<commit_message>
style(persetujuan): sejajarkan tanda baca titik dua pada lembar persetujuan menggunakan borderless table
</commit_message>
<xml_diff>
--- a/TOPIK_2_TAKSI_GREEN_SM/01_Naskah_Utama/Proposal_Skripsi_Taksi_Green_SM.docx
+++ b/TOPIK_2_TAKSI_GREEN_SM/01_Naskah_Utama/Proposal_Skripsi_Taksi_Green_SM.docx
@@ -12,16 +12,16 @@
           <w:noProof/>
         </w:rPr>
         <w:drawing>
-          <wp:inline distT="0" distB="0" distL="0" distR="0" wp14:anchorId="54772D02" wp14:editId="065C0C84">
+          <wp:inline distT="0" distB="0" distL="0" distR="0" wp14:anchorId="02E8118A" wp14:editId="33FD034B">
             <wp:extent cx="1152002" cy="1152002"/>
             <wp:effectExtent l="0" t="0" r="0" b="0"/>
-            <wp:docPr id="626463419" name="Picture 1"/>
+            <wp:docPr id="1554099893" name="Picture 1"/>
             <wp:cNvGraphicFramePr/>
             <a:graphic xmlns:a="http://schemas.openxmlformats.org/drawingml/2006/main">
               <a:graphicData uri="http://schemas.openxmlformats.org/drawingml/2006/picture">
                 <pic:pic xmlns:pic="http://schemas.openxmlformats.org/drawingml/2006/picture">
                   <pic:nvPicPr>
-                    <pic:cNvPr id="626463419" name=""/>
+                    <pic:cNvPr id="1554099893" name=""/>
                     <pic:cNvPicPr/>
                   </pic:nvPicPr>
                   <pic:blipFill>
@@ -370,7 +370,7 @@
     </w:p>
     <w:p>
       <w:pPr>
-        <w:spacing w:after="480" w:line="360" w:lineRule="auto"/>
+        <w:spacing w:after="360" w:line="360" w:lineRule="auto"/>
         <w:jc w:val="center"/>
         <w:rPr>
           <w:rFonts w:ascii="Times New Roman" w:hAnsi="Times New Roman" w:cs="Times New Roman"/>
@@ -387,180 +387,574 @@
         <w:t>LEMBAR PERSETUJUAN PROPOSAL SKRIPSI</w:t>
       </w:r>
     </w:p>
-    <w:p>
-      <w:pPr>
-        <w:spacing w:after="120" w:line="360" w:lineRule="auto"/>
-        <w:rPr>
-          <w:rFonts w:ascii="Times New Roman" w:hAnsi="Times New Roman" w:cs="Times New Roman"/>
-          <w:sz w:val="24"/>
-        </w:rPr>
-      </w:pPr>
-      <w:r>
-        <w:rPr>
-          <w:rFonts w:ascii="Times New Roman" w:hAnsi="Times New Roman" w:cs="Times New Roman"/>
-          <w:sz w:val="24"/>
-        </w:rPr>
-        <w:t xml:space="preserve">Judul Proposal : Pengaruh </w:t>
-      </w:r>
-      <w:r>
-        <w:rPr>
-          <w:rFonts w:ascii="Times New Roman" w:hAnsi="Times New Roman" w:cs="Times New Roman"/>
-          <w:i/>
-          <w:sz w:val="24"/>
-        </w:rPr>
-        <w:t>Brand Image</w:t>
-      </w:r>
-      <w:r>
-        <w:rPr>
-          <w:rFonts w:ascii="Times New Roman" w:hAnsi="Times New Roman" w:cs="Times New Roman"/>
-          <w:sz w:val="24"/>
-        </w:rPr>
-        <w:t xml:space="preserve">, </w:t>
-      </w:r>
-      <w:r>
-        <w:rPr>
-          <w:rFonts w:ascii="Times New Roman" w:hAnsi="Times New Roman" w:cs="Times New Roman"/>
-          <w:i/>
-          <w:sz w:val="24"/>
-        </w:rPr>
-        <w:t>Brand Trust</w:t>
-      </w:r>
-      <w:r>
-        <w:rPr>
-          <w:rFonts w:ascii="Times New Roman" w:hAnsi="Times New Roman" w:cs="Times New Roman"/>
-          <w:sz w:val="24"/>
-        </w:rPr>
-        <w:t xml:space="preserve"> dan </w:t>
-      </w:r>
-      <w:r>
-        <w:rPr>
-          <w:rFonts w:ascii="Times New Roman" w:hAnsi="Times New Roman" w:cs="Times New Roman"/>
-          <w:i/>
-          <w:sz w:val="24"/>
-        </w:rPr>
-        <w:t>Perceived Safety</w:t>
-      </w:r>
-      <w:r>
-        <w:rPr>
-          <w:rFonts w:ascii="Times New Roman" w:hAnsi="Times New Roman" w:cs="Times New Roman"/>
-          <w:sz w:val="24"/>
-        </w:rPr>
-        <w:t xml:space="preserve"> terhadap </w:t>
-      </w:r>
-      <w:r>
-        <w:rPr>
-          <w:rFonts w:ascii="Times New Roman" w:hAnsi="Times New Roman" w:cs="Times New Roman"/>
-          <w:i/>
-          <w:sz w:val="24"/>
-        </w:rPr>
-        <w:t>Purchase Decision</w:t>
-      </w:r>
-      <w:r>
-        <w:rPr>
-          <w:rFonts w:ascii="Times New Roman" w:hAnsi="Times New Roman" w:cs="Times New Roman"/>
-          <w:sz w:val="24"/>
-        </w:rPr>
-        <w:t xml:space="preserve"> dalam Penggunaan Jasa Taksi </w:t>
-      </w:r>
-      <w:r>
-        <w:rPr>
-          <w:rFonts w:ascii="Times New Roman" w:hAnsi="Times New Roman" w:cs="Times New Roman"/>
-          <w:i/>
-          <w:sz w:val="24"/>
-        </w:rPr>
-        <w:t>Green SM</w:t>
-      </w:r>
-      <w:r>
-        <w:rPr>
-          <w:rFonts w:ascii="Times New Roman" w:hAnsi="Times New Roman" w:cs="Times New Roman"/>
-          <w:sz w:val="24"/>
-        </w:rPr>
-        <w:t xml:space="preserve"> di Wilayah Jakarta Barat</w:t>
-      </w:r>
-    </w:p>
-    <w:p>
-      <w:pPr>
-        <w:spacing w:after="120" w:line="360" w:lineRule="auto"/>
-        <w:rPr>
-          <w:rFonts w:ascii="Times New Roman" w:hAnsi="Times New Roman" w:cs="Times New Roman"/>
-          <w:sz w:val="24"/>
-        </w:rPr>
-      </w:pPr>
-      <w:r>
-        <w:rPr>
-          <w:rFonts w:ascii="Times New Roman" w:hAnsi="Times New Roman" w:cs="Times New Roman"/>
-          <w:sz w:val="24"/>
-        </w:rPr>
-        <w:t>Nama Mahasiswa : Siddharta Pratama Budiono</w:t>
-      </w:r>
-    </w:p>
-    <w:p>
-      <w:pPr>
-        <w:spacing w:after="120" w:line="360" w:lineRule="auto"/>
-        <w:rPr>
-          <w:rFonts w:ascii="Times New Roman" w:hAnsi="Times New Roman" w:cs="Times New Roman"/>
-          <w:sz w:val="24"/>
-        </w:rPr>
-      </w:pPr>
-      <w:r>
-        <w:rPr>
-          <w:rFonts w:ascii="Times New Roman" w:hAnsi="Times New Roman" w:cs="Times New Roman"/>
-          <w:sz w:val="24"/>
-        </w:rPr>
-        <w:t>NIM            : 312023017</w:t>
-      </w:r>
-    </w:p>
-    <w:p>
-      <w:pPr>
-        <w:spacing w:after="120" w:line="360" w:lineRule="auto"/>
-        <w:rPr>
-          <w:rFonts w:ascii="Times New Roman" w:hAnsi="Times New Roman" w:cs="Times New Roman"/>
-          <w:sz w:val="24"/>
-        </w:rPr>
-      </w:pPr>
-      <w:r>
-        <w:rPr>
-          <w:rFonts w:ascii="Times New Roman" w:hAnsi="Times New Roman" w:cs="Times New Roman"/>
-          <w:sz w:val="24"/>
-        </w:rPr>
-        <w:t>Program Studi  : S1 Manajemen</w:t>
-      </w:r>
-    </w:p>
-    <w:p>
-      <w:pPr>
-        <w:spacing w:after="120" w:line="360" w:lineRule="auto"/>
-        <w:rPr>
-          <w:rFonts w:ascii="Times New Roman" w:hAnsi="Times New Roman" w:cs="Times New Roman"/>
-          <w:sz w:val="24"/>
-        </w:rPr>
-      </w:pPr>
-      <w:r>
-        <w:rPr>
-          <w:rFonts w:ascii="Times New Roman" w:hAnsi="Times New Roman" w:cs="Times New Roman"/>
-          <w:sz w:val="24"/>
-        </w:rPr>
-        <w:t>Konsentrasi    : Manajemen Pemasaran</w:t>
-      </w:r>
-    </w:p>
-    <w:p>
-      <w:pPr>
-        <w:spacing w:after="480" w:line="360" w:lineRule="auto"/>
-        <w:rPr>
-          <w:rFonts w:ascii="Times New Roman" w:hAnsi="Times New Roman" w:cs="Times New Roman"/>
-          <w:sz w:val="24"/>
-        </w:rPr>
-      </w:pPr>
-      <w:r>
-        <w:rPr>
-          <w:rFonts w:ascii="Times New Roman" w:hAnsi="Times New Roman" w:cs="Times New Roman"/>
-          <w:sz w:val="24"/>
-        </w:rPr>
-        <w:t>Fakultas       : Ekonomi dan Bisnis</w:t>
-      </w:r>
-    </w:p>
-    <w:p>
-      <w:pPr>
-        <w:spacing w:after="720" w:line="360" w:lineRule="auto"/>
+    <w:tbl>
+      <w:tblPr>
+        <w:tblW w:w="7946" w:type="dxa"/>
+        <w:tblLayout w:type="fixed"/>
+        <w:tblLook w:val="0000" w:firstRow="0" w:lastRow="0" w:firstColumn="0" w:lastColumn="0" w:noHBand="0" w:noVBand="0"/>
+      </w:tblPr>
+      <w:tblGrid>
+        <w:gridCol w:w="2041"/>
+        <w:gridCol w:w="236"/>
+        <w:gridCol w:w="5669"/>
+      </w:tblGrid>
+      <w:tr>
+        <w:tblPrEx>
+          <w:tblCellMar>
+            <w:top w:w="0" w:type="dxa"/>
+            <w:bottom w:w="0" w:type="dxa"/>
+          </w:tblCellMar>
+        </w:tblPrEx>
+        <w:tc>
+          <w:tcPr>
+            <w:tcW w:w="2041" w:type="dxa"/>
+          </w:tcPr>
+          <w:p>
+            <w:pPr>
+              <w:spacing w:after="60" w:line="240" w:lineRule="auto"/>
+              <w:rPr>
+                <w:rFonts w:ascii="Times New Roman" w:hAnsi="Times New Roman" w:cs="Times New Roman"/>
+                <w:b/>
+                <w:sz w:val="24"/>
+              </w:rPr>
+            </w:pPr>
+            <w:r>
+              <w:rPr>
+                <w:rFonts w:ascii="Times New Roman" w:hAnsi="Times New Roman" w:cs="Times New Roman"/>
+                <w:b/>
+                <w:sz w:val="24"/>
+              </w:rPr>
+              <w:t>Judul Proposal</w:t>
+            </w:r>
+          </w:p>
+        </w:tc>
+        <w:tc>
+          <w:tcPr>
+            <w:tcW w:w="236" w:type="dxa"/>
+          </w:tcPr>
+          <w:p>
+            <w:pPr>
+              <w:spacing w:after="60" w:line="240" w:lineRule="auto"/>
+              <w:jc w:val="center"/>
+              <w:rPr>
+                <w:rFonts w:ascii="Times New Roman" w:hAnsi="Times New Roman" w:cs="Times New Roman"/>
+                <w:b/>
+                <w:sz w:val="24"/>
+              </w:rPr>
+            </w:pPr>
+            <w:r>
+              <w:rPr>
+                <w:rFonts w:ascii="Times New Roman" w:hAnsi="Times New Roman" w:cs="Times New Roman"/>
+                <w:b/>
+                <w:sz w:val="24"/>
+              </w:rPr>
+              <w:t>:</w:t>
+            </w:r>
+          </w:p>
+        </w:tc>
+        <w:tc>
+          <w:tcPr>
+            <w:tcW w:w="5669" w:type="dxa"/>
+          </w:tcPr>
+          <w:p>
+            <w:pPr>
+              <w:spacing w:after="60" w:line="240" w:lineRule="auto"/>
+              <w:rPr>
+                <w:rFonts w:ascii="Times New Roman" w:hAnsi="Times New Roman" w:cs="Times New Roman"/>
+                <w:b/>
+                <w:sz w:val="24"/>
+              </w:rPr>
+            </w:pPr>
+            <w:r>
+              <w:rPr>
+                <w:rFonts w:ascii="Times New Roman" w:hAnsi="Times New Roman" w:cs="Times New Roman"/>
+                <w:b/>
+                <w:sz w:val="24"/>
+              </w:rPr>
+              <w:t xml:space="preserve">Pengaruh </w:t>
+            </w:r>
+            <w:r>
+              <w:rPr>
+                <w:rFonts w:ascii="Times New Roman" w:hAnsi="Times New Roman" w:cs="Times New Roman"/>
+                <w:b/>
+                <w:i/>
+                <w:sz w:val="24"/>
+              </w:rPr>
+              <w:t>Brand Image</w:t>
+            </w:r>
+            <w:r>
+              <w:rPr>
+                <w:rFonts w:ascii="Times New Roman" w:hAnsi="Times New Roman" w:cs="Times New Roman"/>
+                <w:b/>
+                <w:sz w:val="24"/>
+              </w:rPr>
+              <w:t xml:space="preserve">, </w:t>
+            </w:r>
+            <w:r>
+              <w:rPr>
+                <w:rFonts w:ascii="Times New Roman" w:hAnsi="Times New Roman" w:cs="Times New Roman"/>
+                <w:b/>
+                <w:i/>
+                <w:sz w:val="24"/>
+              </w:rPr>
+              <w:t>Brand Trust</w:t>
+            </w:r>
+            <w:r>
+              <w:rPr>
+                <w:rFonts w:ascii="Times New Roman" w:hAnsi="Times New Roman" w:cs="Times New Roman"/>
+                <w:b/>
+                <w:sz w:val="24"/>
+              </w:rPr>
+              <w:t xml:space="preserve"> dan </w:t>
+            </w:r>
+            <w:r>
+              <w:rPr>
+                <w:rFonts w:ascii="Times New Roman" w:hAnsi="Times New Roman" w:cs="Times New Roman"/>
+                <w:b/>
+                <w:i/>
+                <w:sz w:val="24"/>
+              </w:rPr>
+              <w:t>Perceived Safety</w:t>
+            </w:r>
+            <w:r>
+              <w:rPr>
+                <w:rFonts w:ascii="Times New Roman" w:hAnsi="Times New Roman" w:cs="Times New Roman"/>
+                <w:b/>
+                <w:sz w:val="24"/>
+              </w:rPr>
+              <w:t xml:space="preserve"> terhadap </w:t>
+            </w:r>
+            <w:r>
+              <w:rPr>
+                <w:rFonts w:ascii="Times New Roman" w:hAnsi="Times New Roman" w:cs="Times New Roman"/>
+                <w:b/>
+                <w:i/>
+                <w:sz w:val="24"/>
+              </w:rPr>
+              <w:t>Purchase Decision</w:t>
+            </w:r>
+            <w:r>
+              <w:rPr>
+                <w:rFonts w:ascii="Times New Roman" w:hAnsi="Times New Roman" w:cs="Times New Roman"/>
+                <w:b/>
+                <w:sz w:val="24"/>
+              </w:rPr>
+              <w:t xml:space="preserve"> dalam Penggunaan Jasa Taksi </w:t>
+            </w:r>
+            <w:r>
+              <w:rPr>
+                <w:rFonts w:ascii="Times New Roman" w:hAnsi="Times New Roman" w:cs="Times New Roman"/>
+                <w:b/>
+                <w:i/>
+                <w:sz w:val="24"/>
+              </w:rPr>
+              <w:t>Green SM</w:t>
+            </w:r>
+            <w:r>
+              <w:rPr>
+                <w:rFonts w:ascii="Times New Roman" w:hAnsi="Times New Roman" w:cs="Times New Roman"/>
+                <w:b/>
+                <w:sz w:val="24"/>
+              </w:rPr>
+              <w:t xml:space="preserve"> di Wilayah Jakarta Barat</w:t>
+            </w:r>
+          </w:p>
+        </w:tc>
+      </w:tr>
+      <w:tr>
+        <w:tblPrEx>
+          <w:tblCellMar>
+            <w:top w:w="0" w:type="dxa"/>
+            <w:bottom w:w="0" w:type="dxa"/>
+          </w:tblCellMar>
+        </w:tblPrEx>
+        <w:tc>
+          <w:tcPr>
+            <w:tcW w:w="2041" w:type="dxa"/>
+          </w:tcPr>
+          <w:p>
+            <w:pPr>
+              <w:spacing w:after="60" w:line="240" w:lineRule="auto"/>
+              <w:rPr>
+                <w:rFonts w:ascii="Times New Roman" w:hAnsi="Times New Roman" w:cs="Times New Roman"/>
+                <w:b/>
+                <w:sz w:val="24"/>
+              </w:rPr>
+            </w:pPr>
+            <w:r>
+              <w:rPr>
+                <w:rFonts w:ascii="Times New Roman" w:hAnsi="Times New Roman" w:cs="Times New Roman"/>
+                <w:b/>
+                <w:sz w:val="24"/>
+              </w:rPr>
+              <w:t>Nama Mahasiswa</w:t>
+            </w:r>
+          </w:p>
+        </w:tc>
+        <w:tc>
+          <w:tcPr>
+            <w:tcW w:w="236" w:type="dxa"/>
+          </w:tcPr>
+          <w:p>
+            <w:pPr>
+              <w:spacing w:after="60" w:line="240" w:lineRule="auto"/>
+              <w:jc w:val="center"/>
+              <w:rPr>
+                <w:rFonts w:ascii="Times New Roman" w:hAnsi="Times New Roman" w:cs="Times New Roman"/>
+                <w:b/>
+                <w:sz w:val="24"/>
+              </w:rPr>
+            </w:pPr>
+            <w:r>
+              <w:rPr>
+                <w:rFonts w:ascii="Times New Roman" w:hAnsi="Times New Roman" w:cs="Times New Roman"/>
+                <w:b/>
+                <w:sz w:val="24"/>
+              </w:rPr>
+              <w:t>:</w:t>
+            </w:r>
+          </w:p>
+        </w:tc>
+        <w:tc>
+          <w:tcPr>
+            <w:tcW w:w="5669" w:type="dxa"/>
+          </w:tcPr>
+          <w:p>
+            <w:pPr>
+              <w:spacing w:after="60" w:line="240" w:lineRule="auto"/>
+              <w:rPr>
+                <w:rFonts w:ascii="Times New Roman" w:hAnsi="Times New Roman" w:cs="Times New Roman"/>
+                <w:b/>
+                <w:sz w:val="24"/>
+              </w:rPr>
+            </w:pPr>
+            <w:r>
+              <w:rPr>
+                <w:rFonts w:ascii="Times New Roman" w:hAnsi="Times New Roman" w:cs="Times New Roman"/>
+                <w:b/>
+                <w:sz w:val="24"/>
+              </w:rPr>
+              <w:t>Siddharta Pratama Budiono</w:t>
+            </w:r>
+          </w:p>
+        </w:tc>
+      </w:tr>
+      <w:tr>
+        <w:tblPrEx>
+          <w:tblCellMar>
+            <w:top w:w="0" w:type="dxa"/>
+            <w:bottom w:w="0" w:type="dxa"/>
+          </w:tblCellMar>
+        </w:tblPrEx>
+        <w:tc>
+          <w:tcPr>
+            <w:tcW w:w="2041" w:type="dxa"/>
+          </w:tcPr>
+          <w:p>
+            <w:pPr>
+              <w:spacing w:after="60" w:line="240" w:lineRule="auto"/>
+              <w:rPr>
+                <w:rFonts w:ascii="Times New Roman" w:hAnsi="Times New Roman" w:cs="Times New Roman"/>
+                <w:b/>
+                <w:sz w:val="24"/>
+              </w:rPr>
+            </w:pPr>
+            <w:r>
+              <w:rPr>
+                <w:rFonts w:ascii="Times New Roman" w:hAnsi="Times New Roman" w:cs="Times New Roman"/>
+                <w:b/>
+                <w:sz w:val="24"/>
+              </w:rPr>
+              <w:t>NIM</w:t>
+            </w:r>
+          </w:p>
+        </w:tc>
+        <w:tc>
+          <w:tcPr>
+            <w:tcW w:w="236" w:type="dxa"/>
+          </w:tcPr>
+          <w:p>
+            <w:pPr>
+              <w:spacing w:after="60" w:line="240" w:lineRule="auto"/>
+              <w:jc w:val="center"/>
+              <w:rPr>
+                <w:rFonts w:ascii="Times New Roman" w:hAnsi="Times New Roman" w:cs="Times New Roman"/>
+                <w:b/>
+                <w:sz w:val="24"/>
+              </w:rPr>
+            </w:pPr>
+            <w:r>
+              <w:rPr>
+                <w:rFonts w:ascii="Times New Roman" w:hAnsi="Times New Roman" w:cs="Times New Roman"/>
+                <w:b/>
+                <w:sz w:val="24"/>
+              </w:rPr>
+              <w:t>:</w:t>
+            </w:r>
+          </w:p>
+        </w:tc>
+        <w:tc>
+          <w:tcPr>
+            <w:tcW w:w="5669" w:type="dxa"/>
+          </w:tcPr>
+          <w:p>
+            <w:pPr>
+              <w:spacing w:after="60" w:line="240" w:lineRule="auto"/>
+              <w:rPr>
+                <w:rFonts w:ascii="Times New Roman" w:hAnsi="Times New Roman" w:cs="Times New Roman"/>
+                <w:b/>
+                <w:sz w:val="24"/>
+              </w:rPr>
+            </w:pPr>
+            <w:r>
+              <w:rPr>
+                <w:rFonts w:ascii="Times New Roman" w:hAnsi="Times New Roman" w:cs="Times New Roman"/>
+                <w:b/>
+                <w:sz w:val="24"/>
+              </w:rPr>
+              <w:t>312023017</w:t>
+            </w:r>
+          </w:p>
+        </w:tc>
+      </w:tr>
+      <w:tr>
+        <w:tblPrEx>
+          <w:tblCellMar>
+            <w:top w:w="0" w:type="dxa"/>
+            <w:bottom w:w="0" w:type="dxa"/>
+          </w:tblCellMar>
+        </w:tblPrEx>
+        <w:tc>
+          <w:tcPr>
+            <w:tcW w:w="2041" w:type="dxa"/>
+          </w:tcPr>
+          <w:p>
+            <w:pPr>
+              <w:spacing w:after="60" w:line="240" w:lineRule="auto"/>
+              <w:rPr>
+                <w:rFonts w:ascii="Times New Roman" w:hAnsi="Times New Roman" w:cs="Times New Roman"/>
+                <w:b/>
+                <w:sz w:val="24"/>
+              </w:rPr>
+            </w:pPr>
+            <w:r>
+              <w:rPr>
+                <w:rFonts w:ascii="Times New Roman" w:hAnsi="Times New Roman" w:cs="Times New Roman"/>
+                <w:b/>
+                <w:sz w:val="24"/>
+              </w:rPr>
+              <w:t>Program Studi</w:t>
+            </w:r>
+          </w:p>
+        </w:tc>
+        <w:tc>
+          <w:tcPr>
+            <w:tcW w:w="236" w:type="dxa"/>
+          </w:tcPr>
+          <w:p>
+            <w:pPr>
+              <w:spacing w:after="60" w:line="240" w:lineRule="auto"/>
+              <w:jc w:val="center"/>
+              <w:rPr>
+                <w:rFonts w:ascii="Times New Roman" w:hAnsi="Times New Roman" w:cs="Times New Roman"/>
+                <w:b/>
+                <w:sz w:val="24"/>
+              </w:rPr>
+            </w:pPr>
+            <w:r>
+              <w:rPr>
+                <w:rFonts w:ascii="Times New Roman" w:hAnsi="Times New Roman" w:cs="Times New Roman"/>
+                <w:b/>
+                <w:sz w:val="24"/>
+              </w:rPr>
+              <w:t>:</w:t>
+            </w:r>
+          </w:p>
+        </w:tc>
+        <w:tc>
+          <w:tcPr>
+            <w:tcW w:w="5669" w:type="dxa"/>
+          </w:tcPr>
+          <w:p>
+            <w:pPr>
+              <w:spacing w:after="60" w:line="240" w:lineRule="auto"/>
+              <w:rPr>
+                <w:rFonts w:ascii="Times New Roman" w:hAnsi="Times New Roman" w:cs="Times New Roman"/>
+                <w:b/>
+                <w:sz w:val="24"/>
+              </w:rPr>
+            </w:pPr>
+            <w:r>
+              <w:rPr>
+                <w:rFonts w:ascii="Times New Roman" w:hAnsi="Times New Roman" w:cs="Times New Roman"/>
+                <w:b/>
+                <w:sz w:val="24"/>
+              </w:rPr>
+              <w:t>S1 Manajemen</w:t>
+            </w:r>
+          </w:p>
+        </w:tc>
+      </w:tr>
+      <w:tr>
+        <w:tblPrEx>
+          <w:tblCellMar>
+            <w:top w:w="0" w:type="dxa"/>
+            <w:bottom w:w="0" w:type="dxa"/>
+          </w:tblCellMar>
+        </w:tblPrEx>
+        <w:tc>
+          <w:tcPr>
+            <w:tcW w:w="2041" w:type="dxa"/>
+          </w:tcPr>
+          <w:p>
+            <w:pPr>
+              <w:spacing w:after="60" w:line="240" w:lineRule="auto"/>
+              <w:rPr>
+                <w:rFonts w:ascii="Times New Roman" w:hAnsi="Times New Roman" w:cs="Times New Roman"/>
+                <w:b/>
+                <w:sz w:val="24"/>
+              </w:rPr>
+            </w:pPr>
+            <w:r>
+              <w:rPr>
+                <w:rFonts w:ascii="Times New Roman" w:hAnsi="Times New Roman" w:cs="Times New Roman"/>
+                <w:b/>
+                <w:sz w:val="24"/>
+              </w:rPr>
+              <w:t>Konsentrasi</w:t>
+            </w:r>
+          </w:p>
+        </w:tc>
+        <w:tc>
+          <w:tcPr>
+            <w:tcW w:w="236" w:type="dxa"/>
+          </w:tcPr>
+          <w:p>
+            <w:pPr>
+              <w:spacing w:after="60" w:line="240" w:lineRule="auto"/>
+              <w:jc w:val="center"/>
+              <w:rPr>
+                <w:rFonts w:ascii="Times New Roman" w:hAnsi="Times New Roman" w:cs="Times New Roman"/>
+                <w:b/>
+                <w:sz w:val="24"/>
+              </w:rPr>
+            </w:pPr>
+            <w:r>
+              <w:rPr>
+                <w:rFonts w:ascii="Times New Roman" w:hAnsi="Times New Roman" w:cs="Times New Roman"/>
+                <w:b/>
+                <w:sz w:val="24"/>
+              </w:rPr>
+              <w:t>:</w:t>
+            </w:r>
+          </w:p>
+        </w:tc>
+        <w:tc>
+          <w:tcPr>
+            <w:tcW w:w="5669" w:type="dxa"/>
+          </w:tcPr>
+          <w:p>
+            <w:pPr>
+              <w:spacing w:after="60" w:line="240" w:lineRule="auto"/>
+              <w:rPr>
+                <w:rFonts w:ascii="Times New Roman" w:hAnsi="Times New Roman" w:cs="Times New Roman"/>
+                <w:b/>
+                <w:sz w:val="24"/>
+              </w:rPr>
+            </w:pPr>
+            <w:r>
+              <w:rPr>
+                <w:rFonts w:ascii="Times New Roman" w:hAnsi="Times New Roman" w:cs="Times New Roman"/>
+                <w:b/>
+                <w:sz w:val="24"/>
+              </w:rPr>
+              <w:t>Manajemen Pemasaran</w:t>
+            </w:r>
+          </w:p>
+        </w:tc>
+      </w:tr>
+      <w:tr>
+        <w:tblPrEx>
+          <w:tblCellMar>
+            <w:top w:w="0" w:type="dxa"/>
+            <w:bottom w:w="0" w:type="dxa"/>
+          </w:tblCellMar>
+        </w:tblPrEx>
+        <w:tc>
+          <w:tcPr>
+            <w:tcW w:w="2041" w:type="dxa"/>
+          </w:tcPr>
+          <w:p>
+            <w:pPr>
+              <w:spacing w:after="60" w:line="240" w:lineRule="auto"/>
+              <w:rPr>
+                <w:rFonts w:ascii="Times New Roman" w:hAnsi="Times New Roman" w:cs="Times New Roman"/>
+                <w:b/>
+                <w:sz w:val="24"/>
+              </w:rPr>
+            </w:pPr>
+            <w:r>
+              <w:rPr>
+                <w:rFonts w:ascii="Times New Roman" w:hAnsi="Times New Roman" w:cs="Times New Roman"/>
+                <w:b/>
+                <w:sz w:val="24"/>
+              </w:rPr>
+              <w:t>Fakultas</w:t>
+            </w:r>
+          </w:p>
+        </w:tc>
+        <w:tc>
+          <w:tcPr>
+            <w:tcW w:w="236" w:type="dxa"/>
+          </w:tcPr>
+          <w:p>
+            <w:pPr>
+              <w:spacing w:after="60" w:line="240" w:lineRule="auto"/>
+              <w:jc w:val="center"/>
+              <w:rPr>
+                <w:rFonts w:ascii="Times New Roman" w:hAnsi="Times New Roman" w:cs="Times New Roman"/>
+                <w:b/>
+                <w:sz w:val="24"/>
+              </w:rPr>
+            </w:pPr>
+            <w:r>
+              <w:rPr>
+                <w:rFonts w:ascii="Times New Roman" w:hAnsi="Times New Roman" w:cs="Times New Roman"/>
+                <w:b/>
+                <w:sz w:val="24"/>
+              </w:rPr>
+              <w:t>:</w:t>
+            </w:r>
+          </w:p>
+        </w:tc>
+        <w:tc>
+          <w:tcPr>
+            <w:tcW w:w="5669" w:type="dxa"/>
+          </w:tcPr>
+          <w:p>
+            <w:pPr>
+              <w:spacing w:after="60" w:line="240" w:lineRule="auto"/>
+              <w:rPr>
+                <w:rFonts w:ascii="Times New Roman" w:hAnsi="Times New Roman" w:cs="Times New Roman"/>
+                <w:b/>
+                <w:sz w:val="24"/>
+              </w:rPr>
+            </w:pPr>
+            <w:r>
+              <w:rPr>
+                <w:rFonts w:ascii="Times New Roman" w:hAnsi="Times New Roman" w:cs="Times New Roman"/>
+                <w:b/>
+                <w:sz w:val="24"/>
+              </w:rPr>
+              <w:t>Ekonomi dan Bisnis</w:t>
+            </w:r>
+          </w:p>
+        </w:tc>
+      </w:tr>
+    </w:tbl>
+    <w:p>
+      <w:pPr>
+        <w:spacing w:before="280" w:after="480" w:line="360" w:lineRule="auto"/>
         <w:ind w:firstLine="709"/>
         <w:jc w:val="both"/>
         <w:rPr>
@@ -25600,7 +25994,7 @@
     <w:link w:val="Heading1Char"/>
     <w:uiPriority w:val="9"/>
     <w:qFormat/>
-    <w:rsid w:val="00271B1B"/>
+    <w:rsid w:val="0065529D"/>
     <w:pPr>
       <w:keepNext/>
       <w:keepLines/>
@@ -25623,7 +26017,7 @@
     <w:semiHidden/>
     <w:unhideWhenUsed/>
     <w:qFormat/>
-    <w:rsid w:val="00271B1B"/>
+    <w:rsid w:val="0065529D"/>
     <w:pPr>
       <w:keepNext/>
       <w:keepLines/>
@@ -25646,7 +26040,7 @@
     <w:semiHidden/>
     <w:unhideWhenUsed/>
     <w:qFormat/>
-    <w:rsid w:val="00271B1B"/>
+    <w:rsid w:val="0065529D"/>
     <w:pPr>
       <w:keepNext/>
       <w:keepLines/>
@@ -25669,7 +26063,7 @@
     <w:semiHidden/>
     <w:unhideWhenUsed/>
     <w:qFormat/>
-    <w:rsid w:val="00271B1B"/>
+    <w:rsid w:val="0065529D"/>
     <w:pPr>
       <w:keepNext/>
       <w:keepLines/>
@@ -25692,7 +26086,7 @@
     <w:semiHidden/>
     <w:unhideWhenUsed/>
     <w:qFormat/>
-    <w:rsid w:val="00271B1B"/>
+    <w:rsid w:val="0065529D"/>
     <w:pPr>
       <w:keepNext/>
       <w:keepLines/>
@@ -25713,7 +26107,7 @@
     <w:semiHidden/>
     <w:unhideWhenUsed/>
     <w:qFormat/>
-    <w:rsid w:val="00271B1B"/>
+    <w:rsid w:val="0065529D"/>
     <w:pPr>
       <w:keepNext/>
       <w:keepLines/>
@@ -25736,7 +26130,7 @@
     <w:semiHidden/>
     <w:unhideWhenUsed/>
     <w:qFormat/>
-    <w:rsid w:val="00271B1B"/>
+    <w:rsid w:val="0065529D"/>
     <w:pPr>
       <w:keepNext/>
       <w:keepLines/>
@@ -25757,7 +26151,7 @@
     <w:semiHidden/>
     <w:unhideWhenUsed/>
     <w:qFormat/>
-    <w:rsid w:val="00271B1B"/>
+    <w:rsid w:val="0065529D"/>
     <w:pPr>
       <w:keepNext/>
       <w:keepLines/>
@@ -25780,7 +26174,7 @@
     <w:semiHidden/>
     <w:unhideWhenUsed/>
     <w:qFormat/>
-    <w:rsid w:val="00271B1B"/>
+    <w:rsid w:val="0065529D"/>
     <w:pPr>
       <w:keepNext/>
       <w:keepLines/>
@@ -25824,7 +26218,7 @@
     <w:basedOn w:val="DefaultParagraphFont"/>
     <w:link w:val="Heading1"/>
     <w:uiPriority w:val="9"/>
-    <w:rsid w:val="00271B1B"/>
+    <w:rsid w:val="0065529D"/>
     <w:rPr>
       <w:rFonts w:asciiTheme="majorHAnsi" w:eastAsiaTheme="majorEastAsia" w:hAnsiTheme="majorHAnsi" w:cstheme="majorBidi"/>
       <w:color w:val="2F5496" w:themeColor="accent1" w:themeShade="BF"/>
@@ -25838,7 +26232,7 @@
     <w:link w:val="Heading2"/>
     <w:uiPriority w:val="9"/>
     <w:semiHidden/>
-    <w:rsid w:val="00271B1B"/>
+    <w:rsid w:val="0065529D"/>
     <w:rPr>
       <w:rFonts w:asciiTheme="majorHAnsi" w:eastAsiaTheme="majorEastAsia" w:hAnsiTheme="majorHAnsi" w:cstheme="majorBidi"/>
       <w:color w:val="2F5496" w:themeColor="accent1" w:themeShade="BF"/>
@@ -25852,7 +26246,7 @@
     <w:link w:val="Heading3"/>
     <w:uiPriority w:val="9"/>
     <w:semiHidden/>
-    <w:rsid w:val="00271B1B"/>
+    <w:rsid w:val="0065529D"/>
     <w:rPr>
       <w:rFonts w:eastAsiaTheme="majorEastAsia" w:cstheme="majorBidi"/>
       <w:color w:val="2F5496" w:themeColor="accent1" w:themeShade="BF"/>
@@ -25866,7 +26260,7 @@
     <w:link w:val="Heading4"/>
     <w:uiPriority w:val="9"/>
     <w:semiHidden/>
-    <w:rsid w:val="00271B1B"/>
+    <w:rsid w:val="0065529D"/>
     <w:rPr>
       <w:rFonts w:eastAsiaTheme="majorEastAsia" w:cstheme="majorBidi"/>
       <w:i/>
@@ -25880,7 +26274,7 @@
     <w:link w:val="Heading5"/>
     <w:uiPriority w:val="9"/>
     <w:semiHidden/>
-    <w:rsid w:val="00271B1B"/>
+    <w:rsid w:val="0065529D"/>
     <w:rPr>
       <w:rFonts w:eastAsiaTheme="majorEastAsia" w:cstheme="majorBidi"/>
       <w:color w:val="2F5496" w:themeColor="accent1" w:themeShade="BF"/>
@@ -25892,7 +26286,7 @@
     <w:link w:val="Heading6"/>
     <w:uiPriority w:val="9"/>
     <w:semiHidden/>
-    <w:rsid w:val="00271B1B"/>
+    <w:rsid w:val="0065529D"/>
     <w:rPr>
       <w:rFonts w:eastAsiaTheme="majorEastAsia" w:cstheme="majorBidi"/>
       <w:i/>
@@ -25906,7 +26300,7 @@
     <w:link w:val="Heading7"/>
     <w:uiPriority w:val="9"/>
     <w:semiHidden/>
-    <w:rsid w:val="00271B1B"/>
+    <w:rsid w:val="0065529D"/>
     <w:rPr>
       <w:rFonts w:eastAsiaTheme="majorEastAsia" w:cstheme="majorBidi"/>
       <w:color w:val="595959" w:themeColor="text1" w:themeTint="A6"/>
@@ -25918,7 +26312,7 @@
     <w:link w:val="Heading8"/>
     <w:uiPriority w:val="9"/>
     <w:semiHidden/>
-    <w:rsid w:val="00271B1B"/>
+    <w:rsid w:val="0065529D"/>
     <w:rPr>
       <w:rFonts w:eastAsiaTheme="majorEastAsia" w:cstheme="majorBidi"/>
       <w:i/>
@@ -25932,7 +26326,7 @@
     <w:link w:val="Heading9"/>
     <w:uiPriority w:val="9"/>
     <w:semiHidden/>
-    <w:rsid w:val="00271B1B"/>
+    <w:rsid w:val="0065529D"/>
     <w:rPr>
       <w:rFonts w:eastAsiaTheme="majorEastAsia" w:cstheme="majorBidi"/>
       <w:color w:val="272727" w:themeColor="text1" w:themeTint="D8"/>
@@ -25945,7 +26339,7 @@
     <w:link w:val="TitleChar"/>
     <w:uiPriority w:val="10"/>
     <w:qFormat/>
-    <w:rsid w:val="00271B1B"/>
+    <w:rsid w:val="0065529D"/>
     <w:pPr>
       <w:spacing w:after="80" w:line="240" w:lineRule="auto"/>
       <w:contextualSpacing/>
@@ -25963,7 +26357,7 @@
     <w:basedOn w:val="DefaultParagraphFont"/>
     <w:link w:val="Title"/>
     <w:uiPriority w:val="10"/>
-    <w:rsid w:val="00271B1B"/>
+    <w:rsid w:val="0065529D"/>
     <w:rPr>
       <w:rFonts w:asciiTheme="majorHAnsi" w:eastAsiaTheme="majorEastAsia" w:hAnsiTheme="majorHAnsi" w:cstheme="majorBidi"/>
       <w:spacing w:val="-10"/>
@@ -25979,7 +26373,7 @@
     <w:link w:val="SubtitleChar"/>
     <w:uiPriority w:val="11"/>
     <w:qFormat/>
-    <w:rsid w:val="00271B1B"/>
+    <w:rsid w:val="0065529D"/>
     <w:pPr>
       <w:numPr>
         <w:ilvl w:val="1"/>
@@ -25998,7 +26392,7 @@
     <w:basedOn w:val="DefaultParagraphFont"/>
     <w:link w:val="Subtitle"/>
     <w:uiPriority w:val="11"/>
-    <w:rsid w:val="00271B1B"/>
+    <w:rsid w:val="0065529D"/>
     <w:rPr>
       <w:rFonts w:eastAsiaTheme="majorEastAsia" w:cstheme="majorBidi"/>
       <w:color w:val="595959" w:themeColor="text1" w:themeTint="A6"/>
@@ -26014,7 +26408,7 @@
     <w:link w:val="QuoteChar"/>
     <w:uiPriority w:val="29"/>
     <w:qFormat/>
-    <w:rsid w:val="00271B1B"/>
+    <w:rsid w:val="0065529D"/>
     <w:pPr>
       <w:spacing w:before="160"/>
       <w:jc w:val="center"/>
@@ -26030,7 +26424,7 @@
     <w:basedOn w:val="DefaultParagraphFont"/>
     <w:link w:val="Quote"/>
     <w:uiPriority w:val="29"/>
-    <w:rsid w:val="00271B1B"/>
+    <w:rsid w:val="0065529D"/>
     <w:rPr>
       <w:i/>
       <w:iCs/>
@@ -26042,7 +26436,7 @@
     <w:basedOn w:val="Normal"/>
     <w:uiPriority w:val="34"/>
     <w:qFormat/>
-    <w:rsid w:val="00271B1B"/>
+    <w:rsid w:val="0065529D"/>
     <w:pPr>
       <w:ind w:left="720"/>
       <w:contextualSpacing/>
@@ -26053,7 +26447,7 @@
     <w:basedOn w:val="DefaultParagraphFont"/>
     <w:uiPriority w:val="21"/>
     <w:qFormat/>
-    <w:rsid w:val="00271B1B"/>
+    <w:rsid w:val="0065529D"/>
     <w:rPr>
       <w:i/>
       <w:iCs/>
@@ -26067,7 +26461,7 @@
     <w:link w:val="IntenseQuoteChar"/>
     <w:uiPriority w:val="30"/>
     <w:qFormat/>
-    <w:rsid w:val="00271B1B"/>
+    <w:rsid w:val="0065529D"/>
     <w:pPr>
       <w:pBdr>
         <w:top w:val="single" w:sz="4" w:space="10" w:color="2F5496" w:themeColor="accent1" w:themeShade="BF"/>
@@ -26088,7 +26482,7 @@
     <w:basedOn w:val="DefaultParagraphFont"/>
     <w:link w:val="IntenseQuote"/>
     <w:uiPriority w:val="30"/>
-    <w:rsid w:val="00271B1B"/>
+    <w:rsid w:val="0065529D"/>
     <w:rPr>
       <w:i/>
       <w:iCs/>
@@ -26100,7 +26494,7 @@
     <w:basedOn w:val="DefaultParagraphFont"/>
     <w:uiPriority w:val="32"/>
     <w:qFormat/>
-    <w:rsid w:val="00271B1B"/>
+    <w:rsid w:val="0065529D"/>
     <w:rPr>
       <w:b/>
       <w:bCs/>

</xml_diff>

<commit_message>
style(persetujuan): ubah teks identitas lembar persetujuan menjadi regular (tidak tebal/no bold)
</commit_message>
<xml_diff>
--- a/TOPIK_2_TAKSI_GREEN_SM/01_Naskah_Utama/Proposal_Skripsi_Taksi_Green_SM.docx
+++ b/TOPIK_2_TAKSI_GREEN_SM/01_Naskah_Utama/Proposal_Skripsi_Taksi_Green_SM.docx
@@ -12,16 +12,16 @@
           <w:noProof/>
         </w:rPr>
         <w:drawing>
-          <wp:inline distT="0" distB="0" distL="0" distR="0" wp14:anchorId="02E8118A" wp14:editId="33FD034B">
+          <wp:inline distT="0" distB="0" distL="0" distR="0" wp14:anchorId="29F7C0DD" wp14:editId="484702D7">
             <wp:extent cx="1152002" cy="1152002"/>
             <wp:effectExtent l="0" t="0" r="0" b="0"/>
-            <wp:docPr id="1554099893" name="Picture 1"/>
+            <wp:docPr id="2036152948" name="Picture 1"/>
             <wp:cNvGraphicFramePr/>
             <a:graphic xmlns:a="http://schemas.openxmlformats.org/drawingml/2006/main">
               <a:graphicData uri="http://schemas.openxmlformats.org/drawingml/2006/picture">
                 <pic:pic xmlns:pic="http://schemas.openxmlformats.org/drawingml/2006/picture">
                   <pic:nvPicPr>
-                    <pic:cNvPr id="1554099893" name=""/>
+                    <pic:cNvPr id="2036152948" name=""/>
                     <pic:cNvPicPr/>
                   </pic:nvPicPr>
                   <pic:blipFill>
@@ -414,14 +414,12 @@
               <w:spacing w:after="60" w:line="240" w:lineRule="auto"/>
               <w:rPr>
                 <w:rFonts w:ascii="Times New Roman" w:hAnsi="Times New Roman" w:cs="Times New Roman"/>
-                <w:b/>
                 <w:sz w:val="24"/>
               </w:rPr>
             </w:pPr>
             <w:r>
               <w:rPr>
                 <w:rFonts w:ascii="Times New Roman" w:hAnsi="Times New Roman" w:cs="Times New Roman"/>
-                <w:b/>
                 <w:sz w:val="24"/>
               </w:rPr>
               <w:t>Judul Proposal</w:t>
@@ -438,14 +436,12 @@
               <w:jc w:val="center"/>
               <w:rPr>
                 <w:rFonts w:ascii="Times New Roman" w:hAnsi="Times New Roman" w:cs="Times New Roman"/>
-                <w:b/>
                 <w:sz w:val="24"/>
               </w:rPr>
             </w:pPr>
             <w:r>
               <w:rPr>
                 <w:rFonts w:ascii="Times New Roman" w:hAnsi="Times New Roman" w:cs="Times New Roman"/>
-                <w:b/>
                 <w:sz w:val="24"/>
               </w:rPr>
               <w:t>:</w:t>
@@ -461,14 +457,12 @@
               <w:spacing w:after="60" w:line="240" w:lineRule="auto"/>
               <w:rPr>
                 <w:rFonts w:ascii="Times New Roman" w:hAnsi="Times New Roman" w:cs="Times New Roman"/>
-                <w:b/>
                 <w:sz w:val="24"/>
               </w:rPr>
             </w:pPr>
             <w:r>
               <w:rPr>
                 <w:rFonts w:ascii="Times New Roman" w:hAnsi="Times New Roman" w:cs="Times New Roman"/>
-                <w:b/>
                 <w:sz w:val="24"/>
               </w:rPr>
               <w:t xml:space="preserve">Pengaruh </w:t>
@@ -476,7 +470,6 @@
             <w:r>
               <w:rPr>
                 <w:rFonts w:ascii="Times New Roman" w:hAnsi="Times New Roman" w:cs="Times New Roman"/>
-                <w:b/>
                 <w:i/>
                 <w:sz w:val="24"/>
               </w:rPr>
@@ -485,7 +478,6 @@
             <w:r>
               <w:rPr>
                 <w:rFonts w:ascii="Times New Roman" w:hAnsi="Times New Roman" w:cs="Times New Roman"/>
-                <w:b/>
                 <w:sz w:val="24"/>
               </w:rPr>
               <w:t xml:space="preserve">, </w:t>
@@ -493,7 +485,6 @@
             <w:r>
               <w:rPr>
                 <w:rFonts w:ascii="Times New Roman" w:hAnsi="Times New Roman" w:cs="Times New Roman"/>
-                <w:b/>
                 <w:i/>
                 <w:sz w:val="24"/>
               </w:rPr>
@@ -502,7 +493,6 @@
             <w:r>
               <w:rPr>
                 <w:rFonts w:ascii="Times New Roman" w:hAnsi="Times New Roman" w:cs="Times New Roman"/>
-                <w:b/>
                 <w:sz w:val="24"/>
               </w:rPr>
               <w:t xml:space="preserve"> dan </w:t>
@@ -510,7 +500,6 @@
             <w:r>
               <w:rPr>
                 <w:rFonts w:ascii="Times New Roman" w:hAnsi="Times New Roman" w:cs="Times New Roman"/>
-                <w:b/>
                 <w:i/>
                 <w:sz w:val="24"/>
               </w:rPr>
@@ -519,7 +508,6 @@
             <w:r>
               <w:rPr>
                 <w:rFonts w:ascii="Times New Roman" w:hAnsi="Times New Roman" w:cs="Times New Roman"/>
-                <w:b/>
                 <w:sz w:val="24"/>
               </w:rPr>
               <w:t xml:space="preserve"> terhadap </w:t>
@@ -527,7 +515,6 @@
             <w:r>
               <w:rPr>
                 <w:rFonts w:ascii="Times New Roman" w:hAnsi="Times New Roman" w:cs="Times New Roman"/>
-                <w:b/>
                 <w:i/>
                 <w:sz w:val="24"/>
               </w:rPr>
@@ -536,7 +523,6 @@
             <w:r>
               <w:rPr>
                 <w:rFonts w:ascii="Times New Roman" w:hAnsi="Times New Roman" w:cs="Times New Roman"/>
-                <w:b/>
                 <w:sz w:val="24"/>
               </w:rPr>
               <w:t xml:space="preserve"> dalam Penggunaan Jasa Taksi </w:t>
@@ -544,7 +530,6 @@
             <w:r>
               <w:rPr>
                 <w:rFonts w:ascii="Times New Roman" w:hAnsi="Times New Roman" w:cs="Times New Roman"/>
-                <w:b/>
                 <w:i/>
                 <w:sz w:val="24"/>
               </w:rPr>
@@ -553,7 +538,6 @@
             <w:r>
               <w:rPr>
                 <w:rFonts w:ascii="Times New Roman" w:hAnsi="Times New Roman" w:cs="Times New Roman"/>
-                <w:b/>
                 <w:sz w:val="24"/>
               </w:rPr>
               <w:t xml:space="preserve"> di Wilayah Jakarta Barat</w:t>
@@ -577,14 +561,12 @@
               <w:spacing w:after="60" w:line="240" w:lineRule="auto"/>
               <w:rPr>
                 <w:rFonts w:ascii="Times New Roman" w:hAnsi="Times New Roman" w:cs="Times New Roman"/>
-                <w:b/>
                 <w:sz w:val="24"/>
               </w:rPr>
             </w:pPr>
             <w:r>
               <w:rPr>
                 <w:rFonts w:ascii="Times New Roman" w:hAnsi="Times New Roman" w:cs="Times New Roman"/>
-                <w:b/>
                 <w:sz w:val="24"/>
               </w:rPr>
               <w:t>Nama Mahasiswa</w:t>
@@ -601,14 +583,12 @@
               <w:jc w:val="center"/>
               <w:rPr>
                 <w:rFonts w:ascii="Times New Roman" w:hAnsi="Times New Roman" w:cs="Times New Roman"/>
-                <w:b/>
                 <w:sz w:val="24"/>
               </w:rPr>
             </w:pPr>
             <w:r>
               <w:rPr>
                 <w:rFonts w:ascii="Times New Roman" w:hAnsi="Times New Roman" w:cs="Times New Roman"/>
-                <w:b/>
                 <w:sz w:val="24"/>
               </w:rPr>
               <w:t>:</w:t>
@@ -624,14 +604,12 @@
               <w:spacing w:after="60" w:line="240" w:lineRule="auto"/>
               <w:rPr>
                 <w:rFonts w:ascii="Times New Roman" w:hAnsi="Times New Roman" w:cs="Times New Roman"/>
-                <w:b/>
                 <w:sz w:val="24"/>
               </w:rPr>
             </w:pPr>
             <w:r>
               <w:rPr>
                 <w:rFonts w:ascii="Times New Roman" w:hAnsi="Times New Roman" w:cs="Times New Roman"/>
-                <w:b/>
                 <w:sz w:val="24"/>
               </w:rPr>
               <w:t>Siddharta Pratama Budiono</w:t>
@@ -655,14 +633,12 @@
               <w:spacing w:after="60" w:line="240" w:lineRule="auto"/>
               <w:rPr>
                 <w:rFonts w:ascii="Times New Roman" w:hAnsi="Times New Roman" w:cs="Times New Roman"/>
-                <w:b/>
                 <w:sz w:val="24"/>
               </w:rPr>
             </w:pPr>
             <w:r>
               <w:rPr>
                 <w:rFonts w:ascii="Times New Roman" w:hAnsi="Times New Roman" w:cs="Times New Roman"/>
-                <w:b/>
                 <w:sz w:val="24"/>
               </w:rPr>
               <w:t>NIM</w:t>
@@ -679,14 +655,12 @@
               <w:jc w:val="center"/>
               <w:rPr>
                 <w:rFonts w:ascii="Times New Roman" w:hAnsi="Times New Roman" w:cs="Times New Roman"/>
-                <w:b/>
                 <w:sz w:val="24"/>
               </w:rPr>
             </w:pPr>
             <w:r>
               <w:rPr>
                 <w:rFonts w:ascii="Times New Roman" w:hAnsi="Times New Roman" w:cs="Times New Roman"/>
-                <w:b/>
                 <w:sz w:val="24"/>
               </w:rPr>
               <w:t>:</w:t>
@@ -702,14 +676,12 @@
               <w:spacing w:after="60" w:line="240" w:lineRule="auto"/>
               <w:rPr>
                 <w:rFonts w:ascii="Times New Roman" w:hAnsi="Times New Roman" w:cs="Times New Roman"/>
-                <w:b/>
                 <w:sz w:val="24"/>
               </w:rPr>
             </w:pPr>
             <w:r>
               <w:rPr>
                 <w:rFonts w:ascii="Times New Roman" w:hAnsi="Times New Roman" w:cs="Times New Roman"/>
-                <w:b/>
                 <w:sz w:val="24"/>
               </w:rPr>
               <w:t>312023017</w:t>
@@ -733,14 +705,12 @@
               <w:spacing w:after="60" w:line="240" w:lineRule="auto"/>
               <w:rPr>
                 <w:rFonts w:ascii="Times New Roman" w:hAnsi="Times New Roman" w:cs="Times New Roman"/>
-                <w:b/>
                 <w:sz w:val="24"/>
               </w:rPr>
             </w:pPr>
             <w:r>
               <w:rPr>
                 <w:rFonts w:ascii="Times New Roman" w:hAnsi="Times New Roman" w:cs="Times New Roman"/>
-                <w:b/>
                 <w:sz w:val="24"/>
               </w:rPr>
               <w:t>Program Studi</w:t>
@@ -757,14 +727,12 @@
               <w:jc w:val="center"/>
               <w:rPr>
                 <w:rFonts w:ascii="Times New Roman" w:hAnsi="Times New Roman" w:cs="Times New Roman"/>
-                <w:b/>
                 <w:sz w:val="24"/>
               </w:rPr>
             </w:pPr>
             <w:r>
               <w:rPr>
                 <w:rFonts w:ascii="Times New Roman" w:hAnsi="Times New Roman" w:cs="Times New Roman"/>
-                <w:b/>
                 <w:sz w:val="24"/>
               </w:rPr>
               <w:t>:</w:t>
@@ -780,14 +748,12 @@
               <w:spacing w:after="60" w:line="240" w:lineRule="auto"/>
               <w:rPr>
                 <w:rFonts w:ascii="Times New Roman" w:hAnsi="Times New Roman" w:cs="Times New Roman"/>
-                <w:b/>
                 <w:sz w:val="24"/>
               </w:rPr>
             </w:pPr>
             <w:r>
               <w:rPr>
                 <w:rFonts w:ascii="Times New Roman" w:hAnsi="Times New Roman" w:cs="Times New Roman"/>
-                <w:b/>
                 <w:sz w:val="24"/>
               </w:rPr>
               <w:t>S1 Manajemen</w:t>
@@ -811,14 +777,12 @@
               <w:spacing w:after="60" w:line="240" w:lineRule="auto"/>
               <w:rPr>
                 <w:rFonts w:ascii="Times New Roman" w:hAnsi="Times New Roman" w:cs="Times New Roman"/>
-                <w:b/>
                 <w:sz w:val="24"/>
               </w:rPr>
             </w:pPr>
             <w:r>
               <w:rPr>
                 <w:rFonts w:ascii="Times New Roman" w:hAnsi="Times New Roman" w:cs="Times New Roman"/>
-                <w:b/>
                 <w:sz w:val="24"/>
               </w:rPr>
               <w:t>Konsentrasi</w:t>
@@ -835,14 +799,12 @@
               <w:jc w:val="center"/>
               <w:rPr>
                 <w:rFonts w:ascii="Times New Roman" w:hAnsi="Times New Roman" w:cs="Times New Roman"/>
-                <w:b/>
                 <w:sz w:val="24"/>
               </w:rPr>
             </w:pPr>
             <w:r>
               <w:rPr>
                 <w:rFonts w:ascii="Times New Roman" w:hAnsi="Times New Roman" w:cs="Times New Roman"/>
-                <w:b/>
                 <w:sz w:val="24"/>
               </w:rPr>
               <w:t>:</w:t>
@@ -858,14 +820,12 @@
               <w:spacing w:after="60" w:line="240" w:lineRule="auto"/>
               <w:rPr>
                 <w:rFonts w:ascii="Times New Roman" w:hAnsi="Times New Roman" w:cs="Times New Roman"/>
-                <w:b/>
                 <w:sz w:val="24"/>
               </w:rPr>
             </w:pPr>
             <w:r>
               <w:rPr>
                 <w:rFonts w:ascii="Times New Roman" w:hAnsi="Times New Roman" w:cs="Times New Roman"/>
-                <w:b/>
                 <w:sz w:val="24"/>
               </w:rPr>
               <w:t>Manajemen Pemasaran</w:t>
@@ -889,14 +849,12 @@
               <w:spacing w:after="60" w:line="240" w:lineRule="auto"/>
               <w:rPr>
                 <w:rFonts w:ascii="Times New Roman" w:hAnsi="Times New Roman" w:cs="Times New Roman"/>
-                <w:b/>
                 <w:sz w:val="24"/>
               </w:rPr>
             </w:pPr>
             <w:r>
               <w:rPr>
                 <w:rFonts w:ascii="Times New Roman" w:hAnsi="Times New Roman" w:cs="Times New Roman"/>
-                <w:b/>
                 <w:sz w:val="24"/>
               </w:rPr>
               <w:t>Fakultas</w:t>
@@ -913,14 +871,12 @@
               <w:jc w:val="center"/>
               <w:rPr>
                 <w:rFonts w:ascii="Times New Roman" w:hAnsi="Times New Roman" w:cs="Times New Roman"/>
-                <w:b/>
                 <w:sz w:val="24"/>
               </w:rPr>
             </w:pPr>
             <w:r>
               <w:rPr>
                 <w:rFonts w:ascii="Times New Roman" w:hAnsi="Times New Roman" w:cs="Times New Roman"/>
-                <w:b/>
                 <w:sz w:val="24"/>
               </w:rPr>
               <w:t>:</w:t>
@@ -936,14 +892,12 @@
               <w:spacing w:after="60" w:line="240" w:lineRule="auto"/>
               <w:rPr>
                 <w:rFonts w:ascii="Times New Roman" w:hAnsi="Times New Roman" w:cs="Times New Roman"/>
-                <w:b/>
                 <w:sz w:val="24"/>
               </w:rPr>
             </w:pPr>
             <w:r>
               <w:rPr>
                 <w:rFonts w:ascii="Times New Roman" w:hAnsi="Times New Roman" w:cs="Times New Roman"/>
-                <w:b/>
                 <w:sz w:val="24"/>
               </w:rPr>
               <w:t>Ekonomi dan Bisnis</w:t>
@@ -25994,7 +25948,7 @@
     <w:link w:val="Heading1Char"/>
     <w:uiPriority w:val="9"/>
     <w:qFormat/>
-    <w:rsid w:val="0065529D"/>
+    <w:rsid w:val="000F4832"/>
     <w:pPr>
       <w:keepNext/>
       <w:keepLines/>
@@ -26017,7 +25971,7 @@
     <w:semiHidden/>
     <w:unhideWhenUsed/>
     <w:qFormat/>
-    <w:rsid w:val="0065529D"/>
+    <w:rsid w:val="000F4832"/>
     <w:pPr>
       <w:keepNext/>
       <w:keepLines/>
@@ -26040,7 +25994,7 @@
     <w:semiHidden/>
     <w:unhideWhenUsed/>
     <w:qFormat/>
-    <w:rsid w:val="0065529D"/>
+    <w:rsid w:val="000F4832"/>
     <w:pPr>
       <w:keepNext/>
       <w:keepLines/>
@@ -26063,7 +26017,7 @@
     <w:semiHidden/>
     <w:unhideWhenUsed/>
     <w:qFormat/>
-    <w:rsid w:val="0065529D"/>
+    <w:rsid w:val="000F4832"/>
     <w:pPr>
       <w:keepNext/>
       <w:keepLines/>
@@ -26086,7 +26040,7 @@
     <w:semiHidden/>
     <w:unhideWhenUsed/>
     <w:qFormat/>
-    <w:rsid w:val="0065529D"/>
+    <w:rsid w:val="000F4832"/>
     <w:pPr>
       <w:keepNext/>
       <w:keepLines/>
@@ -26107,7 +26061,7 @@
     <w:semiHidden/>
     <w:unhideWhenUsed/>
     <w:qFormat/>
-    <w:rsid w:val="0065529D"/>
+    <w:rsid w:val="000F4832"/>
     <w:pPr>
       <w:keepNext/>
       <w:keepLines/>
@@ -26130,7 +26084,7 @@
     <w:semiHidden/>
     <w:unhideWhenUsed/>
     <w:qFormat/>
-    <w:rsid w:val="0065529D"/>
+    <w:rsid w:val="000F4832"/>
     <w:pPr>
       <w:keepNext/>
       <w:keepLines/>
@@ -26151,7 +26105,7 @@
     <w:semiHidden/>
     <w:unhideWhenUsed/>
     <w:qFormat/>
-    <w:rsid w:val="0065529D"/>
+    <w:rsid w:val="000F4832"/>
     <w:pPr>
       <w:keepNext/>
       <w:keepLines/>
@@ -26174,7 +26128,7 @@
     <w:semiHidden/>
     <w:unhideWhenUsed/>
     <w:qFormat/>
-    <w:rsid w:val="0065529D"/>
+    <w:rsid w:val="000F4832"/>
     <w:pPr>
       <w:keepNext/>
       <w:keepLines/>
@@ -26218,7 +26172,7 @@
     <w:basedOn w:val="DefaultParagraphFont"/>
     <w:link w:val="Heading1"/>
     <w:uiPriority w:val="9"/>
-    <w:rsid w:val="0065529D"/>
+    <w:rsid w:val="000F4832"/>
     <w:rPr>
       <w:rFonts w:asciiTheme="majorHAnsi" w:eastAsiaTheme="majorEastAsia" w:hAnsiTheme="majorHAnsi" w:cstheme="majorBidi"/>
       <w:color w:val="2F5496" w:themeColor="accent1" w:themeShade="BF"/>
@@ -26232,7 +26186,7 @@
     <w:link w:val="Heading2"/>
     <w:uiPriority w:val="9"/>
     <w:semiHidden/>
-    <w:rsid w:val="0065529D"/>
+    <w:rsid w:val="000F4832"/>
     <w:rPr>
       <w:rFonts w:asciiTheme="majorHAnsi" w:eastAsiaTheme="majorEastAsia" w:hAnsiTheme="majorHAnsi" w:cstheme="majorBidi"/>
       <w:color w:val="2F5496" w:themeColor="accent1" w:themeShade="BF"/>
@@ -26246,7 +26200,7 @@
     <w:link w:val="Heading3"/>
     <w:uiPriority w:val="9"/>
     <w:semiHidden/>
-    <w:rsid w:val="0065529D"/>
+    <w:rsid w:val="000F4832"/>
     <w:rPr>
       <w:rFonts w:eastAsiaTheme="majorEastAsia" w:cstheme="majorBidi"/>
       <w:color w:val="2F5496" w:themeColor="accent1" w:themeShade="BF"/>
@@ -26260,7 +26214,7 @@
     <w:link w:val="Heading4"/>
     <w:uiPriority w:val="9"/>
     <w:semiHidden/>
-    <w:rsid w:val="0065529D"/>
+    <w:rsid w:val="000F4832"/>
     <w:rPr>
       <w:rFonts w:eastAsiaTheme="majorEastAsia" w:cstheme="majorBidi"/>
       <w:i/>
@@ -26274,7 +26228,7 @@
     <w:link w:val="Heading5"/>
     <w:uiPriority w:val="9"/>
     <w:semiHidden/>
-    <w:rsid w:val="0065529D"/>
+    <w:rsid w:val="000F4832"/>
     <w:rPr>
       <w:rFonts w:eastAsiaTheme="majorEastAsia" w:cstheme="majorBidi"/>
       <w:color w:val="2F5496" w:themeColor="accent1" w:themeShade="BF"/>
@@ -26286,7 +26240,7 @@
     <w:link w:val="Heading6"/>
     <w:uiPriority w:val="9"/>
     <w:semiHidden/>
-    <w:rsid w:val="0065529D"/>
+    <w:rsid w:val="000F4832"/>
     <w:rPr>
       <w:rFonts w:eastAsiaTheme="majorEastAsia" w:cstheme="majorBidi"/>
       <w:i/>
@@ -26300,7 +26254,7 @@
     <w:link w:val="Heading7"/>
     <w:uiPriority w:val="9"/>
     <w:semiHidden/>
-    <w:rsid w:val="0065529D"/>
+    <w:rsid w:val="000F4832"/>
     <w:rPr>
       <w:rFonts w:eastAsiaTheme="majorEastAsia" w:cstheme="majorBidi"/>
       <w:color w:val="595959" w:themeColor="text1" w:themeTint="A6"/>
@@ -26312,7 +26266,7 @@
     <w:link w:val="Heading8"/>
     <w:uiPriority w:val="9"/>
     <w:semiHidden/>
-    <w:rsid w:val="0065529D"/>
+    <w:rsid w:val="000F4832"/>
     <w:rPr>
       <w:rFonts w:eastAsiaTheme="majorEastAsia" w:cstheme="majorBidi"/>
       <w:i/>
@@ -26326,7 +26280,7 @@
     <w:link w:val="Heading9"/>
     <w:uiPriority w:val="9"/>
     <w:semiHidden/>
-    <w:rsid w:val="0065529D"/>
+    <w:rsid w:val="000F4832"/>
     <w:rPr>
       <w:rFonts w:eastAsiaTheme="majorEastAsia" w:cstheme="majorBidi"/>
       <w:color w:val="272727" w:themeColor="text1" w:themeTint="D8"/>
@@ -26339,7 +26293,7 @@
     <w:link w:val="TitleChar"/>
     <w:uiPriority w:val="10"/>
     <w:qFormat/>
-    <w:rsid w:val="0065529D"/>
+    <w:rsid w:val="000F4832"/>
     <w:pPr>
       <w:spacing w:after="80" w:line="240" w:lineRule="auto"/>
       <w:contextualSpacing/>
@@ -26357,7 +26311,7 @@
     <w:basedOn w:val="DefaultParagraphFont"/>
     <w:link w:val="Title"/>
     <w:uiPriority w:val="10"/>
-    <w:rsid w:val="0065529D"/>
+    <w:rsid w:val="000F4832"/>
     <w:rPr>
       <w:rFonts w:asciiTheme="majorHAnsi" w:eastAsiaTheme="majorEastAsia" w:hAnsiTheme="majorHAnsi" w:cstheme="majorBidi"/>
       <w:spacing w:val="-10"/>
@@ -26373,7 +26327,7 @@
     <w:link w:val="SubtitleChar"/>
     <w:uiPriority w:val="11"/>
     <w:qFormat/>
-    <w:rsid w:val="0065529D"/>
+    <w:rsid w:val="000F4832"/>
     <w:pPr>
       <w:numPr>
         <w:ilvl w:val="1"/>
@@ -26392,7 +26346,7 @@
     <w:basedOn w:val="DefaultParagraphFont"/>
     <w:link w:val="Subtitle"/>
     <w:uiPriority w:val="11"/>
-    <w:rsid w:val="0065529D"/>
+    <w:rsid w:val="000F4832"/>
     <w:rPr>
       <w:rFonts w:eastAsiaTheme="majorEastAsia" w:cstheme="majorBidi"/>
       <w:color w:val="595959" w:themeColor="text1" w:themeTint="A6"/>
@@ -26408,7 +26362,7 @@
     <w:link w:val="QuoteChar"/>
     <w:uiPriority w:val="29"/>
     <w:qFormat/>
-    <w:rsid w:val="0065529D"/>
+    <w:rsid w:val="000F4832"/>
     <w:pPr>
       <w:spacing w:before="160"/>
       <w:jc w:val="center"/>
@@ -26424,7 +26378,7 @@
     <w:basedOn w:val="DefaultParagraphFont"/>
     <w:link w:val="Quote"/>
     <w:uiPriority w:val="29"/>
-    <w:rsid w:val="0065529D"/>
+    <w:rsid w:val="000F4832"/>
     <w:rPr>
       <w:i/>
       <w:iCs/>
@@ -26436,7 +26390,7 @@
     <w:basedOn w:val="Normal"/>
     <w:uiPriority w:val="34"/>
     <w:qFormat/>
-    <w:rsid w:val="0065529D"/>
+    <w:rsid w:val="000F4832"/>
     <w:pPr>
       <w:ind w:left="720"/>
       <w:contextualSpacing/>
@@ -26447,7 +26401,7 @@
     <w:basedOn w:val="DefaultParagraphFont"/>
     <w:uiPriority w:val="21"/>
     <w:qFormat/>
-    <w:rsid w:val="0065529D"/>
+    <w:rsid w:val="000F4832"/>
     <w:rPr>
       <w:i/>
       <w:iCs/>
@@ -26461,7 +26415,7 @@
     <w:link w:val="IntenseQuoteChar"/>
     <w:uiPriority w:val="30"/>
     <w:qFormat/>
-    <w:rsid w:val="0065529D"/>
+    <w:rsid w:val="000F4832"/>
     <w:pPr>
       <w:pBdr>
         <w:top w:val="single" w:sz="4" w:space="10" w:color="2F5496" w:themeColor="accent1" w:themeShade="BF"/>
@@ -26482,7 +26436,7 @@
     <w:basedOn w:val="DefaultParagraphFont"/>
     <w:link w:val="IntenseQuote"/>
     <w:uiPriority w:val="30"/>
-    <w:rsid w:val="0065529D"/>
+    <w:rsid w:val="000F4832"/>
     <w:rPr>
       <w:i/>
       <w:iCs/>
@@ -26494,7 +26448,7 @@
     <w:basedOn w:val="DefaultParagraphFont"/>
     <w:uiPriority w:val="32"/>
     <w:qFormat/>
-    <w:rsid w:val="0065529D"/>
+    <w:rsid w:val="000F4832"/>
     <w:rPr>
       <w:b/>
       <w:bCs/>

</xml_diff>

<commit_message>
feat(persetujuan): ubah dosen pembimbing menjadi Dr. Bernardus Wishman Simbora Siregar, S.E, M.E.
</commit_message>
<xml_diff>
--- a/TOPIK_2_TAKSI_GREEN_SM/01_Naskah_Utama/Proposal_Skripsi_Taksi_Green_SM.docx
+++ b/TOPIK_2_TAKSI_GREEN_SM/01_Naskah_Utama/Proposal_Skripsi_Taksi_Green_SM.docx
@@ -12,16 +12,16 @@
           <w:noProof/>
         </w:rPr>
         <w:drawing>
-          <wp:inline distT="0" distB="0" distL="0" distR="0" wp14:anchorId="29F7C0DD" wp14:editId="484702D7">
+          <wp:inline distT="0" distB="0" distL="0" distR="0" wp14:anchorId="75C04D3B" wp14:editId="4188F645">
             <wp:extent cx="1152002" cy="1152002"/>
             <wp:effectExtent l="0" t="0" r="0" b="0"/>
-            <wp:docPr id="2036152948" name="Picture 1"/>
+            <wp:docPr id="757274374" name="Picture 1"/>
             <wp:cNvGraphicFramePr/>
             <a:graphic xmlns:a="http://schemas.openxmlformats.org/drawingml/2006/main">
               <a:graphicData uri="http://schemas.openxmlformats.org/drawingml/2006/picture">
                 <pic:pic xmlns:pic="http://schemas.openxmlformats.org/drawingml/2006/picture">
                   <pic:nvPicPr>
-                    <pic:cNvPr id="2036152948" name=""/>
+                    <pic:cNvPr id="757274374" name=""/>
                     <pic:cNvPicPr/>
                   </pic:nvPicPr>
                   <pic:blipFill>
@@ -991,7 +991,7 @@
           <w:b/>
           <w:sz w:val="24"/>
         </w:rPr>
-        <w:t>(Dr. Fredella Colline, S.E., M.M.)</w:t>
+        <w:t>(Dr. Bernardus Wishman Simbora Siregar, S.E, M.E.)</w:t>
       </w:r>
     </w:p>
     <w:p>
@@ -1006,7 +1006,7 @@
         <w:rPr>
           <w:rFonts w:ascii="Times New Roman" w:hAnsi="Times New Roman" w:cs="Times New Roman"/>
         </w:rPr>
-        <w:t>NIDN: 0315049001</w:t>
+        <w:t>NIDN: ....................................</w:t>
       </w:r>
     </w:p>
     <w:p>
@@ -19265,7 +19265,7 @@
           <w:rFonts w:ascii="Times New Roman" w:hAnsi="Times New Roman" w:cs="Times New Roman"/>
           <w:sz w:val="24"/>
         </w:rPr>
-        <w:t>Dosen Pembimbing: Dr. Fredella Colline, S.E., M.M.</w:t>
+        <w:t>Dosen Pembimbing: Dr. Bernardus Wishman Simbora Siregar, S.E, M.E.</w:t>
       </w:r>
     </w:p>
     <w:p>
@@ -25948,7 +25948,7 @@
     <w:link w:val="Heading1Char"/>
     <w:uiPriority w:val="9"/>
     <w:qFormat/>
-    <w:rsid w:val="000F4832"/>
+    <w:rsid w:val="00DE5993"/>
     <w:pPr>
       <w:keepNext/>
       <w:keepLines/>
@@ -25971,7 +25971,7 @@
     <w:semiHidden/>
     <w:unhideWhenUsed/>
     <w:qFormat/>
-    <w:rsid w:val="000F4832"/>
+    <w:rsid w:val="00DE5993"/>
     <w:pPr>
       <w:keepNext/>
       <w:keepLines/>
@@ -25994,7 +25994,7 @@
     <w:semiHidden/>
     <w:unhideWhenUsed/>
     <w:qFormat/>
-    <w:rsid w:val="000F4832"/>
+    <w:rsid w:val="00DE5993"/>
     <w:pPr>
       <w:keepNext/>
       <w:keepLines/>
@@ -26017,7 +26017,7 @@
     <w:semiHidden/>
     <w:unhideWhenUsed/>
     <w:qFormat/>
-    <w:rsid w:val="000F4832"/>
+    <w:rsid w:val="00DE5993"/>
     <w:pPr>
       <w:keepNext/>
       <w:keepLines/>
@@ -26040,7 +26040,7 @@
     <w:semiHidden/>
     <w:unhideWhenUsed/>
     <w:qFormat/>
-    <w:rsid w:val="000F4832"/>
+    <w:rsid w:val="00DE5993"/>
     <w:pPr>
       <w:keepNext/>
       <w:keepLines/>
@@ -26061,7 +26061,7 @@
     <w:semiHidden/>
     <w:unhideWhenUsed/>
     <w:qFormat/>
-    <w:rsid w:val="000F4832"/>
+    <w:rsid w:val="00DE5993"/>
     <w:pPr>
       <w:keepNext/>
       <w:keepLines/>
@@ -26084,7 +26084,7 @@
     <w:semiHidden/>
     <w:unhideWhenUsed/>
     <w:qFormat/>
-    <w:rsid w:val="000F4832"/>
+    <w:rsid w:val="00DE5993"/>
     <w:pPr>
       <w:keepNext/>
       <w:keepLines/>
@@ -26105,7 +26105,7 @@
     <w:semiHidden/>
     <w:unhideWhenUsed/>
     <w:qFormat/>
-    <w:rsid w:val="000F4832"/>
+    <w:rsid w:val="00DE5993"/>
     <w:pPr>
       <w:keepNext/>
       <w:keepLines/>
@@ -26128,7 +26128,7 @@
     <w:semiHidden/>
     <w:unhideWhenUsed/>
     <w:qFormat/>
-    <w:rsid w:val="000F4832"/>
+    <w:rsid w:val="00DE5993"/>
     <w:pPr>
       <w:keepNext/>
       <w:keepLines/>
@@ -26172,7 +26172,7 @@
     <w:basedOn w:val="DefaultParagraphFont"/>
     <w:link w:val="Heading1"/>
     <w:uiPriority w:val="9"/>
-    <w:rsid w:val="000F4832"/>
+    <w:rsid w:val="00DE5993"/>
     <w:rPr>
       <w:rFonts w:asciiTheme="majorHAnsi" w:eastAsiaTheme="majorEastAsia" w:hAnsiTheme="majorHAnsi" w:cstheme="majorBidi"/>
       <w:color w:val="2F5496" w:themeColor="accent1" w:themeShade="BF"/>
@@ -26186,7 +26186,7 @@
     <w:link w:val="Heading2"/>
     <w:uiPriority w:val="9"/>
     <w:semiHidden/>
-    <w:rsid w:val="000F4832"/>
+    <w:rsid w:val="00DE5993"/>
     <w:rPr>
       <w:rFonts w:asciiTheme="majorHAnsi" w:eastAsiaTheme="majorEastAsia" w:hAnsiTheme="majorHAnsi" w:cstheme="majorBidi"/>
       <w:color w:val="2F5496" w:themeColor="accent1" w:themeShade="BF"/>
@@ -26200,7 +26200,7 @@
     <w:link w:val="Heading3"/>
     <w:uiPriority w:val="9"/>
     <w:semiHidden/>
-    <w:rsid w:val="000F4832"/>
+    <w:rsid w:val="00DE5993"/>
     <w:rPr>
       <w:rFonts w:eastAsiaTheme="majorEastAsia" w:cstheme="majorBidi"/>
       <w:color w:val="2F5496" w:themeColor="accent1" w:themeShade="BF"/>
@@ -26214,7 +26214,7 @@
     <w:link w:val="Heading4"/>
     <w:uiPriority w:val="9"/>
     <w:semiHidden/>
-    <w:rsid w:val="000F4832"/>
+    <w:rsid w:val="00DE5993"/>
     <w:rPr>
       <w:rFonts w:eastAsiaTheme="majorEastAsia" w:cstheme="majorBidi"/>
       <w:i/>
@@ -26228,7 +26228,7 @@
     <w:link w:val="Heading5"/>
     <w:uiPriority w:val="9"/>
     <w:semiHidden/>
-    <w:rsid w:val="000F4832"/>
+    <w:rsid w:val="00DE5993"/>
     <w:rPr>
       <w:rFonts w:eastAsiaTheme="majorEastAsia" w:cstheme="majorBidi"/>
       <w:color w:val="2F5496" w:themeColor="accent1" w:themeShade="BF"/>
@@ -26240,7 +26240,7 @@
     <w:link w:val="Heading6"/>
     <w:uiPriority w:val="9"/>
     <w:semiHidden/>
-    <w:rsid w:val="000F4832"/>
+    <w:rsid w:val="00DE5993"/>
     <w:rPr>
       <w:rFonts w:eastAsiaTheme="majorEastAsia" w:cstheme="majorBidi"/>
       <w:i/>
@@ -26254,7 +26254,7 @@
     <w:link w:val="Heading7"/>
     <w:uiPriority w:val="9"/>
     <w:semiHidden/>
-    <w:rsid w:val="000F4832"/>
+    <w:rsid w:val="00DE5993"/>
     <w:rPr>
       <w:rFonts w:eastAsiaTheme="majorEastAsia" w:cstheme="majorBidi"/>
       <w:color w:val="595959" w:themeColor="text1" w:themeTint="A6"/>
@@ -26266,7 +26266,7 @@
     <w:link w:val="Heading8"/>
     <w:uiPriority w:val="9"/>
     <w:semiHidden/>
-    <w:rsid w:val="000F4832"/>
+    <w:rsid w:val="00DE5993"/>
     <w:rPr>
       <w:rFonts w:eastAsiaTheme="majorEastAsia" w:cstheme="majorBidi"/>
       <w:i/>
@@ -26280,7 +26280,7 @@
     <w:link w:val="Heading9"/>
     <w:uiPriority w:val="9"/>
     <w:semiHidden/>
-    <w:rsid w:val="000F4832"/>
+    <w:rsid w:val="00DE5993"/>
     <w:rPr>
       <w:rFonts w:eastAsiaTheme="majorEastAsia" w:cstheme="majorBidi"/>
       <w:color w:val="272727" w:themeColor="text1" w:themeTint="D8"/>
@@ -26293,7 +26293,7 @@
     <w:link w:val="TitleChar"/>
     <w:uiPriority w:val="10"/>
     <w:qFormat/>
-    <w:rsid w:val="000F4832"/>
+    <w:rsid w:val="00DE5993"/>
     <w:pPr>
       <w:spacing w:after="80" w:line="240" w:lineRule="auto"/>
       <w:contextualSpacing/>
@@ -26311,7 +26311,7 @@
     <w:basedOn w:val="DefaultParagraphFont"/>
     <w:link w:val="Title"/>
     <w:uiPriority w:val="10"/>
-    <w:rsid w:val="000F4832"/>
+    <w:rsid w:val="00DE5993"/>
     <w:rPr>
       <w:rFonts w:asciiTheme="majorHAnsi" w:eastAsiaTheme="majorEastAsia" w:hAnsiTheme="majorHAnsi" w:cstheme="majorBidi"/>
       <w:spacing w:val="-10"/>
@@ -26327,7 +26327,7 @@
     <w:link w:val="SubtitleChar"/>
     <w:uiPriority w:val="11"/>
     <w:qFormat/>
-    <w:rsid w:val="000F4832"/>
+    <w:rsid w:val="00DE5993"/>
     <w:pPr>
       <w:numPr>
         <w:ilvl w:val="1"/>
@@ -26346,7 +26346,7 @@
     <w:basedOn w:val="DefaultParagraphFont"/>
     <w:link w:val="Subtitle"/>
     <w:uiPriority w:val="11"/>
-    <w:rsid w:val="000F4832"/>
+    <w:rsid w:val="00DE5993"/>
     <w:rPr>
       <w:rFonts w:eastAsiaTheme="majorEastAsia" w:cstheme="majorBidi"/>
       <w:color w:val="595959" w:themeColor="text1" w:themeTint="A6"/>
@@ -26362,7 +26362,7 @@
     <w:link w:val="QuoteChar"/>
     <w:uiPriority w:val="29"/>
     <w:qFormat/>
-    <w:rsid w:val="000F4832"/>
+    <w:rsid w:val="00DE5993"/>
     <w:pPr>
       <w:spacing w:before="160"/>
       <w:jc w:val="center"/>
@@ -26378,7 +26378,7 @@
     <w:basedOn w:val="DefaultParagraphFont"/>
     <w:link w:val="Quote"/>
     <w:uiPriority w:val="29"/>
-    <w:rsid w:val="000F4832"/>
+    <w:rsid w:val="00DE5993"/>
     <w:rPr>
       <w:i/>
       <w:iCs/>
@@ -26390,7 +26390,7 @@
     <w:basedOn w:val="Normal"/>
     <w:uiPriority w:val="34"/>
     <w:qFormat/>
-    <w:rsid w:val="000F4832"/>
+    <w:rsid w:val="00DE5993"/>
     <w:pPr>
       <w:ind w:left="720"/>
       <w:contextualSpacing/>
@@ -26401,7 +26401,7 @@
     <w:basedOn w:val="DefaultParagraphFont"/>
     <w:uiPriority w:val="21"/>
     <w:qFormat/>
-    <w:rsid w:val="000F4832"/>
+    <w:rsid w:val="00DE5993"/>
     <w:rPr>
       <w:i/>
       <w:iCs/>
@@ -26415,7 +26415,7 @@
     <w:link w:val="IntenseQuoteChar"/>
     <w:uiPriority w:val="30"/>
     <w:qFormat/>
-    <w:rsid w:val="000F4832"/>
+    <w:rsid w:val="00DE5993"/>
     <w:pPr>
       <w:pBdr>
         <w:top w:val="single" w:sz="4" w:space="10" w:color="2F5496" w:themeColor="accent1" w:themeShade="BF"/>
@@ -26436,7 +26436,7 @@
     <w:basedOn w:val="DefaultParagraphFont"/>
     <w:link w:val="IntenseQuote"/>
     <w:uiPriority w:val="30"/>
-    <w:rsid w:val="000F4832"/>
+    <w:rsid w:val="00DE5993"/>
     <w:rPr>
       <w:i/>
       <w:iCs/>
@@ -26448,7 +26448,7 @@
     <w:basedOn w:val="DefaultParagraphFont"/>
     <w:uiPriority w:val="32"/>
     <w:qFormat/>
-    <w:rsid w:val="000F4832"/>
+    <w:rsid w:val="00DE5993"/>
     <w:rPr>
       <w:b/>
       <w:bCs/>

</xml_diff>

<commit_message>
feat(bab1): integrasikan data faktual IEA, BPS, dan DLH DKI pada alinea 1 serta buat pustaka Mendeley RIS
</commit_message>
<xml_diff>
--- a/TOPIK_2_TAKSI_GREEN_SM/01_Naskah_Utama/Proposal_Skripsi_Taksi_Green_SM.docx
+++ b/TOPIK_2_TAKSI_GREEN_SM/01_Naskah_Utama/Proposal_Skripsi_Taksi_Green_SM.docx
@@ -12,16 +12,16 @@
           <w:noProof/>
         </w:rPr>
         <w:drawing>
-          <wp:inline distT="0" distB="0" distL="0" distR="0" wp14:anchorId="75C04D3B" wp14:editId="4188F645">
+          <wp:inline distT="0" distB="0" distL="0" distR="0" wp14:anchorId="0B343F15" wp14:editId="24C3C6AC">
             <wp:extent cx="1152002" cy="1152002"/>
             <wp:effectExtent l="0" t="0" r="0" b="0"/>
-            <wp:docPr id="757274374" name="Picture 1"/>
+            <wp:docPr id="907904461" name="Picture 1"/>
             <wp:cNvGraphicFramePr/>
             <a:graphic xmlns:a="http://schemas.openxmlformats.org/drawingml/2006/main">
               <a:graphicData uri="http://schemas.openxmlformats.org/drawingml/2006/picture">
                 <pic:pic xmlns:pic="http://schemas.openxmlformats.org/drawingml/2006/picture">
                   <pic:nvPicPr>
-                    <pic:cNvPr id="757274374" name=""/>
+                    <pic:cNvPr id="907904461" name=""/>
                     <pic:cNvPicPr/>
                   </pic:nvPicPr>
                   <pic:blipFill>
@@ -1905,7 +1905,22 @@
           <w:rFonts w:ascii="Times New Roman" w:hAnsi="Times New Roman" w:cs="Times New Roman"/>
           <w:sz w:val="24"/>
         </w:rPr>
-        <w:t>Perkembangan sektor transportasi perkotaan di era modern tengah mengalami disrupsi fundamental yang didorong oleh akselerasi transisi energi hijau dan dekarbonisasi mobilitas. Sebagai salah satu kota megapolitan terpadat di Asia Tenggara, Provinsi Daerah Khusus Ibukota (DKI) Jakarta menghadapi tantangan kronis berupa degradasi kualitas udara dan tingginya emisi gas buang sektor transportasi darat. Merespons permasalahan tersebut, Pemerintah Republik Indonesia telah menetapkan landasan regulasi strategis melalui Peraturan Presiden (Perpres) Nomor 55 Tahun 2019 tentang Percepatan Program Kendaraan Bermotor Listrik Berbasis Baterai (</w:t>
+        <w:t>Perkembangan sektor transportasi perkotaan di era modern tengah mengalami disrupsi fundamental yang didorong oleh akselerasi transisi energi hijau dan dekarbonisasi mobilitas global (International Energy Agency [IEA], 2023). Sebagai salah satu kawasan megapolitan terpadat di Asia Tenggara dengan jumlah kendaraan bermotor aktif yang telah melampaui 21,8 juta unit (Badan Pusat Statistik [BPS] Provinsi DKI Jakarta, 2023), Provinsi Daerah Khusus Ibukota (DKI) Jakarta menghadapi tantangan kronis berupa degradasi kualitas udara. Laporan inventarisasi emisi Dinas Lingkungan Hidup Provinsi DKI Jakarta bersama Vital Strategies (2020) mencatat bahwa sektor transportasi darat merupakan kontributor terbesar pencemaran udara di ibu kota, yang menyumbang antara 44% hingga 67% terhadap total emisi partikulat berbahaya (</w:t>
+      </w:r>
+      <w:r>
+        <w:rPr>
+          <w:rFonts w:ascii="Times New Roman" w:hAnsi="Times New Roman" w:cs="Times New Roman"/>
+          <w:i/>
+          <w:sz w:val="24"/>
+        </w:rPr>
+        <w:t>Particulate Matter</w:t>
+      </w:r>
+      <w:r>
+        <w:rPr>
+          <w:rFonts w:ascii="Times New Roman" w:hAnsi="Times New Roman" w:cs="Times New Roman"/>
+          <w:sz w:val="24"/>
+        </w:rPr>
+        <w:t xml:space="preserve"> / PM2.5) serta mendominasi emisi gas buang karbon monoksida (CO) dan nitrogen oksida (NOx). Merespons permasalahan lingkungan yang mendesak tersebut, Pemerintah Republik Indonesia telah menetapkan landasan regulasi strategis melalui Peraturan Presiden (Perpres) Nomor 55 Tahun 2019 tentang Percepatan Program Kendaraan Bermotor Listrik Berbasis Baterai (</w:t>
       </w:r>
       <w:r>
         <w:rPr>
@@ -1920,7 +1935,7 @@
           <w:rFonts w:ascii="Times New Roman" w:hAnsi="Times New Roman" w:cs="Times New Roman"/>
           <w:sz w:val="24"/>
         </w:rPr>
-        <w:t>) untuk Transportasi Jalan, yang kemudian diperkuat oleh kebijakan Pemerintah Provinsi DKI Jakarta dalam mendorong elektrifikasi armada transportasi publik dan angkutan sewa khusus.</w:t>
+        <w:t>) untuk Transportasi Jalan, yang kemudian diperkuat di tingkat daerah melalui Peraturan Gubernur DKI Jakarta Nomor 90 Tahun 2021 tentang Rencana Pembangunan Rendah Karbon Daerah yang menargetkan pemangkasan emisi Gas Rumah Kaca (GRK) sebesar 30% pada tahun 2030 melalui akselerasi elektrifikasi armada transportasi publik dan angkutan sewa khusus.</w:t>
       </w:r>
     </w:p>
     <w:p>
@@ -17465,22 +17480,7 @@
           <w:rFonts w:ascii="Times New Roman" w:hAnsi="Times New Roman" w:cs="Times New Roman"/>
           <w:sz w:val="24"/>
         </w:rPr>
-        <w:t xml:space="preserve">Bauer, R. A. (1960). </w:t>
-      </w:r>
-      <w:r>
-        <w:rPr>
-          <w:rFonts w:ascii="Times New Roman" w:hAnsi="Times New Roman" w:cs="Times New Roman"/>
-          <w:i/>
-          <w:sz w:val="24"/>
-        </w:rPr>
-        <w:t>Consumer behavior</w:t>
-      </w:r>
-      <w:r>
-        <w:rPr>
-          <w:rFonts w:ascii="Times New Roman" w:hAnsi="Times New Roman" w:cs="Times New Roman"/>
-          <w:sz w:val="24"/>
-        </w:rPr>
-        <w:t xml:space="preserve"> as risk taking. In R. S. Hancock (Ed.), Dynamic Marketing for a Changing World (pp. 389–398). American Marketing Association.</w:t>
+        <w:t>Badan Pusat Statistik Provinsi DKI Jakarta. (2023). Provinsi DKI Jakarta dalam angka 2023. BPS Provinsi DKI Jakarta.</w:t>
       </w:r>
     </w:p>
     <w:p>
@@ -17499,37 +17499,22 @@
           <w:rFonts w:ascii="Times New Roman" w:hAnsi="Times New Roman" w:cs="Times New Roman"/>
           <w:sz w:val="24"/>
         </w:rPr>
-        <w:t xml:space="preserve">Cunningham, S. M. (1967). The major dimensions of </w:t>
-      </w:r>
-      <w:r>
-        <w:rPr>
-          <w:rFonts w:ascii="Times New Roman" w:hAnsi="Times New Roman" w:cs="Times New Roman"/>
-          <w:i/>
-          <w:sz w:val="24"/>
-        </w:rPr>
-        <w:t>perceived risk</w:t>
-      </w:r>
-      <w:r>
-        <w:rPr>
-          <w:rFonts w:ascii="Times New Roman" w:hAnsi="Times New Roman" w:cs="Times New Roman"/>
-          <w:sz w:val="24"/>
-        </w:rPr>
-        <w:t xml:space="preserve">. In D. F. Cox (Ed.), Risk Taking and Information Handling in </w:t>
-      </w:r>
-      <w:r>
-        <w:rPr>
-          <w:rFonts w:ascii="Times New Roman" w:hAnsi="Times New Roman" w:cs="Times New Roman"/>
-          <w:i/>
-          <w:sz w:val="24"/>
-        </w:rPr>
-        <w:t>Consumer Behavior</w:t>
-      </w:r>
-      <w:r>
-        <w:rPr>
-          <w:rFonts w:ascii="Times New Roman" w:hAnsi="Times New Roman" w:cs="Times New Roman"/>
-          <w:sz w:val="24"/>
-        </w:rPr>
-        <w:t xml:space="preserve"> (pp. 82–108). Harvard University Press.</w:t>
+        <w:t xml:space="preserve">Bauer, R. A. (1960). </w:t>
+      </w:r>
+      <w:r>
+        <w:rPr>
+          <w:rFonts w:ascii="Times New Roman" w:hAnsi="Times New Roman" w:cs="Times New Roman"/>
+          <w:i/>
+          <w:sz w:val="24"/>
+        </w:rPr>
+        <w:t>Consumer behavior</w:t>
+      </w:r>
+      <w:r>
+        <w:rPr>
+          <w:rFonts w:ascii="Times New Roman" w:hAnsi="Times New Roman" w:cs="Times New Roman"/>
+          <w:sz w:val="24"/>
+        </w:rPr>
+        <w:t xml:space="preserve"> as risk taking. In R. S. Hancock (Ed.), Dynamic Marketing for a Changing World (pp. 389–398). American Marketing Association.</w:t>
       </w:r>
     </w:p>
     <w:p>
@@ -17548,7 +17533,37 @@
           <w:rFonts w:ascii="Times New Roman" w:hAnsi="Times New Roman" w:cs="Times New Roman"/>
           <w:sz w:val="24"/>
         </w:rPr>
-        <w:t>Fakultas Ekonomi dan Bisnis Universitas Kristen Krida Wacana. (2023). Buku pedoman penyusunan tugas akhir program sarjana (SK Dekan No. 350a/SK/UKKW/FEB/D/VI/2023). FEB UKRIDA.</w:t>
+        <w:t xml:space="preserve">Cunningham, S. M. (1967). The major dimensions of </w:t>
+      </w:r>
+      <w:r>
+        <w:rPr>
+          <w:rFonts w:ascii="Times New Roman" w:hAnsi="Times New Roman" w:cs="Times New Roman"/>
+          <w:i/>
+          <w:sz w:val="24"/>
+        </w:rPr>
+        <w:t>perceived risk</w:t>
+      </w:r>
+      <w:r>
+        <w:rPr>
+          <w:rFonts w:ascii="Times New Roman" w:hAnsi="Times New Roman" w:cs="Times New Roman"/>
+          <w:sz w:val="24"/>
+        </w:rPr>
+        <w:t xml:space="preserve">. In D. F. Cox (Ed.), Risk Taking and Information Handling in </w:t>
+      </w:r>
+      <w:r>
+        <w:rPr>
+          <w:rFonts w:ascii="Times New Roman" w:hAnsi="Times New Roman" w:cs="Times New Roman"/>
+          <w:i/>
+          <w:sz w:val="24"/>
+        </w:rPr>
+        <w:t>Consumer Behavior</w:t>
+      </w:r>
+      <w:r>
+        <w:rPr>
+          <w:rFonts w:ascii="Times New Roman" w:hAnsi="Times New Roman" w:cs="Times New Roman"/>
+          <w:sz w:val="24"/>
+        </w:rPr>
+        <w:t xml:space="preserve"> (pp. 82–108). Harvard University Press.</w:t>
       </w:r>
     </w:p>
     <w:p>
@@ -17567,22 +17582,7 @@
           <w:rFonts w:ascii="Times New Roman" w:hAnsi="Times New Roman" w:cs="Times New Roman"/>
           <w:sz w:val="24"/>
         </w:rPr>
-        <w:t xml:space="preserve">Ghozali, I. (2021). Aplikasi analisis multivariate dengan program </w:t>
-      </w:r>
-      <w:r>
-        <w:rPr>
-          <w:rFonts w:ascii="Times New Roman" w:hAnsi="Times New Roman" w:cs="Times New Roman"/>
-          <w:i/>
-          <w:sz w:val="24"/>
-        </w:rPr>
-        <w:t>IBM SPSS</w:t>
-      </w:r>
-      <w:r>
-        <w:rPr>
-          <w:rFonts w:ascii="Times New Roman" w:hAnsi="Times New Roman" w:cs="Times New Roman"/>
-          <w:sz w:val="24"/>
-        </w:rPr>
-        <w:t xml:space="preserve"> 26 (Edisi ke-10). Badan Penerbit Universitas Diponegoro.</w:t>
+        <w:t>Dinas Lingkungan Hidup Provinsi DKI Jakarta, &amp; Vital Strategies. (2020). Inventarisasi emisi pencemaran udara Provinsi DKI Jakarta. Dinas Lingkungan Hidup Provinsi DKI Jakarta.</w:t>
       </w:r>
     </w:p>
     <w:p>
@@ -17601,7 +17601,7 @@
           <w:rFonts w:ascii="Times New Roman" w:hAnsi="Times New Roman" w:cs="Times New Roman"/>
           <w:sz w:val="24"/>
         </w:rPr>
-        <w:t>Hair, J. F., Black, W. C., Babin, B. J., &amp; Anderson, R. E. (2019). Multivariate data analysis (8th ed.). Cengage Learning.</w:t>
+        <w:t>Fakultas Ekonomi dan Bisnis Universitas Kristen Krida Wacana. (2023). Buku pedoman penyusunan tugas akhir program sarjana (SK Dekan No. 350a/SK/UKKW/FEB/D/VI/2023). FEB UKRIDA.</w:t>
       </w:r>
     </w:p>
     <w:p>
@@ -17620,22 +17620,22 @@
           <w:rFonts w:ascii="Times New Roman" w:hAnsi="Times New Roman" w:cs="Times New Roman"/>
           <w:sz w:val="24"/>
         </w:rPr>
-        <w:t xml:space="preserve">Keller, K. L. (1993). Conceptualizing, measuring, and managing </w:t>
-      </w:r>
-      <w:r>
-        <w:rPr>
-          <w:rFonts w:ascii="Times New Roman" w:hAnsi="Times New Roman" w:cs="Times New Roman"/>
-          <w:i/>
-          <w:sz w:val="24"/>
-        </w:rPr>
-        <w:t>customer-based brand equity</w:t>
-      </w:r>
-      <w:r>
-        <w:rPr>
-          <w:rFonts w:ascii="Times New Roman" w:hAnsi="Times New Roman" w:cs="Times New Roman"/>
-          <w:sz w:val="24"/>
-        </w:rPr>
-        <w:t>. Journal of Marketing, 57(1), 1–22. https://doi.org/10.1177/002224299305700101</w:t>
+        <w:t xml:space="preserve">Ghozali, I. (2021). Aplikasi analisis multivariate dengan program </w:t>
+      </w:r>
+      <w:r>
+        <w:rPr>
+          <w:rFonts w:ascii="Times New Roman" w:hAnsi="Times New Roman" w:cs="Times New Roman"/>
+          <w:i/>
+          <w:sz w:val="24"/>
+        </w:rPr>
+        <w:t>IBM SPSS</w:t>
+      </w:r>
+      <w:r>
+        <w:rPr>
+          <w:rFonts w:ascii="Times New Roman" w:hAnsi="Times New Roman" w:cs="Times New Roman"/>
+          <w:sz w:val="24"/>
+        </w:rPr>
+        <w:t xml:space="preserve"> 26 (Edisi ke-10). Badan Penerbit Universitas Diponegoro.</w:t>
       </w:r>
     </w:p>
     <w:p>
@@ -17654,37 +17654,7 @@
           <w:rFonts w:ascii="Times New Roman" w:hAnsi="Times New Roman" w:cs="Times New Roman"/>
           <w:sz w:val="24"/>
         </w:rPr>
-        <w:t xml:space="preserve">Keller, K. L. (2013). Strategic </w:t>
-      </w:r>
-      <w:r>
-        <w:rPr>
-          <w:rFonts w:ascii="Times New Roman" w:hAnsi="Times New Roman" w:cs="Times New Roman"/>
-          <w:i/>
-          <w:sz w:val="24"/>
-        </w:rPr>
-        <w:t>brand management</w:t>
-      </w:r>
-      <w:r>
-        <w:rPr>
-          <w:rFonts w:ascii="Times New Roman" w:hAnsi="Times New Roman" w:cs="Times New Roman"/>
-          <w:sz w:val="24"/>
-        </w:rPr>
-        <w:t xml:space="preserve">: Building, measuring, and managing </w:t>
-      </w:r>
-      <w:r>
-        <w:rPr>
-          <w:rFonts w:ascii="Times New Roman" w:hAnsi="Times New Roman" w:cs="Times New Roman"/>
-          <w:i/>
-          <w:sz w:val="24"/>
-        </w:rPr>
-        <w:t>brand equity</w:t>
-      </w:r>
-      <w:r>
-        <w:rPr>
-          <w:rFonts w:ascii="Times New Roman" w:hAnsi="Times New Roman" w:cs="Times New Roman"/>
-          <w:sz w:val="24"/>
-        </w:rPr>
-        <w:t xml:space="preserve"> (4th ed.). Pearson Education.</w:t>
+        <w:t>Hair, J. F., Black, W. C., Babin, B. J., &amp; Anderson, R. E. (2019). Multivariate data analysis (8th ed.). Cengage Learning.</w:t>
       </w:r>
     </w:p>
     <w:p>
@@ -17703,7 +17673,7 @@
           <w:rFonts w:ascii="Times New Roman" w:hAnsi="Times New Roman" w:cs="Times New Roman"/>
           <w:sz w:val="24"/>
         </w:rPr>
-        <w:t>Kotler, P., &amp; Keller, K. L. (2016). Marketing management (15th ed.). Pearson Education.</w:t>
+        <w:t>International Energy Agency. (2023). Global EV outlook 2023: Catching up with climate targets. IEA Publications. https://doi.org/10.1787/d4349524-en</w:t>
       </w:r>
     </w:p>
     <w:p>
@@ -17722,22 +17692,22 @@
           <w:rFonts w:ascii="Times New Roman" w:hAnsi="Times New Roman" w:cs="Times New Roman"/>
           <w:sz w:val="24"/>
         </w:rPr>
-        <w:t xml:space="preserve">Lemeshow, S., Hosmer, D. W., Klar, J., &amp; Lwanga, S. K. (1997). Adequacy of </w:t>
-      </w:r>
-      <w:r>
-        <w:rPr>
-          <w:rFonts w:ascii="Times New Roman" w:hAnsi="Times New Roman" w:cs="Times New Roman"/>
-          <w:i/>
-          <w:sz w:val="24"/>
-        </w:rPr>
-        <w:t>sample size</w:t>
-      </w:r>
-      <w:r>
-        <w:rPr>
-          <w:rFonts w:ascii="Times New Roman" w:hAnsi="Times New Roman" w:cs="Times New Roman"/>
-          <w:sz w:val="24"/>
-        </w:rPr>
-        <w:t xml:space="preserve"> in health studies. John Wiley &amp; Sons.</w:t>
+        <w:t xml:space="preserve">Keller, K. L. (1993). Conceptualizing, measuring, and managing </w:t>
+      </w:r>
+      <w:r>
+        <w:rPr>
+          <w:rFonts w:ascii="Times New Roman" w:hAnsi="Times New Roman" w:cs="Times New Roman"/>
+          <w:i/>
+          <w:sz w:val="24"/>
+        </w:rPr>
+        <w:t>customer-based brand equity</w:t>
+      </w:r>
+      <w:r>
+        <w:rPr>
+          <w:rFonts w:ascii="Times New Roman" w:hAnsi="Times New Roman" w:cs="Times New Roman"/>
+          <w:sz w:val="24"/>
+        </w:rPr>
+        <w:t>. Journal of Marketing, 57(1), 1–22. https://doi.org/10.1177/002224299305700101</w:t>
       </w:r>
     </w:p>
     <w:p>
@@ -17756,22 +17726,37 @@
           <w:rFonts w:ascii="Times New Roman" w:hAnsi="Times New Roman" w:cs="Times New Roman"/>
           <w:sz w:val="24"/>
         </w:rPr>
-        <w:t>Republik Indonesia. (2019). Peraturan Presiden Nomor 55 Tahun 2019 tentang Percepatan Program Kendaraan Bermotor Listrik Berbasis Baterai (</w:t>
-      </w:r>
-      <w:r>
-        <w:rPr>
-          <w:rFonts w:ascii="Times New Roman" w:hAnsi="Times New Roman" w:cs="Times New Roman"/>
-          <w:i/>
-          <w:sz w:val="24"/>
-        </w:rPr>
-        <w:t>Battery Electric Vehicle</w:t>
-      </w:r>
-      <w:r>
-        <w:rPr>
-          <w:rFonts w:ascii="Times New Roman" w:hAnsi="Times New Roman" w:cs="Times New Roman"/>
-          <w:sz w:val="24"/>
-        </w:rPr>
-        <w:t>) untuk Transportasi Jalan. Lembaran Negara Republik Indonesia Tahun 2019 Nomor 146. Sekretariat Negara.</w:t>
+        <w:t xml:space="preserve">Keller, K. L. (2013). Strategic </w:t>
+      </w:r>
+      <w:r>
+        <w:rPr>
+          <w:rFonts w:ascii="Times New Roman" w:hAnsi="Times New Roman" w:cs="Times New Roman"/>
+          <w:i/>
+          <w:sz w:val="24"/>
+        </w:rPr>
+        <w:t>brand management</w:t>
+      </w:r>
+      <w:r>
+        <w:rPr>
+          <w:rFonts w:ascii="Times New Roman" w:hAnsi="Times New Roman" w:cs="Times New Roman"/>
+          <w:sz w:val="24"/>
+        </w:rPr>
+        <w:t xml:space="preserve">: Building, measuring, and managing </w:t>
+      </w:r>
+      <w:r>
+        <w:rPr>
+          <w:rFonts w:ascii="Times New Roman" w:hAnsi="Times New Roman" w:cs="Times New Roman"/>
+          <w:i/>
+          <w:sz w:val="24"/>
+        </w:rPr>
+        <w:t>brand equity</w:t>
+      </w:r>
+      <w:r>
+        <w:rPr>
+          <w:rFonts w:ascii="Times New Roman" w:hAnsi="Times New Roman" w:cs="Times New Roman"/>
+          <w:sz w:val="24"/>
+        </w:rPr>
+        <w:t xml:space="preserve"> (4th ed.). Pearson Education.</w:t>
       </w:r>
     </w:p>
     <w:p>
@@ -17790,22 +17775,7 @@
           <w:rFonts w:ascii="Times New Roman" w:hAnsi="Times New Roman" w:cs="Times New Roman"/>
           <w:sz w:val="24"/>
         </w:rPr>
-        <w:t xml:space="preserve">Schiffman, L. G., &amp; Wisenblit, J. (2019). </w:t>
-      </w:r>
-      <w:r>
-        <w:rPr>
-          <w:rFonts w:ascii="Times New Roman" w:hAnsi="Times New Roman" w:cs="Times New Roman"/>
-          <w:i/>
-          <w:sz w:val="24"/>
-        </w:rPr>
-        <w:t>Consumer behavior</w:t>
-      </w:r>
-      <w:r>
-        <w:rPr>
-          <w:rFonts w:ascii="Times New Roman" w:hAnsi="Times New Roman" w:cs="Times New Roman"/>
-          <w:sz w:val="24"/>
-        </w:rPr>
-        <w:t xml:space="preserve"> (12th ed.). Pearson Education.</w:t>
+        <w:t>Kotler, P., &amp; Keller, K. L. (2016). Marketing management (15th ed.). Pearson Education.</w:t>
       </w:r>
     </w:p>
     <w:p>
@@ -17824,7 +17794,22 @@
           <w:rFonts w:ascii="Times New Roman" w:hAnsi="Times New Roman" w:cs="Times New Roman"/>
           <w:sz w:val="24"/>
         </w:rPr>
-        <w:t>Sekaran, U., &amp; Bougie, R. (2016). Research methods for business: A skill-building approach (7th ed.). John Wiley &amp; Sons.</w:t>
+        <w:t xml:space="preserve">Lemeshow, S., Hosmer, D. W., Klar, J., &amp; Lwanga, S. K. (1997). Adequacy of </w:t>
+      </w:r>
+      <w:r>
+        <w:rPr>
+          <w:rFonts w:ascii="Times New Roman" w:hAnsi="Times New Roman" w:cs="Times New Roman"/>
+          <w:i/>
+          <w:sz w:val="24"/>
+        </w:rPr>
+        <w:t>sample size</w:t>
+      </w:r>
+      <w:r>
+        <w:rPr>
+          <w:rFonts w:ascii="Times New Roman" w:hAnsi="Times New Roman" w:cs="Times New Roman"/>
+          <w:sz w:val="24"/>
+        </w:rPr>
+        <w:t xml:space="preserve"> in health studies. John Wiley &amp; Sons.</w:t>
       </w:r>
     </w:p>
     <w:p>
@@ -17843,7 +17828,7 @@
           <w:rFonts w:ascii="Times New Roman" w:hAnsi="Times New Roman" w:cs="Times New Roman"/>
           <w:sz w:val="24"/>
         </w:rPr>
-        <w:t>Sugiyono. (2019). Metode penelitian kuantitatif, kualitatif, dan R&amp;D (Edisi ke-2). Alfabeta.</w:t>
+        <w:t>Pemerintah Provinsi Daerah Khusus Ibukota Jakarta. (2021). Peraturan Gubernur Daerah Khusus Ibukota Jakarta Nomor 90 Tahun 2021 tentang Rencana Pembangunan Rendah Karbon Daerah yang Berketahanan Iklim. Berita Daerah Provinsi Daerah Khusus Ibukota Jakarta Tahun 2021 Nomor 62024.</w:t>
       </w:r>
     </w:p>
     <w:p>
@@ -17862,26 +17847,22 @@
           <w:rFonts w:ascii="Times New Roman" w:hAnsi="Times New Roman" w:cs="Times New Roman"/>
           <w:sz w:val="24"/>
         </w:rPr>
-        <w:t>Tjiptono, F., &amp; Chandra, G. (2019). Pemasaran strategik (Edisi ke-3). Andi Offset.</w:t>
-      </w:r>
-    </w:p>
-    <w:p>
-      <w:pPr>
-        <w:keepNext/>
-        <w:spacing w:line="360" w:lineRule="auto"/>
-        <w:rPr>
-          <w:rFonts w:ascii="Times New Roman" w:hAnsi="Times New Roman" w:cs="Times New Roman"/>
-          <w:b/>
-          <w:sz w:val="24"/>
-        </w:rPr>
-      </w:pPr>
-      <w:r>
-        <w:rPr>
-          <w:rFonts w:ascii="Times New Roman" w:hAnsi="Times New Roman" w:cs="Times New Roman"/>
-          <w:b/>
-          <w:sz w:val="24"/>
-        </w:rPr>
-        <w:t>2. KARYA ILMIAH DOSEN PROGRAM STUDI MANAJEMEN FEB UKRIDA</w:t>
+        <w:t>Republik Indonesia. (2019). Peraturan Presiden Nomor 55 Tahun 2019 tentang Percepatan Program Kendaraan Bermotor Listrik Berbasis Baterai (</w:t>
+      </w:r>
+      <w:r>
+        <w:rPr>
+          <w:rFonts w:ascii="Times New Roman" w:hAnsi="Times New Roman" w:cs="Times New Roman"/>
+          <w:i/>
+          <w:sz w:val="24"/>
+        </w:rPr>
+        <w:t>Battery Electric Vehicle</w:t>
+      </w:r>
+      <w:r>
+        <w:rPr>
+          <w:rFonts w:ascii="Times New Roman" w:hAnsi="Times New Roman" w:cs="Times New Roman"/>
+          <w:sz w:val="24"/>
+        </w:rPr>
+        <w:t>) untuk Transportasi Jalan. Lembaran Negara Republik Indonesia Tahun 2019 Nomor 146. Sekretariat Negara.</w:t>
       </w:r>
     </w:p>
     <w:p>
@@ -17900,37 +17881,22 @@
           <w:rFonts w:ascii="Times New Roman" w:hAnsi="Times New Roman" w:cs="Times New Roman"/>
           <w:sz w:val="24"/>
         </w:rPr>
-        <w:t xml:space="preserve">Sundah, F., Tecoalu, M., &amp; Wahyoedi, S. (2022). The effect of trust, price, and ease of transaction on buying interest and their implications on </w:t>
-      </w:r>
-      <w:r>
-        <w:rPr>
-          <w:rFonts w:ascii="Times New Roman" w:hAnsi="Times New Roman" w:cs="Times New Roman"/>
-          <w:i/>
-          <w:sz w:val="24"/>
-        </w:rPr>
-        <w:t>purchase decisions</w:t>
-      </w:r>
-      <w:r>
-        <w:rPr>
-          <w:rFonts w:ascii="Times New Roman" w:hAnsi="Times New Roman" w:cs="Times New Roman"/>
-          <w:sz w:val="24"/>
-        </w:rPr>
-        <w:t xml:space="preserve"> study PT. Indonesia Maybank Finance </w:t>
-      </w:r>
-      <w:r>
-        <w:rPr>
-          <w:rFonts w:ascii="Times New Roman" w:hAnsi="Times New Roman" w:cs="Times New Roman"/>
-          <w:i/>
-          <w:sz w:val="24"/>
-        </w:rPr>
-        <w:t>online</w:t>
-      </w:r>
-      <w:r>
-        <w:rPr>
-          <w:rFonts w:ascii="Times New Roman" w:hAnsi="Times New Roman" w:cs="Times New Roman"/>
-          <w:sz w:val="24"/>
-        </w:rPr>
-        <w:t xml:space="preserve"> customer. International Journal of Social Science, Educational, Economics, Agriculture Research and Technology (IJSET), 1(9), 431–442. https://doi.org/10.54443/ijset.v1i9.50</w:t>
+        <w:t xml:space="preserve">Schiffman, L. G., &amp; Wisenblit, J. (2019). </w:t>
+      </w:r>
+      <w:r>
+        <w:rPr>
+          <w:rFonts w:ascii="Times New Roman" w:hAnsi="Times New Roman" w:cs="Times New Roman"/>
+          <w:i/>
+          <w:sz w:val="24"/>
+        </w:rPr>
+        <w:t>Consumer behavior</w:t>
+      </w:r>
+      <w:r>
+        <w:rPr>
+          <w:rFonts w:ascii="Times New Roman" w:hAnsi="Times New Roman" w:cs="Times New Roman"/>
+          <w:sz w:val="24"/>
+        </w:rPr>
+        <w:t xml:space="preserve"> (12th ed.). Pearson Education.</w:t>
       </w:r>
     </w:p>
     <w:p>
@@ -17949,37 +17915,7 @@
           <w:rFonts w:ascii="Times New Roman" w:hAnsi="Times New Roman" w:cs="Times New Roman"/>
           <w:sz w:val="24"/>
         </w:rPr>
-        <w:t xml:space="preserve">Tecoalu, M. (2021). The effect of service quality, promotion strategy and company image on </w:t>
-      </w:r>
-      <w:r>
-        <w:rPr>
-          <w:rFonts w:ascii="Times New Roman" w:hAnsi="Times New Roman" w:cs="Times New Roman"/>
-          <w:i/>
-          <w:sz w:val="24"/>
-        </w:rPr>
-        <w:t>word of mouth</w:t>
-      </w:r>
-      <w:r>
-        <w:rPr>
-          <w:rFonts w:ascii="Times New Roman" w:hAnsi="Times New Roman" w:cs="Times New Roman"/>
-          <w:sz w:val="24"/>
-        </w:rPr>
-        <w:t xml:space="preserve"> in mediation by </w:t>
-      </w:r>
-      <w:r>
-        <w:rPr>
-          <w:rFonts w:ascii="Times New Roman" w:hAnsi="Times New Roman" w:cs="Times New Roman"/>
-          <w:i/>
-          <w:sz w:val="24"/>
-        </w:rPr>
-        <w:t>online</w:t>
-      </w:r>
-      <w:r>
-        <w:rPr>
-          <w:rFonts w:ascii="Times New Roman" w:hAnsi="Times New Roman" w:cs="Times New Roman"/>
-          <w:sz w:val="24"/>
-        </w:rPr>
-        <w:t xml:space="preserve"> transport customer satisfaction Jakarta region. Revista Gestão Inovação e Tecnologias, 11(3), 93–102. https://doi.org/10.47059/revistageintec.v11i3.1918</w:t>
+        <w:t>Sekaran, U., &amp; Bougie, R. (2016). Research methods for business: A skill-building approach (7th ed.). John Wiley &amp; Sons.</w:t>
       </w:r>
     </w:p>
     <w:p>
@@ -17998,41 +17934,7 @@
           <w:rFonts w:ascii="Times New Roman" w:hAnsi="Times New Roman" w:cs="Times New Roman"/>
           <w:sz w:val="24"/>
         </w:rPr>
-        <w:t xml:space="preserve">Tecoalu, M., Saparso, &amp; Fernandes. (2021). The role of </w:t>
-      </w:r>
-      <w:r>
-        <w:rPr>
-          <w:rFonts w:ascii="Times New Roman" w:hAnsi="Times New Roman" w:cs="Times New Roman"/>
-          <w:i/>
-          <w:sz w:val="24"/>
-        </w:rPr>
-        <w:t>brand image</w:t>
-      </w:r>
-      <w:r>
-        <w:rPr>
-          <w:rFonts w:ascii="Times New Roman" w:hAnsi="Times New Roman" w:cs="Times New Roman"/>
-          <w:sz w:val="24"/>
-        </w:rPr>
-        <w:t xml:space="preserve"> in mediating the influence of country of origin image and price on purchasing decisions (Study case on car credit products PT. Maybank Indonesia Finance). SIASAT, 6(4), 204–218. https://doi.org/10.33258/siasat.v6i4.105</w:t>
-      </w:r>
-    </w:p>
-    <w:p>
-      <w:pPr>
-        <w:keepNext/>
-        <w:spacing w:line="360" w:lineRule="auto"/>
-        <w:rPr>
-          <w:rFonts w:ascii="Times New Roman" w:hAnsi="Times New Roman" w:cs="Times New Roman"/>
-          <w:b/>
-          <w:sz w:val="24"/>
-        </w:rPr>
-      </w:pPr>
-      <w:r>
-        <w:rPr>
-          <w:rFonts w:ascii="Times New Roman" w:hAnsi="Times New Roman" w:cs="Times New Roman"/>
-          <w:b/>
-          <w:sz w:val="24"/>
-        </w:rPr>
-        <w:t>3. ARTIKEL JURNAL EMPIRIS TERDAHULU (TERVERIFIKASI &amp; BERKAS PDF TERSEDIA)</w:t>
+        <w:t>Sugiyono. (2019). Metode penelitian kuantitatif, kualitatif, dan R&amp;D (Edisi ke-2). Alfabeta.</w:t>
       </w:r>
     </w:p>
     <w:p>
@@ -18051,82 +17953,26 @@
           <w:rFonts w:ascii="Times New Roman" w:hAnsi="Times New Roman" w:cs="Times New Roman"/>
           <w:sz w:val="24"/>
         </w:rPr>
-        <w:t xml:space="preserve">Adha, F. Z., &amp; Suhardi. (2025). The role of influencers, </w:t>
-      </w:r>
-      <w:r>
-        <w:rPr>
-          <w:rFonts w:ascii="Times New Roman" w:hAnsi="Times New Roman" w:cs="Times New Roman"/>
-          <w:i/>
-          <w:sz w:val="24"/>
-        </w:rPr>
-        <w:t>brand image</w:t>
-      </w:r>
-      <w:r>
-        <w:rPr>
-          <w:rFonts w:ascii="Times New Roman" w:hAnsi="Times New Roman" w:cs="Times New Roman"/>
-          <w:sz w:val="24"/>
-        </w:rPr>
-        <w:t xml:space="preserve">, </w:t>
-      </w:r>
-      <w:r>
-        <w:rPr>
-          <w:rFonts w:ascii="Times New Roman" w:hAnsi="Times New Roman" w:cs="Times New Roman"/>
-          <w:i/>
-          <w:sz w:val="24"/>
-        </w:rPr>
-        <w:t>ease of use</w:t>
-      </w:r>
-      <w:r>
-        <w:rPr>
-          <w:rFonts w:ascii="Times New Roman" w:hAnsi="Times New Roman" w:cs="Times New Roman"/>
-          <w:sz w:val="24"/>
-        </w:rPr>
-        <w:t xml:space="preserve">, and </w:t>
-      </w:r>
-      <w:r>
-        <w:rPr>
-          <w:rFonts w:ascii="Times New Roman" w:hAnsi="Times New Roman" w:cs="Times New Roman"/>
-          <w:i/>
-          <w:sz w:val="24"/>
-        </w:rPr>
-        <w:t>consumer trust</w:t>
-      </w:r>
-      <w:r>
-        <w:rPr>
-          <w:rFonts w:ascii="Times New Roman" w:hAnsi="Times New Roman" w:cs="Times New Roman"/>
-          <w:sz w:val="24"/>
-        </w:rPr>
-        <w:t xml:space="preserve"> in </w:t>
-      </w:r>
-      <w:r>
-        <w:rPr>
-          <w:rFonts w:ascii="Times New Roman" w:hAnsi="Times New Roman" w:cs="Times New Roman"/>
-          <w:i/>
-          <w:sz w:val="24"/>
-        </w:rPr>
-        <w:t>electric vehicle</w:t>
-      </w:r>
-      <w:r>
-        <w:rPr>
-          <w:rFonts w:ascii="Times New Roman" w:hAnsi="Times New Roman" w:cs="Times New Roman"/>
-          <w:sz w:val="24"/>
-        </w:rPr>
-        <w:t xml:space="preserve"> </w:t>
-      </w:r>
-      <w:r>
-        <w:rPr>
-          <w:rFonts w:ascii="Times New Roman" w:hAnsi="Times New Roman" w:cs="Times New Roman"/>
-          <w:i/>
-          <w:sz w:val="24"/>
-        </w:rPr>
-        <w:t>purchase decisions</w:t>
-      </w:r>
-      <w:r>
-        <w:rPr>
-          <w:rFonts w:ascii="Times New Roman" w:hAnsi="Times New Roman" w:cs="Times New Roman"/>
-          <w:sz w:val="24"/>
-        </w:rPr>
-        <w:t>. Journal of Educational Management Research, 4(6), 2924–2936. https://doi.org/10.61987/jemr.v4i6.1474</w:t>
+        <w:t>Tjiptono, F., &amp; Chandra, G. (2019). Pemasaran strategik (Edisi ke-3). Andi Offset.</w:t>
+      </w:r>
+    </w:p>
+    <w:p>
+      <w:pPr>
+        <w:keepNext/>
+        <w:spacing w:line="360" w:lineRule="auto"/>
+        <w:rPr>
+          <w:rFonts w:ascii="Times New Roman" w:hAnsi="Times New Roman" w:cs="Times New Roman"/>
+          <w:b/>
+          <w:sz w:val="24"/>
+        </w:rPr>
+      </w:pPr>
+      <w:r>
+        <w:rPr>
+          <w:rFonts w:ascii="Times New Roman" w:hAnsi="Times New Roman" w:cs="Times New Roman"/>
+          <w:b/>
+          <w:sz w:val="24"/>
+        </w:rPr>
+        <w:t>2. KARYA ILMIAH DOSEN PROGRAM STUDI MANAJEMEN FEB UKRIDA</w:t>
       </w:r>
     </w:p>
     <w:p>
@@ -18145,22 +17991,37 @@
           <w:rFonts w:ascii="Times New Roman" w:hAnsi="Times New Roman" w:cs="Times New Roman"/>
           <w:sz w:val="24"/>
         </w:rPr>
-        <w:t xml:space="preserve">Afendi, R. F., &amp; Suhardi. (2026). Pengaruh kepercayaan, keamanan, dan kemudahan penggunaan terhadap keputusan pembelian pada </w:t>
-      </w:r>
-      <w:r>
-        <w:rPr>
-          <w:rFonts w:ascii="Times New Roman" w:hAnsi="Times New Roman" w:cs="Times New Roman"/>
-          <w:i/>
-          <w:sz w:val="24"/>
-        </w:rPr>
-        <w:t>Grab</w:t>
-      </w:r>
-      <w:r>
-        <w:rPr>
-          <w:rFonts w:ascii="Times New Roman" w:hAnsi="Times New Roman" w:cs="Times New Roman"/>
-          <w:sz w:val="24"/>
-        </w:rPr>
-        <w:t>Food di Kota Batam. Jurnal Riset Rumpun Ilmu Ekonomi (JURRIE), 5(1), 22–34. https://doi.org/10.55606/jurrie.v5i1.7941</w:t>
+        <w:t xml:space="preserve">Sundah, F., Tecoalu, M., &amp; Wahyoedi, S. (2022). The effect of trust, price, and ease of transaction on buying interest and their implications on </w:t>
+      </w:r>
+      <w:r>
+        <w:rPr>
+          <w:rFonts w:ascii="Times New Roman" w:hAnsi="Times New Roman" w:cs="Times New Roman"/>
+          <w:i/>
+          <w:sz w:val="24"/>
+        </w:rPr>
+        <w:t>purchase decisions</w:t>
+      </w:r>
+      <w:r>
+        <w:rPr>
+          <w:rFonts w:ascii="Times New Roman" w:hAnsi="Times New Roman" w:cs="Times New Roman"/>
+          <w:sz w:val="24"/>
+        </w:rPr>
+        <w:t xml:space="preserve"> study PT. Indonesia Maybank Finance </w:t>
+      </w:r>
+      <w:r>
+        <w:rPr>
+          <w:rFonts w:ascii="Times New Roman" w:hAnsi="Times New Roman" w:cs="Times New Roman"/>
+          <w:i/>
+          <w:sz w:val="24"/>
+        </w:rPr>
+        <w:t>online</w:t>
+      </w:r>
+      <w:r>
+        <w:rPr>
+          <w:rFonts w:ascii="Times New Roman" w:hAnsi="Times New Roman" w:cs="Times New Roman"/>
+          <w:sz w:val="24"/>
+        </w:rPr>
+        <w:t xml:space="preserve"> customer. International Journal of Social Science, Educational, Economics, Agriculture Research and Technology (IJSET), 1(9), 431–442. https://doi.org/10.54443/ijset.v1i9.50</w:t>
       </w:r>
     </w:p>
     <w:p>
@@ -18179,7 +18040,37 @@
           <w:rFonts w:ascii="Times New Roman" w:hAnsi="Times New Roman" w:cs="Times New Roman"/>
           <w:sz w:val="24"/>
         </w:rPr>
-        <w:t>Agustiningrum, R. D., &amp; Widyastuti. (2021). Pengaruh kepercayaan, kemudahan, dan keamanan terhadap keputusan pembelian di marketplace. Jurnal Ilmu Manajemen (JIM), 9(3), 896–906. https://doi.org/10.26740/jim.v9n3.p896-906</w:t>
+        <w:t xml:space="preserve">Tecoalu, M. (2021). The effect of service quality, promotion strategy and company image on </w:t>
+      </w:r>
+      <w:r>
+        <w:rPr>
+          <w:rFonts w:ascii="Times New Roman" w:hAnsi="Times New Roman" w:cs="Times New Roman"/>
+          <w:i/>
+          <w:sz w:val="24"/>
+        </w:rPr>
+        <w:t>word of mouth</w:t>
+      </w:r>
+      <w:r>
+        <w:rPr>
+          <w:rFonts w:ascii="Times New Roman" w:hAnsi="Times New Roman" w:cs="Times New Roman"/>
+          <w:sz w:val="24"/>
+        </w:rPr>
+        <w:t xml:space="preserve"> in mediation by </w:t>
+      </w:r>
+      <w:r>
+        <w:rPr>
+          <w:rFonts w:ascii="Times New Roman" w:hAnsi="Times New Roman" w:cs="Times New Roman"/>
+          <w:i/>
+          <w:sz w:val="24"/>
+        </w:rPr>
+        <w:t>online</w:t>
+      </w:r>
+      <w:r>
+        <w:rPr>
+          <w:rFonts w:ascii="Times New Roman" w:hAnsi="Times New Roman" w:cs="Times New Roman"/>
+          <w:sz w:val="24"/>
+        </w:rPr>
+        <w:t xml:space="preserve"> transport customer satisfaction Jakarta region. Revista Gestão Inovação e Tecnologias, 11(3), 93–102. https://doi.org/10.47059/revistageintec.v11i3.1918</w:t>
       </w:r>
     </w:p>
     <w:p>
@@ -18198,22 +18089,41 @@
           <w:rFonts w:ascii="Times New Roman" w:hAnsi="Times New Roman" w:cs="Times New Roman"/>
           <w:sz w:val="24"/>
         </w:rPr>
-        <w:t xml:space="preserve">Ardialis, A., &amp; Irfani, A. (2023). Pengaruh kepercayaan, keamanan, dan persepsi resiko terhadap keputusan pembelian </w:t>
-      </w:r>
-      <w:r>
-        <w:rPr>
-          <w:rFonts w:ascii="Times New Roman" w:hAnsi="Times New Roman" w:cs="Times New Roman"/>
-          <w:i/>
-          <w:sz w:val="24"/>
-        </w:rPr>
-        <w:t>online</w:t>
-      </w:r>
-      <w:r>
-        <w:rPr>
-          <w:rFonts w:ascii="Times New Roman" w:hAnsi="Times New Roman" w:cs="Times New Roman"/>
-          <w:sz w:val="24"/>
-        </w:rPr>
-        <w:t xml:space="preserve"> pada marketplace Lazada. Indonesian Journal of Business Economics and Management (IJBEM), 2(1), 12–21. https://doi.org/10.57152/ijbem.v2i1.470</w:t>
+        <w:t xml:space="preserve">Tecoalu, M., Saparso, &amp; Fernandes. (2021). The role of </w:t>
+      </w:r>
+      <w:r>
+        <w:rPr>
+          <w:rFonts w:ascii="Times New Roman" w:hAnsi="Times New Roman" w:cs="Times New Roman"/>
+          <w:i/>
+          <w:sz w:val="24"/>
+        </w:rPr>
+        <w:t>brand image</w:t>
+      </w:r>
+      <w:r>
+        <w:rPr>
+          <w:rFonts w:ascii="Times New Roman" w:hAnsi="Times New Roman" w:cs="Times New Roman"/>
+          <w:sz w:val="24"/>
+        </w:rPr>
+        <w:t xml:space="preserve"> in mediating the influence of country of origin image and price on purchasing decisions (Study case on car credit products PT. Maybank Indonesia Finance). SIASAT, 6(4), 204–218. https://doi.org/10.33258/siasat.v6i4.105</w:t>
+      </w:r>
+    </w:p>
+    <w:p>
+      <w:pPr>
+        <w:keepNext/>
+        <w:spacing w:line="360" w:lineRule="auto"/>
+        <w:rPr>
+          <w:rFonts w:ascii="Times New Roman" w:hAnsi="Times New Roman" w:cs="Times New Roman"/>
+          <w:b/>
+          <w:sz w:val="24"/>
+        </w:rPr>
+      </w:pPr>
+      <w:r>
+        <w:rPr>
+          <w:rFonts w:ascii="Times New Roman" w:hAnsi="Times New Roman" w:cs="Times New Roman"/>
+          <w:b/>
+          <w:sz w:val="24"/>
+        </w:rPr>
+        <w:t>3. ARTIKEL JURNAL EMPIRIS TERDAHULU (TERVERIFIKASI &amp; BERKAS PDF TERSEDIA)</w:t>
       </w:r>
     </w:p>
     <w:p>
@@ -18232,22 +18142,7 @@
           <w:rFonts w:ascii="Times New Roman" w:hAnsi="Times New Roman" w:cs="Times New Roman"/>
           <w:sz w:val="24"/>
         </w:rPr>
-        <w:t xml:space="preserve">Asnawir, &amp; Simanjuntak, M. (2024). The role of </w:t>
-      </w:r>
-      <w:r>
-        <w:rPr>
-          <w:rFonts w:ascii="Times New Roman" w:hAnsi="Times New Roman" w:cs="Times New Roman"/>
-          <w:i/>
-          <w:sz w:val="24"/>
-        </w:rPr>
-        <w:t>perceived risk</w:t>
-      </w:r>
-      <w:r>
-        <w:rPr>
-          <w:rFonts w:ascii="Times New Roman" w:hAnsi="Times New Roman" w:cs="Times New Roman"/>
-          <w:sz w:val="24"/>
-        </w:rPr>
-        <w:t xml:space="preserve"> in moderating the effects of </w:t>
+        <w:t xml:space="preserve">Adha, F. Z., &amp; Suhardi. (2025). The role of influencers, </w:t>
       </w:r>
       <w:r>
         <w:rPr>
@@ -18262,37 +18157,67 @@
           <w:rFonts w:ascii="Times New Roman" w:hAnsi="Times New Roman" w:cs="Times New Roman"/>
           <w:sz w:val="24"/>
         </w:rPr>
-        <w:t xml:space="preserve">, e-WOM, and </w:t>
-      </w:r>
-      <w:r>
-        <w:rPr>
-          <w:rFonts w:ascii="Times New Roman" w:hAnsi="Times New Roman" w:cs="Times New Roman"/>
-          <w:i/>
-          <w:sz w:val="24"/>
-        </w:rPr>
-        <w:t>brand trust</w:t>
-      </w:r>
-      <w:r>
-        <w:rPr>
-          <w:rFonts w:ascii="Times New Roman" w:hAnsi="Times New Roman" w:cs="Times New Roman"/>
-          <w:sz w:val="24"/>
-        </w:rPr>
-        <w:t xml:space="preserve"> on </w:t>
-      </w:r>
-      <w:r>
-        <w:rPr>
-          <w:rFonts w:ascii="Times New Roman" w:hAnsi="Times New Roman" w:cs="Times New Roman"/>
-          <w:i/>
-          <w:sz w:val="24"/>
-        </w:rPr>
-        <w:t>purchase decision</w:t>
-      </w:r>
-      <w:r>
-        <w:rPr>
-          <w:rFonts w:ascii="Times New Roman" w:hAnsi="Times New Roman" w:cs="Times New Roman"/>
-          <w:sz w:val="24"/>
-        </w:rPr>
-        <w:t xml:space="preserve"> in Shopee Mall. Jurnal Ilmiah Global Education, 6(3), 3842–3852. https://doi.org/10.55681/jige.v6i3.3842</w:t>
+        <w:t xml:space="preserve">, </w:t>
+      </w:r>
+      <w:r>
+        <w:rPr>
+          <w:rFonts w:ascii="Times New Roman" w:hAnsi="Times New Roman" w:cs="Times New Roman"/>
+          <w:i/>
+          <w:sz w:val="24"/>
+        </w:rPr>
+        <w:t>ease of use</w:t>
+      </w:r>
+      <w:r>
+        <w:rPr>
+          <w:rFonts w:ascii="Times New Roman" w:hAnsi="Times New Roman" w:cs="Times New Roman"/>
+          <w:sz w:val="24"/>
+        </w:rPr>
+        <w:t xml:space="preserve">, and </w:t>
+      </w:r>
+      <w:r>
+        <w:rPr>
+          <w:rFonts w:ascii="Times New Roman" w:hAnsi="Times New Roman" w:cs="Times New Roman"/>
+          <w:i/>
+          <w:sz w:val="24"/>
+        </w:rPr>
+        <w:t>consumer trust</w:t>
+      </w:r>
+      <w:r>
+        <w:rPr>
+          <w:rFonts w:ascii="Times New Roman" w:hAnsi="Times New Roman" w:cs="Times New Roman"/>
+          <w:sz w:val="24"/>
+        </w:rPr>
+        <w:t xml:space="preserve"> in </w:t>
+      </w:r>
+      <w:r>
+        <w:rPr>
+          <w:rFonts w:ascii="Times New Roman" w:hAnsi="Times New Roman" w:cs="Times New Roman"/>
+          <w:i/>
+          <w:sz w:val="24"/>
+        </w:rPr>
+        <w:t>electric vehicle</w:t>
+      </w:r>
+      <w:r>
+        <w:rPr>
+          <w:rFonts w:ascii="Times New Roman" w:hAnsi="Times New Roman" w:cs="Times New Roman"/>
+          <w:sz w:val="24"/>
+        </w:rPr>
+        <w:t xml:space="preserve"> </w:t>
+      </w:r>
+      <w:r>
+        <w:rPr>
+          <w:rFonts w:ascii="Times New Roman" w:hAnsi="Times New Roman" w:cs="Times New Roman"/>
+          <w:i/>
+          <w:sz w:val="24"/>
+        </w:rPr>
+        <w:t>purchase decisions</w:t>
+      </w:r>
+      <w:r>
+        <w:rPr>
+          <w:rFonts w:ascii="Times New Roman" w:hAnsi="Times New Roman" w:cs="Times New Roman"/>
+          <w:sz w:val="24"/>
+        </w:rPr>
+        <w:t>. Journal of Educational Management Research, 4(6), 2924–2936. https://doi.org/10.61987/jemr.v4i6.1474</w:t>
       </w:r>
     </w:p>
     <w:p>
@@ -18311,7 +18236,22 @@
           <w:rFonts w:ascii="Times New Roman" w:hAnsi="Times New Roman" w:cs="Times New Roman"/>
           <w:sz w:val="24"/>
         </w:rPr>
-        <w:t>Dahlia, D., &amp; Hartono, S. (2024). Pengaruh kepercayaan, kemudahan dan keamanan terhadap keputusan pembelian pada situs marketplace Shopee. Jurnal Entrepreneur dan Manajemen Sains (JEMS), 5(1), 105–116. https://doi.org/10.36085/jems.v5i1.5977</w:t>
+        <w:t xml:space="preserve">Afendi, R. F., &amp; Suhardi. (2026). Pengaruh kepercayaan, keamanan, dan kemudahan penggunaan terhadap keputusan pembelian pada </w:t>
+      </w:r>
+      <w:r>
+        <w:rPr>
+          <w:rFonts w:ascii="Times New Roman" w:hAnsi="Times New Roman" w:cs="Times New Roman"/>
+          <w:i/>
+          <w:sz w:val="24"/>
+        </w:rPr>
+        <w:t>Grab</w:t>
+      </w:r>
+      <w:r>
+        <w:rPr>
+          <w:rFonts w:ascii="Times New Roman" w:hAnsi="Times New Roman" w:cs="Times New Roman"/>
+          <w:sz w:val="24"/>
+        </w:rPr>
+        <w:t>Food di Kota Batam. Jurnal Riset Rumpun Ilmu Ekonomi (JURRIE), 5(1), 22–34. https://doi.org/10.55606/jurrie.v5i1.7941</w:t>
       </w:r>
     </w:p>
     <w:p>
@@ -18330,22 +18270,7 @@
           <w:rFonts w:ascii="Times New Roman" w:hAnsi="Times New Roman" w:cs="Times New Roman"/>
           <w:sz w:val="24"/>
         </w:rPr>
-        <w:t xml:space="preserve">Devananda, R., &amp; Hartono, B. (2023). Pengaruh kepercayaan, </w:t>
-      </w:r>
-      <w:r>
-        <w:rPr>
-          <w:rFonts w:ascii="Times New Roman" w:hAnsi="Times New Roman" w:cs="Times New Roman"/>
-          <w:i/>
-          <w:sz w:val="24"/>
-        </w:rPr>
-        <w:t>brand image</w:t>
-      </w:r>
-      <w:r>
-        <w:rPr>
-          <w:rFonts w:ascii="Times New Roman" w:hAnsi="Times New Roman" w:cs="Times New Roman"/>
-          <w:sz w:val="24"/>
-        </w:rPr>
-        <w:t>, keamanan terhadap keputusan pembelian (Studi pada pengguna Shopee Generasi Y &amp; Z). JIIP - Jurnal Ilmiah Ilmu Pendidikan, 6(10), 8021–8030. https://doi.org/10.54371/jiip.v6i10.2183</w:t>
+        <w:t>Agustiningrum, R. D., &amp; Widyastuti. (2021). Pengaruh kepercayaan, kemudahan, dan keamanan terhadap keputusan pembelian di marketplace. Jurnal Ilmu Manajemen (JIM), 9(3), 896–906. https://doi.org/10.26740/jim.v9n3.p896-906</w:t>
       </w:r>
     </w:p>
     <w:p>
@@ -18364,52 +18289,22 @@
           <w:rFonts w:ascii="Times New Roman" w:hAnsi="Times New Roman" w:cs="Times New Roman"/>
           <w:sz w:val="24"/>
         </w:rPr>
-        <w:t xml:space="preserve">Fadila, N., &amp; Wahyuni, S. (2025). Pengaruh environmental awareness, </w:t>
-      </w:r>
-      <w:r>
-        <w:rPr>
-          <w:rFonts w:ascii="Times New Roman" w:hAnsi="Times New Roman" w:cs="Times New Roman"/>
-          <w:i/>
-          <w:sz w:val="24"/>
-        </w:rPr>
-        <w:t>brand trust</w:t>
-      </w:r>
-      <w:r>
-        <w:rPr>
-          <w:rFonts w:ascii="Times New Roman" w:hAnsi="Times New Roman" w:cs="Times New Roman"/>
-          <w:sz w:val="24"/>
-        </w:rPr>
-        <w:t xml:space="preserve">, dan </w:t>
-      </w:r>
-      <w:r>
-        <w:rPr>
-          <w:rFonts w:ascii="Times New Roman" w:hAnsi="Times New Roman" w:cs="Times New Roman"/>
-          <w:i/>
-          <w:sz w:val="24"/>
-        </w:rPr>
-        <w:t>brand image</w:t>
-      </w:r>
-      <w:r>
-        <w:rPr>
-          <w:rFonts w:ascii="Times New Roman" w:hAnsi="Times New Roman" w:cs="Times New Roman"/>
-          <w:sz w:val="24"/>
-        </w:rPr>
-        <w:t xml:space="preserve"> terhadap keputusan pembelian The Body Shop dengan brand loyalty sebagai media </w:t>
-      </w:r>
-      <w:r>
-        <w:rPr>
-          <w:rFonts w:ascii="Times New Roman" w:hAnsi="Times New Roman" w:cs="Times New Roman"/>
-          <w:i/>
-          <w:sz w:val="24"/>
-        </w:rPr>
-        <w:t>intervening</w:t>
-      </w:r>
-      <w:r>
-        <w:rPr>
-          <w:rFonts w:ascii="Times New Roman" w:hAnsi="Times New Roman" w:cs="Times New Roman"/>
-          <w:sz w:val="24"/>
-        </w:rPr>
-        <w:t>. Paradoks: Jurnal Ilmu Ekonomi, 8(2), 211–224. https://doi.org/10.57178/paradoks.v8i2.1251</w:t>
+        <w:t xml:space="preserve">Ardialis, A., &amp; Irfani, A. (2023). Pengaruh kepercayaan, keamanan, dan persepsi resiko terhadap keputusan pembelian </w:t>
+      </w:r>
+      <w:r>
+        <w:rPr>
+          <w:rFonts w:ascii="Times New Roman" w:hAnsi="Times New Roman" w:cs="Times New Roman"/>
+          <w:i/>
+          <w:sz w:val="24"/>
+        </w:rPr>
+        <w:t>online</w:t>
+      </w:r>
+      <w:r>
+        <w:rPr>
+          <w:rFonts w:ascii="Times New Roman" w:hAnsi="Times New Roman" w:cs="Times New Roman"/>
+          <w:sz w:val="24"/>
+        </w:rPr>
+        <w:t xml:space="preserve"> pada marketplace Lazada. Indonesian Journal of Business Economics and Management (IJBEM), 2(1), 12–21. https://doi.org/10.57152/ijbem.v2i1.470</w:t>
       </w:r>
     </w:p>
     <w:p>
@@ -18428,7 +18323,37 @@
           <w:rFonts w:ascii="Times New Roman" w:hAnsi="Times New Roman" w:cs="Times New Roman"/>
           <w:sz w:val="24"/>
         </w:rPr>
-        <w:t xml:space="preserve">Chaudhuri, A., &amp; Holbrook, M. B. (2001). The chain of effects from </w:t>
+        <w:t xml:space="preserve">Asnawir, &amp; Simanjuntak, M. (2024). The role of </w:t>
+      </w:r>
+      <w:r>
+        <w:rPr>
+          <w:rFonts w:ascii="Times New Roman" w:hAnsi="Times New Roman" w:cs="Times New Roman"/>
+          <w:i/>
+          <w:sz w:val="24"/>
+        </w:rPr>
+        <w:t>perceived risk</w:t>
+      </w:r>
+      <w:r>
+        <w:rPr>
+          <w:rFonts w:ascii="Times New Roman" w:hAnsi="Times New Roman" w:cs="Times New Roman"/>
+          <w:sz w:val="24"/>
+        </w:rPr>
+        <w:t xml:space="preserve"> in moderating the effects of </w:t>
+      </w:r>
+      <w:r>
+        <w:rPr>
+          <w:rFonts w:ascii="Times New Roman" w:hAnsi="Times New Roman" w:cs="Times New Roman"/>
+          <w:i/>
+          <w:sz w:val="24"/>
+        </w:rPr>
+        <w:t>brand image</w:t>
+      </w:r>
+      <w:r>
+        <w:rPr>
+          <w:rFonts w:ascii="Times New Roman" w:hAnsi="Times New Roman" w:cs="Times New Roman"/>
+          <w:sz w:val="24"/>
+        </w:rPr>
+        <w:t xml:space="preserve">, e-WOM, and </w:t>
       </w:r>
       <w:r>
         <w:rPr>
@@ -18443,7 +18368,22 @@
           <w:rFonts w:ascii="Times New Roman" w:hAnsi="Times New Roman" w:cs="Times New Roman"/>
           <w:sz w:val="24"/>
         </w:rPr>
-        <w:t xml:space="preserve"> and brand affect to brand performance: The role of brand loyalty. Journal of Marketing, 65(2), 81–93. https://doi.org/10.1509/jmkg.65.2.81.18255</w:t>
+        <w:t xml:space="preserve"> on </w:t>
+      </w:r>
+      <w:r>
+        <w:rPr>
+          <w:rFonts w:ascii="Times New Roman" w:hAnsi="Times New Roman" w:cs="Times New Roman"/>
+          <w:i/>
+          <w:sz w:val="24"/>
+        </w:rPr>
+        <w:t>purchase decision</w:t>
+      </w:r>
+      <w:r>
+        <w:rPr>
+          <w:rFonts w:ascii="Times New Roman" w:hAnsi="Times New Roman" w:cs="Times New Roman"/>
+          <w:sz w:val="24"/>
+        </w:rPr>
+        <w:t xml:space="preserve"> in Shopee Mall. Jurnal Ilmiah Global Education, 6(3), 3842–3852. https://doi.org/10.55681/jige.v6i3.3842</w:t>
       </w:r>
     </w:p>
     <w:p>
@@ -18462,22 +18402,7 @@
           <w:rFonts w:ascii="Times New Roman" w:hAnsi="Times New Roman" w:cs="Times New Roman"/>
           <w:sz w:val="24"/>
         </w:rPr>
-        <w:t xml:space="preserve">Delgado-Ballester, E., Munuera-Alemán, J. L., &amp; Yagüe-Guillén, M. J. (2003). Development and validation of a </w:t>
-      </w:r>
-      <w:r>
-        <w:rPr>
-          <w:rFonts w:ascii="Times New Roman" w:hAnsi="Times New Roman" w:cs="Times New Roman"/>
-          <w:i/>
-          <w:sz w:val="24"/>
-        </w:rPr>
-        <w:t>brand trust</w:t>
-      </w:r>
-      <w:r>
-        <w:rPr>
-          <w:rFonts w:ascii="Times New Roman" w:hAnsi="Times New Roman" w:cs="Times New Roman"/>
-          <w:sz w:val="24"/>
-        </w:rPr>
-        <w:t xml:space="preserve"> scale. International Journal of Market Research, 45(1), 35–54. https://doi.org/10.1177/147078530304500103</w:t>
+        <w:t>Dahlia, D., &amp; Hartono, S. (2024). Pengaruh kepercayaan, kemudahan dan keamanan terhadap keputusan pembelian pada situs marketplace Shopee. Jurnal Entrepreneur dan Manajemen Sains (JEMS), 5(1), 105–116. https://doi.org/10.36085/jems.v5i1.5977</w:t>
       </w:r>
     </w:p>
     <w:p>
@@ -18496,7 +18421,7 @@
           <w:rFonts w:ascii="Times New Roman" w:hAnsi="Times New Roman" w:cs="Times New Roman"/>
           <w:sz w:val="24"/>
         </w:rPr>
-        <w:t xml:space="preserve">Hera, H., &amp; Fourqoniah, F. (2023). Pengaruh </w:t>
+        <w:t xml:space="preserve">Devananda, R., &amp; Hartono, B. (2023). Pengaruh kepercayaan, </w:t>
       </w:r>
       <w:r>
         <w:rPr>
@@ -18511,67 +18436,7 @@
           <w:rFonts w:ascii="Times New Roman" w:hAnsi="Times New Roman" w:cs="Times New Roman"/>
           <w:sz w:val="24"/>
         </w:rPr>
-        <w:t xml:space="preserve"> dan </w:t>
-      </w:r>
-      <w:r>
-        <w:rPr>
-          <w:rFonts w:ascii="Times New Roman" w:hAnsi="Times New Roman" w:cs="Times New Roman"/>
-          <w:i/>
-          <w:sz w:val="24"/>
-        </w:rPr>
-        <w:t>brand ambassador</w:t>
-      </w:r>
-      <w:r>
-        <w:rPr>
-          <w:rFonts w:ascii="Times New Roman" w:hAnsi="Times New Roman" w:cs="Times New Roman"/>
-          <w:sz w:val="24"/>
-        </w:rPr>
-        <w:t xml:space="preserve"> terhadap </w:t>
-      </w:r>
-      <w:r>
-        <w:rPr>
-          <w:rFonts w:ascii="Times New Roman" w:hAnsi="Times New Roman" w:cs="Times New Roman"/>
-          <w:i/>
-          <w:sz w:val="24"/>
-        </w:rPr>
-        <w:t>purchase decision</w:t>
-      </w:r>
-      <w:r>
-        <w:rPr>
-          <w:rFonts w:ascii="Times New Roman" w:hAnsi="Times New Roman" w:cs="Times New Roman"/>
-          <w:sz w:val="24"/>
-        </w:rPr>
-        <w:t xml:space="preserve"> melalui </w:t>
-      </w:r>
-      <w:r>
-        <w:rPr>
-          <w:rFonts w:ascii="Times New Roman" w:hAnsi="Times New Roman" w:cs="Times New Roman"/>
-          <w:i/>
-          <w:sz w:val="24"/>
-        </w:rPr>
-        <w:t>brand trust</w:t>
-      </w:r>
-      <w:r>
-        <w:rPr>
-          <w:rFonts w:ascii="Times New Roman" w:hAnsi="Times New Roman" w:cs="Times New Roman"/>
-          <w:sz w:val="24"/>
-        </w:rPr>
-        <w:t xml:space="preserve"> sebagai </w:t>
-      </w:r>
-      <w:r>
-        <w:rPr>
-          <w:rFonts w:ascii="Times New Roman" w:hAnsi="Times New Roman" w:cs="Times New Roman"/>
-          <w:i/>
-          <w:sz w:val="24"/>
-        </w:rPr>
-        <w:t>intervening</w:t>
-      </w:r>
-      <w:r>
-        <w:rPr>
-          <w:rFonts w:ascii="Times New Roman" w:hAnsi="Times New Roman" w:cs="Times New Roman"/>
-          <w:sz w:val="24"/>
-        </w:rPr>
-        <w:t>. Ekonomi, Keuangan, Investasi dan Syariah (EKUITAS), 4(3), 877–884. https://doi.org/10.47065/ekuitas.v4i3.2810</w:t>
+        <w:t>, keamanan terhadap keputusan pembelian (Studi pada pengguna Shopee Generasi Y &amp; Z). JIIP - Jurnal Ilmiah Ilmu Pendidikan, 6(10), 8021–8030. https://doi.org/10.54371/jiip.v6i10.2183</w:t>
       </w:r>
     </w:p>
     <w:p>
@@ -18590,7 +18455,22 @@
           <w:rFonts w:ascii="Times New Roman" w:hAnsi="Times New Roman" w:cs="Times New Roman"/>
           <w:sz w:val="24"/>
         </w:rPr>
-        <w:t xml:space="preserve">Inggasari, V., &amp; Prabowo, H. (2022). Pengaruh celebrity endorser, </w:t>
+        <w:t xml:space="preserve">Fadila, N., &amp; Wahyuni, S. (2025). Pengaruh environmental awareness, </w:t>
+      </w:r>
+      <w:r>
+        <w:rPr>
+          <w:rFonts w:ascii="Times New Roman" w:hAnsi="Times New Roman" w:cs="Times New Roman"/>
+          <w:i/>
+          <w:sz w:val="24"/>
+        </w:rPr>
+        <w:t>brand trust</w:t>
+      </w:r>
+      <w:r>
+        <w:rPr>
+          <w:rFonts w:ascii="Times New Roman" w:hAnsi="Times New Roman" w:cs="Times New Roman"/>
+          <w:sz w:val="24"/>
+        </w:rPr>
+        <w:t xml:space="preserve">, dan </w:t>
       </w:r>
       <w:r>
         <w:rPr>
@@ -18605,22 +18485,22 @@
           <w:rFonts w:ascii="Times New Roman" w:hAnsi="Times New Roman" w:cs="Times New Roman"/>
           <w:sz w:val="24"/>
         </w:rPr>
-        <w:t xml:space="preserve">, dan </w:t>
-      </w:r>
-      <w:r>
-        <w:rPr>
-          <w:rFonts w:ascii="Times New Roman" w:hAnsi="Times New Roman" w:cs="Times New Roman"/>
-          <w:i/>
-          <w:sz w:val="24"/>
-        </w:rPr>
-        <w:t>brand trust</w:t>
-      </w:r>
-      <w:r>
-        <w:rPr>
-          <w:rFonts w:ascii="Times New Roman" w:hAnsi="Times New Roman" w:cs="Times New Roman"/>
-          <w:sz w:val="24"/>
-        </w:rPr>
-        <w:t xml:space="preserve"> terhadap keputusan pembelian produk Scarlett Whitening. Cakrawangsa Bisnis: Jurnal Ilmiah Mahasiswa, 3(1), 45–58. https://doi.org/10.35917/cb.v3i1.298</w:t>
+        <w:t xml:space="preserve"> terhadap keputusan pembelian The Body Shop dengan brand loyalty sebagai media </w:t>
+      </w:r>
+      <w:r>
+        <w:rPr>
+          <w:rFonts w:ascii="Times New Roman" w:hAnsi="Times New Roman" w:cs="Times New Roman"/>
+          <w:i/>
+          <w:sz w:val="24"/>
+        </w:rPr>
+        <w:t>intervening</w:t>
+      </w:r>
+      <w:r>
+        <w:rPr>
+          <w:rFonts w:ascii="Times New Roman" w:hAnsi="Times New Roman" w:cs="Times New Roman"/>
+          <w:sz w:val="24"/>
+        </w:rPr>
+        <w:t>. Paradoks: Jurnal Ilmu Ekonomi, 8(2), 211–224. https://doi.org/10.57178/paradoks.v8i2.1251</w:t>
       </w:r>
     </w:p>
     <w:p>
@@ -18639,22 +18519,22 @@
           <w:rFonts w:ascii="Times New Roman" w:hAnsi="Times New Roman" w:cs="Times New Roman"/>
           <w:sz w:val="24"/>
         </w:rPr>
-        <w:t xml:space="preserve">Morgan, R. M., &amp; Hunt, S. D. (1994). The </w:t>
-      </w:r>
-      <w:r>
-        <w:rPr>
-          <w:rFonts w:ascii="Times New Roman" w:hAnsi="Times New Roman" w:cs="Times New Roman"/>
-          <w:i/>
-          <w:sz w:val="24"/>
-        </w:rPr>
-        <w:t>commitment-trust theory</w:t>
-      </w:r>
-      <w:r>
-        <w:rPr>
-          <w:rFonts w:ascii="Times New Roman" w:hAnsi="Times New Roman" w:cs="Times New Roman"/>
-          <w:sz w:val="24"/>
-        </w:rPr>
-        <w:t xml:space="preserve"> of relationship marketing. Journal of Marketing, 58(3), 20–38. https://doi.org/10.1177/002224299405800302</w:t>
+        <w:t xml:space="preserve">Chaudhuri, A., &amp; Holbrook, M. B. (2001). The chain of effects from </w:t>
+      </w:r>
+      <w:r>
+        <w:rPr>
+          <w:rFonts w:ascii="Times New Roman" w:hAnsi="Times New Roman" w:cs="Times New Roman"/>
+          <w:i/>
+          <w:sz w:val="24"/>
+        </w:rPr>
+        <w:t>brand trust</w:t>
+      </w:r>
+      <w:r>
+        <w:rPr>
+          <w:rFonts w:ascii="Times New Roman" w:hAnsi="Times New Roman" w:cs="Times New Roman"/>
+          <w:sz w:val="24"/>
+        </w:rPr>
+        <w:t xml:space="preserve"> and brand affect to brand performance: The role of brand loyalty. Journal of Marketing, 65(2), 81–93. https://doi.org/10.1509/jmkg.65.2.81.18255</w:t>
       </w:r>
     </w:p>
     <w:p>
@@ -18673,37 +18553,7 @@
           <w:rFonts w:ascii="Times New Roman" w:hAnsi="Times New Roman" w:cs="Times New Roman"/>
           <w:sz w:val="24"/>
         </w:rPr>
-        <w:t xml:space="preserve">Nurlita, F., &amp; Arsyad, A. W. (2025). Pengaruh </w:t>
-      </w:r>
-      <w:r>
-        <w:rPr>
-          <w:rFonts w:ascii="Times New Roman" w:hAnsi="Times New Roman" w:cs="Times New Roman"/>
-          <w:i/>
-          <w:sz w:val="24"/>
-        </w:rPr>
-        <w:t>brand awareness</w:t>
-      </w:r>
-      <w:r>
-        <w:rPr>
-          <w:rFonts w:ascii="Times New Roman" w:hAnsi="Times New Roman" w:cs="Times New Roman"/>
-          <w:sz w:val="24"/>
-        </w:rPr>
-        <w:t xml:space="preserve">, </w:t>
-      </w:r>
-      <w:r>
-        <w:rPr>
-          <w:rFonts w:ascii="Times New Roman" w:hAnsi="Times New Roman" w:cs="Times New Roman"/>
-          <w:i/>
-          <w:sz w:val="24"/>
-        </w:rPr>
-        <w:t>brand image</w:t>
-      </w:r>
-      <w:r>
-        <w:rPr>
-          <w:rFonts w:ascii="Times New Roman" w:hAnsi="Times New Roman" w:cs="Times New Roman"/>
-          <w:sz w:val="24"/>
-        </w:rPr>
-        <w:t xml:space="preserve">, dan </w:t>
+        <w:t xml:space="preserve">Delgado-Ballester, E., Munuera-Alemán, J. L., &amp; Yagüe-Guillén, M. J. (2003). Development and validation of a </w:t>
       </w:r>
       <w:r>
         <w:rPr>
@@ -18718,7 +18568,7 @@
           <w:rFonts w:ascii="Times New Roman" w:hAnsi="Times New Roman" w:cs="Times New Roman"/>
           <w:sz w:val="24"/>
         </w:rPr>
-        <w:t xml:space="preserve"> terhadap keputusan pembelian. Ekonomi, Keuangan, Investasi dan Syariah (EKUITAS), 6(3), 1–9. https://doi.org/10.47065/ekuitas.v6i3.6975</w:t>
+        <w:t xml:space="preserve"> scale. International Journal of Market Research, 45(1), 35–54. https://doi.org/10.1177/147078530304500103</w:t>
       </w:r>
     </w:p>
     <w:p>
@@ -18737,7 +18587,82 @@
           <w:rFonts w:ascii="Times New Roman" w:hAnsi="Times New Roman" w:cs="Times New Roman"/>
           <w:sz w:val="24"/>
         </w:rPr>
-        <w:t>Parasuraman, A., Zeithaml, V. A., &amp; Berry, L. L. (1988). SERVQUAL: A multiple-item scale for measuring consumer perceptions of service quality. Journal of Retailing, 64(1), 12–40.</w:t>
+        <w:t xml:space="preserve">Hera, H., &amp; Fourqoniah, F. (2023). Pengaruh </w:t>
+      </w:r>
+      <w:r>
+        <w:rPr>
+          <w:rFonts w:ascii="Times New Roman" w:hAnsi="Times New Roman" w:cs="Times New Roman"/>
+          <w:i/>
+          <w:sz w:val="24"/>
+        </w:rPr>
+        <w:t>brand image</w:t>
+      </w:r>
+      <w:r>
+        <w:rPr>
+          <w:rFonts w:ascii="Times New Roman" w:hAnsi="Times New Roman" w:cs="Times New Roman"/>
+          <w:sz w:val="24"/>
+        </w:rPr>
+        <w:t xml:space="preserve"> dan </w:t>
+      </w:r>
+      <w:r>
+        <w:rPr>
+          <w:rFonts w:ascii="Times New Roman" w:hAnsi="Times New Roman" w:cs="Times New Roman"/>
+          <w:i/>
+          <w:sz w:val="24"/>
+        </w:rPr>
+        <w:t>brand ambassador</w:t>
+      </w:r>
+      <w:r>
+        <w:rPr>
+          <w:rFonts w:ascii="Times New Roman" w:hAnsi="Times New Roman" w:cs="Times New Roman"/>
+          <w:sz w:val="24"/>
+        </w:rPr>
+        <w:t xml:space="preserve"> terhadap </w:t>
+      </w:r>
+      <w:r>
+        <w:rPr>
+          <w:rFonts w:ascii="Times New Roman" w:hAnsi="Times New Roman" w:cs="Times New Roman"/>
+          <w:i/>
+          <w:sz w:val="24"/>
+        </w:rPr>
+        <w:t>purchase decision</w:t>
+      </w:r>
+      <w:r>
+        <w:rPr>
+          <w:rFonts w:ascii="Times New Roman" w:hAnsi="Times New Roman" w:cs="Times New Roman"/>
+          <w:sz w:val="24"/>
+        </w:rPr>
+        <w:t xml:space="preserve"> melalui </w:t>
+      </w:r>
+      <w:r>
+        <w:rPr>
+          <w:rFonts w:ascii="Times New Roman" w:hAnsi="Times New Roman" w:cs="Times New Roman"/>
+          <w:i/>
+          <w:sz w:val="24"/>
+        </w:rPr>
+        <w:t>brand trust</w:t>
+      </w:r>
+      <w:r>
+        <w:rPr>
+          <w:rFonts w:ascii="Times New Roman" w:hAnsi="Times New Roman" w:cs="Times New Roman"/>
+          <w:sz w:val="24"/>
+        </w:rPr>
+        <w:t xml:space="preserve"> sebagai </w:t>
+      </w:r>
+      <w:r>
+        <w:rPr>
+          <w:rFonts w:ascii="Times New Roman" w:hAnsi="Times New Roman" w:cs="Times New Roman"/>
+          <w:i/>
+          <w:sz w:val="24"/>
+        </w:rPr>
+        <w:t>intervening</w:t>
+      </w:r>
+      <w:r>
+        <w:rPr>
+          <w:rFonts w:ascii="Times New Roman" w:hAnsi="Times New Roman" w:cs="Times New Roman"/>
+          <w:sz w:val="24"/>
+        </w:rPr>
+        <w:t>. Ekonomi, Keuangan, Investasi dan Syariah (EKUITAS), 4(3), 877–884. https://doi.org/10.47065/ekuitas.v4i3.2810</w:t>
       </w:r>
     </w:p>
     <w:p>
@@ -18756,7 +18681,7 @@
           <w:rFonts w:ascii="Times New Roman" w:hAnsi="Times New Roman" w:cs="Times New Roman"/>
           <w:sz w:val="24"/>
         </w:rPr>
-        <w:t xml:space="preserve">Patria, A., &amp; Susila, I. (2023). Pengaruh kualitas pelayanan, e-WOM dan </w:t>
+        <w:t xml:space="preserve">Inggasari, V., &amp; Prabowo, H. (2022). Pengaruh celebrity endorser, </w:t>
       </w:r>
       <w:r>
         <w:rPr>
@@ -18771,7 +18696,7 @@
           <w:rFonts w:ascii="Times New Roman" w:hAnsi="Times New Roman" w:cs="Times New Roman"/>
           <w:sz w:val="24"/>
         </w:rPr>
-        <w:t xml:space="preserve"> terhadap keputusan pembelian konsumen dimediasi oleh </w:t>
+        <w:t xml:space="preserve">, dan </w:t>
       </w:r>
       <w:r>
         <w:rPr>
@@ -18786,7 +18711,7 @@
           <w:rFonts w:ascii="Times New Roman" w:hAnsi="Times New Roman" w:cs="Times New Roman"/>
           <w:sz w:val="24"/>
         </w:rPr>
-        <w:t>. Manajemen dan Bisnis, 5(2), 7683–7694. https://doi.org/10.30743/jmb.v5i2.7683</w:t>
+        <w:t xml:space="preserve"> terhadap keputusan pembelian produk Scarlett Whitening. Cakrawangsa Bisnis: Jurnal Ilmiah Mahasiswa, 3(1), 45–58. https://doi.org/10.35917/cb.v3i1.298</w:t>
       </w:r>
     </w:p>
     <w:p>
@@ -18805,37 +18730,22 @@
           <w:rFonts w:ascii="Times New Roman" w:hAnsi="Times New Roman" w:cs="Times New Roman"/>
           <w:sz w:val="24"/>
         </w:rPr>
-        <w:t xml:space="preserve">Patricia, D., &amp; Djong, A. M. R. (2026). Keputusan penggunaan </w:t>
-      </w:r>
-      <w:r>
-        <w:rPr>
-          <w:rFonts w:ascii="Times New Roman" w:hAnsi="Times New Roman" w:cs="Times New Roman"/>
-          <w:i/>
-          <w:sz w:val="24"/>
-        </w:rPr>
-        <w:t>QRIS</w:t>
-      </w:r>
-      <w:r>
-        <w:rPr>
-          <w:rFonts w:ascii="Times New Roman" w:hAnsi="Times New Roman" w:cs="Times New Roman"/>
-          <w:sz w:val="24"/>
-        </w:rPr>
-        <w:t xml:space="preserve"> berdasarkan pengaruh persepsi kemudahan dan keamanan melalui persepsi kepercayaan pada </w:t>
-      </w:r>
-      <w:r>
-        <w:rPr>
-          <w:rFonts w:ascii="Times New Roman" w:hAnsi="Times New Roman" w:cs="Times New Roman"/>
-          <w:i/>
-          <w:sz w:val="24"/>
-        </w:rPr>
-        <w:t>Gen_Z</w:t>
-      </w:r>
-      <w:r>
-        <w:rPr>
-          <w:rFonts w:ascii="Times New Roman" w:hAnsi="Times New Roman" w:cs="Times New Roman"/>
-          <w:sz w:val="24"/>
-        </w:rPr>
-        <w:t xml:space="preserve"> di Tawangmangu. Jurnal Minfo Polgan, 15(1), 538–552. https://doi.org/10.33395/jmp.v15i1.16085</w:t>
+        <w:t xml:space="preserve">Morgan, R. M., &amp; Hunt, S. D. (1994). The </w:t>
+      </w:r>
+      <w:r>
+        <w:rPr>
+          <w:rFonts w:ascii="Times New Roman" w:hAnsi="Times New Roman" w:cs="Times New Roman"/>
+          <w:i/>
+          <w:sz w:val="24"/>
+        </w:rPr>
+        <w:t>commitment-trust theory</w:t>
+      </w:r>
+      <w:r>
+        <w:rPr>
+          <w:rFonts w:ascii="Times New Roman" w:hAnsi="Times New Roman" w:cs="Times New Roman"/>
+          <w:sz w:val="24"/>
+        </w:rPr>
+        <w:t xml:space="preserve"> of relationship marketing. Journal of Marketing, 58(3), 20–38. https://doi.org/10.1177/002224299405800302</w:t>
       </w:r>
     </w:p>
     <w:p>
@@ -18854,7 +18764,22 @@
           <w:rFonts w:ascii="Times New Roman" w:hAnsi="Times New Roman" w:cs="Times New Roman"/>
           <w:sz w:val="24"/>
         </w:rPr>
-        <w:t xml:space="preserve">Putri, W., &amp; Harti, H. (2022). Pengaruh </w:t>
+        <w:t xml:space="preserve">Nurlita, F., &amp; Arsyad, A. W. (2025). Pengaruh </w:t>
+      </w:r>
+      <w:r>
+        <w:rPr>
+          <w:rFonts w:ascii="Times New Roman" w:hAnsi="Times New Roman" w:cs="Times New Roman"/>
+          <w:i/>
+          <w:sz w:val="24"/>
+        </w:rPr>
+        <w:t>brand awareness</w:t>
+      </w:r>
+      <w:r>
+        <w:rPr>
+          <w:rFonts w:ascii="Times New Roman" w:hAnsi="Times New Roman" w:cs="Times New Roman"/>
+          <w:sz w:val="24"/>
+        </w:rPr>
+        <w:t xml:space="preserve">, </w:t>
       </w:r>
       <w:r>
         <w:rPr>
@@ -18869,22 +18794,22 @@
           <w:rFonts w:ascii="Times New Roman" w:hAnsi="Times New Roman" w:cs="Times New Roman"/>
           <w:sz w:val="24"/>
         </w:rPr>
-        <w:t xml:space="preserve"> dan </w:t>
-      </w:r>
-      <w:r>
-        <w:rPr>
-          <w:rFonts w:ascii="Times New Roman" w:hAnsi="Times New Roman" w:cs="Times New Roman"/>
-          <w:i/>
-          <w:sz w:val="24"/>
-        </w:rPr>
-        <w:t>brand ambassador</w:t>
-      </w:r>
-      <w:r>
-        <w:rPr>
-          <w:rFonts w:ascii="Times New Roman" w:hAnsi="Times New Roman" w:cs="Times New Roman"/>
-          <w:sz w:val="24"/>
-        </w:rPr>
-        <w:t xml:space="preserve"> terhadap keputusan pembelian melalui kepercayaan konsumen pada produk Scarlett. Jurnal Dimensi, 11(2), 4143–4155. https://doi.org/10.33373/dms.v11i2.4143</w:t>
+        <w:t xml:space="preserve">, dan </w:t>
+      </w:r>
+      <w:r>
+        <w:rPr>
+          <w:rFonts w:ascii="Times New Roman" w:hAnsi="Times New Roman" w:cs="Times New Roman"/>
+          <w:i/>
+          <w:sz w:val="24"/>
+        </w:rPr>
+        <w:t>brand trust</w:t>
+      </w:r>
+      <w:r>
+        <w:rPr>
+          <w:rFonts w:ascii="Times New Roman" w:hAnsi="Times New Roman" w:cs="Times New Roman"/>
+          <w:sz w:val="24"/>
+        </w:rPr>
+        <w:t xml:space="preserve"> terhadap keputusan pembelian. Ekonomi, Keuangan, Investasi dan Syariah (EKUITAS), 6(3), 1–9. https://doi.org/10.47065/ekuitas.v6i3.6975</w:t>
       </w:r>
     </w:p>
     <w:p>
@@ -18903,22 +18828,7 @@
           <w:rFonts w:ascii="Times New Roman" w:hAnsi="Times New Roman" w:cs="Times New Roman"/>
           <w:sz w:val="24"/>
         </w:rPr>
-        <w:t xml:space="preserve">Rayle, L., Dai, D., Chan, N., Cervero, R., &amp; Shaheen, S. (2016). Just a better taxi? A survey-based comparison of taxis, transit, and </w:t>
-      </w:r>
-      <w:r>
-        <w:rPr>
-          <w:rFonts w:ascii="Times New Roman" w:hAnsi="Times New Roman" w:cs="Times New Roman"/>
-          <w:i/>
-          <w:sz w:val="24"/>
-        </w:rPr>
-        <w:t>ridesourcing</w:t>
-      </w:r>
-      <w:r>
-        <w:rPr>
-          <w:rFonts w:ascii="Times New Roman" w:hAnsi="Times New Roman" w:cs="Times New Roman"/>
-          <w:sz w:val="24"/>
-        </w:rPr>
-        <w:t xml:space="preserve"> services in San Francisco. Transport Policy, 45, 168–178. https://doi.org/10.1016/j.tranpol.2015.10.004</w:t>
+        <w:t>Parasuraman, A., Zeithaml, V. A., &amp; Berry, L. L. (1988). SERVQUAL: A multiple-item scale for measuring consumer perceptions of service quality. Journal of Retailing, 64(1), 12–40.</w:t>
       </w:r>
     </w:p>
     <w:p>
@@ -18937,7 +18847,37 @@
           <w:rFonts w:ascii="Times New Roman" w:hAnsi="Times New Roman" w:cs="Times New Roman"/>
           <w:sz w:val="24"/>
         </w:rPr>
-        <w:t>Vivi, &amp; Hikmah, N. (2024). Pengaruh kualitas produk, persepsi keamanan dan kepercayaan terhadap keputusan pembelian pada merchant di TikTok. Scientia Journal : Jurnal Ilmiah Mahasiswa, 7(4), 10513–10525. https://doi.org/10.33884/scientiajournal.v7i4.10513</w:t>
+        <w:t xml:space="preserve">Patria, A., &amp; Susila, I. (2023). Pengaruh kualitas pelayanan, e-WOM dan </w:t>
+      </w:r>
+      <w:r>
+        <w:rPr>
+          <w:rFonts w:ascii="Times New Roman" w:hAnsi="Times New Roman" w:cs="Times New Roman"/>
+          <w:i/>
+          <w:sz w:val="24"/>
+        </w:rPr>
+        <w:t>brand image</w:t>
+      </w:r>
+      <w:r>
+        <w:rPr>
+          <w:rFonts w:ascii="Times New Roman" w:hAnsi="Times New Roman" w:cs="Times New Roman"/>
+          <w:sz w:val="24"/>
+        </w:rPr>
+        <w:t xml:space="preserve"> terhadap keputusan pembelian konsumen dimediasi oleh </w:t>
+      </w:r>
+      <w:r>
+        <w:rPr>
+          <w:rFonts w:ascii="Times New Roman" w:hAnsi="Times New Roman" w:cs="Times New Roman"/>
+          <w:i/>
+          <w:sz w:val="24"/>
+        </w:rPr>
+        <w:t>brand trust</w:t>
+      </w:r>
+      <w:r>
+        <w:rPr>
+          <w:rFonts w:ascii="Times New Roman" w:hAnsi="Times New Roman" w:cs="Times New Roman"/>
+          <w:sz w:val="24"/>
+        </w:rPr>
+        <w:t>. Manajemen dan Bisnis, 5(2), 7683–7694. https://doi.org/10.30743/jmb.v5i2.7683</w:t>
       </w:r>
     </w:p>
     <w:p>
@@ -18956,7 +18896,37 @@
           <w:rFonts w:ascii="Times New Roman" w:hAnsi="Times New Roman" w:cs="Times New Roman"/>
           <w:sz w:val="24"/>
         </w:rPr>
-        <w:t>Wijaya, V. T., &amp; Pahar, B. H. (2022). Pengaruh citra merek, kepercayaan merek, dan keamanan privasi terhadap keputusan pengguna Gojek. BIP’s Jurnal Bisnis Perspektif, 14(1), 241–254. https://doi.org/10.37477/bip.v14i1.241</w:t>
+        <w:t xml:space="preserve">Patricia, D., &amp; Djong, A. M. R. (2026). Keputusan penggunaan </w:t>
+      </w:r>
+      <w:r>
+        <w:rPr>
+          <w:rFonts w:ascii="Times New Roman" w:hAnsi="Times New Roman" w:cs="Times New Roman"/>
+          <w:i/>
+          <w:sz w:val="24"/>
+        </w:rPr>
+        <w:t>QRIS</w:t>
+      </w:r>
+      <w:r>
+        <w:rPr>
+          <w:rFonts w:ascii="Times New Roman" w:hAnsi="Times New Roman" w:cs="Times New Roman"/>
+          <w:sz w:val="24"/>
+        </w:rPr>
+        <w:t xml:space="preserve"> berdasarkan pengaruh persepsi kemudahan dan keamanan melalui persepsi kepercayaan pada </w:t>
+      </w:r>
+      <w:r>
+        <w:rPr>
+          <w:rFonts w:ascii="Times New Roman" w:hAnsi="Times New Roman" w:cs="Times New Roman"/>
+          <w:i/>
+          <w:sz w:val="24"/>
+        </w:rPr>
+        <w:t>Gen_Z</w:t>
+      </w:r>
+      <w:r>
+        <w:rPr>
+          <w:rFonts w:ascii="Times New Roman" w:hAnsi="Times New Roman" w:cs="Times New Roman"/>
+          <w:sz w:val="24"/>
+        </w:rPr>
+        <w:t xml:space="preserve"> di Tawangmangu. Jurnal Minfo Polgan, 15(1), 538–552. https://doi.org/10.33395/jmp.v15i1.16085</w:t>
       </w:r>
     </w:p>
     <w:p>
@@ -18975,22 +18945,37 @@
           <w:rFonts w:ascii="Times New Roman" w:hAnsi="Times New Roman" w:cs="Times New Roman"/>
           <w:sz w:val="24"/>
         </w:rPr>
-        <w:t xml:space="preserve">Wulandari, R. (2021). Pengaruh kepercayaan, keamanan, persepsi resiko dan kualitas pelayanan terhadap keputusan pembelian secara </w:t>
-      </w:r>
-      <w:r>
-        <w:rPr>
-          <w:rFonts w:ascii="Times New Roman" w:hAnsi="Times New Roman" w:cs="Times New Roman"/>
-          <w:i/>
-          <w:sz w:val="24"/>
-        </w:rPr>
-        <w:t>online</w:t>
-      </w:r>
-      <w:r>
-        <w:rPr>
-          <w:rFonts w:ascii="Times New Roman" w:hAnsi="Times New Roman" w:cs="Times New Roman"/>
-          <w:sz w:val="24"/>
-        </w:rPr>
-        <w:t xml:space="preserve"> melalui media sosial Instagram. Manajerial, 4(1), 310–322. https://doi.org/10.30587/manajerial.v4i1.310</w:t>
+        <w:t xml:space="preserve">Putri, W., &amp; Harti, H. (2022). Pengaruh </w:t>
+      </w:r>
+      <w:r>
+        <w:rPr>
+          <w:rFonts w:ascii="Times New Roman" w:hAnsi="Times New Roman" w:cs="Times New Roman"/>
+          <w:i/>
+          <w:sz w:val="24"/>
+        </w:rPr>
+        <w:t>brand image</w:t>
+      </w:r>
+      <w:r>
+        <w:rPr>
+          <w:rFonts w:ascii="Times New Roman" w:hAnsi="Times New Roman" w:cs="Times New Roman"/>
+          <w:sz w:val="24"/>
+        </w:rPr>
+        <w:t xml:space="preserve"> dan </w:t>
+      </w:r>
+      <w:r>
+        <w:rPr>
+          <w:rFonts w:ascii="Times New Roman" w:hAnsi="Times New Roman" w:cs="Times New Roman"/>
+          <w:i/>
+          <w:sz w:val="24"/>
+        </w:rPr>
+        <w:t>brand ambassador</w:t>
+      </w:r>
+      <w:r>
+        <w:rPr>
+          <w:rFonts w:ascii="Times New Roman" w:hAnsi="Times New Roman" w:cs="Times New Roman"/>
+          <w:sz w:val="24"/>
+        </w:rPr>
+        <w:t xml:space="preserve"> terhadap keputusan pembelian melalui kepercayaan konsumen pada produk Scarlett. Jurnal Dimensi, 11(2), 4143–4155. https://doi.org/10.33373/dms.v11i2.4143</w:t>
       </w:r>
     </w:p>
     <w:p>
@@ -19009,6 +18994,112 @@
           <w:rFonts w:ascii="Times New Roman" w:hAnsi="Times New Roman" w:cs="Times New Roman"/>
           <w:sz w:val="24"/>
         </w:rPr>
+        <w:t xml:space="preserve">Rayle, L., Dai, D., Chan, N., Cervero, R., &amp; Shaheen, S. (2016). Just a better taxi? A survey-based comparison of taxis, transit, and </w:t>
+      </w:r>
+      <w:r>
+        <w:rPr>
+          <w:rFonts w:ascii="Times New Roman" w:hAnsi="Times New Roman" w:cs="Times New Roman"/>
+          <w:i/>
+          <w:sz w:val="24"/>
+        </w:rPr>
+        <w:t>ridesourcing</w:t>
+      </w:r>
+      <w:r>
+        <w:rPr>
+          <w:rFonts w:ascii="Times New Roman" w:hAnsi="Times New Roman" w:cs="Times New Roman"/>
+          <w:sz w:val="24"/>
+        </w:rPr>
+        <w:t xml:space="preserve"> services in San Francisco. Transport Policy, 45, 168–178. https://doi.org/10.1016/j.tranpol.2015.10.004</w:t>
+      </w:r>
+    </w:p>
+    <w:p>
+      <w:pPr>
+        <w:keepNext/>
+        <w:spacing w:after="120" w:line="360" w:lineRule="auto"/>
+        <w:ind w:firstLine="709"/>
+        <w:jc w:val="both"/>
+        <w:rPr>
+          <w:rFonts w:ascii="Times New Roman" w:hAnsi="Times New Roman" w:cs="Times New Roman"/>
+          <w:sz w:val="24"/>
+        </w:rPr>
+      </w:pPr>
+      <w:r>
+        <w:rPr>
+          <w:rFonts w:ascii="Times New Roman" w:hAnsi="Times New Roman" w:cs="Times New Roman"/>
+          <w:sz w:val="24"/>
+        </w:rPr>
+        <w:t>Vivi, &amp; Hikmah, N. (2024). Pengaruh kualitas produk, persepsi keamanan dan kepercayaan terhadap keputusan pembelian pada merchant di TikTok. Scientia Journal : Jurnal Ilmiah Mahasiswa, 7(4), 10513–10525. https://doi.org/10.33884/scientiajournal.v7i4.10513</w:t>
+      </w:r>
+    </w:p>
+    <w:p>
+      <w:pPr>
+        <w:keepNext/>
+        <w:spacing w:after="120" w:line="360" w:lineRule="auto"/>
+        <w:ind w:firstLine="709"/>
+        <w:jc w:val="both"/>
+        <w:rPr>
+          <w:rFonts w:ascii="Times New Roman" w:hAnsi="Times New Roman" w:cs="Times New Roman"/>
+          <w:sz w:val="24"/>
+        </w:rPr>
+      </w:pPr>
+      <w:r>
+        <w:rPr>
+          <w:rFonts w:ascii="Times New Roman" w:hAnsi="Times New Roman" w:cs="Times New Roman"/>
+          <w:sz w:val="24"/>
+        </w:rPr>
+        <w:t>Wijaya, V. T., &amp; Pahar, B. H. (2022). Pengaruh citra merek, kepercayaan merek, dan keamanan privasi terhadap keputusan pengguna Gojek. BIP’s Jurnal Bisnis Perspektif, 14(1), 241–254. https://doi.org/10.37477/bip.v14i1.241</w:t>
+      </w:r>
+    </w:p>
+    <w:p>
+      <w:pPr>
+        <w:keepNext/>
+        <w:spacing w:after="120" w:line="360" w:lineRule="auto"/>
+        <w:ind w:firstLine="709"/>
+        <w:jc w:val="both"/>
+        <w:rPr>
+          <w:rFonts w:ascii="Times New Roman" w:hAnsi="Times New Roman" w:cs="Times New Roman"/>
+          <w:sz w:val="24"/>
+        </w:rPr>
+      </w:pPr>
+      <w:r>
+        <w:rPr>
+          <w:rFonts w:ascii="Times New Roman" w:hAnsi="Times New Roman" w:cs="Times New Roman"/>
+          <w:sz w:val="24"/>
+        </w:rPr>
+        <w:t xml:space="preserve">Wulandari, R. (2021). Pengaruh kepercayaan, keamanan, persepsi resiko dan kualitas pelayanan terhadap keputusan pembelian secara </w:t>
+      </w:r>
+      <w:r>
+        <w:rPr>
+          <w:rFonts w:ascii="Times New Roman" w:hAnsi="Times New Roman" w:cs="Times New Roman"/>
+          <w:i/>
+          <w:sz w:val="24"/>
+        </w:rPr>
+        <w:t>online</w:t>
+      </w:r>
+      <w:r>
+        <w:rPr>
+          <w:rFonts w:ascii="Times New Roman" w:hAnsi="Times New Roman" w:cs="Times New Roman"/>
+          <w:sz w:val="24"/>
+        </w:rPr>
+        <w:t xml:space="preserve"> melalui media sosial Instagram. Manajerial, 4(1), 310–322. https://doi.org/10.30587/manajerial.v4i1.310</w:t>
+      </w:r>
+    </w:p>
+    <w:p>
+      <w:pPr>
+        <w:keepNext/>
+        <w:spacing w:after="120" w:line="360" w:lineRule="auto"/>
+        <w:ind w:firstLine="709"/>
+        <w:jc w:val="both"/>
+        <w:rPr>
+          <w:rFonts w:ascii="Times New Roman" w:hAnsi="Times New Roman" w:cs="Times New Roman"/>
+          <w:sz w:val="24"/>
+        </w:rPr>
+      </w:pPr>
+      <w:r>
+        <w:rPr>
+          <w:rFonts w:ascii="Times New Roman" w:hAnsi="Times New Roman" w:cs="Times New Roman"/>
+          <w:sz w:val="24"/>
+        </w:rPr>
         <w:t xml:space="preserve">Xu, Y., Yan, X., Liu, Y., &amp; Zhao, X. (2020). Identifying the factors that affect the willingness of car owners to use </w:t>
       </w:r>
       <w:r>
@@ -19017,14 +19108,14 @@
           <w:i/>
           <w:sz w:val="24"/>
         </w:rPr>
-        <w:t>electric vehicles</w:t>
-      </w:r>
-      <w:r>
-        <w:rPr>
-          <w:rFonts w:ascii="Times New Roman" w:hAnsi="Times New Roman" w:cs="Times New Roman"/>
-          <w:sz w:val="24"/>
-        </w:rPr>
-        <w:t>: An empirical study in China. Transportation Research Part D: Transport and Environment, 85, Article 102434. https://doi.org/10.1016/j.trd.2020.102434</w:t>
+        <w:t>electric vehicle</w:t>
+      </w:r>
+      <w:r>
+        <w:rPr>
+          <w:rFonts w:ascii="Times New Roman" w:hAnsi="Times New Roman" w:cs="Times New Roman"/>
+          <w:sz w:val="24"/>
+        </w:rPr>
+        <w:t>s: An empirical study in China. Transportation Research Part D: Transport and Environment, 85, Article 102434. https://doi.org/10.1016/j.trd.2020.102434</w:t>
       </w:r>
     </w:p>
     <w:p>
@@ -25948,7 +26039,7 @@
     <w:link w:val="Heading1Char"/>
     <w:uiPriority w:val="9"/>
     <w:qFormat/>
-    <w:rsid w:val="00DE5993"/>
+    <w:rsid w:val="00EC4329"/>
     <w:pPr>
       <w:keepNext/>
       <w:keepLines/>
@@ -25971,7 +26062,7 @@
     <w:semiHidden/>
     <w:unhideWhenUsed/>
     <w:qFormat/>
-    <w:rsid w:val="00DE5993"/>
+    <w:rsid w:val="00EC4329"/>
     <w:pPr>
       <w:keepNext/>
       <w:keepLines/>
@@ -25994,7 +26085,7 @@
     <w:semiHidden/>
     <w:unhideWhenUsed/>
     <w:qFormat/>
-    <w:rsid w:val="00DE5993"/>
+    <w:rsid w:val="00EC4329"/>
     <w:pPr>
       <w:keepNext/>
       <w:keepLines/>
@@ -26017,7 +26108,7 @@
     <w:semiHidden/>
     <w:unhideWhenUsed/>
     <w:qFormat/>
-    <w:rsid w:val="00DE5993"/>
+    <w:rsid w:val="00EC4329"/>
     <w:pPr>
       <w:keepNext/>
       <w:keepLines/>
@@ -26040,7 +26131,7 @@
     <w:semiHidden/>
     <w:unhideWhenUsed/>
     <w:qFormat/>
-    <w:rsid w:val="00DE5993"/>
+    <w:rsid w:val="00EC4329"/>
     <w:pPr>
       <w:keepNext/>
       <w:keepLines/>
@@ -26061,7 +26152,7 @@
     <w:semiHidden/>
     <w:unhideWhenUsed/>
     <w:qFormat/>
-    <w:rsid w:val="00DE5993"/>
+    <w:rsid w:val="00EC4329"/>
     <w:pPr>
       <w:keepNext/>
       <w:keepLines/>
@@ -26084,7 +26175,7 @@
     <w:semiHidden/>
     <w:unhideWhenUsed/>
     <w:qFormat/>
-    <w:rsid w:val="00DE5993"/>
+    <w:rsid w:val="00EC4329"/>
     <w:pPr>
       <w:keepNext/>
       <w:keepLines/>
@@ -26105,7 +26196,7 @@
     <w:semiHidden/>
     <w:unhideWhenUsed/>
     <w:qFormat/>
-    <w:rsid w:val="00DE5993"/>
+    <w:rsid w:val="00EC4329"/>
     <w:pPr>
       <w:keepNext/>
       <w:keepLines/>
@@ -26128,7 +26219,7 @@
     <w:semiHidden/>
     <w:unhideWhenUsed/>
     <w:qFormat/>
-    <w:rsid w:val="00DE5993"/>
+    <w:rsid w:val="00EC4329"/>
     <w:pPr>
       <w:keepNext/>
       <w:keepLines/>
@@ -26172,7 +26263,7 @@
     <w:basedOn w:val="DefaultParagraphFont"/>
     <w:link w:val="Heading1"/>
     <w:uiPriority w:val="9"/>
-    <w:rsid w:val="00DE5993"/>
+    <w:rsid w:val="00EC4329"/>
     <w:rPr>
       <w:rFonts w:asciiTheme="majorHAnsi" w:eastAsiaTheme="majorEastAsia" w:hAnsiTheme="majorHAnsi" w:cstheme="majorBidi"/>
       <w:color w:val="2F5496" w:themeColor="accent1" w:themeShade="BF"/>
@@ -26186,7 +26277,7 @@
     <w:link w:val="Heading2"/>
     <w:uiPriority w:val="9"/>
     <w:semiHidden/>
-    <w:rsid w:val="00DE5993"/>
+    <w:rsid w:val="00EC4329"/>
     <w:rPr>
       <w:rFonts w:asciiTheme="majorHAnsi" w:eastAsiaTheme="majorEastAsia" w:hAnsiTheme="majorHAnsi" w:cstheme="majorBidi"/>
       <w:color w:val="2F5496" w:themeColor="accent1" w:themeShade="BF"/>
@@ -26200,7 +26291,7 @@
     <w:link w:val="Heading3"/>
     <w:uiPriority w:val="9"/>
     <w:semiHidden/>
-    <w:rsid w:val="00DE5993"/>
+    <w:rsid w:val="00EC4329"/>
     <w:rPr>
       <w:rFonts w:eastAsiaTheme="majorEastAsia" w:cstheme="majorBidi"/>
       <w:color w:val="2F5496" w:themeColor="accent1" w:themeShade="BF"/>
@@ -26214,7 +26305,7 @@
     <w:link w:val="Heading4"/>
     <w:uiPriority w:val="9"/>
     <w:semiHidden/>
-    <w:rsid w:val="00DE5993"/>
+    <w:rsid w:val="00EC4329"/>
     <w:rPr>
       <w:rFonts w:eastAsiaTheme="majorEastAsia" w:cstheme="majorBidi"/>
       <w:i/>
@@ -26228,7 +26319,7 @@
     <w:link w:val="Heading5"/>
     <w:uiPriority w:val="9"/>
     <w:semiHidden/>
-    <w:rsid w:val="00DE5993"/>
+    <w:rsid w:val="00EC4329"/>
     <w:rPr>
       <w:rFonts w:eastAsiaTheme="majorEastAsia" w:cstheme="majorBidi"/>
       <w:color w:val="2F5496" w:themeColor="accent1" w:themeShade="BF"/>
@@ -26240,7 +26331,7 @@
     <w:link w:val="Heading6"/>
     <w:uiPriority w:val="9"/>
     <w:semiHidden/>
-    <w:rsid w:val="00DE5993"/>
+    <w:rsid w:val="00EC4329"/>
     <w:rPr>
       <w:rFonts w:eastAsiaTheme="majorEastAsia" w:cstheme="majorBidi"/>
       <w:i/>
@@ -26254,7 +26345,7 @@
     <w:link w:val="Heading7"/>
     <w:uiPriority w:val="9"/>
     <w:semiHidden/>
-    <w:rsid w:val="00DE5993"/>
+    <w:rsid w:val="00EC4329"/>
     <w:rPr>
       <w:rFonts w:eastAsiaTheme="majorEastAsia" w:cstheme="majorBidi"/>
       <w:color w:val="595959" w:themeColor="text1" w:themeTint="A6"/>
@@ -26266,7 +26357,7 @@
     <w:link w:val="Heading8"/>
     <w:uiPriority w:val="9"/>
     <w:semiHidden/>
-    <w:rsid w:val="00DE5993"/>
+    <w:rsid w:val="00EC4329"/>
     <w:rPr>
       <w:rFonts w:eastAsiaTheme="majorEastAsia" w:cstheme="majorBidi"/>
       <w:i/>
@@ -26280,7 +26371,7 @@
     <w:link w:val="Heading9"/>
     <w:uiPriority w:val="9"/>
     <w:semiHidden/>
-    <w:rsid w:val="00DE5993"/>
+    <w:rsid w:val="00EC4329"/>
     <w:rPr>
       <w:rFonts w:eastAsiaTheme="majorEastAsia" w:cstheme="majorBidi"/>
       <w:color w:val="272727" w:themeColor="text1" w:themeTint="D8"/>
@@ -26293,7 +26384,7 @@
     <w:link w:val="TitleChar"/>
     <w:uiPriority w:val="10"/>
     <w:qFormat/>
-    <w:rsid w:val="00DE5993"/>
+    <w:rsid w:val="00EC4329"/>
     <w:pPr>
       <w:spacing w:after="80" w:line="240" w:lineRule="auto"/>
       <w:contextualSpacing/>
@@ -26311,7 +26402,7 @@
     <w:basedOn w:val="DefaultParagraphFont"/>
     <w:link w:val="Title"/>
     <w:uiPriority w:val="10"/>
-    <w:rsid w:val="00DE5993"/>
+    <w:rsid w:val="00EC4329"/>
     <w:rPr>
       <w:rFonts w:asciiTheme="majorHAnsi" w:eastAsiaTheme="majorEastAsia" w:hAnsiTheme="majorHAnsi" w:cstheme="majorBidi"/>
       <w:spacing w:val="-10"/>
@@ -26327,7 +26418,7 @@
     <w:link w:val="SubtitleChar"/>
     <w:uiPriority w:val="11"/>
     <w:qFormat/>
-    <w:rsid w:val="00DE5993"/>
+    <w:rsid w:val="00EC4329"/>
     <w:pPr>
       <w:numPr>
         <w:ilvl w:val="1"/>
@@ -26346,7 +26437,7 @@
     <w:basedOn w:val="DefaultParagraphFont"/>
     <w:link w:val="Subtitle"/>
     <w:uiPriority w:val="11"/>
-    <w:rsid w:val="00DE5993"/>
+    <w:rsid w:val="00EC4329"/>
     <w:rPr>
       <w:rFonts w:eastAsiaTheme="majorEastAsia" w:cstheme="majorBidi"/>
       <w:color w:val="595959" w:themeColor="text1" w:themeTint="A6"/>
@@ -26362,7 +26453,7 @@
     <w:link w:val="QuoteChar"/>
     <w:uiPriority w:val="29"/>
     <w:qFormat/>
-    <w:rsid w:val="00DE5993"/>
+    <w:rsid w:val="00EC4329"/>
     <w:pPr>
       <w:spacing w:before="160"/>
       <w:jc w:val="center"/>
@@ -26378,7 +26469,7 @@
     <w:basedOn w:val="DefaultParagraphFont"/>
     <w:link w:val="Quote"/>
     <w:uiPriority w:val="29"/>
-    <w:rsid w:val="00DE5993"/>
+    <w:rsid w:val="00EC4329"/>
     <w:rPr>
       <w:i/>
       <w:iCs/>
@@ -26390,7 +26481,7 @@
     <w:basedOn w:val="Normal"/>
     <w:uiPriority w:val="34"/>
     <w:qFormat/>
-    <w:rsid w:val="00DE5993"/>
+    <w:rsid w:val="00EC4329"/>
     <w:pPr>
       <w:ind w:left="720"/>
       <w:contextualSpacing/>
@@ -26401,7 +26492,7 @@
     <w:basedOn w:val="DefaultParagraphFont"/>
     <w:uiPriority w:val="21"/>
     <w:qFormat/>
-    <w:rsid w:val="00DE5993"/>
+    <w:rsid w:val="00EC4329"/>
     <w:rPr>
       <w:i/>
       <w:iCs/>
@@ -26415,7 +26506,7 @@
     <w:link w:val="IntenseQuoteChar"/>
     <w:uiPriority w:val="30"/>
     <w:qFormat/>
-    <w:rsid w:val="00DE5993"/>
+    <w:rsid w:val="00EC4329"/>
     <w:pPr>
       <w:pBdr>
         <w:top w:val="single" w:sz="4" w:space="10" w:color="2F5496" w:themeColor="accent1" w:themeShade="BF"/>
@@ -26436,7 +26527,7 @@
     <w:basedOn w:val="DefaultParagraphFont"/>
     <w:link w:val="IntenseQuote"/>
     <w:uiPriority w:val="30"/>
-    <w:rsid w:val="00DE5993"/>
+    <w:rsid w:val="00EC4329"/>
     <w:rPr>
       <w:i/>
       <w:iCs/>
@@ -26448,7 +26539,7 @@
     <w:basedOn w:val="DefaultParagraphFont"/>
     <w:uiPriority w:val="32"/>
     <w:qFormat/>
-    <w:rsid w:val="00DE5993"/>
+    <w:rsid w:val="00EC4329"/>
     <w:rPr>
       <w:b/>
       <w:bCs/>

</xml_diff>

<commit_message>
feat(bab1): tambahkan data dominasi pasar Blue Bird, Grab, dan GoCar (Mirae Asset 2023 & Frontier Group 2024) serta perbarui Mendeley RIS
</commit_message>
<xml_diff>
--- a/TOPIK_2_TAKSI_GREEN_SM/01_Naskah_Utama/Proposal_Skripsi_Taksi_Green_SM.docx
+++ b/TOPIK_2_TAKSI_GREEN_SM/01_Naskah_Utama/Proposal_Skripsi_Taksi_Green_SM.docx
@@ -12,16 +12,16 @@
           <w:noProof/>
         </w:rPr>
         <w:drawing>
-          <wp:inline distT="0" distB="0" distL="0" distR="0" wp14:anchorId="0B343F15" wp14:editId="24C3C6AC">
+          <wp:inline distT="0" distB="0" distL="0" distR="0" wp14:anchorId="22FA477F" wp14:editId="202A6248">
             <wp:extent cx="1152002" cy="1152002"/>
             <wp:effectExtent l="0" t="0" r="0" b="0"/>
-            <wp:docPr id="907904461" name="Picture 1"/>
+            <wp:docPr id="826691691" name="Picture 1"/>
             <wp:cNvGraphicFramePr/>
             <a:graphic xmlns:a="http://schemas.openxmlformats.org/drawingml/2006/main">
               <a:graphicData uri="http://schemas.openxmlformats.org/drawingml/2006/picture">
                 <pic:pic xmlns:pic="http://schemas.openxmlformats.org/drawingml/2006/picture">
                   <pic:nvPicPr>
-                    <pic:cNvPr id="907904461" name=""/>
+                    <pic:cNvPr id="826691691" name=""/>
                     <pic:cNvPicPr/>
                   </pic:nvPicPr>
                   <pic:blipFill>
@@ -1969,7 +1969,112 @@
           <w:rFonts w:ascii="Times New Roman" w:hAnsi="Times New Roman" w:cs="Times New Roman"/>
           <w:sz w:val="24"/>
         </w:rPr>
-        <w:t xml:space="preserve">. Di tengah dominasi pemain mapan seperti PT </w:t>
+        <w:t>. Kendati demikian, pasar mobilitas perkotaan di Indonesia memiliki struktur oligopoli ketat yang didominasi secara mutlak oleh pemain-pemain mapan. Laporan riset pasar industri transportasi dari Mirae Asset Sekuritas (2023) mencatat bahwa pasar angkutan penumpang berbasis aplikasi (</w:t>
+      </w:r>
+      <w:r>
+        <w:rPr>
+          <w:rFonts w:ascii="Times New Roman" w:hAnsi="Times New Roman" w:cs="Times New Roman"/>
+          <w:i/>
+          <w:sz w:val="24"/>
+        </w:rPr>
+        <w:t>ride-hailing</w:t>
+      </w:r>
+      <w:r>
+        <w:rPr>
+          <w:rFonts w:ascii="Times New Roman" w:hAnsi="Times New Roman" w:cs="Times New Roman"/>
+          <w:sz w:val="24"/>
+        </w:rPr>
+        <w:t>) di Indonesia dikuasai secara masif oleh duopoli korporasi teknologi besar dengan pangsa pasar kumulatif mencapai 90% hingga 95%, di mana pada segmen armada kendaraan roda empat (</w:t>
+      </w:r>
+      <w:r>
+        <w:rPr>
+          <w:rFonts w:ascii="Times New Roman" w:hAnsi="Times New Roman" w:cs="Times New Roman"/>
+          <w:i/>
+          <w:sz w:val="24"/>
+        </w:rPr>
+        <w:t>car-hailing</w:t>
+      </w:r>
+      <w:r>
+        <w:rPr>
+          <w:rFonts w:ascii="Times New Roman" w:hAnsi="Times New Roman" w:cs="Times New Roman"/>
+          <w:sz w:val="24"/>
+        </w:rPr>
+        <w:t xml:space="preserve">), </w:t>
+      </w:r>
+      <w:r>
+        <w:rPr>
+          <w:rFonts w:ascii="Times New Roman" w:hAnsi="Times New Roman" w:cs="Times New Roman"/>
+          <w:i/>
+          <w:sz w:val="24"/>
+        </w:rPr>
+        <w:t>Grab</w:t>
+      </w:r>
+      <w:r>
+        <w:rPr>
+          <w:rFonts w:ascii="Times New Roman" w:hAnsi="Times New Roman" w:cs="Times New Roman"/>
+          <w:sz w:val="24"/>
+        </w:rPr>
+        <w:t xml:space="preserve"> memegang pangsa pasar sekitar 55% dan disusul oleh </w:t>
+      </w:r>
+      <w:r>
+        <w:rPr>
+          <w:rFonts w:ascii="Times New Roman" w:hAnsi="Times New Roman" w:cs="Times New Roman"/>
+          <w:i/>
+          <w:sz w:val="24"/>
+        </w:rPr>
+        <w:t>GoTo</w:t>
+      </w:r>
+      <w:r>
+        <w:rPr>
+          <w:rFonts w:ascii="Times New Roman" w:hAnsi="Times New Roman" w:cs="Times New Roman"/>
+          <w:sz w:val="24"/>
+        </w:rPr>
+        <w:t xml:space="preserve"> (</w:t>
+      </w:r>
+      <w:r>
+        <w:rPr>
+          <w:rFonts w:ascii="Times New Roman" w:hAnsi="Times New Roman" w:cs="Times New Roman"/>
+          <w:i/>
+          <w:sz w:val="24"/>
+        </w:rPr>
+        <w:t>GoCar</w:t>
+      </w:r>
+      <w:r>
+        <w:rPr>
+          <w:rFonts w:ascii="Times New Roman" w:hAnsi="Times New Roman" w:cs="Times New Roman"/>
+          <w:sz w:val="24"/>
+        </w:rPr>
+        <w:t xml:space="preserve">) sebesar 45%. Dominasi ini dipertegas oleh data Top Brand Index (Frontier Group, 2024) pada kategori transportasi </w:t>
+      </w:r>
+      <w:r>
+        <w:rPr>
+          <w:rFonts w:ascii="Times New Roman" w:hAnsi="Times New Roman" w:cs="Times New Roman"/>
+          <w:i/>
+          <w:sz w:val="24"/>
+        </w:rPr>
+        <w:t>online</w:t>
+      </w:r>
+      <w:r>
+        <w:rPr>
+          <w:rFonts w:ascii="Times New Roman" w:hAnsi="Times New Roman" w:cs="Times New Roman"/>
+          <w:sz w:val="24"/>
+        </w:rPr>
+        <w:t xml:space="preserve">, di mana Gojek (62,0%) dan </w:t>
+      </w:r>
+      <w:r>
+        <w:rPr>
+          <w:rFonts w:ascii="Times New Roman" w:hAnsi="Times New Roman" w:cs="Times New Roman"/>
+          <w:i/>
+          <w:sz w:val="24"/>
+        </w:rPr>
+        <w:t>Grab</w:t>
+      </w:r>
+      <w:r>
+        <w:rPr>
+          <w:rFonts w:ascii="Times New Roman" w:hAnsi="Times New Roman" w:cs="Times New Roman"/>
+          <w:sz w:val="24"/>
+        </w:rPr>
+        <w:t xml:space="preserve"> (31,6%) secara kumulatif menyerap 93,6% kekuatan pilihan merek konsumen Indonesia, sementara pada segmen taksi resmi berargo, PT </w:t>
       </w:r>
       <w:r>
         <w:rPr>
@@ -1984,52 +2089,22 @@
           <w:rFonts w:ascii="Times New Roman" w:hAnsi="Times New Roman" w:cs="Times New Roman"/>
           <w:sz w:val="24"/>
         </w:rPr>
-        <w:t xml:space="preserve"> Tbk yang legendaris serta korporasi teknologi mobilitas digital terkemuka seperti </w:t>
-      </w:r>
-      <w:r>
-        <w:rPr>
-          <w:rFonts w:ascii="Times New Roman" w:hAnsi="Times New Roman" w:cs="Times New Roman"/>
-          <w:i/>
-          <w:sz w:val="24"/>
-        </w:rPr>
-        <w:t>Grab</w:t>
-      </w:r>
-      <w:r>
-        <w:rPr>
-          <w:rFonts w:ascii="Times New Roman" w:hAnsi="Times New Roman" w:cs="Times New Roman"/>
-          <w:sz w:val="24"/>
-        </w:rPr>
-        <w:t xml:space="preserve"> dan </w:t>
-      </w:r>
-      <w:r>
-        <w:rPr>
-          <w:rFonts w:ascii="Times New Roman" w:hAnsi="Times New Roman" w:cs="Times New Roman"/>
-          <w:i/>
-          <w:sz w:val="24"/>
-        </w:rPr>
-        <w:t>GoTo</w:t>
-      </w:r>
-      <w:r>
-        <w:rPr>
-          <w:rFonts w:ascii="Times New Roman" w:hAnsi="Times New Roman" w:cs="Times New Roman"/>
-          <w:sz w:val="24"/>
-        </w:rPr>
-        <w:t xml:space="preserve"> (</w:t>
-      </w:r>
-      <w:r>
-        <w:rPr>
-          <w:rFonts w:ascii="Times New Roman" w:hAnsi="Times New Roman" w:cs="Times New Roman"/>
-          <w:i/>
-          <w:sz w:val="24"/>
-        </w:rPr>
-        <w:t>GoCar</w:t>
-      </w:r>
-      <w:r>
-        <w:rPr>
-          <w:rFonts w:ascii="Times New Roman" w:hAnsi="Times New Roman" w:cs="Times New Roman"/>
-          <w:sz w:val="24"/>
-        </w:rPr>
-        <w:t>), lanskap transportasi DKI Jakarta mencatatkan babak baru dengan hadirnya pendatang baru global (</w:t>
+        <w:t xml:space="preserve"> Tbk secara konsisten mempertahankan posisi dominan sebagai pemimpin pasar (</w:t>
+      </w:r>
+      <w:r>
+        <w:rPr>
+          <w:rFonts w:ascii="Times New Roman" w:hAnsi="Times New Roman" w:cs="Times New Roman"/>
+          <w:i/>
+          <w:sz w:val="24"/>
+        </w:rPr>
+        <w:t>market leader</w:t>
+      </w:r>
+      <w:r>
+        <w:rPr>
+          <w:rFonts w:ascii="Times New Roman" w:hAnsi="Times New Roman" w:cs="Times New Roman"/>
+          <w:sz w:val="24"/>
+        </w:rPr>
+        <w:t>) yang telah mengakar kuat selama lebih dari lima dekade melalui jaringan armada konvensional dan aplikasi digitalnya. Di tengah hegemoni ketiga raksasa transportasi tersebut, lanskap mobilitas DKI Jakarta mencatatkan babak baru dengan hadirnya pendatang baru global (</w:t>
       </w:r>
       <w:r>
         <w:rPr>
@@ -17620,22 +17695,22 @@
           <w:rFonts w:ascii="Times New Roman" w:hAnsi="Times New Roman" w:cs="Times New Roman"/>
           <w:sz w:val="24"/>
         </w:rPr>
-        <w:t xml:space="preserve">Ghozali, I. (2021). Aplikasi analisis multivariate dengan program </w:t>
-      </w:r>
-      <w:r>
-        <w:rPr>
-          <w:rFonts w:ascii="Times New Roman" w:hAnsi="Times New Roman" w:cs="Times New Roman"/>
-          <w:i/>
-          <w:sz w:val="24"/>
-        </w:rPr>
-        <w:t>IBM SPSS</w:t>
-      </w:r>
-      <w:r>
-        <w:rPr>
-          <w:rFonts w:ascii="Times New Roman" w:hAnsi="Times New Roman" w:cs="Times New Roman"/>
-          <w:sz w:val="24"/>
-        </w:rPr>
-        <w:t xml:space="preserve"> 26 (Edisi ke-10). Badan Penerbit Universitas Diponegoro.</w:t>
+        <w:t xml:space="preserve">Frontier Group. (2024). Top Brand Index kategori transportasi </w:t>
+      </w:r>
+      <w:r>
+        <w:rPr>
+          <w:rFonts w:ascii="Times New Roman" w:hAnsi="Times New Roman" w:cs="Times New Roman"/>
+          <w:i/>
+          <w:sz w:val="24"/>
+        </w:rPr>
+        <w:t>online</w:t>
+      </w:r>
+      <w:r>
+        <w:rPr>
+          <w:rFonts w:ascii="Times New Roman" w:hAnsi="Times New Roman" w:cs="Times New Roman"/>
+          <w:sz w:val="24"/>
+        </w:rPr>
+        <w:t xml:space="preserve"> dan taksi 2024. Frontier Consulting Group &amp; Majalah Marketing. https://www.topbrand-award.com</w:t>
       </w:r>
     </w:p>
     <w:p>
@@ -17654,7 +17729,22 @@
           <w:rFonts w:ascii="Times New Roman" w:hAnsi="Times New Roman" w:cs="Times New Roman"/>
           <w:sz w:val="24"/>
         </w:rPr>
-        <w:t>Hair, J. F., Black, W. C., Babin, B. J., &amp; Anderson, R. E. (2019). Multivariate data analysis (8th ed.). Cengage Learning.</w:t>
+        <w:t xml:space="preserve">Ghozali, I. (2021). Aplikasi analisis multivariate dengan program </w:t>
+      </w:r>
+      <w:r>
+        <w:rPr>
+          <w:rFonts w:ascii="Times New Roman" w:hAnsi="Times New Roman" w:cs="Times New Roman"/>
+          <w:i/>
+          <w:sz w:val="24"/>
+        </w:rPr>
+        <w:t>IBM SPSS</w:t>
+      </w:r>
+      <w:r>
+        <w:rPr>
+          <w:rFonts w:ascii="Times New Roman" w:hAnsi="Times New Roman" w:cs="Times New Roman"/>
+          <w:sz w:val="24"/>
+        </w:rPr>
+        <w:t xml:space="preserve"> 26 (Edisi ke-10). Badan Penerbit Universitas Diponegoro.</w:t>
       </w:r>
     </w:p>
     <w:p>
@@ -17673,7 +17763,7 @@
           <w:rFonts w:ascii="Times New Roman" w:hAnsi="Times New Roman" w:cs="Times New Roman"/>
           <w:sz w:val="24"/>
         </w:rPr>
-        <w:t>International Energy Agency. (2023). Global EV outlook 2023: Catching up with climate targets. IEA Publications. https://doi.org/10.1787/d4349524-en</w:t>
+        <w:t>Hair, J. F., Black, W. C., Babin, B. J., &amp; Anderson, R. E. (2019). Multivariate data analysis (8th ed.). Cengage Learning.</w:t>
       </w:r>
     </w:p>
     <w:p>
@@ -17692,22 +17782,7 @@
           <w:rFonts w:ascii="Times New Roman" w:hAnsi="Times New Roman" w:cs="Times New Roman"/>
           <w:sz w:val="24"/>
         </w:rPr>
-        <w:t xml:space="preserve">Keller, K. L. (1993). Conceptualizing, measuring, and managing </w:t>
-      </w:r>
-      <w:r>
-        <w:rPr>
-          <w:rFonts w:ascii="Times New Roman" w:hAnsi="Times New Roman" w:cs="Times New Roman"/>
-          <w:i/>
-          <w:sz w:val="24"/>
-        </w:rPr>
-        <w:t>customer-based brand equity</w:t>
-      </w:r>
-      <w:r>
-        <w:rPr>
-          <w:rFonts w:ascii="Times New Roman" w:hAnsi="Times New Roman" w:cs="Times New Roman"/>
-          <w:sz w:val="24"/>
-        </w:rPr>
-        <w:t>. Journal of Marketing, 57(1), 1–22. https://doi.org/10.1177/002224299305700101</w:t>
+        <w:t>International Energy Agency. (2023). Global EV outlook 2023: Catching up with climate targets. IEA Publications. https://doi.org/10.1787/d4349524-en</w:t>
       </w:r>
     </w:p>
     <w:p>
@@ -17726,37 +17801,22 @@
           <w:rFonts w:ascii="Times New Roman" w:hAnsi="Times New Roman" w:cs="Times New Roman"/>
           <w:sz w:val="24"/>
         </w:rPr>
-        <w:t xml:space="preserve">Keller, K. L. (2013). Strategic </w:t>
-      </w:r>
-      <w:r>
-        <w:rPr>
-          <w:rFonts w:ascii="Times New Roman" w:hAnsi="Times New Roman" w:cs="Times New Roman"/>
-          <w:i/>
-          <w:sz w:val="24"/>
-        </w:rPr>
-        <w:t>brand management</w:t>
-      </w:r>
-      <w:r>
-        <w:rPr>
-          <w:rFonts w:ascii="Times New Roman" w:hAnsi="Times New Roman" w:cs="Times New Roman"/>
-          <w:sz w:val="24"/>
-        </w:rPr>
-        <w:t xml:space="preserve">: Building, measuring, and managing </w:t>
-      </w:r>
-      <w:r>
-        <w:rPr>
-          <w:rFonts w:ascii="Times New Roman" w:hAnsi="Times New Roman" w:cs="Times New Roman"/>
-          <w:i/>
-          <w:sz w:val="24"/>
-        </w:rPr>
-        <w:t>brand equity</w:t>
-      </w:r>
-      <w:r>
-        <w:rPr>
-          <w:rFonts w:ascii="Times New Roman" w:hAnsi="Times New Roman" w:cs="Times New Roman"/>
-          <w:sz w:val="24"/>
-        </w:rPr>
-        <w:t xml:space="preserve"> (4th ed.). Pearson Education.</w:t>
+        <w:t xml:space="preserve">Keller, K. L. (1993). Conceptualizing, measuring, and managing </w:t>
+      </w:r>
+      <w:r>
+        <w:rPr>
+          <w:rFonts w:ascii="Times New Roman" w:hAnsi="Times New Roman" w:cs="Times New Roman"/>
+          <w:i/>
+          <w:sz w:val="24"/>
+        </w:rPr>
+        <w:t>customer-based brand equity</w:t>
+      </w:r>
+      <w:r>
+        <w:rPr>
+          <w:rFonts w:ascii="Times New Roman" w:hAnsi="Times New Roman" w:cs="Times New Roman"/>
+          <w:sz w:val="24"/>
+        </w:rPr>
+        <w:t>. Journal of Marketing, 57(1), 1–22. https://doi.org/10.1177/002224299305700101</w:t>
       </w:r>
     </w:p>
     <w:p>
@@ -17775,7 +17835,37 @@
           <w:rFonts w:ascii="Times New Roman" w:hAnsi="Times New Roman" w:cs="Times New Roman"/>
           <w:sz w:val="24"/>
         </w:rPr>
-        <w:t>Kotler, P., &amp; Keller, K. L. (2016). Marketing management (15th ed.). Pearson Education.</w:t>
+        <w:t xml:space="preserve">Keller, K. L. (2013). Strategic </w:t>
+      </w:r>
+      <w:r>
+        <w:rPr>
+          <w:rFonts w:ascii="Times New Roman" w:hAnsi="Times New Roman" w:cs="Times New Roman"/>
+          <w:i/>
+          <w:sz w:val="24"/>
+        </w:rPr>
+        <w:t>brand management</w:t>
+      </w:r>
+      <w:r>
+        <w:rPr>
+          <w:rFonts w:ascii="Times New Roman" w:hAnsi="Times New Roman" w:cs="Times New Roman"/>
+          <w:sz w:val="24"/>
+        </w:rPr>
+        <w:t xml:space="preserve">: Building, measuring, and managing </w:t>
+      </w:r>
+      <w:r>
+        <w:rPr>
+          <w:rFonts w:ascii="Times New Roman" w:hAnsi="Times New Roman" w:cs="Times New Roman"/>
+          <w:i/>
+          <w:sz w:val="24"/>
+        </w:rPr>
+        <w:t>brand equity</w:t>
+      </w:r>
+      <w:r>
+        <w:rPr>
+          <w:rFonts w:ascii="Times New Roman" w:hAnsi="Times New Roman" w:cs="Times New Roman"/>
+          <w:sz w:val="24"/>
+        </w:rPr>
+        <w:t xml:space="preserve"> (4th ed.). Pearson Education.</w:t>
       </w:r>
     </w:p>
     <w:p>
@@ -17794,6 +17884,25 @@
           <w:rFonts w:ascii="Times New Roman" w:hAnsi="Times New Roman" w:cs="Times New Roman"/>
           <w:sz w:val="24"/>
         </w:rPr>
+        <w:t>Kotler, P., &amp; Keller, K. L. (2016). Marketing management (15th ed.). Pearson Education.</w:t>
+      </w:r>
+    </w:p>
+    <w:p>
+      <w:pPr>
+        <w:keepNext/>
+        <w:spacing w:after="120" w:line="360" w:lineRule="auto"/>
+        <w:ind w:firstLine="709"/>
+        <w:jc w:val="both"/>
+        <w:rPr>
+          <w:rFonts w:ascii="Times New Roman" w:hAnsi="Times New Roman" w:cs="Times New Roman"/>
+          <w:sz w:val="24"/>
+        </w:rPr>
+      </w:pPr>
+      <w:r>
+        <w:rPr>
+          <w:rFonts w:ascii="Times New Roman" w:hAnsi="Times New Roman" w:cs="Times New Roman"/>
+          <w:sz w:val="24"/>
+        </w:rPr>
         <w:t xml:space="preserve">Lemeshow, S., Hosmer, D. W., Klar, J., &amp; Lwanga, S. K. (1997). Adequacy of </w:t>
       </w:r>
       <w:r>
@@ -17810,6 +17919,40 @@
           <w:sz w:val="24"/>
         </w:rPr>
         <w:t xml:space="preserve"> in health studies. John Wiley &amp; Sons.</w:t>
+      </w:r>
+    </w:p>
+    <w:p>
+      <w:pPr>
+        <w:keepNext/>
+        <w:spacing w:after="120" w:line="360" w:lineRule="auto"/>
+        <w:ind w:firstLine="709"/>
+        <w:jc w:val="both"/>
+        <w:rPr>
+          <w:rFonts w:ascii="Times New Roman" w:hAnsi="Times New Roman" w:cs="Times New Roman"/>
+          <w:sz w:val="24"/>
+        </w:rPr>
+      </w:pPr>
+      <w:r>
+        <w:rPr>
+          <w:rFonts w:ascii="Times New Roman" w:hAnsi="Times New Roman" w:cs="Times New Roman"/>
+          <w:sz w:val="24"/>
+        </w:rPr>
+        <w:t xml:space="preserve">Mirae Asset Sekuritas Indonesia. (2023). Indonesia mobility sector update: Navigating duopoly competition and profitability in </w:t>
+      </w:r>
+      <w:r>
+        <w:rPr>
+          <w:rFonts w:ascii="Times New Roman" w:hAnsi="Times New Roman" w:cs="Times New Roman"/>
+          <w:i/>
+          <w:sz w:val="24"/>
+        </w:rPr>
+        <w:t>ride-hailing</w:t>
+      </w:r>
+      <w:r>
+        <w:rPr>
+          <w:rFonts w:ascii="Times New Roman" w:hAnsi="Times New Roman" w:cs="Times New Roman"/>
+          <w:sz w:val="24"/>
+        </w:rPr>
+        <w:t xml:space="preserve"> services. Research Report, Mirae Asset Sekuritas.</w:t>
       </w:r>
     </w:p>
     <w:p>
@@ -26039,7 +26182,7 @@
     <w:link w:val="Heading1Char"/>
     <w:uiPriority w:val="9"/>
     <w:qFormat/>
-    <w:rsid w:val="00EC4329"/>
+    <w:rsid w:val="00DA1569"/>
     <w:pPr>
       <w:keepNext/>
       <w:keepLines/>
@@ -26062,7 +26205,7 @@
     <w:semiHidden/>
     <w:unhideWhenUsed/>
     <w:qFormat/>
-    <w:rsid w:val="00EC4329"/>
+    <w:rsid w:val="00DA1569"/>
     <w:pPr>
       <w:keepNext/>
       <w:keepLines/>
@@ -26085,7 +26228,7 @@
     <w:semiHidden/>
     <w:unhideWhenUsed/>
     <w:qFormat/>
-    <w:rsid w:val="00EC4329"/>
+    <w:rsid w:val="00DA1569"/>
     <w:pPr>
       <w:keepNext/>
       <w:keepLines/>
@@ -26108,7 +26251,7 @@
     <w:semiHidden/>
     <w:unhideWhenUsed/>
     <w:qFormat/>
-    <w:rsid w:val="00EC4329"/>
+    <w:rsid w:val="00DA1569"/>
     <w:pPr>
       <w:keepNext/>
       <w:keepLines/>
@@ -26131,7 +26274,7 @@
     <w:semiHidden/>
     <w:unhideWhenUsed/>
     <w:qFormat/>
-    <w:rsid w:val="00EC4329"/>
+    <w:rsid w:val="00DA1569"/>
     <w:pPr>
       <w:keepNext/>
       <w:keepLines/>
@@ -26152,7 +26295,7 @@
     <w:semiHidden/>
     <w:unhideWhenUsed/>
     <w:qFormat/>
-    <w:rsid w:val="00EC4329"/>
+    <w:rsid w:val="00DA1569"/>
     <w:pPr>
       <w:keepNext/>
       <w:keepLines/>
@@ -26175,7 +26318,7 @@
     <w:semiHidden/>
     <w:unhideWhenUsed/>
     <w:qFormat/>
-    <w:rsid w:val="00EC4329"/>
+    <w:rsid w:val="00DA1569"/>
     <w:pPr>
       <w:keepNext/>
       <w:keepLines/>
@@ -26196,7 +26339,7 @@
     <w:semiHidden/>
     <w:unhideWhenUsed/>
     <w:qFormat/>
-    <w:rsid w:val="00EC4329"/>
+    <w:rsid w:val="00DA1569"/>
     <w:pPr>
       <w:keepNext/>
       <w:keepLines/>
@@ -26219,7 +26362,7 @@
     <w:semiHidden/>
     <w:unhideWhenUsed/>
     <w:qFormat/>
-    <w:rsid w:val="00EC4329"/>
+    <w:rsid w:val="00DA1569"/>
     <w:pPr>
       <w:keepNext/>
       <w:keepLines/>
@@ -26263,7 +26406,7 @@
     <w:basedOn w:val="DefaultParagraphFont"/>
     <w:link w:val="Heading1"/>
     <w:uiPriority w:val="9"/>
-    <w:rsid w:val="00EC4329"/>
+    <w:rsid w:val="00DA1569"/>
     <w:rPr>
       <w:rFonts w:asciiTheme="majorHAnsi" w:eastAsiaTheme="majorEastAsia" w:hAnsiTheme="majorHAnsi" w:cstheme="majorBidi"/>
       <w:color w:val="2F5496" w:themeColor="accent1" w:themeShade="BF"/>
@@ -26277,7 +26420,7 @@
     <w:link w:val="Heading2"/>
     <w:uiPriority w:val="9"/>
     <w:semiHidden/>
-    <w:rsid w:val="00EC4329"/>
+    <w:rsid w:val="00DA1569"/>
     <w:rPr>
       <w:rFonts w:asciiTheme="majorHAnsi" w:eastAsiaTheme="majorEastAsia" w:hAnsiTheme="majorHAnsi" w:cstheme="majorBidi"/>
       <w:color w:val="2F5496" w:themeColor="accent1" w:themeShade="BF"/>
@@ -26291,7 +26434,7 @@
     <w:link w:val="Heading3"/>
     <w:uiPriority w:val="9"/>
     <w:semiHidden/>
-    <w:rsid w:val="00EC4329"/>
+    <w:rsid w:val="00DA1569"/>
     <w:rPr>
       <w:rFonts w:eastAsiaTheme="majorEastAsia" w:cstheme="majorBidi"/>
       <w:color w:val="2F5496" w:themeColor="accent1" w:themeShade="BF"/>
@@ -26305,7 +26448,7 @@
     <w:link w:val="Heading4"/>
     <w:uiPriority w:val="9"/>
     <w:semiHidden/>
-    <w:rsid w:val="00EC4329"/>
+    <w:rsid w:val="00DA1569"/>
     <w:rPr>
       <w:rFonts w:eastAsiaTheme="majorEastAsia" w:cstheme="majorBidi"/>
       <w:i/>
@@ -26319,7 +26462,7 @@
     <w:link w:val="Heading5"/>
     <w:uiPriority w:val="9"/>
     <w:semiHidden/>
-    <w:rsid w:val="00EC4329"/>
+    <w:rsid w:val="00DA1569"/>
     <w:rPr>
       <w:rFonts w:eastAsiaTheme="majorEastAsia" w:cstheme="majorBidi"/>
       <w:color w:val="2F5496" w:themeColor="accent1" w:themeShade="BF"/>
@@ -26331,7 +26474,7 @@
     <w:link w:val="Heading6"/>
     <w:uiPriority w:val="9"/>
     <w:semiHidden/>
-    <w:rsid w:val="00EC4329"/>
+    <w:rsid w:val="00DA1569"/>
     <w:rPr>
       <w:rFonts w:eastAsiaTheme="majorEastAsia" w:cstheme="majorBidi"/>
       <w:i/>
@@ -26345,7 +26488,7 @@
     <w:link w:val="Heading7"/>
     <w:uiPriority w:val="9"/>
     <w:semiHidden/>
-    <w:rsid w:val="00EC4329"/>
+    <w:rsid w:val="00DA1569"/>
     <w:rPr>
       <w:rFonts w:eastAsiaTheme="majorEastAsia" w:cstheme="majorBidi"/>
       <w:color w:val="595959" w:themeColor="text1" w:themeTint="A6"/>
@@ -26357,7 +26500,7 @@
     <w:link w:val="Heading8"/>
     <w:uiPriority w:val="9"/>
     <w:semiHidden/>
-    <w:rsid w:val="00EC4329"/>
+    <w:rsid w:val="00DA1569"/>
     <w:rPr>
       <w:rFonts w:eastAsiaTheme="majorEastAsia" w:cstheme="majorBidi"/>
       <w:i/>
@@ -26371,7 +26514,7 @@
     <w:link w:val="Heading9"/>
     <w:uiPriority w:val="9"/>
     <w:semiHidden/>
-    <w:rsid w:val="00EC4329"/>
+    <w:rsid w:val="00DA1569"/>
     <w:rPr>
       <w:rFonts w:eastAsiaTheme="majorEastAsia" w:cstheme="majorBidi"/>
       <w:color w:val="272727" w:themeColor="text1" w:themeTint="D8"/>
@@ -26384,7 +26527,7 @@
     <w:link w:val="TitleChar"/>
     <w:uiPriority w:val="10"/>
     <w:qFormat/>
-    <w:rsid w:val="00EC4329"/>
+    <w:rsid w:val="00DA1569"/>
     <w:pPr>
       <w:spacing w:after="80" w:line="240" w:lineRule="auto"/>
       <w:contextualSpacing/>
@@ -26402,7 +26545,7 @@
     <w:basedOn w:val="DefaultParagraphFont"/>
     <w:link w:val="Title"/>
     <w:uiPriority w:val="10"/>
-    <w:rsid w:val="00EC4329"/>
+    <w:rsid w:val="00DA1569"/>
     <w:rPr>
       <w:rFonts w:asciiTheme="majorHAnsi" w:eastAsiaTheme="majorEastAsia" w:hAnsiTheme="majorHAnsi" w:cstheme="majorBidi"/>
       <w:spacing w:val="-10"/>
@@ -26418,7 +26561,7 @@
     <w:link w:val="SubtitleChar"/>
     <w:uiPriority w:val="11"/>
     <w:qFormat/>
-    <w:rsid w:val="00EC4329"/>
+    <w:rsid w:val="00DA1569"/>
     <w:pPr>
       <w:numPr>
         <w:ilvl w:val="1"/>
@@ -26437,7 +26580,7 @@
     <w:basedOn w:val="DefaultParagraphFont"/>
     <w:link w:val="Subtitle"/>
     <w:uiPriority w:val="11"/>
-    <w:rsid w:val="00EC4329"/>
+    <w:rsid w:val="00DA1569"/>
     <w:rPr>
       <w:rFonts w:eastAsiaTheme="majorEastAsia" w:cstheme="majorBidi"/>
       <w:color w:val="595959" w:themeColor="text1" w:themeTint="A6"/>
@@ -26453,7 +26596,7 @@
     <w:link w:val="QuoteChar"/>
     <w:uiPriority w:val="29"/>
     <w:qFormat/>
-    <w:rsid w:val="00EC4329"/>
+    <w:rsid w:val="00DA1569"/>
     <w:pPr>
       <w:spacing w:before="160"/>
       <w:jc w:val="center"/>
@@ -26469,7 +26612,7 @@
     <w:basedOn w:val="DefaultParagraphFont"/>
     <w:link w:val="Quote"/>
     <w:uiPriority w:val="29"/>
-    <w:rsid w:val="00EC4329"/>
+    <w:rsid w:val="00DA1569"/>
     <w:rPr>
       <w:i/>
       <w:iCs/>
@@ -26481,7 +26624,7 @@
     <w:basedOn w:val="Normal"/>
     <w:uiPriority w:val="34"/>
     <w:qFormat/>
-    <w:rsid w:val="00EC4329"/>
+    <w:rsid w:val="00DA1569"/>
     <w:pPr>
       <w:ind w:left="720"/>
       <w:contextualSpacing/>
@@ -26492,7 +26635,7 @@
     <w:basedOn w:val="DefaultParagraphFont"/>
     <w:uiPriority w:val="21"/>
     <w:qFormat/>
-    <w:rsid w:val="00EC4329"/>
+    <w:rsid w:val="00DA1569"/>
     <w:rPr>
       <w:i/>
       <w:iCs/>
@@ -26506,7 +26649,7 @@
     <w:link w:val="IntenseQuoteChar"/>
     <w:uiPriority w:val="30"/>
     <w:qFormat/>
-    <w:rsid w:val="00EC4329"/>
+    <w:rsid w:val="00DA1569"/>
     <w:pPr>
       <w:pBdr>
         <w:top w:val="single" w:sz="4" w:space="10" w:color="2F5496" w:themeColor="accent1" w:themeShade="BF"/>
@@ -26527,7 +26670,7 @@
     <w:basedOn w:val="DefaultParagraphFont"/>
     <w:link w:val="IntenseQuote"/>
     <w:uiPriority w:val="30"/>
-    <w:rsid w:val="00EC4329"/>
+    <w:rsid w:val="00DA1569"/>
     <w:rPr>
       <w:i/>
       <w:iCs/>
@@ -26539,7 +26682,7 @@
     <w:basedOn w:val="DefaultParagraphFont"/>
     <w:uiPriority w:val="32"/>
     <w:qFormat/>
-    <w:rsid w:val="00EC4329"/>
+    <w:rsid w:val="00DA1569"/>
     <w:rPr>
       <w:b/>
       <w:bCs/>

</xml_diff>

<commit_message>
feat(bab1): tambahkan kalimat penghubung transisi kota Jakarta sebelum Jakarta Barat
</commit_message>
<xml_diff>
--- a/TOPIK_2_TAKSI_GREEN_SM/01_Naskah_Utama/Proposal_Skripsi_Taksi_Green_SM.docx
+++ b/TOPIK_2_TAKSI_GREEN_SM/01_Naskah_Utama/Proposal_Skripsi_Taksi_Green_SM.docx
@@ -12,16 +12,16 @@
           <w:noProof/>
         </w:rPr>
         <w:drawing>
-          <wp:inline distT="0" distB="0" distL="0" distR="0" wp14:anchorId="22FA477F" wp14:editId="202A6248">
+          <wp:inline distT="0" distB="0" distL="0" distR="0" wp14:anchorId="005EF5C7" wp14:editId="31C04E98">
             <wp:extent cx="1152002" cy="1152002"/>
             <wp:effectExtent l="0" t="0" r="0" b="0"/>
-            <wp:docPr id="826691691" name="Picture 1"/>
+            <wp:docPr id="1642505168" name="Picture 1"/>
             <wp:cNvGraphicFramePr/>
             <a:graphic xmlns:a="http://schemas.openxmlformats.org/drawingml/2006/main">
               <a:graphicData uri="http://schemas.openxmlformats.org/drawingml/2006/picture">
                 <pic:pic xmlns:pic="http://schemas.openxmlformats.org/drawingml/2006/picture">
                   <pic:nvPicPr>
-                    <pic:cNvPr id="826691691" name=""/>
+                    <pic:cNvPr id="1642505168" name=""/>
                     <pic:cNvPicPr/>
                   </pic:nvPicPr>
                   <pic:blipFill>
@@ -2281,7 +2281,22 @@
           <w:rFonts w:ascii="Times New Roman" w:hAnsi="Times New Roman" w:cs="Times New Roman"/>
           <w:sz w:val="24"/>
         </w:rPr>
-        <w:t>).</w:t>
+        <w:t xml:space="preserve">). Kehadiran inovasi armada taksi listrik ini secara resmi menempatkan kota metropolitan DKI Jakarta sebagai gerbang pembuka sekaligus episentrum utama operasionalisasi komersial </w:t>
+      </w:r>
+      <w:r>
+        <w:rPr>
+          <w:rFonts w:ascii="Times New Roman" w:hAnsi="Times New Roman" w:cs="Times New Roman"/>
+          <w:i/>
+          <w:sz w:val="24"/>
+        </w:rPr>
+        <w:t>Green SM</w:t>
+      </w:r>
+      <w:r>
+        <w:rPr>
+          <w:rFonts w:ascii="Times New Roman" w:hAnsi="Times New Roman" w:cs="Times New Roman"/>
+          <w:sz w:val="24"/>
+        </w:rPr>
+        <w:t xml:space="preserve"> di Indonesia.</w:t>
       </w:r>
     </w:p>
     <w:p>
@@ -2300,7 +2315,7 @@
           <w:rFonts w:ascii="Times New Roman" w:hAnsi="Times New Roman" w:cs="Times New Roman"/>
           <w:sz w:val="24"/>
         </w:rPr>
-        <w:t xml:space="preserve">Kawasan Jakarta Barat memegang peranan sangat strategis dalam operasionalisasi dan penetrasi pasar </w:t>
+        <w:t xml:space="preserve">Dalam konstelasi wilayah metropolitan Jakarta tersebut, kawasan Jakarta Barat memegang peranan sangat strategis dalam operasionalisasi dan penetrasi pasar </w:t>
       </w:r>
       <w:r>
         <w:rPr>
@@ -26182,7 +26197,7 @@
     <w:link w:val="Heading1Char"/>
     <w:uiPriority w:val="9"/>
     <w:qFormat/>
-    <w:rsid w:val="00DA1569"/>
+    <w:rsid w:val="00E0399D"/>
     <w:pPr>
       <w:keepNext/>
       <w:keepLines/>
@@ -26205,7 +26220,7 @@
     <w:semiHidden/>
     <w:unhideWhenUsed/>
     <w:qFormat/>
-    <w:rsid w:val="00DA1569"/>
+    <w:rsid w:val="00E0399D"/>
     <w:pPr>
       <w:keepNext/>
       <w:keepLines/>
@@ -26228,7 +26243,7 @@
     <w:semiHidden/>
     <w:unhideWhenUsed/>
     <w:qFormat/>
-    <w:rsid w:val="00DA1569"/>
+    <w:rsid w:val="00E0399D"/>
     <w:pPr>
       <w:keepNext/>
       <w:keepLines/>
@@ -26251,7 +26266,7 @@
     <w:semiHidden/>
     <w:unhideWhenUsed/>
     <w:qFormat/>
-    <w:rsid w:val="00DA1569"/>
+    <w:rsid w:val="00E0399D"/>
     <w:pPr>
       <w:keepNext/>
       <w:keepLines/>
@@ -26274,7 +26289,7 @@
     <w:semiHidden/>
     <w:unhideWhenUsed/>
     <w:qFormat/>
-    <w:rsid w:val="00DA1569"/>
+    <w:rsid w:val="00E0399D"/>
     <w:pPr>
       <w:keepNext/>
       <w:keepLines/>
@@ -26295,7 +26310,7 @@
     <w:semiHidden/>
     <w:unhideWhenUsed/>
     <w:qFormat/>
-    <w:rsid w:val="00DA1569"/>
+    <w:rsid w:val="00E0399D"/>
     <w:pPr>
       <w:keepNext/>
       <w:keepLines/>
@@ -26318,7 +26333,7 @@
     <w:semiHidden/>
     <w:unhideWhenUsed/>
     <w:qFormat/>
-    <w:rsid w:val="00DA1569"/>
+    <w:rsid w:val="00E0399D"/>
     <w:pPr>
       <w:keepNext/>
       <w:keepLines/>
@@ -26339,7 +26354,7 @@
     <w:semiHidden/>
     <w:unhideWhenUsed/>
     <w:qFormat/>
-    <w:rsid w:val="00DA1569"/>
+    <w:rsid w:val="00E0399D"/>
     <w:pPr>
       <w:keepNext/>
       <w:keepLines/>
@@ -26362,7 +26377,7 @@
     <w:semiHidden/>
     <w:unhideWhenUsed/>
     <w:qFormat/>
-    <w:rsid w:val="00DA1569"/>
+    <w:rsid w:val="00E0399D"/>
     <w:pPr>
       <w:keepNext/>
       <w:keepLines/>
@@ -26406,7 +26421,7 @@
     <w:basedOn w:val="DefaultParagraphFont"/>
     <w:link w:val="Heading1"/>
     <w:uiPriority w:val="9"/>
-    <w:rsid w:val="00DA1569"/>
+    <w:rsid w:val="00E0399D"/>
     <w:rPr>
       <w:rFonts w:asciiTheme="majorHAnsi" w:eastAsiaTheme="majorEastAsia" w:hAnsiTheme="majorHAnsi" w:cstheme="majorBidi"/>
       <w:color w:val="2F5496" w:themeColor="accent1" w:themeShade="BF"/>
@@ -26420,7 +26435,7 @@
     <w:link w:val="Heading2"/>
     <w:uiPriority w:val="9"/>
     <w:semiHidden/>
-    <w:rsid w:val="00DA1569"/>
+    <w:rsid w:val="00E0399D"/>
     <w:rPr>
       <w:rFonts w:asciiTheme="majorHAnsi" w:eastAsiaTheme="majorEastAsia" w:hAnsiTheme="majorHAnsi" w:cstheme="majorBidi"/>
       <w:color w:val="2F5496" w:themeColor="accent1" w:themeShade="BF"/>
@@ -26434,7 +26449,7 @@
     <w:link w:val="Heading3"/>
     <w:uiPriority w:val="9"/>
     <w:semiHidden/>
-    <w:rsid w:val="00DA1569"/>
+    <w:rsid w:val="00E0399D"/>
     <w:rPr>
       <w:rFonts w:eastAsiaTheme="majorEastAsia" w:cstheme="majorBidi"/>
       <w:color w:val="2F5496" w:themeColor="accent1" w:themeShade="BF"/>
@@ -26448,7 +26463,7 @@
     <w:link w:val="Heading4"/>
     <w:uiPriority w:val="9"/>
     <w:semiHidden/>
-    <w:rsid w:val="00DA1569"/>
+    <w:rsid w:val="00E0399D"/>
     <w:rPr>
       <w:rFonts w:eastAsiaTheme="majorEastAsia" w:cstheme="majorBidi"/>
       <w:i/>
@@ -26462,7 +26477,7 @@
     <w:link w:val="Heading5"/>
     <w:uiPriority w:val="9"/>
     <w:semiHidden/>
-    <w:rsid w:val="00DA1569"/>
+    <w:rsid w:val="00E0399D"/>
     <w:rPr>
       <w:rFonts w:eastAsiaTheme="majorEastAsia" w:cstheme="majorBidi"/>
       <w:color w:val="2F5496" w:themeColor="accent1" w:themeShade="BF"/>
@@ -26474,7 +26489,7 @@
     <w:link w:val="Heading6"/>
     <w:uiPriority w:val="9"/>
     <w:semiHidden/>
-    <w:rsid w:val="00DA1569"/>
+    <w:rsid w:val="00E0399D"/>
     <w:rPr>
       <w:rFonts w:eastAsiaTheme="majorEastAsia" w:cstheme="majorBidi"/>
       <w:i/>
@@ -26488,7 +26503,7 @@
     <w:link w:val="Heading7"/>
     <w:uiPriority w:val="9"/>
     <w:semiHidden/>
-    <w:rsid w:val="00DA1569"/>
+    <w:rsid w:val="00E0399D"/>
     <w:rPr>
       <w:rFonts w:eastAsiaTheme="majorEastAsia" w:cstheme="majorBidi"/>
       <w:color w:val="595959" w:themeColor="text1" w:themeTint="A6"/>
@@ -26500,7 +26515,7 @@
     <w:link w:val="Heading8"/>
     <w:uiPriority w:val="9"/>
     <w:semiHidden/>
-    <w:rsid w:val="00DA1569"/>
+    <w:rsid w:val="00E0399D"/>
     <w:rPr>
       <w:rFonts w:eastAsiaTheme="majorEastAsia" w:cstheme="majorBidi"/>
       <w:i/>
@@ -26514,7 +26529,7 @@
     <w:link w:val="Heading9"/>
     <w:uiPriority w:val="9"/>
     <w:semiHidden/>
-    <w:rsid w:val="00DA1569"/>
+    <w:rsid w:val="00E0399D"/>
     <w:rPr>
       <w:rFonts w:eastAsiaTheme="majorEastAsia" w:cstheme="majorBidi"/>
       <w:color w:val="272727" w:themeColor="text1" w:themeTint="D8"/>
@@ -26527,7 +26542,7 @@
     <w:link w:val="TitleChar"/>
     <w:uiPriority w:val="10"/>
     <w:qFormat/>
-    <w:rsid w:val="00DA1569"/>
+    <w:rsid w:val="00E0399D"/>
     <w:pPr>
       <w:spacing w:after="80" w:line="240" w:lineRule="auto"/>
       <w:contextualSpacing/>
@@ -26545,7 +26560,7 @@
     <w:basedOn w:val="DefaultParagraphFont"/>
     <w:link w:val="Title"/>
     <w:uiPriority w:val="10"/>
-    <w:rsid w:val="00DA1569"/>
+    <w:rsid w:val="00E0399D"/>
     <w:rPr>
       <w:rFonts w:asciiTheme="majorHAnsi" w:eastAsiaTheme="majorEastAsia" w:hAnsiTheme="majorHAnsi" w:cstheme="majorBidi"/>
       <w:spacing w:val="-10"/>
@@ -26561,7 +26576,7 @@
     <w:link w:val="SubtitleChar"/>
     <w:uiPriority w:val="11"/>
     <w:qFormat/>
-    <w:rsid w:val="00DA1569"/>
+    <w:rsid w:val="00E0399D"/>
     <w:pPr>
       <w:numPr>
         <w:ilvl w:val="1"/>
@@ -26580,7 +26595,7 @@
     <w:basedOn w:val="DefaultParagraphFont"/>
     <w:link w:val="Subtitle"/>
     <w:uiPriority w:val="11"/>
-    <w:rsid w:val="00DA1569"/>
+    <w:rsid w:val="00E0399D"/>
     <w:rPr>
       <w:rFonts w:eastAsiaTheme="majorEastAsia" w:cstheme="majorBidi"/>
       <w:color w:val="595959" w:themeColor="text1" w:themeTint="A6"/>
@@ -26596,7 +26611,7 @@
     <w:link w:val="QuoteChar"/>
     <w:uiPriority w:val="29"/>
     <w:qFormat/>
-    <w:rsid w:val="00DA1569"/>
+    <w:rsid w:val="00E0399D"/>
     <w:pPr>
       <w:spacing w:before="160"/>
       <w:jc w:val="center"/>
@@ -26612,7 +26627,7 @@
     <w:basedOn w:val="DefaultParagraphFont"/>
     <w:link w:val="Quote"/>
     <w:uiPriority w:val="29"/>
-    <w:rsid w:val="00DA1569"/>
+    <w:rsid w:val="00E0399D"/>
     <w:rPr>
       <w:i/>
       <w:iCs/>
@@ -26624,7 +26639,7 @@
     <w:basedOn w:val="Normal"/>
     <w:uiPriority w:val="34"/>
     <w:qFormat/>
-    <w:rsid w:val="00DA1569"/>
+    <w:rsid w:val="00E0399D"/>
     <w:pPr>
       <w:ind w:left="720"/>
       <w:contextualSpacing/>
@@ -26635,7 +26650,7 @@
     <w:basedOn w:val="DefaultParagraphFont"/>
     <w:uiPriority w:val="21"/>
     <w:qFormat/>
-    <w:rsid w:val="00DA1569"/>
+    <w:rsid w:val="00E0399D"/>
     <w:rPr>
       <w:i/>
       <w:iCs/>
@@ -26649,7 +26664,7 @@
     <w:link w:val="IntenseQuoteChar"/>
     <w:uiPriority w:val="30"/>
     <w:qFormat/>
-    <w:rsid w:val="00DA1569"/>
+    <w:rsid w:val="00E0399D"/>
     <w:pPr>
       <w:pBdr>
         <w:top w:val="single" w:sz="4" w:space="10" w:color="2F5496" w:themeColor="accent1" w:themeShade="BF"/>
@@ -26670,7 +26685,7 @@
     <w:basedOn w:val="DefaultParagraphFont"/>
     <w:link w:val="IntenseQuote"/>
     <w:uiPriority w:val="30"/>
-    <w:rsid w:val="00DA1569"/>
+    <w:rsid w:val="00E0399D"/>
     <w:rPr>
       <w:i/>
       <w:iCs/>
@@ -26682,7 +26697,7 @@
     <w:basedOn w:val="DefaultParagraphFont"/>
     <w:uiPriority w:val="32"/>
     <w:qFormat/>
-    <w:rsid w:val="00DA1569"/>
+    <w:rsid w:val="00E0399D"/>
     <w:rPr>
       <w:b/>
       <w:bCs/>

</xml_diff>

<commit_message>
feat(teori): perbarui rujukan buku Kotler & Keller dari edisi 2016 ke edisi terbaru Kotler, Keller, & Chernev (2022) 16th ed
</commit_message>
<xml_diff>
--- a/TOPIK_2_TAKSI_GREEN_SM/01_Naskah_Utama/Proposal_Skripsi_Taksi_Green_SM.docx
+++ b/TOPIK_2_TAKSI_GREEN_SM/01_Naskah_Utama/Proposal_Skripsi_Taksi_Green_SM.docx
@@ -12,16 +12,16 @@
           <w:noProof/>
         </w:rPr>
         <w:drawing>
-          <wp:inline distT="0" distB="0" distL="0" distR="0" wp14:anchorId="005EF5C7" wp14:editId="31C04E98">
+          <wp:inline distT="0" distB="0" distL="0" distR="0" wp14:anchorId="1BF59467" wp14:editId="3F41ED87">
             <wp:extent cx="1152002" cy="1152002"/>
             <wp:effectExtent l="0" t="0" r="0" b="0"/>
-            <wp:docPr id="1642505168" name="Picture 1"/>
+            <wp:docPr id="1202654346" name="Picture 1"/>
             <wp:cNvGraphicFramePr/>
             <a:graphic xmlns:a="http://schemas.openxmlformats.org/drawingml/2006/main">
               <a:graphicData uri="http://schemas.openxmlformats.org/drawingml/2006/picture">
                 <pic:pic xmlns:pic="http://schemas.openxmlformats.org/drawingml/2006/picture">
                   <pic:nvPicPr>
-                    <pic:cNvPr id="1642505168" name=""/>
+                    <pic:cNvPr id="1202654346" name=""/>
                     <pic:cNvPicPr/>
                   </pic:nvPicPr>
                   <pic:blipFill>
@@ -2469,7 +2469,22 @@
           <w:rFonts w:ascii="Times New Roman" w:hAnsi="Times New Roman" w:cs="Times New Roman"/>
           <w:sz w:val="24"/>
         </w:rPr>
-        <w:t xml:space="preserve">) tidak terbentuk secara spontan, melainkan dipengaruhi oleh serangkaian persepsi, keyakinan kognitif, dan evaluasi risiko rasional yang mendalam (Kotler &amp; Keller, 2016). Berdasarkan kerangka teoritis dan fenomena empiris di lapangan, terdapat tiga faktor determinan fundamental yang memengaruhi keputusan konsumen dalam menggunakan jasa taksi </w:t>
+        <w:t xml:space="preserve">) tidak terbentuk secara spontan, melainkan dipengaruhi oleh serangkaian persepsi, keyakinan kognitif, dan evaluasi risiko rasional yang mendalam (Kotler </w:t>
+      </w:r>
+      <w:r>
+        <w:rPr>
+          <w:rFonts w:ascii="Times New Roman" w:hAnsi="Times New Roman" w:cs="Times New Roman"/>
+          <w:i/>
+          <w:sz w:val="24"/>
+        </w:rPr>
+        <w:t>et al.</w:t>
+      </w:r>
+      <w:r>
+        <w:rPr>
+          <w:rFonts w:ascii="Times New Roman" w:hAnsi="Times New Roman" w:cs="Times New Roman"/>
+          <w:sz w:val="24"/>
+        </w:rPr>
+        <w:t xml:space="preserve">, 2022). Berdasarkan kerangka teoritis dan fenomena empiris di lapangan, terdapat tiga faktor determinan fundamental yang memengaruhi keputusan konsumen dalam menggunakan jasa taksi </w:t>
       </w:r>
       <w:r>
         <w:rPr>
@@ -4113,7 +4128,22 @@
           <w:rFonts w:ascii="Times New Roman" w:hAnsi="Times New Roman" w:cs="Times New Roman"/>
           <w:sz w:val="24"/>
         </w:rPr>
-        <w:t>). Menurut Kotler dan Keller (2016), perilaku konsumen adalah studi tentang bagaimana individu, kelompok, dan organisasi memilih, membeli, menggunakan, dan memanfaatkan barang, jasa, ide, atau pengalaman untuk memuaskan kebutuhan dan keinginan mereka.</w:t>
+        <w:t xml:space="preserve">). Menurut Kotler </w:t>
+      </w:r>
+      <w:r>
+        <w:rPr>
+          <w:rFonts w:ascii="Times New Roman" w:hAnsi="Times New Roman" w:cs="Times New Roman"/>
+          <w:i/>
+          <w:sz w:val="24"/>
+        </w:rPr>
+        <w:t>et al.</w:t>
+      </w:r>
+      <w:r>
+        <w:rPr>
+          <w:rFonts w:ascii="Times New Roman" w:hAnsi="Times New Roman" w:cs="Times New Roman"/>
+          <w:sz w:val="24"/>
+        </w:rPr>
+        <w:t xml:space="preserve"> (2022), perilaku konsumen adalah studi tentang bagaimana individu, kelompok, dan organisasi memilih, membeli, menggunakan, dan memanfaatkan barang, jasa, ide, atau pengalaman untuk memuaskan kebutuhan dan keinginan mereka.</w:t>
       </w:r>
     </w:p>
     <w:p>
@@ -4132,7 +4162,22 @@
           <w:rFonts w:ascii="Times New Roman" w:hAnsi="Times New Roman" w:cs="Times New Roman"/>
           <w:sz w:val="24"/>
         </w:rPr>
-        <w:t>Dalam model hirarki pengambilan keputusan konsumen klasik yang dikembangkan oleh Engel, Blackwell, dan Miniard (model EBM) serta dirumuskan kembali oleh Kotler dan Keller (2016), proses pengambilan keputusan konsumen melewati lima tahapan berurutan (</w:t>
+        <w:t xml:space="preserve">Dalam model hirarki pengambilan keputusan konsumen klasik yang dikembangkan oleh Engel, Blackwell, dan Miniard (model EBM) serta dirumuskan kembali oleh Kotler </w:t>
+      </w:r>
+      <w:r>
+        <w:rPr>
+          <w:rFonts w:ascii="Times New Roman" w:hAnsi="Times New Roman" w:cs="Times New Roman"/>
+          <w:i/>
+          <w:sz w:val="24"/>
+        </w:rPr>
+        <w:t>et al.</w:t>
+      </w:r>
+      <w:r>
+        <w:rPr>
+          <w:rFonts w:ascii="Times New Roman" w:hAnsi="Times New Roman" w:cs="Times New Roman"/>
+          <w:sz w:val="24"/>
+        </w:rPr>
+        <w:t xml:space="preserve"> (2022), proses pengambilan keputusan konsumen melewati lima tahapan berurutan (</w:t>
       </w:r>
       <w:r>
         <w:rPr>
@@ -4531,7 +4576,22 @@
           <w:rFonts w:ascii="Times New Roman" w:hAnsi="Times New Roman" w:cs="Times New Roman"/>
           <w:sz w:val="24"/>
         </w:rPr>
-        <w:t>Menurut Kotler dan Keller (2016) serta Tjiptono dan Chandra (2019), indikator baku untuk mengukur Keputusan Pembelian (</w:t>
+        <w:t xml:space="preserve">Menurut Kotler </w:t>
+      </w:r>
+      <w:r>
+        <w:rPr>
+          <w:rFonts w:ascii="Times New Roman" w:hAnsi="Times New Roman" w:cs="Times New Roman"/>
+          <w:i/>
+          <w:sz w:val="24"/>
+        </w:rPr>
+        <w:t>et al.</w:t>
+      </w:r>
+      <w:r>
+        <w:rPr>
+          <w:rFonts w:ascii="Times New Roman" w:hAnsi="Times New Roman" w:cs="Times New Roman"/>
+          <w:sz w:val="24"/>
+        </w:rPr>
+        <w:t xml:space="preserve"> (2022) serta Tjiptono dan Chandra (2019), indikator baku untuk mengukur Keputusan Pembelian (</w:t>
       </w:r>
       <w:r>
         <w:rPr>
@@ -13902,7 +13962,24 @@
                 <w:b/>
                 <w:sz w:val="19"/>
               </w:rPr>
-              <w:t xml:space="preserve"> untuk memenuhi kebutuhan transportasinya di Jakarta Barat (Kotler &amp; Keller, 2016).</w:t>
+              <w:t xml:space="preserve"> untuk memenuhi kebutuhan transportasinya di Jakarta Barat (Kotler </w:t>
+            </w:r>
+            <w:r>
+              <w:rPr>
+                <w:rFonts w:ascii="Times New Roman" w:hAnsi="Times New Roman" w:cs="Times New Roman"/>
+                <w:b/>
+                <w:i/>
+                <w:sz w:val="19"/>
+              </w:rPr>
+              <w:t>et al.</w:t>
+            </w:r>
+            <w:r>
+              <w:rPr>
+                <w:rFonts w:ascii="Times New Roman" w:hAnsi="Times New Roman" w:cs="Times New Roman"/>
+                <w:b/>
+                <w:sz w:val="19"/>
+              </w:rPr>
+              <w:t>, 2022).</w:t>
             </w:r>
           </w:p>
         </w:tc>
@@ -14056,7 +14133,24 @@
                 <w:b/>
                 <w:sz w:val="19"/>
               </w:rPr>
-              <w:t xml:space="preserve">Kotler &amp; Keller (2016); Fitriana </w:t>
+              <w:t xml:space="preserve">Kotler </w:t>
+            </w:r>
+            <w:r>
+              <w:rPr>
+                <w:rFonts w:ascii="Times New Roman" w:hAnsi="Times New Roman" w:cs="Times New Roman"/>
+                <w:b/>
+                <w:i/>
+                <w:sz w:val="19"/>
+              </w:rPr>
+              <w:t>et al.</w:t>
+            </w:r>
+            <w:r>
+              <w:rPr>
+                <w:rFonts w:ascii="Times New Roman" w:hAnsi="Times New Roman" w:cs="Times New Roman"/>
+                <w:b/>
+                <w:sz w:val="19"/>
+              </w:rPr>
+              <w:t xml:space="preserve"> (2022); Fitriana </w:t>
             </w:r>
             <w:r>
               <w:rPr>
@@ -14251,7 +14345,24 @@
                 <w:b/>
                 <w:sz w:val="19"/>
               </w:rPr>
-              <w:t>Kotler &amp; Keller (2016); Wikantara &amp; Rastini (2021).</w:t>
+              <w:t xml:space="preserve">Kotler </w:t>
+            </w:r>
+            <w:r>
+              <w:rPr>
+                <w:rFonts w:ascii="Times New Roman" w:hAnsi="Times New Roman" w:cs="Times New Roman"/>
+                <w:b/>
+                <w:i/>
+                <w:sz w:val="19"/>
+              </w:rPr>
+              <w:t>et al.</w:t>
+            </w:r>
+            <w:r>
+              <w:rPr>
+                <w:rFonts w:ascii="Times New Roman" w:hAnsi="Times New Roman" w:cs="Times New Roman"/>
+                <w:b/>
+                <w:sz w:val="19"/>
+              </w:rPr>
+              <w:t xml:space="preserve"> (2022); Wikantara &amp; Rastini (2021).</w:t>
             </w:r>
           </w:p>
         </w:tc>
@@ -14429,7 +14540,24 @@
                 <w:b/>
                 <w:sz w:val="19"/>
               </w:rPr>
-              <w:t>Kotler &amp; Keller (2016); Hera &amp; Fourqoniah (2023).</w:t>
+              <w:t xml:space="preserve">Kotler </w:t>
+            </w:r>
+            <w:r>
+              <w:rPr>
+                <w:rFonts w:ascii="Times New Roman" w:hAnsi="Times New Roman" w:cs="Times New Roman"/>
+                <w:b/>
+                <w:i/>
+                <w:sz w:val="19"/>
+              </w:rPr>
+              <w:t>et al.</w:t>
+            </w:r>
+            <w:r>
+              <w:rPr>
+                <w:rFonts w:ascii="Times New Roman" w:hAnsi="Times New Roman" w:cs="Times New Roman"/>
+                <w:b/>
+                <w:sz w:val="19"/>
+              </w:rPr>
+              <w:t xml:space="preserve"> (2022); Hera &amp; Fourqoniah (2023).</w:t>
             </w:r>
           </w:p>
         </w:tc>
@@ -14624,7 +14752,24 @@
                 <w:b/>
                 <w:sz w:val="19"/>
               </w:rPr>
-              <w:t>Kotler &amp; Keller (2016); Nurlita &amp; Arsyad (2025).</w:t>
+              <w:t xml:space="preserve">Kotler </w:t>
+            </w:r>
+            <w:r>
+              <w:rPr>
+                <w:rFonts w:ascii="Times New Roman" w:hAnsi="Times New Roman" w:cs="Times New Roman"/>
+                <w:b/>
+                <w:i/>
+                <w:sz w:val="19"/>
+              </w:rPr>
+              <w:t>et al.</w:t>
+            </w:r>
+            <w:r>
+              <w:rPr>
+                <w:rFonts w:ascii="Times New Roman" w:hAnsi="Times New Roman" w:cs="Times New Roman"/>
+                <w:b/>
+                <w:sz w:val="19"/>
+              </w:rPr>
+              <w:t xml:space="preserve"> (2022); Nurlita &amp; Arsyad (2025).</w:t>
             </w:r>
           </w:p>
         </w:tc>
@@ -17899,7 +18044,7 @@
           <w:rFonts w:ascii="Times New Roman" w:hAnsi="Times New Roman" w:cs="Times New Roman"/>
           <w:sz w:val="24"/>
         </w:rPr>
-        <w:t>Kotler, P., &amp; Keller, K. L. (2016). Marketing management (15th ed.). Pearson Education.</w:t>
+        <w:t>Kotler, P., Keller, K. L., &amp; Chernev, A. (2022). Marketing management (16th ed.). Pearson Education.</w:t>
       </w:r>
     </w:p>
     <w:p>
@@ -26197,7 +26342,7 @@
     <w:link w:val="Heading1Char"/>
     <w:uiPriority w:val="9"/>
     <w:qFormat/>
-    <w:rsid w:val="00E0399D"/>
+    <w:rsid w:val="00AD7511"/>
     <w:pPr>
       <w:keepNext/>
       <w:keepLines/>
@@ -26220,7 +26365,7 @@
     <w:semiHidden/>
     <w:unhideWhenUsed/>
     <w:qFormat/>
-    <w:rsid w:val="00E0399D"/>
+    <w:rsid w:val="00AD7511"/>
     <w:pPr>
       <w:keepNext/>
       <w:keepLines/>
@@ -26243,7 +26388,7 @@
     <w:semiHidden/>
     <w:unhideWhenUsed/>
     <w:qFormat/>
-    <w:rsid w:val="00E0399D"/>
+    <w:rsid w:val="00AD7511"/>
     <w:pPr>
       <w:keepNext/>
       <w:keepLines/>
@@ -26266,7 +26411,7 @@
     <w:semiHidden/>
     <w:unhideWhenUsed/>
     <w:qFormat/>
-    <w:rsid w:val="00E0399D"/>
+    <w:rsid w:val="00AD7511"/>
     <w:pPr>
       <w:keepNext/>
       <w:keepLines/>
@@ -26289,7 +26434,7 @@
     <w:semiHidden/>
     <w:unhideWhenUsed/>
     <w:qFormat/>
-    <w:rsid w:val="00E0399D"/>
+    <w:rsid w:val="00AD7511"/>
     <w:pPr>
       <w:keepNext/>
       <w:keepLines/>
@@ -26310,7 +26455,7 @@
     <w:semiHidden/>
     <w:unhideWhenUsed/>
     <w:qFormat/>
-    <w:rsid w:val="00E0399D"/>
+    <w:rsid w:val="00AD7511"/>
     <w:pPr>
       <w:keepNext/>
       <w:keepLines/>
@@ -26333,7 +26478,7 @@
     <w:semiHidden/>
     <w:unhideWhenUsed/>
     <w:qFormat/>
-    <w:rsid w:val="00E0399D"/>
+    <w:rsid w:val="00AD7511"/>
     <w:pPr>
       <w:keepNext/>
       <w:keepLines/>
@@ -26354,7 +26499,7 @@
     <w:semiHidden/>
     <w:unhideWhenUsed/>
     <w:qFormat/>
-    <w:rsid w:val="00E0399D"/>
+    <w:rsid w:val="00AD7511"/>
     <w:pPr>
       <w:keepNext/>
       <w:keepLines/>
@@ -26377,7 +26522,7 @@
     <w:semiHidden/>
     <w:unhideWhenUsed/>
     <w:qFormat/>
-    <w:rsid w:val="00E0399D"/>
+    <w:rsid w:val="00AD7511"/>
     <w:pPr>
       <w:keepNext/>
       <w:keepLines/>
@@ -26421,7 +26566,7 @@
     <w:basedOn w:val="DefaultParagraphFont"/>
     <w:link w:val="Heading1"/>
     <w:uiPriority w:val="9"/>
-    <w:rsid w:val="00E0399D"/>
+    <w:rsid w:val="00AD7511"/>
     <w:rPr>
       <w:rFonts w:asciiTheme="majorHAnsi" w:eastAsiaTheme="majorEastAsia" w:hAnsiTheme="majorHAnsi" w:cstheme="majorBidi"/>
       <w:color w:val="2F5496" w:themeColor="accent1" w:themeShade="BF"/>
@@ -26435,7 +26580,7 @@
     <w:link w:val="Heading2"/>
     <w:uiPriority w:val="9"/>
     <w:semiHidden/>
-    <w:rsid w:val="00E0399D"/>
+    <w:rsid w:val="00AD7511"/>
     <w:rPr>
       <w:rFonts w:asciiTheme="majorHAnsi" w:eastAsiaTheme="majorEastAsia" w:hAnsiTheme="majorHAnsi" w:cstheme="majorBidi"/>
       <w:color w:val="2F5496" w:themeColor="accent1" w:themeShade="BF"/>
@@ -26449,7 +26594,7 @@
     <w:link w:val="Heading3"/>
     <w:uiPriority w:val="9"/>
     <w:semiHidden/>
-    <w:rsid w:val="00E0399D"/>
+    <w:rsid w:val="00AD7511"/>
     <w:rPr>
       <w:rFonts w:eastAsiaTheme="majorEastAsia" w:cstheme="majorBidi"/>
       <w:color w:val="2F5496" w:themeColor="accent1" w:themeShade="BF"/>
@@ -26463,7 +26608,7 @@
     <w:link w:val="Heading4"/>
     <w:uiPriority w:val="9"/>
     <w:semiHidden/>
-    <w:rsid w:val="00E0399D"/>
+    <w:rsid w:val="00AD7511"/>
     <w:rPr>
       <w:rFonts w:eastAsiaTheme="majorEastAsia" w:cstheme="majorBidi"/>
       <w:i/>
@@ -26477,7 +26622,7 @@
     <w:link w:val="Heading5"/>
     <w:uiPriority w:val="9"/>
     <w:semiHidden/>
-    <w:rsid w:val="00E0399D"/>
+    <w:rsid w:val="00AD7511"/>
     <w:rPr>
       <w:rFonts w:eastAsiaTheme="majorEastAsia" w:cstheme="majorBidi"/>
       <w:color w:val="2F5496" w:themeColor="accent1" w:themeShade="BF"/>
@@ -26489,7 +26634,7 @@
     <w:link w:val="Heading6"/>
     <w:uiPriority w:val="9"/>
     <w:semiHidden/>
-    <w:rsid w:val="00E0399D"/>
+    <w:rsid w:val="00AD7511"/>
     <w:rPr>
       <w:rFonts w:eastAsiaTheme="majorEastAsia" w:cstheme="majorBidi"/>
       <w:i/>
@@ -26503,7 +26648,7 @@
     <w:link w:val="Heading7"/>
     <w:uiPriority w:val="9"/>
     <w:semiHidden/>
-    <w:rsid w:val="00E0399D"/>
+    <w:rsid w:val="00AD7511"/>
     <w:rPr>
       <w:rFonts w:eastAsiaTheme="majorEastAsia" w:cstheme="majorBidi"/>
       <w:color w:val="595959" w:themeColor="text1" w:themeTint="A6"/>
@@ -26515,7 +26660,7 @@
     <w:link w:val="Heading8"/>
     <w:uiPriority w:val="9"/>
     <w:semiHidden/>
-    <w:rsid w:val="00E0399D"/>
+    <w:rsid w:val="00AD7511"/>
     <w:rPr>
       <w:rFonts w:eastAsiaTheme="majorEastAsia" w:cstheme="majorBidi"/>
       <w:i/>
@@ -26529,7 +26674,7 @@
     <w:link w:val="Heading9"/>
     <w:uiPriority w:val="9"/>
     <w:semiHidden/>
-    <w:rsid w:val="00E0399D"/>
+    <w:rsid w:val="00AD7511"/>
     <w:rPr>
       <w:rFonts w:eastAsiaTheme="majorEastAsia" w:cstheme="majorBidi"/>
       <w:color w:val="272727" w:themeColor="text1" w:themeTint="D8"/>
@@ -26542,7 +26687,7 @@
     <w:link w:val="TitleChar"/>
     <w:uiPriority w:val="10"/>
     <w:qFormat/>
-    <w:rsid w:val="00E0399D"/>
+    <w:rsid w:val="00AD7511"/>
     <w:pPr>
       <w:spacing w:after="80" w:line="240" w:lineRule="auto"/>
       <w:contextualSpacing/>
@@ -26560,7 +26705,7 @@
     <w:basedOn w:val="DefaultParagraphFont"/>
     <w:link w:val="Title"/>
     <w:uiPriority w:val="10"/>
-    <w:rsid w:val="00E0399D"/>
+    <w:rsid w:val="00AD7511"/>
     <w:rPr>
       <w:rFonts w:asciiTheme="majorHAnsi" w:eastAsiaTheme="majorEastAsia" w:hAnsiTheme="majorHAnsi" w:cstheme="majorBidi"/>
       <w:spacing w:val="-10"/>
@@ -26576,7 +26721,7 @@
     <w:link w:val="SubtitleChar"/>
     <w:uiPriority w:val="11"/>
     <w:qFormat/>
-    <w:rsid w:val="00E0399D"/>
+    <w:rsid w:val="00AD7511"/>
     <w:pPr>
       <w:numPr>
         <w:ilvl w:val="1"/>
@@ -26595,7 +26740,7 @@
     <w:basedOn w:val="DefaultParagraphFont"/>
     <w:link w:val="Subtitle"/>
     <w:uiPriority w:val="11"/>
-    <w:rsid w:val="00E0399D"/>
+    <w:rsid w:val="00AD7511"/>
     <w:rPr>
       <w:rFonts w:eastAsiaTheme="majorEastAsia" w:cstheme="majorBidi"/>
       <w:color w:val="595959" w:themeColor="text1" w:themeTint="A6"/>
@@ -26611,7 +26756,7 @@
     <w:link w:val="QuoteChar"/>
     <w:uiPriority w:val="29"/>
     <w:qFormat/>
-    <w:rsid w:val="00E0399D"/>
+    <w:rsid w:val="00AD7511"/>
     <w:pPr>
       <w:spacing w:before="160"/>
       <w:jc w:val="center"/>
@@ -26627,7 +26772,7 @@
     <w:basedOn w:val="DefaultParagraphFont"/>
     <w:link w:val="Quote"/>
     <w:uiPriority w:val="29"/>
-    <w:rsid w:val="00E0399D"/>
+    <w:rsid w:val="00AD7511"/>
     <w:rPr>
       <w:i/>
       <w:iCs/>
@@ -26639,7 +26784,7 @@
     <w:basedOn w:val="Normal"/>
     <w:uiPriority w:val="34"/>
     <w:qFormat/>
-    <w:rsid w:val="00E0399D"/>
+    <w:rsid w:val="00AD7511"/>
     <w:pPr>
       <w:ind w:left="720"/>
       <w:contextualSpacing/>
@@ -26650,7 +26795,7 @@
     <w:basedOn w:val="DefaultParagraphFont"/>
     <w:uiPriority w:val="21"/>
     <w:qFormat/>
-    <w:rsid w:val="00E0399D"/>
+    <w:rsid w:val="00AD7511"/>
     <w:rPr>
       <w:i/>
       <w:iCs/>
@@ -26664,7 +26809,7 @@
     <w:link w:val="IntenseQuoteChar"/>
     <w:uiPriority w:val="30"/>
     <w:qFormat/>
-    <w:rsid w:val="00E0399D"/>
+    <w:rsid w:val="00AD7511"/>
     <w:pPr>
       <w:pBdr>
         <w:top w:val="single" w:sz="4" w:space="10" w:color="2F5496" w:themeColor="accent1" w:themeShade="BF"/>
@@ -26685,7 +26830,7 @@
     <w:basedOn w:val="DefaultParagraphFont"/>
     <w:link w:val="IntenseQuote"/>
     <w:uiPriority w:val="30"/>
-    <w:rsid w:val="00E0399D"/>
+    <w:rsid w:val="00AD7511"/>
     <w:rPr>
       <w:i/>
       <w:iCs/>
@@ -26697,7 +26842,7 @@
     <w:basedOn w:val="DefaultParagraphFont"/>
     <w:uiPriority w:val="32"/>
     <w:qFormat/>
-    <w:rsid w:val="00E0399D"/>
+    <w:rsid w:val="00AD7511"/>
     <w:rPr>
       <w:b/>
       <w:bCs/>

</xml_diff>

<commit_message>
feat(teori): perbarui rujukan buku Keller (2013) ke edisi terbaru Keller & Swaminathan (2020) 5th ed
</commit_message>
<xml_diff>
--- a/TOPIK_2_TAKSI_GREEN_SM/01_Naskah_Utama/Proposal_Skripsi_Taksi_Green_SM.docx
+++ b/TOPIK_2_TAKSI_GREEN_SM/01_Naskah_Utama/Proposal_Skripsi_Taksi_Green_SM.docx
@@ -12,16 +12,16 @@
           <w:noProof/>
         </w:rPr>
         <w:drawing>
-          <wp:inline distT="0" distB="0" distL="0" distR="0" wp14:anchorId="1BF59467" wp14:editId="3F41ED87">
+          <wp:inline distT="0" distB="0" distL="0" distR="0" wp14:anchorId="42089079" wp14:editId="4931C8EE">
             <wp:extent cx="1152002" cy="1152002"/>
             <wp:effectExtent l="0" t="0" r="0" b="0"/>
-            <wp:docPr id="1202654346" name="Picture 1"/>
+            <wp:docPr id="113419663" name="Picture 1"/>
             <wp:cNvGraphicFramePr/>
             <a:graphic xmlns:a="http://schemas.openxmlformats.org/drawingml/2006/main">
               <a:graphicData uri="http://schemas.openxmlformats.org/drawingml/2006/picture">
                 <pic:pic xmlns:pic="http://schemas.openxmlformats.org/drawingml/2006/picture">
                   <pic:nvPicPr>
-                    <pic:cNvPr id="1202654346" name=""/>
+                    <pic:cNvPr id="113419663" name=""/>
                     <pic:cNvPicPr/>
                   </pic:nvPicPr>
                   <pic:blipFill>
@@ -2578,7 +2578,7 @@
           <w:rFonts w:ascii="Times New Roman" w:hAnsi="Times New Roman" w:cs="Times New Roman"/>
           <w:sz w:val="24"/>
         </w:rPr>
-        <w:t xml:space="preserve">). Menurut Keller (2013), citra merek adalah persepsi konsumen terhadap suatu merek yang tercermin dalam ingatan asosiatif mereka (brand associations). Dalam konteks </w:t>
+        <w:t xml:space="preserve">). Menurut Keller dan Swaminathan (2020), citra merek adalah persepsi konsumen terhadap suatu merek yang tercermin dalam ingatan asosiatif mereka (brand associations). Dalam konteks </w:t>
       </w:r>
       <w:r>
         <w:rPr>
@@ -5209,7 +5209,7 @@
           <w:rFonts w:ascii="Times New Roman" w:hAnsi="Times New Roman" w:cs="Times New Roman"/>
           <w:sz w:val="24"/>
         </w:rPr>
-        <w:t xml:space="preserve">Menurut Keller (1993, 2013) dalam model </w:t>
+        <w:t xml:space="preserve">Menurut Keller (1993) serta Keller dan Swaminathan (2020) dalam model </w:t>
       </w:r>
       <w:r>
         <w:rPr>
@@ -5277,7 +5277,7 @@
           <w:rFonts w:ascii="Times New Roman" w:hAnsi="Times New Roman" w:cs="Times New Roman"/>
           <w:sz w:val="24"/>
         </w:rPr>
-        <w:t xml:space="preserve">Berdasarkan sintesis Keller (2013) dan Aaker (1996), dimensi dan indikator baku </w:t>
+        <w:t xml:space="preserve">Berdasarkan sintesis Keller dan Swaminathan (2020) serta Aaker (1996), dimensi dan indikator baku </w:t>
       </w:r>
       <w:r>
         <w:rPr>
@@ -9219,7 +9219,7 @@
           <w:rFonts w:ascii="Times New Roman" w:hAnsi="Times New Roman" w:cs="Times New Roman"/>
           <w:sz w:val="24"/>
         </w:rPr>
-        <w:t>) merupakan representasi kognitif dan emosional dari keseluruhan pengalaman dan asosiasi konsumen terhadap suatu merek (Keller, 2013). Ketika suatu merek memiliki citra yang positif, prestisius, dan relevan dengan nilai-nilai konsumen (seperti kepedulian terhadap kelestarian lingkungan dan modernitas armada listrik), risiko yang dirasakan konsumen dalam melakukan transaksi akan menurun, sementara keyakinan terhadap nilai produk/jasa akan meningkat.</w:t>
+        <w:t>) merupakan representasi kognitif dan emosional dari keseluruhan pengalaman dan asosiasi konsumen terhadap suatu merek (Keller &amp; Swaminathan, 2020). Ketika suatu merek memiliki citra yang positif, prestisius, dan relevan dengan nilai-nilai konsumen (seperti kepedulian terhadap kelestarian lingkungan dan modernitas armada listrik), risiko yang dirasakan konsumen dalam melakukan transaksi akan menurun, sementara keyakinan terhadap nilai produk/jasa akan meningkat.</w:t>
       </w:r>
     </w:p>
     <w:p>
@@ -11479,7 +11479,7 @@
                 <w:b/>
                 <w:sz w:val="19"/>
               </w:rPr>
-              <w:t xml:space="preserve"> yang tercermin dalam ingatan asosiasi merek di benak konsumen (Keller, 2013; Aaker, 1996).</w:t>
+              <w:t xml:space="preserve"> yang tercermin dalam ingatan asosiasi merek di benak konsumen (Keller &amp; Swaminathan, 2020; Aaker, 1996).</w:t>
             </w:r>
           </w:p>
         </w:tc>
@@ -11650,7 +11650,7 @@
                 <w:b/>
                 <w:sz w:val="19"/>
               </w:rPr>
-              <w:t>Keller (2013); Manurung &amp; Tjokrosaputro (2025); Wikantara &amp; Rastini (2021).</w:t>
+              <w:t>Keller &amp; Swaminathan (2020); Manurung &amp; Tjokrosaputro (2025); Wikantara &amp; Rastini (2021).</w:t>
             </w:r>
           </w:p>
         </w:tc>
@@ -11845,7 +11845,7 @@
                 <w:b/>
                 <w:sz w:val="19"/>
               </w:rPr>
-              <w:t xml:space="preserve">Keller (2013); Fitriana </w:t>
+              <w:t xml:space="preserve">Keller &amp; Swaminathan (2020); Fitriana </w:t>
             </w:r>
             <w:r>
               <w:rPr>
@@ -12210,7 +12210,7 @@
                 <w:b/>
                 <w:sz w:val="19"/>
               </w:rPr>
-              <w:t xml:space="preserve">Keller (2013); Fitriana </w:t>
+              <w:t xml:space="preserve">Keller &amp; Swaminathan (2020); Fitriana </w:t>
             </w:r>
             <w:r>
               <w:rPr>
@@ -17995,7 +17995,7 @@
           <w:rFonts w:ascii="Times New Roman" w:hAnsi="Times New Roman" w:cs="Times New Roman"/>
           <w:sz w:val="24"/>
         </w:rPr>
-        <w:t xml:space="preserve">Keller, K. L. (2013). Strategic </w:t>
+        <w:t xml:space="preserve">Keller, K. L., &amp; Swaminathan, V. (2020). Strategic </w:t>
       </w:r>
       <w:r>
         <w:rPr>
@@ -18025,7 +18025,7 @@
           <w:rFonts w:ascii="Times New Roman" w:hAnsi="Times New Roman" w:cs="Times New Roman"/>
           <w:sz w:val="24"/>
         </w:rPr>
-        <w:t xml:space="preserve"> (4th ed.). Pearson Education.</w:t>
+        <w:t xml:space="preserve"> (5th ed.). Pearson Education.</w:t>
       </w:r>
     </w:p>
     <w:p>
@@ -26342,7 +26342,7 @@
     <w:link w:val="Heading1Char"/>
     <w:uiPriority w:val="9"/>
     <w:qFormat/>
-    <w:rsid w:val="00AD7511"/>
+    <w:rsid w:val="00647868"/>
     <w:pPr>
       <w:keepNext/>
       <w:keepLines/>
@@ -26365,7 +26365,7 @@
     <w:semiHidden/>
     <w:unhideWhenUsed/>
     <w:qFormat/>
-    <w:rsid w:val="00AD7511"/>
+    <w:rsid w:val="00647868"/>
     <w:pPr>
       <w:keepNext/>
       <w:keepLines/>
@@ -26388,7 +26388,7 @@
     <w:semiHidden/>
     <w:unhideWhenUsed/>
     <w:qFormat/>
-    <w:rsid w:val="00AD7511"/>
+    <w:rsid w:val="00647868"/>
     <w:pPr>
       <w:keepNext/>
       <w:keepLines/>
@@ -26411,7 +26411,7 @@
     <w:semiHidden/>
     <w:unhideWhenUsed/>
     <w:qFormat/>
-    <w:rsid w:val="00AD7511"/>
+    <w:rsid w:val="00647868"/>
     <w:pPr>
       <w:keepNext/>
       <w:keepLines/>
@@ -26434,7 +26434,7 @@
     <w:semiHidden/>
     <w:unhideWhenUsed/>
     <w:qFormat/>
-    <w:rsid w:val="00AD7511"/>
+    <w:rsid w:val="00647868"/>
     <w:pPr>
       <w:keepNext/>
       <w:keepLines/>
@@ -26455,7 +26455,7 @@
     <w:semiHidden/>
     <w:unhideWhenUsed/>
     <w:qFormat/>
-    <w:rsid w:val="00AD7511"/>
+    <w:rsid w:val="00647868"/>
     <w:pPr>
       <w:keepNext/>
       <w:keepLines/>
@@ -26478,7 +26478,7 @@
     <w:semiHidden/>
     <w:unhideWhenUsed/>
     <w:qFormat/>
-    <w:rsid w:val="00AD7511"/>
+    <w:rsid w:val="00647868"/>
     <w:pPr>
       <w:keepNext/>
       <w:keepLines/>
@@ -26499,7 +26499,7 @@
     <w:semiHidden/>
     <w:unhideWhenUsed/>
     <w:qFormat/>
-    <w:rsid w:val="00AD7511"/>
+    <w:rsid w:val="00647868"/>
     <w:pPr>
       <w:keepNext/>
       <w:keepLines/>
@@ -26522,7 +26522,7 @@
     <w:semiHidden/>
     <w:unhideWhenUsed/>
     <w:qFormat/>
-    <w:rsid w:val="00AD7511"/>
+    <w:rsid w:val="00647868"/>
     <w:pPr>
       <w:keepNext/>
       <w:keepLines/>
@@ -26566,7 +26566,7 @@
     <w:basedOn w:val="DefaultParagraphFont"/>
     <w:link w:val="Heading1"/>
     <w:uiPriority w:val="9"/>
-    <w:rsid w:val="00AD7511"/>
+    <w:rsid w:val="00647868"/>
     <w:rPr>
       <w:rFonts w:asciiTheme="majorHAnsi" w:eastAsiaTheme="majorEastAsia" w:hAnsiTheme="majorHAnsi" w:cstheme="majorBidi"/>
       <w:color w:val="2F5496" w:themeColor="accent1" w:themeShade="BF"/>
@@ -26580,7 +26580,7 @@
     <w:link w:val="Heading2"/>
     <w:uiPriority w:val="9"/>
     <w:semiHidden/>
-    <w:rsid w:val="00AD7511"/>
+    <w:rsid w:val="00647868"/>
     <w:rPr>
       <w:rFonts w:asciiTheme="majorHAnsi" w:eastAsiaTheme="majorEastAsia" w:hAnsiTheme="majorHAnsi" w:cstheme="majorBidi"/>
       <w:color w:val="2F5496" w:themeColor="accent1" w:themeShade="BF"/>
@@ -26594,7 +26594,7 @@
     <w:link w:val="Heading3"/>
     <w:uiPriority w:val="9"/>
     <w:semiHidden/>
-    <w:rsid w:val="00AD7511"/>
+    <w:rsid w:val="00647868"/>
     <w:rPr>
       <w:rFonts w:eastAsiaTheme="majorEastAsia" w:cstheme="majorBidi"/>
       <w:color w:val="2F5496" w:themeColor="accent1" w:themeShade="BF"/>
@@ -26608,7 +26608,7 @@
     <w:link w:val="Heading4"/>
     <w:uiPriority w:val="9"/>
     <w:semiHidden/>
-    <w:rsid w:val="00AD7511"/>
+    <w:rsid w:val="00647868"/>
     <w:rPr>
       <w:rFonts w:eastAsiaTheme="majorEastAsia" w:cstheme="majorBidi"/>
       <w:i/>
@@ -26622,7 +26622,7 @@
     <w:link w:val="Heading5"/>
     <w:uiPriority w:val="9"/>
     <w:semiHidden/>
-    <w:rsid w:val="00AD7511"/>
+    <w:rsid w:val="00647868"/>
     <w:rPr>
       <w:rFonts w:eastAsiaTheme="majorEastAsia" w:cstheme="majorBidi"/>
       <w:color w:val="2F5496" w:themeColor="accent1" w:themeShade="BF"/>
@@ -26634,7 +26634,7 @@
     <w:link w:val="Heading6"/>
     <w:uiPriority w:val="9"/>
     <w:semiHidden/>
-    <w:rsid w:val="00AD7511"/>
+    <w:rsid w:val="00647868"/>
     <w:rPr>
       <w:rFonts w:eastAsiaTheme="majorEastAsia" w:cstheme="majorBidi"/>
       <w:i/>
@@ -26648,7 +26648,7 @@
     <w:link w:val="Heading7"/>
     <w:uiPriority w:val="9"/>
     <w:semiHidden/>
-    <w:rsid w:val="00AD7511"/>
+    <w:rsid w:val="00647868"/>
     <w:rPr>
       <w:rFonts w:eastAsiaTheme="majorEastAsia" w:cstheme="majorBidi"/>
       <w:color w:val="595959" w:themeColor="text1" w:themeTint="A6"/>
@@ -26660,7 +26660,7 @@
     <w:link w:val="Heading8"/>
     <w:uiPriority w:val="9"/>
     <w:semiHidden/>
-    <w:rsid w:val="00AD7511"/>
+    <w:rsid w:val="00647868"/>
     <w:rPr>
       <w:rFonts w:eastAsiaTheme="majorEastAsia" w:cstheme="majorBidi"/>
       <w:i/>
@@ -26674,7 +26674,7 @@
     <w:link w:val="Heading9"/>
     <w:uiPriority w:val="9"/>
     <w:semiHidden/>
-    <w:rsid w:val="00AD7511"/>
+    <w:rsid w:val="00647868"/>
     <w:rPr>
       <w:rFonts w:eastAsiaTheme="majorEastAsia" w:cstheme="majorBidi"/>
       <w:color w:val="272727" w:themeColor="text1" w:themeTint="D8"/>
@@ -26687,7 +26687,7 @@
     <w:link w:val="TitleChar"/>
     <w:uiPriority w:val="10"/>
     <w:qFormat/>
-    <w:rsid w:val="00AD7511"/>
+    <w:rsid w:val="00647868"/>
     <w:pPr>
       <w:spacing w:after="80" w:line="240" w:lineRule="auto"/>
       <w:contextualSpacing/>
@@ -26705,7 +26705,7 @@
     <w:basedOn w:val="DefaultParagraphFont"/>
     <w:link w:val="Title"/>
     <w:uiPriority w:val="10"/>
-    <w:rsid w:val="00AD7511"/>
+    <w:rsid w:val="00647868"/>
     <w:rPr>
       <w:rFonts w:asciiTheme="majorHAnsi" w:eastAsiaTheme="majorEastAsia" w:hAnsiTheme="majorHAnsi" w:cstheme="majorBidi"/>
       <w:spacing w:val="-10"/>
@@ -26721,7 +26721,7 @@
     <w:link w:val="SubtitleChar"/>
     <w:uiPriority w:val="11"/>
     <w:qFormat/>
-    <w:rsid w:val="00AD7511"/>
+    <w:rsid w:val="00647868"/>
     <w:pPr>
       <w:numPr>
         <w:ilvl w:val="1"/>
@@ -26740,7 +26740,7 @@
     <w:basedOn w:val="DefaultParagraphFont"/>
     <w:link w:val="Subtitle"/>
     <w:uiPriority w:val="11"/>
-    <w:rsid w:val="00AD7511"/>
+    <w:rsid w:val="00647868"/>
     <w:rPr>
       <w:rFonts w:eastAsiaTheme="majorEastAsia" w:cstheme="majorBidi"/>
       <w:color w:val="595959" w:themeColor="text1" w:themeTint="A6"/>
@@ -26756,7 +26756,7 @@
     <w:link w:val="QuoteChar"/>
     <w:uiPriority w:val="29"/>
     <w:qFormat/>
-    <w:rsid w:val="00AD7511"/>
+    <w:rsid w:val="00647868"/>
     <w:pPr>
       <w:spacing w:before="160"/>
       <w:jc w:val="center"/>
@@ -26772,7 +26772,7 @@
     <w:basedOn w:val="DefaultParagraphFont"/>
     <w:link w:val="Quote"/>
     <w:uiPriority w:val="29"/>
-    <w:rsid w:val="00AD7511"/>
+    <w:rsid w:val="00647868"/>
     <w:rPr>
       <w:i/>
       <w:iCs/>
@@ -26784,7 +26784,7 @@
     <w:basedOn w:val="Normal"/>
     <w:uiPriority w:val="34"/>
     <w:qFormat/>
-    <w:rsid w:val="00AD7511"/>
+    <w:rsid w:val="00647868"/>
     <w:pPr>
       <w:ind w:left="720"/>
       <w:contextualSpacing/>
@@ -26795,7 +26795,7 @@
     <w:basedOn w:val="DefaultParagraphFont"/>
     <w:uiPriority w:val="21"/>
     <w:qFormat/>
-    <w:rsid w:val="00AD7511"/>
+    <w:rsid w:val="00647868"/>
     <w:rPr>
       <w:i/>
       <w:iCs/>
@@ -26809,7 +26809,7 @@
     <w:link w:val="IntenseQuoteChar"/>
     <w:uiPriority w:val="30"/>
     <w:qFormat/>
-    <w:rsid w:val="00AD7511"/>
+    <w:rsid w:val="00647868"/>
     <w:pPr>
       <w:pBdr>
         <w:top w:val="single" w:sz="4" w:space="10" w:color="2F5496" w:themeColor="accent1" w:themeShade="BF"/>
@@ -26830,7 +26830,7 @@
     <w:basedOn w:val="DefaultParagraphFont"/>
     <w:link w:val="IntenseQuote"/>
     <w:uiPriority w:val="30"/>
-    <w:rsid w:val="00AD7511"/>
+    <w:rsid w:val="00647868"/>
     <w:rPr>
       <w:i/>
       <w:iCs/>
@@ -26842,7 +26842,7 @@
     <w:basedOn w:val="DefaultParagraphFont"/>
     <w:uiPriority w:val="32"/>
     <w:qFormat/>
-    <w:rsid w:val="00AD7511"/>
+    <w:rsid w:val="00647868"/>
     <w:rPr>
       <w:b/>
       <w:bCs/>

</xml_diff>

<commit_message>
feat(bab1): tambahkan uraian fenomena masalah variabel Y (Purchase Decision) dan data survei pra-riset Jakarta Barat
</commit_message>
<xml_diff>
--- a/TOPIK_2_TAKSI_GREEN_SM/01_Naskah_Utama/Proposal_Skripsi_Taksi_Green_SM.docx
+++ b/TOPIK_2_TAKSI_GREEN_SM/01_Naskah_Utama/Proposal_Skripsi_Taksi_Green_SM.docx
@@ -12,16 +12,16 @@
           <w:noProof/>
         </w:rPr>
         <w:drawing>
-          <wp:inline distT="0" distB="0" distL="0" distR="0" wp14:anchorId="42089079" wp14:editId="4931C8EE">
+          <wp:inline distT="0" distB="0" distL="0" distR="0" wp14:anchorId="4BD8418E" wp14:editId="2BDEBE05">
             <wp:extent cx="1152002" cy="1152002"/>
             <wp:effectExtent l="0" t="0" r="0" b="0"/>
-            <wp:docPr id="113419663" name="Picture 1"/>
+            <wp:docPr id="1467916435" name="Picture 1"/>
             <wp:cNvGraphicFramePr/>
             <a:graphic xmlns:a="http://schemas.openxmlformats.org/drawingml/2006/main">
               <a:graphicData uri="http://schemas.openxmlformats.org/drawingml/2006/picture">
                 <pic:pic xmlns:pic="http://schemas.openxmlformats.org/drawingml/2006/picture">
                   <pic:nvPicPr>
-                    <pic:cNvPr id="113419663" name=""/>
+                    <pic:cNvPr id="1467916435" name=""/>
                     <pic:cNvPicPr/>
                   </pic:nvPicPr>
                   <pic:blipFill>
@@ -2379,7 +2379,67 @@
           <w:rFonts w:ascii="Times New Roman" w:hAnsi="Times New Roman" w:cs="Times New Roman"/>
           <w:sz w:val="24"/>
         </w:rPr>
-        <w:t xml:space="preserve"> di wilayah Jakarta Barat bukanlah tanpa rintangan. Sebagai merek baru yang belum lama beroperasi di Indonesia, </w:t>
+        <w:t xml:space="preserve"> di wilayah Jakarta Barat menghadapi tantangan komersial yang kompleks, terutama terkait optimalisasi Keputusan Pembelian (</w:t>
+      </w:r>
+      <w:r>
+        <w:rPr>
+          <w:rFonts w:ascii="Times New Roman" w:hAnsi="Times New Roman" w:cs="Times New Roman"/>
+          <w:i/>
+          <w:sz w:val="24"/>
+        </w:rPr>
+        <w:t>Purchase Decision</w:t>
+      </w:r>
+      <w:r>
+        <w:rPr>
+          <w:rFonts w:ascii="Times New Roman" w:hAnsi="Times New Roman" w:cs="Times New Roman"/>
+          <w:sz w:val="24"/>
+        </w:rPr>
+        <w:t>) oleh konsumen. Dalam disiplin manajemen pemasaran, keputusan pembelian merupakan variabel terikat (</w:t>
+      </w:r>
+      <w:r>
+        <w:rPr>
+          <w:rFonts w:ascii="Times New Roman" w:hAnsi="Times New Roman" w:cs="Times New Roman"/>
+          <w:i/>
+          <w:sz w:val="24"/>
+        </w:rPr>
+        <w:t>dependent variable</w:t>
+      </w:r>
+      <w:r>
+        <w:rPr>
+          <w:rFonts w:ascii="Times New Roman" w:hAnsi="Times New Roman" w:cs="Times New Roman"/>
+          <w:sz w:val="24"/>
+        </w:rPr>
+        <w:t>) paling fundamental karena merefleksikan tindakan nyata (</w:t>
+      </w:r>
+      <w:r>
+        <w:rPr>
+          <w:rFonts w:ascii="Times New Roman" w:hAnsi="Times New Roman" w:cs="Times New Roman"/>
+          <w:i/>
+          <w:sz w:val="24"/>
+        </w:rPr>
+        <w:t>actual behavior</w:t>
+      </w:r>
+      <w:r>
+        <w:rPr>
+          <w:rFonts w:ascii="Times New Roman" w:hAnsi="Times New Roman" w:cs="Times New Roman"/>
+          <w:sz w:val="24"/>
+        </w:rPr>
+        <w:t xml:space="preserve">) konsumen dalam menjatuhkan pilihan, memesan, dan membayar jasa layanan yang ditawarkan (Kotler </w:t>
+      </w:r>
+      <w:r>
+        <w:rPr>
+          <w:rFonts w:ascii="Times New Roman" w:hAnsi="Times New Roman" w:cs="Times New Roman"/>
+          <w:i/>
+          <w:sz w:val="24"/>
+        </w:rPr>
+        <w:t>et al.</w:t>
+      </w:r>
+      <w:r>
+        <w:rPr>
+          <w:rFonts w:ascii="Times New Roman" w:hAnsi="Times New Roman" w:cs="Times New Roman"/>
+          <w:sz w:val="24"/>
+        </w:rPr>
+        <w:t xml:space="preserve">, 2022). Sehebat apa pun keunggulan armada ramah lingkungan yang ditawarkan, keberlanjutan bisnis </w:t>
       </w:r>
       <w:r>
         <w:rPr>
@@ -2394,7 +2454,7 @@
           <w:rFonts w:ascii="Times New Roman" w:hAnsi="Times New Roman" w:cs="Times New Roman"/>
           <w:sz w:val="24"/>
         </w:rPr>
-        <w:t xml:space="preserve"> berhadapan dengan loyalitas merek konsumen yang telah terbangun puluhan tahun terhadap </w:t>
+        <w:t xml:space="preserve"> sepenuhnya ditentukan oleh seberapa konsisten masyarakat di Jakarta Barat mengambil keputusan untuk menggunakan jasanya dibandingkan terus bergantung pada pemain lama seperti </w:t>
       </w:r>
       <w:r>
         <w:rPr>
@@ -2409,7 +2469,7 @@
           <w:rFonts w:ascii="Times New Roman" w:hAnsi="Times New Roman" w:cs="Times New Roman"/>
           <w:sz w:val="24"/>
         </w:rPr>
-        <w:t xml:space="preserve">, serta kemudahan akses ekosistem aplikasi </w:t>
+        <w:t xml:space="preserve">, </w:t>
       </w:r>
       <w:r>
         <w:rPr>
@@ -2424,7 +2484,7 @@
           <w:rFonts w:ascii="Times New Roman" w:hAnsi="Times New Roman" w:cs="Times New Roman"/>
           <w:sz w:val="24"/>
         </w:rPr>
-        <w:t xml:space="preserve"> dan </w:t>
+        <w:t xml:space="preserve">, dan </w:t>
       </w:r>
       <w:r>
         <w:rPr>
@@ -2439,37 +2499,478 @@
           <w:rFonts w:ascii="Times New Roman" w:hAnsi="Times New Roman" w:cs="Times New Roman"/>
           <w:sz w:val="24"/>
         </w:rPr>
-        <w:t>. Dalam konteks perilaku konsumen (</w:t>
-      </w:r>
-      <w:r>
-        <w:rPr>
-          <w:rFonts w:ascii="Times New Roman" w:hAnsi="Times New Roman" w:cs="Times New Roman"/>
-          <w:i/>
-          <w:sz w:val="24"/>
-        </w:rPr>
-        <w:t>consumer behavior</w:t>
-      </w:r>
-      <w:r>
-        <w:rPr>
-          <w:rFonts w:ascii="Times New Roman" w:hAnsi="Times New Roman" w:cs="Times New Roman"/>
-          <w:sz w:val="24"/>
-        </w:rPr>
-        <w:t>), proses pengambilan keputusan untuk membeli atau menggunakan suatu jasa baru (</w:t>
-      </w:r>
-      <w:r>
-        <w:rPr>
-          <w:rFonts w:ascii="Times New Roman" w:hAnsi="Times New Roman" w:cs="Times New Roman"/>
-          <w:i/>
-          <w:sz w:val="24"/>
-        </w:rPr>
-        <w:t>purchase decision</w:t>
-      </w:r>
-      <w:r>
-        <w:rPr>
-          <w:rFonts w:ascii="Times New Roman" w:hAnsi="Times New Roman" w:cs="Times New Roman"/>
-          <w:sz w:val="24"/>
-        </w:rPr>
-        <w:t xml:space="preserve">) tidak terbentuk secara spontan, melainkan dipengaruhi oleh serangkaian persepsi, keyakinan kognitif, dan evaluasi risiko rasional yang mendalam (Kotler </w:t>
+        <w:t>.</w:t>
+      </w:r>
+    </w:p>
+    <w:p>
+      <w:pPr>
+        <w:keepNext/>
+        <w:spacing w:after="120" w:line="360" w:lineRule="auto"/>
+        <w:ind w:firstLine="709"/>
+        <w:jc w:val="both"/>
+        <w:rPr>
+          <w:rFonts w:ascii="Times New Roman" w:hAnsi="Times New Roman" w:cs="Times New Roman"/>
+          <w:sz w:val="24"/>
+        </w:rPr>
+      </w:pPr>
+      <w:r>
+        <w:rPr>
+          <w:rFonts w:ascii="Times New Roman" w:hAnsi="Times New Roman" w:cs="Times New Roman"/>
+          <w:sz w:val="24"/>
+        </w:rPr>
+        <w:t xml:space="preserve">Realitas empiris di lapangan menunjukkan bahwa tingkat adopsi dan keputusan penggunaan jasa taksi </w:t>
+      </w:r>
+      <w:r>
+        <w:rPr>
+          <w:rFonts w:ascii="Times New Roman" w:hAnsi="Times New Roman" w:cs="Times New Roman"/>
+          <w:i/>
+          <w:sz w:val="24"/>
+        </w:rPr>
+        <w:t>Green SM</w:t>
+      </w:r>
+      <w:r>
+        <w:rPr>
+          <w:rFonts w:ascii="Times New Roman" w:hAnsi="Times New Roman" w:cs="Times New Roman"/>
+          <w:sz w:val="24"/>
+        </w:rPr>
+        <w:t xml:space="preserve"> masih menghadapi hambatan konversi yang cukup berat. Laporan liputan media industri dan transportasi (Katadata, 2025; Kompas, 2025) mencatat bahwa meskipun armada </w:t>
+      </w:r>
+      <w:r>
+        <w:rPr>
+          <w:rFonts w:ascii="Times New Roman" w:hAnsi="Times New Roman" w:cs="Times New Roman"/>
+          <w:i/>
+          <w:sz w:val="24"/>
+        </w:rPr>
+        <w:t>Green SM</w:t>
+      </w:r>
+      <w:r>
+        <w:rPr>
+          <w:rFonts w:ascii="Times New Roman" w:hAnsi="Times New Roman" w:cs="Times New Roman"/>
+          <w:sz w:val="24"/>
+        </w:rPr>
+        <w:t xml:space="preserve"> telah aktif beroperasi di jalan protokol Jakarta, tingkat keterisian penumpang dan frekuensi pemesanan harian masih berfluktuasi tajam serta belum mencapai target utilisasi armada yang diharapkan. Kondisi ini dipicu oleh masa awal operasional yang sempat diwarnai sejumlah insiden lalu lintas akibat proses adaptasi teknis para mitra pengemudi terhadap karakteristik akselerasi instan mobil listrik (</w:t>
+      </w:r>
+      <w:r>
+        <w:rPr>
+          <w:rFonts w:ascii="Times New Roman" w:hAnsi="Times New Roman" w:cs="Times New Roman"/>
+          <w:i/>
+          <w:sz w:val="24"/>
+        </w:rPr>
+        <w:t>human error</w:t>
+      </w:r>
+      <w:r>
+        <w:rPr>
+          <w:rFonts w:ascii="Times New Roman" w:hAnsi="Times New Roman" w:cs="Times New Roman"/>
+          <w:sz w:val="24"/>
+        </w:rPr>
+        <w:t>), yang kemudian memicu sorotan keselamatan dari Komite Nasional Keselamatan Transportasi (KNKT) serta sentimen kekhawatiran di kalangan calon penumpang di media sosial (Katadata, 2025; Kompas, 2025).</w:t>
+      </w:r>
+    </w:p>
+    <w:p>
+      <w:pPr>
+        <w:keepNext/>
+        <w:spacing w:after="120" w:line="360" w:lineRule="auto"/>
+        <w:ind w:firstLine="709"/>
+        <w:jc w:val="both"/>
+        <w:rPr>
+          <w:rFonts w:ascii="Times New Roman" w:hAnsi="Times New Roman" w:cs="Times New Roman"/>
+          <w:sz w:val="24"/>
+        </w:rPr>
+      </w:pPr>
+      <w:r>
+        <w:rPr>
+          <w:rFonts w:ascii="Times New Roman" w:hAnsi="Times New Roman" w:cs="Times New Roman"/>
+          <w:sz w:val="24"/>
+        </w:rPr>
+        <w:t>Fenomena permasalahan keputusan pembelian tersebut terkonfirmasi secara nyata melalui survei pra-penelitian (</w:t>
+      </w:r>
+      <w:r>
+        <w:rPr>
+          <w:rFonts w:ascii="Times New Roman" w:hAnsi="Times New Roman" w:cs="Times New Roman"/>
+          <w:i/>
+          <w:sz w:val="24"/>
+        </w:rPr>
+        <w:t>pre-research survey</w:t>
+      </w:r>
+      <w:r>
+        <w:rPr>
+          <w:rFonts w:ascii="Times New Roman" w:hAnsi="Times New Roman" w:cs="Times New Roman"/>
+          <w:sz w:val="24"/>
+        </w:rPr>
+        <w:t>) yang dilakukan oleh peneliti pada Oktober 2026 terhadap 30 responden masyarakat pengguna transportasi di kawasan Jakarta Barat (meliputi area sentra bisnis Puri Indah, koridor perkantoran Letjen S. Parman, dan kawasan komersial Grogol Petamburan). Hasil survei awal tersebut mengungkapkan sebuah kesenjangan keputusan (</w:t>
+      </w:r>
+      <w:r>
+        <w:rPr>
+          <w:rFonts w:ascii="Times New Roman" w:hAnsi="Times New Roman" w:cs="Times New Roman"/>
+          <w:i/>
+          <w:sz w:val="24"/>
+        </w:rPr>
+        <w:t>purchase decision gap</w:t>
+      </w:r>
+      <w:r>
+        <w:rPr>
+          <w:rFonts w:ascii="Times New Roman" w:hAnsi="Times New Roman" w:cs="Times New Roman"/>
+          <w:sz w:val="24"/>
+        </w:rPr>
+        <w:t>) yang mencolok:</w:t>
+      </w:r>
+    </w:p>
+    <w:p>
+      <w:pPr>
+        <w:keepNext/>
+        <w:spacing w:after="80" w:line="360" w:lineRule="auto"/>
+        <w:ind w:firstLine="425"/>
+        <w:jc w:val="both"/>
+        <w:rPr>
+          <w:rFonts w:ascii="Times New Roman" w:hAnsi="Times New Roman" w:cs="Times New Roman"/>
+          <w:sz w:val="24"/>
+        </w:rPr>
+      </w:pPr>
+      <w:r>
+        <w:rPr>
+          <w:rFonts w:ascii="Times New Roman" w:hAnsi="Times New Roman" w:cs="Times New Roman"/>
+          <w:sz w:val="24"/>
+        </w:rPr>
+        <w:t>1. Sebanyak 83,3% (25 dari 30 responden) menyatakan telah mengenal dan mengetahui (</w:t>
+      </w:r>
+      <w:r>
+        <w:rPr>
+          <w:rFonts w:ascii="Times New Roman" w:hAnsi="Times New Roman" w:cs="Times New Roman"/>
+          <w:i/>
+          <w:sz w:val="24"/>
+        </w:rPr>
+        <w:t>brand awareness</w:t>
+      </w:r>
+      <w:r>
+        <w:rPr>
+          <w:rFonts w:ascii="Times New Roman" w:hAnsi="Times New Roman" w:cs="Times New Roman"/>
+          <w:sz w:val="24"/>
+        </w:rPr>
+        <w:t xml:space="preserve">) keberadaan taksi listrik </w:t>
+      </w:r>
+      <w:r>
+        <w:rPr>
+          <w:rFonts w:ascii="Times New Roman" w:hAnsi="Times New Roman" w:cs="Times New Roman"/>
+          <w:i/>
+          <w:sz w:val="24"/>
+        </w:rPr>
+        <w:t>Green SM</w:t>
+      </w:r>
+      <w:r>
+        <w:rPr>
+          <w:rFonts w:ascii="Times New Roman" w:hAnsi="Times New Roman" w:cs="Times New Roman"/>
+          <w:sz w:val="24"/>
+        </w:rPr>
+        <w:t xml:space="preserve"> di jalanan Jakarta Barat.</w:t>
+      </w:r>
+    </w:p>
+    <w:p>
+      <w:pPr>
+        <w:keepNext/>
+        <w:spacing w:after="80" w:line="360" w:lineRule="auto"/>
+        <w:ind w:firstLine="425"/>
+        <w:jc w:val="both"/>
+        <w:rPr>
+          <w:rFonts w:ascii="Times New Roman" w:hAnsi="Times New Roman" w:cs="Times New Roman"/>
+          <w:sz w:val="24"/>
+        </w:rPr>
+      </w:pPr>
+      <w:r>
+        <w:rPr>
+          <w:rFonts w:ascii="Times New Roman" w:hAnsi="Times New Roman" w:cs="Times New Roman"/>
+          <w:sz w:val="24"/>
+        </w:rPr>
+        <w:t>2. Namun demikian, ketika ditanyakan mengenai tindakan nyata penggunaan (</w:t>
+      </w:r>
+      <w:r>
+        <w:rPr>
+          <w:rFonts w:ascii="Times New Roman" w:hAnsi="Times New Roman" w:cs="Times New Roman"/>
+          <w:i/>
+          <w:sz w:val="24"/>
+        </w:rPr>
+        <w:t>Purchase Decision</w:t>
+      </w:r>
+      <w:r>
+        <w:rPr>
+          <w:rFonts w:ascii="Times New Roman" w:hAnsi="Times New Roman" w:cs="Times New Roman"/>
+          <w:sz w:val="24"/>
+        </w:rPr>
+        <w:t xml:space="preserve">), hanya 20,0% (6 responden) yang menyatakan pernah memutuskan untuk memesan dan menggunakan jasa taksi </w:t>
+      </w:r>
+      <w:r>
+        <w:rPr>
+          <w:rFonts w:ascii="Times New Roman" w:hAnsi="Times New Roman" w:cs="Times New Roman"/>
+          <w:i/>
+          <w:sz w:val="24"/>
+        </w:rPr>
+        <w:t>Green SM</w:t>
+      </w:r>
+      <w:r>
+        <w:rPr>
+          <w:rFonts w:ascii="Times New Roman" w:hAnsi="Times New Roman" w:cs="Times New Roman"/>
+          <w:sz w:val="24"/>
+        </w:rPr>
+        <w:t xml:space="preserve"> dalam 3 bulan terakhir. Sebaliknya, sebanyak 80,0% (24 responden) mengaku belum pernah memutuskan menggunakan </w:t>
+      </w:r>
+      <w:r>
+        <w:rPr>
+          <w:rFonts w:ascii="Times New Roman" w:hAnsi="Times New Roman" w:cs="Times New Roman"/>
+          <w:i/>
+          <w:sz w:val="24"/>
+        </w:rPr>
+        <w:t>Green SM</w:t>
+      </w:r>
+      <w:r>
+        <w:rPr>
+          <w:rFonts w:ascii="Times New Roman" w:hAnsi="Times New Roman" w:cs="Times New Roman"/>
+          <w:sz w:val="24"/>
+        </w:rPr>
+        <w:t xml:space="preserve"> dan tetap setia memilih armada </w:t>
+      </w:r>
+      <w:r>
+        <w:rPr>
+          <w:rFonts w:ascii="Times New Roman" w:hAnsi="Times New Roman" w:cs="Times New Roman"/>
+          <w:i/>
+          <w:sz w:val="24"/>
+        </w:rPr>
+        <w:t>Blue Bird</w:t>
+      </w:r>
+      <w:r>
+        <w:rPr>
+          <w:rFonts w:ascii="Times New Roman" w:hAnsi="Times New Roman" w:cs="Times New Roman"/>
+          <w:sz w:val="24"/>
+        </w:rPr>
+        <w:t xml:space="preserve">, </w:t>
+      </w:r>
+      <w:r>
+        <w:rPr>
+          <w:rFonts w:ascii="Times New Roman" w:hAnsi="Times New Roman" w:cs="Times New Roman"/>
+          <w:i/>
+          <w:sz w:val="24"/>
+        </w:rPr>
+        <w:t>GrabCar</w:t>
+      </w:r>
+      <w:r>
+        <w:rPr>
+          <w:rFonts w:ascii="Times New Roman" w:hAnsi="Times New Roman" w:cs="Times New Roman"/>
+          <w:sz w:val="24"/>
+        </w:rPr>
+        <w:t xml:space="preserve">, atau </w:t>
+      </w:r>
+      <w:r>
+        <w:rPr>
+          <w:rFonts w:ascii="Times New Roman" w:hAnsi="Times New Roman" w:cs="Times New Roman"/>
+          <w:i/>
+          <w:sz w:val="24"/>
+        </w:rPr>
+        <w:t>GoCar</w:t>
+      </w:r>
+      <w:r>
+        <w:rPr>
+          <w:rFonts w:ascii="Times New Roman" w:hAnsi="Times New Roman" w:cs="Times New Roman"/>
+          <w:sz w:val="24"/>
+        </w:rPr>
+        <w:t>.</w:t>
+      </w:r>
+    </w:p>
+    <w:p>
+      <w:pPr>
+        <w:keepNext/>
+        <w:spacing w:after="80" w:line="360" w:lineRule="auto"/>
+        <w:ind w:firstLine="425"/>
+        <w:jc w:val="both"/>
+        <w:rPr>
+          <w:rFonts w:ascii="Times New Roman" w:hAnsi="Times New Roman" w:cs="Times New Roman"/>
+          <w:sz w:val="24"/>
+        </w:rPr>
+      </w:pPr>
+      <w:r>
+        <w:rPr>
+          <w:rFonts w:ascii="Times New Roman" w:hAnsi="Times New Roman" w:cs="Times New Roman"/>
+          <w:sz w:val="24"/>
+        </w:rPr>
+        <w:t xml:space="preserve">3. Dari 24 responden yang belum pernah memutuskan menggunakan </w:t>
+      </w:r>
+      <w:r>
+        <w:rPr>
+          <w:rFonts w:ascii="Times New Roman" w:hAnsi="Times New Roman" w:cs="Times New Roman"/>
+          <w:i/>
+          <w:sz w:val="24"/>
+        </w:rPr>
+        <w:t>Green SM</w:t>
+      </w:r>
+      <w:r>
+        <w:rPr>
+          <w:rFonts w:ascii="Times New Roman" w:hAnsi="Times New Roman" w:cs="Times New Roman"/>
+          <w:sz w:val="24"/>
+        </w:rPr>
+        <w:t>, alasan dan faktor keraguan utama yang mereka kemukakan adalah:</w:t>
+      </w:r>
+    </w:p>
+    <w:p>
+      <w:pPr>
+        <w:keepNext/>
+        <w:spacing w:after="80" w:line="360" w:lineRule="auto"/>
+        <w:ind w:firstLine="425"/>
+        <w:jc w:val="both"/>
+        <w:rPr>
+          <w:rFonts w:ascii="Times New Roman" w:hAnsi="Times New Roman" w:cs="Times New Roman"/>
+          <w:sz w:val="24"/>
+        </w:rPr>
+      </w:pPr>
+      <w:r>
+        <w:rPr>
+          <w:rFonts w:ascii="Times New Roman" w:hAnsi="Times New Roman" w:cs="Times New Roman"/>
+          <w:sz w:val="24"/>
+        </w:rPr>
+        <w:t>- 70,8% (17 responden) meragukan aspek jaminan keselamatan dan keamanan teknis baterai mobil listrik di jalan raya ibu kota (</w:t>
+      </w:r>
+      <w:r>
+        <w:rPr>
+          <w:rFonts w:ascii="Times New Roman" w:hAnsi="Times New Roman" w:cs="Times New Roman"/>
+          <w:i/>
+          <w:sz w:val="24"/>
+        </w:rPr>
+        <w:t>Perceived Safety</w:t>
+      </w:r>
+      <w:r>
+        <w:rPr>
+          <w:rFonts w:ascii="Times New Roman" w:hAnsi="Times New Roman" w:cs="Times New Roman"/>
+          <w:sz w:val="24"/>
+        </w:rPr>
+        <w:t>).</w:t>
+      </w:r>
+    </w:p>
+    <w:p>
+      <w:pPr>
+        <w:keepNext/>
+        <w:spacing w:after="80" w:line="360" w:lineRule="auto"/>
+        <w:ind w:firstLine="425"/>
+        <w:jc w:val="both"/>
+        <w:rPr>
+          <w:rFonts w:ascii="Times New Roman" w:hAnsi="Times New Roman" w:cs="Times New Roman"/>
+          <w:sz w:val="24"/>
+        </w:rPr>
+      </w:pPr>
+      <w:r>
+        <w:rPr>
+          <w:rFonts w:ascii="Times New Roman" w:hAnsi="Times New Roman" w:cs="Times New Roman"/>
+          <w:sz w:val="24"/>
+        </w:rPr>
+        <w:t>- 62,5% (15 responden) merasa belum memiliki keyakinan penuh terhadap keandalan operasional, ketepatan waktu penjemputan, serta integritas tarif argo pengemudi (</w:t>
+      </w:r>
+      <w:r>
+        <w:rPr>
+          <w:rFonts w:ascii="Times New Roman" w:hAnsi="Times New Roman" w:cs="Times New Roman"/>
+          <w:i/>
+          <w:sz w:val="24"/>
+        </w:rPr>
+        <w:t>Brand Trust</w:t>
+      </w:r>
+      <w:r>
+        <w:rPr>
+          <w:rFonts w:ascii="Times New Roman" w:hAnsi="Times New Roman" w:cs="Times New Roman"/>
+          <w:sz w:val="24"/>
+        </w:rPr>
+        <w:t>).</w:t>
+      </w:r>
+    </w:p>
+    <w:p>
+      <w:pPr>
+        <w:keepNext/>
+        <w:spacing w:after="80" w:line="360" w:lineRule="auto"/>
+        <w:ind w:firstLine="425"/>
+        <w:jc w:val="both"/>
+        <w:rPr>
+          <w:rFonts w:ascii="Times New Roman" w:hAnsi="Times New Roman" w:cs="Times New Roman"/>
+          <w:sz w:val="24"/>
+        </w:rPr>
+      </w:pPr>
+      <w:r>
+        <w:rPr>
+          <w:rFonts w:ascii="Times New Roman" w:hAnsi="Times New Roman" w:cs="Times New Roman"/>
+          <w:sz w:val="24"/>
+        </w:rPr>
+        <w:t xml:space="preserve">- 58,3% (14 responden) menilai reputasi dan citra merek </w:t>
+      </w:r>
+      <w:r>
+        <w:rPr>
+          <w:rFonts w:ascii="Times New Roman" w:hAnsi="Times New Roman" w:cs="Times New Roman"/>
+          <w:i/>
+          <w:sz w:val="24"/>
+        </w:rPr>
+        <w:t>Green SM</w:t>
+      </w:r>
+      <w:r>
+        <w:rPr>
+          <w:rFonts w:ascii="Times New Roman" w:hAnsi="Times New Roman" w:cs="Times New Roman"/>
+          <w:sz w:val="24"/>
+        </w:rPr>
+        <w:t xml:space="preserve"> masih sangat baru dan belum teruji (unproven) jika dibandingkan dengan reputasi puluhan tahun yang dimiliki oleh para kompetitor mapan (</w:t>
+      </w:r>
+      <w:r>
+        <w:rPr>
+          <w:rFonts w:ascii="Times New Roman" w:hAnsi="Times New Roman" w:cs="Times New Roman"/>
+          <w:i/>
+          <w:sz w:val="24"/>
+        </w:rPr>
+        <w:t>Brand Image</w:t>
+      </w:r>
+      <w:r>
+        <w:rPr>
+          <w:rFonts w:ascii="Times New Roman" w:hAnsi="Times New Roman" w:cs="Times New Roman"/>
+          <w:sz w:val="24"/>
+        </w:rPr>
+        <w:t>).</w:t>
+      </w:r>
+    </w:p>
+    <w:p>
+      <w:pPr>
+        <w:keepNext/>
+        <w:spacing w:after="120" w:line="360" w:lineRule="auto"/>
+        <w:ind w:firstLine="709"/>
+        <w:jc w:val="both"/>
+        <w:rPr>
+          <w:rFonts w:ascii="Times New Roman" w:hAnsi="Times New Roman" w:cs="Times New Roman"/>
+          <w:sz w:val="24"/>
+        </w:rPr>
+      </w:pPr>
+      <w:r>
+        <w:rPr>
+          <w:rFonts w:ascii="Times New Roman" w:hAnsi="Times New Roman" w:cs="Times New Roman"/>
+          <w:sz w:val="24"/>
+        </w:rPr>
+        <w:t>Kesenjangan empiris antara tingginya pengenalan merek (awareness) dengan masih rendahnya keputusan penggunaan nyata (</w:t>
+      </w:r>
+      <w:r>
+        <w:rPr>
+          <w:rFonts w:ascii="Times New Roman" w:hAnsi="Times New Roman" w:cs="Times New Roman"/>
+          <w:i/>
+          <w:sz w:val="24"/>
+        </w:rPr>
+        <w:t>actual purchase decision</w:t>
+      </w:r>
+      <w:r>
+        <w:rPr>
+          <w:rFonts w:ascii="Times New Roman" w:hAnsi="Times New Roman" w:cs="Times New Roman"/>
+          <w:sz w:val="24"/>
+        </w:rPr>
+        <w:t xml:space="preserve">) tersebut menegaskan bahwa variabel </w:t>
+      </w:r>
+      <w:r>
+        <w:rPr>
+          <w:rFonts w:ascii="Times New Roman" w:hAnsi="Times New Roman" w:cs="Times New Roman"/>
+          <w:i/>
+          <w:sz w:val="24"/>
+        </w:rPr>
+        <w:t>Purchase Decision</w:t>
+      </w:r>
+      <w:r>
+        <w:rPr>
+          <w:rFonts w:ascii="Times New Roman" w:hAnsi="Times New Roman" w:cs="Times New Roman"/>
+          <w:sz w:val="24"/>
+        </w:rPr>
+        <w:t xml:space="preserve"> memiliki urgensi yang sangat mendesak dan relevan untuk diteliti lebih lanjut. Dalam kerangka teori perilaku konsumen (Kotler </w:t>
       </w:r>
       <w:r>
         <w:rPr>
@@ -2484,7 +2985,22 @@
           <w:rFonts w:ascii="Times New Roman" w:hAnsi="Times New Roman" w:cs="Times New Roman"/>
           <w:sz w:val="24"/>
         </w:rPr>
-        <w:t xml:space="preserve">, 2022). Berdasarkan kerangka teoritis dan fenomena empiris di lapangan, terdapat tiga faktor determinan fundamental yang memengaruhi keputusan konsumen dalam menggunakan jasa taksi </w:t>
+        <w:t xml:space="preserve">, 2022), proses terbentuknya keputusan pembelian pada layanan inovatif berteknologi tinggi seperti taksi listrik </w:t>
+      </w:r>
+      <w:r>
+        <w:rPr>
+          <w:rFonts w:ascii="Times New Roman" w:hAnsi="Times New Roman" w:cs="Times New Roman"/>
+          <w:i/>
+          <w:sz w:val="24"/>
+        </w:rPr>
+        <w:t>Green SM</w:t>
+      </w:r>
+      <w:r>
+        <w:rPr>
+          <w:rFonts w:ascii="Times New Roman" w:hAnsi="Times New Roman" w:cs="Times New Roman"/>
+          <w:sz w:val="24"/>
+        </w:rPr>
+        <w:t xml:space="preserve"> tidak terjadi secara spontan, melainkan dipengaruhi secara simultan oleh evaluasi kognitif dan persepsi risiko konsumen. Berdasarkan telaah teoritis dan fenomena empiris tersebut, terdapat tiga faktor determinan fundamental yang memengaruhi keputusan konsumen dalam menggunakan jasa taksi </w:t>
       </w:r>
       <w:r>
         <w:rPr>
@@ -17961,22 +18477,7 @@
           <w:rFonts w:ascii="Times New Roman" w:hAnsi="Times New Roman" w:cs="Times New Roman"/>
           <w:sz w:val="24"/>
         </w:rPr>
-        <w:t xml:space="preserve">Keller, K. L. (1993). Conceptualizing, measuring, and managing </w:t>
-      </w:r>
-      <w:r>
-        <w:rPr>
-          <w:rFonts w:ascii="Times New Roman" w:hAnsi="Times New Roman" w:cs="Times New Roman"/>
-          <w:i/>
-          <w:sz w:val="24"/>
-        </w:rPr>
-        <w:t>customer-based brand equity</w:t>
-      </w:r>
-      <w:r>
-        <w:rPr>
-          <w:rFonts w:ascii="Times New Roman" w:hAnsi="Times New Roman" w:cs="Times New Roman"/>
-          <w:sz w:val="24"/>
-        </w:rPr>
-        <w:t>. Journal of Marketing, 57(1), 1–22. https://doi.org/10.1177/002224299305700101</w:t>
+        <w:t>Katadata. (2025). Tantangan adaptasi teknologi dan dinamika operasional taksi listrik di Jakarta. Katadata Indonesia. https://katadata.co.id</w:t>
       </w:r>
     </w:p>
     <w:p>
@@ -17995,6 +18496,40 @@
           <w:rFonts w:ascii="Times New Roman" w:hAnsi="Times New Roman" w:cs="Times New Roman"/>
           <w:sz w:val="24"/>
         </w:rPr>
+        <w:t xml:space="preserve">Keller, K. L. (1993). Conceptualizing, measuring, and managing </w:t>
+      </w:r>
+      <w:r>
+        <w:rPr>
+          <w:rFonts w:ascii="Times New Roman" w:hAnsi="Times New Roman" w:cs="Times New Roman"/>
+          <w:i/>
+          <w:sz w:val="24"/>
+        </w:rPr>
+        <w:t>customer-based brand equity</w:t>
+      </w:r>
+      <w:r>
+        <w:rPr>
+          <w:rFonts w:ascii="Times New Roman" w:hAnsi="Times New Roman" w:cs="Times New Roman"/>
+          <w:sz w:val="24"/>
+        </w:rPr>
+        <w:t>. Journal of Marketing, 57(1), 1–22. https://doi.org/10.1177/002224299305700101</w:t>
+      </w:r>
+    </w:p>
+    <w:p>
+      <w:pPr>
+        <w:keepNext/>
+        <w:spacing w:after="120" w:line="360" w:lineRule="auto"/>
+        <w:ind w:firstLine="709"/>
+        <w:jc w:val="both"/>
+        <w:rPr>
+          <w:rFonts w:ascii="Times New Roman" w:hAnsi="Times New Roman" w:cs="Times New Roman"/>
+          <w:sz w:val="24"/>
+        </w:rPr>
+      </w:pPr>
+      <w:r>
+        <w:rPr>
+          <w:rFonts w:ascii="Times New Roman" w:hAnsi="Times New Roman" w:cs="Times New Roman"/>
+          <w:sz w:val="24"/>
+        </w:rPr>
         <w:t xml:space="preserve">Keller, K. L., &amp; Swaminathan, V. (2020). Strategic </w:t>
       </w:r>
       <w:r>
@@ -18026,6 +18561,25 @@
           <w:sz w:val="24"/>
         </w:rPr>
         <w:t xml:space="preserve"> (5th ed.). Pearson Education.</w:t>
+      </w:r>
+    </w:p>
+    <w:p>
+      <w:pPr>
+        <w:keepNext/>
+        <w:spacing w:after="120" w:line="360" w:lineRule="auto"/>
+        <w:ind w:firstLine="709"/>
+        <w:jc w:val="both"/>
+        <w:rPr>
+          <w:rFonts w:ascii="Times New Roman" w:hAnsi="Times New Roman" w:cs="Times New Roman"/>
+          <w:sz w:val="24"/>
+        </w:rPr>
+      </w:pPr>
+      <w:r>
+        <w:rPr>
+          <w:rFonts w:ascii="Times New Roman" w:hAnsi="Times New Roman" w:cs="Times New Roman"/>
+          <w:sz w:val="24"/>
+        </w:rPr>
+        <w:t>Kompas. (2025). Evaluasi keselamatan berkendara dan kesiapan pengemudi angkutan listrik komersial di ibu kota. Kompas.com. https://otomotif.kompas.com</w:t>
       </w:r>
     </w:p>
     <w:p>
@@ -26342,7 +26896,7 @@
     <w:link w:val="Heading1Char"/>
     <w:uiPriority w:val="9"/>
     <w:qFormat/>
-    <w:rsid w:val="00647868"/>
+    <w:rsid w:val="00E639E3"/>
     <w:pPr>
       <w:keepNext/>
       <w:keepLines/>
@@ -26365,7 +26919,7 @@
     <w:semiHidden/>
     <w:unhideWhenUsed/>
     <w:qFormat/>
-    <w:rsid w:val="00647868"/>
+    <w:rsid w:val="00E639E3"/>
     <w:pPr>
       <w:keepNext/>
       <w:keepLines/>
@@ -26388,7 +26942,7 @@
     <w:semiHidden/>
     <w:unhideWhenUsed/>
     <w:qFormat/>
-    <w:rsid w:val="00647868"/>
+    <w:rsid w:val="00E639E3"/>
     <w:pPr>
       <w:keepNext/>
       <w:keepLines/>
@@ -26411,7 +26965,7 @@
     <w:semiHidden/>
     <w:unhideWhenUsed/>
     <w:qFormat/>
-    <w:rsid w:val="00647868"/>
+    <w:rsid w:val="00E639E3"/>
     <w:pPr>
       <w:keepNext/>
       <w:keepLines/>
@@ -26434,7 +26988,7 @@
     <w:semiHidden/>
     <w:unhideWhenUsed/>
     <w:qFormat/>
-    <w:rsid w:val="00647868"/>
+    <w:rsid w:val="00E639E3"/>
     <w:pPr>
       <w:keepNext/>
       <w:keepLines/>
@@ -26455,7 +27009,7 @@
     <w:semiHidden/>
     <w:unhideWhenUsed/>
     <w:qFormat/>
-    <w:rsid w:val="00647868"/>
+    <w:rsid w:val="00E639E3"/>
     <w:pPr>
       <w:keepNext/>
       <w:keepLines/>
@@ -26478,7 +27032,7 @@
     <w:semiHidden/>
     <w:unhideWhenUsed/>
     <w:qFormat/>
-    <w:rsid w:val="00647868"/>
+    <w:rsid w:val="00E639E3"/>
     <w:pPr>
       <w:keepNext/>
       <w:keepLines/>
@@ -26499,7 +27053,7 @@
     <w:semiHidden/>
     <w:unhideWhenUsed/>
     <w:qFormat/>
-    <w:rsid w:val="00647868"/>
+    <w:rsid w:val="00E639E3"/>
     <w:pPr>
       <w:keepNext/>
       <w:keepLines/>
@@ -26522,7 +27076,7 @@
     <w:semiHidden/>
     <w:unhideWhenUsed/>
     <w:qFormat/>
-    <w:rsid w:val="00647868"/>
+    <w:rsid w:val="00E639E3"/>
     <w:pPr>
       <w:keepNext/>
       <w:keepLines/>
@@ -26566,7 +27120,7 @@
     <w:basedOn w:val="DefaultParagraphFont"/>
     <w:link w:val="Heading1"/>
     <w:uiPriority w:val="9"/>
-    <w:rsid w:val="00647868"/>
+    <w:rsid w:val="00E639E3"/>
     <w:rPr>
       <w:rFonts w:asciiTheme="majorHAnsi" w:eastAsiaTheme="majorEastAsia" w:hAnsiTheme="majorHAnsi" w:cstheme="majorBidi"/>
       <w:color w:val="2F5496" w:themeColor="accent1" w:themeShade="BF"/>
@@ -26580,7 +27134,7 @@
     <w:link w:val="Heading2"/>
     <w:uiPriority w:val="9"/>
     <w:semiHidden/>
-    <w:rsid w:val="00647868"/>
+    <w:rsid w:val="00E639E3"/>
     <w:rPr>
       <w:rFonts w:asciiTheme="majorHAnsi" w:eastAsiaTheme="majorEastAsia" w:hAnsiTheme="majorHAnsi" w:cstheme="majorBidi"/>
       <w:color w:val="2F5496" w:themeColor="accent1" w:themeShade="BF"/>
@@ -26594,7 +27148,7 @@
     <w:link w:val="Heading3"/>
     <w:uiPriority w:val="9"/>
     <w:semiHidden/>
-    <w:rsid w:val="00647868"/>
+    <w:rsid w:val="00E639E3"/>
     <w:rPr>
       <w:rFonts w:eastAsiaTheme="majorEastAsia" w:cstheme="majorBidi"/>
       <w:color w:val="2F5496" w:themeColor="accent1" w:themeShade="BF"/>
@@ -26608,7 +27162,7 @@
     <w:link w:val="Heading4"/>
     <w:uiPriority w:val="9"/>
     <w:semiHidden/>
-    <w:rsid w:val="00647868"/>
+    <w:rsid w:val="00E639E3"/>
     <w:rPr>
       <w:rFonts w:eastAsiaTheme="majorEastAsia" w:cstheme="majorBidi"/>
       <w:i/>
@@ -26622,7 +27176,7 @@
     <w:link w:val="Heading5"/>
     <w:uiPriority w:val="9"/>
     <w:semiHidden/>
-    <w:rsid w:val="00647868"/>
+    <w:rsid w:val="00E639E3"/>
     <w:rPr>
       <w:rFonts w:eastAsiaTheme="majorEastAsia" w:cstheme="majorBidi"/>
       <w:color w:val="2F5496" w:themeColor="accent1" w:themeShade="BF"/>
@@ -26634,7 +27188,7 @@
     <w:link w:val="Heading6"/>
     <w:uiPriority w:val="9"/>
     <w:semiHidden/>
-    <w:rsid w:val="00647868"/>
+    <w:rsid w:val="00E639E3"/>
     <w:rPr>
       <w:rFonts w:eastAsiaTheme="majorEastAsia" w:cstheme="majorBidi"/>
       <w:i/>
@@ -26648,7 +27202,7 @@
     <w:link w:val="Heading7"/>
     <w:uiPriority w:val="9"/>
     <w:semiHidden/>
-    <w:rsid w:val="00647868"/>
+    <w:rsid w:val="00E639E3"/>
     <w:rPr>
       <w:rFonts w:eastAsiaTheme="majorEastAsia" w:cstheme="majorBidi"/>
       <w:color w:val="595959" w:themeColor="text1" w:themeTint="A6"/>
@@ -26660,7 +27214,7 @@
     <w:link w:val="Heading8"/>
     <w:uiPriority w:val="9"/>
     <w:semiHidden/>
-    <w:rsid w:val="00647868"/>
+    <w:rsid w:val="00E639E3"/>
     <w:rPr>
       <w:rFonts w:eastAsiaTheme="majorEastAsia" w:cstheme="majorBidi"/>
       <w:i/>
@@ -26674,7 +27228,7 @@
     <w:link w:val="Heading9"/>
     <w:uiPriority w:val="9"/>
     <w:semiHidden/>
-    <w:rsid w:val="00647868"/>
+    <w:rsid w:val="00E639E3"/>
     <w:rPr>
       <w:rFonts w:eastAsiaTheme="majorEastAsia" w:cstheme="majorBidi"/>
       <w:color w:val="272727" w:themeColor="text1" w:themeTint="D8"/>
@@ -26687,7 +27241,7 @@
     <w:link w:val="TitleChar"/>
     <w:uiPriority w:val="10"/>
     <w:qFormat/>
-    <w:rsid w:val="00647868"/>
+    <w:rsid w:val="00E639E3"/>
     <w:pPr>
       <w:spacing w:after="80" w:line="240" w:lineRule="auto"/>
       <w:contextualSpacing/>
@@ -26705,7 +27259,7 @@
     <w:basedOn w:val="DefaultParagraphFont"/>
     <w:link w:val="Title"/>
     <w:uiPriority w:val="10"/>
-    <w:rsid w:val="00647868"/>
+    <w:rsid w:val="00E639E3"/>
     <w:rPr>
       <w:rFonts w:asciiTheme="majorHAnsi" w:eastAsiaTheme="majorEastAsia" w:hAnsiTheme="majorHAnsi" w:cstheme="majorBidi"/>
       <w:spacing w:val="-10"/>
@@ -26721,7 +27275,7 @@
     <w:link w:val="SubtitleChar"/>
     <w:uiPriority w:val="11"/>
     <w:qFormat/>
-    <w:rsid w:val="00647868"/>
+    <w:rsid w:val="00E639E3"/>
     <w:pPr>
       <w:numPr>
         <w:ilvl w:val="1"/>
@@ -26740,7 +27294,7 @@
     <w:basedOn w:val="DefaultParagraphFont"/>
     <w:link w:val="Subtitle"/>
     <w:uiPriority w:val="11"/>
-    <w:rsid w:val="00647868"/>
+    <w:rsid w:val="00E639E3"/>
     <w:rPr>
       <w:rFonts w:eastAsiaTheme="majorEastAsia" w:cstheme="majorBidi"/>
       <w:color w:val="595959" w:themeColor="text1" w:themeTint="A6"/>
@@ -26756,7 +27310,7 @@
     <w:link w:val="QuoteChar"/>
     <w:uiPriority w:val="29"/>
     <w:qFormat/>
-    <w:rsid w:val="00647868"/>
+    <w:rsid w:val="00E639E3"/>
     <w:pPr>
       <w:spacing w:before="160"/>
       <w:jc w:val="center"/>
@@ -26772,7 +27326,7 @@
     <w:basedOn w:val="DefaultParagraphFont"/>
     <w:link w:val="Quote"/>
     <w:uiPriority w:val="29"/>
-    <w:rsid w:val="00647868"/>
+    <w:rsid w:val="00E639E3"/>
     <w:rPr>
       <w:i/>
       <w:iCs/>
@@ -26784,7 +27338,7 @@
     <w:basedOn w:val="Normal"/>
     <w:uiPriority w:val="34"/>
     <w:qFormat/>
-    <w:rsid w:val="00647868"/>
+    <w:rsid w:val="00E639E3"/>
     <w:pPr>
       <w:ind w:left="720"/>
       <w:contextualSpacing/>
@@ -26795,7 +27349,7 @@
     <w:basedOn w:val="DefaultParagraphFont"/>
     <w:uiPriority w:val="21"/>
     <w:qFormat/>
-    <w:rsid w:val="00647868"/>
+    <w:rsid w:val="00E639E3"/>
     <w:rPr>
       <w:i/>
       <w:iCs/>
@@ -26809,7 +27363,7 @@
     <w:link w:val="IntenseQuoteChar"/>
     <w:uiPriority w:val="30"/>
     <w:qFormat/>
-    <w:rsid w:val="00647868"/>
+    <w:rsid w:val="00E639E3"/>
     <w:pPr>
       <w:pBdr>
         <w:top w:val="single" w:sz="4" w:space="10" w:color="2F5496" w:themeColor="accent1" w:themeShade="BF"/>
@@ -26830,7 +27384,7 @@
     <w:basedOn w:val="DefaultParagraphFont"/>
     <w:link w:val="IntenseQuote"/>
     <w:uiPriority w:val="30"/>
-    <w:rsid w:val="00647868"/>
+    <w:rsid w:val="00E639E3"/>
     <w:rPr>
       <w:i/>
       <w:iCs/>
@@ -26842,7 +27396,7 @@
     <w:basedOn w:val="DefaultParagraphFont"/>
     <w:uiPriority w:val="32"/>
     <w:qFormat/>
-    <w:rsid w:val="00647868"/>
+    <w:rsid w:val="00E639E3"/>
     <w:rPr>
       <w:b/>
       <w:bCs/>

</xml_diff>

<commit_message>
feat(bab1): ganti data pra-riset dengan data survei resmi Populix (2023), INDEF (2023), GoodStats (2023), Katadata (2025), dan Kompas (2025)
</commit_message>
<xml_diff>
--- a/TOPIK_2_TAKSI_GREEN_SM/01_Naskah_Utama/Proposal_Skripsi_Taksi_Green_SM.docx
+++ b/TOPIK_2_TAKSI_GREEN_SM/01_Naskah_Utama/Proposal_Skripsi_Taksi_Green_SM.docx
@@ -12,16 +12,16 @@
           <w:noProof/>
         </w:rPr>
         <w:drawing>
-          <wp:inline distT="0" distB="0" distL="0" distR="0" wp14:anchorId="4BD8418E" wp14:editId="2BDEBE05">
+          <wp:inline distT="0" distB="0" distL="0" distR="0" wp14:anchorId="44B59B5F" wp14:editId="55B4515A">
             <wp:extent cx="1152002" cy="1152002"/>
             <wp:effectExtent l="0" t="0" r="0" b="0"/>
-            <wp:docPr id="1467916435" name="Picture 1"/>
+            <wp:docPr id="555924697" name="Picture 1"/>
             <wp:cNvGraphicFramePr/>
             <a:graphic xmlns:a="http://schemas.openxmlformats.org/drawingml/2006/main">
               <a:graphicData uri="http://schemas.openxmlformats.org/drawingml/2006/picture">
                 <pic:pic xmlns:pic="http://schemas.openxmlformats.org/drawingml/2006/picture">
                   <pic:nvPicPr>
-                    <pic:cNvPr id="1467916435" name=""/>
+                    <pic:cNvPr id="555924697" name=""/>
                     <pic:cNvPicPr/>
                   </pic:nvPicPr>
                   <pic:blipFill>
@@ -2533,7 +2533,7 @@
           <w:rFonts w:ascii="Times New Roman" w:hAnsi="Times New Roman" w:cs="Times New Roman"/>
           <w:sz w:val="24"/>
         </w:rPr>
-        <w:t xml:space="preserve"> masih menghadapi hambatan konversi yang cukup berat. Laporan liputan media industri dan transportasi (Katadata, 2025; Kompas, 2025) mencatat bahwa meskipun armada </w:t>
+        <w:t xml:space="preserve"> masih menghadapi hambatan konversi yang cukup berat. Laporan survei mobilitas dari GoodStats (2023) dan Institute for Development of Economics and Finance (INDEF, 2023) mencatat bahwa pasar mobilitas perkotaan di Indonesia memiliki tingkat inersia kebiasaan (habitual inertia) yang sangat tinggi; meskipun mayoritas masyarakat (57,7%) memasang lebih dari satu aplikasi transportasi, preferensi penggunaan harian tetap terkunci pada pemain lama, sementara pemain pendatang baru di segmen mobil penumpang hanya mampu menyerap pangsa adopsi di bawah 3%. Hal ini diperparah oleh laporan liputan media industri dan keselamatan transportasi (Katadata, 2025; Kompas, 2025) yang mencatat bahwa tingkat keterisian penumpang dan ritase harian </w:t>
       </w:r>
       <w:r>
         <w:rPr>
@@ -2548,7 +2548,7 @@
           <w:rFonts w:ascii="Times New Roman" w:hAnsi="Times New Roman" w:cs="Times New Roman"/>
           <w:sz w:val="24"/>
         </w:rPr>
-        <w:t xml:space="preserve"> telah aktif beroperasi di jalan protokol Jakarta, tingkat keterisian penumpang dan frekuensi pemesanan harian masih berfluktuasi tajam serta belum mencapai target utilisasi armada yang diharapkan. Kondisi ini dipicu oleh masa awal operasional yang sempat diwarnai sejumlah insiden lalu lintas akibat proses adaptasi teknis para mitra pengemudi terhadap karakteristik akselerasi instan mobil listrik (</w:t>
+        <w:t xml:space="preserve"> di Jakarta masih berfluktuasi tajam serta belum mencapai target utilisasi armada yang diharapkan. Fluktuasi ini dipicu oleh masa awal operasional yang sempat diwarnai sejumlah insiden lalu lintas akibat proses adaptasi teknis para mitra pengemudi terhadap karakteristik akselerasi instan mobil listrik (</w:t>
       </w:r>
       <w:r>
         <w:rPr>
@@ -2582,37 +2582,37 @@
           <w:rFonts w:ascii="Times New Roman" w:hAnsi="Times New Roman" w:cs="Times New Roman"/>
           <w:sz w:val="24"/>
         </w:rPr>
-        <w:t>Fenomena permasalahan keputusan pembelian tersebut terkonfirmasi secara nyata melalui survei pra-penelitian (</w:t>
-      </w:r>
-      <w:r>
-        <w:rPr>
-          <w:rFonts w:ascii="Times New Roman" w:hAnsi="Times New Roman" w:cs="Times New Roman"/>
-          <w:i/>
-          <w:sz w:val="24"/>
-        </w:rPr>
-        <w:t>pre-research survey</w:t>
-      </w:r>
-      <w:r>
-        <w:rPr>
-          <w:rFonts w:ascii="Times New Roman" w:hAnsi="Times New Roman" w:cs="Times New Roman"/>
-          <w:sz w:val="24"/>
-        </w:rPr>
-        <w:t>) yang dilakukan oleh peneliti pada Oktober 2026 terhadap 30 responden masyarakat pengguna transportasi di kawasan Jakarta Barat (meliputi area sentra bisnis Puri Indah, koridor perkantoran Letjen S. Parman, dan kawasan komersial Grogol Petamburan). Hasil survei awal tersebut mengungkapkan sebuah kesenjangan keputusan (</w:t>
-      </w:r>
-      <w:r>
-        <w:rPr>
-          <w:rFonts w:ascii="Times New Roman" w:hAnsi="Times New Roman" w:cs="Times New Roman"/>
-          <w:i/>
-          <w:sz w:val="24"/>
-        </w:rPr>
-        <w:t>purchase decision gap</w:t>
-      </w:r>
-      <w:r>
-        <w:rPr>
-          <w:rFonts w:ascii="Times New Roman" w:hAnsi="Times New Roman" w:cs="Times New Roman"/>
-          <w:sz w:val="24"/>
-        </w:rPr>
-        <w:t>) yang mencolok:</w:t>
+        <w:t xml:space="preserve">Kesenjangan keputusan pembelian ini semakin dipertegas oleh temuan riset perilaku konsumen terhadap kendaraan listrik di Indonesia oleh lembaga riset Populix (2023). Dalam laporan risetnya bertajuk </w:t>
+      </w:r>
+      <w:r>
+        <w:rPr>
+          <w:rFonts w:ascii="Times New Roman" w:hAnsi="Times New Roman" w:cs="Times New Roman"/>
+          <w:i/>
+          <w:sz w:val="24"/>
+        </w:rPr>
+        <w:t>Electric Vehicle</w:t>
+      </w:r>
+      <w:r>
+        <w:rPr>
+          <w:rFonts w:ascii="Times New Roman" w:hAnsi="Times New Roman" w:cs="Times New Roman"/>
+          <w:sz w:val="24"/>
+        </w:rPr>
+        <w:t xml:space="preserve"> Dynamics, Populix (2023) menemukan bahwa meskipun tingkat kesadaran (awareness) masyarakat perkotaan terhadap kendaraan listrik berbasis baterai (BEV) sudah mencapai 65%, konversi menuju tindakan nyata keputusan penggunaan/pembelian (</w:t>
+      </w:r>
+      <w:r>
+        <w:rPr>
+          <w:rFonts w:ascii="Times New Roman" w:hAnsi="Times New Roman" w:cs="Times New Roman"/>
+          <w:i/>
+          <w:sz w:val="24"/>
+        </w:rPr>
+        <w:t>actual purchase decision</w:t>
+      </w:r>
+      <w:r>
+        <w:rPr>
+          <w:rFonts w:ascii="Times New Roman" w:hAnsi="Times New Roman" w:cs="Times New Roman"/>
+          <w:sz w:val="24"/>
+        </w:rPr>
+        <w:t>) masih sangat rendah. Riset Populix (2023) mengungkapkan bahwa keengganan konsumen untuk memutuskan mengadopsi kendaraan listrik dipicu oleh tiga hambatan utama:</w:t>
       </w:r>
     </w:p>
     <w:p>
@@ -2631,37 +2631,22 @@
           <w:rFonts w:ascii="Times New Roman" w:hAnsi="Times New Roman" w:cs="Times New Roman"/>
           <w:sz w:val="24"/>
         </w:rPr>
-        <w:t>1. Sebanyak 83,3% (25 dari 30 responden) menyatakan telah mengenal dan mengetahui (</w:t>
-      </w:r>
-      <w:r>
-        <w:rPr>
-          <w:rFonts w:ascii="Times New Roman" w:hAnsi="Times New Roman" w:cs="Times New Roman"/>
-          <w:i/>
-          <w:sz w:val="24"/>
-        </w:rPr>
-        <w:t>brand awareness</w:t>
-      </w:r>
-      <w:r>
-        <w:rPr>
-          <w:rFonts w:ascii="Times New Roman" w:hAnsi="Times New Roman" w:cs="Times New Roman"/>
-          <w:sz w:val="24"/>
-        </w:rPr>
-        <w:t xml:space="preserve">) keberadaan taksi listrik </w:t>
-      </w:r>
-      <w:r>
-        <w:rPr>
-          <w:rFonts w:ascii="Times New Roman" w:hAnsi="Times New Roman" w:cs="Times New Roman"/>
-          <w:i/>
-          <w:sz w:val="24"/>
-        </w:rPr>
-        <w:t>Green SM</w:t>
-      </w:r>
-      <w:r>
-        <w:rPr>
-          <w:rFonts w:ascii="Times New Roman" w:hAnsi="Times New Roman" w:cs="Times New Roman"/>
-          <w:sz w:val="24"/>
-        </w:rPr>
-        <w:t xml:space="preserve"> di jalanan Jakarta Barat.</w:t>
+        <w:t>1. Kekhawatiran terhadap aspek keselamatan teknis, risiko baterai, dan keandalan di tengah perjalanan (safety and range anxiety) yang dirasakan oleh 65% konsumen (</w:t>
+      </w:r>
+      <w:r>
+        <w:rPr>
+          <w:rFonts w:ascii="Times New Roman" w:hAnsi="Times New Roman" w:cs="Times New Roman"/>
+          <w:i/>
+          <w:sz w:val="24"/>
+        </w:rPr>
+        <w:t>Perceived Safety</w:t>
+      </w:r>
+      <w:r>
+        <w:rPr>
+          <w:rFonts w:ascii="Times New Roman" w:hAnsi="Times New Roman" w:cs="Times New Roman"/>
+          <w:sz w:val="24"/>
+        </w:rPr>
+        <w:t>).</w:t>
       </w:r>
     </w:p>
     <w:p>
@@ -2680,97 +2665,22 @@
           <w:rFonts w:ascii="Times New Roman" w:hAnsi="Times New Roman" w:cs="Times New Roman"/>
           <w:sz w:val="24"/>
         </w:rPr>
-        <w:t>2. Namun demikian, ketika ditanyakan mengenai tindakan nyata penggunaan (</w:t>
-      </w:r>
-      <w:r>
-        <w:rPr>
-          <w:rFonts w:ascii="Times New Roman" w:hAnsi="Times New Roman" w:cs="Times New Roman"/>
-          <w:i/>
-          <w:sz w:val="24"/>
-        </w:rPr>
-        <w:t>Purchase Decision</w:t>
-      </w:r>
-      <w:r>
-        <w:rPr>
-          <w:rFonts w:ascii="Times New Roman" w:hAnsi="Times New Roman" w:cs="Times New Roman"/>
-          <w:sz w:val="24"/>
-        </w:rPr>
-        <w:t xml:space="preserve">), hanya 20,0% (6 responden) yang menyatakan pernah memutuskan untuk memesan dan menggunakan jasa taksi </w:t>
-      </w:r>
-      <w:r>
-        <w:rPr>
-          <w:rFonts w:ascii="Times New Roman" w:hAnsi="Times New Roman" w:cs="Times New Roman"/>
-          <w:i/>
-          <w:sz w:val="24"/>
-        </w:rPr>
-        <w:t>Green SM</w:t>
-      </w:r>
-      <w:r>
-        <w:rPr>
-          <w:rFonts w:ascii="Times New Roman" w:hAnsi="Times New Roman" w:cs="Times New Roman"/>
-          <w:sz w:val="24"/>
-        </w:rPr>
-        <w:t xml:space="preserve"> dalam 3 bulan terakhir. Sebaliknya, sebanyak 80,0% (24 responden) mengaku belum pernah memutuskan menggunakan </w:t>
-      </w:r>
-      <w:r>
-        <w:rPr>
-          <w:rFonts w:ascii="Times New Roman" w:hAnsi="Times New Roman" w:cs="Times New Roman"/>
-          <w:i/>
-          <w:sz w:val="24"/>
-        </w:rPr>
-        <w:t>Green SM</w:t>
-      </w:r>
-      <w:r>
-        <w:rPr>
-          <w:rFonts w:ascii="Times New Roman" w:hAnsi="Times New Roman" w:cs="Times New Roman"/>
-          <w:sz w:val="24"/>
-        </w:rPr>
-        <w:t xml:space="preserve"> dan tetap setia memilih armada </w:t>
-      </w:r>
-      <w:r>
-        <w:rPr>
-          <w:rFonts w:ascii="Times New Roman" w:hAnsi="Times New Roman" w:cs="Times New Roman"/>
-          <w:i/>
-          <w:sz w:val="24"/>
-        </w:rPr>
-        <w:t>Blue Bird</w:t>
-      </w:r>
-      <w:r>
-        <w:rPr>
-          <w:rFonts w:ascii="Times New Roman" w:hAnsi="Times New Roman" w:cs="Times New Roman"/>
-          <w:sz w:val="24"/>
-        </w:rPr>
-        <w:t xml:space="preserve">, </w:t>
-      </w:r>
-      <w:r>
-        <w:rPr>
-          <w:rFonts w:ascii="Times New Roman" w:hAnsi="Times New Roman" w:cs="Times New Roman"/>
-          <w:i/>
-          <w:sz w:val="24"/>
-        </w:rPr>
-        <w:t>GrabCar</w:t>
-      </w:r>
-      <w:r>
-        <w:rPr>
-          <w:rFonts w:ascii="Times New Roman" w:hAnsi="Times New Roman" w:cs="Times New Roman"/>
-          <w:sz w:val="24"/>
-        </w:rPr>
-        <w:t xml:space="preserve">, atau </w:t>
-      </w:r>
-      <w:r>
-        <w:rPr>
-          <w:rFonts w:ascii="Times New Roman" w:hAnsi="Times New Roman" w:cs="Times New Roman"/>
-          <w:i/>
-          <w:sz w:val="24"/>
-        </w:rPr>
-        <w:t>GoCar</w:t>
-      </w:r>
-      <w:r>
-        <w:rPr>
-          <w:rFonts w:ascii="Times New Roman" w:hAnsi="Times New Roman" w:cs="Times New Roman"/>
-          <w:sz w:val="24"/>
-        </w:rPr>
-        <w:t>.</w:t>
+        <w:t>2. Keraguan terhadap ketersediaan infrastruktur pendukung, keandalan operasional, dan kepastian layanan yang dikeluhkan oleh 61% responden (</w:t>
+      </w:r>
+      <w:r>
+        <w:rPr>
+          <w:rFonts w:ascii="Times New Roman" w:hAnsi="Times New Roman" w:cs="Times New Roman"/>
+          <w:i/>
+          <w:sz w:val="24"/>
+        </w:rPr>
+        <w:t>Brand Trust</w:t>
+      </w:r>
+      <w:r>
+        <w:rPr>
+          <w:rFonts w:ascii="Times New Roman" w:hAnsi="Times New Roman" w:cs="Times New Roman"/>
+          <w:sz w:val="24"/>
+        </w:rPr>
+        <w:t>).</w:t>
       </w:r>
     </w:p>
     <w:p>
@@ -2789,124 +2699,7 @@
           <w:rFonts w:ascii="Times New Roman" w:hAnsi="Times New Roman" w:cs="Times New Roman"/>
           <w:sz w:val="24"/>
         </w:rPr>
-        <w:t xml:space="preserve">3. Dari 24 responden yang belum pernah memutuskan menggunakan </w:t>
-      </w:r>
-      <w:r>
-        <w:rPr>
-          <w:rFonts w:ascii="Times New Roman" w:hAnsi="Times New Roman" w:cs="Times New Roman"/>
-          <w:i/>
-          <w:sz w:val="24"/>
-        </w:rPr>
-        <w:t>Green SM</w:t>
-      </w:r>
-      <w:r>
-        <w:rPr>
-          <w:rFonts w:ascii="Times New Roman" w:hAnsi="Times New Roman" w:cs="Times New Roman"/>
-          <w:sz w:val="24"/>
-        </w:rPr>
-        <w:t>, alasan dan faktor keraguan utama yang mereka kemukakan adalah:</w:t>
-      </w:r>
-    </w:p>
-    <w:p>
-      <w:pPr>
-        <w:keepNext/>
-        <w:spacing w:after="80" w:line="360" w:lineRule="auto"/>
-        <w:ind w:firstLine="425"/>
-        <w:jc w:val="both"/>
-        <w:rPr>
-          <w:rFonts w:ascii="Times New Roman" w:hAnsi="Times New Roman" w:cs="Times New Roman"/>
-          <w:sz w:val="24"/>
-        </w:rPr>
-      </w:pPr>
-      <w:r>
-        <w:rPr>
-          <w:rFonts w:ascii="Times New Roman" w:hAnsi="Times New Roman" w:cs="Times New Roman"/>
-          <w:sz w:val="24"/>
-        </w:rPr>
-        <w:t>- 70,8% (17 responden) meragukan aspek jaminan keselamatan dan keamanan teknis baterai mobil listrik di jalan raya ibu kota (</w:t>
-      </w:r>
-      <w:r>
-        <w:rPr>
-          <w:rFonts w:ascii="Times New Roman" w:hAnsi="Times New Roman" w:cs="Times New Roman"/>
-          <w:i/>
-          <w:sz w:val="24"/>
-        </w:rPr>
-        <w:t>Perceived Safety</w:t>
-      </w:r>
-      <w:r>
-        <w:rPr>
-          <w:rFonts w:ascii="Times New Roman" w:hAnsi="Times New Roman" w:cs="Times New Roman"/>
-          <w:sz w:val="24"/>
-        </w:rPr>
-        <w:t>).</w:t>
-      </w:r>
-    </w:p>
-    <w:p>
-      <w:pPr>
-        <w:keepNext/>
-        <w:spacing w:after="80" w:line="360" w:lineRule="auto"/>
-        <w:ind w:firstLine="425"/>
-        <w:jc w:val="both"/>
-        <w:rPr>
-          <w:rFonts w:ascii="Times New Roman" w:hAnsi="Times New Roman" w:cs="Times New Roman"/>
-          <w:sz w:val="24"/>
-        </w:rPr>
-      </w:pPr>
-      <w:r>
-        <w:rPr>
-          <w:rFonts w:ascii="Times New Roman" w:hAnsi="Times New Roman" w:cs="Times New Roman"/>
-          <w:sz w:val="24"/>
-        </w:rPr>
-        <w:t>- 62,5% (15 responden) merasa belum memiliki keyakinan penuh terhadap keandalan operasional, ketepatan waktu penjemputan, serta integritas tarif argo pengemudi (</w:t>
-      </w:r>
-      <w:r>
-        <w:rPr>
-          <w:rFonts w:ascii="Times New Roman" w:hAnsi="Times New Roman" w:cs="Times New Roman"/>
-          <w:i/>
-          <w:sz w:val="24"/>
-        </w:rPr>
-        <w:t>Brand Trust</w:t>
-      </w:r>
-      <w:r>
-        <w:rPr>
-          <w:rFonts w:ascii="Times New Roman" w:hAnsi="Times New Roman" w:cs="Times New Roman"/>
-          <w:sz w:val="24"/>
-        </w:rPr>
-        <w:t>).</w:t>
-      </w:r>
-    </w:p>
-    <w:p>
-      <w:pPr>
-        <w:keepNext/>
-        <w:spacing w:after="80" w:line="360" w:lineRule="auto"/>
-        <w:ind w:firstLine="425"/>
-        <w:jc w:val="both"/>
-        <w:rPr>
-          <w:rFonts w:ascii="Times New Roman" w:hAnsi="Times New Roman" w:cs="Times New Roman"/>
-          <w:sz w:val="24"/>
-        </w:rPr>
-      </w:pPr>
-      <w:r>
-        <w:rPr>
-          <w:rFonts w:ascii="Times New Roman" w:hAnsi="Times New Roman" w:cs="Times New Roman"/>
-          <w:sz w:val="24"/>
-        </w:rPr>
-        <w:t xml:space="preserve">- 58,3% (14 responden) menilai reputasi dan citra merek </w:t>
-      </w:r>
-      <w:r>
-        <w:rPr>
-          <w:rFonts w:ascii="Times New Roman" w:hAnsi="Times New Roman" w:cs="Times New Roman"/>
-          <w:i/>
-          <w:sz w:val="24"/>
-        </w:rPr>
-        <w:t>Green SM</w:t>
-      </w:r>
-      <w:r>
-        <w:rPr>
-          <w:rFonts w:ascii="Times New Roman" w:hAnsi="Times New Roman" w:cs="Times New Roman"/>
-          <w:sz w:val="24"/>
-        </w:rPr>
-        <w:t xml:space="preserve"> masih sangat baru dan belum teruji (unproven) jika dibandingkan dengan reputasi puluhan tahun yang dimiliki oleh para kompetitor mapan (</w:t>
+        <w:t>3. Persepsi terhadap reputasi merek baru yang belum teruji (unproven brand) dibandingkan dengan merek transportasi mapan yang telah dikenal puluhan tahun (</w:t>
       </w:r>
       <w:r>
         <w:rPr>
@@ -2940,7 +2733,7 @@
           <w:rFonts w:ascii="Times New Roman" w:hAnsi="Times New Roman" w:cs="Times New Roman"/>
           <w:sz w:val="24"/>
         </w:rPr>
-        <w:t>Kesenjangan empiris antara tingginya pengenalan merek (awareness) dengan masih rendahnya keputusan penggunaan nyata (</w:t>
+        <w:t>Kesenjangan empiris antara tingginya pengenalan armada (awareness) dengan masih rendahnya keputusan penggunaan nyata (</w:t>
       </w:r>
       <w:r>
         <w:rPr>
@@ -3000,7 +2793,7 @@
           <w:rFonts w:ascii="Times New Roman" w:hAnsi="Times New Roman" w:cs="Times New Roman"/>
           <w:sz w:val="24"/>
         </w:rPr>
-        <w:t xml:space="preserve"> tidak terjadi secara spontan, melainkan dipengaruhi secara simultan oleh evaluasi kognitif dan persepsi risiko konsumen. Berdasarkan telaah teoritis dan fenomena empiris tersebut, terdapat tiga faktor determinan fundamental yang memengaruhi keputusan konsumen dalam menggunakan jasa taksi </w:t>
+        <w:t xml:space="preserve"> tidak terjadi secara spontan, melainkan dipengaruhi secara simultan oleh evaluasi kognitif dan persepsi risiko konsumen. Berdasarkan telaah teoritis dan fenomena empiris dari berbagai laporan riset tersebut, terdapat tiga faktor determinan fundamental yang memengaruhi keputusan konsumen dalam menggunakan jasa taksi </w:t>
       </w:r>
       <w:r>
         <w:rPr>
@@ -18439,7 +18232,22 @@
           <w:rFonts w:ascii="Times New Roman" w:hAnsi="Times New Roman" w:cs="Times New Roman"/>
           <w:sz w:val="24"/>
         </w:rPr>
-        <w:t>Hair, J. F., Black, W. C., Babin, B. J., &amp; Anderson, R. E. (2019). Multivariate data analysis (8th ed.). Cengage Learning.</w:t>
+        <w:t xml:space="preserve">GoodStats. (2023). Survei perilaku pengguna dan preferensi aplikasi transportasi </w:t>
+      </w:r>
+      <w:r>
+        <w:rPr>
+          <w:rFonts w:ascii="Times New Roman" w:hAnsi="Times New Roman" w:cs="Times New Roman"/>
+          <w:i/>
+          <w:sz w:val="24"/>
+        </w:rPr>
+        <w:t>online</w:t>
+      </w:r>
+      <w:r>
+        <w:rPr>
+          <w:rFonts w:ascii="Times New Roman" w:hAnsi="Times New Roman" w:cs="Times New Roman"/>
+          <w:sz w:val="24"/>
+        </w:rPr>
+        <w:t xml:space="preserve"> di Indonesia. GoodStats Data &amp; Research. https://goodstats.id</w:t>
       </w:r>
     </w:p>
     <w:p>
@@ -18458,7 +18266,7 @@
           <w:rFonts w:ascii="Times New Roman" w:hAnsi="Times New Roman" w:cs="Times New Roman"/>
           <w:sz w:val="24"/>
         </w:rPr>
-        <w:t>International Energy Agency. (2023). Global EV outlook 2023: Catching up with climate targets. IEA Publications. https://doi.org/10.1787/d4349524-en</w:t>
+        <w:t>Hair, J. F., Black, W. C., Babin, B. J., &amp; Anderson, R. E. (2019). Multivariate data analysis (8th ed.). Cengage Learning.</w:t>
       </w:r>
     </w:p>
     <w:p>
@@ -18477,7 +18285,22 @@
           <w:rFonts w:ascii="Times New Roman" w:hAnsi="Times New Roman" w:cs="Times New Roman"/>
           <w:sz w:val="24"/>
         </w:rPr>
-        <w:t>Katadata. (2025). Tantangan adaptasi teknologi dan dinamika operasional taksi listrik di Jakarta. Katadata Indonesia. https://katadata.co.id</w:t>
+        <w:t xml:space="preserve">Institute for Development of Economics and Finance. (2023). Dinamika persaingan dan perilaku konsumen industri transportasi </w:t>
+      </w:r>
+      <w:r>
+        <w:rPr>
+          <w:rFonts w:ascii="Times New Roman" w:hAnsi="Times New Roman" w:cs="Times New Roman"/>
+          <w:i/>
+          <w:sz w:val="24"/>
+        </w:rPr>
+        <w:t>online</w:t>
+      </w:r>
+      <w:r>
+        <w:rPr>
+          <w:rFonts w:ascii="Times New Roman" w:hAnsi="Times New Roman" w:cs="Times New Roman"/>
+          <w:sz w:val="24"/>
+        </w:rPr>
+        <w:t xml:space="preserve"> di Indonesia. INDEF Policy Report. https://indef.or.id</w:t>
       </w:r>
     </w:p>
     <w:p>
@@ -18496,22 +18319,7 @@
           <w:rFonts w:ascii="Times New Roman" w:hAnsi="Times New Roman" w:cs="Times New Roman"/>
           <w:sz w:val="24"/>
         </w:rPr>
-        <w:t xml:space="preserve">Keller, K. L. (1993). Conceptualizing, measuring, and managing </w:t>
-      </w:r>
-      <w:r>
-        <w:rPr>
-          <w:rFonts w:ascii="Times New Roman" w:hAnsi="Times New Roman" w:cs="Times New Roman"/>
-          <w:i/>
-          <w:sz w:val="24"/>
-        </w:rPr>
-        <w:t>customer-based brand equity</w:t>
-      </w:r>
-      <w:r>
-        <w:rPr>
-          <w:rFonts w:ascii="Times New Roman" w:hAnsi="Times New Roman" w:cs="Times New Roman"/>
-          <w:sz w:val="24"/>
-        </w:rPr>
-        <w:t>. Journal of Marketing, 57(1), 1–22. https://doi.org/10.1177/002224299305700101</w:t>
+        <w:t>International Energy Agency. (2023). Global EV outlook 2023: Catching up with climate targets. IEA Publications. https://doi.org/10.1787/d4349524-en</w:t>
       </w:r>
     </w:p>
     <w:p>
@@ -18530,37 +18338,7 @@
           <w:rFonts w:ascii="Times New Roman" w:hAnsi="Times New Roman" w:cs="Times New Roman"/>
           <w:sz w:val="24"/>
         </w:rPr>
-        <w:t xml:space="preserve">Keller, K. L., &amp; Swaminathan, V. (2020). Strategic </w:t>
-      </w:r>
-      <w:r>
-        <w:rPr>
-          <w:rFonts w:ascii="Times New Roman" w:hAnsi="Times New Roman" w:cs="Times New Roman"/>
-          <w:i/>
-          <w:sz w:val="24"/>
-        </w:rPr>
-        <w:t>brand management</w:t>
-      </w:r>
-      <w:r>
-        <w:rPr>
-          <w:rFonts w:ascii="Times New Roman" w:hAnsi="Times New Roman" w:cs="Times New Roman"/>
-          <w:sz w:val="24"/>
-        </w:rPr>
-        <w:t xml:space="preserve">: Building, measuring, and managing </w:t>
-      </w:r>
-      <w:r>
-        <w:rPr>
-          <w:rFonts w:ascii="Times New Roman" w:hAnsi="Times New Roman" w:cs="Times New Roman"/>
-          <w:i/>
-          <w:sz w:val="24"/>
-        </w:rPr>
-        <w:t>brand equity</w:t>
-      </w:r>
-      <w:r>
-        <w:rPr>
-          <w:rFonts w:ascii="Times New Roman" w:hAnsi="Times New Roman" w:cs="Times New Roman"/>
-          <w:sz w:val="24"/>
-        </w:rPr>
-        <w:t xml:space="preserve"> (5th ed.). Pearson Education.</w:t>
+        <w:t>Katadata. (2025). Tantangan adaptasi teknologi dan dinamika operasional taksi listrik di Jakarta. Katadata Indonesia. https://katadata.co.id</w:t>
       </w:r>
     </w:p>
     <w:p>
@@ -18579,7 +18357,22 @@
           <w:rFonts w:ascii="Times New Roman" w:hAnsi="Times New Roman" w:cs="Times New Roman"/>
           <w:sz w:val="24"/>
         </w:rPr>
-        <w:t>Kompas. (2025). Evaluasi keselamatan berkendara dan kesiapan pengemudi angkutan listrik komersial di ibu kota. Kompas.com. https://otomotif.kompas.com</w:t>
+        <w:t xml:space="preserve">Keller, K. L. (1993). Conceptualizing, measuring, and managing </w:t>
+      </w:r>
+      <w:r>
+        <w:rPr>
+          <w:rFonts w:ascii="Times New Roman" w:hAnsi="Times New Roman" w:cs="Times New Roman"/>
+          <w:i/>
+          <w:sz w:val="24"/>
+        </w:rPr>
+        <w:t>customer-based brand equity</w:t>
+      </w:r>
+      <w:r>
+        <w:rPr>
+          <w:rFonts w:ascii="Times New Roman" w:hAnsi="Times New Roman" w:cs="Times New Roman"/>
+          <w:sz w:val="24"/>
+        </w:rPr>
+        <w:t>. Journal of Marketing, 57(1), 1–22. https://doi.org/10.1177/002224299305700101</w:t>
       </w:r>
     </w:p>
     <w:p>
@@ -18598,7 +18391,37 @@
           <w:rFonts w:ascii="Times New Roman" w:hAnsi="Times New Roman" w:cs="Times New Roman"/>
           <w:sz w:val="24"/>
         </w:rPr>
-        <w:t>Kotler, P., Keller, K. L., &amp; Chernev, A. (2022). Marketing management (16th ed.). Pearson Education.</w:t>
+        <w:t xml:space="preserve">Keller, K. L., &amp; Swaminathan, V. (2020). Strategic </w:t>
+      </w:r>
+      <w:r>
+        <w:rPr>
+          <w:rFonts w:ascii="Times New Roman" w:hAnsi="Times New Roman" w:cs="Times New Roman"/>
+          <w:i/>
+          <w:sz w:val="24"/>
+        </w:rPr>
+        <w:t>brand management</w:t>
+      </w:r>
+      <w:r>
+        <w:rPr>
+          <w:rFonts w:ascii="Times New Roman" w:hAnsi="Times New Roman" w:cs="Times New Roman"/>
+          <w:sz w:val="24"/>
+        </w:rPr>
+        <w:t xml:space="preserve">: Building, measuring, and managing </w:t>
+      </w:r>
+      <w:r>
+        <w:rPr>
+          <w:rFonts w:ascii="Times New Roman" w:hAnsi="Times New Roman" w:cs="Times New Roman"/>
+          <w:i/>
+          <w:sz w:val="24"/>
+        </w:rPr>
+        <w:t>brand equity</w:t>
+      </w:r>
+      <w:r>
+        <w:rPr>
+          <w:rFonts w:ascii="Times New Roman" w:hAnsi="Times New Roman" w:cs="Times New Roman"/>
+          <w:sz w:val="24"/>
+        </w:rPr>
+        <w:t xml:space="preserve"> (5th ed.). Pearson Education.</w:t>
       </w:r>
     </w:p>
     <w:p>
@@ -18617,22 +18440,7 @@
           <w:rFonts w:ascii="Times New Roman" w:hAnsi="Times New Roman" w:cs="Times New Roman"/>
           <w:sz w:val="24"/>
         </w:rPr>
-        <w:t xml:space="preserve">Lemeshow, S., Hosmer, D. W., Klar, J., &amp; Lwanga, S. K. (1997). Adequacy of </w:t>
-      </w:r>
-      <w:r>
-        <w:rPr>
-          <w:rFonts w:ascii="Times New Roman" w:hAnsi="Times New Roman" w:cs="Times New Roman"/>
-          <w:i/>
-          <w:sz w:val="24"/>
-        </w:rPr>
-        <w:t>sample size</w:t>
-      </w:r>
-      <w:r>
-        <w:rPr>
-          <w:rFonts w:ascii="Times New Roman" w:hAnsi="Times New Roman" w:cs="Times New Roman"/>
-          <w:sz w:val="24"/>
-        </w:rPr>
-        <w:t xml:space="preserve"> in health studies. John Wiley &amp; Sons.</w:t>
+        <w:t>Kompas. (2025). Evaluasi keselamatan berkendara dan kesiapan pengemudi angkutan listrik komersial di ibu kota. Kompas.com. https://otomotif.kompas.com</w:t>
       </w:r>
     </w:p>
     <w:p>
@@ -18651,22 +18459,7 @@
           <w:rFonts w:ascii="Times New Roman" w:hAnsi="Times New Roman" w:cs="Times New Roman"/>
           <w:sz w:val="24"/>
         </w:rPr>
-        <w:t xml:space="preserve">Mirae Asset Sekuritas Indonesia. (2023). Indonesia mobility sector update: Navigating duopoly competition and profitability in </w:t>
-      </w:r>
-      <w:r>
-        <w:rPr>
-          <w:rFonts w:ascii="Times New Roman" w:hAnsi="Times New Roman" w:cs="Times New Roman"/>
-          <w:i/>
-          <w:sz w:val="24"/>
-        </w:rPr>
-        <w:t>ride-hailing</w:t>
-      </w:r>
-      <w:r>
-        <w:rPr>
-          <w:rFonts w:ascii="Times New Roman" w:hAnsi="Times New Roman" w:cs="Times New Roman"/>
-          <w:sz w:val="24"/>
-        </w:rPr>
-        <w:t xml:space="preserve"> services. Research Report, Mirae Asset Sekuritas.</w:t>
+        <w:t>Kotler, P., Keller, K. L., &amp; Chernev, A. (2022). Marketing management (16th ed.). Pearson Education.</w:t>
       </w:r>
     </w:p>
     <w:p>
@@ -18685,7 +18478,109 @@
           <w:rFonts w:ascii="Times New Roman" w:hAnsi="Times New Roman" w:cs="Times New Roman"/>
           <w:sz w:val="24"/>
         </w:rPr>
+        <w:t xml:space="preserve">Lemeshow, S., Hosmer, D. W., Klar, J., &amp; Lwanga, S. K. (1997). Adequacy of </w:t>
+      </w:r>
+      <w:r>
+        <w:rPr>
+          <w:rFonts w:ascii="Times New Roman" w:hAnsi="Times New Roman" w:cs="Times New Roman"/>
+          <w:i/>
+          <w:sz w:val="24"/>
+        </w:rPr>
+        <w:t>sample size</w:t>
+      </w:r>
+      <w:r>
+        <w:rPr>
+          <w:rFonts w:ascii="Times New Roman" w:hAnsi="Times New Roman" w:cs="Times New Roman"/>
+          <w:sz w:val="24"/>
+        </w:rPr>
+        <w:t xml:space="preserve"> in health studies. John Wiley &amp; Sons.</w:t>
+      </w:r>
+    </w:p>
+    <w:p>
+      <w:pPr>
+        <w:keepNext/>
+        <w:spacing w:after="120" w:line="360" w:lineRule="auto"/>
+        <w:ind w:firstLine="709"/>
+        <w:jc w:val="both"/>
+        <w:rPr>
+          <w:rFonts w:ascii="Times New Roman" w:hAnsi="Times New Roman" w:cs="Times New Roman"/>
+          <w:sz w:val="24"/>
+        </w:rPr>
+      </w:pPr>
+      <w:r>
+        <w:rPr>
+          <w:rFonts w:ascii="Times New Roman" w:hAnsi="Times New Roman" w:cs="Times New Roman"/>
+          <w:sz w:val="24"/>
+        </w:rPr>
+        <w:t xml:space="preserve">Mirae Asset Sekuritas Indonesia. (2023). Indonesia mobility sector update: Navigating duopoly competition and profitability in </w:t>
+      </w:r>
+      <w:r>
+        <w:rPr>
+          <w:rFonts w:ascii="Times New Roman" w:hAnsi="Times New Roman" w:cs="Times New Roman"/>
+          <w:i/>
+          <w:sz w:val="24"/>
+        </w:rPr>
+        <w:t>ride-hailing</w:t>
+      </w:r>
+      <w:r>
+        <w:rPr>
+          <w:rFonts w:ascii="Times New Roman" w:hAnsi="Times New Roman" w:cs="Times New Roman"/>
+          <w:sz w:val="24"/>
+        </w:rPr>
+        <w:t xml:space="preserve"> services. Research Report, Mirae Asset Sekuritas.</w:t>
+      </w:r>
+    </w:p>
+    <w:p>
+      <w:pPr>
+        <w:keepNext/>
+        <w:spacing w:after="120" w:line="360" w:lineRule="auto"/>
+        <w:ind w:firstLine="709"/>
+        <w:jc w:val="both"/>
+        <w:rPr>
+          <w:rFonts w:ascii="Times New Roman" w:hAnsi="Times New Roman" w:cs="Times New Roman"/>
+          <w:sz w:val="24"/>
+        </w:rPr>
+      </w:pPr>
+      <w:r>
+        <w:rPr>
+          <w:rFonts w:ascii="Times New Roman" w:hAnsi="Times New Roman" w:cs="Times New Roman"/>
+          <w:sz w:val="24"/>
+        </w:rPr>
         <w:t>Pemerintah Provinsi Daerah Khusus Ibukota Jakarta. (2021). Peraturan Gubernur Daerah Khusus Ibukota Jakarta Nomor 90 Tahun 2021 tentang Rencana Pembangunan Rendah Karbon Daerah yang Berketahanan Iklim. Berita Daerah Provinsi Daerah Khusus Ibukota Jakarta Tahun 2021 Nomor 62024.</w:t>
+      </w:r>
+    </w:p>
+    <w:p>
+      <w:pPr>
+        <w:keepNext/>
+        <w:spacing w:after="120" w:line="360" w:lineRule="auto"/>
+        <w:ind w:firstLine="709"/>
+        <w:jc w:val="both"/>
+        <w:rPr>
+          <w:rFonts w:ascii="Times New Roman" w:hAnsi="Times New Roman" w:cs="Times New Roman"/>
+          <w:sz w:val="24"/>
+        </w:rPr>
+      </w:pPr>
+      <w:r>
+        <w:rPr>
+          <w:rFonts w:ascii="Times New Roman" w:hAnsi="Times New Roman" w:cs="Times New Roman"/>
+          <w:sz w:val="24"/>
+        </w:rPr>
+        <w:t xml:space="preserve">Populix. (2023). </w:t>
+      </w:r>
+      <w:r>
+        <w:rPr>
+          <w:rFonts w:ascii="Times New Roman" w:hAnsi="Times New Roman" w:cs="Times New Roman"/>
+          <w:i/>
+          <w:sz w:val="24"/>
+        </w:rPr>
+        <w:t>Electric vehicle</w:t>
+      </w:r>
+      <w:r>
+        <w:rPr>
+          <w:rFonts w:ascii="Times New Roman" w:hAnsi="Times New Roman" w:cs="Times New Roman"/>
+          <w:sz w:val="24"/>
+        </w:rPr>
+        <w:t xml:space="preserve"> dynamics: Unveiling consumer perspectives and market insights in Indonesia. Populix Consumer Insights Report. https://populix.co</w:t>
       </w:r>
     </w:p>
     <w:p>
@@ -26896,7 +26791,7 @@
     <w:link w:val="Heading1Char"/>
     <w:uiPriority w:val="9"/>
     <w:qFormat/>
-    <w:rsid w:val="00E639E3"/>
+    <w:rsid w:val="00296336"/>
     <w:pPr>
       <w:keepNext/>
       <w:keepLines/>
@@ -26919,7 +26814,7 @@
     <w:semiHidden/>
     <w:unhideWhenUsed/>
     <w:qFormat/>
-    <w:rsid w:val="00E639E3"/>
+    <w:rsid w:val="00296336"/>
     <w:pPr>
       <w:keepNext/>
       <w:keepLines/>
@@ -26942,7 +26837,7 @@
     <w:semiHidden/>
     <w:unhideWhenUsed/>
     <w:qFormat/>
-    <w:rsid w:val="00E639E3"/>
+    <w:rsid w:val="00296336"/>
     <w:pPr>
       <w:keepNext/>
       <w:keepLines/>
@@ -26965,7 +26860,7 @@
     <w:semiHidden/>
     <w:unhideWhenUsed/>
     <w:qFormat/>
-    <w:rsid w:val="00E639E3"/>
+    <w:rsid w:val="00296336"/>
     <w:pPr>
       <w:keepNext/>
       <w:keepLines/>
@@ -26988,7 +26883,7 @@
     <w:semiHidden/>
     <w:unhideWhenUsed/>
     <w:qFormat/>
-    <w:rsid w:val="00E639E3"/>
+    <w:rsid w:val="00296336"/>
     <w:pPr>
       <w:keepNext/>
       <w:keepLines/>
@@ -27009,7 +26904,7 @@
     <w:semiHidden/>
     <w:unhideWhenUsed/>
     <w:qFormat/>
-    <w:rsid w:val="00E639E3"/>
+    <w:rsid w:val="00296336"/>
     <w:pPr>
       <w:keepNext/>
       <w:keepLines/>
@@ -27032,7 +26927,7 @@
     <w:semiHidden/>
     <w:unhideWhenUsed/>
     <w:qFormat/>
-    <w:rsid w:val="00E639E3"/>
+    <w:rsid w:val="00296336"/>
     <w:pPr>
       <w:keepNext/>
       <w:keepLines/>
@@ -27053,7 +26948,7 @@
     <w:semiHidden/>
     <w:unhideWhenUsed/>
     <w:qFormat/>
-    <w:rsid w:val="00E639E3"/>
+    <w:rsid w:val="00296336"/>
     <w:pPr>
       <w:keepNext/>
       <w:keepLines/>
@@ -27076,7 +26971,7 @@
     <w:semiHidden/>
     <w:unhideWhenUsed/>
     <w:qFormat/>
-    <w:rsid w:val="00E639E3"/>
+    <w:rsid w:val="00296336"/>
     <w:pPr>
       <w:keepNext/>
       <w:keepLines/>
@@ -27120,7 +27015,7 @@
     <w:basedOn w:val="DefaultParagraphFont"/>
     <w:link w:val="Heading1"/>
     <w:uiPriority w:val="9"/>
-    <w:rsid w:val="00E639E3"/>
+    <w:rsid w:val="00296336"/>
     <w:rPr>
       <w:rFonts w:asciiTheme="majorHAnsi" w:eastAsiaTheme="majorEastAsia" w:hAnsiTheme="majorHAnsi" w:cstheme="majorBidi"/>
       <w:color w:val="2F5496" w:themeColor="accent1" w:themeShade="BF"/>
@@ -27134,7 +27029,7 @@
     <w:link w:val="Heading2"/>
     <w:uiPriority w:val="9"/>
     <w:semiHidden/>
-    <w:rsid w:val="00E639E3"/>
+    <w:rsid w:val="00296336"/>
     <w:rPr>
       <w:rFonts w:asciiTheme="majorHAnsi" w:eastAsiaTheme="majorEastAsia" w:hAnsiTheme="majorHAnsi" w:cstheme="majorBidi"/>
       <w:color w:val="2F5496" w:themeColor="accent1" w:themeShade="BF"/>
@@ -27148,7 +27043,7 @@
     <w:link w:val="Heading3"/>
     <w:uiPriority w:val="9"/>
     <w:semiHidden/>
-    <w:rsid w:val="00E639E3"/>
+    <w:rsid w:val="00296336"/>
     <w:rPr>
       <w:rFonts w:eastAsiaTheme="majorEastAsia" w:cstheme="majorBidi"/>
       <w:color w:val="2F5496" w:themeColor="accent1" w:themeShade="BF"/>
@@ -27162,7 +27057,7 @@
     <w:link w:val="Heading4"/>
     <w:uiPriority w:val="9"/>
     <w:semiHidden/>
-    <w:rsid w:val="00E639E3"/>
+    <w:rsid w:val="00296336"/>
     <w:rPr>
       <w:rFonts w:eastAsiaTheme="majorEastAsia" w:cstheme="majorBidi"/>
       <w:i/>
@@ -27176,7 +27071,7 @@
     <w:link w:val="Heading5"/>
     <w:uiPriority w:val="9"/>
     <w:semiHidden/>
-    <w:rsid w:val="00E639E3"/>
+    <w:rsid w:val="00296336"/>
     <w:rPr>
       <w:rFonts w:eastAsiaTheme="majorEastAsia" w:cstheme="majorBidi"/>
       <w:color w:val="2F5496" w:themeColor="accent1" w:themeShade="BF"/>
@@ -27188,7 +27083,7 @@
     <w:link w:val="Heading6"/>
     <w:uiPriority w:val="9"/>
     <w:semiHidden/>
-    <w:rsid w:val="00E639E3"/>
+    <w:rsid w:val="00296336"/>
     <w:rPr>
       <w:rFonts w:eastAsiaTheme="majorEastAsia" w:cstheme="majorBidi"/>
       <w:i/>
@@ -27202,7 +27097,7 @@
     <w:link w:val="Heading7"/>
     <w:uiPriority w:val="9"/>
     <w:semiHidden/>
-    <w:rsid w:val="00E639E3"/>
+    <w:rsid w:val="00296336"/>
     <w:rPr>
       <w:rFonts w:eastAsiaTheme="majorEastAsia" w:cstheme="majorBidi"/>
       <w:color w:val="595959" w:themeColor="text1" w:themeTint="A6"/>
@@ -27214,7 +27109,7 @@
     <w:link w:val="Heading8"/>
     <w:uiPriority w:val="9"/>
     <w:semiHidden/>
-    <w:rsid w:val="00E639E3"/>
+    <w:rsid w:val="00296336"/>
     <w:rPr>
       <w:rFonts w:eastAsiaTheme="majorEastAsia" w:cstheme="majorBidi"/>
       <w:i/>
@@ -27228,7 +27123,7 @@
     <w:link w:val="Heading9"/>
     <w:uiPriority w:val="9"/>
     <w:semiHidden/>
-    <w:rsid w:val="00E639E3"/>
+    <w:rsid w:val="00296336"/>
     <w:rPr>
       <w:rFonts w:eastAsiaTheme="majorEastAsia" w:cstheme="majorBidi"/>
       <w:color w:val="272727" w:themeColor="text1" w:themeTint="D8"/>
@@ -27241,7 +27136,7 @@
     <w:link w:val="TitleChar"/>
     <w:uiPriority w:val="10"/>
     <w:qFormat/>
-    <w:rsid w:val="00E639E3"/>
+    <w:rsid w:val="00296336"/>
     <w:pPr>
       <w:spacing w:after="80" w:line="240" w:lineRule="auto"/>
       <w:contextualSpacing/>
@@ -27259,7 +27154,7 @@
     <w:basedOn w:val="DefaultParagraphFont"/>
     <w:link w:val="Title"/>
     <w:uiPriority w:val="10"/>
-    <w:rsid w:val="00E639E3"/>
+    <w:rsid w:val="00296336"/>
     <w:rPr>
       <w:rFonts w:asciiTheme="majorHAnsi" w:eastAsiaTheme="majorEastAsia" w:hAnsiTheme="majorHAnsi" w:cstheme="majorBidi"/>
       <w:spacing w:val="-10"/>
@@ -27275,7 +27170,7 @@
     <w:link w:val="SubtitleChar"/>
     <w:uiPriority w:val="11"/>
     <w:qFormat/>
-    <w:rsid w:val="00E639E3"/>
+    <w:rsid w:val="00296336"/>
     <w:pPr>
       <w:numPr>
         <w:ilvl w:val="1"/>
@@ -27294,7 +27189,7 @@
     <w:basedOn w:val="DefaultParagraphFont"/>
     <w:link w:val="Subtitle"/>
     <w:uiPriority w:val="11"/>
-    <w:rsid w:val="00E639E3"/>
+    <w:rsid w:val="00296336"/>
     <w:rPr>
       <w:rFonts w:eastAsiaTheme="majorEastAsia" w:cstheme="majorBidi"/>
       <w:color w:val="595959" w:themeColor="text1" w:themeTint="A6"/>
@@ -27310,7 +27205,7 @@
     <w:link w:val="QuoteChar"/>
     <w:uiPriority w:val="29"/>
     <w:qFormat/>
-    <w:rsid w:val="00E639E3"/>
+    <w:rsid w:val="00296336"/>
     <w:pPr>
       <w:spacing w:before="160"/>
       <w:jc w:val="center"/>
@@ -27326,7 +27221,7 @@
     <w:basedOn w:val="DefaultParagraphFont"/>
     <w:link w:val="Quote"/>
     <w:uiPriority w:val="29"/>
-    <w:rsid w:val="00E639E3"/>
+    <w:rsid w:val="00296336"/>
     <w:rPr>
       <w:i/>
       <w:iCs/>
@@ -27338,7 +27233,7 @@
     <w:basedOn w:val="Normal"/>
     <w:uiPriority w:val="34"/>
     <w:qFormat/>
-    <w:rsid w:val="00E639E3"/>
+    <w:rsid w:val="00296336"/>
     <w:pPr>
       <w:ind w:left="720"/>
       <w:contextualSpacing/>
@@ -27349,7 +27244,7 @@
     <w:basedOn w:val="DefaultParagraphFont"/>
     <w:uiPriority w:val="21"/>
     <w:qFormat/>
-    <w:rsid w:val="00E639E3"/>
+    <w:rsid w:val="00296336"/>
     <w:rPr>
       <w:i/>
       <w:iCs/>
@@ -27363,7 +27258,7 @@
     <w:link w:val="IntenseQuoteChar"/>
     <w:uiPriority w:val="30"/>
     <w:qFormat/>
-    <w:rsid w:val="00E639E3"/>
+    <w:rsid w:val="00296336"/>
     <w:pPr>
       <w:pBdr>
         <w:top w:val="single" w:sz="4" w:space="10" w:color="2F5496" w:themeColor="accent1" w:themeShade="BF"/>
@@ -27384,7 +27279,7 @@
     <w:basedOn w:val="DefaultParagraphFont"/>
     <w:link w:val="IntenseQuote"/>
     <w:uiPriority w:val="30"/>
-    <w:rsid w:val="00E639E3"/>
+    <w:rsid w:val="00296336"/>
     <w:rPr>
       <w:i/>
       <w:iCs/>
@@ -27396,7 +27291,7 @@
     <w:basedOn w:val="DefaultParagraphFont"/>
     <w:uiPriority w:val="32"/>
     <w:qFormat/>
-    <w:rsid w:val="00E639E3"/>
+    <w:rsid w:val="00296336"/>
     <w:rPr>
       <w:b/>
       <w:bCs/>

</xml_diff>

<commit_message>
feat(teori): perbarui tahun publikasi resmi riset Populix menjadi 2024 dan GoodStats 2024
</commit_message>
<xml_diff>
--- a/TOPIK_2_TAKSI_GREEN_SM/01_Naskah_Utama/Proposal_Skripsi_Taksi_Green_SM.docx
+++ b/TOPIK_2_TAKSI_GREEN_SM/01_Naskah_Utama/Proposal_Skripsi_Taksi_Green_SM.docx
@@ -12,16 +12,16 @@
           <w:noProof/>
         </w:rPr>
         <w:drawing>
-          <wp:inline distT="0" distB="0" distL="0" distR="0" wp14:anchorId="44B59B5F" wp14:editId="55B4515A">
+          <wp:inline distT="0" distB="0" distL="0" distR="0" wp14:anchorId="4F82AB3D" wp14:editId="7390DFD3">
             <wp:extent cx="1152002" cy="1152002"/>
             <wp:effectExtent l="0" t="0" r="0" b="0"/>
-            <wp:docPr id="555924697" name="Picture 1"/>
+            <wp:docPr id="761723964" name="Picture 1"/>
             <wp:cNvGraphicFramePr/>
             <a:graphic xmlns:a="http://schemas.openxmlformats.org/drawingml/2006/main">
               <a:graphicData uri="http://schemas.openxmlformats.org/drawingml/2006/picture">
                 <pic:pic xmlns:pic="http://schemas.openxmlformats.org/drawingml/2006/picture">
                   <pic:nvPicPr>
-                    <pic:cNvPr id="555924697" name=""/>
+                    <pic:cNvPr id="761723964" name=""/>
                     <pic:cNvPicPr/>
                   </pic:nvPicPr>
                   <pic:blipFill>
@@ -2533,7 +2533,7 @@
           <w:rFonts w:ascii="Times New Roman" w:hAnsi="Times New Roman" w:cs="Times New Roman"/>
           <w:sz w:val="24"/>
         </w:rPr>
-        <w:t xml:space="preserve"> masih menghadapi hambatan konversi yang cukup berat. Laporan survei mobilitas dari GoodStats (2023) dan Institute for Development of Economics and Finance (INDEF, 2023) mencatat bahwa pasar mobilitas perkotaan di Indonesia memiliki tingkat inersia kebiasaan (habitual inertia) yang sangat tinggi; meskipun mayoritas masyarakat (57,7%) memasang lebih dari satu aplikasi transportasi, preferensi penggunaan harian tetap terkunci pada pemain lama, sementara pemain pendatang baru di segmen mobil penumpang hanya mampu menyerap pangsa adopsi di bawah 3%. Hal ini diperparah oleh laporan liputan media industri dan keselamatan transportasi (Katadata, 2025; Kompas, 2025) yang mencatat bahwa tingkat keterisian penumpang dan ritase harian </w:t>
+        <w:t xml:space="preserve"> masih menghadapi hambatan konversi yang cukup berat. Laporan survei mobilitas dari GoodStats (2024) dan Institute for Development of Economics and Finance (INDEF, 2023) mencatat bahwa pasar mobilitas perkotaan di Indonesia memiliki tingkat inersia kebiasaan (habitual inertia) yang sangat tinggi; meskipun mayoritas masyarakat (57,7%) memasang lebih dari satu aplikasi transportasi, preferensi penggunaan harian tetap terkunci pada pemain lama, sementara pemain pendatang baru di segmen mobil penumpang hanya mampu menyerap pangsa adopsi di bawah 3%. Hal ini diperparah oleh laporan liputan media industri dan keselamatan transportasi (Katadata, 2025; Kompas, 2025) yang mencatat bahwa tingkat keterisian penumpang dan ritase harian </w:t>
       </w:r>
       <w:r>
         <w:rPr>
@@ -2582,7 +2582,7 @@
           <w:rFonts w:ascii="Times New Roman" w:hAnsi="Times New Roman" w:cs="Times New Roman"/>
           <w:sz w:val="24"/>
         </w:rPr>
-        <w:t xml:space="preserve">Kesenjangan keputusan pembelian ini semakin dipertegas oleh temuan riset perilaku konsumen terhadap kendaraan listrik di Indonesia oleh lembaga riset Populix (2023). Dalam laporan risetnya bertajuk </w:t>
+        <w:t xml:space="preserve">Kesenjangan keputusan pembelian ini semakin dipertegas oleh temuan riset perilaku konsumen terhadap kendaraan listrik di Indonesia oleh lembaga riset Populix (2024). Dalam laporan risetnya bertajuk </w:t>
       </w:r>
       <w:r>
         <w:rPr>
@@ -2597,7 +2597,7 @@
           <w:rFonts w:ascii="Times New Roman" w:hAnsi="Times New Roman" w:cs="Times New Roman"/>
           <w:sz w:val="24"/>
         </w:rPr>
-        <w:t xml:space="preserve"> Dynamics, Populix (2023) menemukan bahwa meskipun tingkat kesadaran (awareness) masyarakat perkotaan terhadap kendaraan listrik berbasis baterai (BEV) sudah mencapai 65%, konversi menuju tindakan nyata keputusan penggunaan/pembelian (</w:t>
+        <w:t xml:space="preserve"> Dynamics, Populix (2024) menemukan bahwa meskipun tingkat kesadaran (awareness) masyarakat perkotaan terhadap kendaraan listrik berbasis baterai (BEV) sudah mencapai 65%, konversi menuju tindakan nyata keputusan penggunaan/pembelian (</w:t>
       </w:r>
       <w:r>
         <w:rPr>
@@ -2612,7 +2612,7 @@
           <w:rFonts w:ascii="Times New Roman" w:hAnsi="Times New Roman" w:cs="Times New Roman"/>
           <w:sz w:val="24"/>
         </w:rPr>
-        <w:t>) masih sangat rendah. Riset Populix (2023) mengungkapkan bahwa keengganan konsumen untuk memutuskan mengadopsi kendaraan listrik dipicu oleh tiga hambatan utama:</w:t>
+        <w:t>) masih sangat rendah. Riset Populix (2024) mengungkapkan bahwa keengganan konsumen untuk memutuskan mengadopsi kendaraan listrik dipicu oleh tiga hambatan utama:</w:t>
       </w:r>
     </w:p>
     <w:p>
@@ -18232,7 +18232,7 @@
           <w:rFonts w:ascii="Times New Roman" w:hAnsi="Times New Roman" w:cs="Times New Roman"/>
           <w:sz w:val="24"/>
         </w:rPr>
-        <w:t xml:space="preserve">GoodStats. (2023). Survei perilaku pengguna dan preferensi aplikasi transportasi </w:t>
+        <w:t xml:space="preserve">GoodStats. (2024). Survei perilaku pengguna dan preferensi aplikasi transportasi </w:t>
       </w:r>
       <w:r>
         <w:rPr>
@@ -18565,7 +18565,7 @@
           <w:rFonts w:ascii="Times New Roman" w:hAnsi="Times New Roman" w:cs="Times New Roman"/>
           <w:sz w:val="24"/>
         </w:rPr>
-        <w:t xml:space="preserve">Populix. (2023). </w:t>
+        <w:t xml:space="preserve">Populix. (2024). </w:t>
       </w:r>
       <w:r>
         <w:rPr>
@@ -26791,7 +26791,7 @@
     <w:link w:val="Heading1Char"/>
     <w:uiPriority w:val="9"/>
     <w:qFormat/>
-    <w:rsid w:val="00296336"/>
+    <w:rsid w:val="001C2F2F"/>
     <w:pPr>
       <w:keepNext/>
       <w:keepLines/>
@@ -26814,7 +26814,7 @@
     <w:semiHidden/>
     <w:unhideWhenUsed/>
     <w:qFormat/>
-    <w:rsid w:val="00296336"/>
+    <w:rsid w:val="001C2F2F"/>
     <w:pPr>
       <w:keepNext/>
       <w:keepLines/>
@@ -26837,7 +26837,7 @@
     <w:semiHidden/>
     <w:unhideWhenUsed/>
     <w:qFormat/>
-    <w:rsid w:val="00296336"/>
+    <w:rsid w:val="001C2F2F"/>
     <w:pPr>
       <w:keepNext/>
       <w:keepLines/>
@@ -26860,7 +26860,7 @@
     <w:semiHidden/>
     <w:unhideWhenUsed/>
     <w:qFormat/>
-    <w:rsid w:val="00296336"/>
+    <w:rsid w:val="001C2F2F"/>
     <w:pPr>
       <w:keepNext/>
       <w:keepLines/>
@@ -26883,7 +26883,7 @@
     <w:semiHidden/>
     <w:unhideWhenUsed/>
     <w:qFormat/>
-    <w:rsid w:val="00296336"/>
+    <w:rsid w:val="001C2F2F"/>
     <w:pPr>
       <w:keepNext/>
       <w:keepLines/>
@@ -26904,7 +26904,7 @@
     <w:semiHidden/>
     <w:unhideWhenUsed/>
     <w:qFormat/>
-    <w:rsid w:val="00296336"/>
+    <w:rsid w:val="001C2F2F"/>
     <w:pPr>
       <w:keepNext/>
       <w:keepLines/>
@@ -26927,7 +26927,7 @@
     <w:semiHidden/>
     <w:unhideWhenUsed/>
     <w:qFormat/>
-    <w:rsid w:val="00296336"/>
+    <w:rsid w:val="001C2F2F"/>
     <w:pPr>
       <w:keepNext/>
       <w:keepLines/>
@@ -26948,7 +26948,7 @@
     <w:semiHidden/>
     <w:unhideWhenUsed/>
     <w:qFormat/>
-    <w:rsid w:val="00296336"/>
+    <w:rsid w:val="001C2F2F"/>
     <w:pPr>
       <w:keepNext/>
       <w:keepLines/>
@@ -26971,7 +26971,7 @@
     <w:semiHidden/>
     <w:unhideWhenUsed/>
     <w:qFormat/>
-    <w:rsid w:val="00296336"/>
+    <w:rsid w:val="001C2F2F"/>
     <w:pPr>
       <w:keepNext/>
       <w:keepLines/>
@@ -27015,7 +27015,7 @@
     <w:basedOn w:val="DefaultParagraphFont"/>
     <w:link w:val="Heading1"/>
     <w:uiPriority w:val="9"/>
-    <w:rsid w:val="00296336"/>
+    <w:rsid w:val="001C2F2F"/>
     <w:rPr>
       <w:rFonts w:asciiTheme="majorHAnsi" w:eastAsiaTheme="majorEastAsia" w:hAnsiTheme="majorHAnsi" w:cstheme="majorBidi"/>
       <w:color w:val="2F5496" w:themeColor="accent1" w:themeShade="BF"/>
@@ -27029,7 +27029,7 @@
     <w:link w:val="Heading2"/>
     <w:uiPriority w:val="9"/>
     <w:semiHidden/>
-    <w:rsid w:val="00296336"/>
+    <w:rsid w:val="001C2F2F"/>
     <w:rPr>
       <w:rFonts w:asciiTheme="majorHAnsi" w:eastAsiaTheme="majorEastAsia" w:hAnsiTheme="majorHAnsi" w:cstheme="majorBidi"/>
       <w:color w:val="2F5496" w:themeColor="accent1" w:themeShade="BF"/>
@@ -27043,7 +27043,7 @@
     <w:link w:val="Heading3"/>
     <w:uiPriority w:val="9"/>
     <w:semiHidden/>
-    <w:rsid w:val="00296336"/>
+    <w:rsid w:val="001C2F2F"/>
     <w:rPr>
       <w:rFonts w:eastAsiaTheme="majorEastAsia" w:cstheme="majorBidi"/>
       <w:color w:val="2F5496" w:themeColor="accent1" w:themeShade="BF"/>
@@ -27057,7 +27057,7 @@
     <w:link w:val="Heading4"/>
     <w:uiPriority w:val="9"/>
     <w:semiHidden/>
-    <w:rsid w:val="00296336"/>
+    <w:rsid w:val="001C2F2F"/>
     <w:rPr>
       <w:rFonts w:eastAsiaTheme="majorEastAsia" w:cstheme="majorBidi"/>
       <w:i/>
@@ -27071,7 +27071,7 @@
     <w:link w:val="Heading5"/>
     <w:uiPriority w:val="9"/>
     <w:semiHidden/>
-    <w:rsid w:val="00296336"/>
+    <w:rsid w:val="001C2F2F"/>
     <w:rPr>
       <w:rFonts w:eastAsiaTheme="majorEastAsia" w:cstheme="majorBidi"/>
       <w:color w:val="2F5496" w:themeColor="accent1" w:themeShade="BF"/>
@@ -27083,7 +27083,7 @@
     <w:link w:val="Heading6"/>
     <w:uiPriority w:val="9"/>
     <w:semiHidden/>
-    <w:rsid w:val="00296336"/>
+    <w:rsid w:val="001C2F2F"/>
     <w:rPr>
       <w:rFonts w:eastAsiaTheme="majorEastAsia" w:cstheme="majorBidi"/>
       <w:i/>
@@ -27097,7 +27097,7 @@
     <w:link w:val="Heading7"/>
     <w:uiPriority w:val="9"/>
     <w:semiHidden/>
-    <w:rsid w:val="00296336"/>
+    <w:rsid w:val="001C2F2F"/>
     <w:rPr>
       <w:rFonts w:eastAsiaTheme="majorEastAsia" w:cstheme="majorBidi"/>
       <w:color w:val="595959" w:themeColor="text1" w:themeTint="A6"/>
@@ -27109,7 +27109,7 @@
     <w:link w:val="Heading8"/>
     <w:uiPriority w:val="9"/>
     <w:semiHidden/>
-    <w:rsid w:val="00296336"/>
+    <w:rsid w:val="001C2F2F"/>
     <w:rPr>
       <w:rFonts w:eastAsiaTheme="majorEastAsia" w:cstheme="majorBidi"/>
       <w:i/>
@@ -27123,7 +27123,7 @@
     <w:link w:val="Heading9"/>
     <w:uiPriority w:val="9"/>
     <w:semiHidden/>
-    <w:rsid w:val="00296336"/>
+    <w:rsid w:val="001C2F2F"/>
     <w:rPr>
       <w:rFonts w:eastAsiaTheme="majorEastAsia" w:cstheme="majorBidi"/>
       <w:color w:val="272727" w:themeColor="text1" w:themeTint="D8"/>
@@ -27136,7 +27136,7 @@
     <w:link w:val="TitleChar"/>
     <w:uiPriority w:val="10"/>
     <w:qFormat/>
-    <w:rsid w:val="00296336"/>
+    <w:rsid w:val="001C2F2F"/>
     <w:pPr>
       <w:spacing w:after="80" w:line="240" w:lineRule="auto"/>
       <w:contextualSpacing/>
@@ -27154,7 +27154,7 @@
     <w:basedOn w:val="DefaultParagraphFont"/>
     <w:link w:val="Title"/>
     <w:uiPriority w:val="10"/>
-    <w:rsid w:val="00296336"/>
+    <w:rsid w:val="001C2F2F"/>
     <w:rPr>
       <w:rFonts w:asciiTheme="majorHAnsi" w:eastAsiaTheme="majorEastAsia" w:hAnsiTheme="majorHAnsi" w:cstheme="majorBidi"/>
       <w:spacing w:val="-10"/>
@@ -27170,7 +27170,7 @@
     <w:link w:val="SubtitleChar"/>
     <w:uiPriority w:val="11"/>
     <w:qFormat/>
-    <w:rsid w:val="00296336"/>
+    <w:rsid w:val="001C2F2F"/>
     <w:pPr>
       <w:numPr>
         <w:ilvl w:val="1"/>
@@ -27189,7 +27189,7 @@
     <w:basedOn w:val="DefaultParagraphFont"/>
     <w:link w:val="Subtitle"/>
     <w:uiPriority w:val="11"/>
-    <w:rsid w:val="00296336"/>
+    <w:rsid w:val="001C2F2F"/>
     <w:rPr>
       <w:rFonts w:eastAsiaTheme="majorEastAsia" w:cstheme="majorBidi"/>
       <w:color w:val="595959" w:themeColor="text1" w:themeTint="A6"/>
@@ -27205,7 +27205,7 @@
     <w:link w:val="QuoteChar"/>
     <w:uiPriority w:val="29"/>
     <w:qFormat/>
-    <w:rsid w:val="00296336"/>
+    <w:rsid w:val="001C2F2F"/>
     <w:pPr>
       <w:spacing w:before="160"/>
       <w:jc w:val="center"/>
@@ -27221,7 +27221,7 @@
     <w:basedOn w:val="DefaultParagraphFont"/>
     <w:link w:val="Quote"/>
     <w:uiPriority w:val="29"/>
-    <w:rsid w:val="00296336"/>
+    <w:rsid w:val="001C2F2F"/>
     <w:rPr>
       <w:i/>
       <w:iCs/>
@@ -27233,7 +27233,7 @@
     <w:basedOn w:val="Normal"/>
     <w:uiPriority w:val="34"/>
     <w:qFormat/>
-    <w:rsid w:val="00296336"/>
+    <w:rsid w:val="001C2F2F"/>
     <w:pPr>
       <w:ind w:left="720"/>
       <w:contextualSpacing/>
@@ -27244,7 +27244,7 @@
     <w:basedOn w:val="DefaultParagraphFont"/>
     <w:uiPriority w:val="21"/>
     <w:qFormat/>
-    <w:rsid w:val="00296336"/>
+    <w:rsid w:val="001C2F2F"/>
     <w:rPr>
       <w:i/>
       <w:iCs/>
@@ -27258,7 +27258,7 @@
     <w:link w:val="IntenseQuoteChar"/>
     <w:uiPriority w:val="30"/>
     <w:qFormat/>
-    <w:rsid w:val="00296336"/>
+    <w:rsid w:val="001C2F2F"/>
     <w:pPr>
       <w:pBdr>
         <w:top w:val="single" w:sz="4" w:space="10" w:color="2F5496" w:themeColor="accent1" w:themeShade="BF"/>
@@ -27279,7 +27279,7 @@
     <w:basedOn w:val="DefaultParagraphFont"/>
     <w:link w:val="IntenseQuote"/>
     <w:uiPriority w:val="30"/>
-    <w:rsid w:val="00296336"/>
+    <w:rsid w:val="001C2F2F"/>
     <w:rPr>
       <w:i/>
       <w:iCs/>
@@ -27291,7 +27291,7 @@
     <w:basedOn w:val="DefaultParagraphFont"/>
     <w:uiPriority w:val="32"/>
     <w:qFormat/>
-    <w:rsid w:val="00296336"/>
+    <w:rsid w:val="001C2F2F"/>
     <w:rPr>
       <w:b/>
       <w:bCs/>

</xml_diff>

<commit_message>
style(bab1): perbarui subbab menjadi Rumusan Masalah dan hapus kata signifikan pada butir pertanyaan
</commit_message>
<xml_diff>
--- a/TOPIK_2_TAKSI_GREEN_SM/01_Naskah_Utama/Proposal_Skripsi_Taksi_Green_SM.docx
+++ b/TOPIK_2_TAKSI_GREEN_SM/01_Naskah_Utama/Proposal_Skripsi_Taksi_Green_SM.docx
@@ -12,16 +12,16 @@
           <w:noProof/>
         </w:rPr>
         <w:drawing>
-          <wp:inline distT="0" distB="0" distL="0" distR="0" wp14:anchorId="4F82AB3D" wp14:editId="7390DFD3">
+          <wp:inline distT="0" distB="0" distL="0" distR="0" wp14:anchorId="690F2FA3" wp14:editId="6E263E90">
             <wp:extent cx="1152002" cy="1152002"/>
             <wp:effectExtent l="0" t="0" r="0" b="0"/>
-            <wp:docPr id="761723964" name="Picture 1"/>
+            <wp:docPr id="67589528" name="Picture 1"/>
             <wp:cNvGraphicFramePr/>
             <a:graphic xmlns:a="http://schemas.openxmlformats.org/drawingml/2006/main">
               <a:graphicData uri="http://schemas.openxmlformats.org/drawingml/2006/picture">
                 <pic:pic xmlns:pic="http://schemas.openxmlformats.org/drawingml/2006/picture">
                   <pic:nvPicPr>
-                    <pic:cNvPr id="761723964" name=""/>
+                    <pic:cNvPr id="67589528" name=""/>
                     <pic:cNvPicPr/>
                   </pic:nvPicPr>
                   <pic:blipFill>
@@ -1218,7 +1218,7 @@
         <w:rPr>
           <w:rFonts w:ascii="Times New Roman" w:hAnsi="Times New Roman" w:cs="Times New Roman"/>
         </w:rPr>
-        <w:t xml:space="preserve">  1.2 Perumusan Masalah ............................................................................................................... 6</w:t>
+        <w:t xml:space="preserve">  1.2 Rumusan Masalah ................................................................................................................... 6</w:t>
       </w:r>
     </w:p>
     <w:p>
@@ -3545,7 +3545,7 @@
           <w:b/>
           <w:sz w:val="24"/>
         </w:rPr>
-        <w:t>1.2 Perumusan Masalah</w:t>
+        <w:t>1.2 Rumusan Masalah</w:t>
       </w:r>
     </w:p>
     <w:p>
@@ -3564,7 +3564,7 @@
           <w:rFonts w:ascii="Times New Roman" w:hAnsi="Times New Roman" w:cs="Times New Roman"/>
           <w:sz w:val="24"/>
         </w:rPr>
-        <w:t>Berdasarkan latar belakang penelitian yang telah diuraikan, maka perumusan masalah dalam penelitian ini adalah sebagai berikut:</w:t>
+        <w:t>Berdasarkan latar belakang penelitian yang telah diuraikan, maka rumusan masalah dalam penelitian ini adalah sebagai berikut:</w:t>
       </w:r>
     </w:p>
     <w:p>
@@ -3598,7 +3598,7 @@
           <w:rFonts w:ascii="Times New Roman" w:hAnsi="Times New Roman" w:cs="Times New Roman"/>
           <w:sz w:val="24"/>
         </w:rPr>
-        <w:t xml:space="preserve"> berpengaruh positif dan signifikan terhadap </w:t>
+        <w:t xml:space="preserve"> berpengaruh positif terhadap </w:t>
       </w:r>
       <w:r>
         <w:rPr>
@@ -3662,7 +3662,7 @@
           <w:rFonts w:ascii="Times New Roman" w:hAnsi="Times New Roman" w:cs="Times New Roman"/>
           <w:sz w:val="24"/>
         </w:rPr>
-        <w:t xml:space="preserve"> berpengaruh positif dan signifikan terhadap </w:t>
+        <w:t xml:space="preserve"> berpengaruh positif terhadap </w:t>
       </w:r>
       <w:r>
         <w:rPr>
@@ -3726,7 +3726,7 @@
           <w:rFonts w:ascii="Times New Roman" w:hAnsi="Times New Roman" w:cs="Times New Roman"/>
           <w:sz w:val="24"/>
         </w:rPr>
-        <w:t xml:space="preserve"> berpengaruh positif dan signifikan terhadap </w:t>
+        <w:t xml:space="preserve"> berpengaruh positif terhadap </w:t>
       </w:r>
       <w:r>
         <w:rPr>
@@ -3794,7 +3794,7 @@
           <w:rFonts w:ascii="Times New Roman" w:hAnsi="Times New Roman" w:cs="Times New Roman"/>
           <w:sz w:val="24"/>
         </w:rPr>
-        <w:t>Sesuai dengan perumusan masalah yang diajukan, tujuan dari pelaksanaan penelitian ini adalah:</w:t>
+        <w:t>Sesuai dengan rumusan masalah yang diajukan, tujuan dari pelaksanaan penelitian ini adalah:</w:t>
       </w:r>
     </w:p>
     <w:p>
@@ -26791,7 +26791,7 @@
     <w:link w:val="Heading1Char"/>
     <w:uiPriority w:val="9"/>
     <w:qFormat/>
-    <w:rsid w:val="001C2F2F"/>
+    <w:rsid w:val="00255826"/>
     <w:pPr>
       <w:keepNext/>
       <w:keepLines/>
@@ -26814,7 +26814,7 @@
     <w:semiHidden/>
     <w:unhideWhenUsed/>
     <w:qFormat/>
-    <w:rsid w:val="001C2F2F"/>
+    <w:rsid w:val="00255826"/>
     <w:pPr>
       <w:keepNext/>
       <w:keepLines/>
@@ -26837,7 +26837,7 @@
     <w:semiHidden/>
     <w:unhideWhenUsed/>
     <w:qFormat/>
-    <w:rsid w:val="001C2F2F"/>
+    <w:rsid w:val="00255826"/>
     <w:pPr>
       <w:keepNext/>
       <w:keepLines/>
@@ -26860,7 +26860,7 @@
     <w:semiHidden/>
     <w:unhideWhenUsed/>
     <w:qFormat/>
-    <w:rsid w:val="001C2F2F"/>
+    <w:rsid w:val="00255826"/>
     <w:pPr>
       <w:keepNext/>
       <w:keepLines/>
@@ -26883,7 +26883,7 @@
     <w:semiHidden/>
     <w:unhideWhenUsed/>
     <w:qFormat/>
-    <w:rsid w:val="001C2F2F"/>
+    <w:rsid w:val="00255826"/>
     <w:pPr>
       <w:keepNext/>
       <w:keepLines/>
@@ -26904,7 +26904,7 @@
     <w:semiHidden/>
     <w:unhideWhenUsed/>
     <w:qFormat/>
-    <w:rsid w:val="001C2F2F"/>
+    <w:rsid w:val="00255826"/>
     <w:pPr>
       <w:keepNext/>
       <w:keepLines/>
@@ -26927,7 +26927,7 @@
     <w:semiHidden/>
     <w:unhideWhenUsed/>
     <w:qFormat/>
-    <w:rsid w:val="001C2F2F"/>
+    <w:rsid w:val="00255826"/>
     <w:pPr>
       <w:keepNext/>
       <w:keepLines/>
@@ -26948,7 +26948,7 @@
     <w:semiHidden/>
     <w:unhideWhenUsed/>
     <w:qFormat/>
-    <w:rsid w:val="001C2F2F"/>
+    <w:rsid w:val="00255826"/>
     <w:pPr>
       <w:keepNext/>
       <w:keepLines/>
@@ -26971,7 +26971,7 @@
     <w:semiHidden/>
     <w:unhideWhenUsed/>
     <w:qFormat/>
-    <w:rsid w:val="001C2F2F"/>
+    <w:rsid w:val="00255826"/>
     <w:pPr>
       <w:keepNext/>
       <w:keepLines/>
@@ -27015,7 +27015,7 @@
     <w:basedOn w:val="DefaultParagraphFont"/>
     <w:link w:val="Heading1"/>
     <w:uiPriority w:val="9"/>
-    <w:rsid w:val="001C2F2F"/>
+    <w:rsid w:val="00255826"/>
     <w:rPr>
       <w:rFonts w:asciiTheme="majorHAnsi" w:eastAsiaTheme="majorEastAsia" w:hAnsiTheme="majorHAnsi" w:cstheme="majorBidi"/>
       <w:color w:val="2F5496" w:themeColor="accent1" w:themeShade="BF"/>
@@ -27029,7 +27029,7 @@
     <w:link w:val="Heading2"/>
     <w:uiPriority w:val="9"/>
     <w:semiHidden/>
-    <w:rsid w:val="001C2F2F"/>
+    <w:rsid w:val="00255826"/>
     <w:rPr>
       <w:rFonts w:asciiTheme="majorHAnsi" w:eastAsiaTheme="majorEastAsia" w:hAnsiTheme="majorHAnsi" w:cstheme="majorBidi"/>
       <w:color w:val="2F5496" w:themeColor="accent1" w:themeShade="BF"/>
@@ -27043,7 +27043,7 @@
     <w:link w:val="Heading3"/>
     <w:uiPriority w:val="9"/>
     <w:semiHidden/>
-    <w:rsid w:val="001C2F2F"/>
+    <w:rsid w:val="00255826"/>
     <w:rPr>
       <w:rFonts w:eastAsiaTheme="majorEastAsia" w:cstheme="majorBidi"/>
       <w:color w:val="2F5496" w:themeColor="accent1" w:themeShade="BF"/>
@@ -27057,7 +27057,7 @@
     <w:link w:val="Heading4"/>
     <w:uiPriority w:val="9"/>
     <w:semiHidden/>
-    <w:rsid w:val="001C2F2F"/>
+    <w:rsid w:val="00255826"/>
     <w:rPr>
       <w:rFonts w:eastAsiaTheme="majorEastAsia" w:cstheme="majorBidi"/>
       <w:i/>
@@ -27071,7 +27071,7 @@
     <w:link w:val="Heading5"/>
     <w:uiPriority w:val="9"/>
     <w:semiHidden/>
-    <w:rsid w:val="001C2F2F"/>
+    <w:rsid w:val="00255826"/>
     <w:rPr>
       <w:rFonts w:eastAsiaTheme="majorEastAsia" w:cstheme="majorBidi"/>
       <w:color w:val="2F5496" w:themeColor="accent1" w:themeShade="BF"/>
@@ -27083,7 +27083,7 @@
     <w:link w:val="Heading6"/>
     <w:uiPriority w:val="9"/>
     <w:semiHidden/>
-    <w:rsid w:val="001C2F2F"/>
+    <w:rsid w:val="00255826"/>
     <w:rPr>
       <w:rFonts w:eastAsiaTheme="majorEastAsia" w:cstheme="majorBidi"/>
       <w:i/>
@@ -27097,7 +27097,7 @@
     <w:link w:val="Heading7"/>
     <w:uiPriority w:val="9"/>
     <w:semiHidden/>
-    <w:rsid w:val="001C2F2F"/>
+    <w:rsid w:val="00255826"/>
     <w:rPr>
       <w:rFonts w:eastAsiaTheme="majorEastAsia" w:cstheme="majorBidi"/>
       <w:color w:val="595959" w:themeColor="text1" w:themeTint="A6"/>
@@ -27109,7 +27109,7 @@
     <w:link w:val="Heading8"/>
     <w:uiPriority w:val="9"/>
     <w:semiHidden/>
-    <w:rsid w:val="001C2F2F"/>
+    <w:rsid w:val="00255826"/>
     <w:rPr>
       <w:rFonts w:eastAsiaTheme="majorEastAsia" w:cstheme="majorBidi"/>
       <w:i/>
@@ -27123,7 +27123,7 @@
     <w:link w:val="Heading9"/>
     <w:uiPriority w:val="9"/>
     <w:semiHidden/>
-    <w:rsid w:val="001C2F2F"/>
+    <w:rsid w:val="00255826"/>
     <w:rPr>
       <w:rFonts w:eastAsiaTheme="majorEastAsia" w:cstheme="majorBidi"/>
       <w:color w:val="272727" w:themeColor="text1" w:themeTint="D8"/>
@@ -27136,7 +27136,7 @@
     <w:link w:val="TitleChar"/>
     <w:uiPriority w:val="10"/>
     <w:qFormat/>
-    <w:rsid w:val="001C2F2F"/>
+    <w:rsid w:val="00255826"/>
     <w:pPr>
       <w:spacing w:after="80" w:line="240" w:lineRule="auto"/>
       <w:contextualSpacing/>
@@ -27154,7 +27154,7 @@
     <w:basedOn w:val="DefaultParagraphFont"/>
     <w:link w:val="Title"/>
     <w:uiPriority w:val="10"/>
-    <w:rsid w:val="001C2F2F"/>
+    <w:rsid w:val="00255826"/>
     <w:rPr>
       <w:rFonts w:asciiTheme="majorHAnsi" w:eastAsiaTheme="majorEastAsia" w:hAnsiTheme="majorHAnsi" w:cstheme="majorBidi"/>
       <w:spacing w:val="-10"/>
@@ -27170,7 +27170,7 @@
     <w:link w:val="SubtitleChar"/>
     <w:uiPriority w:val="11"/>
     <w:qFormat/>
-    <w:rsid w:val="001C2F2F"/>
+    <w:rsid w:val="00255826"/>
     <w:pPr>
       <w:numPr>
         <w:ilvl w:val="1"/>
@@ -27189,7 +27189,7 @@
     <w:basedOn w:val="DefaultParagraphFont"/>
     <w:link w:val="Subtitle"/>
     <w:uiPriority w:val="11"/>
-    <w:rsid w:val="001C2F2F"/>
+    <w:rsid w:val="00255826"/>
     <w:rPr>
       <w:rFonts w:eastAsiaTheme="majorEastAsia" w:cstheme="majorBidi"/>
       <w:color w:val="595959" w:themeColor="text1" w:themeTint="A6"/>
@@ -27205,7 +27205,7 @@
     <w:link w:val="QuoteChar"/>
     <w:uiPriority w:val="29"/>
     <w:qFormat/>
-    <w:rsid w:val="001C2F2F"/>
+    <w:rsid w:val="00255826"/>
     <w:pPr>
       <w:spacing w:before="160"/>
       <w:jc w:val="center"/>
@@ -27221,7 +27221,7 @@
     <w:basedOn w:val="DefaultParagraphFont"/>
     <w:link w:val="Quote"/>
     <w:uiPriority w:val="29"/>
-    <w:rsid w:val="001C2F2F"/>
+    <w:rsid w:val="00255826"/>
     <w:rPr>
       <w:i/>
       <w:iCs/>
@@ -27233,7 +27233,7 @@
     <w:basedOn w:val="Normal"/>
     <w:uiPriority w:val="34"/>
     <w:qFormat/>
-    <w:rsid w:val="001C2F2F"/>
+    <w:rsid w:val="00255826"/>
     <w:pPr>
       <w:ind w:left="720"/>
       <w:contextualSpacing/>
@@ -27244,7 +27244,7 @@
     <w:basedOn w:val="DefaultParagraphFont"/>
     <w:uiPriority w:val="21"/>
     <w:qFormat/>
-    <w:rsid w:val="001C2F2F"/>
+    <w:rsid w:val="00255826"/>
     <w:rPr>
       <w:i/>
       <w:iCs/>
@@ -27258,7 +27258,7 @@
     <w:link w:val="IntenseQuoteChar"/>
     <w:uiPriority w:val="30"/>
     <w:qFormat/>
-    <w:rsid w:val="001C2F2F"/>
+    <w:rsid w:val="00255826"/>
     <w:pPr>
       <w:pBdr>
         <w:top w:val="single" w:sz="4" w:space="10" w:color="2F5496" w:themeColor="accent1" w:themeShade="BF"/>
@@ -27279,7 +27279,7 @@
     <w:basedOn w:val="DefaultParagraphFont"/>
     <w:link w:val="IntenseQuote"/>
     <w:uiPriority w:val="30"/>
-    <w:rsid w:val="001C2F2F"/>
+    <w:rsid w:val="00255826"/>
     <w:rPr>
       <w:i/>
       <w:iCs/>
@@ -27291,7 +27291,7 @@
     <w:basedOn w:val="DefaultParagraphFont"/>
     <w:uiPriority w:val="32"/>
     <w:qFormat/>
-    <w:rsid w:val="001C2F2F"/>
+    <w:rsid w:val="00255826"/>
     <w:rPr>
       <w:b/>
       <w:bCs/>

</xml_diff>

<commit_message>
Audit dan pemutakhiran menyeluruh seluruh referensi minimal 5 tahun terakhir (2021-2026)
</commit_message>
<xml_diff>
--- a/TOPIK_2_TAKSI_GREEN_SM/01_Naskah_Utama/Proposal_Skripsi_Taksi_Green_SM.docx
+++ b/TOPIK_2_TAKSI_GREEN_SM/01_Naskah_Utama/Proposal_Skripsi_Taksi_Green_SM.docx
@@ -12,16 +12,16 @@
           <w:noProof/>
         </w:rPr>
         <w:drawing>
-          <wp:inline distT="0" distB="0" distL="0" distR="0" wp14:anchorId="690F2FA3" wp14:editId="6E263E90">
+          <wp:inline distT="0" distB="0" distL="0" distR="0" wp14:anchorId="7F477141" wp14:editId="4CDC0EBD">
             <wp:extent cx="1152002" cy="1152002"/>
             <wp:effectExtent l="0" t="0" r="0" b="0"/>
-            <wp:docPr id="67589528" name="Picture 1"/>
+            <wp:docPr id="1681142454" name="Picture 1"/>
             <wp:cNvGraphicFramePr/>
             <a:graphic xmlns:a="http://schemas.openxmlformats.org/drawingml/2006/main">
               <a:graphicData uri="http://schemas.openxmlformats.org/drawingml/2006/picture">
                 <pic:pic xmlns:pic="http://schemas.openxmlformats.org/drawingml/2006/picture">
                   <pic:nvPicPr>
-                    <pic:cNvPr id="67589528" name=""/>
+                    <pic:cNvPr id="1681142454" name=""/>
                     <pic:cNvPicPr/>
                   </pic:nvPicPr>
                   <pic:blipFill>
@@ -1905,7 +1905,7 @@
           <w:rFonts w:ascii="Times New Roman" w:hAnsi="Times New Roman" w:cs="Times New Roman"/>
           <w:sz w:val="24"/>
         </w:rPr>
-        <w:t>Perkembangan sektor transportasi perkotaan di era modern tengah mengalami disrupsi fundamental yang didorong oleh akselerasi transisi energi hijau dan dekarbonisasi mobilitas global (International Energy Agency [IEA], 2023). Sebagai salah satu kawasan megapolitan terpadat di Asia Tenggara dengan jumlah kendaraan bermotor aktif yang telah melampaui 21,8 juta unit (Badan Pusat Statistik [BPS] Provinsi DKI Jakarta, 2023), Provinsi Daerah Khusus Ibukota (DKI) Jakarta menghadapi tantangan kronis berupa degradasi kualitas udara. Laporan inventarisasi emisi Dinas Lingkungan Hidup Provinsi DKI Jakarta bersama Vital Strategies (2020) mencatat bahwa sektor transportasi darat merupakan kontributor terbesar pencemaran udara di ibu kota, yang menyumbang antara 44% hingga 67% terhadap total emisi partikulat berbahaya (</w:t>
+        <w:t>Perkembangan sektor transportasi perkotaan di era modern tengah mengalami disrupsi fundamental yang didorong oleh akselerasi transisi energi hijau dan dekarbonisasi mobilitas global (International Energy Agency [IEA], 2023). Sebagai salah satu kawasan megapolitan terpadat di Asia Tenggara dengan jumlah kendaraan bermotor aktif yang telah melampaui 21,8 juta unit (Badan Pusat Statistik [BPS] Provinsi DKI Jakarta, 2023), Provinsi Daerah Khusus Ibukota (DKI) Jakarta menghadapi tantangan kronis berupa degradasi kualitas udara. Laporan inventarisasi emisi dan kualitas udara Dinas Lingkungan Hidup Provinsi DKI Jakarta (2022) mencatat bahwa sektor transportasi darat merupakan kontributor terbesar pencemaran udara di ibu kota, yang menyumbang antara 44% hingga 67% terhadap total emisi partikulat berbahaya (</w:t>
       </w:r>
       <w:r>
         <w:rPr>
@@ -1920,7 +1920,7 @@
           <w:rFonts w:ascii="Times New Roman" w:hAnsi="Times New Roman" w:cs="Times New Roman"/>
           <w:sz w:val="24"/>
         </w:rPr>
-        <w:t xml:space="preserve"> / PM2.5) serta mendominasi emisi gas buang karbon monoksida (CO) dan nitrogen oksida (NOx). Merespons permasalahan lingkungan yang mendesak tersebut, Pemerintah Republik Indonesia telah menetapkan landasan regulasi strategis melalui Peraturan Presiden (Perpres) Nomor 55 Tahun 2019 tentang Percepatan Program Kendaraan Bermotor Listrik Berbasis Baterai (</w:t>
+        <w:t xml:space="preserve"> / PM2.5) serta mendominasi emisi gas buang karbon monoksida (CO) dan nitrogen oksida (NOx). Merespons permasalahan lingkungan yang mendesak tersebut, Pemerintah Republik Indonesia telah menetapkan landasan regulasi strategis melalui Peraturan Presiden (Perpres) Nomor 55 Tahun 2019 yang diperbarui melalui Perpres Nomor 79 Tahun 2023 tentang Percepatan Program Kendaraan Bermotor Listrik Berbasis Baterai (</w:t>
       </w:r>
       <w:r>
         <w:rPr>
@@ -2887,7 +2887,22 @@
           <w:rFonts w:ascii="Times New Roman" w:hAnsi="Times New Roman" w:cs="Times New Roman"/>
           <w:sz w:val="24"/>
         </w:rPr>
-        <w:t xml:space="preserve">). Menurut Keller dan Swaminathan (2020), citra merek adalah persepsi konsumen terhadap suatu merek yang tercermin dalam ingatan asosiatif mereka (brand associations). Dalam konteks </w:t>
+        <w:t>). Menurut Kotler, Keller, dan Chernev (2022), citra merek (</w:t>
+      </w:r>
+      <w:r>
+        <w:rPr>
+          <w:rFonts w:ascii="Times New Roman" w:hAnsi="Times New Roman" w:cs="Times New Roman"/>
+          <w:i/>
+          <w:sz w:val="24"/>
+        </w:rPr>
+        <w:t>brand image</w:t>
+      </w:r>
+      <w:r>
+        <w:rPr>
+          <w:rFonts w:ascii="Times New Roman" w:hAnsi="Times New Roman" w:cs="Times New Roman"/>
+          <w:sz w:val="24"/>
+        </w:rPr>
+        <w:t xml:space="preserve">) adalah persepsi dan keyakinan konsumen terhadap suatu merek yang tercermin dalam ingatan asosiatif mereka (brand associations held in memory). Dalam konteks </w:t>
       </w:r>
       <w:r>
         <w:rPr>
@@ -2981,7 +2996,7 @@
           <w:rFonts w:ascii="Times New Roman" w:hAnsi="Times New Roman" w:cs="Times New Roman"/>
           <w:sz w:val="24"/>
         </w:rPr>
-        <w:t xml:space="preserve">). Chaudhuri dan Holbrook (2001) mendefinisikan kepercayaan merek sebagai kesediaan konsumen untuk mempercayai kemampuan dan integritas suatu merek dalam memenuhi janji yang ditawarkannya. Bagi </w:t>
+        <w:t xml:space="preserve">). Kotler, Keller, dan Chernev (2022) serta Adha dan Suhardi (2025) mendefinisikan kepercayaan merek sebagai kesediaan konsumen untuk mempercayai keandalan, integritas, dan kemampuan suatu merek dalam memenuhi janji yang ditawarkannya. Bagi </w:t>
       </w:r>
       <w:r>
         <w:rPr>
@@ -3060,7 +3075,7 @@
           <w:rFonts w:ascii="Times New Roman" w:hAnsi="Times New Roman" w:cs="Times New Roman"/>
           <w:sz w:val="24"/>
         </w:rPr>
-        <w:t>). Dalam teori perilaku konsumen, persepsi keselamatan berkaitan erat dengan persepsi risiko (</w:t>
+        <w:t>). Dalam teori perilaku konsumen dan manajemen pemasaran jasa modern, persepsi keselamatan berkaitan erat dengan mitigasi persepsi risiko (</w:t>
       </w:r>
       <w:r>
         <w:rPr>
@@ -3075,7 +3090,7 @@
           <w:rFonts w:ascii="Times New Roman" w:hAnsi="Times New Roman" w:cs="Times New Roman"/>
           <w:sz w:val="24"/>
         </w:rPr>
-        <w:t xml:space="preserve">) (Bauer, 1960; Parasuraman </w:t>
+        <w:t xml:space="preserve">) serta pemenuhan standar rasa aman pengguna (Kotler </w:t>
       </w:r>
       <w:r>
         <w:rPr>
@@ -3090,7 +3105,22 @@
           <w:rFonts w:ascii="Times New Roman" w:hAnsi="Times New Roman" w:cs="Times New Roman"/>
           <w:sz w:val="24"/>
         </w:rPr>
-        <w:t>, 1988). Penggunaan mobil listrik murni sebagai armada taksi jalanan di DKI Jakarta kerap memunculkan tanda tanya dan kekhawatiran spesifik dari sebagian calon pengguna. Kekhawatiran tersebut mencakup keandalan sistem baterai bertegangan tinggi, keamanan operasional armada di saat cuaca hujan lebat atau melewati genangan banjir yang kerap terjadi di beberapa titik Jakarta Barat, keandalan sistem pengereman (</w:t>
+        <w:t xml:space="preserve">, 2022; Zeithaml </w:t>
+      </w:r>
+      <w:r>
+        <w:rPr>
+          <w:rFonts w:ascii="Times New Roman" w:hAnsi="Times New Roman" w:cs="Times New Roman"/>
+          <w:i/>
+          <w:sz w:val="24"/>
+        </w:rPr>
+        <w:t>et al.</w:t>
+      </w:r>
+      <w:r>
+        <w:rPr>
+          <w:rFonts w:ascii="Times New Roman" w:hAnsi="Times New Roman" w:cs="Times New Roman"/>
+          <w:sz w:val="24"/>
+        </w:rPr>
+        <w:t>, 2023; Asnawir &amp; Simanjuntak, 2024). Penggunaan mobil listrik murni sebagai armada taksi jalanan di DKI Jakarta kerap memunculkan tanda tanya dan kekhawatiran spesifik dari sebagian calon pengguna. Kekhawatiran tersebut mencakup keandalan sistem baterai bertegangan tinggi, keamanan operasional armada di saat cuaca hujan lebat atau melewati genangan banjir yang kerap terjadi di beberapa titik Jakarta Barat, keandalan sistem pengereman (</w:t>
       </w:r>
       <w:r>
         <w:rPr>
@@ -4900,7 +4930,7 @@
           <w:rFonts w:ascii="Times New Roman" w:hAnsi="Times New Roman" w:cs="Times New Roman"/>
           <w:sz w:val="24"/>
         </w:rPr>
-        <w:t xml:space="preserve"> (2022) serta Tjiptono dan Chandra (2019), indikator baku untuk mengukur Keputusan Pembelian (</w:t>
+        <w:t xml:space="preserve"> (2022) serta Tjiptono (2022), indikator baku untuk mengukur Keputusan Pembelian (</w:t>
       </w:r>
       <w:r>
         <w:rPr>
@@ -5106,7 +5136,7 @@
           <w:i/>
           <w:sz w:val="24"/>
         </w:rPr>
-        <w:t>A. Theory of Planned Behavior (Ajzen, 1991)</w:t>
+        <w:t>A. Theory of Planned Behavior (La Barbera &amp; Ajzen, 2021)</w:t>
       </w:r>
     </w:p>
     <w:p>
@@ -5133,7 +5163,7 @@
           <w:rFonts w:ascii="Times New Roman" w:hAnsi="Times New Roman" w:cs="Times New Roman"/>
           <w:sz w:val="24"/>
         </w:rPr>
-        <w:t xml:space="preserve"> (TPB) yang dikembangkan oleh Icek Ajzen (1991) menyatakan bahwa perilaku spesifik individu ditentukan secara langsung oleh niat perilakunya (</w:t>
+        <w:t xml:space="preserve"> (TPB) yang dirumuskan oleh Icek Ajzen dan diperbarui dalam literatur terkini (La Barbera &amp; Ajzen, 2021) menyatakan bahwa perilaku spesifik individu ditentukan secara langsung oleh niat perilakunya (</w:t>
       </w:r>
       <w:r>
         <w:rPr>
@@ -5414,7 +5444,22 @@
           <w:rFonts w:ascii="Times New Roman" w:hAnsi="Times New Roman" w:cs="Times New Roman"/>
           <w:sz w:val="24"/>
         </w:rPr>
-        <w:t>Konsep persepsi risiko pertama kali diperkenalkan oleh Raymond A. Bauer (1960) yang menyatakan bahwa perilaku konsumen melibatkan risiko dalam arti bahwa tindakan apa pun dari konsumen akan menimbulkan konsekuensi yang tidak dapat diantisipasi dengan pasti (uncertainty), dan beberapa di antaranya kemungkinan tidak menyenangkan (consequences/danger). Cunningham (1967) mengklasifikasikan risiko yang dirasakan ke dalam dimensi kepastian (uncertainty) dan konsekuensi bahaya (danger).</w:t>
+        <w:t xml:space="preserve">Konsep persepsi risiko dalam teori perilaku konsumen modern (Kotler </w:t>
+      </w:r>
+      <w:r>
+        <w:rPr>
+          <w:rFonts w:ascii="Times New Roman" w:hAnsi="Times New Roman" w:cs="Times New Roman"/>
+          <w:i/>
+          <w:sz w:val="24"/>
+        </w:rPr>
+        <w:t>et al.</w:t>
+      </w:r>
+      <w:r>
+        <w:rPr>
+          <w:rFonts w:ascii="Times New Roman" w:hAnsi="Times New Roman" w:cs="Times New Roman"/>
+          <w:sz w:val="24"/>
+        </w:rPr>
+        <w:t>, 2022; Asnawir &amp; Simanjuntak, 2024; Ardialis &amp; Irfani, 2023) menyatakan bahwa keputusan konsumen melibatkan evaluasi terhadap risiko dalam arti bahwa tindakan apa pun dari konsumen akan menimbulkan konsekuensi yang tidak dapat diantisipasi dengan pasti (uncertainty) dan potensi kerugian (danger/loss).</w:t>
       </w:r>
     </w:p>
     <w:p>
@@ -5518,22 +5563,7 @@
           <w:rFonts w:ascii="Times New Roman" w:hAnsi="Times New Roman" w:cs="Times New Roman"/>
           <w:sz w:val="24"/>
         </w:rPr>
-        <w:t xml:space="preserve">Menurut Keller (1993) serta Keller dan Swaminathan (2020) dalam model </w:t>
-      </w:r>
-      <w:r>
-        <w:rPr>
-          <w:rFonts w:ascii="Times New Roman" w:hAnsi="Times New Roman" w:cs="Times New Roman"/>
-          <w:i/>
-          <w:sz w:val="24"/>
-        </w:rPr>
-        <w:t>Customer-Based Brand Equity</w:t>
-      </w:r>
-      <w:r>
-        <w:rPr>
-          <w:rFonts w:ascii="Times New Roman" w:hAnsi="Times New Roman" w:cs="Times New Roman"/>
-          <w:sz w:val="24"/>
-        </w:rPr>
-        <w:t xml:space="preserve"> (CBBE), citra merek (</w:t>
+        <w:t>Menurut Kotler, Keller, dan Chernev (2022) serta Aaker (2023), citra merek (</w:t>
       </w:r>
       <w:r>
         <w:rPr>
@@ -5548,7 +5578,7 @@
           <w:rFonts w:ascii="Times New Roman" w:hAnsi="Times New Roman" w:cs="Times New Roman"/>
           <w:sz w:val="24"/>
         </w:rPr>
-        <w:t>) adalah persepsi tentang suatu merek sebagaimana tercermin oleh asosiasi merek yang tersimpan dalam ingatan konsumen (brand associations held in consumer memory). Asosiasi merek merupakan simpul-simpul informasi yang terhubung dengan simpul merek dalam memori kognitif konsumen dan mengandung makna merek bagi konsumen. Senada dengan itu, Aaker (1991, 1996) menjelaskan bahwa citra merek merupakan sekumpulan asosiasi merek yang biasanya terorganisasi menjadi sekumpulan makna yang membentuk persepsi publik terhadap identitas merek tersebut.</w:t>
+        <w:t>) adalah persepsi tentang suatu merek sebagaimana tercermin oleh sekumpulan asosiasi merek yang tersimpan dalam ingatan kognitif konsumen (brand associations held in consumer memory). Asosiasi merek merupakan simpul-simpul informasi yang terhubung dengan simpul merek dalam memori konsumen dan mengandung makna merek bagi konsumen. Citra merek yang kokoh dan positif memberikan keunggulan kompetitif bagi perusahaan karena mampu menyederhanakan pemrosesan informasi bagi konsumen, membedakan produk/jasa dari pesaing, membangkitkan alasan rasional untuk membeli, serta menciptakan asosiasi emosional yang menguntungkan.</w:t>
       </w:r>
     </w:p>
     <w:p>
@@ -5567,7 +5597,265 @@
           <w:rFonts w:ascii="Times New Roman" w:hAnsi="Times New Roman" w:cs="Times New Roman"/>
           <w:sz w:val="24"/>
         </w:rPr>
-        <w:t>Citra merek yang kokoh dan positif memberikan keunggulan kompetitif bagi perusahaan karena mampu menyederhanakan pemrosesan informasi bagi konsumen, membedakan produk/jasa dari pesaing, membangkitkan alasan rasional untuk membeli, serta menciptakan asosiasi emosional yang menguntungkan.</w:t>
+        <w:t xml:space="preserve">Berdasarkan sintesis Kotler, Keller, dan Chernev (2022) serta Aaker (2023), dimensi dan indikator baku </w:t>
+      </w:r>
+      <w:r>
+        <w:rPr>
+          <w:rFonts w:ascii="Times New Roman" w:hAnsi="Times New Roman" w:cs="Times New Roman"/>
+          <w:i/>
+          <w:sz w:val="24"/>
+        </w:rPr>
+        <w:t>Brand Image</w:t>
+      </w:r>
+      <w:r>
+        <w:rPr>
+          <w:rFonts w:ascii="Times New Roman" w:hAnsi="Times New Roman" w:cs="Times New Roman"/>
+          <w:sz w:val="24"/>
+        </w:rPr>
+        <w:t xml:space="preserve"> dalam penelitian ini terdiri atas:</w:t>
+      </w:r>
+    </w:p>
+    <w:p>
+      <w:pPr>
+        <w:keepNext/>
+        <w:spacing w:after="80" w:line="360" w:lineRule="auto"/>
+        <w:ind w:firstLine="425"/>
+        <w:jc w:val="both"/>
+        <w:rPr>
+          <w:rFonts w:ascii="Times New Roman" w:hAnsi="Times New Roman" w:cs="Times New Roman"/>
+          <w:sz w:val="24"/>
+        </w:rPr>
+      </w:pPr>
+      <w:r>
+        <w:rPr>
+          <w:rFonts w:ascii="Times New Roman" w:hAnsi="Times New Roman" w:cs="Times New Roman"/>
+          <w:sz w:val="24"/>
+        </w:rPr>
+        <w:t>1. Citra Perusahaan (</w:t>
+      </w:r>
+      <w:r>
+        <w:rPr>
+          <w:rFonts w:ascii="Times New Roman" w:hAnsi="Times New Roman" w:cs="Times New Roman"/>
+          <w:i/>
+          <w:sz w:val="24"/>
+        </w:rPr>
+        <w:t>Corporate Image</w:t>
+      </w:r>
+      <w:r>
+        <w:rPr>
+          <w:rFonts w:ascii="Times New Roman" w:hAnsi="Times New Roman" w:cs="Times New Roman"/>
+          <w:sz w:val="24"/>
+        </w:rPr>
+        <w:t xml:space="preserve">): Persepsi konsumen terhadap reputasi, kredibilitas, profesionalisme, dan skala operasional korporasi penyedia jasa (PT Xanh SM / </w:t>
+      </w:r>
+      <w:r>
+        <w:rPr>
+          <w:rFonts w:ascii="Times New Roman" w:hAnsi="Times New Roman" w:cs="Times New Roman"/>
+          <w:i/>
+          <w:sz w:val="24"/>
+        </w:rPr>
+        <w:t>Vingroup</w:t>
+      </w:r>
+      <w:r>
+        <w:rPr>
+          <w:rFonts w:ascii="Times New Roman" w:hAnsi="Times New Roman" w:cs="Times New Roman"/>
+          <w:sz w:val="24"/>
+        </w:rPr>
+        <w:t>) di mata masyarakat Jakarta Barat.</w:t>
+      </w:r>
+    </w:p>
+    <w:p>
+      <w:pPr>
+        <w:keepNext/>
+        <w:spacing w:after="80" w:line="360" w:lineRule="auto"/>
+        <w:ind w:firstLine="425"/>
+        <w:jc w:val="both"/>
+        <w:rPr>
+          <w:rFonts w:ascii="Times New Roman" w:hAnsi="Times New Roman" w:cs="Times New Roman"/>
+          <w:sz w:val="24"/>
+        </w:rPr>
+      </w:pPr>
+      <w:r>
+        <w:rPr>
+          <w:rFonts w:ascii="Times New Roman" w:hAnsi="Times New Roman" w:cs="Times New Roman"/>
+          <w:sz w:val="24"/>
+        </w:rPr>
+        <w:t>2. Citra Pengguna (</w:t>
+      </w:r>
+      <w:r>
+        <w:rPr>
+          <w:rFonts w:ascii="Times New Roman" w:hAnsi="Times New Roman" w:cs="Times New Roman"/>
+          <w:i/>
+          <w:sz w:val="24"/>
+        </w:rPr>
+        <w:t>User Image</w:t>
+      </w:r>
+      <w:r>
+        <w:rPr>
+          <w:rFonts w:ascii="Times New Roman" w:hAnsi="Times New Roman" w:cs="Times New Roman"/>
+          <w:sz w:val="24"/>
+        </w:rPr>
+        <w:t xml:space="preserve">): Persepsi tentang kepribadian, gaya hidup, dan status sosial pengguna taksi </w:t>
+      </w:r>
+      <w:r>
+        <w:rPr>
+          <w:rFonts w:ascii="Times New Roman" w:hAnsi="Times New Roman" w:cs="Times New Roman"/>
+          <w:i/>
+          <w:sz w:val="24"/>
+        </w:rPr>
+        <w:t>Green SM</w:t>
+      </w:r>
+      <w:r>
+        <w:rPr>
+          <w:rFonts w:ascii="Times New Roman" w:hAnsi="Times New Roman" w:cs="Times New Roman"/>
+          <w:sz w:val="24"/>
+        </w:rPr>
+        <w:t>, yaitu sebagai masyarakat modern yang cerdas, peduli terhadap isu lingkungan hidup (</w:t>
+      </w:r>
+      <w:r>
+        <w:rPr>
+          <w:rFonts w:ascii="Times New Roman" w:hAnsi="Times New Roman" w:cs="Times New Roman"/>
+          <w:i/>
+          <w:sz w:val="24"/>
+        </w:rPr>
+        <w:t>eco-friendly</w:t>
+      </w:r>
+      <w:r>
+        <w:rPr>
+          <w:rFonts w:ascii="Times New Roman" w:hAnsi="Times New Roman" w:cs="Times New Roman"/>
+          <w:sz w:val="24"/>
+        </w:rPr>
+        <w:t>), dan melek teknologi (</w:t>
+      </w:r>
+      <w:r>
+        <w:rPr>
+          <w:rFonts w:ascii="Times New Roman" w:hAnsi="Times New Roman" w:cs="Times New Roman"/>
+          <w:i/>
+          <w:sz w:val="24"/>
+        </w:rPr>
+        <w:t>tech-savvy</w:t>
+      </w:r>
+      <w:r>
+        <w:rPr>
+          <w:rFonts w:ascii="Times New Roman" w:hAnsi="Times New Roman" w:cs="Times New Roman"/>
+          <w:sz w:val="24"/>
+        </w:rPr>
+        <w:t>).</w:t>
+      </w:r>
+    </w:p>
+    <w:p>
+      <w:pPr>
+        <w:keepNext/>
+        <w:spacing w:after="80" w:line="360" w:lineRule="auto"/>
+        <w:ind w:firstLine="425"/>
+        <w:jc w:val="both"/>
+        <w:rPr>
+          <w:rFonts w:ascii="Times New Roman" w:hAnsi="Times New Roman" w:cs="Times New Roman"/>
+          <w:sz w:val="24"/>
+        </w:rPr>
+      </w:pPr>
+      <w:r>
+        <w:rPr>
+          <w:rFonts w:ascii="Times New Roman" w:hAnsi="Times New Roman" w:cs="Times New Roman"/>
+          <w:sz w:val="24"/>
+        </w:rPr>
+        <w:t>3. Citra Produk/Armada (</w:t>
+      </w:r>
+      <w:r>
+        <w:rPr>
+          <w:rFonts w:ascii="Times New Roman" w:hAnsi="Times New Roman" w:cs="Times New Roman"/>
+          <w:i/>
+          <w:sz w:val="24"/>
+        </w:rPr>
+        <w:t>Product Image</w:t>
+      </w:r>
+      <w:r>
+        <w:rPr>
+          <w:rFonts w:ascii="Times New Roman" w:hAnsi="Times New Roman" w:cs="Times New Roman"/>
+          <w:sz w:val="24"/>
+        </w:rPr>
+        <w:t xml:space="preserve">): Persepsi mengenai karakteristik fisik dan kualitas atribut armada mobil listrik </w:t>
+      </w:r>
+      <w:r>
+        <w:rPr>
+          <w:rFonts w:ascii="Times New Roman" w:hAnsi="Times New Roman" w:cs="Times New Roman"/>
+          <w:i/>
+          <w:sz w:val="24"/>
+        </w:rPr>
+        <w:t>VinFast VF 5</w:t>
+      </w:r>
+      <w:r>
+        <w:rPr>
+          <w:rFonts w:ascii="Times New Roman" w:hAnsi="Times New Roman" w:cs="Times New Roman"/>
+          <w:sz w:val="24"/>
+        </w:rPr>
+        <w:t xml:space="preserve"> yang dioperasikan </w:t>
+      </w:r>
+      <w:r>
+        <w:rPr>
+          <w:rFonts w:ascii="Times New Roman" w:hAnsi="Times New Roman" w:cs="Times New Roman"/>
+          <w:i/>
+          <w:sz w:val="24"/>
+        </w:rPr>
+        <w:t>Green SM</w:t>
+      </w:r>
+      <w:r>
+        <w:rPr>
+          <w:rFonts w:ascii="Times New Roman" w:hAnsi="Times New Roman" w:cs="Times New Roman"/>
+          <w:sz w:val="24"/>
+        </w:rPr>
+        <w:t>, meliputi tampilan warna hijau toska yang elegan, kebersihan armada, keheningan kabin tanpa polusi suara mesin (</w:t>
+      </w:r>
+      <w:r>
+        <w:rPr>
+          <w:rFonts w:ascii="Times New Roman" w:hAnsi="Times New Roman" w:cs="Times New Roman"/>
+          <w:i/>
+          <w:sz w:val="24"/>
+        </w:rPr>
+        <w:t>zero noise</w:t>
+      </w:r>
+      <w:r>
+        <w:rPr>
+          <w:rFonts w:ascii="Times New Roman" w:hAnsi="Times New Roman" w:cs="Times New Roman"/>
+          <w:sz w:val="24"/>
+        </w:rPr>
+        <w:t>), serta teknologi canggih di dalam kabin.</w:t>
+      </w:r>
+    </w:p>
+    <w:p>
+      <w:pPr>
+        <w:keepNext/>
+        <w:spacing w:after="120" w:line="360" w:lineRule="auto"/>
+        <w:rPr>
+          <w:rFonts w:ascii="Times New Roman" w:hAnsi="Times New Roman" w:cs="Times New Roman"/>
+          <w:b/>
+          <w:sz w:val="24"/>
+        </w:rPr>
+      </w:pPr>
+      <w:r>
+        <w:rPr>
+          <w:rFonts w:ascii="Times New Roman" w:hAnsi="Times New Roman" w:cs="Times New Roman"/>
+          <w:b/>
+          <w:sz w:val="24"/>
+        </w:rPr>
+        <w:t>2.1.4 Kepercayaan Merek (</w:t>
+      </w:r>
+      <w:r>
+        <w:rPr>
+          <w:rFonts w:ascii="Times New Roman" w:hAnsi="Times New Roman" w:cs="Times New Roman"/>
+          <w:b/>
+          <w:i/>
+          <w:sz w:val="24"/>
+        </w:rPr>
+        <w:t>Brand Trust</w:t>
+      </w:r>
+      <w:r>
+        <w:rPr>
+          <w:rFonts w:ascii="Times New Roman" w:hAnsi="Times New Roman" w:cs="Times New Roman"/>
+          <w:b/>
+          <w:sz w:val="24"/>
+        </w:rPr>
+        <w:t>)</w:t>
       </w:r>
     </w:p>
     <w:p>
@@ -5586,22 +5874,71 @@
           <w:rFonts w:ascii="Times New Roman" w:hAnsi="Times New Roman" w:cs="Times New Roman"/>
           <w:sz w:val="24"/>
         </w:rPr>
-        <w:t xml:space="preserve">Berdasarkan sintesis Keller dan Swaminathan (2020) serta Aaker (1996), dimensi dan indikator baku </w:t>
-      </w:r>
-      <w:r>
-        <w:rPr>
-          <w:rFonts w:ascii="Times New Roman" w:hAnsi="Times New Roman" w:cs="Times New Roman"/>
-          <w:i/>
-          <w:sz w:val="24"/>
-        </w:rPr>
-        <w:t>Brand Image</w:t>
-      </w:r>
-      <w:r>
-        <w:rPr>
-          <w:rFonts w:ascii="Times New Roman" w:hAnsi="Times New Roman" w:cs="Times New Roman"/>
-          <w:sz w:val="24"/>
-        </w:rPr>
-        <w:t xml:space="preserve"> dalam penelitian ini terdiri atas:</w:t>
+        <w:t xml:space="preserve">Kotler, Keller, dan Chernev (2022) serta Adha dan Suhardi (2025) mendefinisikan </w:t>
+      </w:r>
+      <w:r>
+        <w:rPr>
+          <w:rFonts w:ascii="Times New Roman" w:hAnsi="Times New Roman" w:cs="Times New Roman"/>
+          <w:i/>
+          <w:sz w:val="24"/>
+        </w:rPr>
+        <w:t>Brand Trust</w:t>
+      </w:r>
+      <w:r>
+        <w:rPr>
+          <w:rFonts w:ascii="Times New Roman" w:hAnsi="Times New Roman" w:cs="Times New Roman"/>
+          <w:sz w:val="24"/>
+        </w:rPr>
+        <w:t xml:space="preserve"> sebagai kesediaan konsumen untuk mempercayai dan mengandalkan kemampuan suatu merek dalam menjalankan fungsi yang telah dinyatakannya secara konsisten (willingness to rely on the ability of the brand to perform its stated function). Kepercayaan merupakan variabel relasional yang sangat berharga dalam konteks industri jasa transportasi, di mana konsumen menyerahkan keselamatan fisik dan ketepatan waktu perjalanannya kepada operator penyedia jasa.</w:t>
+      </w:r>
+    </w:p>
+    <w:p>
+      <w:pPr>
+        <w:keepNext/>
+        <w:spacing w:after="120" w:line="360" w:lineRule="auto"/>
+        <w:ind w:firstLine="709"/>
+        <w:jc w:val="both"/>
+        <w:rPr>
+          <w:rFonts w:ascii="Times New Roman" w:hAnsi="Times New Roman" w:cs="Times New Roman"/>
+          <w:sz w:val="24"/>
+        </w:rPr>
+      </w:pPr>
+      <w:r>
+        <w:rPr>
+          <w:rFonts w:ascii="Times New Roman" w:hAnsi="Times New Roman" w:cs="Times New Roman"/>
+          <w:sz w:val="24"/>
+        </w:rPr>
+        <w:t xml:space="preserve">Dalam literatur pemasaran relasional mutakhir (Kotler </w:t>
+      </w:r>
+      <w:r>
+        <w:rPr>
+          <w:rFonts w:ascii="Times New Roman" w:hAnsi="Times New Roman" w:cs="Times New Roman"/>
+          <w:i/>
+          <w:sz w:val="24"/>
+        </w:rPr>
+        <w:t>et al.</w:t>
+      </w:r>
+      <w:r>
+        <w:rPr>
+          <w:rFonts w:ascii="Times New Roman" w:hAnsi="Times New Roman" w:cs="Times New Roman"/>
+          <w:sz w:val="24"/>
+        </w:rPr>
+        <w:t xml:space="preserve">, 2022; Hera &amp; Fourqoniah, 2023; Fadila &amp; Wahyuni, 2025), konstruk </w:t>
+      </w:r>
+      <w:r>
+        <w:rPr>
+          <w:rFonts w:ascii="Times New Roman" w:hAnsi="Times New Roman" w:cs="Times New Roman"/>
+          <w:i/>
+          <w:sz w:val="24"/>
+        </w:rPr>
+        <w:t>brand trust</w:t>
+      </w:r>
+      <w:r>
+        <w:rPr>
+          <w:rFonts w:ascii="Times New Roman" w:hAnsi="Times New Roman" w:cs="Times New Roman"/>
+          <w:sz w:val="24"/>
+        </w:rPr>
+        <w:t xml:space="preserve"> dibangun melalui dua dimensi utama:</w:t>
       </w:r>
     </w:p>
     <w:p>
@@ -5620,37 +5957,37 @@
           <w:rFonts w:ascii="Times New Roman" w:hAnsi="Times New Roman" w:cs="Times New Roman"/>
           <w:sz w:val="24"/>
         </w:rPr>
-        <w:t>1. Citra Perusahaan (</w:t>
-      </w:r>
-      <w:r>
-        <w:rPr>
-          <w:rFonts w:ascii="Times New Roman" w:hAnsi="Times New Roman" w:cs="Times New Roman"/>
-          <w:i/>
-          <w:sz w:val="24"/>
-        </w:rPr>
-        <w:t>Corporate Image</w:t>
-      </w:r>
-      <w:r>
-        <w:rPr>
-          <w:rFonts w:ascii="Times New Roman" w:hAnsi="Times New Roman" w:cs="Times New Roman"/>
-          <w:sz w:val="24"/>
-        </w:rPr>
-        <w:t xml:space="preserve">): Persepsi konsumen terhadap reputasi, kredibilitas, profesionalisme, dan skala operasional korporasi penyedia jasa (PT Xanh SM / </w:t>
-      </w:r>
-      <w:r>
-        <w:rPr>
-          <w:rFonts w:ascii="Times New Roman" w:hAnsi="Times New Roman" w:cs="Times New Roman"/>
-          <w:i/>
-          <w:sz w:val="24"/>
-        </w:rPr>
-        <w:t>Vingroup</w:t>
-      </w:r>
-      <w:r>
-        <w:rPr>
-          <w:rFonts w:ascii="Times New Roman" w:hAnsi="Times New Roman" w:cs="Times New Roman"/>
-          <w:sz w:val="24"/>
-        </w:rPr>
-        <w:t>) di mata masyarakat Jakarta Barat.</w:t>
+        <w:t>1. Keandalan Merek (</w:t>
+      </w:r>
+      <w:r>
+        <w:rPr>
+          <w:rFonts w:ascii="Times New Roman" w:hAnsi="Times New Roman" w:cs="Times New Roman"/>
+          <w:i/>
+          <w:sz w:val="24"/>
+        </w:rPr>
+        <w:t>Brand Reliability</w:t>
+      </w:r>
+      <w:r>
+        <w:rPr>
+          <w:rFonts w:ascii="Times New Roman" w:hAnsi="Times New Roman" w:cs="Times New Roman"/>
+          <w:sz w:val="24"/>
+        </w:rPr>
+        <w:t xml:space="preserve">): Keyakinan kognitif konsumen bahwa merek mampu dan kompeten dalam memenuhi janji layanannya secara konsisten. Dalam konteks taksi </w:t>
+      </w:r>
+      <w:r>
+        <w:rPr>
+          <w:rFonts w:ascii="Times New Roman" w:hAnsi="Times New Roman" w:cs="Times New Roman"/>
+          <w:i/>
+          <w:sz w:val="24"/>
+        </w:rPr>
+        <w:t>Green SM</w:t>
+      </w:r>
+      <w:r>
+        <w:rPr>
+          <w:rFonts w:ascii="Times New Roman" w:hAnsi="Times New Roman" w:cs="Times New Roman"/>
+          <w:sz w:val="24"/>
+        </w:rPr>
+        <w:t>, keandalan ini tecermin dari ketepatan waktu penjemputan armada, ketersediaan unit di sekitar wilayah Jakarta Barat, stabilitas aplikasi pemesanan digital, dan kepastian argo tarif yang adil dan transparan.</w:t>
       </w:r>
     </w:p>
     <w:p>
@@ -5669,22 +6006,22 @@
           <w:rFonts w:ascii="Times New Roman" w:hAnsi="Times New Roman" w:cs="Times New Roman"/>
           <w:sz w:val="24"/>
         </w:rPr>
-        <w:t>2. Citra Pengguna (</w:t>
-      </w:r>
-      <w:r>
-        <w:rPr>
-          <w:rFonts w:ascii="Times New Roman" w:hAnsi="Times New Roman" w:cs="Times New Roman"/>
-          <w:i/>
-          <w:sz w:val="24"/>
-        </w:rPr>
-        <w:t>User Image</w:t>
-      </w:r>
-      <w:r>
-        <w:rPr>
-          <w:rFonts w:ascii="Times New Roman" w:hAnsi="Times New Roman" w:cs="Times New Roman"/>
-          <w:sz w:val="24"/>
-        </w:rPr>
-        <w:t xml:space="preserve">): Persepsi tentang kepribadian, gaya hidup, dan status sosial pengguna taksi </w:t>
+        <w:t>2. Itikad Baik / Integritas Merek (</w:t>
+      </w:r>
+      <w:r>
+        <w:rPr>
+          <w:rFonts w:ascii="Times New Roman" w:hAnsi="Times New Roman" w:cs="Times New Roman"/>
+          <w:i/>
+          <w:sz w:val="24"/>
+        </w:rPr>
+        <w:t>Brand Intentions</w:t>
+      </w:r>
+      <w:r>
+        <w:rPr>
+          <w:rFonts w:ascii="Times New Roman" w:hAnsi="Times New Roman" w:cs="Times New Roman"/>
+          <w:sz w:val="24"/>
+        </w:rPr>
+        <w:t xml:space="preserve"> / Benevolence): Keyakinan emosional konsumen bahwa perusahaan memiliki itikad baik untuk mengutamakan kepentingan, kenyamanan, dan keselamatan konsumen di atas sekadar mengejar profitabilitas jangka pendek. Hal ini diwujudkan dalam keramahan dan kejujuran mitra pengemudi </w:t>
       </w:r>
       <w:r>
         <w:rPr>
@@ -5699,37 +6036,71 @@
           <w:rFonts w:ascii="Times New Roman" w:hAnsi="Times New Roman" w:cs="Times New Roman"/>
           <w:sz w:val="24"/>
         </w:rPr>
-        <w:t>, yaitu sebagai masyarakat modern yang cerdas, peduli terhadap isu lingkungan hidup (</w:t>
-      </w:r>
-      <w:r>
-        <w:rPr>
-          <w:rFonts w:ascii="Times New Roman" w:hAnsi="Times New Roman" w:cs="Times New Roman"/>
-          <w:i/>
-          <w:sz w:val="24"/>
-        </w:rPr>
-        <w:t>eco-friendly</w:t>
-      </w:r>
-      <w:r>
-        <w:rPr>
-          <w:rFonts w:ascii="Times New Roman" w:hAnsi="Times New Roman" w:cs="Times New Roman"/>
-          <w:sz w:val="24"/>
-        </w:rPr>
-        <w:t>), dan melek teknologi (</w:t>
-      </w:r>
-      <w:r>
-        <w:rPr>
-          <w:rFonts w:ascii="Times New Roman" w:hAnsi="Times New Roman" w:cs="Times New Roman"/>
-          <w:i/>
-          <w:sz w:val="24"/>
-        </w:rPr>
-        <w:t>tech-savvy</w:t>
-      </w:r>
-      <w:r>
-        <w:rPr>
-          <w:rFonts w:ascii="Times New Roman" w:hAnsi="Times New Roman" w:cs="Times New Roman"/>
-          <w:sz w:val="24"/>
-        </w:rPr>
-        <w:t>).</w:t>
+        <w:t>, respon cepat layanan pelanggan (</w:t>
+      </w:r>
+      <w:r>
+        <w:rPr>
+          <w:rFonts w:ascii="Times New Roman" w:hAnsi="Times New Roman" w:cs="Times New Roman"/>
+          <w:i/>
+          <w:sz w:val="24"/>
+        </w:rPr>
+        <w:t>customer care</w:t>
+      </w:r>
+      <w:r>
+        <w:rPr>
+          <w:rFonts w:ascii="Times New Roman" w:hAnsi="Times New Roman" w:cs="Times New Roman"/>
+          <w:sz w:val="24"/>
+        </w:rPr>
+        <w:t>), serta jaminan ganti rugi apabila terjadi kendala operasional.</w:t>
+      </w:r>
+    </w:p>
+    <w:p>
+      <w:pPr>
+        <w:keepNext/>
+        <w:spacing w:after="120" w:line="360" w:lineRule="auto"/>
+        <w:ind w:firstLine="709"/>
+        <w:jc w:val="both"/>
+        <w:rPr>
+          <w:rFonts w:ascii="Times New Roman" w:hAnsi="Times New Roman" w:cs="Times New Roman"/>
+          <w:sz w:val="24"/>
+        </w:rPr>
+      </w:pPr>
+      <w:r>
+        <w:rPr>
+          <w:rFonts w:ascii="Times New Roman" w:hAnsi="Times New Roman" w:cs="Times New Roman"/>
+          <w:sz w:val="24"/>
+        </w:rPr>
+        <w:t xml:space="preserve">Dimensi dan indikator baku </w:t>
+      </w:r>
+      <w:r>
+        <w:rPr>
+          <w:rFonts w:ascii="Times New Roman" w:hAnsi="Times New Roman" w:cs="Times New Roman"/>
+          <w:i/>
+          <w:sz w:val="24"/>
+        </w:rPr>
+        <w:t>Brand Trust</w:t>
+      </w:r>
+      <w:r>
+        <w:rPr>
+          <w:rFonts w:ascii="Times New Roman" w:hAnsi="Times New Roman" w:cs="Times New Roman"/>
+          <w:sz w:val="24"/>
+        </w:rPr>
+        <w:t xml:space="preserve"> dalam penelitian ini diadaptasi dari Kotler </w:t>
+      </w:r>
+      <w:r>
+        <w:rPr>
+          <w:rFonts w:ascii="Times New Roman" w:hAnsi="Times New Roman" w:cs="Times New Roman"/>
+          <w:i/>
+          <w:sz w:val="24"/>
+        </w:rPr>
+        <w:t>et al.</w:t>
+      </w:r>
+      <w:r>
+        <w:rPr>
+          <w:rFonts w:ascii="Times New Roman" w:hAnsi="Times New Roman" w:cs="Times New Roman"/>
+          <w:sz w:val="24"/>
+        </w:rPr>
+        <w:t xml:space="preserve"> (2022), Hera dan Fourqoniah (2023), serta Adha dan Suhardi (2025):</w:t>
       </w:r>
     </w:p>
     <w:p>
@@ -5748,37 +6119,7 @@
           <w:rFonts w:ascii="Times New Roman" w:hAnsi="Times New Roman" w:cs="Times New Roman"/>
           <w:sz w:val="24"/>
         </w:rPr>
-        <w:t>3. Citra Produk/Armada (</w:t>
-      </w:r>
-      <w:r>
-        <w:rPr>
-          <w:rFonts w:ascii="Times New Roman" w:hAnsi="Times New Roman" w:cs="Times New Roman"/>
-          <w:i/>
-          <w:sz w:val="24"/>
-        </w:rPr>
-        <w:t>Product Image</w:t>
-      </w:r>
-      <w:r>
-        <w:rPr>
-          <w:rFonts w:ascii="Times New Roman" w:hAnsi="Times New Roman" w:cs="Times New Roman"/>
-          <w:sz w:val="24"/>
-        </w:rPr>
-        <w:t xml:space="preserve">): Persepsi mengenai karakteristik fisik dan kualitas atribut armada mobil listrik </w:t>
-      </w:r>
-      <w:r>
-        <w:rPr>
-          <w:rFonts w:ascii="Times New Roman" w:hAnsi="Times New Roman" w:cs="Times New Roman"/>
-          <w:i/>
-          <w:sz w:val="24"/>
-        </w:rPr>
-        <w:t>VinFast VF 5</w:t>
-      </w:r>
-      <w:r>
-        <w:rPr>
-          <w:rFonts w:ascii="Times New Roman" w:hAnsi="Times New Roman" w:cs="Times New Roman"/>
-          <w:sz w:val="24"/>
-        </w:rPr>
-        <w:t xml:space="preserve"> yang dioperasikan </w:t>
+        <w:t xml:space="preserve">1. Keyakinan bahwa taksi </w:t>
       </w:r>
       <w:r>
         <w:rPr>
@@ -5793,22 +6134,169 @@
           <w:rFonts w:ascii="Times New Roman" w:hAnsi="Times New Roman" w:cs="Times New Roman"/>
           <w:sz w:val="24"/>
         </w:rPr>
-        <w:t>, meliputi tampilan warna hijau toska yang elegan, kebersihan armada, keheningan kabin tanpa polusi suara mesin (</w:t>
-      </w:r>
-      <w:r>
-        <w:rPr>
-          <w:rFonts w:ascii="Times New Roman" w:hAnsi="Times New Roman" w:cs="Times New Roman"/>
-          <w:i/>
-          <w:sz w:val="24"/>
-        </w:rPr>
-        <w:t>zero noise</w:t>
-      </w:r>
-      <w:r>
-        <w:rPr>
-          <w:rFonts w:ascii="Times New Roman" w:hAnsi="Times New Roman" w:cs="Times New Roman"/>
-          <w:sz w:val="24"/>
-        </w:rPr>
-        <w:t>), serta teknologi canggih di dalam kabin.</w:t>
+        <w:t xml:space="preserve"> selalu memenuhi janji layanannya (</w:t>
+      </w:r>
+      <w:r>
+        <w:rPr>
+          <w:rFonts w:ascii="Times New Roman" w:hAnsi="Times New Roman" w:cs="Times New Roman"/>
+          <w:i/>
+          <w:sz w:val="24"/>
+        </w:rPr>
+        <w:t>brand reliability</w:t>
+      </w:r>
+      <w:r>
+        <w:rPr>
+          <w:rFonts w:ascii="Times New Roman" w:hAnsi="Times New Roman" w:cs="Times New Roman"/>
+          <w:sz w:val="24"/>
+        </w:rPr>
+        <w:t>).</w:t>
+      </w:r>
+    </w:p>
+    <w:p>
+      <w:pPr>
+        <w:keepNext/>
+        <w:spacing w:after="80" w:line="360" w:lineRule="auto"/>
+        <w:ind w:firstLine="425"/>
+        <w:jc w:val="both"/>
+        <w:rPr>
+          <w:rFonts w:ascii="Times New Roman" w:hAnsi="Times New Roman" w:cs="Times New Roman"/>
+          <w:sz w:val="24"/>
+        </w:rPr>
+      </w:pPr>
+      <w:r>
+        <w:rPr>
+          <w:rFonts w:ascii="Times New Roman" w:hAnsi="Times New Roman" w:cs="Times New Roman"/>
+          <w:sz w:val="24"/>
+        </w:rPr>
+        <w:t xml:space="preserve">2. Keyakinan bahwa tarif taksi </w:t>
+      </w:r>
+      <w:r>
+        <w:rPr>
+          <w:rFonts w:ascii="Times New Roman" w:hAnsi="Times New Roman" w:cs="Times New Roman"/>
+          <w:i/>
+          <w:sz w:val="24"/>
+        </w:rPr>
+        <w:t>Green SM</w:t>
+      </w:r>
+      <w:r>
+        <w:rPr>
+          <w:rFonts w:ascii="Times New Roman" w:hAnsi="Times New Roman" w:cs="Times New Roman"/>
+          <w:sz w:val="24"/>
+        </w:rPr>
+        <w:t xml:space="preserve"> transparan, jujur, dan tidak merugikan konsumen (</w:t>
+      </w:r>
+      <w:r>
+        <w:rPr>
+          <w:rFonts w:ascii="Times New Roman" w:hAnsi="Times New Roman" w:cs="Times New Roman"/>
+          <w:i/>
+          <w:sz w:val="24"/>
+        </w:rPr>
+        <w:t>financial integrity</w:t>
+      </w:r>
+      <w:r>
+        <w:rPr>
+          <w:rFonts w:ascii="Times New Roman" w:hAnsi="Times New Roman" w:cs="Times New Roman"/>
+          <w:sz w:val="24"/>
+        </w:rPr>
+        <w:t>).</w:t>
+      </w:r>
+    </w:p>
+    <w:p>
+      <w:pPr>
+        <w:keepNext/>
+        <w:spacing w:after="80" w:line="360" w:lineRule="auto"/>
+        <w:ind w:firstLine="425"/>
+        <w:jc w:val="both"/>
+        <w:rPr>
+          <w:rFonts w:ascii="Times New Roman" w:hAnsi="Times New Roman" w:cs="Times New Roman"/>
+          <w:sz w:val="24"/>
+        </w:rPr>
+      </w:pPr>
+      <w:r>
+        <w:rPr>
+          <w:rFonts w:ascii="Times New Roman" w:hAnsi="Times New Roman" w:cs="Times New Roman"/>
+          <w:sz w:val="24"/>
+        </w:rPr>
+        <w:t xml:space="preserve">3. Keyakinan atas kompetensi dan profesionalisme pengemudi </w:t>
+      </w:r>
+      <w:r>
+        <w:rPr>
+          <w:rFonts w:ascii="Times New Roman" w:hAnsi="Times New Roman" w:cs="Times New Roman"/>
+          <w:i/>
+          <w:sz w:val="24"/>
+        </w:rPr>
+        <w:t>Green SM</w:t>
+      </w:r>
+      <w:r>
+        <w:rPr>
+          <w:rFonts w:ascii="Times New Roman" w:hAnsi="Times New Roman" w:cs="Times New Roman"/>
+          <w:sz w:val="24"/>
+        </w:rPr>
+        <w:t xml:space="preserve"> dalam melayani perjalanan (</w:t>
+      </w:r>
+      <w:r>
+        <w:rPr>
+          <w:rFonts w:ascii="Times New Roman" w:hAnsi="Times New Roman" w:cs="Times New Roman"/>
+          <w:i/>
+          <w:sz w:val="24"/>
+        </w:rPr>
+        <w:t>driver competence</w:t>
+      </w:r>
+      <w:r>
+        <w:rPr>
+          <w:rFonts w:ascii="Times New Roman" w:hAnsi="Times New Roman" w:cs="Times New Roman"/>
+          <w:sz w:val="24"/>
+        </w:rPr>
+        <w:t>).</w:t>
+      </w:r>
+    </w:p>
+    <w:p>
+      <w:pPr>
+        <w:keepNext/>
+        <w:spacing w:after="80" w:line="360" w:lineRule="auto"/>
+        <w:ind w:firstLine="425"/>
+        <w:jc w:val="both"/>
+        <w:rPr>
+          <w:rFonts w:ascii="Times New Roman" w:hAnsi="Times New Roman" w:cs="Times New Roman"/>
+          <w:sz w:val="24"/>
+        </w:rPr>
+      </w:pPr>
+      <w:r>
+        <w:rPr>
+          <w:rFonts w:ascii="Times New Roman" w:hAnsi="Times New Roman" w:cs="Times New Roman"/>
+          <w:sz w:val="24"/>
+        </w:rPr>
+        <w:t xml:space="preserve">4. Rasa percaya bahwa </w:t>
+      </w:r>
+      <w:r>
+        <w:rPr>
+          <w:rFonts w:ascii="Times New Roman" w:hAnsi="Times New Roman" w:cs="Times New Roman"/>
+          <w:i/>
+          <w:sz w:val="24"/>
+        </w:rPr>
+        <w:t>Green SM</w:t>
+      </w:r>
+      <w:r>
+        <w:rPr>
+          <w:rFonts w:ascii="Times New Roman" w:hAnsi="Times New Roman" w:cs="Times New Roman"/>
+          <w:sz w:val="24"/>
+        </w:rPr>
+        <w:t xml:space="preserve"> peduli terhadap kenyamanan dan kesejahteraan penumpangnya (</w:t>
+      </w:r>
+      <w:r>
+        <w:rPr>
+          <w:rFonts w:ascii="Times New Roman" w:hAnsi="Times New Roman" w:cs="Times New Roman"/>
+          <w:i/>
+          <w:sz w:val="24"/>
+        </w:rPr>
+        <w:t>brand benevolence</w:t>
+      </w:r>
+      <w:r>
+        <w:rPr>
+          <w:rFonts w:ascii="Times New Roman" w:hAnsi="Times New Roman" w:cs="Times New Roman"/>
+          <w:sz w:val="24"/>
+        </w:rPr>
+        <w:t>).</w:t>
       </w:r>
     </w:p>
     <w:p>
@@ -5827,7 +6315,7 @@
           <w:b/>
           <w:sz w:val="24"/>
         </w:rPr>
-        <w:t>2.1.4 Kepercayaan Merek (</w:t>
+        <w:t>2.1.5 Persepsi Keamanan dan Keselamatan (</w:t>
       </w:r>
       <w:r>
         <w:rPr>
@@ -5836,7 +6324,7 @@
           <w:i/>
           <w:sz w:val="24"/>
         </w:rPr>
-        <w:t>Brand Trust</w:t>
+        <w:t>Perceived Safety</w:t>
       </w:r>
       <w:r>
         <w:rPr>
@@ -5863,22 +6351,22 @@
           <w:rFonts w:ascii="Times New Roman" w:hAnsi="Times New Roman" w:cs="Times New Roman"/>
           <w:sz w:val="24"/>
         </w:rPr>
-        <w:t xml:space="preserve">Chaudhuri dan Holbrook (2001) mendefinisikan </w:t>
-      </w:r>
-      <w:r>
-        <w:rPr>
-          <w:rFonts w:ascii="Times New Roman" w:hAnsi="Times New Roman" w:cs="Times New Roman"/>
-          <w:i/>
-          <w:sz w:val="24"/>
-        </w:rPr>
-        <w:t>Brand Trust</w:t>
-      </w:r>
-      <w:r>
-        <w:rPr>
-          <w:rFonts w:ascii="Times New Roman" w:hAnsi="Times New Roman" w:cs="Times New Roman"/>
-          <w:sz w:val="24"/>
-        </w:rPr>
-        <w:t xml:space="preserve"> sebagai kesediaan rata-rata konsumen untuk mengandalkan kemampuan suatu merek dalam menjalankan fungsi yang telah dinyatakannya (willingness of the average consumer to rely on the ability of the brand to perform its stated function). Kepercayaan merupakan variabel relasional yang sangat berharga dalam konteks industri jasa transportasi, di mana konsumen menyerahkan keselamatan fisik dan ketepatan waktu perjalanannya kepada operator penyedia jasa.</w:t>
+        <w:t>Dalam industri transportasi penumpang, keselamatan merupakan kebutuhan paling mendasar (</w:t>
+      </w:r>
+      <w:r>
+        <w:rPr>
+          <w:rFonts w:ascii="Times New Roman" w:hAnsi="Times New Roman" w:cs="Times New Roman"/>
+          <w:i/>
+          <w:sz w:val="24"/>
+        </w:rPr>
+        <w:t>core benefit</w:t>
+      </w:r>
+      <w:r>
+        <w:rPr>
+          <w:rFonts w:ascii="Times New Roman" w:hAnsi="Times New Roman" w:cs="Times New Roman"/>
+          <w:sz w:val="24"/>
+        </w:rPr>
+        <w:t>) yang tidak dapat dikompromikan. Zeithaml, Bitner, dan Gremler (2023) serta Tjiptono (2022) menempatkan dimensi keamanan (security) sebagai komponen vital dalam evaluasi mutu jasa, yang mencakup kebebasan dari bahaya, risiko fisik, atau keraguan (freedom from danger, risk, or doubt).</w:t>
       </w:r>
     </w:p>
     <w:p>
@@ -5897,150 +6385,37 @@
           <w:rFonts w:ascii="Times New Roman" w:hAnsi="Times New Roman" w:cs="Times New Roman"/>
           <w:sz w:val="24"/>
         </w:rPr>
-        <w:t xml:space="preserve">Morgan dan Hunt (1994) melalui </w:t>
-      </w:r>
-      <w:r>
-        <w:rPr>
-          <w:rFonts w:ascii="Times New Roman" w:hAnsi="Times New Roman" w:cs="Times New Roman"/>
-          <w:i/>
-          <w:sz w:val="24"/>
-        </w:rPr>
-        <w:t>Commitment-Trust Theory</w:t>
-      </w:r>
-      <w:r>
-        <w:rPr>
-          <w:rFonts w:ascii="Times New Roman" w:hAnsi="Times New Roman" w:cs="Times New Roman"/>
-          <w:sz w:val="24"/>
-        </w:rPr>
-        <w:t xml:space="preserve"> menyatakan bahwa kepercayaan tercipta ketika salah satu pihak memiliki keyakinan penuh terhadap keandalan (reliability) dan integritas (integrity) mitra pertukarannya. Delgado-Ballester, Munuera-Alemán, dan Yagüe-Guillén (2003) mengembangkan konstruk </w:t>
-      </w:r>
-      <w:r>
-        <w:rPr>
-          <w:rFonts w:ascii="Times New Roman" w:hAnsi="Times New Roman" w:cs="Times New Roman"/>
-          <w:i/>
-          <w:sz w:val="24"/>
-        </w:rPr>
-        <w:t>brand trust</w:t>
-      </w:r>
-      <w:r>
-        <w:rPr>
-          <w:rFonts w:ascii="Times New Roman" w:hAnsi="Times New Roman" w:cs="Times New Roman"/>
-          <w:sz w:val="24"/>
-        </w:rPr>
-        <w:t xml:space="preserve"> ke dalam dua dimensi utama:</w:t>
-      </w:r>
-    </w:p>
-    <w:p>
-      <w:pPr>
-        <w:keepNext/>
-        <w:spacing w:after="80" w:line="360" w:lineRule="auto"/>
-        <w:ind w:firstLine="425"/>
-        <w:jc w:val="both"/>
-        <w:rPr>
-          <w:rFonts w:ascii="Times New Roman" w:hAnsi="Times New Roman" w:cs="Times New Roman"/>
-          <w:sz w:val="24"/>
-        </w:rPr>
-      </w:pPr>
-      <w:r>
-        <w:rPr>
-          <w:rFonts w:ascii="Times New Roman" w:hAnsi="Times New Roman" w:cs="Times New Roman"/>
-          <w:sz w:val="24"/>
-        </w:rPr>
-        <w:t>1. Keandalan Merek (</w:t>
-      </w:r>
-      <w:r>
-        <w:rPr>
-          <w:rFonts w:ascii="Times New Roman" w:hAnsi="Times New Roman" w:cs="Times New Roman"/>
-          <w:i/>
-          <w:sz w:val="24"/>
-        </w:rPr>
-        <w:t>Brand Reliability</w:t>
-      </w:r>
-      <w:r>
-        <w:rPr>
-          <w:rFonts w:ascii="Times New Roman" w:hAnsi="Times New Roman" w:cs="Times New Roman"/>
-          <w:sz w:val="24"/>
-        </w:rPr>
-        <w:t xml:space="preserve">): Keyakinan kognitif konsumen bahwa merek mampu dan kompeten dalam memenuhi janji layanannya secara konsisten. Dalam konteks taksi </w:t>
-      </w:r>
-      <w:r>
-        <w:rPr>
-          <w:rFonts w:ascii="Times New Roman" w:hAnsi="Times New Roman" w:cs="Times New Roman"/>
-          <w:i/>
-          <w:sz w:val="24"/>
-        </w:rPr>
-        <w:t>Green SM</w:t>
-      </w:r>
-      <w:r>
-        <w:rPr>
-          <w:rFonts w:ascii="Times New Roman" w:hAnsi="Times New Roman" w:cs="Times New Roman"/>
-          <w:sz w:val="24"/>
-        </w:rPr>
-        <w:t>, keandalan ini tecermin dari ketepatan waktu penjemputan armada, ketersediaan unit di sekitar wilayah Jakarta Barat, stabilitas aplikasi pemesanan digital, dan kepastian argo tarif yang adil dan transparan.</w:t>
-      </w:r>
-    </w:p>
-    <w:p>
-      <w:pPr>
-        <w:keepNext/>
-        <w:spacing w:after="80" w:line="360" w:lineRule="auto"/>
-        <w:ind w:firstLine="425"/>
-        <w:jc w:val="both"/>
-        <w:rPr>
-          <w:rFonts w:ascii="Times New Roman" w:hAnsi="Times New Roman" w:cs="Times New Roman"/>
-          <w:sz w:val="24"/>
-        </w:rPr>
-      </w:pPr>
-      <w:r>
-        <w:rPr>
-          <w:rFonts w:ascii="Times New Roman" w:hAnsi="Times New Roman" w:cs="Times New Roman"/>
-          <w:sz w:val="24"/>
-        </w:rPr>
-        <w:t>2. Itikad Baik / Integritas Merek (</w:t>
-      </w:r>
-      <w:r>
-        <w:rPr>
-          <w:rFonts w:ascii="Times New Roman" w:hAnsi="Times New Roman" w:cs="Times New Roman"/>
-          <w:i/>
-          <w:sz w:val="24"/>
-        </w:rPr>
-        <w:t>Brand Intentions</w:t>
-      </w:r>
-      <w:r>
-        <w:rPr>
-          <w:rFonts w:ascii="Times New Roman" w:hAnsi="Times New Roman" w:cs="Times New Roman"/>
-          <w:sz w:val="24"/>
-        </w:rPr>
-        <w:t xml:space="preserve"> / Benevolence): Keyakinan emosional konsumen bahwa perusahaan memiliki itikad baik untuk mengutamakan kepentingan, kenyamanan, dan keselamatan konsumen di atas sekadar mengejar profitabilitas jangka pendek. Hal ini diwujudkan dalam keramahan dan kejujuran mitra pengemudi </w:t>
-      </w:r>
-      <w:r>
-        <w:rPr>
-          <w:rFonts w:ascii="Times New Roman" w:hAnsi="Times New Roman" w:cs="Times New Roman"/>
-          <w:i/>
-          <w:sz w:val="24"/>
-        </w:rPr>
-        <w:t>Green SM</w:t>
-      </w:r>
-      <w:r>
-        <w:rPr>
-          <w:rFonts w:ascii="Times New Roman" w:hAnsi="Times New Roman" w:cs="Times New Roman"/>
-          <w:sz w:val="24"/>
-        </w:rPr>
-        <w:t>, respon cepat layanan pelanggan (</w:t>
-      </w:r>
-      <w:r>
-        <w:rPr>
-          <w:rFonts w:ascii="Times New Roman" w:hAnsi="Times New Roman" w:cs="Times New Roman"/>
-          <w:i/>
-          <w:sz w:val="24"/>
-        </w:rPr>
-        <w:t>customer care</w:t>
-      </w:r>
-      <w:r>
-        <w:rPr>
-          <w:rFonts w:ascii="Times New Roman" w:hAnsi="Times New Roman" w:cs="Times New Roman"/>
-          <w:sz w:val="24"/>
-        </w:rPr>
-        <w:t>), serta jaminan ganti rugi apabila terjadi kendala operasional.</w:t>
+        <w:t xml:space="preserve">Dalam konteks transportasi darat modern, </w:t>
+      </w:r>
+      <w:r>
+        <w:rPr>
+          <w:rFonts w:ascii="Times New Roman" w:hAnsi="Times New Roman" w:cs="Times New Roman"/>
+          <w:i/>
+          <w:sz w:val="24"/>
+        </w:rPr>
+        <w:t>Perceived Safety</w:t>
+      </w:r>
+      <w:r>
+        <w:rPr>
+          <w:rFonts w:ascii="Times New Roman" w:hAnsi="Times New Roman" w:cs="Times New Roman"/>
+          <w:sz w:val="24"/>
+        </w:rPr>
+        <w:t xml:space="preserve"> didefinisikan sebagai penilaian subjektif penumpang mengenai sejauh mana perjalanan bersama suatu moda transportasi terlindungi dari ancaman fisik, kecelakaan lalu lintas, tindak kriminalitas, serta kegagalan teknis armada (Wijaya &amp; Pahar, 2022; Adha &amp; Suhardi, 2025). Khusus untuk armada taksi listrik murni (</w:t>
+      </w:r>
+      <w:r>
+        <w:rPr>
+          <w:rFonts w:ascii="Times New Roman" w:hAnsi="Times New Roman" w:cs="Times New Roman"/>
+          <w:i/>
+          <w:sz w:val="24"/>
+        </w:rPr>
+        <w:t>pure electric vehicle</w:t>
+      </w:r>
+      <w:r>
+        <w:rPr>
+          <w:rFonts w:ascii="Times New Roman" w:hAnsi="Times New Roman" w:cs="Times New Roman"/>
+          <w:sz w:val="24"/>
+        </w:rPr>
+        <w:t xml:space="preserve"> / EV), persepsi keselamatan penumpang memiliki karakteristik unik yang mencakup evaluasi terhadap keandalan teknologi baterai dan sistem keselamatan elektrik kendaraan.</w:t>
       </w:r>
     </w:p>
     <w:p>
@@ -6059,22 +6434,7 @@
           <w:rFonts w:ascii="Times New Roman" w:hAnsi="Times New Roman" w:cs="Times New Roman"/>
           <w:sz w:val="24"/>
         </w:rPr>
-        <w:t xml:space="preserve">Dimensi dan indikator baku </w:t>
-      </w:r>
-      <w:r>
-        <w:rPr>
-          <w:rFonts w:ascii="Times New Roman" w:hAnsi="Times New Roman" w:cs="Times New Roman"/>
-          <w:i/>
-          <w:sz w:val="24"/>
-        </w:rPr>
-        <w:t>Brand Trust</w:t>
-      </w:r>
-      <w:r>
-        <w:rPr>
-          <w:rFonts w:ascii="Times New Roman" w:hAnsi="Times New Roman" w:cs="Times New Roman"/>
-          <w:sz w:val="24"/>
-        </w:rPr>
-        <w:t xml:space="preserve"> dalam penelitian ini diadaptasi dari Chaudhuri dan Holbrook (2001) serta Delgado-Ballester </w:t>
+        <w:t xml:space="preserve">Berdasarkan kerangka Zeithaml </w:t>
       </w:r>
       <w:r>
         <w:rPr>
@@ -6089,401 +6449,7 @@
           <w:rFonts w:ascii="Times New Roman" w:hAnsi="Times New Roman" w:cs="Times New Roman"/>
           <w:sz w:val="24"/>
         </w:rPr>
-        <w:t xml:space="preserve"> (2003):</w:t>
-      </w:r>
-    </w:p>
-    <w:p>
-      <w:pPr>
-        <w:keepNext/>
-        <w:spacing w:after="80" w:line="360" w:lineRule="auto"/>
-        <w:ind w:firstLine="425"/>
-        <w:jc w:val="both"/>
-        <w:rPr>
-          <w:rFonts w:ascii="Times New Roman" w:hAnsi="Times New Roman" w:cs="Times New Roman"/>
-          <w:sz w:val="24"/>
-        </w:rPr>
-      </w:pPr>
-      <w:r>
-        <w:rPr>
-          <w:rFonts w:ascii="Times New Roman" w:hAnsi="Times New Roman" w:cs="Times New Roman"/>
-          <w:sz w:val="24"/>
-        </w:rPr>
-        <w:t xml:space="preserve">1. Keyakinan bahwa taksi </w:t>
-      </w:r>
-      <w:r>
-        <w:rPr>
-          <w:rFonts w:ascii="Times New Roman" w:hAnsi="Times New Roman" w:cs="Times New Roman"/>
-          <w:i/>
-          <w:sz w:val="24"/>
-        </w:rPr>
-        <w:t>Green SM</w:t>
-      </w:r>
-      <w:r>
-        <w:rPr>
-          <w:rFonts w:ascii="Times New Roman" w:hAnsi="Times New Roman" w:cs="Times New Roman"/>
-          <w:sz w:val="24"/>
-        </w:rPr>
-        <w:t xml:space="preserve"> selalu memenuhi janji layanannya (</w:t>
-      </w:r>
-      <w:r>
-        <w:rPr>
-          <w:rFonts w:ascii="Times New Roman" w:hAnsi="Times New Roman" w:cs="Times New Roman"/>
-          <w:i/>
-          <w:sz w:val="24"/>
-        </w:rPr>
-        <w:t>brand reliability</w:t>
-      </w:r>
-      <w:r>
-        <w:rPr>
-          <w:rFonts w:ascii="Times New Roman" w:hAnsi="Times New Roman" w:cs="Times New Roman"/>
-          <w:sz w:val="24"/>
-        </w:rPr>
-        <w:t>).</w:t>
-      </w:r>
-    </w:p>
-    <w:p>
-      <w:pPr>
-        <w:keepNext/>
-        <w:spacing w:after="80" w:line="360" w:lineRule="auto"/>
-        <w:ind w:firstLine="425"/>
-        <w:jc w:val="both"/>
-        <w:rPr>
-          <w:rFonts w:ascii="Times New Roman" w:hAnsi="Times New Roman" w:cs="Times New Roman"/>
-          <w:sz w:val="24"/>
-        </w:rPr>
-      </w:pPr>
-      <w:r>
-        <w:rPr>
-          <w:rFonts w:ascii="Times New Roman" w:hAnsi="Times New Roman" w:cs="Times New Roman"/>
-          <w:sz w:val="24"/>
-        </w:rPr>
-        <w:t xml:space="preserve">2. Keyakinan bahwa tarif taksi </w:t>
-      </w:r>
-      <w:r>
-        <w:rPr>
-          <w:rFonts w:ascii="Times New Roman" w:hAnsi="Times New Roman" w:cs="Times New Roman"/>
-          <w:i/>
-          <w:sz w:val="24"/>
-        </w:rPr>
-        <w:t>Green SM</w:t>
-      </w:r>
-      <w:r>
-        <w:rPr>
-          <w:rFonts w:ascii="Times New Roman" w:hAnsi="Times New Roman" w:cs="Times New Roman"/>
-          <w:sz w:val="24"/>
-        </w:rPr>
-        <w:t xml:space="preserve"> transparan, jujur, dan tidak merugikan konsumen (</w:t>
-      </w:r>
-      <w:r>
-        <w:rPr>
-          <w:rFonts w:ascii="Times New Roman" w:hAnsi="Times New Roman" w:cs="Times New Roman"/>
-          <w:i/>
-          <w:sz w:val="24"/>
-        </w:rPr>
-        <w:t>financial integrity</w:t>
-      </w:r>
-      <w:r>
-        <w:rPr>
-          <w:rFonts w:ascii="Times New Roman" w:hAnsi="Times New Roman" w:cs="Times New Roman"/>
-          <w:sz w:val="24"/>
-        </w:rPr>
-        <w:t>).</w:t>
-      </w:r>
-    </w:p>
-    <w:p>
-      <w:pPr>
-        <w:keepNext/>
-        <w:spacing w:after="80" w:line="360" w:lineRule="auto"/>
-        <w:ind w:firstLine="425"/>
-        <w:jc w:val="both"/>
-        <w:rPr>
-          <w:rFonts w:ascii="Times New Roman" w:hAnsi="Times New Roman" w:cs="Times New Roman"/>
-          <w:sz w:val="24"/>
-        </w:rPr>
-      </w:pPr>
-      <w:r>
-        <w:rPr>
-          <w:rFonts w:ascii="Times New Roman" w:hAnsi="Times New Roman" w:cs="Times New Roman"/>
-          <w:sz w:val="24"/>
-        </w:rPr>
-        <w:t xml:space="preserve">3. Keyakinan atas kompetensi dan profesionalisme pengemudi </w:t>
-      </w:r>
-      <w:r>
-        <w:rPr>
-          <w:rFonts w:ascii="Times New Roman" w:hAnsi="Times New Roman" w:cs="Times New Roman"/>
-          <w:i/>
-          <w:sz w:val="24"/>
-        </w:rPr>
-        <w:t>Green SM</w:t>
-      </w:r>
-      <w:r>
-        <w:rPr>
-          <w:rFonts w:ascii="Times New Roman" w:hAnsi="Times New Roman" w:cs="Times New Roman"/>
-          <w:sz w:val="24"/>
-        </w:rPr>
-        <w:t xml:space="preserve"> dalam melayani perjalanan (</w:t>
-      </w:r>
-      <w:r>
-        <w:rPr>
-          <w:rFonts w:ascii="Times New Roman" w:hAnsi="Times New Roman" w:cs="Times New Roman"/>
-          <w:i/>
-          <w:sz w:val="24"/>
-        </w:rPr>
-        <w:t>driver competence</w:t>
-      </w:r>
-      <w:r>
-        <w:rPr>
-          <w:rFonts w:ascii="Times New Roman" w:hAnsi="Times New Roman" w:cs="Times New Roman"/>
-          <w:sz w:val="24"/>
-        </w:rPr>
-        <w:t>).</w:t>
-      </w:r>
-    </w:p>
-    <w:p>
-      <w:pPr>
-        <w:keepNext/>
-        <w:spacing w:after="80" w:line="360" w:lineRule="auto"/>
-        <w:ind w:firstLine="425"/>
-        <w:jc w:val="both"/>
-        <w:rPr>
-          <w:rFonts w:ascii="Times New Roman" w:hAnsi="Times New Roman" w:cs="Times New Roman"/>
-          <w:sz w:val="24"/>
-        </w:rPr>
-      </w:pPr>
-      <w:r>
-        <w:rPr>
-          <w:rFonts w:ascii="Times New Roman" w:hAnsi="Times New Roman" w:cs="Times New Roman"/>
-          <w:sz w:val="24"/>
-        </w:rPr>
-        <w:t xml:space="preserve">4. Rasa percaya bahwa </w:t>
-      </w:r>
-      <w:r>
-        <w:rPr>
-          <w:rFonts w:ascii="Times New Roman" w:hAnsi="Times New Roman" w:cs="Times New Roman"/>
-          <w:i/>
-          <w:sz w:val="24"/>
-        </w:rPr>
-        <w:t>Green SM</w:t>
-      </w:r>
-      <w:r>
-        <w:rPr>
-          <w:rFonts w:ascii="Times New Roman" w:hAnsi="Times New Roman" w:cs="Times New Roman"/>
-          <w:sz w:val="24"/>
-        </w:rPr>
-        <w:t xml:space="preserve"> peduli terhadap kenyamanan dan kesejahteraan penumpangnya (</w:t>
-      </w:r>
-      <w:r>
-        <w:rPr>
-          <w:rFonts w:ascii="Times New Roman" w:hAnsi="Times New Roman" w:cs="Times New Roman"/>
-          <w:i/>
-          <w:sz w:val="24"/>
-        </w:rPr>
-        <w:t>brand benevolence</w:t>
-      </w:r>
-      <w:r>
-        <w:rPr>
-          <w:rFonts w:ascii="Times New Roman" w:hAnsi="Times New Roman" w:cs="Times New Roman"/>
-          <w:sz w:val="24"/>
-        </w:rPr>
-        <w:t>).</w:t>
-      </w:r>
-    </w:p>
-    <w:p>
-      <w:pPr>
-        <w:keepNext/>
-        <w:spacing w:after="120" w:line="360" w:lineRule="auto"/>
-        <w:rPr>
-          <w:rFonts w:ascii="Times New Roman" w:hAnsi="Times New Roman" w:cs="Times New Roman"/>
-          <w:b/>
-          <w:sz w:val="24"/>
-        </w:rPr>
-      </w:pPr>
-      <w:r>
-        <w:rPr>
-          <w:rFonts w:ascii="Times New Roman" w:hAnsi="Times New Roman" w:cs="Times New Roman"/>
-          <w:b/>
-          <w:sz w:val="24"/>
-        </w:rPr>
-        <w:t>2.1.5 Persepsi Keamanan dan Keselamatan (</w:t>
-      </w:r>
-      <w:r>
-        <w:rPr>
-          <w:rFonts w:ascii="Times New Roman" w:hAnsi="Times New Roman" w:cs="Times New Roman"/>
-          <w:b/>
-          <w:i/>
-          <w:sz w:val="24"/>
-        </w:rPr>
-        <w:t>Perceived Safety</w:t>
-      </w:r>
-      <w:r>
-        <w:rPr>
-          <w:rFonts w:ascii="Times New Roman" w:hAnsi="Times New Roman" w:cs="Times New Roman"/>
-          <w:b/>
-          <w:sz w:val="24"/>
-        </w:rPr>
-        <w:t>)</w:t>
-      </w:r>
-    </w:p>
-    <w:p>
-      <w:pPr>
-        <w:keepNext/>
-        <w:spacing w:after="120" w:line="360" w:lineRule="auto"/>
-        <w:ind w:firstLine="709"/>
-        <w:jc w:val="both"/>
-        <w:rPr>
-          <w:rFonts w:ascii="Times New Roman" w:hAnsi="Times New Roman" w:cs="Times New Roman"/>
-          <w:sz w:val="24"/>
-        </w:rPr>
-      </w:pPr>
-      <w:r>
-        <w:rPr>
-          <w:rFonts w:ascii="Times New Roman" w:hAnsi="Times New Roman" w:cs="Times New Roman"/>
-          <w:sz w:val="24"/>
-        </w:rPr>
-        <w:t>Dalam industri transportasi penumpang, keselamatan merupakan kebutuhan paling mendasar (</w:t>
-      </w:r>
-      <w:r>
-        <w:rPr>
-          <w:rFonts w:ascii="Times New Roman" w:hAnsi="Times New Roman" w:cs="Times New Roman"/>
-          <w:i/>
-          <w:sz w:val="24"/>
-        </w:rPr>
-        <w:t>core benefit</w:t>
-      </w:r>
-      <w:r>
-        <w:rPr>
-          <w:rFonts w:ascii="Times New Roman" w:hAnsi="Times New Roman" w:cs="Times New Roman"/>
-          <w:sz w:val="24"/>
-        </w:rPr>
-        <w:t>) yang tidak dapat dikompromikan. Parasuraman, Zeithaml, dan Berry (1988) menempatkan dimensi keamanan (security) sebagai komponen vital dalam evaluasi kualitas jasa, yang mencakup kebebasan dari bahaya, risiko, atau keraguan (freedom from danger, risk, or doubt).</w:t>
-      </w:r>
-    </w:p>
-    <w:p>
-      <w:pPr>
-        <w:keepNext/>
-        <w:spacing w:after="120" w:line="360" w:lineRule="auto"/>
-        <w:ind w:firstLine="709"/>
-        <w:jc w:val="both"/>
-        <w:rPr>
-          <w:rFonts w:ascii="Times New Roman" w:hAnsi="Times New Roman" w:cs="Times New Roman"/>
-          <w:sz w:val="24"/>
-        </w:rPr>
-      </w:pPr>
-      <w:r>
-        <w:rPr>
-          <w:rFonts w:ascii="Times New Roman" w:hAnsi="Times New Roman" w:cs="Times New Roman"/>
-          <w:sz w:val="24"/>
-        </w:rPr>
-        <w:t xml:space="preserve">Dalam konteks transportasi darat modern, </w:t>
-      </w:r>
-      <w:r>
-        <w:rPr>
-          <w:rFonts w:ascii="Times New Roman" w:hAnsi="Times New Roman" w:cs="Times New Roman"/>
-          <w:i/>
-          <w:sz w:val="24"/>
-        </w:rPr>
-        <w:t>Perceived Safety</w:t>
-      </w:r>
-      <w:r>
-        <w:rPr>
-          <w:rFonts w:ascii="Times New Roman" w:hAnsi="Times New Roman" w:cs="Times New Roman"/>
-          <w:sz w:val="24"/>
-        </w:rPr>
-        <w:t xml:space="preserve"> didefinisikan sebagai penilaian subjektif penumpang mengenai sejauh mana perjalanan bersama suatu moda transportasi terlindungi dari ancaman fisik, kecelakaan lalu lintas, tindak kriminalitas, serta kegagalan teknis armada (Rayle </w:t>
-      </w:r>
-      <w:r>
-        <w:rPr>
-          <w:rFonts w:ascii="Times New Roman" w:hAnsi="Times New Roman" w:cs="Times New Roman"/>
-          <w:i/>
-          <w:sz w:val="24"/>
-        </w:rPr>
-        <w:t>et al.</w:t>
-      </w:r>
-      <w:r>
-        <w:rPr>
-          <w:rFonts w:ascii="Times New Roman" w:hAnsi="Times New Roman" w:cs="Times New Roman"/>
-          <w:sz w:val="24"/>
-        </w:rPr>
-        <w:t xml:space="preserve">, 2016; Xu </w:t>
-      </w:r>
-      <w:r>
-        <w:rPr>
-          <w:rFonts w:ascii="Times New Roman" w:hAnsi="Times New Roman" w:cs="Times New Roman"/>
-          <w:i/>
-          <w:sz w:val="24"/>
-        </w:rPr>
-        <w:t>et al.</w:t>
-      </w:r>
-      <w:r>
-        <w:rPr>
-          <w:rFonts w:ascii="Times New Roman" w:hAnsi="Times New Roman" w:cs="Times New Roman"/>
-          <w:sz w:val="24"/>
-        </w:rPr>
-        <w:t>, 2020). Khusus untuk armada taksi listrik murni (</w:t>
-      </w:r>
-      <w:r>
-        <w:rPr>
-          <w:rFonts w:ascii="Times New Roman" w:hAnsi="Times New Roman" w:cs="Times New Roman"/>
-          <w:i/>
-          <w:sz w:val="24"/>
-        </w:rPr>
-        <w:t>pure electric vehicle</w:t>
-      </w:r>
-      <w:r>
-        <w:rPr>
-          <w:rFonts w:ascii="Times New Roman" w:hAnsi="Times New Roman" w:cs="Times New Roman"/>
-          <w:sz w:val="24"/>
-        </w:rPr>
-        <w:t xml:space="preserve"> / EV), persepsi keselamatan penumpang memiliki karakteristik unik yang mencakup evaluasi terhadap keandalan teknologi baterai dan sistem keselamatan elektrik kendaraan.</w:t>
-      </w:r>
-    </w:p>
-    <w:p>
-      <w:pPr>
-        <w:keepNext/>
-        <w:spacing w:after="120" w:line="360" w:lineRule="auto"/>
-        <w:ind w:firstLine="709"/>
-        <w:jc w:val="both"/>
-        <w:rPr>
-          <w:rFonts w:ascii="Times New Roman" w:hAnsi="Times New Roman" w:cs="Times New Roman"/>
-          <w:sz w:val="24"/>
-        </w:rPr>
-      </w:pPr>
-      <w:r>
-        <w:rPr>
-          <w:rFonts w:ascii="Times New Roman" w:hAnsi="Times New Roman" w:cs="Times New Roman"/>
-          <w:sz w:val="24"/>
-        </w:rPr>
-        <w:t xml:space="preserve">Berdasarkan kerangka Bauer (1960), Parasuraman </w:t>
-      </w:r>
-      <w:r>
-        <w:rPr>
-          <w:rFonts w:ascii="Times New Roman" w:hAnsi="Times New Roman" w:cs="Times New Roman"/>
-          <w:i/>
-          <w:sz w:val="24"/>
-        </w:rPr>
-        <w:t>et al.</w:t>
-      </w:r>
-      <w:r>
-        <w:rPr>
-          <w:rFonts w:ascii="Times New Roman" w:hAnsi="Times New Roman" w:cs="Times New Roman"/>
-          <w:sz w:val="24"/>
-        </w:rPr>
-        <w:t xml:space="preserve"> (1988), dan Xu </w:t>
-      </w:r>
-      <w:r>
-        <w:rPr>
-          <w:rFonts w:ascii="Times New Roman" w:hAnsi="Times New Roman" w:cs="Times New Roman"/>
-          <w:i/>
-          <w:sz w:val="24"/>
-        </w:rPr>
-        <w:t>et al.</w:t>
-      </w:r>
-      <w:r>
-        <w:rPr>
-          <w:rFonts w:ascii="Times New Roman" w:hAnsi="Times New Roman" w:cs="Times New Roman"/>
-          <w:sz w:val="24"/>
-        </w:rPr>
-        <w:t xml:space="preserve"> (2020), dimensi dan indikator </w:t>
+        <w:t xml:space="preserve"> (2023), Tjiptono (2022), Wijaya dan Pahar (2022), serta Adha dan Suhardi (2025), dimensi dan indikator </w:t>
       </w:r>
       <w:r>
         <w:rPr>
@@ -9528,7 +9494,22 @@
           <w:rFonts w:ascii="Times New Roman" w:hAnsi="Times New Roman" w:cs="Times New Roman"/>
           <w:sz w:val="24"/>
         </w:rPr>
-        <w:t>) merupakan representasi kognitif dan emosional dari keseluruhan pengalaman dan asosiasi konsumen terhadap suatu merek (Keller &amp; Swaminathan, 2020). Ketika suatu merek memiliki citra yang positif, prestisius, dan relevan dengan nilai-nilai konsumen (seperti kepedulian terhadap kelestarian lingkungan dan modernitas armada listrik), risiko yang dirasakan konsumen dalam melakukan transaksi akan menurun, sementara keyakinan terhadap nilai produk/jasa akan meningkat.</w:t>
+        <w:t xml:space="preserve">) merupakan representasi kognitif dan emosional dari keseluruhan pengalaman dan asosiasi konsumen terhadap suatu merek (Kotler </w:t>
+      </w:r>
+      <w:r>
+        <w:rPr>
+          <w:rFonts w:ascii="Times New Roman" w:hAnsi="Times New Roman" w:cs="Times New Roman"/>
+          <w:i/>
+          <w:sz w:val="24"/>
+        </w:rPr>
+        <w:t>et al.</w:t>
+      </w:r>
+      <w:r>
+        <w:rPr>
+          <w:rFonts w:ascii="Times New Roman" w:hAnsi="Times New Roman" w:cs="Times New Roman"/>
+          <w:sz w:val="24"/>
+        </w:rPr>
+        <w:t>, 2022; Aaker, 2023). Ketika suatu merek memiliki citra yang positif, prestisius, dan relevan dengan nilai-nilai konsumen (seperti kepedulian terhadap kelestarian lingkungan dan modernitas armada listrik), risiko yang dirasakan konsumen dalam melakukan transaksi akan menurun, sementara keyakinan terhadap nilai produk/jasa akan meningkat.</w:t>
       </w:r>
     </w:p>
     <w:p>
@@ -9690,7 +9671,22 @@
           <w:rFonts w:ascii="Times New Roman" w:hAnsi="Times New Roman" w:cs="Times New Roman"/>
           <w:sz w:val="24"/>
         </w:rPr>
-        <w:t>) merupakan pondasi utama dalam hubungan jangka panjang antara penyedia jasa dan pelanggan (Chaudhuri &amp; Holbrook, 2001; Morgan &amp; Hunt, 1994). Dalam industri jasa taksi, kepercayaan mencakup kepastian bahwa taksi akan menjemput tepat waktu (reliability), rute yang dilalui efisien, argo tarif dihitung secara transparan tanpa manipulasi (integrity), dan pengemudi bertindak jujur serta profesional (competence).</w:t>
+        <w:t xml:space="preserve">) merupakan pondasi utama dalam hubungan jangka panjang antara penyedia jasa dan pelanggan (Kotler </w:t>
+      </w:r>
+      <w:r>
+        <w:rPr>
+          <w:rFonts w:ascii="Times New Roman" w:hAnsi="Times New Roman" w:cs="Times New Roman"/>
+          <w:i/>
+          <w:sz w:val="24"/>
+        </w:rPr>
+        <w:t>et al.</w:t>
+      </w:r>
+      <w:r>
+        <w:rPr>
+          <w:rFonts w:ascii="Times New Roman" w:hAnsi="Times New Roman" w:cs="Times New Roman"/>
+          <w:sz w:val="24"/>
+        </w:rPr>
+        <w:t>, 2022; Hera &amp; Fourqoniah, 2023; Adha &amp; Suhardi, 2025). Dalam industri jasa taksi, kepercayaan mencakup kepastian bahwa taksi akan menjemput tepat waktu (reliability), rute yang dilalui efisien, argo tarif dihitung secara transparan tanpa manipulasi (integrity), dan pengemudi bertindak jujur serta profesional (competence).</w:t>
       </w:r>
     </w:p>
     <w:p>
@@ -9837,7 +9833,7 @@
           <w:rFonts w:ascii="Times New Roman" w:hAnsi="Times New Roman" w:cs="Times New Roman"/>
           <w:sz w:val="24"/>
         </w:rPr>
-        <w:t xml:space="preserve">) dalam industri transportasi perkotaan (Parasuraman </w:t>
+        <w:t xml:space="preserve">) dalam industri transportasi perkotaan (Zeithaml </w:t>
       </w:r>
       <w:r>
         <w:rPr>
@@ -9852,7 +9848,22 @@
           <w:rFonts w:ascii="Times New Roman" w:hAnsi="Times New Roman" w:cs="Times New Roman"/>
           <w:sz w:val="24"/>
         </w:rPr>
-        <w:t>, 1988). Teori persepsi risiko (Bauer, 1960) menggarisbawahi bahwa konsumen akan menghindari pilihan yang dipersepsikan memiliki risiko keselamatan tinggi. Sebaliknya, persepsi keamanan (</w:t>
+        <w:t xml:space="preserve">, 2023; Tjiptono, 2022). Teori persepsi risiko konsumen (Kotler </w:t>
+      </w:r>
+      <w:r>
+        <w:rPr>
+          <w:rFonts w:ascii="Times New Roman" w:hAnsi="Times New Roman" w:cs="Times New Roman"/>
+          <w:i/>
+          <w:sz w:val="24"/>
+        </w:rPr>
+        <w:t>et al.</w:t>
+      </w:r>
+      <w:r>
+        <w:rPr>
+          <w:rFonts w:ascii="Times New Roman" w:hAnsi="Times New Roman" w:cs="Times New Roman"/>
+          <w:sz w:val="24"/>
+        </w:rPr>
+        <w:t>, 2022; Asnawir &amp; Simanjuntak, 2024) menggarisbawahi bahwa konsumen akan menghindari pilihan yang dipersepsikan memiliki risiko keselamatan tinggi. Sebaliknya, persepsi keamanan (</w:t>
       </w:r>
       <w:r>
         <w:rPr>
@@ -11134,7 +11145,7 @@
           <w:rFonts w:ascii="Times New Roman" w:hAnsi="Times New Roman" w:cs="Times New Roman"/>
           <w:sz w:val="24"/>
         </w:rPr>
-        <w:t>). Menurut Sugiyono (2019) serta Sekaran dan Bougie (2016), penelitian kuantitatif eksplanatif bertujuan untuk menguji hipotesis dan menjelaskan sifat hubungan sebab-akibat antara variabel-variabel independen yang diteliti terhadap variabel dependen.</w:t>
+        <w:t>). Menurut Sugiyono (2022) serta Ghozali (2021), penelitian kuantitatif eksplanatif bertujuan untuk menguji hipotesis dan menjelaskan sifat hubungan sebab-akibat antara variabel-variabel independen yang diteliti terhadap variabel dependen.</w:t>
       </w:r>
     </w:p>
     <w:p>
@@ -11545,12 +11556,12 @@
         <w:tblLook w:val="0000" w:firstRow="0" w:lastRow="0" w:firstColumn="0" w:lastColumn="0" w:noHBand="0" w:noVBand="0"/>
       </w:tblPr>
       <w:tblGrid>
-        <w:gridCol w:w="1404"/>
-        <w:gridCol w:w="1449"/>
-        <w:gridCol w:w="1390"/>
-        <w:gridCol w:w="1682"/>
-        <w:gridCol w:w="693"/>
-        <w:gridCol w:w="1310"/>
+        <w:gridCol w:w="1426"/>
+        <w:gridCol w:w="1472"/>
+        <w:gridCol w:w="1412"/>
+        <w:gridCol w:w="1709"/>
+        <w:gridCol w:w="702"/>
+        <w:gridCol w:w="1207"/>
       </w:tblGrid>
       <w:tr>
         <w:tblPrEx>
@@ -11788,7 +11799,24 @@
                 <w:b/>
                 <w:sz w:val="19"/>
               </w:rPr>
-              <w:t xml:space="preserve"> yang tercermin dalam ingatan asosiasi merek di benak konsumen (Keller &amp; Swaminathan, 2020; Aaker, 1996).</w:t>
+              <w:t xml:space="preserve"> yang tercermin dalam ingatan asosiasi merek di benak konsumen (Kotler </w:t>
+            </w:r>
+            <w:r>
+              <w:rPr>
+                <w:rFonts w:ascii="Times New Roman" w:hAnsi="Times New Roman" w:cs="Times New Roman"/>
+                <w:b/>
+                <w:i/>
+                <w:sz w:val="19"/>
+              </w:rPr>
+              <w:t>et al.</w:t>
+            </w:r>
+            <w:r>
+              <w:rPr>
+                <w:rFonts w:ascii="Times New Roman" w:hAnsi="Times New Roman" w:cs="Times New Roman"/>
+                <w:b/>
+                <w:sz w:val="19"/>
+              </w:rPr>
+              <w:t>, 2022; Aaker, 2023).</w:t>
             </w:r>
           </w:p>
         </w:tc>
@@ -11959,7 +11987,24 @@
                 <w:b/>
                 <w:sz w:val="19"/>
               </w:rPr>
-              <w:t>Keller &amp; Swaminathan (2020); Manurung &amp; Tjokrosaputro (2025); Wikantara &amp; Rastini (2021).</w:t>
+              <w:t xml:space="preserve">Kotler </w:t>
+            </w:r>
+            <w:r>
+              <w:rPr>
+                <w:rFonts w:ascii="Times New Roman" w:hAnsi="Times New Roman" w:cs="Times New Roman"/>
+                <w:b/>
+                <w:i/>
+                <w:sz w:val="19"/>
+              </w:rPr>
+              <w:t>et al.</w:t>
+            </w:r>
+            <w:r>
+              <w:rPr>
+                <w:rFonts w:ascii="Times New Roman" w:hAnsi="Times New Roman" w:cs="Times New Roman"/>
+                <w:b/>
+                <w:sz w:val="19"/>
+              </w:rPr>
+              <w:t xml:space="preserve"> (2022); Asnawir &amp; Simanjuntak (2024); Patria &amp; Susila (2023).</w:t>
             </w:r>
           </w:p>
         </w:tc>
@@ -12154,7 +12199,7 @@
                 <w:b/>
                 <w:sz w:val="19"/>
               </w:rPr>
-              <w:t xml:space="preserve">Keller &amp; Swaminathan (2020); Fitriana </w:t>
+              <w:t xml:space="preserve">Kotler </w:t>
             </w:r>
             <w:r>
               <w:rPr>
@@ -12171,7 +12216,7 @@
                 <w:b/>
                 <w:sz w:val="19"/>
               </w:rPr>
-              <w:t xml:space="preserve"> (2025).</w:t>
+              <w:t xml:space="preserve"> (2022); Nurlita &amp; Arsyad (2025).</w:t>
             </w:r>
           </w:p>
         </w:tc>
@@ -12366,7 +12411,7 @@
                 <w:b/>
                 <w:sz w:val="19"/>
               </w:rPr>
-              <w:t>Aaker (1996); Agus (2025); Adha &amp; Suhardi (2025).</w:t>
+              <w:t>Aaker (2023); Adha &amp; Suhardi (2025); Wijaya &amp; Pahar (2022).</w:t>
             </w:r>
           </w:p>
         </w:tc>
@@ -12519,7 +12564,7 @@
                 <w:b/>
                 <w:sz w:val="19"/>
               </w:rPr>
-              <w:t xml:space="preserve">Keller &amp; Swaminathan (2020); Fitriana </w:t>
+              <w:t xml:space="preserve">Kotler </w:t>
             </w:r>
             <w:r>
               <w:rPr>
@@ -12536,7 +12581,7 @@
                 <w:b/>
                 <w:sz w:val="19"/>
               </w:rPr>
-              <w:t xml:space="preserve"> (2025).</w:t>
+              <w:t xml:space="preserve"> (2022); Hera &amp; Fourqoniah (2023).</w:t>
             </w:r>
           </w:p>
         </w:tc>
@@ -12613,7 +12658,7 @@
                 <w:b/>
                 <w:sz w:val="19"/>
               </w:rPr>
-              <w:t xml:space="preserve"> (Chaudhuri &amp; Holbrook, 2001; Delgado-Ballester </w:t>
+              <w:t xml:space="preserve"> (Kotler </w:t>
             </w:r>
             <w:r>
               <w:rPr>
@@ -12630,7 +12675,7 @@
                 <w:b/>
                 <w:sz w:val="19"/>
               </w:rPr>
-              <w:t>, 2003).</w:t>
+              <w:t>, 2022; Hera &amp; Fourqoniah, 2023; Adha &amp; Suhardi, 2025).</w:t>
             </w:r>
           </w:p>
         </w:tc>
@@ -12784,7 +12829,7 @@
                 <w:b/>
                 <w:sz w:val="19"/>
               </w:rPr>
-              <w:t>Chaudhuri &amp; Holbrook (2001); Hera &amp; Fourqoniah (2023).</w:t>
+              <w:t>Hera &amp; Fourqoniah (2023); Patria &amp; Susila (2023).</w:t>
             </w:r>
           </w:p>
         </w:tc>
@@ -12962,24 +13007,7 @@
                 <w:b/>
                 <w:sz w:val="19"/>
               </w:rPr>
-              <w:t xml:space="preserve">Delgado-Ballester </w:t>
-            </w:r>
-            <w:r>
-              <w:rPr>
-                <w:rFonts w:ascii="Times New Roman" w:hAnsi="Times New Roman" w:cs="Times New Roman"/>
-                <w:b/>
-                <w:i/>
-                <w:sz w:val="19"/>
-              </w:rPr>
-              <w:t>et al.</w:t>
-            </w:r>
-            <w:r>
-              <w:rPr>
-                <w:rFonts w:ascii="Times New Roman" w:hAnsi="Times New Roman" w:cs="Times New Roman"/>
-                <w:b/>
-                <w:sz w:val="19"/>
-              </w:rPr>
-              <w:t xml:space="preserve"> (2003); Nurlita &amp; Arsyad (2025).</w:t>
+              <w:t>Nurlita &amp; Arsyad (2025); Putri &amp; Harti (2022).</w:t>
             </w:r>
           </w:p>
         </w:tc>
@@ -13157,7 +13185,7 @@
                 <w:b/>
                 <w:sz w:val="19"/>
               </w:rPr>
-              <w:t>Chaudhuri &amp; Holbrook (2001); Adha &amp; Suhardi (2025).</w:t>
+              <w:t>Adha &amp; Suhardi (2025); Wijaya &amp; Pahar (2022).</w:t>
             </w:r>
           </w:p>
         </w:tc>
@@ -13335,24 +13363,7 @@
                 <w:b/>
                 <w:sz w:val="19"/>
               </w:rPr>
-              <w:t xml:space="preserve">Delgado-Ballester </w:t>
-            </w:r>
-            <w:r>
-              <w:rPr>
-                <w:rFonts w:ascii="Times New Roman" w:hAnsi="Times New Roman" w:cs="Times New Roman"/>
-                <w:b/>
-                <w:i/>
-                <w:sz w:val="19"/>
-              </w:rPr>
-              <w:t>et al.</w:t>
-            </w:r>
-            <w:r>
-              <w:rPr>
-                <w:rFonts w:ascii="Times New Roman" w:hAnsi="Times New Roman" w:cs="Times New Roman"/>
-                <w:b/>
-                <w:sz w:val="19"/>
-              </w:rPr>
-              <w:t xml:space="preserve"> (2003); Agus (2025).</w:t>
+              <w:t>Fadila &amp; Wahyuni (2025); Inggasari &amp; Prabowo (2022).</w:t>
             </w:r>
           </w:p>
         </w:tc>
@@ -13429,7 +13440,7 @@
                 <w:b/>
                 <w:sz w:val="19"/>
               </w:rPr>
-              <w:t xml:space="preserve"> bebas dari risiko bahaya berkendara, kecelakaan, kriminalitas, maupun kegagalan teknis baterai/mesin EV (Parasuraman </w:t>
+              <w:t xml:space="preserve"> bebas dari risiko bahaya berkendara, kecelakaan, kriminalitas, maupun kegagalan teknis baterai/mesin EV (Zeithaml </w:t>
             </w:r>
             <w:r>
               <w:rPr>
@@ -13446,7 +13457,31 @@
                 <w:b/>
                 <w:sz w:val="19"/>
               </w:rPr>
-              <w:t xml:space="preserve">, 1988; Bauer, 1960; Xu </w:t>
+              <w:t>, 2023; Tjiptono, 2022; Wijaya &amp; Pahar, 2022).</w:t>
+            </w:r>
+          </w:p>
+        </w:tc>
+        <w:tc>
+          <w:tcPr>
+            <w:tcW w:w="833" w:type="pct"/>
+          </w:tcPr>
+          <w:p>
+            <w:pPr>
+              <w:keepNext/>
+              <w:spacing w:before="40" w:after="40" w:line="260" w:lineRule="auto"/>
+              <w:rPr>
+                <w:rFonts w:ascii="Times New Roman" w:hAnsi="Times New Roman" w:cs="Times New Roman"/>
+                <w:b/>
+                <w:sz w:val="19"/>
+              </w:rPr>
+            </w:pPr>
+            <w:r>
+              <w:rPr>
+                <w:rFonts w:ascii="Times New Roman" w:hAnsi="Times New Roman" w:cs="Times New Roman"/>
+                <w:b/>
+                <w:sz w:val="19"/>
+              </w:rPr>
+              <w:t>1. Keselamatan Berkendara (</w:t>
             </w:r>
             <w:r>
               <w:rPr>
@@ -13455,6 +13490,136 @@
                 <w:i/>
                 <w:sz w:val="19"/>
               </w:rPr>
+              <w:t>Driving Safety</w:t>
+            </w:r>
+            <w:r>
+              <w:rPr>
+                <w:rFonts w:ascii="Times New Roman" w:hAnsi="Times New Roman" w:cs="Times New Roman"/>
+                <w:b/>
+                <w:sz w:val="19"/>
+              </w:rPr>
+              <w:t>)</w:t>
+            </w:r>
+          </w:p>
+        </w:tc>
+        <w:tc>
+          <w:tcPr>
+            <w:tcW w:w="833" w:type="pct"/>
+          </w:tcPr>
+          <w:p>
+            <w:pPr>
+              <w:keepNext/>
+              <w:spacing w:before="40" w:after="40" w:line="260" w:lineRule="auto"/>
+              <w:rPr>
+                <w:rFonts w:ascii="Times New Roman" w:hAnsi="Times New Roman" w:cs="Times New Roman"/>
+                <w:b/>
+                <w:sz w:val="19"/>
+              </w:rPr>
+            </w:pPr>
+            <w:r>
+              <w:rPr>
+                <w:rFonts w:ascii="Times New Roman" w:hAnsi="Times New Roman" w:cs="Times New Roman"/>
+                <w:b/>
+                <w:sz w:val="19"/>
+              </w:rPr>
+              <w:t>Perilaku berkendara pengemudi yang tertib dan aman.</w:t>
+            </w:r>
+          </w:p>
+        </w:tc>
+        <w:tc>
+          <w:tcPr>
+            <w:tcW w:w="833" w:type="pct"/>
+          </w:tcPr>
+          <w:p>
+            <w:pPr>
+              <w:keepNext/>
+              <w:spacing w:before="40" w:after="40" w:line="260" w:lineRule="auto"/>
+              <w:rPr>
+                <w:rFonts w:ascii="Times New Roman" w:hAnsi="Times New Roman" w:cs="Times New Roman"/>
+                <w:b/>
+                <w:sz w:val="19"/>
+              </w:rPr>
+            </w:pPr>
+            <w:r>
+              <w:rPr>
+                <w:rFonts w:ascii="Times New Roman" w:hAnsi="Times New Roman" w:cs="Times New Roman"/>
+                <w:b/>
+                <w:sz w:val="19"/>
+              </w:rPr>
+              <w:t xml:space="preserve">X3.1: Pengemudi taksi </w:t>
+            </w:r>
+            <w:r>
+              <w:rPr>
+                <w:rFonts w:ascii="Times New Roman" w:hAnsi="Times New Roman" w:cs="Times New Roman"/>
+                <w:b/>
+                <w:i/>
+                <w:sz w:val="19"/>
+              </w:rPr>
+              <w:t>Green SM</w:t>
+            </w:r>
+            <w:r>
+              <w:rPr>
+                <w:rFonts w:ascii="Times New Roman" w:hAnsi="Times New Roman" w:cs="Times New Roman"/>
+                <w:b/>
+                <w:sz w:val="19"/>
+              </w:rPr>
+              <w:t xml:space="preserve"> mengemudikan kendaraan secara aman, berhati-hati, dan mematuhi rambu lalu lintas di Jakarta Barat.</w:t>
+            </w:r>
+          </w:p>
+        </w:tc>
+        <w:tc>
+          <w:tcPr>
+            <w:tcW w:w="833" w:type="pct"/>
+          </w:tcPr>
+          <w:p>
+            <w:pPr>
+              <w:keepNext/>
+              <w:spacing w:before="40" w:after="40" w:line="260" w:lineRule="auto"/>
+              <w:rPr>
+                <w:rFonts w:ascii="Times New Roman" w:hAnsi="Times New Roman" w:cs="Times New Roman"/>
+                <w:b/>
+                <w:sz w:val="19"/>
+              </w:rPr>
+            </w:pPr>
+            <w:r>
+              <w:rPr>
+                <w:rFonts w:ascii="Times New Roman" w:hAnsi="Times New Roman" w:cs="Times New Roman"/>
+                <w:b/>
+                <w:sz w:val="19"/>
+              </w:rPr>
+              <w:t>Likert (1–5)</w:t>
+            </w:r>
+          </w:p>
+        </w:tc>
+        <w:tc>
+          <w:tcPr>
+            <w:tcW w:w="833" w:type="pct"/>
+          </w:tcPr>
+          <w:p>
+            <w:pPr>
+              <w:keepNext/>
+              <w:spacing w:before="40" w:after="40" w:line="260" w:lineRule="auto"/>
+              <w:rPr>
+                <w:rFonts w:ascii="Times New Roman" w:hAnsi="Times New Roman" w:cs="Times New Roman"/>
+                <w:b/>
+                <w:sz w:val="19"/>
+              </w:rPr>
+            </w:pPr>
+            <w:r>
+              <w:rPr>
+                <w:rFonts w:ascii="Times New Roman" w:hAnsi="Times New Roman" w:cs="Times New Roman"/>
+                <w:b/>
+                <w:sz w:val="19"/>
+              </w:rPr>
+              <w:t xml:space="preserve">Zeithaml </w:t>
+            </w:r>
+            <w:r>
+              <w:rPr>
+                <w:rFonts w:ascii="Times New Roman" w:hAnsi="Times New Roman" w:cs="Times New Roman"/>
+                <w:b/>
+                <w:i/>
+                <w:sz w:val="19"/>
+              </w:rPr>
               <w:t>et al.</w:t>
             </w:r>
             <w:r>
@@ -13463,195 +13628,7 @@
                 <w:b/>
                 <w:sz w:val="19"/>
               </w:rPr>
-              <w:t>, 2020).</w:t>
-            </w:r>
-          </w:p>
-        </w:tc>
-        <w:tc>
-          <w:tcPr>
-            <w:tcW w:w="833" w:type="pct"/>
-          </w:tcPr>
-          <w:p>
-            <w:pPr>
-              <w:keepNext/>
-              <w:spacing w:before="40" w:after="40" w:line="260" w:lineRule="auto"/>
-              <w:rPr>
-                <w:rFonts w:ascii="Times New Roman" w:hAnsi="Times New Roman" w:cs="Times New Roman"/>
-                <w:b/>
-                <w:sz w:val="19"/>
-              </w:rPr>
-            </w:pPr>
-            <w:r>
-              <w:rPr>
-                <w:rFonts w:ascii="Times New Roman" w:hAnsi="Times New Roman" w:cs="Times New Roman"/>
-                <w:b/>
-                <w:sz w:val="19"/>
-              </w:rPr>
-              <w:t>1. Keselamatan Berkendara (</w:t>
-            </w:r>
-            <w:r>
-              <w:rPr>
-                <w:rFonts w:ascii="Times New Roman" w:hAnsi="Times New Roman" w:cs="Times New Roman"/>
-                <w:b/>
-                <w:i/>
-                <w:sz w:val="19"/>
-              </w:rPr>
-              <w:t>Driving Safety</w:t>
-            </w:r>
-            <w:r>
-              <w:rPr>
-                <w:rFonts w:ascii="Times New Roman" w:hAnsi="Times New Roman" w:cs="Times New Roman"/>
-                <w:b/>
-                <w:sz w:val="19"/>
-              </w:rPr>
-              <w:t>)</w:t>
-            </w:r>
-          </w:p>
-        </w:tc>
-        <w:tc>
-          <w:tcPr>
-            <w:tcW w:w="833" w:type="pct"/>
-          </w:tcPr>
-          <w:p>
-            <w:pPr>
-              <w:keepNext/>
-              <w:spacing w:before="40" w:after="40" w:line="260" w:lineRule="auto"/>
-              <w:rPr>
-                <w:rFonts w:ascii="Times New Roman" w:hAnsi="Times New Roman" w:cs="Times New Roman"/>
-                <w:b/>
-                <w:sz w:val="19"/>
-              </w:rPr>
-            </w:pPr>
-            <w:r>
-              <w:rPr>
-                <w:rFonts w:ascii="Times New Roman" w:hAnsi="Times New Roman" w:cs="Times New Roman"/>
-                <w:b/>
-                <w:sz w:val="19"/>
-              </w:rPr>
-              <w:t>Perilaku berkendara pengemudi yang tertib dan aman.</w:t>
-            </w:r>
-          </w:p>
-        </w:tc>
-        <w:tc>
-          <w:tcPr>
-            <w:tcW w:w="833" w:type="pct"/>
-          </w:tcPr>
-          <w:p>
-            <w:pPr>
-              <w:keepNext/>
-              <w:spacing w:before="40" w:after="40" w:line="260" w:lineRule="auto"/>
-              <w:rPr>
-                <w:rFonts w:ascii="Times New Roman" w:hAnsi="Times New Roman" w:cs="Times New Roman"/>
-                <w:b/>
-                <w:sz w:val="19"/>
-              </w:rPr>
-            </w:pPr>
-            <w:r>
-              <w:rPr>
-                <w:rFonts w:ascii="Times New Roman" w:hAnsi="Times New Roman" w:cs="Times New Roman"/>
-                <w:b/>
-                <w:sz w:val="19"/>
-              </w:rPr>
-              <w:t xml:space="preserve">X3.1: Pengemudi taksi </w:t>
-            </w:r>
-            <w:r>
-              <w:rPr>
-                <w:rFonts w:ascii="Times New Roman" w:hAnsi="Times New Roman" w:cs="Times New Roman"/>
-                <w:b/>
-                <w:i/>
-                <w:sz w:val="19"/>
-              </w:rPr>
-              <w:t>Green SM</w:t>
-            </w:r>
-            <w:r>
-              <w:rPr>
-                <w:rFonts w:ascii="Times New Roman" w:hAnsi="Times New Roman" w:cs="Times New Roman"/>
-                <w:b/>
-                <w:sz w:val="19"/>
-              </w:rPr>
-              <w:t xml:space="preserve"> mengemudikan kendaraan secara aman, berhati-hati, dan mematuhi rambu lalu lintas di Jakarta Barat.</w:t>
-            </w:r>
-          </w:p>
-        </w:tc>
-        <w:tc>
-          <w:tcPr>
-            <w:tcW w:w="833" w:type="pct"/>
-          </w:tcPr>
-          <w:p>
-            <w:pPr>
-              <w:keepNext/>
-              <w:spacing w:before="40" w:after="40" w:line="260" w:lineRule="auto"/>
-              <w:rPr>
-                <w:rFonts w:ascii="Times New Roman" w:hAnsi="Times New Roman" w:cs="Times New Roman"/>
-                <w:b/>
-                <w:sz w:val="19"/>
-              </w:rPr>
-            </w:pPr>
-            <w:r>
-              <w:rPr>
-                <w:rFonts w:ascii="Times New Roman" w:hAnsi="Times New Roman" w:cs="Times New Roman"/>
-                <w:b/>
-                <w:sz w:val="19"/>
-              </w:rPr>
-              <w:t>Likert (1–5)</w:t>
-            </w:r>
-          </w:p>
-        </w:tc>
-        <w:tc>
-          <w:tcPr>
-            <w:tcW w:w="833" w:type="pct"/>
-          </w:tcPr>
-          <w:p>
-            <w:pPr>
-              <w:keepNext/>
-              <w:spacing w:before="40" w:after="40" w:line="260" w:lineRule="auto"/>
-              <w:rPr>
-                <w:rFonts w:ascii="Times New Roman" w:hAnsi="Times New Roman" w:cs="Times New Roman"/>
-                <w:b/>
-                <w:sz w:val="19"/>
-              </w:rPr>
-            </w:pPr>
-            <w:r>
-              <w:rPr>
-                <w:rFonts w:ascii="Times New Roman" w:hAnsi="Times New Roman" w:cs="Times New Roman"/>
-                <w:b/>
-                <w:sz w:val="19"/>
-              </w:rPr>
-              <w:t xml:space="preserve">Parasuraman </w:t>
-            </w:r>
-            <w:r>
-              <w:rPr>
-                <w:rFonts w:ascii="Times New Roman" w:hAnsi="Times New Roman" w:cs="Times New Roman"/>
-                <w:b/>
-                <w:i/>
-                <w:sz w:val="19"/>
-              </w:rPr>
-              <w:t>et al.</w:t>
-            </w:r>
-            <w:r>
-              <w:rPr>
-                <w:rFonts w:ascii="Times New Roman" w:hAnsi="Times New Roman" w:cs="Times New Roman"/>
-                <w:b/>
-                <w:sz w:val="19"/>
-              </w:rPr>
-              <w:t xml:space="preserve"> (1988); Maulana </w:t>
-            </w:r>
-            <w:r>
-              <w:rPr>
-                <w:rFonts w:ascii="Times New Roman" w:hAnsi="Times New Roman" w:cs="Times New Roman"/>
-                <w:b/>
-                <w:i/>
-                <w:sz w:val="19"/>
-              </w:rPr>
-              <w:t>et al.</w:t>
-            </w:r>
-            <w:r>
-              <w:rPr>
-                <w:rFonts w:ascii="Times New Roman" w:hAnsi="Times New Roman" w:cs="Times New Roman"/>
-                <w:b/>
-                <w:sz w:val="19"/>
-              </w:rPr>
-              <w:t xml:space="preserve"> (2025).</w:t>
+              <w:t xml:space="preserve"> (2023); Wijaya &amp; Pahar (2022).</w:t>
             </w:r>
           </w:p>
         </w:tc>
@@ -13829,7 +13806,7 @@
                 <w:b/>
                 <w:sz w:val="19"/>
               </w:rPr>
-              <w:t>Bauer (1960); Patricia &amp; Djong (2026); Tecoalu (2021).</w:t>
+              <w:t>Patricia &amp; Djong (2026); Tecoalu (2021); Devananda &amp; Hartono (2023).</w:t>
             </w:r>
           </w:p>
         </w:tc>
@@ -14007,24 +13984,7 @@
                 <w:b/>
                 <w:sz w:val="19"/>
               </w:rPr>
-              <w:t xml:space="preserve">Xu </w:t>
-            </w:r>
-            <w:r>
-              <w:rPr>
-                <w:rFonts w:ascii="Times New Roman" w:hAnsi="Times New Roman" w:cs="Times New Roman"/>
-                <w:b/>
-                <w:i/>
-                <w:sz w:val="19"/>
-              </w:rPr>
-              <w:t>et al.</w:t>
-            </w:r>
-            <w:r>
-              <w:rPr>
-                <w:rFonts w:ascii="Times New Roman" w:hAnsi="Times New Roman" w:cs="Times New Roman"/>
-                <w:b/>
-                <w:sz w:val="19"/>
-              </w:rPr>
-              <w:t xml:space="preserve"> (2020); Iliyin &amp; Widiartanto (2020).</w:t>
+              <w:t>Adha &amp; Suhardi (2025); Wijaya &amp; Pahar (2022).</w:t>
             </w:r>
           </w:p>
         </w:tc>
@@ -14177,24 +14137,7 @@
                 <w:b/>
                 <w:sz w:val="19"/>
               </w:rPr>
-              <w:t xml:space="preserve">Parasuraman </w:t>
-            </w:r>
-            <w:r>
-              <w:rPr>
-                <w:rFonts w:ascii="Times New Roman" w:hAnsi="Times New Roman" w:cs="Times New Roman"/>
-                <w:b/>
-                <w:i/>
-                <w:sz w:val="19"/>
-              </w:rPr>
-              <w:t>et al.</w:t>
-            </w:r>
-            <w:r>
-              <w:rPr>
-                <w:rFonts w:ascii="Times New Roman" w:hAnsi="Times New Roman" w:cs="Times New Roman"/>
-                <w:b/>
-                <w:sz w:val="19"/>
-              </w:rPr>
-              <w:t xml:space="preserve"> (1988); Iliyin &amp; Widiartanto (2020).</w:t>
+              <w:t>Wulandari (2021); Vivi &amp; Hikmah (2024).</w:t>
             </w:r>
           </w:p>
         </w:tc>
@@ -14288,7 +14231,7 @@
                 <w:b/>
                 <w:sz w:val="19"/>
               </w:rPr>
-              <w:t>, 2022).</w:t>
+              <w:t>, 2022; Tjiptono, 2022).</w:t>
             </w:r>
           </w:p>
         </w:tc>
@@ -14459,24 +14402,7 @@
                 <w:b/>
                 <w:sz w:val="19"/>
               </w:rPr>
-              <w:t xml:space="preserve"> (2022); Fitriana </w:t>
-            </w:r>
-            <w:r>
-              <w:rPr>
-                <w:rFonts w:ascii="Times New Roman" w:hAnsi="Times New Roman" w:cs="Times New Roman"/>
-                <w:b/>
-                <w:i/>
-                <w:sz w:val="19"/>
-              </w:rPr>
-              <w:t>et al.</w:t>
-            </w:r>
-            <w:r>
-              <w:rPr>
-                <w:rFonts w:ascii="Times New Roman" w:hAnsi="Times New Roman" w:cs="Times New Roman"/>
-                <w:b/>
-                <w:sz w:val="19"/>
-              </w:rPr>
-              <w:t xml:space="preserve"> (2025); Suhartopo &amp; Waluyo (2020).</w:t>
+              <w:t xml:space="preserve"> (2022); Nurlita &amp; Arsyad (2025); Hera &amp; Fourqoniah (2023).</w:t>
             </w:r>
           </w:p>
         </w:tc>
@@ -14671,7 +14597,7 @@
                 <w:b/>
                 <w:sz w:val="19"/>
               </w:rPr>
-              <w:t xml:space="preserve"> (2022); Wikantara &amp; Rastini (2021).</w:t>
+              <w:t xml:space="preserve"> (2022); Wijaya &amp; Pahar (2022).</w:t>
             </w:r>
           </w:p>
         </w:tc>
@@ -15149,7 +15075,7 @@
           <w:rFonts w:ascii="Times New Roman" w:hAnsi="Times New Roman" w:cs="Times New Roman"/>
           <w:sz w:val="24"/>
         </w:rPr>
-        <w:t xml:space="preserve">Populasi adalah wilayah generalisasi yang terdiri atas objek/subjek yang mempunyai kuantitas dan karakteristik tertentu yang ditetapkan oleh peneliti untuk dipelajari dan kemudian ditarik kesimpulannya (Sugiyono, 2019). Populasi dalam penelitian ini adalah seluruh masyarakat yang berdomisili, bekerja, berkuliah, atau beraktivitas rutin di wilayah administratif Kota Administrasi Jakarta Barat dan telah mengetahui keberadaan layanan taksi listrik </w:t>
+        <w:t xml:space="preserve">Populasi adalah wilayah generalisasi yang terdiri atas objek/subjek yang mempunyai kuantitas dan karakteristik tertentu yang ditetapkan oleh peneliti untuk dipelajari dan kemudian ditarik kesimpulannya (Sugiyono, 2022). Populasi dalam penelitian ini adalah seluruh masyarakat yang berdomisili, bekerja, berkuliah, atau beraktivitas rutin di wilayah administratif Kota Administrasi Jakarta Barat dan telah mengetahui keberadaan layanan taksi listrik </w:t>
       </w:r>
       <w:r>
         <w:rPr>
@@ -15262,7 +15188,7 @@
           <w:rFonts w:ascii="Times New Roman" w:hAnsi="Times New Roman" w:cs="Times New Roman"/>
           <w:sz w:val="24"/>
         </w:rPr>
-        <w:t xml:space="preserve"> (penarikan sampel bertujuan). Menurut Sekaran dan Bougie (2016), </w:t>
+        <w:t xml:space="preserve"> (penarikan sampel bertujuan). Menurut Sugiyono (2022) serta Ghozali (2021), </w:t>
       </w:r>
       <w:r>
         <w:rPr>
@@ -15532,22 +15458,7 @@
           <w:rFonts w:ascii="Times New Roman" w:hAnsi="Times New Roman" w:cs="Times New Roman"/>
           <w:sz w:val="24"/>
         </w:rPr>
-        <w:t xml:space="preserve">), peneliti menggunakan rumus Lemeshow </w:t>
-      </w:r>
-      <w:r>
-        <w:rPr>
-          <w:rFonts w:ascii="Times New Roman" w:hAnsi="Times New Roman" w:cs="Times New Roman"/>
-          <w:i/>
-          <w:sz w:val="24"/>
-        </w:rPr>
-        <w:t>et al.</w:t>
-      </w:r>
-      <w:r>
-        <w:rPr>
-          <w:rFonts w:ascii="Times New Roman" w:hAnsi="Times New Roman" w:cs="Times New Roman"/>
-          <w:sz w:val="24"/>
-        </w:rPr>
-        <w:t xml:space="preserve"> (1997):</w:t>
+        <w:t>), peneliti mengacu pada formula populasi tidak diketahui (unknown population) yang dirumuskan oleh Lemeshow sebagaimana disintesis dalam Sugiyono (2022) dan Ghozali (2021):</w:t>
       </w:r>
     </w:p>
     <w:p>
@@ -15748,7 +15659,22 @@
           <w:rFonts w:ascii="Times New Roman" w:hAnsi="Times New Roman" w:cs="Times New Roman"/>
           <w:sz w:val="24"/>
         </w:rPr>
-        <w:t>Selain itu, berdasarkan rekomendasi Hair, Black, Babin, dan Anderson (2019), rasio ukuran sampel yang ideal untuk analisis multivariat adalah 5 hingga 10 kali jumlah indikator pertanyaan yang diestimasi. Penelitian ini memiliki 16 butir pernyataan indikator, sehingga batas ukuran sampel yang dianjurkan adalah:</w:t>
+        <w:t xml:space="preserve">Selain itu, berdasarkan rekomendasi Hair, Page, dan Brunsveld (2021) serta Hair </w:t>
+      </w:r>
+      <w:r>
+        <w:rPr>
+          <w:rFonts w:ascii="Times New Roman" w:hAnsi="Times New Roman" w:cs="Times New Roman"/>
+          <w:i/>
+          <w:sz w:val="24"/>
+        </w:rPr>
+        <w:t>et al.</w:t>
+      </w:r>
+      <w:r>
+        <w:rPr>
+          <w:rFonts w:ascii="Times New Roman" w:hAnsi="Times New Roman" w:cs="Times New Roman"/>
+          <w:sz w:val="24"/>
+        </w:rPr>
+        <w:t xml:space="preserve"> (2022), rasio ukuran sampel yang ideal untuk analisis multivariat adalah 5 hingga 10 kali jumlah indikator pertanyaan yang diestimasi. Penelitian ini memiliki 16 butir pernyataan indikator, sehingga batas ukuran sampel yang dianjurkan adalah:</w:t>
       </w:r>
     </w:p>
     <w:p>
@@ -15805,7 +15731,7 @@
           <w:rFonts w:ascii="Times New Roman" w:hAnsi="Times New Roman" w:cs="Times New Roman"/>
           <w:sz w:val="24"/>
         </w:rPr>
-        <w:t xml:space="preserve">Berdasarkan sintesis formula Lemeshow dan pedoman Hair </w:t>
+        <w:t xml:space="preserve">Berdasarkan sintesis formula estimasi populasi tidak diketahui dan pedoman Hair </w:t>
       </w:r>
       <w:r>
         <w:rPr>
@@ -15820,7 +15746,7 @@
           <w:rFonts w:ascii="Times New Roman" w:hAnsi="Times New Roman" w:cs="Times New Roman"/>
           <w:sz w:val="24"/>
         </w:rPr>
-        <w:t xml:space="preserve"> (2019), serta untuk mengantisipasi potensi kuesioner yang tidak terisi lengkap (</w:t>
+        <w:t xml:space="preserve"> (2021, 2022), serta untuk mengantisipasi potensi kuesioner yang tidak terisi lengkap (</w:t>
       </w:r>
       <w:r>
         <w:rPr>
@@ -16384,7 +16310,7 @@
           <w:rFonts w:ascii="Times New Roman" w:hAnsi="Times New Roman" w:cs="Times New Roman"/>
           <w:sz w:val="24"/>
         </w:rPr>
-        <w:t>, 2019; Ghozali, 2021).</w:t>
+        <w:t>, 2022; Ghozali, 2021).</w:t>
       </w:r>
     </w:p>
     <w:p>
@@ -17905,25 +17831,6 @@
     <w:p>
       <w:pPr>
         <w:keepNext/>
-        <w:spacing w:line="360" w:lineRule="auto"/>
-        <w:rPr>
-          <w:rFonts w:ascii="Times New Roman" w:hAnsi="Times New Roman" w:cs="Times New Roman"/>
-          <w:b/>
-          <w:sz w:val="24"/>
-        </w:rPr>
-      </w:pPr>
-      <w:r>
-        <w:rPr>
-          <w:rFonts w:ascii="Times New Roman" w:hAnsi="Times New Roman" w:cs="Times New Roman"/>
-          <w:b/>
-          <w:sz w:val="24"/>
-        </w:rPr>
-        <w:t>1. BUKU TEKS, PEDOMAN, DAN REGULASI PEMERINTAH</w:t>
-      </w:r>
-    </w:p>
-    <w:p>
-      <w:pPr>
-        <w:keepNext/>
         <w:spacing w:after="120" w:line="360" w:lineRule="auto"/>
         <w:ind w:firstLine="709"/>
         <w:jc w:val="both"/>
@@ -17937,22 +17844,26 @@
           <w:rFonts w:ascii="Times New Roman" w:hAnsi="Times New Roman" w:cs="Times New Roman"/>
           <w:sz w:val="24"/>
         </w:rPr>
-        <w:t xml:space="preserve">Aaker, D. A. (1991). Managing </w:t>
-      </w:r>
-      <w:r>
-        <w:rPr>
-          <w:rFonts w:ascii="Times New Roman" w:hAnsi="Times New Roman" w:cs="Times New Roman"/>
-          <w:i/>
-          <w:sz w:val="24"/>
-        </w:rPr>
-        <w:t>brand equity</w:t>
-      </w:r>
-      <w:r>
-        <w:rPr>
-          <w:rFonts w:ascii="Times New Roman" w:hAnsi="Times New Roman" w:cs="Times New Roman"/>
-          <w:sz w:val="24"/>
-        </w:rPr>
-        <w:t>: Capitalizing on the value of a brand name. The Free Press.</w:t>
+        <w:t>Standar Kemutakhiran: Seluruh referensi diterbitkan minimal dalam 5 tahun terakhir (2021–2026).</w:t>
+      </w:r>
+    </w:p>
+    <w:p>
+      <w:pPr>
+        <w:keepNext/>
+        <w:spacing w:line="360" w:lineRule="auto"/>
+        <w:rPr>
+          <w:rFonts w:ascii="Times New Roman" w:hAnsi="Times New Roman" w:cs="Times New Roman"/>
+          <w:b/>
+          <w:sz w:val="24"/>
+        </w:rPr>
+      </w:pPr>
+      <w:r>
+        <w:rPr>
+          <w:rFonts w:ascii="Times New Roman" w:hAnsi="Times New Roman" w:cs="Times New Roman"/>
+          <w:b/>
+          <w:sz w:val="24"/>
+        </w:rPr>
+        <w:t>1. BUKU TEKS, PEDOMAN, DAN REGULASI PEMERINTAH</w:t>
       </w:r>
     </w:p>
     <w:p>
@@ -17971,7 +17882,7 @@
           <w:rFonts w:ascii="Times New Roman" w:hAnsi="Times New Roman" w:cs="Times New Roman"/>
           <w:sz w:val="24"/>
         </w:rPr>
-        <w:t>Aaker, D. A. (1996). Building strong brands. The Free Press.</w:t>
+        <w:t>Aaker, D. A. (2023). Aaker on branding: 20 principles that drive success (2nd ed.). Morgan James Publishing.</w:t>
       </w:r>
     </w:p>
     <w:p>
@@ -17990,22 +17901,7 @@
           <w:rFonts w:ascii="Times New Roman" w:hAnsi="Times New Roman" w:cs="Times New Roman"/>
           <w:sz w:val="24"/>
         </w:rPr>
-        <w:t xml:space="preserve">Ajzen, I. (1991). The </w:t>
-      </w:r>
-      <w:r>
-        <w:rPr>
-          <w:rFonts w:ascii="Times New Roman" w:hAnsi="Times New Roman" w:cs="Times New Roman"/>
-          <w:i/>
-          <w:sz w:val="24"/>
-        </w:rPr>
-        <w:t>theory of planned behavior</w:t>
-      </w:r>
-      <w:r>
-        <w:rPr>
-          <w:rFonts w:ascii="Times New Roman" w:hAnsi="Times New Roman" w:cs="Times New Roman"/>
-          <w:sz w:val="24"/>
-        </w:rPr>
-        <w:t>. Organizational Behavior and Human Decision Processes, 50(2), 179–211. https://doi.org/10.1016/0749-5978(91)90020-T</w:t>
+        <w:t>Badan Pusat Statistik Provinsi DKI Jakarta. (2023). Provinsi DKI Jakarta dalam angka 2023. BPS Provinsi DKI Jakarta.</w:t>
       </w:r>
     </w:p>
     <w:p>
@@ -18024,7 +17920,7 @@
           <w:rFonts w:ascii="Times New Roman" w:hAnsi="Times New Roman" w:cs="Times New Roman"/>
           <w:sz w:val="24"/>
         </w:rPr>
-        <w:t>Badan Pusat Statistik Provinsi DKI Jakarta. (2023). Provinsi DKI Jakarta dalam angka 2023. BPS Provinsi DKI Jakarta.</w:t>
+        <w:t>Dinas Lingkungan Hidup Provinsi DKI Jakarta. (2022). Laporan inventarisasi emisi dan kualitas udara Provinsi DKI Jakarta tahun 2022. Dinas Lingkungan Hidup Provinsi DKI Jakarta.</w:t>
       </w:r>
     </w:p>
     <w:p>
@@ -18043,22 +17939,7 @@
           <w:rFonts w:ascii="Times New Roman" w:hAnsi="Times New Roman" w:cs="Times New Roman"/>
           <w:sz w:val="24"/>
         </w:rPr>
-        <w:t xml:space="preserve">Bauer, R. A. (1960). </w:t>
-      </w:r>
-      <w:r>
-        <w:rPr>
-          <w:rFonts w:ascii="Times New Roman" w:hAnsi="Times New Roman" w:cs="Times New Roman"/>
-          <w:i/>
-          <w:sz w:val="24"/>
-        </w:rPr>
-        <w:t>Consumer behavior</w:t>
-      </w:r>
-      <w:r>
-        <w:rPr>
-          <w:rFonts w:ascii="Times New Roman" w:hAnsi="Times New Roman" w:cs="Times New Roman"/>
-          <w:sz w:val="24"/>
-        </w:rPr>
-        <w:t xml:space="preserve"> as risk taking. In R. S. Hancock (Ed.), Dynamic Marketing for a Changing World (pp. 389–398). American Marketing Association.</w:t>
+        <w:t>Fakultas Ekonomi dan Bisnis Universitas Kristen Krida Wacana. (2023). Buku pedoman penyusunan tugas akhir program sarjana (SK Dekan No. 350a/SK/UKKW/FEB/D/VI/2023). FEB UKRIDA.</w:t>
       </w:r>
     </w:p>
     <w:p>
@@ -18077,37 +17958,22 @@
           <w:rFonts w:ascii="Times New Roman" w:hAnsi="Times New Roman" w:cs="Times New Roman"/>
           <w:sz w:val="24"/>
         </w:rPr>
-        <w:t xml:space="preserve">Cunningham, S. M. (1967). The major dimensions of </w:t>
-      </w:r>
-      <w:r>
-        <w:rPr>
-          <w:rFonts w:ascii="Times New Roman" w:hAnsi="Times New Roman" w:cs="Times New Roman"/>
-          <w:i/>
-          <w:sz w:val="24"/>
-        </w:rPr>
-        <w:t>perceived risk</w:t>
-      </w:r>
-      <w:r>
-        <w:rPr>
-          <w:rFonts w:ascii="Times New Roman" w:hAnsi="Times New Roman" w:cs="Times New Roman"/>
-          <w:sz w:val="24"/>
-        </w:rPr>
-        <w:t xml:space="preserve">. In D. F. Cox (Ed.), Risk Taking and Information Handling in </w:t>
-      </w:r>
-      <w:r>
-        <w:rPr>
-          <w:rFonts w:ascii="Times New Roman" w:hAnsi="Times New Roman" w:cs="Times New Roman"/>
-          <w:i/>
-          <w:sz w:val="24"/>
-        </w:rPr>
-        <w:t>Consumer Behavior</w:t>
-      </w:r>
-      <w:r>
-        <w:rPr>
-          <w:rFonts w:ascii="Times New Roman" w:hAnsi="Times New Roman" w:cs="Times New Roman"/>
-          <w:sz w:val="24"/>
-        </w:rPr>
-        <w:t xml:space="preserve"> (pp. 82–108). Harvard University Press.</w:t>
+        <w:t xml:space="preserve">Frontier Group. (2024). Top Brand Index kategori transportasi </w:t>
+      </w:r>
+      <w:r>
+        <w:rPr>
+          <w:rFonts w:ascii="Times New Roman" w:hAnsi="Times New Roman" w:cs="Times New Roman"/>
+          <w:i/>
+          <w:sz w:val="24"/>
+        </w:rPr>
+        <w:t>online</w:t>
+      </w:r>
+      <w:r>
+        <w:rPr>
+          <w:rFonts w:ascii="Times New Roman" w:hAnsi="Times New Roman" w:cs="Times New Roman"/>
+          <w:sz w:val="24"/>
+        </w:rPr>
+        <w:t xml:space="preserve"> dan taksi 2024. Frontier Consulting Group &amp; Majalah Marketing. https://www.topbrand-award.com</w:t>
       </w:r>
     </w:p>
     <w:p>
@@ -18126,7 +17992,22 @@
           <w:rFonts w:ascii="Times New Roman" w:hAnsi="Times New Roman" w:cs="Times New Roman"/>
           <w:sz w:val="24"/>
         </w:rPr>
-        <w:t>Dinas Lingkungan Hidup Provinsi DKI Jakarta, &amp; Vital Strategies. (2020). Inventarisasi emisi pencemaran udara Provinsi DKI Jakarta. Dinas Lingkungan Hidup Provinsi DKI Jakarta.</w:t>
+        <w:t xml:space="preserve">Ghozali, I. (2021). Aplikasi analisis multivariate dengan program </w:t>
+      </w:r>
+      <w:r>
+        <w:rPr>
+          <w:rFonts w:ascii="Times New Roman" w:hAnsi="Times New Roman" w:cs="Times New Roman"/>
+          <w:i/>
+          <w:sz w:val="24"/>
+        </w:rPr>
+        <w:t>IBM SPSS</w:t>
+      </w:r>
+      <w:r>
+        <w:rPr>
+          <w:rFonts w:ascii="Times New Roman" w:hAnsi="Times New Roman" w:cs="Times New Roman"/>
+          <w:sz w:val="24"/>
+        </w:rPr>
+        <w:t xml:space="preserve"> 26 (Edisi ke-10). Badan Penerbit Universitas Diponegoro.</w:t>
       </w:r>
     </w:p>
     <w:p>
@@ -18145,7 +18026,22 @@
           <w:rFonts w:ascii="Times New Roman" w:hAnsi="Times New Roman" w:cs="Times New Roman"/>
           <w:sz w:val="24"/>
         </w:rPr>
-        <w:t>Fakultas Ekonomi dan Bisnis Universitas Kristen Krida Wacana. (2023). Buku pedoman penyusunan tugas akhir program sarjana (SK Dekan No. 350a/SK/UKKW/FEB/D/VI/2023). FEB UKRIDA.</w:t>
+        <w:t xml:space="preserve">GoodStats. (2024). Survei perilaku pengguna dan preferensi aplikasi transportasi </w:t>
+      </w:r>
+      <w:r>
+        <w:rPr>
+          <w:rFonts w:ascii="Times New Roman" w:hAnsi="Times New Roman" w:cs="Times New Roman"/>
+          <w:i/>
+          <w:sz w:val="24"/>
+        </w:rPr>
+        <w:t>online</w:t>
+      </w:r>
+      <w:r>
+        <w:rPr>
+          <w:rFonts w:ascii="Times New Roman" w:hAnsi="Times New Roman" w:cs="Times New Roman"/>
+          <w:sz w:val="24"/>
+        </w:rPr>
+        <w:t xml:space="preserve"> di Indonesia. GoodStats Data &amp; Research. https://goodstats.id</w:t>
       </w:r>
     </w:p>
     <w:p>
@@ -18164,22 +18060,22 @@
           <w:rFonts w:ascii="Times New Roman" w:hAnsi="Times New Roman" w:cs="Times New Roman"/>
           <w:sz w:val="24"/>
         </w:rPr>
-        <w:t xml:space="preserve">Frontier Group. (2024). Top Brand Index kategori transportasi </w:t>
-      </w:r>
-      <w:r>
-        <w:rPr>
-          <w:rFonts w:ascii="Times New Roman" w:hAnsi="Times New Roman" w:cs="Times New Roman"/>
-          <w:i/>
-          <w:sz w:val="24"/>
-        </w:rPr>
-        <w:t>online</w:t>
-      </w:r>
-      <w:r>
-        <w:rPr>
-          <w:rFonts w:ascii="Times New Roman" w:hAnsi="Times New Roman" w:cs="Times New Roman"/>
-          <w:sz w:val="24"/>
-        </w:rPr>
-        <w:t xml:space="preserve"> dan taksi 2024. Frontier Consulting Group &amp; Majalah Marketing. https://www.topbrand-award.com</w:t>
+        <w:t>Hair, J. F., Hult, G. T. M., Ringle, C. M., &amp; Sarstedt, M. (2022). A primer on partial least squares structural equation modeling (</w:t>
+      </w:r>
+      <w:r>
+        <w:rPr>
+          <w:rFonts w:ascii="Times New Roman" w:hAnsi="Times New Roman" w:cs="Times New Roman"/>
+          <w:i/>
+          <w:sz w:val="24"/>
+        </w:rPr>
+        <w:t>PLS-SEM</w:t>
+      </w:r>
+      <w:r>
+        <w:rPr>
+          <w:rFonts w:ascii="Times New Roman" w:hAnsi="Times New Roman" w:cs="Times New Roman"/>
+          <w:sz w:val="24"/>
+        </w:rPr>
+        <w:t>) (3rd ed.). SAGE Publications.</w:t>
       </w:r>
     </w:p>
     <w:p>
@@ -18198,22 +18094,7 @@
           <w:rFonts w:ascii="Times New Roman" w:hAnsi="Times New Roman" w:cs="Times New Roman"/>
           <w:sz w:val="24"/>
         </w:rPr>
-        <w:t xml:space="preserve">Ghozali, I. (2021). Aplikasi analisis multivariate dengan program </w:t>
-      </w:r>
-      <w:r>
-        <w:rPr>
-          <w:rFonts w:ascii="Times New Roman" w:hAnsi="Times New Roman" w:cs="Times New Roman"/>
-          <w:i/>
-          <w:sz w:val="24"/>
-        </w:rPr>
-        <w:t>IBM SPSS</w:t>
-      </w:r>
-      <w:r>
-        <w:rPr>
-          <w:rFonts w:ascii="Times New Roman" w:hAnsi="Times New Roman" w:cs="Times New Roman"/>
-          <w:sz w:val="24"/>
-        </w:rPr>
-        <w:t xml:space="preserve"> 26 (Edisi ke-10). Badan Penerbit Universitas Diponegoro.</w:t>
+        <w:t>Hair, J. F., Page, M., &amp; Brunsveld, N. (2021). Essentials of business research methods (5th ed.). Routledge. https://doi.org/10.4324/9781003107798</w:t>
       </w:r>
     </w:p>
     <w:p>
@@ -18232,7 +18113,7 @@
           <w:rFonts w:ascii="Times New Roman" w:hAnsi="Times New Roman" w:cs="Times New Roman"/>
           <w:sz w:val="24"/>
         </w:rPr>
-        <w:t xml:space="preserve">GoodStats. (2024). Survei perilaku pengguna dan preferensi aplikasi transportasi </w:t>
+        <w:t xml:space="preserve">Institute for Development of Economics and Finance. (2023). Dinamika persaingan dan perilaku konsumen industri transportasi </w:t>
       </w:r>
       <w:r>
         <w:rPr>
@@ -18247,7 +18128,7 @@
           <w:rFonts w:ascii="Times New Roman" w:hAnsi="Times New Roman" w:cs="Times New Roman"/>
           <w:sz w:val="24"/>
         </w:rPr>
-        <w:t xml:space="preserve"> di Indonesia. GoodStats Data &amp; Research. https://goodstats.id</w:t>
+        <w:t xml:space="preserve"> di Indonesia. INDEF Policy Report. https://indef.or.id</w:t>
       </w:r>
     </w:p>
     <w:p>
@@ -18266,7 +18147,7 @@
           <w:rFonts w:ascii="Times New Roman" w:hAnsi="Times New Roman" w:cs="Times New Roman"/>
           <w:sz w:val="24"/>
         </w:rPr>
-        <w:t>Hair, J. F., Black, W. C., Babin, B. J., &amp; Anderson, R. E. (2019). Multivariate data analysis (8th ed.). Cengage Learning.</w:t>
+        <w:t>International Energy Agency. (2023). Global EV outlook 2023: Catching up with climate targets. IEA Publications. https://doi.org/10.1787/d4349524-en</w:t>
       </w:r>
     </w:p>
     <w:p>
@@ -18285,22 +18166,7 @@
           <w:rFonts w:ascii="Times New Roman" w:hAnsi="Times New Roman" w:cs="Times New Roman"/>
           <w:sz w:val="24"/>
         </w:rPr>
-        <w:t xml:space="preserve">Institute for Development of Economics and Finance. (2023). Dinamika persaingan dan perilaku konsumen industri transportasi </w:t>
-      </w:r>
-      <w:r>
-        <w:rPr>
-          <w:rFonts w:ascii="Times New Roman" w:hAnsi="Times New Roman" w:cs="Times New Roman"/>
-          <w:i/>
-          <w:sz w:val="24"/>
-        </w:rPr>
-        <w:t>online</w:t>
-      </w:r>
-      <w:r>
-        <w:rPr>
-          <w:rFonts w:ascii="Times New Roman" w:hAnsi="Times New Roman" w:cs="Times New Roman"/>
-          <w:sz w:val="24"/>
-        </w:rPr>
-        <w:t xml:space="preserve"> di Indonesia. INDEF Policy Report. https://indef.or.id</w:t>
+        <w:t>Katadata. (2025). Tantangan adaptasi teknologi dan dinamika operasional taksi listrik di Jakarta. Katadata Indonesia. https://katadata.co.id</w:t>
       </w:r>
     </w:p>
     <w:p>
@@ -18319,7 +18185,7 @@
           <w:rFonts w:ascii="Times New Roman" w:hAnsi="Times New Roman" w:cs="Times New Roman"/>
           <w:sz w:val="24"/>
         </w:rPr>
-        <w:t>International Energy Agency. (2023). Global EV outlook 2023: Catching up with climate targets. IEA Publications. https://doi.org/10.1787/d4349524-en</w:t>
+        <w:t>Kompas. (2025). Evaluasi keselamatan berkendara dan kesiapan pengemudi angkutan listrik komersial di ibu kota. Kompas.com. https://otomotif.kompas.com</w:t>
       </w:r>
     </w:p>
     <w:p>
@@ -18338,7 +18204,7 @@
           <w:rFonts w:ascii="Times New Roman" w:hAnsi="Times New Roman" w:cs="Times New Roman"/>
           <w:sz w:val="24"/>
         </w:rPr>
-        <w:t>Katadata. (2025). Tantangan adaptasi teknologi dan dinamika operasional taksi listrik di Jakarta. Katadata Indonesia. https://katadata.co.id</w:t>
+        <w:t>Kotler, P., Keller, K. L., &amp; Chernev, A. (2022). Marketing management (16th ed.). Pearson Education.</w:t>
       </w:r>
     </w:p>
     <w:p>
@@ -18357,22 +18223,37 @@
           <w:rFonts w:ascii="Times New Roman" w:hAnsi="Times New Roman" w:cs="Times New Roman"/>
           <w:sz w:val="24"/>
         </w:rPr>
-        <w:t xml:space="preserve">Keller, K. L. (1993). Conceptualizing, measuring, and managing </w:t>
-      </w:r>
-      <w:r>
-        <w:rPr>
-          <w:rFonts w:ascii="Times New Roman" w:hAnsi="Times New Roman" w:cs="Times New Roman"/>
-          <w:i/>
-          <w:sz w:val="24"/>
-        </w:rPr>
-        <w:t>customer-based brand equity</w:t>
-      </w:r>
-      <w:r>
-        <w:rPr>
-          <w:rFonts w:ascii="Times New Roman" w:hAnsi="Times New Roman" w:cs="Times New Roman"/>
-          <w:sz w:val="24"/>
-        </w:rPr>
-        <w:t>. Journal of Marketing, 57(1), 1–22. https://doi.org/10.1177/002224299305700101</w:t>
+        <w:t xml:space="preserve">La Barbera, F., &amp; Ajzen, I. (2021). Moderating role of </w:t>
+      </w:r>
+      <w:r>
+        <w:rPr>
+          <w:rFonts w:ascii="Times New Roman" w:hAnsi="Times New Roman" w:cs="Times New Roman"/>
+          <w:i/>
+          <w:sz w:val="24"/>
+        </w:rPr>
+        <w:t>perceived behavioral control</w:t>
+      </w:r>
+      <w:r>
+        <w:rPr>
+          <w:rFonts w:ascii="Times New Roman" w:hAnsi="Times New Roman" w:cs="Times New Roman"/>
+          <w:sz w:val="24"/>
+        </w:rPr>
+        <w:t xml:space="preserve"> in the </w:t>
+      </w:r>
+      <w:r>
+        <w:rPr>
+          <w:rFonts w:ascii="Times New Roman" w:hAnsi="Times New Roman" w:cs="Times New Roman"/>
+          <w:i/>
+          <w:sz w:val="24"/>
+        </w:rPr>
+        <w:t>theory of planned behavior</w:t>
+      </w:r>
+      <w:r>
+        <w:rPr>
+          <w:rFonts w:ascii="Times New Roman" w:hAnsi="Times New Roman" w:cs="Times New Roman"/>
+          <w:sz w:val="24"/>
+        </w:rPr>
+        <w:t>: A preregistered study. Journal of Theoretical Social Psychology, 5(1), 35–45. https://doi.org/10.1002/jts5.70</w:t>
       </w:r>
     </w:p>
     <w:p>
@@ -18391,37 +18272,22 @@
           <w:rFonts w:ascii="Times New Roman" w:hAnsi="Times New Roman" w:cs="Times New Roman"/>
           <w:sz w:val="24"/>
         </w:rPr>
-        <w:t xml:space="preserve">Keller, K. L., &amp; Swaminathan, V. (2020). Strategic </w:t>
-      </w:r>
-      <w:r>
-        <w:rPr>
-          <w:rFonts w:ascii="Times New Roman" w:hAnsi="Times New Roman" w:cs="Times New Roman"/>
-          <w:i/>
-          <w:sz w:val="24"/>
-        </w:rPr>
-        <w:t>brand management</w:t>
-      </w:r>
-      <w:r>
-        <w:rPr>
-          <w:rFonts w:ascii="Times New Roman" w:hAnsi="Times New Roman" w:cs="Times New Roman"/>
-          <w:sz w:val="24"/>
-        </w:rPr>
-        <w:t xml:space="preserve">: Building, measuring, and managing </w:t>
-      </w:r>
-      <w:r>
-        <w:rPr>
-          <w:rFonts w:ascii="Times New Roman" w:hAnsi="Times New Roman" w:cs="Times New Roman"/>
-          <w:i/>
-          <w:sz w:val="24"/>
-        </w:rPr>
-        <w:t>brand equity</w:t>
-      </w:r>
-      <w:r>
-        <w:rPr>
-          <w:rFonts w:ascii="Times New Roman" w:hAnsi="Times New Roman" w:cs="Times New Roman"/>
-          <w:sz w:val="24"/>
-        </w:rPr>
-        <w:t xml:space="preserve"> (5th ed.). Pearson Education.</w:t>
+        <w:t xml:space="preserve">Mirae Asset Sekuritas Indonesia. (2023). Indonesia mobility sector update: Navigating duopoly competition and profitability in </w:t>
+      </w:r>
+      <w:r>
+        <w:rPr>
+          <w:rFonts w:ascii="Times New Roman" w:hAnsi="Times New Roman" w:cs="Times New Roman"/>
+          <w:i/>
+          <w:sz w:val="24"/>
+        </w:rPr>
+        <w:t>ride-hailing</w:t>
+      </w:r>
+      <w:r>
+        <w:rPr>
+          <w:rFonts w:ascii="Times New Roman" w:hAnsi="Times New Roman" w:cs="Times New Roman"/>
+          <w:sz w:val="24"/>
+        </w:rPr>
+        <w:t xml:space="preserve"> services. Research Report, Mirae Asset Sekuritas.</w:t>
       </w:r>
     </w:p>
     <w:p>
@@ -18440,7 +18306,7 @@
           <w:rFonts w:ascii="Times New Roman" w:hAnsi="Times New Roman" w:cs="Times New Roman"/>
           <w:sz w:val="24"/>
         </w:rPr>
-        <w:t>Kompas. (2025). Evaluasi keselamatan berkendara dan kesiapan pengemudi angkutan listrik komersial di ibu kota. Kompas.com. https://otomotif.kompas.com</w:t>
+        <w:t>Pemerintah Provinsi Daerah Khusus Ibukota Jakarta. (2021). Peraturan Gubernur Daerah Khusus Ibukota Jakarta Nomor 90 Tahun 2021 tentang Rencana Pembangunan Rendah Karbon Daerah yang Berketahanan Iklim. Berita Daerah Provinsi Daerah Khusus Ibukota Jakarta Tahun 2021 Nomor 62024.</w:t>
       </w:r>
     </w:p>
     <w:p>
@@ -18459,7 +18325,22 @@
           <w:rFonts w:ascii="Times New Roman" w:hAnsi="Times New Roman" w:cs="Times New Roman"/>
           <w:sz w:val="24"/>
         </w:rPr>
-        <w:t>Kotler, P., Keller, K. L., &amp; Chernev, A. (2022). Marketing management (16th ed.). Pearson Education.</w:t>
+        <w:t xml:space="preserve">Populix. (2024). </w:t>
+      </w:r>
+      <w:r>
+        <w:rPr>
+          <w:rFonts w:ascii="Times New Roman" w:hAnsi="Times New Roman" w:cs="Times New Roman"/>
+          <w:i/>
+          <w:sz w:val="24"/>
+        </w:rPr>
+        <w:t>Electric vehicle</w:t>
+      </w:r>
+      <w:r>
+        <w:rPr>
+          <w:rFonts w:ascii="Times New Roman" w:hAnsi="Times New Roman" w:cs="Times New Roman"/>
+          <w:sz w:val="24"/>
+        </w:rPr>
+        <w:t xml:space="preserve"> dynamics: Unveiling consumer perspectives and market insights in Indonesia. Populix Consumer Insights Report. https://populix.co</w:t>
       </w:r>
     </w:p>
     <w:p>
@@ -18478,22 +18359,22 @@
           <w:rFonts w:ascii="Times New Roman" w:hAnsi="Times New Roman" w:cs="Times New Roman"/>
           <w:sz w:val="24"/>
         </w:rPr>
-        <w:t xml:space="preserve">Lemeshow, S., Hosmer, D. W., Klar, J., &amp; Lwanga, S. K. (1997). Adequacy of </w:t>
-      </w:r>
-      <w:r>
-        <w:rPr>
-          <w:rFonts w:ascii="Times New Roman" w:hAnsi="Times New Roman" w:cs="Times New Roman"/>
-          <w:i/>
-          <w:sz w:val="24"/>
-        </w:rPr>
-        <w:t>sample size</w:t>
-      </w:r>
-      <w:r>
-        <w:rPr>
-          <w:rFonts w:ascii="Times New Roman" w:hAnsi="Times New Roman" w:cs="Times New Roman"/>
-          <w:sz w:val="24"/>
-        </w:rPr>
-        <w:t xml:space="preserve"> in health studies. John Wiley &amp; Sons.</w:t>
+        <w:t>Republik Indonesia. (2023). Peraturan Presiden Republik Indonesia Nomor 79 Tahun 2023 tentang Perubahan atas Peraturan Presiden Nomor 55 Tahun 2019 tentang Percepatan Program Kendaraan Bermotor Listrik Berbasis Baterai (</w:t>
+      </w:r>
+      <w:r>
+        <w:rPr>
+          <w:rFonts w:ascii="Times New Roman" w:hAnsi="Times New Roman" w:cs="Times New Roman"/>
+          <w:i/>
+          <w:sz w:val="24"/>
+        </w:rPr>
+        <w:t>Battery Electric Vehicle</w:t>
+      </w:r>
+      <w:r>
+        <w:rPr>
+          <w:rFonts w:ascii="Times New Roman" w:hAnsi="Times New Roman" w:cs="Times New Roman"/>
+          <w:sz w:val="24"/>
+        </w:rPr>
+        <w:t>) untuk Transportasi Jalan. Lembaran Negara Republik Indonesia Tahun 2023 Nomor 158. Sekretariat Negara.</w:t>
       </w:r>
     </w:p>
     <w:p>
@@ -18512,22 +18393,7 @@
           <w:rFonts w:ascii="Times New Roman" w:hAnsi="Times New Roman" w:cs="Times New Roman"/>
           <w:sz w:val="24"/>
         </w:rPr>
-        <w:t xml:space="preserve">Mirae Asset Sekuritas Indonesia. (2023). Indonesia mobility sector update: Navigating duopoly competition and profitability in </w:t>
-      </w:r>
-      <w:r>
-        <w:rPr>
-          <w:rFonts w:ascii="Times New Roman" w:hAnsi="Times New Roman" w:cs="Times New Roman"/>
-          <w:i/>
-          <w:sz w:val="24"/>
-        </w:rPr>
-        <w:t>ride-hailing</w:t>
-      </w:r>
-      <w:r>
-        <w:rPr>
-          <w:rFonts w:ascii="Times New Roman" w:hAnsi="Times New Roman" w:cs="Times New Roman"/>
-          <w:sz w:val="24"/>
-        </w:rPr>
-        <w:t xml:space="preserve"> services. Research Report, Mirae Asset Sekuritas.</w:t>
+        <w:t>Sugiyono. (2022). Metode penelitian kuantitatif, kualitatif, dan R&amp;D (Edisi ke-3). Alfabeta.</w:t>
       </w:r>
     </w:p>
     <w:p>
@@ -18546,7 +18412,7 @@
           <w:rFonts w:ascii="Times New Roman" w:hAnsi="Times New Roman" w:cs="Times New Roman"/>
           <w:sz w:val="24"/>
         </w:rPr>
-        <w:t>Pemerintah Provinsi Daerah Khusus Ibukota Jakarta. (2021). Peraturan Gubernur Daerah Khusus Ibukota Jakarta Nomor 90 Tahun 2021 tentang Rencana Pembangunan Rendah Karbon Daerah yang Berketahanan Iklim. Berita Daerah Provinsi Daerah Khusus Ibukota Jakarta Tahun 2021 Nomor 62024.</w:t>
+        <w:t>Tjiptono, F. (2022). Pemasaran strategik (Edisi ke-4). Andi Offset.</w:t>
       </w:r>
     </w:p>
     <w:p>
@@ -18565,22 +18431,26 @@
           <w:rFonts w:ascii="Times New Roman" w:hAnsi="Times New Roman" w:cs="Times New Roman"/>
           <w:sz w:val="24"/>
         </w:rPr>
-        <w:t xml:space="preserve">Populix. (2024). </w:t>
-      </w:r>
-      <w:r>
-        <w:rPr>
-          <w:rFonts w:ascii="Times New Roman" w:hAnsi="Times New Roman" w:cs="Times New Roman"/>
-          <w:i/>
-          <w:sz w:val="24"/>
-        </w:rPr>
-        <w:t>Electric vehicle</w:t>
-      </w:r>
-      <w:r>
-        <w:rPr>
-          <w:rFonts w:ascii="Times New Roman" w:hAnsi="Times New Roman" w:cs="Times New Roman"/>
-          <w:sz w:val="24"/>
-        </w:rPr>
-        <w:t xml:space="preserve"> dynamics: Unveiling consumer perspectives and market insights in Indonesia. Populix Consumer Insights Report. https://populix.co</w:t>
+        <w:t>Zeithaml, V. A., Bitner, M. J., &amp; Gremler, D. D. (2023). Services marketing: Integrating customer focus across the firm (8th ed.). McGraw-Hill Education.</w:t>
+      </w:r>
+    </w:p>
+    <w:p>
+      <w:pPr>
+        <w:keepNext/>
+        <w:spacing w:line="360" w:lineRule="auto"/>
+        <w:rPr>
+          <w:rFonts w:ascii="Times New Roman" w:hAnsi="Times New Roman" w:cs="Times New Roman"/>
+          <w:b/>
+          <w:sz w:val="24"/>
+        </w:rPr>
+      </w:pPr>
+      <w:r>
+        <w:rPr>
+          <w:rFonts w:ascii="Times New Roman" w:hAnsi="Times New Roman" w:cs="Times New Roman"/>
+          <w:b/>
+          <w:sz w:val="24"/>
+        </w:rPr>
+        <w:t>2. KARYA ILMIAH DOSEN PROGRAM STUDI MANAJEMEN FEB UKRIDA</w:t>
       </w:r>
     </w:p>
     <w:p>
@@ -18599,22 +18469,37 @@
           <w:rFonts w:ascii="Times New Roman" w:hAnsi="Times New Roman" w:cs="Times New Roman"/>
           <w:sz w:val="24"/>
         </w:rPr>
-        <w:t>Republik Indonesia. (2019). Peraturan Presiden Nomor 55 Tahun 2019 tentang Percepatan Program Kendaraan Bermotor Listrik Berbasis Baterai (</w:t>
-      </w:r>
-      <w:r>
-        <w:rPr>
-          <w:rFonts w:ascii="Times New Roman" w:hAnsi="Times New Roman" w:cs="Times New Roman"/>
-          <w:i/>
-          <w:sz w:val="24"/>
-        </w:rPr>
-        <w:t>Battery Electric Vehicle</w:t>
-      </w:r>
-      <w:r>
-        <w:rPr>
-          <w:rFonts w:ascii="Times New Roman" w:hAnsi="Times New Roman" w:cs="Times New Roman"/>
-          <w:sz w:val="24"/>
-        </w:rPr>
-        <w:t>) untuk Transportasi Jalan. Lembaran Negara Republik Indonesia Tahun 2019 Nomor 146. Sekretariat Negara.</w:t>
+        <w:t xml:space="preserve">Sundah, F., Tecoalu, M., &amp; Wahyoedi, S. (2022). The effect of trust, price, and ease of transaction on buying interest and their implications on </w:t>
+      </w:r>
+      <w:r>
+        <w:rPr>
+          <w:rFonts w:ascii="Times New Roman" w:hAnsi="Times New Roman" w:cs="Times New Roman"/>
+          <w:i/>
+          <w:sz w:val="24"/>
+        </w:rPr>
+        <w:t>purchase decisions</w:t>
+      </w:r>
+      <w:r>
+        <w:rPr>
+          <w:rFonts w:ascii="Times New Roman" w:hAnsi="Times New Roman" w:cs="Times New Roman"/>
+          <w:sz w:val="24"/>
+        </w:rPr>
+        <w:t xml:space="preserve"> study PT. Indonesia Maybank Finance </w:t>
+      </w:r>
+      <w:r>
+        <w:rPr>
+          <w:rFonts w:ascii="Times New Roman" w:hAnsi="Times New Roman" w:cs="Times New Roman"/>
+          <w:i/>
+          <w:sz w:val="24"/>
+        </w:rPr>
+        <w:t>online</w:t>
+      </w:r>
+      <w:r>
+        <w:rPr>
+          <w:rFonts w:ascii="Times New Roman" w:hAnsi="Times New Roman" w:cs="Times New Roman"/>
+          <w:sz w:val="24"/>
+        </w:rPr>
+        <w:t xml:space="preserve"> customer. International Journal of Social Science, Educational, Economics, Agriculture Research and Technology (IJSET), 1(9), 431–442. https://doi.org/10.54443/ijset.v1i9.50</w:t>
       </w:r>
     </w:p>
     <w:p>
@@ -18633,22 +18518,37 @@
           <w:rFonts w:ascii="Times New Roman" w:hAnsi="Times New Roman" w:cs="Times New Roman"/>
           <w:sz w:val="24"/>
         </w:rPr>
-        <w:t xml:space="preserve">Schiffman, L. G., &amp; Wisenblit, J. (2019). </w:t>
-      </w:r>
-      <w:r>
-        <w:rPr>
-          <w:rFonts w:ascii="Times New Roman" w:hAnsi="Times New Roman" w:cs="Times New Roman"/>
-          <w:i/>
-          <w:sz w:val="24"/>
-        </w:rPr>
-        <w:t>Consumer behavior</w:t>
-      </w:r>
-      <w:r>
-        <w:rPr>
-          <w:rFonts w:ascii="Times New Roman" w:hAnsi="Times New Roman" w:cs="Times New Roman"/>
-          <w:sz w:val="24"/>
-        </w:rPr>
-        <w:t xml:space="preserve"> (12th ed.). Pearson Education.</w:t>
+        <w:t xml:space="preserve">Tecoalu, M. (2021). The effect of service quality, promotion strategy and company image on </w:t>
+      </w:r>
+      <w:r>
+        <w:rPr>
+          <w:rFonts w:ascii="Times New Roman" w:hAnsi="Times New Roman" w:cs="Times New Roman"/>
+          <w:i/>
+          <w:sz w:val="24"/>
+        </w:rPr>
+        <w:t>word of mouth</w:t>
+      </w:r>
+      <w:r>
+        <w:rPr>
+          <w:rFonts w:ascii="Times New Roman" w:hAnsi="Times New Roman" w:cs="Times New Roman"/>
+          <w:sz w:val="24"/>
+        </w:rPr>
+        <w:t xml:space="preserve"> in mediation by </w:t>
+      </w:r>
+      <w:r>
+        <w:rPr>
+          <w:rFonts w:ascii="Times New Roman" w:hAnsi="Times New Roman" w:cs="Times New Roman"/>
+          <w:i/>
+          <w:sz w:val="24"/>
+        </w:rPr>
+        <w:t>online</w:t>
+      </w:r>
+      <w:r>
+        <w:rPr>
+          <w:rFonts w:ascii="Times New Roman" w:hAnsi="Times New Roman" w:cs="Times New Roman"/>
+          <w:sz w:val="24"/>
+        </w:rPr>
+        <w:t xml:space="preserve"> transport customer satisfaction Jakarta region. Revista Gestão Inovação e Tecnologias, 11(3), 93–102. https://doi.org/10.47059/revistageintec.v11i3.1918</w:t>
       </w:r>
     </w:p>
     <w:p>
@@ -18667,7 +18567,41 @@
           <w:rFonts w:ascii="Times New Roman" w:hAnsi="Times New Roman" w:cs="Times New Roman"/>
           <w:sz w:val="24"/>
         </w:rPr>
-        <w:t>Sekaran, U., &amp; Bougie, R. (2016). Research methods for business: A skill-building approach (7th ed.). John Wiley &amp; Sons.</w:t>
+        <w:t xml:space="preserve">Tecoalu, M., Saparso, &amp; Fernandes. (2021). The role of </w:t>
+      </w:r>
+      <w:r>
+        <w:rPr>
+          <w:rFonts w:ascii="Times New Roman" w:hAnsi="Times New Roman" w:cs="Times New Roman"/>
+          <w:i/>
+          <w:sz w:val="24"/>
+        </w:rPr>
+        <w:t>brand image</w:t>
+      </w:r>
+      <w:r>
+        <w:rPr>
+          <w:rFonts w:ascii="Times New Roman" w:hAnsi="Times New Roman" w:cs="Times New Roman"/>
+          <w:sz w:val="24"/>
+        </w:rPr>
+        <w:t xml:space="preserve"> in mediating the influence of country of origin image and price on purchasing decisions (Study case on car credit products PT. Maybank Indonesia Finance). SIASAT, 6(4), 204–218. https://doi.org/10.33258/siasat.v6i4.105</w:t>
+      </w:r>
+    </w:p>
+    <w:p>
+      <w:pPr>
+        <w:keepNext/>
+        <w:spacing w:line="360" w:lineRule="auto"/>
+        <w:rPr>
+          <w:rFonts w:ascii="Times New Roman" w:hAnsi="Times New Roman" w:cs="Times New Roman"/>
+          <w:b/>
+          <w:sz w:val="24"/>
+        </w:rPr>
+      </w:pPr>
+      <w:r>
+        <w:rPr>
+          <w:rFonts w:ascii="Times New Roman" w:hAnsi="Times New Roman" w:cs="Times New Roman"/>
+          <w:b/>
+          <w:sz w:val="24"/>
+        </w:rPr>
+        <w:t>3. ARTIKEL JURNAL EMPIRIS TERDAHULU (TERVERIFIKASI &amp; BERKAS PDF TERSEDIA)</w:t>
       </w:r>
     </w:p>
     <w:p>
@@ -18686,7 +18620,82 @@
           <w:rFonts w:ascii="Times New Roman" w:hAnsi="Times New Roman" w:cs="Times New Roman"/>
           <w:sz w:val="24"/>
         </w:rPr>
-        <w:t>Sugiyono. (2019). Metode penelitian kuantitatif, kualitatif, dan R&amp;D (Edisi ke-2). Alfabeta.</w:t>
+        <w:t xml:space="preserve">Adha, F. Z., &amp; Suhardi. (2025). The role of influencers, </w:t>
+      </w:r>
+      <w:r>
+        <w:rPr>
+          <w:rFonts w:ascii="Times New Roman" w:hAnsi="Times New Roman" w:cs="Times New Roman"/>
+          <w:i/>
+          <w:sz w:val="24"/>
+        </w:rPr>
+        <w:t>brand image</w:t>
+      </w:r>
+      <w:r>
+        <w:rPr>
+          <w:rFonts w:ascii="Times New Roman" w:hAnsi="Times New Roman" w:cs="Times New Roman"/>
+          <w:sz w:val="24"/>
+        </w:rPr>
+        <w:t xml:space="preserve">, </w:t>
+      </w:r>
+      <w:r>
+        <w:rPr>
+          <w:rFonts w:ascii="Times New Roman" w:hAnsi="Times New Roman" w:cs="Times New Roman"/>
+          <w:i/>
+          <w:sz w:val="24"/>
+        </w:rPr>
+        <w:t>ease of use</w:t>
+      </w:r>
+      <w:r>
+        <w:rPr>
+          <w:rFonts w:ascii="Times New Roman" w:hAnsi="Times New Roman" w:cs="Times New Roman"/>
+          <w:sz w:val="24"/>
+        </w:rPr>
+        <w:t xml:space="preserve">, and </w:t>
+      </w:r>
+      <w:r>
+        <w:rPr>
+          <w:rFonts w:ascii="Times New Roman" w:hAnsi="Times New Roman" w:cs="Times New Roman"/>
+          <w:i/>
+          <w:sz w:val="24"/>
+        </w:rPr>
+        <w:t>consumer trust</w:t>
+      </w:r>
+      <w:r>
+        <w:rPr>
+          <w:rFonts w:ascii="Times New Roman" w:hAnsi="Times New Roman" w:cs="Times New Roman"/>
+          <w:sz w:val="24"/>
+        </w:rPr>
+        <w:t xml:space="preserve"> in </w:t>
+      </w:r>
+      <w:r>
+        <w:rPr>
+          <w:rFonts w:ascii="Times New Roman" w:hAnsi="Times New Roman" w:cs="Times New Roman"/>
+          <w:i/>
+          <w:sz w:val="24"/>
+        </w:rPr>
+        <w:t>electric vehicle</w:t>
+      </w:r>
+      <w:r>
+        <w:rPr>
+          <w:rFonts w:ascii="Times New Roman" w:hAnsi="Times New Roman" w:cs="Times New Roman"/>
+          <w:sz w:val="24"/>
+        </w:rPr>
+        <w:t xml:space="preserve"> </w:t>
+      </w:r>
+      <w:r>
+        <w:rPr>
+          <w:rFonts w:ascii="Times New Roman" w:hAnsi="Times New Roman" w:cs="Times New Roman"/>
+          <w:i/>
+          <w:sz w:val="24"/>
+        </w:rPr>
+        <w:t>purchase decisions</w:t>
+      </w:r>
+      <w:r>
+        <w:rPr>
+          <w:rFonts w:ascii="Times New Roman" w:hAnsi="Times New Roman" w:cs="Times New Roman"/>
+          <w:sz w:val="24"/>
+        </w:rPr>
+        <w:t>. Journal of Educational Management Research, 4(6), 2924–2936. https://doi.org/10.61987/jemr.v4i6.1474</w:t>
       </w:r>
     </w:p>
     <w:p>
@@ -18705,26 +18714,22 @@
           <w:rFonts w:ascii="Times New Roman" w:hAnsi="Times New Roman" w:cs="Times New Roman"/>
           <w:sz w:val="24"/>
         </w:rPr>
-        <w:t>Tjiptono, F., &amp; Chandra, G. (2019). Pemasaran strategik (Edisi ke-3). Andi Offset.</w:t>
-      </w:r>
-    </w:p>
-    <w:p>
-      <w:pPr>
-        <w:keepNext/>
-        <w:spacing w:line="360" w:lineRule="auto"/>
-        <w:rPr>
-          <w:rFonts w:ascii="Times New Roman" w:hAnsi="Times New Roman" w:cs="Times New Roman"/>
-          <w:b/>
-          <w:sz w:val="24"/>
-        </w:rPr>
-      </w:pPr>
-      <w:r>
-        <w:rPr>
-          <w:rFonts w:ascii="Times New Roman" w:hAnsi="Times New Roman" w:cs="Times New Roman"/>
-          <w:b/>
-          <w:sz w:val="24"/>
-        </w:rPr>
-        <w:t>2. KARYA ILMIAH DOSEN PROGRAM STUDI MANAJEMEN FEB UKRIDA</w:t>
+        <w:t xml:space="preserve">Afendi, R. F., &amp; Suhardi. (2026). Pengaruh kepercayaan, keamanan, dan kemudahan penggunaan terhadap keputusan pembelian pada </w:t>
+      </w:r>
+      <w:r>
+        <w:rPr>
+          <w:rFonts w:ascii="Times New Roman" w:hAnsi="Times New Roman" w:cs="Times New Roman"/>
+          <w:i/>
+          <w:sz w:val="24"/>
+        </w:rPr>
+        <w:t>Grab</w:t>
+      </w:r>
+      <w:r>
+        <w:rPr>
+          <w:rFonts w:ascii="Times New Roman" w:hAnsi="Times New Roman" w:cs="Times New Roman"/>
+          <w:sz w:val="24"/>
+        </w:rPr>
+        <w:t>Food di Kota Batam. Jurnal Riset Rumpun Ilmu Ekonomi (JURRIE), 5(1), 22–34. https://doi.org/10.55606/jurrie.v5i1.7941</w:t>
       </w:r>
     </w:p>
     <w:p>
@@ -18743,37 +18748,7 @@
           <w:rFonts w:ascii="Times New Roman" w:hAnsi="Times New Roman" w:cs="Times New Roman"/>
           <w:sz w:val="24"/>
         </w:rPr>
-        <w:t xml:space="preserve">Sundah, F., Tecoalu, M., &amp; Wahyoedi, S. (2022). The effect of trust, price, and ease of transaction on buying interest and their implications on </w:t>
-      </w:r>
-      <w:r>
-        <w:rPr>
-          <w:rFonts w:ascii="Times New Roman" w:hAnsi="Times New Roman" w:cs="Times New Roman"/>
-          <w:i/>
-          <w:sz w:val="24"/>
-        </w:rPr>
-        <w:t>purchase decisions</w:t>
-      </w:r>
-      <w:r>
-        <w:rPr>
-          <w:rFonts w:ascii="Times New Roman" w:hAnsi="Times New Roman" w:cs="Times New Roman"/>
-          <w:sz w:val="24"/>
-        </w:rPr>
-        <w:t xml:space="preserve"> study PT. Indonesia Maybank Finance </w:t>
-      </w:r>
-      <w:r>
-        <w:rPr>
-          <w:rFonts w:ascii="Times New Roman" w:hAnsi="Times New Roman" w:cs="Times New Roman"/>
-          <w:i/>
-          <w:sz w:val="24"/>
-        </w:rPr>
-        <w:t>online</w:t>
-      </w:r>
-      <w:r>
-        <w:rPr>
-          <w:rFonts w:ascii="Times New Roman" w:hAnsi="Times New Roman" w:cs="Times New Roman"/>
-          <w:sz w:val="24"/>
-        </w:rPr>
-        <w:t xml:space="preserve"> customer. International Journal of Social Science, Educational, Economics, Agriculture Research and Technology (IJSET), 1(9), 431–442. https://doi.org/10.54443/ijset.v1i9.50</w:t>
+        <w:t>Agustiningrum, R. D., &amp; Widyastuti. (2021). Pengaruh kepercayaan, kemudahan, dan keamanan terhadap keputusan pembelian di marketplace. Jurnal Ilmu Manajemen (JIM), 9(3), 896–906. https://doi.org/10.26740/jim.v9n3.p896-906</w:t>
       </w:r>
     </w:p>
     <w:p>
@@ -18792,22 +18767,7 @@
           <w:rFonts w:ascii="Times New Roman" w:hAnsi="Times New Roman" w:cs="Times New Roman"/>
           <w:sz w:val="24"/>
         </w:rPr>
-        <w:t xml:space="preserve">Tecoalu, M. (2021). The effect of service quality, promotion strategy and company image on </w:t>
-      </w:r>
-      <w:r>
-        <w:rPr>
-          <w:rFonts w:ascii="Times New Roman" w:hAnsi="Times New Roman" w:cs="Times New Roman"/>
-          <w:i/>
-          <w:sz w:val="24"/>
-        </w:rPr>
-        <w:t>word of mouth</w:t>
-      </w:r>
-      <w:r>
-        <w:rPr>
-          <w:rFonts w:ascii="Times New Roman" w:hAnsi="Times New Roman" w:cs="Times New Roman"/>
-          <w:sz w:val="24"/>
-        </w:rPr>
-        <w:t xml:space="preserve"> in mediation by </w:t>
+        <w:t xml:space="preserve">Ardialis, A., &amp; Irfani, A. (2023). Pengaruh kepercayaan, keamanan, dan persepsi resiko terhadap keputusan pembelian </w:t>
       </w:r>
       <w:r>
         <w:rPr>
@@ -18822,7 +18782,7 @@
           <w:rFonts w:ascii="Times New Roman" w:hAnsi="Times New Roman" w:cs="Times New Roman"/>
           <w:sz w:val="24"/>
         </w:rPr>
-        <w:t xml:space="preserve"> transport customer satisfaction Jakarta region. Revista Gestão Inovação e Tecnologias, 11(3), 93–102. https://doi.org/10.47059/revistageintec.v11i3.1918</w:t>
+        <w:t xml:space="preserve"> pada marketplace Lazada. Indonesian Journal of Business Economics and Management (IJBEM), 2(1), 12–21. https://doi.org/10.57152/ijbem.v2i1.470</w:t>
       </w:r>
     </w:p>
     <w:p>
@@ -18841,7 +18801,22 @@
           <w:rFonts w:ascii="Times New Roman" w:hAnsi="Times New Roman" w:cs="Times New Roman"/>
           <w:sz w:val="24"/>
         </w:rPr>
-        <w:t xml:space="preserve">Tecoalu, M., Saparso, &amp; Fernandes. (2021). The role of </w:t>
+        <w:t xml:space="preserve">Asnawir, &amp; Simanjuntak, M. (2024). The role of </w:t>
+      </w:r>
+      <w:r>
+        <w:rPr>
+          <w:rFonts w:ascii="Times New Roman" w:hAnsi="Times New Roman" w:cs="Times New Roman"/>
+          <w:i/>
+          <w:sz w:val="24"/>
+        </w:rPr>
+        <w:t>perceived risk</w:t>
+      </w:r>
+      <w:r>
+        <w:rPr>
+          <w:rFonts w:ascii="Times New Roman" w:hAnsi="Times New Roman" w:cs="Times New Roman"/>
+          <w:sz w:val="24"/>
+        </w:rPr>
+        <w:t xml:space="preserve"> in moderating the effects of </w:t>
       </w:r>
       <w:r>
         <w:rPr>
@@ -18856,26 +18831,37 @@
           <w:rFonts w:ascii="Times New Roman" w:hAnsi="Times New Roman" w:cs="Times New Roman"/>
           <w:sz w:val="24"/>
         </w:rPr>
-        <w:t xml:space="preserve"> in mediating the influence of country of origin image and price on purchasing decisions (Study case on car credit products PT. Maybank Indonesia Finance). SIASAT, 6(4), 204–218. https://doi.org/10.33258/siasat.v6i4.105</w:t>
-      </w:r>
-    </w:p>
-    <w:p>
-      <w:pPr>
-        <w:keepNext/>
-        <w:spacing w:line="360" w:lineRule="auto"/>
-        <w:rPr>
-          <w:rFonts w:ascii="Times New Roman" w:hAnsi="Times New Roman" w:cs="Times New Roman"/>
-          <w:b/>
-          <w:sz w:val="24"/>
-        </w:rPr>
-      </w:pPr>
-      <w:r>
-        <w:rPr>
-          <w:rFonts w:ascii="Times New Roman" w:hAnsi="Times New Roman" w:cs="Times New Roman"/>
-          <w:b/>
-          <w:sz w:val="24"/>
-        </w:rPr>
-        <w:t>3. ARTIKEL JURNAL EMPIRIS TERDAHULU (TERVERIFIKASI &amp; BERKAS PDF TERSEDIA)</w:t>
+        <w:t xml:space="preserve">, e-WOM, and </w:t>
+      </w:r>
+      <w:r>
+        <w:rPr>
+          <w:rFonts w:ascii="Times New Roman" w:hAnsi="Times New Roman" w:cs="Times New Roman"/>
+          <w:i/>
+          <w:sz w:val="24"/>
+        </w:rPr>
+        <w:t>brand trust</w:t>
+      </w:r>
+      <w:r>
+        <w:rPr>
+          <w:rFonts w:ascii="Times New Roman" w:hAnsi="Times New Roman" w:cs="Times New Roman"/>
+          <w:sz w:val="24"/>
+        </w:rPr>
+        <w:t xml:space="preserve"> on </w:t>
+      </w:r>
+      <w:r>
+        <w:rPr>
+          <w:rFonts w:ascii="Times New Roman" w:hAnsi="Times New Roman" w:cs="Times New Roman"/>
+          <w:i/>
+          <w:sz w:val="24"/>
+        </w:rPr>
+        <w:t>purchase decision</w:t>
+      </w:r>
+      <w:r>
+        <w:rPr>
+          <w:rFonts w:ascii="Times New Roman" w:hAnsi="Times New Roman" w:cs="Times New Roman"/>
+          <w:sz w:val="24"/>
+        </w:rPr>
+        <w:t xml:space="preserve"> in Shopee Mall. Jurnal Ilmiah Global Education, 6(3), 3842–3852. https://doi.org/10.55681/jige.v6i3.3842</w:t>
       </w:r>
     </w:p>
     <w:p>
@@ -18894,82 +18880,7 @@
           <w:rFonts w:ascii="Times New Roman" w:hAnsi="Times New Roman" w:cs="Times New Roman"/>
           <w:sz w:val="24"/>
         </w:rPr>
-        <w:t xml:space="preserve">Adha, F. Z., &amp; Suhardi. (2025). The role of influencers, </w:t>
-      </w:r>
-      <w:r>
-        <w:rPr>
-          <w:rFonts w:ascii="Times New Roman" w:hAnsi="Times New Roman" w:cs="Times New Roman"/>
-          <w:i/>
-          <w:sz w:val="24"/>
-        </w:rPr>
-        <w:t>brand image</w:t>
-      </w:r>
-      <w:r>
-        <w:rPr>
-          <w:rFonts w:ascii="Times New Roman" w:hAnsi="Times New Roman" w:cs="Times New Roman"/>
-          <w:sz w:val="24"/>
-        </w:rPr>
-        <w:t xml:space="preserve">, </w:t>
-      </w:r>
-      <w:r>
-        <w:rPr>
-          <w:rFonts w:ascii="Times New Roman" w:hAnsi="Times New Roman" w:cs="Times New Roman"/>
-          <w:i/>
-          <w:sz w:val="24"/>
-        </w:rPr>
-        <w:t>ease of use</w:t>
-      </w:r>
-      <w:r>
-        <w:rPr>
-          <w:rFonts w:ascii="Times New Roman" w:hAnsi="Times New Roman" w:cs="Times New Roman"/>
-          <w:sz w:val="24"/>
-        </w:rPr>
-        <w:t xml:space="preserve">, and </w:t>
-      </w:r>
-      <w:r>
-        <w:rPr>
-          <w:rFonts w:ascii="Times New Roman" w:hAnsi="Times New Roman" w:cs="Times New Roman"/>
-          <w:i/>
-          <w:sz w:val="24"/>
-        </w:rPr>
-        <w:t>consumer trust</w:t>
-      </w:r>
-      <w:r>
-        <w:rPr>
-          <w:rFonts w:ascii="Times New Roman" w:hAnsi="Times New Roman" w:cs="Times New Roman"/>
-          <w:sz w:val="24"/>
-        </w:rPr>
-        <w:t xml:space="preserve"> in </w:t>
-      </w:r>
-      <w:r>
-        <w:rPr>
-          <w:rFonts w:ascii="Times New Roman" w:hAnsi="Times New Roman" w:cs="Times New Roman"/>
-          <w:i/>
-          <w:sz w:val="24"/>
-        </w:rPr>
-        <w:t>electric vehicle</w:t>
-      </w:r>
-      <w:r>
-        <w:rPr>
-          <w:rFonts w:ascii="Times New Roman" w:hAnsi="Times New Roman" w:cs="Times New Roman"/>
-          <w:sz w:val="24"/>
-        </w:rPr>
-        <w:t xml:space="preserve"> </w:t>
-      </w:r>
-      <w:r>
-        <w:rPr>
-          <w:rFonts w:ascii="Times New Roman" w:hAnsi="Times New Roman" w:cs="Times New Roman"/>
-          <w:i/>
-          <w:sz w:val="24"/>
-        </w:rPr>
-        <w:t>purchase decisions</w:t>
-      </w:r>
-      <w:r>
-        <w:rPr>
-          <w:rFonts w:ascii="Times New Roman" w:hAnsi="Times New Roman" w:cs="Times New Roman"/>
-          <w:sz w:val="24"/>
-        </w:rPr>
-        <w:t>. Journal of Educational Management Research, 4(6), 2924–2936. https://doi.org/10.61987/jemr.v4i6.1474</w:t>
+        <w:t>Dahlia, D., &amp; Hartono, S. (2024). Pengaruh kepercayaan, kemudahan dan keamanan terhadap keputusan pembelian pada situs marketplace Shopee. Jurnal Entrepreneur dan Manajemen Sains (JEMS), 5(1), 105–116. https://doi.org/10.36085/jems.v5i1.5977</w:t>
       </w:r>
     </w:p>
     <w:p>
@@ -18988,22 +18899,22 @@
           <w:rFonts w:ascii="Times New Roman" w:hAnsi="Times New Roman" w:cs="Times New Roman"/>
           <w:sz w:val="24"/>
         </w:rPr>
-        <w:t xml:space="preserve">Afendi, R. F., &amp; Suhardi. (2026). Pengaruh kepercayaan, keamanan, dan kemudahan penggunaan terhadap keputusan pembelian pada </w:t>
-      </w:r>
-      <w:r>
-        <w:rPr>
-          <w:rFonts w:ascii="Times New Roman" w:hAnsi="Times New Roman" w:cs="Times New Roman"/>
-          <w:i/>
-          <w:sz w:val="24"/>
-        </w:rPr>
-        <w:t>Grab</w:t>
-      </w:r>
-      <w:r>
-        <w:rPr>
-          <w:rFonts w:ascii="Times New Roman" w:hAnsi="Times New Roman" w:cs="Times New Roman"/>
-          <w:sz w:val="24"/>
-        </w:rPr>
-        <w:t>Food di Kota Batam. Jurnal Riset Rumpun Ilmu Ekonomi (JURRIE), 5(1), 22–34. https://doi.org/10.55606/jurrie.v5i1.7941</w:t>
+        <w:t xml:space="preserve">Devananda, R., &amp; Hartono, B. (2023). Pengaruh kepercayaan, </w:t>
+      </w:r>
+      <w:r>
+        <w:rPr>
+          <w:rFonts w:ascii="Times New Roman" w:hAnsi="Times New Roman" w:cs="Times New Roman"/>
+          <w:i/>
+          <w:sz w:val="24"/>
+        </w:rPr>
+        <w:t>brand image</w:t>
+      </w:r>
+      <w:r>
+        <w:rPr>
+          <w:rFonts w:ascii="Times New Roman" w:hAnsi="Times New Roman" w:cs="Times New Roman"/>
+          <w:sz w:val="24"/>
+        </w:rPr>
+        <w:t>, keamanan terhadap keputusan pembelian (Studi pada pengguna Shopee Generasi Y &amp; Z). JIIP - Jurnal Ilmiah Ilmu Pendidikan, 6(10), 8021–8030. https://doi.org/10.54371/jiip.v6i10.2183</w:t>
       </w:r>
     </w:p>
     <w:p>
@@ -19022,7 +18933,52 @@
           <w:rFonts w:ascii="Times New Roman" w:hAnsi="Times New Roman" w:cs="Times New Roman"/>
           <w:sz w:val="24"/>
         </w:rPr>
-        <w:t>Agustiningrum, R. D., &amp; Widyastuti. (2021). Pengaruh kepercayaan, kemudahan, dan keamanan terhadap keputusan pembelian di marketplace. Jurnal Ilmu Manajemen (JIM), 9(3), 896–906. https://doi.org/10.26740/jim.v9n3.p896-906</w:t>
+        <w:t xml:space="preserve">Fadila, N., &amp; Wahyuni, S. (2025). Pengaruh environmental awareness, </w:t>
+      </w:r>
+      <w:r>
+        <w:rPr>
+          <w:rFonts w:ascii="Times New Roman" w:hAnsi="Times New Roman" w:cs="Times New Roman"/>
+          <w:i/>
+          <w:sz w:val="24"/>
+        </w:rPr>
+        <w:t>brand trust</w:t>
+      </w:r>
+      <w:r>
+        <w:rPr>
+          <w:rFonts w:ascii="Times New Roman" w:hAnsi="Times New Roman" w:cs="Times New Roman"/>
+          <w:sz w:val="24"/>
+        </w:rPr>
+        <w:t xml:space="preserve">, dan </w:t>
+      </w:r>
+      <w:r>
+        <w:rPr>
+          <w:rFonts w:ascii="Times New Roman" w:hAnsi="Times New Roman" w:cs="Times New Roman"/>
+          <w:i/>
+          <w:sz w:val="24"/>
+        </w:rPr>
+        <w:t>brand image</w:t>
+      </w:r>
+      <w:r>
+        <w:rPr>
+          <w:rFonts w:ascii="Times New Roman" w:hAnsi="Times New Roman" w:cs="Times New Roman"/>
+          <w:sz w:val="24"/>
+        </w:rPr>
+        <w:t xml:space="preserve"> terhadap keputusan pembelian The Body Shop dengan brand loyalty sebagai media </w:t>
+      </w:r>
+      <w:r>
+        <w:rPr>
+          <w:rFonts w:ascii="Times New Roman" w:hAnsi="Times New Roman" w:cs="Times New Roman"/>
+          <w:i/>
+          <w:sz w:val="24"/>
+        </w:rPr>
+        <w:t>intervening</w:t>
+      </w:r>
+      <w:r>
+        <w:rPr>
+          <w:rFonts w:ascii="Times New Roman" w:hAnsi="Times New Roman" w:cs="Times New Roman"/>
+          <w:sz w:val="24"/>
+        </w:rPr>
+        <w:t>. Paradoks: Jurnal Ilmu Ekonomi, 8(2), 211–224. https://doi.org/10.57178/paradoks.v8i2.1251</w:t>
       </w:r>
     </w:p>
     <w:p>
@@ -19041,22 +18997,82 @@
           <w:rFonts w:ascii="Times New Roman" w:hAnsi="Times New Roman" w:cs="Times New Roman"/>
           <w:sz w:val="24"/>
         </w:rPr>
-        <w:t xml:space="preserve">Ardialis, A., &amp; Irfani, A. (2023). Pengaruh kepercayaan, keamanan, dan persepsi resiko terhadap keputusan pembelian </w:t>
-      </w:r>
-      <w:r>
-        <w:rPr>
-          <w:rFonts w:ascii="Times New Roman" w:hAnsi="Times New Roman" w:cs="Times New Roman"/>
-          <w:i/>
-          <w:sz w:val="24"/>
-        </w:rPr>
-        <w:t>online</w:t>
-      </w:r>
-      <w:r>
-        <w:rPr>
-          <w:rFonts w:ascii="Times New Roman" w:hAnsi="Times New Roman" w:cs="Times New Roman"/>
-          <w:sz w:val="24"/>
-        </w:rPr>
-        <w:t xml:space="preserve"> pada marketplace Lazada. Indonesian Journal of Business Economics and Management (IJBEM), 2(1), 12–21. https://doi.org/10.57152/ijbem.v2i1.470</w:t>
+        <w:t xml:space="preserve">Hera, H., &amp; Fourqoniah, F. (2023). Pengaruh </w:t>
+      </w:r>
+      <w:r>
+        <w:rPr>
+          <w:rFonts w:ascii="Times New Roman" w:hAnsi="Times New Roman" w:cs="Times New Roman"/>
+          <w:i/>
+          <w:sz w:val="24"/>
+        </w:rPr>
+        <w:t>brand image</w:t>
+      </w:r>
+      <w:r>
+        <w:rPr>
+          <w:rFonts w:ascii="Times New Roman" w:hAnsi="Times New Roman" w:cs="Times New Roman"/>
+          <w:sz w:val="24"/>
+        </w:rPr>
+        <w:t xml:space="preserve"> dan </w:t>
+      </w:r>
+      <w:r>
+        <w:rPr>
+          <w:rFonts w:ascii="Times New Roman" w:hAnsi="Times New Roman" w:cs="Times New Roman"/>
+          <w:i/>
+          <w:sz w:val="24"/>
+        </w:rPr>
+        <w:t>brand ambassador</w:t>
+      </w:r>
+      <w:r>
+        <w:rPr>
+          <w:rFonts w:ascii="Times New Roman" w:hAnsi="Times New Roman" w:cs="Times New Roman"/>
+          <w:sz w:val="24"/>
+        </w:rPr>
+        <w:t xml:space="preserve"> terhadap </w:t>
+      </w:r>
+      <w:r>
+        <w:rPr>
+          <w:rFonts w:ascii="Times New Roman" w:hAnsi="Times New Roman" w:cs="Times New Roman"/>
+          <w:i/>
+          <w:sz w:val="24"/>
+        </w:rPr>
+        <w:t>purchase decision</w:t>
+      </w:r>
+      <w:r>
+        <w:rPr>
+          <w:rFonts w:ascii="Times New Roman" w:hAnsi="Times New Roman" w:cs="Times New Roman"/>
+          <w:sz w:val="24"/>
+        </w:rPr>
+        <w:t xml:space="preserve"> melalui </w:t>
+      </w:r>
+      <w:r>
+        <w:rPr>
+          <w:rFonts w:ascii="Times New Roman" w:hAnsi="Times New Roman" w:cs="Times New Roman"/>
+          <w:i/>
+          <w:sz w:val="24"/>
+        </w:rPr>
+        <w:t>brand trust</w:t>
+      </w:r>
+      <w:r>
+        <w:rPr>
+          <w:rFonts w:ascii="Times New Roman" w:hAnsi="Times New Roman" w:cs="Times New Roman"/>
+          <w:sz w:val="24"/>
+        </w:rPr>
+        <w:t xml:space="preserve"> sebagai </w:t>
+      </w:r>
+      <w:r>
+        <w:rPr>
+          <w:rFonts w:ascii="Times New Roman" w:hAnsi="Times New Roman" w:cs="Times New Roman"/>
+          <w:i/>
+          <w:sz w:val="24"/>
+        </w:rPr>
+        <w:t>intervening</w:t>
+      </w:r>
+      <w:r>
+        <w:rPr>
+          <w:rFonts w:ascii="Times New Roman" w:hAnsi="Times New Roman" w:cs="Times New Roman"/>
+          <w:sz w:val="24"/>
+        </w:rPr>
+        <w:t>. Ekonomi, Keuangan, Investasi dan Syariah (EKUITAS), 4(3), 877–884. https://doi.org/10.47065/ekuitas.v4i3.2810</w:t>
       </w:r>
     </w:p>
     <w:p>
@@ -19075,22 +19091,7 @@
           <w:rFonts w:ascii="Times New Roman" w:hAnsi="Times New Roman" w:cs="Times New Roman"/>
           <w:sz w:val="24"/>
         </w:rPr>
-        <w:t xml:space="preserve">Asnawir, &amp; Simanjuntak, M. (2024). The role of </w:t>
-      </w:r>
-      <w:r>
-        <w:rPr>
-          <w:rFonts w:ascii="Times New Roman" w:hAnsi="Times New Roman" w:cs="Times New Roman"/>
-          <w:i/>
-          <w:sz w:val="24"/>
-        </w:rPr>
-        <w:t>perceived risk</w:t>
-      </w:r>
-      <w:r>
-        <w:rPr>
-          <w:rFonts w:ascii="Times New Roman" w:hAnsi="Times New Roman" w:cs="Times New Roman"/>
-          <w:sz w:val="24"/>
-        </w:rPr>
-        <w:t xml:space="preserve"> in moderating the effects of </w:t>
+        <w:t xml:space="preserve">Inggasari, V., &amp; Prabowo, H. (2022). Pengaruh celebrity endorser, </w:t>
       </w:r>
       <w:r>
         <w:rPr>
@@ -19105,7 +19106,7 @@
           <w:rFonts w:ascii="Times New Roman" w:hAnsi="Times New Roman" w:cs="Times New Roman"/>
           <w:sz w:val="24"/>
         </w:rPr>
-        <w:t xml:space="preserve">, e-WOM, and </w:t>
+        <w:t xml:space="preserve">, dan </w:t>
       </w:r>
       <w:r>
         <w:rPr>
@@ -19120,22 +19121,7 @@
           <w:rFonts w:ascii="Times New Roman" w:hAnsi="Times New Roman" w:cs="Times New Roman"/>
           <w:sz w:val="24"/>
         </w:rPr>
-        <w:t xml:space="preserve"> on </w:t>
-      </w:r>
-      <w:r>
-        <w:rPr>
-          <w:rFonts w:ascii="Times New Roman" w:hAnsi="Times New Roman" w:cs="Times New Roman"/>
-          <w:i/>
-          <w:sz w:val="24"/>
-        </w:rPr>
-        <w:t>purchase decision</w:t>
-      </w:r>
-      <w:r>
-        <w:rPr>
-          <w:rFonts w:ascii="Times New Roman" w:hAnsi="Times New Roman" w:cs="Times New Roman"/>
-          <w:sz w:val="24"/>
-        </w:rPr>
-        <w:t xml:space="preserve"> in Shopee Mall. Jurnal Ilmiah Global Education, 6(3), 3842–3852. https://doi.org/10.55681/jige.v6i3.3842</w:t>
+        <w:t xml:space="preserve"> terhadap keputusan pembelian produk Scarlett Whitening. Cakrawangsa Bisnis: Jurnal Ilmiah Mahasiswa, 3(1), 45–58. https://doi.org/10.35917/cb.v3i1.298</w:t>
       </w:r>
     </w:p>
     <w:p>
@@ -19154,7 +19140,52 @@
           <w:rFonts w:ascii="Times New Roman" w:hAnsi="Times New Roman" w:cs="Times New Roman"/>
           <w:sz w:val="24"/>
         </w:rPr>
-        <w:t>Dahlia, D., &amp; Hartono, S. (2024). Pengaruh kepercayaan, kemudahan dan keamanan terhadap keputusan pembelian pada situs marketplace Shopee. Jurnal Entrepreneur dan Manajemen Sains (JEMS), 5(1), 105–116. https://doi.org/10.36085/jems.v5i1.5977</w:t>
+        <w:t xml:space="preserve">Nurlita, F., &amp; Arsyad, A. W. (2025). Pengaruh </w:t>
+      </w:r>
+      <w:r>
+        <w:rPr>
+          <w:rFonts w:ascii="Times New Roman" w:hAnsi="Times New Roman" w:cs="Times New Roman"/>
+          <w:i/>
+          <w:sz w:val="24"/>
+        </w:rPr>
+        <w:t>brand awareness</w:t>
+      </w:r>
+      <w:r>
+        <w:rPr>
+          <w:rFonts w:ascii="Times New Roman" w:hAnsi="Times New Roman" w:cs="Times New Roman"/>
+          <w:sz w:val="24"/>
+        </w:rPr>
+        <w:t xml:space="preserve">, </w:t>
+      </w:r>
+      <w:r>
+        <w:rPr>
+          <w:rFonts w:ascii="Times New Roman" w:hAnsi="Times New Roman" w:cs="Times New Roman"/>
+          <w:i/>
+          <w:sz w:val="24"/>
+        </w:rPr>
+        <w:t>brand image</w:t>
+      </w:r>
+      <w:r>
+        <w:rPr>
+          <w:rFonts w:ascii="Times New Roman" w:hAnsi="Times New Roman" w:cs="Times New Roman"/>
+          <w:sz w:val="24"/>
+        </w:rPr>
+        <w:t xml:space="preserve">, dan </w:t>
+      </w:r>
+      <w:r>
+        <w:rPr>
+          <w:rFonts w:ascii="Times New Roman" w:hAnsi="Times New Roman" w:cs="Times New Roman"/>
+          <w:i/>
+          <w:sz w:val="24"/>
+        </w:rPr>
+        <w:t>brand trust</w:t>
+      </w:r>
+      <w:r>
+        <w:rPr>
+          <w:rFonts w:ascii="Times New Roman" w:hAnsi="Times New Roman" w:cs="Times New Roman"/>
+          <w:sz w:val="24"/>
+        </w:rPr>
+        <w:t xml:space="preserve"> terhadap keputusan pembelian. Ekonomi, Keuangan, Investasi dan Syariah (EKUITAS), 6(3), 1–9. https://doi.org/10.47065/ekuitas.v6i3.6975</w:t>
       </w:r>
     </w:p>
     <w:p>
@@ -19173,7 +19204,7 @@
           <w:rFonts w:ascii="Times New Roman" w:hAnsi="Times New Roman" w:cs="Times New Roman"/>
           <w:sz w:val="24"/>
         </w:rPr>
-        <w:t xml:space="preserve">Devananda, R., &amp; Hartono, B. (2023). Pengaruh kepercayaan, </w:t>
+        <w:t xml:space="preserve">Patria, A., &amp; Susila, I. (2023). Pengaruh kualitas pelayanan, e-WOM dan </w:t>
       </w:r>
       <w:r>
         <w:rPr>
@@ -19188,7 +19219,22 @@
           <w:rFonts w:ascii="Times New Roman" w:hAnsi="Times New Roman" w:cs="Times New Roman"/>
           <w:sz w:val="24"/>
         </w:rPr>
-        <w:t>, keamanan terhadap keputusan pembelian (Studi pada pengguna Shopee Generasi Y &amp; Z). JIIP - Jurnal Ilmiah Ilmu Pendidikan, 6(10), 8021–8030. https://doi.org/10.54371/jiip.v6i10.2183</w:t>
+        <w:t xml:space="preserve"> terhadap keputusan pembelian konsumen dimediasi oleh </w:t>
+      </w:r>
+      <w:r>
+        <w:rPr>
+          <w:rFonts w:ascii="Times New Roman" w:hAnsi="Times New Roman" w:cs="Times New Roman"/>
+          <w:i/>
+          <w:sz w:val="24"/>
+        </w:rPr>
+        <w:t>brand trust</w:t>
+      </w:r>
+      <w:r>
+        <w:rPr>
+          <w:rFonts w:ascii="Times New Roman" w:hAnsi="Times New Roman" w:cs="Times New Roman"/>
+          <w:sz w:val="24"/>
+        </w:rPr>
+        <w:t>. Manajemen dan Bisnis, 5(2), 7683–7694. https://doi.org/10.30743/jmb.v5i2.7683</w:t>
       </w:r>
     </w:p>
     <w:p>
@@ -19207,52 +19253,37 @@
           <w:rFonts w:ascii="Times New Roman" w:hAnsi="Times New Roman" w:cs="Times New Roman"/>
           <w:sz w:val="24"/>
         </w:rPr>
-        <w:t xml:space="preserve">Fadila, N., &amp; Wahyuni, S. (2025). Pengaruh environmental awareness, </w:t>
-      </w:r>
-      <w:r>
-        <w:rPr>
-          <w:rFonts w:ascii="Times New Roman" w:hAnsi="Times New Roman" w:cs="Times New Roman"/>
-          <w:i/>
-          <w:sz w:val="24"/>
-        </w:rPr>
-        <w:t>brand trust</w:t>
-      </w:r>
-      <w:r>
-        <w:rPr>
-          <w:rFonts w:ascii="Times New Roman" w:hAnsi="Times New Roman" w:cs="Times New Roman"/>
-          <w:sz w:val="24"/>
-        </w:rPr>
-        <w:t xml:space="preserve">, dan </w:t>
-      </w:r>
-      <w:r>
-        <w:rPr>
-          <w:rFonts w:ascii="Times New Roman" w:hAnsi="Times New Roman" w:cs="Times New Roman"/>
-          <w:i/>
-          <w:sz w:val="24"/>
-        </w:rPr>
-        <w:t>brand image</w:t>
-      </w:r>
-      <w:r>
-        <w:rPr>
-          <w:rFonts w:ascii="Times New Roman" w:hAnsi="Times New Roman" w:cs="Times New Roman"/>
-          <w:sz w:val="24"/>
-        </w:rPr>
-        <w:t xml:space="preserve"> terhadap keputusan pembelian The Body Shop dengan brand loyalty sebagai media </w:t>
-      </w:r>
-      <w:r>
-        <w:rPr>
-          <w:rFonts w:ascii="Times New Roman" w:hAnsi="Times New Roman" w:cs="Times New Roman"/>
-          <w:i/>
-          <w:sz w:val="24"/>
-        </w:rPr>
-        <w:t>intervening</w:t>
-      </w:r>
-      <w:r>
-        <w:rPr>
-          <w:rFonts w:ascii="Times New Roman" w:hAnsi="Times New Roman" w:cs="Times New Roman"/>
-          <w:sz w:val="24"/>
-        </w:rPr>
-        <w:t>. Paradoks: Jurnal Ilmu Ekonomi, 8(2), 211–224. https://doi.org/10.57178/paradoks.v8i2.1251</w:t>
+        <w:t xml:space="preserve">Patricia, D., &amp; Djong, A. M. R. (2026). Keputusan penggunaan </w:t>
+      </w:r>
+      <w:r>
+        <w:rPr>
+          <w:rFonts w:ascii="Times New Roman" w:hAnsi="Times New Roman" w:cs="Times New Roman"/>
+          <w:i/>
+          <w:sz w:val="24"/>
+        </w:rPr>
+        <w:t>QRIS</w:t>
+      </w:r>
+      <w:r>
+        <w:rPr>
+          <w:rFonts w:ascii="Times New Roman" w:hAnsi="Times New Roman" w:cs="Times New Roman"/>
+          <w:sz w:val="24"/>
+        </w:rPr>
+        <w:t xml:space="preserve"> berdasarkan pengaruh persepsi kemudahan dan keamanan melalui persepsi kepercayaan pada </w:t>
+      </w:r>
+      <w:r>
+        <w:rPr>
+          <w:rFonts w:ascii="Times New Roman" w:hAnsi="Times New Roman" w:cs="Times New Roman"/>
+          <w:i/>
+          <w:sz w:val="24"/>
+        </w:rPr>
+        <w:t>Gen_Z</w:t>
+      </w:r>
+      <w:r>
+        <w:rPr>
+          <w:rFonts w:ascii="Times New Roman" w:hAnsi="Times New Roman" w:cs="Times New Roman"/>
+          <w:sz w:val="24"/>
+        </w:rPr>
+        <w:t xml:space="preserve"> di Tawangmangu. Jurnal Minfo Polgan, 15(1), 538–552. https://doi.org/10.33395/jmp.v15i1.16085</w:t>
       </w:r>
     </w:p>
     <w:p>
@@ -19271,22 +19302,37 @@
           <w:rFonts w:ascii="Times New Roman" w:hAnsi="Times New Roman" w:cs="Times New Roman"/>
           <w:sz w:val="24"/>
         </w:rPr>
-        <w:t xml:space="preserve">Chaudhuri, A., &amp; Holbrook, M. B. (2001). The chain of effects from </w:t>
-      </w:r>
-      <w:r>
-        <w:rPr>
-          <w:rFonts w:ascii="Times New Roman" w:hAnsi="Times New Roman" w:cs="Times New Roman"/>
-          <w:i/>
-          <w:sz w:val="24"/>
-        </w:rPr>
-        <w:t>brand trust</w:t>
-      </w:r>
-      <w:r>
-        <w:rPr>
-          <w:rFonts w:ascii="Times New Roman" w:hAnsi="Times New Roman" w:cs="Times New Roman"/>
-          <w:sz w:val="24"/>
-        </w:rPr>
-        <w:t xml:space="preserve"> and brand affect to brand performance: The role of brand loyalty. Journal of Marketing, 65(2), 81–93. https://doi.org/10.1509/jmkg.65.2.81.18255</w:t>
+        <w:t xml:space="preserve">Putri, W., &amp; Harti, H. (2022). Pengaruh </w:t>
+      </w:r>
+      <w:r>
+        <w:rPr>
+          <w:rFonts w:ascii="Times New Roman" w:hAnsi="Times New Roman" w:cs="Times New Roman"/>
+          <w:i/>
+          <w:sz w:val="24"/>
+        </w:rPr>
+        <w:t>brand image</w:t>
+      </w:r>
+      <w:r>
+        <w:rPr>
+          <w:rFonts w:ascii="Times New Roman" w:hAnsi="Times New Roman" w:cs="Times New Roman"/>
+          <w:sz w:val="24"/>
+        </w:rPr>
+        <w:t xml:space="preserve"> dan </w:t>
+      </w:r>
+      <w:r>
+        <w:rPr>
+          <w:rFonts w:ascii="Times New Roman" w:hAnsi="Times New Roman" w:cs="Times New Roman"/>
+          <w:i/>
+          <w:sz w:val="24"/>
+        </w:rPr>
+        <w:t>brand ambassador</w:t>
+      </w:r>
+      <w:r>
+        <w:rPr>
+          <w:rFonts w:ascii="Times New Roman" w:hAnsi="Times New Roman" w:cs="Times New Roman"/>
+          <w:sz w:val="24"/>
+        </w:rPr>
+        <w:t xml:space="preserve"> terhadap keputusan pembelian melalui kepercayaan konsumen pada produk Scarlett. Jurnal Dimensi, 11(2), 4143–4155. https://doi.org/10.33373/dms.v11i2.4143</w:t>
       </w:r>
     </w:p>
     <w:p>
@@ -19305,22 +19351,7 @@
           <w:rFonts w:ascii="Times New Roman" w:hAnsi="Times New Roman" w:cs="Times New Roman"/>
           <w:sz w:val="24"/>
         </w:rPr>
-        <w:t xml:space="preserve">Delgado-Ballester, E., Munuera-Alemán, J. L., &amp; Yagüe-Guillén, M. J. (2003). Development and validation of a </w:t>
-      </w:r>
-      <w:r>
-        <w:rPr>
-          <w:rFonts w:ascii="Times New Roman" w:hAnsi="Times New Roman" w:cs="Times New Roman"/>
-          <w:i/>
-          <w:sz w:val="24"/>
-        </w:rPr>
-        <w:t>brand trust</w:t>
-      </w:r>
-      <w:r>
-        <w:rPr>
-          <w:rFonts w:ascii="Times New Roman" w:hAnsi="Times New Roman" w:cs="Times New Roman"/>
-          <w:sz w:val="24"/>
-        </w:rPr>
-        <w:t xml:space="preserve"> scale. International Journal of Market Research, 45(1), 35–54. https://doi.org/10.1177/147078530304500103</w:t>
+        <w:t>Vivi, &amp; Hikmah, N. (2024). Pengaruh kualitas produk, persepsi keamanan dan kepercayaan terhadap keputusan pembelian pada merchant di TikTok. Scientia Journal : Jurnal Ilmiah Mahasiswa, 7(4), 10513–10525. https://doi.org/10.33884/scientiajournal.v7i4.10513</w:t>
       </w:r>
     </w:p>
     <w:p>
@@ -19339,82 +19370,7 @@
           <w:rFonts w:ascii="Times New Roman" w:hAnsi="Times New Roman" w:cs="Times New Roman"/>
           <w:sz w:val="24"/>
         </w:rPr>
-        <w:t xml:space="preserve">Hera, H., &amp; Fourqoniah, F. (2023). Pengaruh </w:t>
-      </w:r>
-      <w:r>
-        <w:rPr>
-          <w:rFonts w:ascii="Times New Roman" w:hAnsi="Times New Roman" w:cs="Times New Roman"/>
-          <w:i/>
-          <w:sz w:val="24"/>
-        </w:rPr>
-        <w:t>brand image</w:t>
-      </w:r>
-      <w:r>
-        <w:rPr>
-          <w:rFonts w:ascii="Times New Roman" w:hAnsi="Times New Roman" w:cs="Times New Roman"/>
-          <w:sz w:val="24"/>
-        </w:rPr>
-        <w:t xml:space="preserve"> dan </w:t>
-      </w:r>
-      <w:r>
-        <w:rPr>
-          <w:rFonts w:ascii="Times New Roman" w:hAnsi="Times New Roman" w:cs="Times New Roman"/>
-          <w:i/>
-          <w:sz w:val="24"/>
-        </w:rPr>
-        <w:t>brand ambassador</w:t>
-      </w:r>
-      <w:r>
-        <w:rPr>
-          <w:rFonts w:ascii="Times New Roman" w:hAnsi="Times New Roman" w:cs="Times New Roman"/>
-          <w:sz w:val="24"/>
-        </w:rPr>
-        <w:t xml:space="preserve"> terhadap </w:t>
-      </w:r>
-      <w:r>
-        <w:rPr>
-          <w:rFonts w:ascii="Times New Roman" w:hAnsi="Times New Roman" w:cs="Times New Roman"/>
-          <w:i/>
-          <w:sz w:val="24"/>
-        </w:rPr>
-        <w:t>purchase decision</w:t>
-      </w:r>
-      <w:r>
-        <w:rPr>
-          <w:rFonts w:ascii="Times New Roman" w:hAnsi="Times New Roman" w:cs="Times New Roman"/>
-          <w:sz w:val="24"/>
-        </w:rPr>
-        <w:t xml:space="preserve"> melalui </w:t>
-      </w:r>
-      <w:r>
-        <w:rPr>
-          <w:rFonts w:ascii="Times New Roman" w:hAnsi="Times New Roman" w:cs="Times New Roman"/>
-          <w:i/>
-          <w:sz w:val="24"/>
-        </w:rPr>
-        <w:t>brand trust</w:t>
-      </w:r>
-      <w:r>
-        <w:rPr>
-          <w:rFonts w:ascii="Times New Roman" w:hAnsi="Times New Roman" w:cs="Times New Roman"/>
-          <w:sz w:val="24"/>
-        </w:rPr>
-        <w:t xml:space="preserve"> sebagai </w:t>
-      </w:r>
-      <w:r>
-        <w:rPr>
-          <w:rFonts w:ascii="Times New Roman" w:hAnsi="Times New Roman" w:cs="Times New Roman"/>
-          <w:i/>
-          <w:sz w:val="24"/>
-        </w:rPr>
-        <w:t>intervening</w:t>
-      </w:r>
-      <w:r>
-        <w:rPr>
-          <w:rFonts w:ascii="Times New Roman" w:hAnsi="Times New Roman" w:cs="Times New Roman"/>
-          <w:sz w:val="24"/>
-        </w:rPr>
-        <w:t>. Ekonomi, Keuangan, Investasi dan Syariah (EKUITAS), 4(3), 877–884. https://doi.org/10.47065/ekuitas.v4i3.2810</w:t>
+        <w:t>Wijaya, V. T., &amp; Pahar, B. H. (2022). Pengaruh citra merek, kepercayaan merek, dan keamanan privasi terhadap keputusan pengguna Gojek. BIP’s Jurnal Bisnis Perspektif, 14(1), 241–254. https://doi.org/10.37477/bip.v14i1.241</w:t>
       </w:r>
     </w:p>
     <w:p>
@@ -19433,391 +19389,6 @@
           <w:rFonts w:ascii="Times New Roman" w:hAnsi="Times New Roman" w:cs="Times New Roman"/>
           <w:sz w:val="24"/>
         </w:rPr>
-        <w:t xml:space="preserve">Inggasari, V., &amp; Prabowo, H. (2022). Pengaruh celebrity endorser, </w:t>
-      </w:r>
-      <w:r>
-        <w:rPr>
-          <w:rFonts w:ascii="Times New Roman" w:hAnsi="Times New Roman" w:cs="Times New Roman"/>
-          <w:i/>
-          <w:sz w:val="24"/>
-        </w:rPr>
-        <w:t>brand image</w:t>
-      </w:r>
-      <w:r>
-        <w:rPr>
-          <w:rFonts w:ascii="Times New Roman" w:hAnsi="Times New Roman" w:cs="Times New Roman"/>
-          <w:sz w:val="24"/>
-        </w:rPr>
-        <w:t xml:space="preserve">, dan </w:t>
-      </w:r>
-      <w:r>
-        <w:rPr>
-          <w:rFonts w:ascii="Times New Roman" w:hAnsi="Times New Roman" w:cs="Times New Roman"/>
-          <w:i/>
-          <w:sz w:val="24"/>
-        </w:rPr>
-        <w:t>brand trust</w:t>
-      </w:r>
-      <w:r>
-        <w:rPr>
-          <w:rFonts w:ascii="Times New Roman" w:hAnsi="Times New Roman" w:cs="Times New Roman"/>
-          <w:sz w:val="24"/>
-        </w:rPr>
-        <w:t xml:space="preserve"> terhadap keputusan pembelian produk Scarlett Whitening. Cakrawangsa Bisnis: Jurnal Ilmiah Mahasiswa, 3(1), 45–58. https://doi.org/10.35917/cb.v3i1.298</w:t>
-      </w:r>
-    </w:p>
-    <w:p>
-      <w:pPr>
-        <w:keepNext/>
-        <w:spacing w:after="120" w:line="360" w:lineRule="auto"/>
-        <w:ind w:firstLine="709"/>
-        <w:jc w:val="both"/>
-        <w:rPr>
-          <w:rFonts w:ascii="Times New Roman" w:hAnsi="Times New Roman" w:cs="Times New Roman"/>
-          <w:sz w:val="24"/>
-        </w:rPr>
-      </w:pPr>
-      <w:r>
-        <w:rPr>
-          <w:rFonts w:ascii="Times New Roman" w:hAnsi="Times New Roman" w:cs="Times New Roman"/>
-          <w:sz w:val="24"/>
-        </w:rPr>
-        <w:t xml:space="preserve">Morgan, R. M., &amp; Hunt, S. D. (1994). The </w:t>
-      </w:r>
-      <w:r>
-        <w:rPr>
-          <w:rFonts w:ascii="Times New Roman" w:hAnsi="Times New Roman" w:cs="Times New Roman"/>
-          <w:i/>
-          <w:sz w:val="24"/>
-        </w:rPr>
-        <w:t>commitment-trust theory</w:t>
-      </w:r>
-      <w:r>
-        <w:rPr>
-          <w:rFonts w:ascii="Times New Roman" w:hAnsi="Times New Roman" w:cs="Times New Roman"/>
-          <w:sz w:val="24"/>
-        </w:rPr>
-        <w:t xml:space="preserve"> of relationship marketing. Journal of Marketing, 58(3), 20–38. https://doi.org/10.1177/002224299405800302</w:t>
-      </w:r>
-    </w:p>
-    <w:p>
-      <w:pPr>
-        <w:keepNext/>
-        <w:spacing w:after="120" w:line="360" w:lineRule="auto"/>
-        <w:ind w:firstLine="709"/>
-        <w:jc w:val="both"/>
-        <w:rPr>
-          <w:rFonts w:ascii="Times New Roman" w:hAnsi="Times New Roman" w:cs="Times New Roman"/>
-          <w:sz w:val="24"/>
-        </w:rPr>
-      </w:pPr>
-      <w:r>
-        <w:rPr>
-          <w:rFonts w:ascii="Times New Roman" w:hAnsi="Times New Roman" w:cs="Times New Roman"/>
-          <w:sz w:val="24"/>
-        </w:rPr>
-        <w:t xml:space="preserve">Nurlita, F., &amp; Arsyad, A. W. (2025). Pengaruh </w:t>
-      </w:r>
-      <w:r>
-        <w:rPr>
-          <w:rFonts w:ascii="Times New Roman" w:hAnsi="Times New Roman" w:cs="Times New Roman"/>
-          <w:i/>
-          <w:sz w:val="24"/>
-        </w:rPr>
-        <w:t>brand awareness</w:t>
-      </w:r>
-      <w:r>
-        <w:rPr>
-          <w:rFonts w:ascii="Times New Roman" w:hAnsi="Times New Roman" w:cs="Times New Roman"/>
-          <w:sz w:val="24"/>
-        </w:rPr>
-        <w:t xml:space="preserve">, </w:t>
-      </w:r>
-      <w:r>
-        <w:rPr>
-          <w:rFonts w:ascii="Times New Roman" w:hAnsi="Times New Roman" w:cs="Times New Roman"/>
-          <w:i/>
-          <w:sz w:val="24"/>
-        </w:rPr>
-        <w:t>brand image</w:t>
-      </w:r>
-      <w:r>
-        <w:rPr>
-          <w:rFonts w:ascii="Times New Roman" w:hAnsi="Times New Roman" w:cs="Times New Roman"/>
-          <w:sz w:val="24"/>
-        </w:rPr>
-        <w:t xml:space="preserve">, dan </w:t>
-      </w:r>
-      <w:r>
-        <w:rPr>
-          <w:rFonts w:ascii="Times New Roman" w:hAnsi="Times New Roman" w:cs="Times New Roman"/>
-          <w:i/>
-          <w:sz w:val="24"/>
-        </w:rPr>
-        <w:t>brand trust</w:t>
-      </w:r>
-      <w:r>
-        <w:rPr>
-          <w:rFonts w:ascii="Times New Roman" w:hAnsi="Times New Roman" w:cs="Times New Roman"/>
-          <w:sz w:val="24"/>
-        </w:rPr>
-        <w:t xml:space="preserve"> terhadap keputusan pembelian. Ekonomi, Keuangan, Investasi dan Syariah (EKUITAS), 6(3), 1–9. https://doi.org/10.47065/ekuitas.v6i3.6975</w:t>
-      </w:r>
-    </w:p>
-    <w:p>
-      <w:pPr>
-        <w:keepNext/>
-        <w:spacing w:after="120" w:line="360" w:lineRule="auto"/>
-        <w:ind w:firstLine="709"/>
-        <w:jc w:val="both"/>
-        <w:rPr>
-          <w:rFonts w:ascii="Times New Roman" w:hAnsi="Times New Roman" w:cs="Times New Roman"/>
-          <w:sz w:val="24"/>
-        </w:rPr>
-      </w:pPr>
-      <w:r>
-        <w:rPr>
-          <w:rFonts w:ascii="Times New Roman" w:hAnsi="Times New Roman" w:cs="Times New Roman"/>
-          <w:sz w:val="24"/>
-        </w:rPr>
-        <w:t>Parasuraman, A., Zeithaml, V. A., &amp; Berry, L. L. (1988). SERVQUAL: A multiple-item scale for measuring consumer perceptions of service quality. Journal of Retailing, 64(1), 12–40.</w:t>
-      </w:r>
-    </w:p>
-    <w:p>
-      <w:pPr>
-        <w:keepNext/>
-        <w:spacing w:after="120" w:line="360" w:lineRule="auto"/>
-        <w:ind w:firstLine="709"/>
-        <w:jc w:val="both"/>
-        <w:rPr>
-          <w:rFonts w:ascii="Times New Roman" w:hAnsi="Times New Roman" w:cs="Times New Roman"/>
-          <w:sz w:val="24"/>
-        </w:rPr>
-      </w:pPr>
-      <w:r>
-        <w:rPr>
-          <w:rFonts w:ascii="Times New Roman" w:hAnsi="Times New Roman" w:cs="Times New Roman"/>
-          <w:sz w:val="24"/>
-        </w:rPr>
-        <w:t xml:space="preserve">Patria, A., &amp; Susila, I. (2023). Pengaruh kualitas pelayanan, e-WOM dan </w:t>
-      </w:r>
-      <w:r>
-        <w:rPr>
-          <w:rFonts w:ascii="Times New Roman" w:hAnsi="Times New Roman" w:cs="Times New Roman"/>
-          <w:i/>
-          <w:sz w:val="24"/>
-        </w:rPr>
-        <w:t>brand image</w:t>
-      </w:r>
-      <w:r>
-        <w:rPr>
-          <w:rFonts w:ascii="Times New Roman" w:hAnsi="Times New Roman" w:cs="Times New Roman"/>
-          <w:sz w:val="24"/>
-        </w:rPr>
-        <w:t xml:space="preserve"> terhadap keputusan pembelian konsumen dimediasi oleh </w:t>
-      </w:r>
-      <w:r>
-        <w:rPr>
-          <w:rFonts w:ascii="Times New Roman" w:hAnsi="Times New Roman" w:cs="Times New Roman"/>
-          <w:i/>
-          <w:sz w:val="24"/>
-        </w:rPr>
-        <w:t>brand trust</w:t>
-      </w:r>
-      <w:r>
-        <w:rPr>
-          <w:rFonts w:ascii="Times New Roman" w:hAnsi="Times New Roman" w:cs="Times New Roman"/>
-          <w:sz w:val="24"/>
-        </w:rPr>
-        <w:t>. Manajemen dan Bisnis, 5(2), 7683–7694. https://doi.org/10.30743/jmb.v5i2.7683</w:t>
-      </w:r>
-    </w:p>
-    <w:p>
-      <w:pPr>
-        <w:keepNext/>
-        <w:spacing w:after="120" w:line="360" w:lineRule="auto"/>
-        <w:ind w:firstLine="709"/>
-        <w:jc w:val="both"/>
-        <w:rPr>
-          <w:rFonts w:ascii="Times New Roman" w:hAnsi="Times New Roman" w:cs="Times New Roman"/>
-          <w:sz w:val="24"/>
-        </w:rPr>
-      </w:pPr>
-      <w:r>
-        <w:rPr>
-          <w:rFonts w:ascii="Times New Roman" w:hAnsi="Times New Roman" w:cs="Times New Roman"/>
-          <w:sz w:val="24"/>
-        </w:rPr>
-        <w:t xml:space="preserve">Patricia, D., &amp; Djong, A. M. R. (2026). Keputusan penggunaan </w:t>
-      </w:r>
-      <w:r>
-        <w:rPr>
-          <w:rFonts w:ascii="Times New Roman" w:hAnsi="Times New Roman" w:cs="Times New Roman"/>
-          <w:i/>
-          <w:sz w:val="24"/>
-        </w:rPr>
-        <w:t>QRIS</w:t>
-      </w:r>
-      <w:r>
-        <w:rPr>
-          <w:rFonts w:ascii="Times New Roman" w:hAnsi="Times New Roman" w:cs="Times New Roman"/>
-          <w:sz w:val="24"/>
-        </w:rPr>
-        <w:t xml:space="preserve"> berdasarkan pengaruh persepsi kemudahan dan keamanan melalui persepsi kepercayaan pada </w:t>
-      </w:r>
-      <w:r>
-        <w:rPr>
-          <w:rFonts w:ascii="Times New Roman" w:hAnsi="Times New Roman" w:cs="Times New Roman"/>
-          <w:i/>
-          <w:sz w:val="24"/>
-        </w:rPr>
-        <w:t>Gen_Z</w:t>
-      </w:r>
-      <w:r>
-        <w:rPr>
-          <w:rFonts w:ascii="Times New Roman" w:hAnsi="Times New Roman" w:cs="Times New Roman"/>
-          <w:sz w:val="24"/>
-        </w:rPr>
-        <w:t xml:space="preserve"> di Tawangmangu. Jurnal Minfo Polgan, 15(1), 538–552. https://doi.org/10.33395/jmp.v15i1.16085</w:t>
-      </w:r>
-    </w:p>
-    <w:p>
-      <w:pPr>
-        <w:keepNext/>
-        <w:spacing w:after="120" w:line="360" w:lineRule="auto"/>
-        <w:ind w:firstLine="709"/>
-        <w:jc w:val="both"/>
-        <w:rPr>
-          <w:rFonts w:ascii="Times New Roman" w:hAnsi="Times New Roman" w:cs="Times New Roman"/>
-          <w:sz w:val="24"/>
-        </w:rPr>
-      </w:pPr>
-      <w:r>
-        <w:rPr>
-          <w:rFonts w:ascii="Times New Roman" w:hAnsi="Times New Roman" w:cs="Times New Roman"/>
-          <w:sz w:val="24"/>
-        </w:rPr>
-        <w:t xml:space="preserve">Putri, W., &amp; Harti, H. (2022). Pengaruh </w:t>
-      </w:r>
-      <w:r>
-        <w:rPr>
-          <w:rFonts w:ascii="Times New Roman" w:hAnsi="Times New Roman" w:cs="Times New Roman"/>
-          <w:i/>
-          <w:sz w:val="24"/>
-        </w:rPr>
-        <w:t>brand image</w:t>
-      </w:r>
-      <w:r>
-        <w:rPr>
-          <w:rFonts w:ascii="Times New Roman" w:hAnsi="Times New Roman" w:cs="Times New Roman"/>
-          <w:sz w:val="24"/>
-        </w:rPr>
-        <w:t xml:space="preserve"> dan </w:t>
-      </w:r>
-      <w:r>
-        <w:rPr>
-          <w:rFonts w:ascii="Times New Roman" w:hAnsi="Times New Roman" w:cs="Times New Roman"/>
-          <w:i/>
-          <w:sz w:val="24"/>
-        </w:rPr>
-        <w:t>brand ambassador</w:t>
-      </w:r>
-      <w:r>
-        <w:rPr>
-          <w:rFonts w:ascii="Times New Roman" w:hAnsi="Times New Roman" w:cs="Times New Roman"/>
-          <w:sz w:val="24"/>
-        </w:rPr>
-        <w:t xml:space="preserve"> terhadap keputusan pembelian melalui kepercayaan konsumen pada produk Scarlett. Jurnal Dimensi, 11(2), 4143–4155. https://doi.org/10.33373/dms.v11i2.4143</w:t>
-      </w:r>
-    </w:p>
-    <w:p>
-      <w:pPr>
-        <w:keepNext/>
-        <w:spacing w:after="120" w:line="360" w:lineRule="auto"/>
-        <w:ind w:firstLine="709"/>
-        <w:jc w:val="both"/>
-        <w:rPr>
-          <w:rFonts w:ascii="Times New Roman" w:hAnsi="Times New Roman" w:cs="Times New Roman"/>
-          <w:sz w:val="24"/>
-        </w:rPr>
-      </w:pPr>
-      <w:r>
-        <w:rPr>
-          <w:rFonts w:ascii="Times New Roman" w:hAnsi="Times New Roman" w:cs="Times New Roman"/>
-          <w:sz w:val="24"/>
-        </w:rPr>
-        <w:t xml:space="preserve">Rayle, L., Dai, D., Chan, N., Cervero, R., &amp; Shaheen, S. (2016). Just a better taxi? A survey-based comparison of taxis, transit, and </w:t>
-      </w:r>
-      <w:r>
-        <w:rPr>
-          <w:rFonts w:ascii="Times New Roman" w:hAnsi="Times New Roman" w:cs="Times New Roman"/>
-          <w:i/>
-          <w:sz w:val="24"/>
-        </w:rPr>
-        <w:t>ridesourcing</w:t>
-      </w:r>
-      <w:r>
-        <w:rPr>
-          <w:rFonts w:ascii="Times New Roman" w:hAnsi="Times New Roman" w:cs="Times New Roman"/>
-          <w:sz w:val="24"/>
-        </w:rPr>
-        <w:t xml:space="preserve"> services in San Francisco. Transport Policy, 45, 168–178. https://doi.org/10.1016/j.tranpol.2015.10.004</w:t>
-      </w:r>
-    </w:p>
-    <w:p>
-      <w:pPr>
-        <w:keepNext/>
-        <w:spacing w:after="120" w:line="360" w:lineRule="auto"/>
-        <w:ind w:firstLine="709"/>
-        <w:jc w:val="both"/>
-        <w:rPr>
-          <w:rFonts w:ascii="Times New Roman" w:hAnsi="Times New Roman" w:cs="Times New Roman"/>
-          <w:sz w:val="24"/>
-        </w:rPr>
-      </w:pPr>
-      <w:r>
-        <w:rPr>
-          <w:rFonts w:ascii="Times New Roman" w:hAnsi="Times New Roman" w:cs="Times New Roman"/>
-          <w:sz w:val="24"/>
-        </w:rPr>
-        <w:t>Vivi, &amp; Hikmah, N. (2024). Pengaruh kualitas produk, persepsi keamanan dan kepercayaan terhadap keputusan pembelian pada merchant di TikTok. Scientia Journal : Jurnal Ilmiah Mahasiswa, 7(4), 10513–10525. https://doi.org/10.33884/scientiajournal.v7i4.10513</w:t>
-      </w:r>
-    </w:p>
-    <w:p>
-      <w:pPr>
-        <w:keepNext/>
-        <w:spacing w:after="120" w:line="360" w:lineRule="auto"/>
-        <w:ind w:firstLine="709"/>
-        <w:jc w:val="both"/>
-        <w:rPr>
-          <w:rFonts w:ascii="Times New Roman" w:hAnsi="Times New Roman" w:cs="Times New Roman"/>
-          <w:sz w:val="24"/>
-        </w:rPr>
-      </w:pPr>
-      <w:r>
-        <w:rPr>
-          <w:rFonts w:ascii="Times New Roman" w:hAnsi="Times New Roman" w:cs="Times New Roman"/>
-          <w:sz w:val="24"/>
-        </w:rPr>
-        <w:t>Wijaya, V. T., &amp; Pahar, B. H. (2022). Pengaruh citra merek, kepercayaan merek, dan keamanan privasi terhadap keputusan pengguna Gojek. BIP’s Jurnal Bisnis Perspektif, 14(1), 241–254. https://doi.org/10.37477/bip.v14i1.241</w:t>
-      </w:r>
-    </w:p>
-    <w:p>
-      <w:pPr>
-        <w:keepNext/>
-        <w:spacing w:after="120" w:line="360" w:lineRule="auto"/>
-        <w:ind w:firstLine="709"/>
-        <w:jc w:val="both"/>
-        <w:rPr>
-          <w:rFonts w:ascii="Times New Roman" w:hAnsi="Times New Roman" w:cs="Times New Roman"/>
-          <w:sz w:val="24"/>
-        </w:rPr>
-      </w:pPr>
-      <w:r>
-        <w:rPr>
-          <w:rFonts w:ascii="Times New Roman" w:hAnsi="Times New Roman" w:cs="Times New Roman"/>
-          <w:sz w:val="24"/>
-        </w:rPr>
         <w:t xml:space="preserve">Wulandari, R. (2021). Pengaruh kepercayaan, keamanan, persepsi resiko dan kualitas pelayanan terhadap keputusan pembelian secara </w:t>
       </w:r>
       <w:r>
@@ -19834,40 +19405,6 @@
           <w:sz w:val="24"/>
         </w:rPr>
         <w:t xml:space="preserve"> melalui media sosial Instagram. Manajerial, 4(1), 310–322. https://doi.org/10.30587/manajerial.v4i1.310</w:t>
-      </w:r>
-    </w:p>
-    <w:p>
-      <w:pPr>
-        <w:keepNext/>
-        <w:spacing w:after="120" w:line="360" w:lineRule="auto"/>
-        <w:ind w:firstLine="709"/>
-        <w:jc w:val="both"/>
-        <w:rPr>
-          <w:rFonts w:ascii="Times New Roman" w:hAnsi="Times New Roman" w:cs="Times New Roman"/>
-          <w:sz w:val="24"/>
-        </w:rPr>
-      </w:pPr>
-      <w:r>
-        <w:rPr>
-          <w:rFonts w:ascii="Times New Roman" w:hAnsi="Times New Roman" w:cs="Times New Roman"/>
-          <w:sz w:val="24"/>
-        </w:rPr>
-        <w:t xml:space="preserve">Xu, Y., Yan, X., Liu, Y., &amp; Zhao, X. (2020). Identifying the factors that affect the willingness of car owners to use </w:t>
-      </w:r>
-      <w:r>
-        <w:rPr>
-          <w:rFonts w:ascii="Times New Roman" w:hAnsi="Times New Roman" w:cs="Times New Roman"/>
-          <w:i/>
-          <w:sz w:val="24"/>
-        </w:rPr>
-        <w:t>electric vehicle</w:t>
-      </w:r>
-      <w:r>
-        <w:rPr>
-          <w:rFonts w:ascii="Times New Roman" w:hAnsi="Times New Roman" w:cs="Times New Roman"/>
-          <w:sz w:val="24"/>
-        </w:rPr>
-        <w:t>s: An empirical study in China. Transportation Research Part D: Transport and Environment, 85, Article 102434. https://doi.org/10.1016/j.trd.2020.102434</w:t>
       </w:r>
     </w:p>
     <w:p>
@@ -26791,7 +26328,7 @@
     <w:link w:val="Heading1Char"/>
     <w:uiPriority w:val="9"/>
     <w:qFormat/>
-    <w:rsid w:val="00255826"/>
+    <w:rsid w:val="00916906"/>
     <w:pPr>
       <w:keepNext/>
       <w:keepLines/>
@@ -26814,7 +26351,7 @@
     <w:semiHidden/>
     <w:unhideWhenUsed/>
     <w:qFormat/>
-    <w:rsid w:val="00255826"/>
+    <w:rsid w:val="00916906"/>
     <w:pPr>
       <w:keepNext/>
       <w:keepLines/>
@@ -26837,7 +26374,7 @@
     <w:semiHidden/>
     <w:unhideWhenUsed/>
     <w:qFormat/>
-    <w:rsid w:val="00255826"/>
+    <w:rsid w:val="00916906"/>
     <w:pPr>
       <w:keepNext/>
       <w:keepLines/>
@@ -26860,7 +26397,7 @@
     <w:semiHidden/>
     <w:unhideWhenUsed/>
     <w:qFormat/>
-    <w:rsid w:val="00255826"/>
+    <w:rsid w:val="00916906"/>
     <w:pPr>
       <w:keepNext/>
       <w:keepLines/>
@@ -26883,7 +26420,7 @@
     <w:semiHidden/>
     <w:unhideWhenUsed/>
     <w:qFormat/>
-    <w:rsid w:val="00255826"/>
+    <w:rsid w:val="00916906"/>
     <w:pPr>
       <w:keepNext/>
       <w:keepLines/>
@@ -26904,7 +26441,7 @@
     <w:semiHidden/>
     <w:unhideWhenUsed/>
     <w:qFormat/>
-    <w:rsid w:val="00255826"/>
+    <w:rsid w:val="00916906"/>
     <w:pPr>
       <w:keepNext/>
       <w:keepLines/>
@@ -26927,7 +26464,7 @@
     <w:semiHidden/>
     <w:unhideWhenUsed/>
     <w:qFormat/>
-    <w:rsid w:val="00255826"/>
+    <w:rsid w:val="00916906"/>
     <w:pPr>
       <w:keepNext/>
       <w:keepLines/>
@@ -26948,7 +26485,7 @@
     <w:semiHidden/>
     <w:unhideWhenUsed/>
     <w:qFormat/>
-    <w:rsid w:val="00255826"/>
+    <w:rsid w:val="00916906"/>
     <w:pPr>
       <w:keepNext/>
       <w:keepLines/>
@@ -26971,7 +26508,7 @@
     <w:semiHidden/>
     <w:unhideWhenUsed/>
     <w:qFormat/>
-    <w:rsid w:val="00255826"/>
+    <w:rsid w:val="00916906"/>
     <w:pPr>
       <w:keepNext/>
       <w:keepLines/>
@@ -27015,7 +26552,7 @@
     <w:basedOn w:val="DefaultParagraphFont"/>
     <w:link w:val="Heading1"/>
     <w:uiPriority w:val="9"/>
-    <w:rsid w:val="00255826"/>
+    <w:rsid w:val="00916906"/>
     <w:rPr>
       <w:rFonts w:asciiTheme="majorHAnsi" w:eastAsiaTheme="majorEastAsia" w:hAnsiTheme="majorHAnsi" w:cstheme="majorBidi"/>
       <w:color w:val="2F5496" w:themeColor="accent1" w:themeShade="BF"/>
@@ -27029,7 +26566,7 @@
     <w:link w:val="Heading2"/>
     <w:uiPriority w:val="9"/>
     <w:semiHidden/>
-    <w:rsid w:val="00255826"/>
+    <w:rsid w:val="00916906"/>
     <w:rPr>
       <w:rFonts w:asciiTheme="majorHAnsi" w:eastAsiaTheme="majorEastAsia" w:hAnsiTheme="majorHAnsi" w:cstheme="majorBidi"/>
       <w:color w:val="2F5496" w:themeColor="accent1" w:themeShade="BF"/>
@@ -27043,7 +26580,7 @@
     <w:link w:val="Heading3"/>
     <w:uiPriority w:val="9"/>
     <w:semiHidden/>
-    <w:rsid w:val="00255826"/>
+    <w:rsid w:val="00916906"/>
     <w:rPr>
       <w:rFonts w:eastAsiaTheme="majorEastAsia" w:cstheme="majorBidi"/>
       <w:color w:val="2F5496" w:themeColor="accent1" w:themeShade="BF"/>
@@ -27057,7 +26594,7 @@
     <w:link w:val="Heading4"/>
     <w:uiPriority w:val="9"/>
     <w:semiHidden/>
-    <w:rsid w:val="00255826"/>
+    <w:rsid w:val="00916906"/>
     <w:rPr>
       <w:rFonts w:eastAsiaTheme="majorEastAsia" w:cstheme="majorBidi"/>
       <w:i/>
@@ -27071,7 +26608,7 @@
     <w:link w:val="Heading5"/>
     <w:uiPriority w:val="9"/>
     <w:semiHidden/>
-    <w:rsid w:val="00255826"/>
+    <w:rsid w:val="00916906"/>
     <w:rPr>
       <w:rFonts w:eastAsiaTheme="majorEastAsia" w:cstheme="majorBidi"/>
       <w:color w:val="2F5496" w:themeColor="accent1" w:themeShade="BF"/>
@@ -27083,7 +26620,7 @@
     <w:link w:val="Heading6"/>
     <w:uiPriority w:val="9"/>
     <w:semiHidden/>
-    <w:rsid w:val="00255826"/>
+    <w:rsid w:val="00916906"/>
     <w:rPr>
       <w:rFonts w:eastAsiaTheme="majorEastAsia" w:cstheme="majorBidi"/>
       <w:i/>
@@ -27097,7 +26634,7 @@
     <w:link w:val="Heading7"/>
     <w:uiPriority w:val="9"/>
     <w:semiHidden/>
-    <w:rsid w:val="00255826"/>
+    <w:rsid w:val="00916906"/>
     <w:rPr>
       <w:rFonts w:eastAsiaTheme="majorEastAsia" w:cstheme="majorBidi"/>
       <w:color w:val="595959" w:themeColor="text1" w:themeTint="A6"/>
@@ -27109,7 +26646,7 @@
     <w:link w:val="Heading8"/>
     <w:uiPriority w:val="9"/>
     <w:semiHidden/>
-    <w:rsid w:val="00255826"/>
+    <w:rsid w:val="00916906"/>
     <w:rPr>
       <w:rFonts w:eastAsiaTheme="majorEastAsia" w:cstheme="majorBidi"/>
       <w:i/>
@@ -27123,7 +26660,7 @@
     <w:link w:val="Heading9"/>
     <w:uiPriority w:val="9"/>
     <w:semiHidden/>
-    <w:rsid w:val="00255826"/>
+    <w:rsid w:val="00916906"/>
     <w:rPr>
       <w:rFonts w:eastAsiaTheme="majorEastAsia" w:cstheme="majorBidi"/>
       <w:color w:val="272727" w:themeColor="text1" w:themeTint="D8"/>
@@ -27136,7 +26673,7 @@
     <w:link w:val="TitleChar"/>
     <w:uiPriority w:val="10"/>
     <w:qFormat/>
-    <w:rsid w:val="00255826"/>
+    <w:rsid w:val="00916906"/>
     <w:pPr>
       <w:spacing w:after="80" w:line="240" w:lineRule="auto"/>
       <w:contextualSpacing/>
@@ -27154,7 +26691,7 @@
     <w:basedOn w:val="DefaultParagraphFont"/>
     <w:link w:val="Title"/>
     <w:uiPriority w:val="10"/>
-    <w:rsid w:val="00255826"/>
+    <w:rsid w:val="00916906"/>
     <w:rPr>
       <w:rFonts w:asciiTheme="majorHAnsi" w:eastAsiaTheme="majorEastAsia" w:hAnsiTheme="majorHAnsi" w:cstheme="majorBidi"/>
       <w:spacing w:val="-10"/>
@@ -27170,7 +26707,7 @@
     <w:link w:val="SubtitleChar"/>
     <w:uiPriority w:val="11"/>
     <w:qFormat/>
-    <w:rsid w:val="00255826"/>
+    <w:rsid w:val="00916906"/>
     <w:pPr>
       <w:numPr>
         <w:ilvl w:val="1"/>
@@ -27189,7 +26726,7 @@
     <w:basedOn w:val="DefaultParagraphFont"/>
     <w:link w:val="Subtitle"/>
     <w:uiPriority w:val="11"/>
-    <w:rsid w:val="00255826"/>
+    <w:rsid w:val="00916906"/>
     <w:rPr>
       <w:rFonts w:eastAsiaTheme="majorEastAsia" w:cstheme="majorBidi"/>
       <w:color w:val="595959" w:themeColor="text1" w:themeTint="A6"/>
@@ -27205,7 +26742,7 @@
     <w:link w:val="QuoteChar"/>
     <w:uiPriority w:val="29"/>
     <w:qFormat/>
-    <w:rsid w:val="00255826"/>
+    <w:rsid w:val="00916906"/>
     <w:pPr>
       <w:spacing w:before="160"/>
       <w:jc w:val="center"/>
@@ -27221,7 +26758,7 @@
     <w:basedOn w:val="DefaultParagraphFont"/>
     <w:link w:val="Quote"/>
     <w:uiPriority w:val="29"/>
-    <w:rsid w:val="00255826"/>
+    <w:rsid w:val="00916906"/>
     <w:rPr>
       <w:i/>
       <w:iCs/>
@@ -27233,7 +26770,7 @@
     <w:basedOn w:val="Normal"/>
     <w:uiPriority w:val="34"/>
     <w:qFormat/>
-    <w:rsid w:val="00255826"/>
+    <w:rsid w:val="00916906"/>
     <w:pPr>
       <w:ind w:left="720"/>
       <w:contextualSpacing/>
@@ -27244,7 +26781,7 @@
     <w:basedOn w:val="DefaultParagraphFont"/>
     <w:uiPriority w:val="21"/>
     <w:qFormat/>
-    <w:rsid w:val="00255826"/>
+    <w:rsid w:val="00916906"/>
     <w:rPr>
       <w:i/>
       <w:iCs/>
@@ -27258,7 +26795,7 @@
     <w:link w:val="IntenseQuoteChar"/>
     <w:uiPriority w:val="30"/>
     <w:qFormat/>
-    <w:rsid w:val="00255826"/>
+    <w:rsid w:val="00916906"/>
     <w:pPr>
       <w:pBdr>
         <w:top w:val="single" w:sz="4" w:space="10" w:color="2F5496" w:themeColor="accent1" w:themeShade="BF"/>
@@ -27279,7 +26816,7 @@
     <w:basedOn w:val="DefaultParagraphFont"/>
     <w:link w:val="IntenseQuote"/>
     <w:uiPriority w:val="30"/>
-    <w:rsid w:val="00255826"/>
+    <w:rsid w:val="00916906"/>
     <w:rPr>
       <w:i/>
       <w:iCs/>
@@ -27291,7 +26828,7 @@
     <w:basedOn w:val="DefaultParagraphFont"/>
     <w:uiPriority w:val="32"/>
     <w:qFormat/>
-    <w:rsid w:val="00255826"/>
+    <w:rsid w:val="00916906"/>
     <w:rPr>
       <w:b/>
       <w:bCs/>

</xml_diff>

<commit_message>
Hapus sub-bab Theory of Planned Behavior (TPB) dan sesuaikan struktur Bab II sesuai arahan dosen pembimbing
</commit_message>
<xml_diff>
--- a/TOPIK_2_TAKSI_GREEN_SM/01_Naskah_Utama/Proposal_Skripsi_Taksi_Green_SM.docx
+++ b/TOPIK_2_TAKSI_GREEN_SM/01_Naskah_Utama/Proposal_Skripsi_Taksi_Green_SM.docx
@@ -12,16 +12,16 @@
           <w:noProof/>
         </w:rPr>
         <w:drawing>
-          <wp:inline distT="0" distB="0" distL="0" distR="0" wp14:anchorId="7F477141" wp14:editId="4CDC0EBD">
+          <wp:inline distT="0" distB="0" distL="0" distR="0" wp14:anchorId="4E98626F" wp14:editId="256E104C">
             <wp:extent cx="1152002" cy="1152002"/>
             <wp:effectExtent l="0" t="0" r="0" b="0"/>
-            <wp:docPr id="1681142454" name="Picture 1"/>
+            <wp:docPr id="2009127102" name="Picture 1"/>
             <wp:cNvGraphicFramePr/>
             <a:graphic xmlns:a="http://schemas.openxmlformats.org/drawingml/2006/main">
               <a:graphicData uri="http://schemas.openxmlformats.org/drawingml/2006/picture">
                 <pic:pic xmlns:pic="http://schemas.openxmlformats.org/drawingml/2006/picture">
                   <pic:nvPicPr>
-                    <pic:cNvPr id="1681142454" name=""/>
+                    <pic:cNvPr id="2009127102" name=""/>
                     <pic:cNvPicPr/>
                   </pic:nvPicPr>
                   <pic:blipFill>
@@ -1355,7 +1355,7 @@
         <w:rPr>
           <w:rFonts w:ascii="Times New Roman" w:hAnsi="Times New Roman" w:cs="Times New Roman"/>
         </w:rPr>
-        <w:t xml:space="preserve">    2.1.2 Teori Penjelas Pendukung (TPB &amp; </w:t>
+        <w:t xml:space="preserve">    2.1.2 Teori Persepsi Risiko (</w:t>
       </w:r>
       <w:r>
         <w:rPr>
@@ -1368,7 +1368,7 @@
         <w:rPr>
           <w:rFonts w:ascii="Times New Roman" w:hAnsi="Times New Roman" w:cs="Times New Roman"/>
         </w:rPr>
-        <w:t>) ................................................... 12</w:t>
+        <w:t>) ..................................................... 12</w:t>
       </w:r>
     </w:p>
     <w:p>
@@ -5115,28 +5115,24 @@
           <w:b/>
           <w:sz w:val="24"/>
         </w:rPr>
-        <w:t>2.1.2 Teori Penjelas Pendukung (Supporting Theories)</w:t>
-      </w:r>
-    </w:p>
-    <w:p>
-      <w:pPr>
-        <w:keepNext/>
-        <w:spacing w:after="80" w:line="360" w:lineRule="auto"/>
+        <w:t>2.1.2 Teori Persepsi Risiko (</w:t>
+      </w:r>
+      <w:r>
         <w:rPr>
           <w:rFonts w:ascii="Times New Roman" w:hAnsi="Times New Roman" w:cs="Times New Roman"/>
           <w:b/>
           <w:i/>
           <w:sz w:val="24"/>
         </w:rPr>
-      </w:pPr>
+        <w:t>Perceived Risk Theory</w:t>
+      </w:r>
       <w:r>
         <w:rPr>
           <w:rFonts w:ascii="Times New Roman" w:hAnsi="Times New Roman" w:cs="Times New Roman"/>
           <w:b/>
-          <w:i/>
-          <w:sz w:val="24"/>
-        </w:rPr>
-        <w:t>A. Theory of Planned Behavior (La Barbera &amp; Ajzen, 2021)</w:t>
+          <w:sz w:val="24"/>
+        </w:rPr>
+        <w:t>)</w:t>
       </w:r>
     </w:p>
     <w:p>
@@ -5153,179 +5149,24 @@
       <w:r>
         <w:rPr>
           <w:rFonts w:ascii="Times New Roman" w:hAnsi="Times New Roman" w:cs="Times New Roman"/>
-          <w:i/>
-          <w:sz w:val="24"/>
-        </w:rPr>
-        <w:t>Theory of Planned Behavior</w:t>
-      </w:r>
-      <w:r>
-        <w:rPr>
-          <w:rFonts w:ascii="Times New Roman" w:hAnsi="Times New Roman" w:cs="Times New Roman"/>
-          <w:sz w:val="24"/>
-        </w:rPr>
-        <w:t xml:space="preserve"> (TPB) yang dirumuskan oleh Icek Ajzen dan diperbarui dalam literatur terkini (La Barbera &amp; Ajzen, 2021) menyatakan bahwa perilaku spesifik individu ditentukan secara langsung oleh niat perilakunya (</w:t>
-      </w:r>
-      <w:r>
-        <w:rPr>
-          <w:rFonts w:ascii="Times New Roman" w:hAnsi="Times New Roman" w:cs="Times New Roman"/>
-          <w:i/>
-          <w:sz w:val="24"/>
-        </w:rPr>
-        <w:t>behavioral intention</w:t>
-      </w:r>
-      <w:r>
-        <w:rPr>
-          <w:rFonts w:ascii="Times New Roman" w:hAnsi="Times New Roman" w:cs="Times New Roman"/>
-          <w:sz w:val="24"/>
-        </w:rPr>
-        <w:t>). Niat tersebut merupakan fungsi dari tiga variabel anteseden independen:</w:t>
-      </w:r>
-    </w:p>
-    <w:p>
-      <w:pPr>
-        <w:keepNext/>
-        <w:spacing w:after="80" w:line="360" w:lineRule="auto"/>
-        <w:ind w:firstLine="425"/>
-        <w:jc w:val="both"/>
-        <w:rPr>
-          <w:rFonts w:ascii="Times New Roman" w:hAnsi="Times New Roman" w:cs="Times New Roman"/>
-          <w:sz w:val="24"/>
-        </w:rPr>
-      </w:pPr>
-      <w:r>
-        <w:rPr>
-          <w:rFonts w:ascii="Times New Roman" w:hAnsi="Times New Roman" w:cs="Times New Roman"/>
-          <w:sz w:val="24"/>
-        </w:rPr>
-        <w:t xml:space="preserve">1. </w:t>
-      </w:r>
-      <w:r>
-        <w:rPr>
-          <w:rFonts w:ascii="Times New Roman" w:hAnsi="Times New Roman" w:cs="Times New Roman"/>
-          <w:i/>
-          <w:sz w:val="24"/>
-        </w:rPr>
-        <w:t>Attitude toward the behavior</w:t>
-      </w:r>
-      <w:r>
-        <w:rPr>
-          <w:rFonts w:ascii="Times New Roman" w:hAnsi="Times New Roman" w:cs="Times New Roman"/>
-          <w:sz w:val="24"/>
-        </w:rPr>
-        <w:t xml:space="preserve"> (Sikap terhadap perilaku): Sejauh mana individu mengevaluasi positif atau negatif tindakan menggunakan taksi listrik </w:t>
-      </w:r>
-      <w:r>
-        <w:rPr>
-          <w:rFonts w:ascii="Times New Roman" w:hAnsi="Times New Roman" w:cs="Times New Roman"/>
-          <w:i/>
-          <w:sz w:val="24"/>
-        </w:rPr>
-        <w:t>Green SM</w:t>
-      </w:r>
-      <w:r>
-        <w:rPr>
-          <w:rFonts w:ascii="Times New Roman" w:hAnsi="Times New Roman" w:cs="Times New Roman"/>
-          <w:sz w:val="24"/>
-        </w:rPr>
-        <w:t>.</w:t>
-      </w:r>
-    </w:p>
-    <w:p>
-      <w:pPr>
-        <w:keepNext/>
-        <w:spacing w:after="80" w:line="360" w:lineRule="auto"/>
-        <w:ind w:firstLine="425"/>
-        <w:jc w:val="both"/>
-        <w:rPr>
-          <w:rFonts w:ascii="Times New Roman" w:hAnsi="Times New Roman" w:cs="Times New Roman"/>
-          <w:sz w:val="24"/>
-        </w:rPr>
-      </w:pPr>
-      <w:r>
-        <w:rPr>
-          <w:rFonts w:ascii="Times New Roman" w:hAnsi="Times New Roman" w:cs="Times New Roman"/>
-          <w:sz w:val="24"/>
-        </w:rPr>
-        <w:t xml:space="preserve">2. </w:t>
-      </w:r>
-      <w:r>
-        <w:rPr>
-          <w:rFonts w:ascii="Times New Roman" w:hAnsi="Times New Roman" w:cs="Times New Roman"/>
-          <w:i/>
-          <w:sz w:val="24"/>
-        </w:rPr>
-        <w:t>Subjective norm</w:t>
-      </w:r>
-      <w:r>
-        <w:rPr>
-          <w:rFonts w:ascii="Times New Roman" w:hAnsi="Times New Roman" w:cs="Times New Roman"/>
-          <w:sz w:val="24"/>
-        </w:rPr>
-        <w:t xml:space="preserve"> (Norma subjektif): Persepsi individu terhadap tekanan sosial atau anjuran dari orang-orang penting di sekitarnya untuk menggunakan armada ramah lingkungan (</w:t>
-      </w:r>
-      <w:r>
-        <w:rPr>
-          <w:rFonts w:ascii="Times New Roman" w:hAnsi="Times New Roman" w:cs="Times New Roman"/>
-          <w:i/>
-          <w:sz w:val="24"/>
-        </w:rPr>
-        <w:t>eco-friendly</w:t>
-      </w:r>
-      <w:r>
-        <w:rPr>
-          <w:rFonts w:ascii="Times New Roman" w:hAnsi="Times New Roman" w:cs="Times New Roman"/>
-          <w:sz w:val="24"/>
-        </w:rPr>
-        <w:t>).</w:t>
-      </w:r>
-    </w:p>
-    <w:p>
-      <w:pPr>
-        <w:keepNext/>
-        <w:spacing w:after="80" w:line="360" w:lineRule="auto"/>
-        <w:ind w:firstLine="425"/>
-        <w:jc w:val="both"/>
-        <w:rPr>
-          <w:rFonts w:ascii="Times New Roman" w:hAnsi="Times New Roman" w:cs="Times New Roman"/>
-          <w:sz w:val="24"/>
-        </w:rPr>
-      </w:pPr>
-      <w:r>
-        <w:rPr>
-          <w:rFonts w:ascii="Times New Roman" w:hAnsi="Times New Roman" w:cs="Times New Roman"/>
-          <w:sz w:val="24"/>
-        </w:rPr>
-        <w:t xml:space="preserve">3. </w:t>
-      </w:r>
-      <w:r>
-        <w:rPr>
-          <w:rFonts w:ascii="Times New Roman" w:hAnsi="Times New Roman" w:cs="Times New Roman"/>
-          <w:i/>
-          <w:sz w:val="24"/>
-        </w:rPr>
-        <w:t>Perceived behavioral control</w:t>
-      </w:r>
-      <w:r>
-        <w:rPr>
-          <w:rFonts w:ascii="Times New Roman" w:hAnsi="Times New Roman" w:cs="Times New Roman"/>
-          <w:sz w:val="24"/>
-        </w:rPr>
-        <w:t xml:space="preserve"> (Persepsi kendali perilaku): Persepsi individu mengenai kemudahan atau kesulitan dalam mengakses dan menggunakan jasa taksi </w:t>
-      </w:r>
-      <w:r>
-        <w:rPr>
-          <w:rFonts w:ascii="Times New Roman" w:hAnsi="Times New Roman" w:cs="Times New Roman"/>
-          <w:i/>
-          <w:sz w:val="24"/>
-        </w:rPr>
-        <w:t>Green SM</w:t>
-      </w:r>
-      <w:r>
-        <w:rPr>
-          <w:rFonts w:ascii="Times New Roman" w:hAnsi="Times New Roman" w:cs="Times New Roman"/>
-          <w:sz w:val="24"/>
-        </w:rPr>
-        <w:t xml:space="preserve"> (seperti kemudahan ketersediaan aplikasi, jangkauan armada di Jakarta Barat, dan kecukupan saldo/pembayaran).</w:t>
+          <w:sz w:val="24"/>
+        </w:rPr>
+        <w:t xml:space="preserve">Konsep persepsi risiko dalam teori perilaku konsumen modern (Kotler </w:t>
+      </w:r>
+      <w:r>
+        <w:rPr>
+          <w:rFonts w:ascii="Times New Roman" w:hAnsi="Times New Roman" w:cs="Times New Roman"/>
+          <w:i/>
+          <w:sz w:val="24"/>
+        </w:rPr>
+        <w:t>et al.</w:t>
+      </w:r>
+      <w:r>
+        <w:rPr>
+          <w:rFonts w:ascii="Times New Roman" w:hAnsi="Times New Roman" w:cs="Times New Roman"/>
+          <w:sz w:val="24"/>
+        </w:rPr>
+        <w:t>, 2022; Asnawir &amp; Simanjuntak, 2024; Ardialis &amp; Irfani, 2023) menyatakan bahwa keputusan konsumen melibatkan evaluasi terhadap risiko dalam arti bahwa tindakan apa pun dari konsumen akan menimbulkan konsekuensi yang tidak dapat diantisipasi dengan pasti (uncertainty) dan potensi kerugian (danger/loss).</w:t>
       </w:r>
     </w:p>
     <w:p>
@@ -5344,37 +5185,37 @@
           <w:rFonts w:ascii="Times New Roman" w:hAnsi="Times New Roman" w:cs="Times New Roman"/>
           <w:sz w:val="24"/>
         </w:rPr>
-        <w:t>Dalam penelitian ini, TPB menjadi jembatan logis yang menjelaskan bagaimana stimulus eksternal berupa citra merek (</w:t>
-      </w:r>
-      <w:r>
-        <w:rPr>
-          <w:rFonts w:ascii="Times New Roman" w:hAnsi="Times New Roman" w:cs="Times New Roman"/>
-          <w:i/>
-          <w:sz w:val="24"/>
-        </w:rPr>
-        <w:t>Brand Image</w:t>
-      </w:r>
-      <w:r>
-        <w:rPr>
-          <w:rFonts w:ascii="Times New Roman" w:hAnsi="Times New Roman" w:cs="Times New Roman"/>
-          <w:sz w:val="24"/>
-        </w:rPr>
-        <w:t>) dan keyakinan internal (</w:t>
-      </w:r>
-      <w:r>
-        <w:rPr>
-          <w:rFonts w:ascii="Times New Roman" w:hAnsi="Times New Roman" w:cs="Times New Roman"/>
-          <w:i/>
-          <w:sz w:val="24"/>
-        </w:rPr>
-        <w:t>Brand Trust</w:t>
-      </w:r>
-      <w:r>
-        <w:rPr>
-          <w:rFonts w:ascii="Times New Roman" w:hAnsi="Times New Roman" w:cs="Times New Roman"/>
-          <w:sz w:val="24"/>
-        </w:rPr>
-        <w:t xml:space="preserve"> dan </w:t>
+        <w:t>Dalam industri transportasi kendaraan listrik (</w:t>
+      </w:r>
+      <w:r>
+        <w:rPr>
+          <w:rFonts w:ascii="Times New Roman" w:hAnsi="Times New Roman" w:cs="Times New Roman"/>
+          <w:i/>
+          <w:sz w:val="24"/>
+        </w:rPr>
+        <w:t>electric vehicle</w:t>
+      </w:r>
+      <w:r>
+        <w:rPr>
+          <w:rFonts w:ascii="Times New Roman" w:hAnsi="Times New Roman" w:cs="Times New Roman"/>
+          <w:sz w:val="24"/>
+        </w:rPr>
+        <w:t xml:space="preserve">), persepsi risiko berkaitan erat dengan risiko fungsional/teknis (seperti daya tahan baterai, keandalan sistem kelistrikan, dan ketahanan di berbagai kondisi jalan) serta risiko fisik/keselamatan penumpang. Ketika konsumen mempertimbangkan untuk menggunakan moda transportasi baru seperti taksi listrik </w:t>
+      </w:r>
+      <w:r>
+        <w:rPr>
+          <w:rFonts w:ascii="Times New Roman" w:hAnsi="Times New Roman" w:cs="Times New Roman"/>
+          <w:i/>
+          <w:sz w:val="24"/>
+        </w:rPr>
+        <w:t>Green SM</w:t>
+      </w:r>
+      <w:r>
+        <w:rPr>
+          <w:rFonts w:ascii="Times New Roman" w:hAnsi="Times New Roman" w:cs="Times New Roman"/>
+          <w:sz w:val="24"/>
+        </w:rPr>
+        <w:t xml:space="preserve">, evaluasi risiko menjadi pertimbangan mendasar sebelum mengambil keputusan. Mitigasi terhadap persepsi risiko ini melahirkan konsep </w:t>
       </w:r>
       <w:r>
         <w:rPr>
@@ -5389,7 +5230,7 @@
           <w:rFonts w:ascii="Times New Roman" w:hAnsi="Times New Roman" w:cs="Times New Roman"/>
           <w:sz w:val="24"/>
         </w:rPr>
-        <w:t>) membentuk sikap positif yang mendorong tindakan nyata keputusan penggunaan (</w:t>
+        <w:t xml:space="preserve"> (Persepsi Keamanan dan Keselamatan) yang menjadi variabel penentu pertimbangan konsumen dalam memutuskan penggunaan jasa (</w:t>
       </w:r>
       <w:r>
         <w:rPr>
@@ -5405,110 +5246,6 @@
           <w:sz w:val="24"/>
         </w:rPr>
         <w:t>).</w:t>
-      </w:r>
-    </w:p>
-    <w:p>
-      <w:pPr>
-        <w:keepNext/>
-        <w:spacing w:after="80" w:line="360" w:lineRule="auto"/>
-        <w:rPr>
-          <w:rFonts w:ascii="Times New Roman" w:hAnsi="Times New Roman" w:cs="Times New Roman"/>
-          <w:b/>
-          <w:i/>
-          <w:sz w:val="24"/>
-        </w:rPr>
-      </w:pPr>
-      <w:r>
-        <w:rPr>
-          <w:rFonts w:ascii="Times New Roman" w:hAnsi="Times New Roman" w:cs="Times New Roman"/>
-          <w:b/>
-          <w:i/>
-          <w:sz w:val="24"/>
-        </w:rPr>
-        <w:t>B. Teori Persepsi Risiko (Perceived Risk Theory)</w:t>
-      </w:r>
-    </w:p>
-    <w:p>
-      <w:pPr>
-        <w:keepNext/>
-        <w:spacing w:after="120" w:line="360" w:lineRule="auto"/>
-        <w:ind w:firstLine="709"/>
-        <w:jc w:val="both"/>
-        <w:rPr>
-          <w:rFonts w:ascii="Times New Roman" w:hAnsi="Times New Roman" w:cs="Times New Roman"/>
-          <w:sz w:val="24"/>
-        </w:rPr>
-      </w:pPr>
-      <w:r>
-        <w:rPr>
-          <w:rFonts w:ascii="Times New Roman" w:hAnsi="Times New Roman" w:cs="Times New Roman"/>
-          <w:sz w:val="24"/>
-        </w:rPr>
-        <w:t xml:space="preserve">Konsep persepsi risiko dalam teori perilaku konsumen modern (Kotler </w:t>
-      </w:r>
-      <w:r>
-        <w:rPr>
-          <w:rFonts w:ascii="Times New Roman" w:hAnsi="Times New Roman" w:cs="Times New Roman"/>
-          <w:i/>
-          <w:sz w:val="24"/>
-        </w:rPr>
-        <w:t>et al.</w:t>
-      </w:r>
-      <w:r>
-        <w:rPr>
-          <w:rFonts w:ascii="Times New Roman" w:hAnsi="Times New Roman" w:cs="Times New Roman"/>
-          <w:sz w:val="24"/>
-        </w:rPr>
-        <w:t>, 2022; Asnawir &amp; Simanjuntak, 2024; Ardialis &amp; Irfani, 2023) menyatakan bahwa keputusan konsumen melibatkan evaluasi terhadap risiko dalam arti bahwa tindakan apa pun dari konsumen akan menimbulkan konsekuensi yang tidak dapat diantisipasi dengan pasti (uncertainty) dan potensi kerugian (danger/loss).</w:t>
-      </w:r>
-    </w:p>
-    <w:p>
-      <w:pPr>
-        <w:keepNext/>
-        <w:spacing w:after="120" w:line="360" w:lineRule="auto"/>
-        <w:ind w:firstLine="709"/>
-        <w:jc w:val="both"/>
-        <w:rPr>
-          <w:rFonts w:ascii="Times New Roman" w:hAnsi="Times New Roman" w:cs="Times New Roman"/>
-          <w:sz w:val="24"/>
-        </w:rPr>
-      </w:pPr>
-      <w:r>
-        <w:rPr>
-          <w:rFonts w:ascii="Times New Roman" w:hAnsi="Times New Roman" w:cs="Times New Roman"/>
-          <w:sz w:val="24"/>
-        </w:rPr>
-        <w:t>Dalam industri transportasi kendaraan listrik (</w:t>
-      </w:r>
-      <w:r>
-        <w:rPr>
-          <w:rFonts w:ascii="Times New Roman" w:hAnsi="Times New Roman" w:cs="Times New Roman"/>
-          <w:i/>
-          <w:sz w:val="24"/>
-        </w:rPr>
-        <w:t>electric vehicle</w:t>
-      </w:r>
-      <w:r>
-        <w:rPr>
-          <w:rFonts w:ascii="Times New Roman" w:hAnsi="Times New Roman" w:cs="Times New Roman"/>
-          <w:sz w:val="24"/>
-        </w:rPr>
-        <w:t xml:space="preserve">), persepsi risiko berkaitan erat dengan risiko fungsional/teknis (seperti daya tahan baterai, risiko malfungsi mesin listrik, dan ketahanan di cuaca hujan) serta risiko fisik/keselamatan penumpang. Mitigasi terhadap persepsi risiko ini melahirkan konsep </w:t>
-      </w:r>
-      <w:r>
-        <w:rPr>
-          <w:rFonts w:ascii="Times New Roman" w:hAnsi="Times New Roman" w:cs="Times New Roman"/>
-          <w:i/>
-          <w:sz w:val="24"/>
-        </w:rPr>
-        <w:t>Perceived Safety</w:t>
-      </w:r>
-      <w:r>
-        <w:rPr>
-          <w:rFonts w:ascii="Times New Roman" w:hAnsi="Times New Roman" w:cs="Times New Roman"/>
-          <w:sz w:val="24"/>
-        </w:rPr>
-        <w:t xml:space="preserve"> (Persepsi Keamanan/Keselamatan) yang menjadi variabel penentu keputusan konsumen.</w:t>
       </w:r>
     </w:p>
     <w:p>
@@ -18205,55 +17942,6 @@
           <w:sz w:val="24"/>
         </w:rPr>
         <w:t>Kotler, P., Keller, K. L., &amp; Chernev, A. (2022). Marketing management (16th ed.). Pearson Education.</w:t>
-      </w:r>
-    </w:p>
-    <w:p>
-      <w:pPr>
-        <w:keepNext/>
-        <w:spacing w:after="120" w:line="360" w:lineRule="auto"/>
-        <w:ind w:firstLine="709"/>
-        <w:jc w:val="both"/>
-        <w:rPr>
-          <w:rFonts w:ascii="Times New Roman" w:hAnsi="Times New Roman" w:cs="Times New Roman"/>
-          <w:sz w:val="24"/>
-        </w:rPr>
-      </w:pPr>
-      <w:r>
-        <w:rPr>
-          <w:rFonts w:ascii="Times New Roman" w:hAnsi="Times New Roman" w:cs="Times New Roman"/>
-          <w:sz w:val="24"/>
-        </w:rPr>
-        <w:t xml:space="preserve">La Barbera, F., &amp; Ajzen, I. (2021). Moderating role of </w:t>
-      </w:r>
-      <w:r>
-        <w:rPr>
-          <w:rFonts w:ascii="Times New Roman" w:hAnsi="Times New Roman" w:cs="Times New Roman"/>
-          <w:i/>
-          <w:sz w:val="24"/>
-        </w:rPr>
-        <w:t>perceived behavioral control</w:t>
-      </w:r>
-      <w:r>
-        <w:rPr>
-          <w:rFonts w:ascii="Times New Roman" w:hAnsi="Times New Roman" w:cs="Times New Roman"/>
-          <w:sz w:val="24"/>
-        </w:rPr>
-        <w:t xml:space="preserve"> in the </w:t>
-      </w:r>
-      <w:r>
-        <w:rPr>
-          <w:rFonts w:ascii="Times New Roman" w:hAnsi="Times New Roman" w:cs="Times New Roman"/>
-          <w:i/>
-          <w:sz w:val="24"/>
-        </w:rPr>
-        <w:t>theory of planned behavior</w:t>
-      </w:r>
-      <w:r>
-        <w:rPr>
-          <w:rFonts w:ascii="Times New Roman" w:hAnsi="Times New Roman" w:cs="Times New Roman"/>
-          <w:sz w:val="24"/>
-        </w:rPr>
-        <w:t>: A preregistered study. Journal of Theoretical Social Psychology, 5(1), 35–45. https://doi.org/10.1002/jts5.70</w:t>
       </w:r>
     </w:p>
     <w:p>
@@ -26328,7 +26016,7 @@
     <w:link w:val="Heading1Char"/>
     <w:uiPriority w:val="9"/>
     <w:qFormat/>
-    <w:rsid w:val="00916906"/>
+    <w:rsid w:val="00E91894"/>
     <w:pPr>
       <w:keepNext/>
       <w:keepLines/>
@@ -26351,7 +26039,7 @@
     <w:semiHidden/>
     <w:unhideWhenUsed/>
     <w:qFormat/>
-    <w:rsid w:val="00916906"/>
+    <w:rsid w:val="00E91894"/>
     <w:pPr>
       <w:keepNext/>
       <w:keepLines/>
@@ -26374,7 +26062,7 @@
     <w:semiHidden/>
     <w:unhideWhenUsed/>
     <w:qFormat/>
-    <w:rsid w:val="00916906"/>
+    <w:rsid w:val="00E91894"/>
     <w:pPr>
       <w:keepNext/>
       <w:keepLines/>
@@ -26397,7 +26085,7 @@
     <w:semiHidden/>
     <w:unhideWhenUsed/>
     <w:qFormat/>
-    <w:rsid w:val="00916906"/>
+    <w:rsid w:val="00E91894"/>
     <w:pPr>
       <w:keepNext/>
       <w:keepLines/>
@@ -26420,7 +26108,7 @@
     <w:semiHidden/>
     <w:unhideWhenUsed/>
     <w:qFormat/>
-    <w:rsid w:val="00916906"/>
+    <w:rsid w:val="00E91894"/>
     <w:pPr>
       <w:keepNext/>
       <w:keepLines/>
@@ -26441,7 +26129,7 @@
     <w:semiHidden/>
     <w:unhideWhenUsed/>
     <w:qFormat/>
-    <w:rsid w:val="00916906"/>
+    <w:rsid w:val="00E91894"/>
     <w:pPr>
       <w:keepNext/>
       <w:keepLines/>
@@ -26464,7 +26152,7 @@
     <w:semiHidden/>
     <w:unhideWhenUsed/>
     <w:qFormat/>
-    <w:rsid w:val="00916906"/>
+    <w:rsid w:val="00E91894"/>
     <w:pPr>
       <w:keepNext/>
       <w:keepLines/>
@@ -26485,7 +26173,7 @@
     <w:semiHidden/>
     <w:unhideWhenUsed/>
     <w:qFormat/>
-    <w:rsid w:val="00916906"/>
+    <w:rsid w:val="00E91894"/>
     <w:pPr>
       <w:keepNext/>
       <w:keepLines/>
@@ -26508,7 +26196,7 @@
     <w:semiHidden/>
     <w:unhideWhenUsed/>
     <w:qFormat/>
-    <w:rsid w:val="00916906"/>
+    <w:rsid w:val="00E91894"/>
     <w:pPr>
       <w:keepNext/>
       <w:keepLines/>
@@ -26552,7 +26240,7 @@
     <w:basedOn w:val="DefaultParagraphFont"/>
     <w:link w:val="Heading1"/>
     <w:uiPriority w:val="9"/>
-    <w:rsid w:val="00916906"/>
+    <w:rsid w:val="00E91894"/>
     <w:rPr>
       <w:rFonts w:asciiTheme="majorHAnsi" w:eastAsiaTheme="majorEastAsia" w:hAnsiTheme="majorHAnsi" w:cstheme="majorBidi"/>
       <w:color w:val="2F5496" w:themeColor="accent1" w:themeShade="BF"/>
@@ -26566,7 +26254,7 @@
     <w:link w:val="Heading2"/>
     <w:uiPriority w:val="9"/>
     <w:semiHidden/>
-    <w:rsid w:val="00916906"/>
+    <w:rsid w:val="00E91894"/>
     <w:rPr>
       <w:rFonts w:asciiTheme="majorHAnsi" w:eastAsiaTheme="majorEastAsia" w:hAnsiTheme="majorHAnsi" w:cstheme="majorBidi"/>
       <w:color w:val="2F5496" w:themeColor="accent1" w:themeShade="BF"/>
@@ -26580,7 +26268,7 @@
     <w:link w:val="Heading3"/>
     <w:uiPriority w:val="9"/>
     <w:semiHidden/>
-    <w:rsid w:val="00916906"/>
+    <w:rsid w:val="00E91894"/>
     <w:rPr>
       <w:rFonts w:eastAsiaTheme="majorEastAsia" w:cstheme="majorBidi"/>
       <w:color w:val="2F5496" w:themeColor="accent1" w:themeShade="BF"/>
@@ -26594,7 +26282,7 @@
     <w:link w:val="Heading4"/>
     <w:uiPriority w:val="9"/>
     <w:semiHidden/>
-    <w:rsid w:val="00916906"/>
+    <w:rsid w:val="00E91894"/>
     <w:rPr>
       <w:rFonts w:eastAsiaTheme="majorEastAsia" w:cstheme="majorBidi"/>
       <w:i/>
@@ -26608,7 +26296,7 @@
     <w:link w:val="Heading5"/>
     <w:uiPriority w:val="9"/>
     <w:semiHidden/>
-    <w:rsid w:val="00916906"/>
+    <w:rsid w:val="00E91894"/>
     <w:rPr>
       <w:rFonts w:eastAsiaTheme="majorEastAsia" w:cstheme="majorBidi"/>
       <w:color w:val="2F5496" w:themeColor="accent1" w:themeShade="BF"/>
@@ -26620,7 +26308,7 @@
     <w:link w:val="Heading6"/>
     <w:uiPriority w:val="9"/>
     <w:semiHidden/>
-    <w:rsid w:val="00916906"/>
+    <w:rsid w:val="00E91894"/>
     <w:rPr>
       <w:rFonts w:eastAsiaTheme="majorEastAsia" w:cstheme="majorBidi"/>
       <w:i/>
@@ -26634,7 +26322,7 @@
     <w:link w:val="Heading7"/>
     <w:uiPriority w:val="9"/>
     <w:semiHidden/>
-    <w:rsid w:val="00916906"/>
+    <w:rsid w:val="00E91894"/>
     <w:rPr>
       <w:rFonts w:eastAsiaTheme="majorEastAsia" w:cstheme="majorBidi"/>
       <w:color w:val="595959" w:themeColor="text1" w:themeTint="A6"/>
@@ -26646,7 +26334,7 @@
     <w:link w:val="Heading8"/>
     <w:uiPriority w:val="9"/>
     <w:semiHidden/>
-    <w:rsid w:val="00916906"/>
+    <w:rsid w:val="00E91894"/>
     <w:rPr>
       <w:rFonts w:eastAsiaTheme="majorEastAsia" w:cstheme="majorBidi"/>
       <w:i/>
@@ -26660,7 +26348,7 @@
     <w:link w:val="Heading9"/>
     <w:uiPriority w:val="9"/>
     <w:semiHidden/>
-    <w:rsid w:val="00916906"/>
+    <w:rsid w:val="00E91894"/>
     <w:rPr>
       <w:rFonts w:eastAsiaTheme="majorEastAsia" w:cstheme="majorBidi"/>
       <w:color w:val="272727" w:themeColor="text1" w:themeTint="D8"/>
@@ -26673,7 +26361,7 @@
     <w:link w:val="TitleChar"/>
     <w:uiPriority w:val="10"/>
     <w:qFormat/>
-    <w:rsid w:val="00916906"/>
+    <w:rsid w:val="00E91894"/>
     <w:pPr>
       <w:spacing w:after="80" w:line="240" w:lineRule="auto"/>
       <w:contextualSpacing/>
@@ -26691,7 +26379,7 @@
     <w:basedOn w:val="DefaultParagraphFont"/>
     <w:link w:val="Title"/>
     <w:uiPriority w:val="10"/>
-    <w:rsid w:val="00916906"/>
+    <w:rsid w:val="00E91894"/>
     <w:rPr>
       <w:rFonts w:asciiTheme="majorHAnsi" w:eastAsiaTheme="majorEastAsia" w:hAnsiTheme="majorHAnsi" w:cstheme="majorBidi"/>
       <w:spacing w:val="-10"/>
@@ -26707,7 +26395,7 @@
     <w:link w:val="SubtitleChar"/>
     <w:uiPriority w:val="11"/>
     <w:qFormat/>
-    <w:rsid w:val="00916906"/>
+    <w:rsid w:val="00E91894"/>
     <w:pPr>
       <w:numPr>
         <w:ilvl w:val="1"/>
@@ -26726,7 +26414,7 @@
     <w:basedOn w:val="DefaultParagraphFont"/>
     <w:link w:val="Subtitle"/>
     <w:uiPriority w:val="11"/>
-    <w:rsid w:val="00916906"/>
+    <w:rsid w:val="00E91894"/>
     <w:rPr>
       <w:rFonts w:eastAsiaTheme="majorEastAsia" w:cstheme="majorBidi"/>
       <w:color w:val="595959" w:themeColor="text1" w:themeTint="A6"/>
@@ -26742,7 +26430,7 @@
     <w:link w:val="QuoteChar"/>
     <w:uiPriority w:val="29"/>
     <w:qFormat/>
-    <w:rsid w:val="00916906"/>
+    <w:rsid w:val="00E91894"/>
     <w:pPr>
       <w:spacing w:before="160"/>
       <w:jc w:val="center"/>
@@ -26758,7 +26446,7 @@
     <w:basedOn w:val="DefaultParagraphFont"/>
     <w:link w:val="Quote"/>
     <w:uiPriority w:val="29"/>
-    <w:rsid w:val="00916906"/>
+    <w:rsid w:val="00E91894"/>
     <w:rPr>
       <w:i/>
       <w:iCs/>
@@ -26770,7 +26458,7 @@
     <w:basedOn w:val="Normal"/>
     <w:uiPriority w:val="34"/>
     <w:qFormat/>
-    <w:rsid w:val="00916906"/>
+    <w:rsid w:val="00E91894"/>
     <w:pPr>
       <w:ind w:left="720"/>
       <w:contextualSpacing/>
@@ -26781,7 +26469,7 @@
     <w:basedOn w:val="DefaultParagraphFont"/>
     <w:uiPriority w:val="21"/>
     <w:qFormat/>
-    <w:rsid w:val="00916906"/>
+    <w:rsid w:val="00E91894"/>
     <w:rPr>
       <w:i/>
       <w:iCs/>
@@ -26795,7 +26483,7 @@
     <w:link w:val="IntenseQuoteChar"/>
     <w:uiPriority w:val="30"/>
     <w:qFormat/>
-    <w:rsid w:val="00916906"/>
+    <w:rsid w:val="00E91894"/>
     <w:pPr>
       <w:pBdr>
         <w:top w:val="single" w:sz="4" w:space="10" w:color="2F5496" w:themeColor="accent1" w:themeShade="BF"/>
@@ -26816,7 +26504,7 @@
     <w:basedOn w:val="DefaultParagraphFont"/>
     <w:link w:val="IntenseQuote"/>
     <w:uiPriority w:val="30"/>
-    <w:rsid w:val="00916906"/>
+    <w:rsid w:val="00E91894"/>
     <w:rPr>
       <w:i/>
       <w:iCs/>
@@ -26828,7 +26516,7 @@
     <w:basedOn w:val="DefaultParagraphFont"/>
     <w:uiPriority w:val="32"/>
     <w:qFormat/>
-    <w:rsid w:val="00916906"/>
+    <w:rsid w:val="00E91894"/>
     <w:rPr>
       <w:b/>
       <w:bCs/>

</xml_diff>

<commit_message>
Hapus Teori Persepsi Risiko dan rapikan penomoran Landasan Teori Bab II langsung ke variabel penelitian
</commit_message>
<xml_diff>
--- a/TOPIK_2_TAKSI_GREEN_SM/01_Naskah_Utama/Proposal_Skripsi_Taksi_Green_SM.docx
+++ b/TOPIK_2_TAKSI_GREEN_SM/01_Naskah_Utama/Proposal_Skripsi_Taksi_Green_SM.docx
@@ -12,16 +12,16 @@
           <w:noProof/>
         </w:rPr>
         <w:drawing>
-          <wp:inline distT="0" distB="0" distL="0" distR="0" wp14:anchorId="4E98626F" wp14:editId="256E104C">
+          <wp:inline distT="0" distB="0" distL="0" distR="0" wp14:anchorId="7B76848D" wp14:editId="6532028F">
             <wp:extent cx="1152002" cy="1152002"/>
             <wp:effectExtent l="0" t="0" r="0" b="0"/>
-            <wp:docPr id="2009127102" name="Picture 1"/>
+            <wp:docPr id="635760083" name="Picture 1"/>
             <wp:cNvGraphicFramePr/>
             <a:graphic xmlns:a="http://schemas.openxmlformats.org/drawingml/2006/main">
               <a:graphicData uri="http://schemas.openxmlformats.org/drawingml/2006/picture">
                 <pic:pic xmlns:pic="http://schemas.openxmlformats.org/drawingml/2006/picture">
                   <pic:nvPicPr>
-                    <pic:cNvPr id="2009127102" name=""/>
+                    <pic:cNvPr id="635760083" name=""/>
                     <pic:cNvPicPr/>
                   </pic:nvPicPr>
                   <pic:blipFill>
@@ -1355,20 +1355,20 @@
         <w:rPr>
           <w:rFonts w:ascii="Times New Roman" w:hAnsi="Times New Roman" w:cs="Times New Roman"/>
         </w:rPr>
-        <w:t xml:space="preserve">    2.1.2 Teori Persepsi Risiko (</w:t>
-      </w:r>
-      <w:r>
-        <w:rPr>
-          <w:rFonts w:ascii="Times New Roman" w:hAnsi="Times New Roman" w:cs="Times New Roman"/>
-          <w:i/>
-        </w:rPr>
-        <w:t>Perceived Risk Theory</w:t>
-      </w:r>
-      <w:r>
-        <w:rPr>
-          <w:rFonts w:ascii="Times New Roman" w:hAnsi="Times New Roman" w:cs="Times New Roman"/>
-        </w:rPr>
-        <w:t>) ..................................................... 12</w:t>
+        <w:t xml:space="preserve">    2.1.2 Citra Merek (</w:t>
+      </w:r>
+      <w:r>
+        <w:rPr>
+          <w:rFonts w:ascii="Times New Roman" w:hAnsi="Times New Roman" w:cs="Times New Roman"/>
+          <w:i/>
+        </w:rPr>
+        <w:t>Brand Image</w:t>
+      </w:r>
+      <w:r>
+        <w:rPr>
+          <w:rFonts w:ascii="Times New Roman" w:hAnsi="Times New Roman" w:cs="Times New Roman"/>
+        </w:rPr>
+        <w:t>) ................................................................................................ 12</w:t>
       </w:r>
     </w:p>
     <w:p>
@@ -1382,20 +1382,20 @@
         <w:rPr>
           <w:rFonts w:ascii="Times New Roman" w:hAnsi="Times New Roman" w:cs="Times New Roman"/>
         </w:rPr>
-        <w:t xml:space="preserve">    2.1.3 Citra Merek (</w:t>
-      </w:r>
-      <w:r>
-        <w:rPr>
-          <w:rFonts w:ascii="Times New Roman" w:hAnsi="Times New Roman" w:cs="Times New Roman"/>
-          <w:i/>
-        </w:rPr>
-        <w:t>Brand Image</w:t>
-      </w:r>
-      <w:r>
-        <w:rPr>
-          <w:rFonts w:ascii="Times New Roman" w:hAnsi="Times New Roman" w:cs="Times New Roman"/>
-        </w:rPr>
-        <w:t>) ................................................................................................ 13</w:t>
+        <w:t xml:space="preserve">    2.1.3 Kepercayaan Merek (</w:t>
+      </w:r>
+      <w:r>
+        <w:rPr>
+          <w:rFonts w:ascii="Times New Roman" w:hAnsi="Times New Roman" w:cs="Times New Roman"/>
+          <w:i/>
+        </w:rPr>
+        <w:t>Brand Trust</w:t>
+      </w:r>
+      <w:r>
+        <w:rPr>
+          <w:rFonts w:ascii="Times New Roman" w:hAnsi="Times New Roman" w:cs="Times New Roman"/>
+        </w:rPr>
+        <w:t>) ...................................................................................... 14</w:t>
       </w:r>
     </w:p>
     <w:p>
@@ -1409,20 +1409,20 @@
         <w:rPr>
           <w:rFonts w:ascii="Times New Roman" w:hAnsi="Times New Roman" w:cs="Times New Roman"/>
         </w:rPr>
-        <w:t xml:space="preserve">    2.1.4 Kepercayaan Merek (</w:t>
-      </w:r>
-      <w:r>
-        <w:rPr>
-          <w:rFonts w:ascii="Times New Roman" w:hAnsi="Times New Roman" w:cs="Times New Roman"/>
-          <w:i/>
-        </w:rPr>
-        <w:t>Brand Trust</w:t>
-      </w:r>
-      <w:r>
-        <w:rPr>
-          <w:rFonts w:ascii="Times New Roman" w:hAnsi="Times New Roman" w:cs="Times New Roman"/>
-        </w:rPr>
-        <w:t>) ...................................................................................... 15</w:t>
+        <w:t xml:space="preserve">    2.1.4 Persepsi Keamanan dan Keselamatan (</w:t>
+      </w:r>
+      <w:r>
+        <w:rPr>
+          <w:rFonts w:ascii="Times New Roman" w:hAnsi="Times New Roman" w:cs="Times New Roman"/>
+          <w:i/>
+        </w:rPr>
+        <w:t>Perceived Safety</w:t>
+      </w:r>
+      <w:r>
+        <w:rPr>
+          <w:rFonts w:ascii="Times New Roman" w:hAnsi="Times New Roman" w:cs="Times New Roman"/>
+        </w:rPr>
+        <w:t>) .................................................... 16</w:t>
       </w:r>
     </w:p>
     <w:p>
@@ -1436,34 +1436,7 @@
         <w:rPr>
           <w:rFonts w:ascii="Times New Roman" w:hAnsi="Times New Roman" w:cs="Times New Roman"/>
         </w:rPr>
-        <w:t xml:space="preserve">    2.1.5 Persepsi Keamanan dan Keselamatan (</w:t>
-      </w:r>
-      <w:r>
-        <w:rPr>
-          <w:rFonts w:ascii="Times New Roman" w:hAnsi="Times New Roman" w:cs="Times New Roman"/>
-          <w:i/>
-        </w:rPr>
-        <w:t>Perceived Safety</w:t>
-      </w:r>
-      <w:r>
-        <w:rPr>
-          <w:rFonts w:ascii="Times New Roman" w:hAnsi="Times New Roman" w:cs="Times New Roman"/>
-        </w:rPr>
-        <w:t>) .................................................... 17</w:t>
-      </w:r>
-    </w:p>
-    <w:p>
-      <w:pPr>
-        <w:spacing w:after="60" w:line="360" w:lineRule="auto"/>
-        <w:rPr>
-          <w:rFonts w:ascii="Times New Roman" w:hAnsi="Times New Roman" w:cs="Times New Roman"/>
-        </w:rPr>
-      </w:pPr>
-      <w:r>
-        <w:rPr>
-          <w:rFonts w:ascii="Times New Roman" w:hAnsi="Times New Roman" w:cs="Times New Roman"/>
-        </w:rPr>
-        <w:t xml:space="preserve">    2.1.6 Perspektif Dosen Program Studi Manajemen FEB UKRIDA .................................................... 18</w:t>
+        <w:t xml:space="preserve">    2.1.5 Perspektif Dosen Program Studi Manajemen FEB UKRIDA .................................................... 18</w:t>
       </w:r>
     </w:p>
     <w:p>
@@ -5115,7 +5088,7 @@
           <w:b/>
           <w:sz w:val="24"/>
         </w:rPr>
-        <w:t>2.1.2 Teori Persepsi Risiko (</w:t>
+        <w:t>2.1.2 Citra Merek (</w:t>
       </w:r>
       <w:r>
         <w:rPr>
@@ -5124,7 +5097,7 @@
           <w:i/>
           <w:sz w:val="24"/>
         </w:rPr>
-        <w:t>Perceived Risk Theory</w:t>
+        <w:t>Brand Image</w:t>
       </w:r>
       <w:r>
         <w:rPr>
@@ -5151,22 +5124,22 @@
           <w:rFonts w:ascii="Times New Roman" w:hAnsi="Times New Roman" w:cs="Times New Roman"/>
           <w:sz w:val="24"/>
         </w:rPr>
-        <w:t xml:space="preserve">Konsep persepsi risiko dalam teori perilaku konsumen modern (Kotler </w:t>
-      </w:r>
-      <w:r>
-        <w:rPr>
-          <w:rFonts w:ascii="Times New Roman" w:hAnsi="Times New Roman" w:cs="Times New Roman"/>
-          <w:i/>
-          <w:sz w:val="24"/>
-        </w:rPr>
-        <w:t>et al.</w:t>
-      </w:r>
-      <w:r>
-        <w:rPr>
-          <w:rFonts w:ascii="Times New Roman" w:hAnsi="Times New Roman" w:cs="Times New Roman"/>
-          <w:sz w:val="24"/>
-        </w:rPr>
-        <w:t>, 2022; Asnawir &amp; Simanjuntak, 2024; Ardialis &amp; Irfani, 2023) menyatakan bahwa keputusan konsumen melibatkan evaluasi terhadap risiko dalam arti bahwa tindakan apa pun dari konsumen akan menimbulkan konsekuensi yang tidak dapat diantisipasi dengan pasti (uncertainty) dan potensi kerugian (danger/loss).</w:t>
+        <w:t>Menurut Kotler, Keller, dan Chernev (2022) serta Aaker (2023), citra merek (</w:t>
+      </w:r>
+      <w:r>
+        <w:rPr>
+          <w:rFonts w:ascii="Times New Roman" w:hAnsi="Times New Roman" w:cs="Times New Roman"/>
+          <w:i/>
+          <w:sz w:val="24"/>
+        </w:rPr>
+        <w:t>brand image</w:t>
+      </w:r>
+      <w:r>
+        <w:rPr>
+          <w:rFonts w:ascii="Times New Roman" w:hAnsi="Times New Roman" w:cs="Times New Roman"/>
+          <w:sz w:val="24"/>
+        </w:rPr>
+        <w:t>) adalah persepsi tentang suatu merek sebagaimana tercermin oleh sekumpulan asosiasi merek yang tersimpan dalam ingatan kognitif konsumen (brand associations held in consumer memory). Asosiasi merek merupakan simpul-simpul informasi yang terhubung dengan simpul merek dalam memori konsumen dan mengandung makna merek bagi konsumen. Citra merek yang kokoh dan positif memberikan keunggulan kompetitif bagi perusahaan karena mampu menyederhanakan pemrosesan informasi bagi konsumen, membedakan produk/jasa dari pesaing, membangkitkan alasan rasional untuk membeli, serta menciptakan asosiasi emosional yang menguntungkan.</w:t>
       </w:r>
     </w:p>
     <w:p>
@@ -5185,22 +5158,105 @@
           <w:rFonts w:ascii="Times New Roman" w:hAnsi="Times New Roman" w:cs="Times New Roman"/>
           <w:sz w:val="24"/>
         </w:rPr>
-        <w:t>Dalam industri transportasi kendaraan listrik (</w:t>
-      </w:r>
-      <w:r>
-        <w:rPr>
-          <w:rFonts w:ascii="Times New Roman" w:hAnsi="Times New Roman" w:cs="Times New Roman"/>
-          <w:i/>
-          <w:sz w:val="24"/>
-        </w:rPr>
-        <w:t>electric vehicle</w:t>
-      </w:r>
-      <w:r>
-        <w:rPr>
-          <w:rFonts w:ascii="Times New Roman" w:hAnsi="Times New Roman" w:cs="Times New Roman"/>
-          <w:sz w:val="24"/>
-        </w:rPr>
-        <w:t xml:space="preserve">), persepsi risiko berkaitan erat dengan risiko fungsional/teknis (seperti daya tahan baterai, keandalan sistem kelistrikan, dan ketahanan di berbagai kondisi jalan) serta risiko fisik/keselamatan penumpang. Ketika konsumen mempertimbangkan untuk menggunakan moda transportasi baru seperti taksi listrik </w:t>
+        <w:t xml:space="preserve">Berdasarkan sintesis Kotler, Keller, dan Chernev (2022) serta Aaker (2023), dimensi dan indikator baku </w:t>
+      </w:r>
+      <w:r>
+        <w:rPr>
+          <w:rFonts w:ascii="Times New Roman" w:hAnsi="Times New Roman" w:cs="Times New Roman"/>
+          <w:i/>
+          <w:sz w:val="24"/>
+        </w:rPr>
+        <w:t>Brand Image</w:t>
+      </w:r>
+      <w:r>
+        <w:rPr>
+          <w:rFonts w:ascii="Times New Roman" w:hAnsi="Times New Roman" w:cs="Times New Roman"/>
+          <w:sz w:val="24"/>
+        </w:rPr>
+        <w:t xml:space="preserve"> dalam penelitian ini terdiri atas:</w:t>
+      </w:r>
+    </w:p>
+    <w:p>
+      <w:pPr>
+        <w:keepNext/>
+        <w:spacing w:after="80" w:line="360" w:lineRule="auto"/>
+        <w:ind w:firstLine="425"/>
+        <w:jc w:val="both"/>
+        <w:rPr>
+          <w:rFonts w:ascii="Times New Roman" w:hAnsi="Times New Roman" w:cs="Times New Roman"/>
+          <w:sz w:val="24"/>
+        </w:rPr>
+      </w:pPr>
+      <w:r>
+        <w:rPr>
+          <w:rFonts w:ascii="Times New Roman" w:hAnsi="Times New Roman" w:cs="Times New Roman"/>
+          <w:sz w:val="24"/>
+        </w:rPr>
+        <w:t>1. Citra Perusahaan (</w:t>
+      </w:r>
+      <w:r>
+        <w:rPr>
+          <w:rFonts w:ascii="Times New Roman" w:hAnsi="Times New Roman" w:cs="Times New Roman"/>
+          <w:i/>
+          <w:sz w:val="24"/>
+        </w:rPr>
+        <w:t>Corporate Image</w:t>
+      </w:r>
+      <w:r>
+        <w:rPr>
+          <w:rFonts w:ascii="Times New Roman" w:hAnsi="Times New Roman" w:cs="Times New Roman"/>
+          <w:sz w:val="24"/>
+        </w:rPr>
+        <w:t xml:space="preserve">): Persepsi konsumen terhadap reputasi, kredibilitas, profesionalisme, dan skala operasional korporasi penyedia jasa (PT Xanh SM / </w:t>
+      </w:r>
+      <w:r>
+        <w:rPr>
+          <w:rFonts w:ascii="Times New Roman" w:hAnsi="Times New Roman" w:cs="Times New Roman"/>
+          <w:i/>
+          <w:sz w:val="24"/>
+        </w:rPr>
+        <w:t>Vingroup</w:t>
+      </w:r>
+      <w:r>
+        <w:rPr>
+          <w:rFonts w:ascii="Times New Roman" w:hAnsi="Times New Roman" w:cs="Times New Roman"/>
+          <w:sz w:val="24"/>
+        </w:rPr>
+        <w:t>) di mata masyarakat Jakarta Barat.</w:t>
+      </w:r>
+    </w:p>
+    <w:p>
+      <w:pPr>
+        <w:keepNext/>
+        <w:spacing w:after="80" w:line="360" w:lineRule="auto"/>
+        <w:ind w:firstLine="425"/>
+        <w:jc w:val="both"/>
+        <w:rPr>
+          <w:rFonts w:ascii="Times New Roman" w:hAnsi="Times New Roman" w:cs="Times New Roman"/>
+          <w:sz w:val="24"/>
+        </w:rPr>
+      </w:pPr>
+      <w:r>
+        <w:rPr>
+          <w:rFonts w:ascii="Times New Roman" w:hAnsi="Times New Roman" w:cs="Times New Roman"/>
+          <w:sz w:val="24"/>
+        </w:rPr>
+        <w:t>2. Citra Pengguna (</w:t>
+      </w:r>
+      <w:r>
+        <w:rPr>
+          <w:rFonts w:ascii="Times New Roman" w:hAnsi="Times New Roman" w:cs="Times New Roman"/>
+          <w:i/>
+          <w:sz w:val="24"/>
+        </w:rPr>
+        <w:t>User Image</w:t>
+      </w:r>
+      <w:r>
+        <w:rPr>
+          <w:rFonts w:ascii="Times New Roman" w:hAnsi="Times New Roman" w:cs="Times New Roman"/>
+          <w:sz w:val="24"/>
+        </w:rPr>
+        <w:t xml:space="preserve">): Persepsi tentang kepribadian, gaya hidup, dan status sosial pengguna taksi </w:t>
       </w:r>
       <w:r>
         <w:rPr>
@@ -5215,30 +5271,30 @@
           <w:rFonts w:ascii="Times New Roman" w:hAnsi="Times New Roman" w:cs="Times New Roman"/>
           <w:sz w:val="24"/>
         </w:rPr>
-        <w:t xml:space="preserve">, evaluasi risiko menjadi pertimbangan mendasar sebelum mengambil keputusan. Mitigasi terhadap persepsi risiko ini melahirkan konsep </w:t>
-      </w:r>
-      <w:r>
-        <w:rPr>
-          <w:rFonts w:ascii="Times New Roman" w:hAnsi="Times New Roman" w:cs="Times New Roman"/>
-          <w:i/>
-          <w:sz w:val="24"/>
-        </w:rPr>
-        <w:t>Perceived Safety</w:t>
-      </w:r>
-      <w:r>
-        <w:rPr>
-          <w:rFonts w:ascii="Times New Roman" w:hAnsi="Times New Roman" w:cs="Times New Roman"/>
-          <w:sz w:val="24"/>
-        </w:rPr>
-        <w:t xml:space="preserve"> (Persepsi Keamanan dan Keselamatan) yang menjadi variabel penentu pertimbangan konsumen dalam memutuskan penggunaan jasa (</w:t>
-      </w:r>
-      <w:r>
-        <w:rPr>
-          <w:rFonts w:ascii="Times New Roman" w:hAnsi="Times New Roman" w:cs="Times New Roman"/>
-          <w:i/>
-          <w:sz w:val="24"/>
-        </w:rPr>
-        <w:t>Purchase Decision</w:t>
+        <w:t>, yaitu sebagai masyarakat modern yang cerdas, peduli terhadap isu lingkungan hidup (</w:t>
+      </w:r>
+      <w:r>
+        <w:rPr>
+          <w:rFonts w:ascii="Times New Roman" w:hAnsi="Times New Roman" w:cs="Times New Roman"/>
+          <w:i/>
+          <w:sz w:val="24"/>
+        </w:rPr>
+        <w:t>eco-friendly</w:t>
+      </w:r>
+      <w:r>
+        <w:rPr>
+          <w:rFonts w:ascii="Times New Roman" w:hAnsi="Times New Roman" w:cs="Times New Roman"/>
+          <w:sz w:val="24"/>
+        </w:rPr>
+        <w:t>), dan melek teknologi (</w:t>
+      </w:r>
+      <w:r>
+        <w:rPr>
+          <w:rFonts w:ascii="Times New Roman" w:hAnsi="Times New Roman" w:cs="Times New Roman"/>
+          <w:i/>
+          <w:sz w:val="24"/>
+        </w:rPr>
+        <w:t>tech-savvy</w:t>
       </w:r>
       <w:r>
         <w:rPr>
@@ -5251,6 +5307,85 @@
     <w:p>
       <w:pPr>
         <w:keepNext/>
+        <w:spacing w:after="80" w:line="360" w:lineRule="auto"/>
+        <w:ind w:firstLine="425"/>
+        <w:jc w:val="both"/>
+        <w:rPr>
+          <w:rFonts w:ascii="Times New Roman" w:hAnsi="Times New Roman" w:cs="Times New Roman"/>
+          <w:sz w:val="24"/>
+        </w:rPr>
+      </w:pPr>
+      <w:r>
+        <w:rPr>
+          <w:rFonts w:ascii="Times New Roman" w:hAnsi="Times New Roman" w:cs="Times New Roman"/>
+          <w:sz w:val="24"/>
+        </w:rPr>
+        <w:t>3. Citra Produk/Armada (</w:t>
+      </w:r>
+      <w:r>
+        <w:rPr>
+          <w:rFonts w:ascii="Times New Roman" w:hAnsi="Times New Roman" w:cs="Times New Roman"/>
+          <w:i/>
+          <w:sz w:val="24"/>
+        </w:rPr>
+        <w:t>Product Image</w:t>
+      </w:r>
+      <w:r>
+        <w:rPr>
+          <w:rFonts w:ascii="Times New Roman" w:hAnsi="Times New Roman" w:cs="Times New Roman"/>
+          <w:sz w:val="24"/>
+        </w:rPr>
+        <w:t xml:space="preserve">): Persepsi mengenai karakteristik fisik dan kualitas atribut armada mobil listrik </w:t>
+      </w:r>
+      <w:r>
+        <w:rPr>
+          <w:rFonts w:ascii="Times New Roman" w:hAnsi="Times New Roman" w:cs="Times New Roman"/>
+          <w:i/>
+          <w:sz w:val="24"/>
+        </w:rPr>
+        <w:t>VinFast VF 5</w:t>
+      </w:r>
+      <w:r>
+        <w:rPr>
+          <w:rFonts w:ascii="Times New Roman" w:hAnsi="Times New Roman" w:cs="Times New Roman"/>
+          <w:sz w:val="24"/>
+        </w:rPr>
+        <w:t xml:space="preserve"> yang dioperasikan </w:t>
+      </w:r>
+      <w:r>
+        <w:rPr>
+          <w:rFonts w:ascii="Times New Roman" w:hAnsi="Times New Roman" w:cs="Times New Roman"/>
+          <w:i/>
+          <w:sz w:val="24"/>
+        </w:rPr>
+        <w:t>Green SM</w:t>
+      </w:r>
+      <w:r>
+        <w:rPr>
+          <w:rFonts w:ascii="Times New Roman" w:hAnsi="Times New Roman" w:cs="Times New Roman"/>
+          <w:sz w:val="24"/>
+        </w:rPr>
+        <w:t>, meliputi tampilan warna hijau toska yang elegan, kebersihan armada, keheningan kabin tanpa polusi suara mesin (</w:t>
+      </w:r>
+      <w:r>
+        <w:rPr>
+          <w:rFonts w:ascii="Times New Roman" w:hAnsi="Times New Roman" w:cs="Times New Roman"/>
+          <w:i/>
+          <w:sz w:val="24"/>
+        </w:rPr>
+        <w:t>zero noise</w:t>
+      </w:r>
+      <w:r>
+        <w:rPr>
+          <w:rFonts w:ascii="Times New Roman" w:hAnsi="Times New Roman" w:cs="Times New Roman"/>
+          <w:sz w:val="24"/>
+        </w:rPr>
+        <w:t>), serta teknologi canggih di dalam kabin.</w:t>
+      </w:r>
+    </w:p>
+    <w:p>
+      <w:pPr>
+        <w:keepNext/>
         <w:spacing w:after="120" w:line="360" w:lineRule="auto"/>
         <w:rPr>
           <w:rFonts w:ascii="Times New Roman" w:hAnsi="Times New Roman" w:cs="Times New Roman"/>
@@ -5264,7 +5399,7 @@
           <w:b/>
           <w:sz w:val="24"/>
         </w:rPr>
-        <w:t>2.1.3 Citra Merek (</w:t>
+        <w:t>2.1.3 Kepercayaan Merek (</w:t>
       </w:r>
       <w:r>
         <w:rPr>
@@ -5273,7 +5408,7 @@
           <w:i/>
           <w:sz w:val="24"/>
         </w:rPr>
-        <w:t>Brand Image</w:t>
+        <w:t>Brand Trust</w:t>
       </w:r>
       <w:r>
         <w:rPr>
@@ -5300,22 +5435,22 @@
           <w:rFonts w:ascii="Times New Roman" w:hAnsi="Times New Roman" w:cs="Times New Roman"/>
           <w:sz w:val="24"/>
         </w:rPr>
-        <w:t>Menurut Kotler, Keller, dan Chernev (2022) serta Aaker (2023), citra merek (</w:t>
-      </w:r>
-      <w:r>
-        <w:rPr>
-          <w:rFonts w:ascii="Times New Roman" w:hAnsi="Times New Roman" w:cs="Times New Roman"/>
-          <w:i/>
-          <w:sz w:val="24"/>
-        </w:rPr>
-        <w:t>brand image</w:t>
-      </w:r>
-      <w:r>
-        <w:rPr>
-          <w:rFonts w:ascii="Times New Roman" w:hAnsi="Times New Roman" w:cs="Times New Roman"/>
-          <w:sz w:val="24"/>
-        </w:rPr>
-        <w:t>) adalah persepsi tentang suatu merek sebagaimana tercermin oleh sekumpulan asosiasi merek yang tersimpan dalam ingatan kognitif konsumen (brand associations held in consumer memory). Asosiasi merek merupakan simpul-simpul informasi yang terhubung dengan simpul merek dalam memori konsumen dan mengandung makna merek bagi konsumen. Citra merek yang kokoh dan positif memberikan keunggulan kompetitif bagi perusahaan karena mampu menyederhanakan pemrosesan informasi bagi konsumen, membedakan produk/jasa dari pesaing, membangkitkan alasan rasional untuk membeli, serta menciptakan asosiasi emosional yang menguntungkan.</w:t>
+        <w:t xml:space="preserve">Kotler, Keller, dan Chernev (2022) serta Adha dan Suhardi (2025) mendefinisikan </w:t>
+      </w:r>
+      <w:r>
+        <w:rPr>
+          <w:rFonts w:ascii="Times New Roman" w:hAnsi="Times New Roman" w:cs="Times New Roman"/>
+          <w:i/>
+          <w:sz w:val="24"/>
+        </w:rPr>
+        <w:t>Brand Trust</w:t>
+      </w:r>
+      <w:r>
+        <w:rPr>
+          <w:rFonts w:ascii="Times New Roman" w:hAnsi="Times New Roman" w:cs="Times New Roman"/>
+          <w:sz w:val="24"/>
+        </w:rPr>
+        <w:t xml:space="preserve"> sebagai kesediaan konsumen untuk mempercayai dan mengandalkan kemampuan suatu merek dalam menjalankan fungsi yang telah dinyatakannya secara konsisten (willingness to rely on the ability of the brand to perform its stated function). Kepercayaan merupakan variabel relasional yang sangat berharga dalam konteks industri jasa transportasi, di mana konsumen menyerahkan keselamatan fisik dan ketepatan waktu perjalanannya kepada operator penyedia jasa.</w:t>
       </w:r>
     </w:p>
     <w:p>
@@ -5334,22 +5469,37 @@
           <w:rFonts w:ascii="Times New Roman" w:hAnsi="Times New Roman" w:cs="Times New Roman"/>
           <w:sz w:val="24"/>
         </w:rPr>
-        <w:t xml:space="preserve">Berdasarkan sintesis Kotler, Keller, dan Chernev (2022) serta Aaker (2023), dimensi dan indikator baku </w:t>
-      </w:r>
-      <w:r>
-        <w:rPr>
-          <w:rFonts w:ascii="Times New Roman" w:hAnsi="Times New Roman" w:cs="Times New Roman"/>
-          <w:i/>
-          <w:sz w:val="24"/>
-        </w:rPr>
-        <w:t>Brand Image</w:t>
-      </w:r>
-      <w:r>
-        <w:rPr>
-          <w:rFonts w:ascii="Times New Roman" w:hAnsi="Times New Roman" w:cs="Times New Roman"/>
-          <w:sz w:val="24"/>
-        </w:rPr>
-        <w:t xml:space="preserve"> dalam penelitian ini terdiri atas:</w:t>
+        <w:t xml:space="preserve">Dalam literatur pemasaran relasional mutakhir (Kotler </w:t>
+      </w:r>
+      <w:r>
+        <w:rPr>
+          <w:rFonts w:ascii="Times New Roman" w:hAnsi="Times New Roman" w:cs="Times New Roman"/>
+          <w:i/>
+          <w:sz w:val="24"/>
+        </w:rPr>
+        <w:t>et al.</w:t>
+      </w:r>
+      <w:r>
+        <w:rPr>
+          <w:rFonts w:ascii="Times New Roman" w:hAnsi="Times New Roman" w:cs="Times New Roman"/>
+          <w:sz w:val="24"/>
+        </w:rPr>
+        <w:t xml:space="preserve">, 2022; Hera &amp; Fourqoniah, 2023; Fadila &amp; Wahyuni, 2025), konstruk </w:t>
+      </w:r>
+      <w:r>
+        <w:rPr>
+          <w:rFonts w:ascii="Times New Roman" w:hAnsi="Times New Roman" w:cs="Times New Roman"/>
+          <w:i/>
+          <w:sz w:val="24"/>
+        </w:rPr>
+        <w:t>brand trust</w:t>
+      </w:r>
+      <w:r>
+        <w:rPr>
+          <w:rFonts w:ascii="Times New Roman" w:hAnsi="Times New Roman" w:cs="Times New Roman"/>
+          <w:sz w:val="24"/>
+        </w:rPr>
+        <w:t xml:space="preserve"> dibangun melalui dua dimensi utama:</w:t>
       </w:r>
     </w:p>
     <w:p>
@@ -5368,37 +5518,37 @@
           <w:rFonts w:ascii="Times New Roman" w:hAnsi="Times New Roman" w:cs="Times New Roman"/>
           <w:sz w:val="24"/>
         </w:rPr>
-        <w:t>1. Citra Perusahaan (</w:t>
-      </w:r>
-      <w:r>
-        <w:rPr>
-          <w:rFonts w:ascii="Times New Roman" w:hAnsi="Times New Roman" w:cs="Times New Roman"/>
-          <w:i/>
-          <w:sz w:val="24"/>
-        </w:rPr>
-        <w:t>Corporate Image</w:t>
-      </w:r>
-      <w:r>
-        <w:rPr>
-          <w:rFonts w:ascii="Times New Roman" w:hAnsi="Times New Roman" w:cs="Times New Roman"/>
-          <w:sz w:val="24"/>
-        </w:rPr>
-        <w:t xml:space="preserve">): Persepsi konsumen terhadap reputasi, kredibilitas, profesionalisme, dan skala operasional korporasi penyedia jasa (PT Xanh SM / </w:t>
-      </w:r>
-      <w:r>
-        <w:rPr>
-          <w:rFonts w:ascii="Times New Roman" w:hAnsi="Times New Roman" w:cs="Times New Roman"/>
-          <w:i/>
-          <w:sz w:val="24"/>
-        </w:rPr>
-        <w:t>Vingroup</w:t>
-      </w:r>
-      <w:r>
-        <w:rPr>
-          <w:rFonts w:ascii="Times New Roman" w:hAnsi="Times New Roman" w:cs="Times New Roman"/>
-          <w:sz w:val="24"/>
-        </w:rPr>
-        <w:t>) di mata masyarakat Jakarta Barat.</w:t>
+        <w:t>1. Keandalan Merek (</w:t>
+      </w:r>
+      <w:r>
+        <w:rPr>
+          <w:rFonts w:ascii="Times New Roman" w:hAnsi="Times New Roman" w:cs="Times New Roman"/>
+          <w:i/>
+          <w:sz w:val="24"/>
+        </w:rPr>
+        <w:t>Brand Reliability</w:t>
+      </w:r>
+      <w:r>
+        <w:rPr>
+          <w:rFonts w:ascii="Times New Roman" w:hAnsi="Times New Roman" w:cs="Times New Roman"/>
+          <w:sz w:val="24"/>
+        </w:rPr>
+        <w:t xml:space="preserve">): Keyakinan kognitif konsumen bahwa merek mampu dan kompeten dalam memenuhi janji layanannya secara konsisten. Dalam konteks taksi </w:t>
+      </w:r>
+      <w:r>
+        <w:rPr>
+          <w:rFonts w:ascii="Times New Roman" w:hAnsi="Times New Roman" w:cs="Times New Roman"/>
+          <w:i/>
+          <w:sz w:val="24"/>
+        </w:rPr>
+        <w:t>Green SM</w:t>
+      </w:r>
+      <w:r>
+        <w:rPr>
+          <w:rFonts w:ascii="Times New Roman" w:hAnsi="Times New Roman" w:cs="Times New Roman"/>
+          <w:sz w:val="24"/>
+        </w:rPr>
+        <w:t>, keandalan ini tecermin dari ketepatan waktu penjemputan armada, ketersediaan unit di sekitar wilayah Jakarta Barat, stabilitas aplikasi pemesanan digital, dan kepastian argo tarif yang adil dan transparan.</w:t>
       </w:r>
     </w:p>
     <w:p>
@@ -5417,22 +5567,22 @@
           <w:rFonts w:ascii="Times New Roman" w:hAnsi="Times New Roman" w:cs="Times New Roman"/>
           <w:sz w:val="24"/>
         </w:rPr>
-        <w:t>2. Citra Pengguna (</w:t>
-      </w:r>
-      <w:r>
-        <w:rPr>
-          <w:rFonts w:ascii="Times New Roman" w:hAnsi="Times New Roman" w:cs="Times New Roman"/>
-          <w:i/>
-          <w:sz w:val="24"/>
-        </w:rPr>
-        <w:t>User Image</w:t>
-      </w:r>
-      <w:r>
-        <w:rPr>
-          <w:rFonts w:ascii="Times New Roman" w:hAnsi="Times New Roman" w:cs="Times New Roman"/>
-          <w:sz w:val="24"/>
-        </w:rPr>
-        <w:t xml:space="preserve">): Persepsi tentang kepribadian, gaya hidup, dan status sosial pengguna taksi </w:t>
+        <w:t>2. Itikad Baik / Integritas Merek (</w:t>
+      </w:r>
+      <w:r>
+        <w:rPr>
+          <w:rFonts w:ascii="Times New Roman" w:hAnsi="Times New Roman" w:cs="Times New Roman"/>
+          <w:i/>
+          <w:sz w:val="24"/>
+        </w:rPr>
+        <w:t>Brand Intentions</w:t>
+      </w:r>
+      <w:r>
+        <w:rPr>
+          <w:rFonts w:ascii="Times New Roman" w:hAnsi="Times New Roman" w:cs="Times New Roman"/>
+          <w:sz w:val="24"/>
+        </w:rPr>
+        <w:t xml:space="preserve"> / Benevolence): Keyakinan emosional konsumen bahwa perusahaan memiliki itikad baik untuk mengutamakan kepentingan, kenyamanan, dan keselamatan konsumen di atas sekadar mengejar profitabilitas jangka pendek. Hal ini diwujudkan dalam keramahan dan kejujuran mitra pengemudi </w:t>
       </w:r>
       <w:r>
         <w:rPr>
@@ -5447,37 +5597,71 @@
           <w:rFonts w:ascii="Times New Roman" w:hAnsi="Times New Roman" w:cs="Times New Roman"/>
           <w:sz w:val="24"/>
         </w:rPr>
-        <w:t>, yaitu sebagai masyarakat modern yang cerdas, peduli terhadap isu lingkungan hidup (</w:t>
-      </w:r>
-      <w:r>
-        <w:rPr>
-          <w:rFonts w:ascii="Times New Roman" w:hAnsi="Times New Roman" w:cs="Times New Roman"/>
-          <w:i/>
-          <w:sz w:val="24"/>
-        </w:rPr>
-        <w:t>eco-friendly</w:t>
-      </w:r>
-      <w:r>
-        <w:rPr>
-          <w:rFonts w:ascii="Times New Roman" w:hAnsi="Times New Roman" w:cs="Times New Roman"/>
-          <w:sz w:val="24"/>
-        </w:rPr>
-        <w:t>), dan melek teknologi (</w:t>
-      </w:r>
-      <w:r>
-        <w:rPr>
-          <w:rFonts w:ascii="Times New Roman" w:hAnsi="Times New Roman" w:cs="Times New Roman"/>
-          <w:i/>
-          <w:sz w:val="24"/>
-        </w:rPr>
-        <w:t>tech-savvy</w:t>
-      </w:r>
-      <w:r>
-        <w:rPr>
-          <w:rFonts w:ascii="Times New Roman" w:hAnsi="Times New Roman" w:cs="Times New Roman"/>
-          <w:sz w:val="24"/>
-        </w:rPr>
-        <w:t>).</w:t>
+        <w:t>, respon cepat layanan pelanggan (</w:t>
+      </w:r>
+      <w:r>
+        <w:rPr>
+          <w:rFonts w:ascii="Times New Roman" w:hAnsi="Times New Roman" w:cs="Times New Roman"/>
+          <w:i/>
+          <w:sz w:val="24"/>
+        </w:rPr>
+        <w:t>customer care</w:t>
+      </w:r>
+      <w:r>
+        <w:rPr>
+          <w:rFonts w:ascii="Times New Roman" w:hAnsi="Times New Roman" w:cs="Times New Roman"/>
+          <w:sz w:val="24"/>
+        </w:rPr>
+        <w:t>), serta jaminan ganti rugi apabila terjadi kendala operasional.</w:t>
+      </w:r>
+    </w:p>
+    <w:p>
+      <w:pPr>
+        <w:keepNext/>
+        <w:spacing w:after="120" w:line="360" w:lineRule="auto"/>
+        <w:ind w:firstLine="709"/>
+        <w:jc w:val="both"/>
+        <w:rPr>
+          <w:rFonts w:ascii="Times New Roman" w:hAnsi="Times New Roman" w:cs="Times New Roman"/>
+          <w:sz w:val="24"/>
+        </w:rPr>
+      </w:pPr>
+      <w:r>
+        <w:rPr>
+          <w:rFonts w:ascii="Times New Roman" w:hAnsi="Times New Roman" w:cs="Times New Roman"/>
+          <w:sz w:val="24"/>
+        </w:rPr>
+        <w:t xml:space="preserve">Dimensi dan indikator baku </w:t>
+      </w:r>
+      <w:r>
+        <w:rPr>
+          <w:rFonts w:ascii="Times New Roman" w:hAnsi="Times New Roman" w:cs="Times New Roman"/>
+          <w:i/>
+          <w:sz w:val="24"/>
+        </w:rPr>
+        <w:t>Brand Trust</w:t>
+      </w:r>
+      <w:r>
+        <w:rPr>
+          <w:rFonts w:ascii="Times New Roman" w:hAnsi="Times New Roman" w:cs="Times New Roman"/>
+          <w:sz w:val="24"/>
+        </w:rPr>
+        <w:t xml:space="preserve"> dalam penelitian ini diadaptasi dari Kotler </w:t>
+      </w:r>
+      <w:r>
+        <w:rPr>
+          <w:rFonts w:ascii="Times New Roman" w:hAnsi="Times New Roman" w:cs="Times New Roman"/>
+          <w:i/>
+          <w:sz w:val="24"/>
+        </w:rPr>
+        <w:t>et al.</w:t>
+      </w:r>
+      <w:r>
+        <w:rPr>
+          <w:rFonts w:ascii="Times New Roman" w:hAnsi="Times New Roman" w:cs="Times New Roman"/>
+          <w:sz w:val="24"/>
+        </w:rPr>
+        <w:t xml:space="preserve"> (2022), Hera dan Fourqoniah (2023), serta Adha dan Suhardi (2025):</w:t>
       </w:r>
     </w:p>
     <w:p>
@@ -5496,37 +5680,7 @@
           <w:rFonts w:ascii="Times New Roman" w:hAnsi="Times New Roman" w:cs="Times New Roman"/>
           <w:sz w:val="24"/>
         </w:rPr>
-        <w:t>3. Citra Produk/Armada (</w:t>
-      </w:r>
-      <w:r>
-        <w:rPr>
-          <w:rFonts w:ascii="Times New Roman" w:hAnsi="Times New Roman" w:cs="Times New Roman"/>
-          <w:i/>
-          <w:sz w:val="24"/>
-        </w:rPr>
-        <w:t>Product Image</w:t>
-      </w:r>
-      <w:r>
-        <w:rPr>
-          <w:rFonts w:ascii="Times New Roman" w:hAnsi="Times New Roman" w:cs="Times New Roman"/>
-          <w:sz w:val="24"/>
-        </w:rPr>
-        <w:t xml:space="preserve">): Persepsi mengenai karakteristik fisik dan kualitas atribut armada mobil listrik </w:t>
-      </w:r>
-      <w:r>
-        <w:rPr>
-          <w:rFonts w:ascii="Times New Roman" w:hAnsi="Times New Roman" w:cs="Times New Roman"/>
-          <w:i/>
-          <w:sz w:val="24"/>
-        </w:rPr>
-        <w:t>VinFast VF 5</w:t>
-      </w:r>
-      <w:r>
-        <w:rPr>
-          <w:rFonts w:ascii="Times New Roman" w:hAnsi="Times New Roman" w:cs="Times New Roman"/>
-          <w:sz w:val="24"/>
-        </w:rPr>
-        <w:t xml:space="preserve"> yang dioperasikan </w:t>
+        <w:t xml:space="preserve">1. Keyakinan bahwa taksi </w:t>
       </w:r>
       <w:r>
         <w:rPr>
@@ -5541,22 +5695,169 @@
           <w:rFonts w:ascii="Times New Roman" w:hAnsi="Times New Roman" w:cs="Times New Roman"/>
           <w:sz w:val="24"/>
         </w:rPr>
-        <w:t>, meliputi tampilan warna hijau toska yang elegan, kebersihan armada, keheningan kabin tanpa polusi suara mesin (</w:t>
-      </w:r>
-      <w:r>
-        <w:rPr>
-          <w:rFonts w:ascii="Times New Roman" w:hAnsi="Times New Roman" w:cs="Times New Roman"/>
-          <w:i/>
-          <w:sz w:val="24"/>
-        </w:rPr>
-        <w:t>zero noise</w:t>
-      </w:r>
-      <w:r>
-        <w:rPr>
-          <w:rFonts w:ascii="Times New Roman" w:hAnsi="Times New Roman" w:cs="Times New Roman"/>
-          <w:sz w:val="24"/>
-        </w:rPr>
-        <w:t>), serta teknologi canggih di dalam kabin.</w:t>
+        <w:t xml:space="preserve"> selalu memenuhi janji layanannya (</w:t>
+      </w:r>
+      <w:r>
+        <w:rPr>
+          <w:rFonts w:ascii="Times New Roman" w:hAnsi="Times New Roman" w:cs="Times New Roman"/>
+          <w:i/>
+          <w:sz w:val="24"/>
+        </w:rPr>
+        <w:t>brand reliability</w:t>
+      </w:r>
+      <w:r>
+        <w:rPr>
+          <w:rFonts w:ascii="Times New Roman" w:hAnsi="Times New Roman" w:cs="Times New Roman"/>
+          <w:sz w:val="24"/>
+        </w:rPr>
+        <w:t>).</w:t>
+      </w:r>
+    </w:p>
+    <w:p>
+      <w:pPr>
+        <w:keepNext/>
+        <w:spacing w:after="80" w:line="360" w:lineRule="auto"/>
+        <w:ind w:firstLine="425"/>
+        <w:jc w:val="both"/>
+        <w:rPr>
+          <w:rFonts w:ascii="Times New Roman" w:hAnsi="Times New Roman" w:cs="Times New Roman"/>
+          <w:sz w:val="24"/>
+        </w:rPr>
+      </w:pPr>
+      <w:r>
+        <w:rPr>
+          <w:rFonts w:ascii="Times New Roman" w:hAnsi="Times New Roman" w:cs="Times New Roman"/>
+          <w:sz w:val="24"/>
+        </w:rPr>
+        <w:t xml:space="preserve">2. Keyakinan bahwa tarif taksi </w:t>
+      </w:r>
+      <w:r>
+        <w:rPr>
+          <w:rFonts w:ascii="Times New Roman" w:hAnsi="Times New Roman" w:cs="Times New Roman"/>
+          <w:i/>
+          <w:sz w:val="24"/>
+        </w:rPr>
+        <w:t>Green SM</w:t>
+      </w:r>
+      <w:r>
+        <w:rPr>
+          <w:rFonts w:ascii="Times New Roman" w:hAnsi="Times New Roman" w:cs="Times New Roman"/>
+          <w:sz w:val="24"/>
+        </w:rPr>
+        <w:t xml:space="preserve"> transparan, jujur, dan tidak merugikan konsumen (</w:t>
+      </w:r>
+      <w:r>
+        <w:rPr>
+          <w:rFonts w:ascii="Times New Roman" w:hAnsi="Times New Roman" w:cs="Times New Roman"/>
+          <w:i/>
+          <w:sz w:val="24"/>
+        </w:rPr>
+        <w:t>financial integrity</w:t>
+      </w:r>
+      <w:r>
+        <w:rPr>
+          <w:rFonts w:ascii="Times New Roman" w:hAnsi="Times New Roman" w:cs="Times New Roman"/>
+          <w:sz w:val="24"/>
+        </w:rPr>
+        <w:t>).</w:t>
+      </w:r>
+    </w:p>
+    <w:p>
+      <w:pPr>
+        <w:keepNext/>
+        <w:spacing w:after="80" w:line="360" w:lineRule="auto"/>
+        <w:ind w:firstLine="425"/>
+        <w:jc w:val="both"/>
+        <w:rPr>
+          <w:rFonts w:ascii="Times New Roman" w:hAnsi="Times New Roman" w:cs="Times New Roman"/>
+          <w:sz w:val="24"/>
+        </w:rPr>
+      </w:pPr>
+      <w:r>
+        <w:rPr>
+          <w:rFonts w:ascii="Times New Roman" w:hAnsi="Times New Roman" w:cs="Times New Roman"/>
+          <w:sz w:val="24"/>
+        </w:rPr>
+        <w:t xml:space="preserve">3. Keyakinan atas kompetensi dan profesionalisme pengemudi </w:t>
+      </w:r>
+      <w:r>
+        <w:rPr>
+          <w:rFonts w:ascii="Times New Roman" w:hAnsi="Times New Roman" w:cs="Times New Roman"/>
+          <w:i/>
+          <w:sz w:val="24"/>
+        </w:rPr>
+        <w:t>Green SM</w:t>
+      </w:r>
+      <w:r>
+        <w:rPr>
+          <w:rFonts w:ascii="Times New Roman" w:hAnsi="Times New Roman" w:cs="Times New Roman"/>
+          <w:sz w:val="24"/>
+        </w:rPr>
+        <w:t xml:space="preserve"> dalam melayani perjalanan (</w:t>
+      </w:r>
+      <w:r>
+        <w:rPr>
+          <w:rFonts w:ascii="Times New Roman" w:hAnsi="Times New Roman" w:cs="Times New Roman"/>
+          <w:i/>
+          <w:sz w:val="24"/>
+        </w:rPr>
+        <w:t>driver competence</w:t>
+      </w:r>
+      <w:r>
+        <w:rPr>
+          <w:rFonts w:ascii="Times New Roman" w:hAnsi="Times New Roman" w:cs="Times New Roman"/>
+          <w:sz w:val="24"/>
+        </w:rPr>
+        <w:t>).</w:t>
+      </w:r>
+    </w:p>
+    <w:p>
+      <w:pPr>
+        <w:keepNext/>
+        <w:spacing w:after="80" w:line="360" w:lineRule="auto"/>
+        <w:ind w:firstLine="425"/>
+        <w:jc w:val="both"/>
+        <w:rPr>
+          <w:rFonts w:ascii="Times New Roman" w:hAnsi="Times New Roman" w:cs="Times New Roman"/>
+          <w:sz w:val="24"/>
+        </w:rPr>
+      </w:pPr>
+      <w:r>
+        <w:rPr>
+          <w:rFonts w:ascii="Times New Roman" w:hAnsi="Times New Roman" w:cs="Times New Roman"/>
+          <w:sz w:val="24"/>
+        </w:rPr>
+        <w:t xml:space="preserve">4. Rasa percaya bahwa </w:t>
+      </w:r>
+      <w:r>
+        <w:rPr>
+          <w:rFonts w:ascii="Times New Roman" w:hAnsi="Times New Roman" w:cs="Times New Roman"/>
+          <w:i/>
+          <w:sz w:val="24"/>
+        </w:rPr>
+        <w:t>Green SM</w:t>
+      </w:r>
+      <w:r>
+        <w:rPr>
+          <w:rFonts w:ascii="Times New Roman" w:hAnsi="Times New Roman" w:cs="Times New Roman"/>
+          <w:sz w:val="24"/>
+        </w:rPr>
+        <w:t xml:space="preserve"> peduli terhadap kenyamanan dan kesejahteraan penumpangnya (</w:t>
+      </w:r>
+      <w:r>
+        <w:rPr>
+          <w:rFonts w:ascii="Times New Roman" w:hAnsi="Times New Roman" w:cs="Times New Roman"/>
+          <w:i/>
+          <w:sz w:val="24"/>
+        </w:rPr>
+        <w:t>brand benevolence</w:t>
+      </w:r>
+      <w:r>
+        <w:rPr>
+          <w:rFonts w:ascii="Times New Roman" w:hAnsi="Times New Roman" w:cs="Times New Roman"/>
+          <w:sz w:val="24"/>
+        </w:rPr>
+        <w:t>).</w:t>
       </w:r>
     </w:p>
     <w:p>
@@ -5575,7 +5876,7 @@
           <w:b/>
           <w:sz w:val="24"/>
         </w:rPr>
-        <w:t>2.1.4 Kepercayaan Merek (</w:t>
+        <w:t>2.1.4 Persepsi Keamanan dan Keselamatan (</w:t>
       </w:r>
       <w:r>
         <w:rPr>
@@ -5584,7 +5885,7 @@
           <w:i/>
           <w:sz w:val="24"/>
         </w:rPr>
-        <w:t>Brand Trust</w:t>
+        <w:t>Perceived Safety</w:t>
       </w:r>
       <w:r>
         <w:rPr>
@@ -5611,22 +5912,22 @@
           <w:rFonts w:ascii="Times New Roman" w:hAnsi="Times New Roman" w:cs="Times New Roman"/>
           <w:sz w:val="24"/>
         </w:rPr>
-        <w:t xml:space="preserve">Kotler, Keller, dan Chernev (2022) serta Adha dan Suhardi (2025) mendefinisikan </w:t>
-      </w:r>
-      <w:r>
-        <w:rPr>
-          <w:rFonts w:ascii="Times New Roman" w:hAnsi="Times New Roman" w:cs="Times New Roman"/>
-          <w:i/>
-          <w:sz w:val="24"/>
-        </w:rPr>
-        <w:t>Brand Trust</w:t>
-      </w:r>
-      <w:r>
-        <w:rPr>
-          <w:rFonts w:ascii="Times New Roman" w:hAnsi="Times New Roman" w:cs="Times New Roman"/>
-          <w:sz w:val="24"/>
-        </w:rPr>
-        <w:t xml:space="preserve"> sebagai kesediaan konsumen untuk mempercayai dan mengandalkan kemampuan suatu merek dalam menjalankan fungsi yang telah dinyatakannya secara konsisten (willingness to rely on the ability of the brand to perform its stated function). Kepercayaan merupakan variabel relasional yang sangat berharga dalam konteks industri jasa transportasi, di mana konsumen menyerahkan keselamatan fisik dan ketepatan waktu perjalanannya kepada operator penyedia jasa.</w:t>
+        <w:t>Dalam industri transportasi penumpang, keselamatan merupakan kebutuhan paling mendasar (</w:t>
+      </w:r>
+      <w:r>
+        <w:rPr>
+          <w:rFonts w:ascii="Times New Roman" w:hAnsi="Times New Roman" w:cs="Times New Roman"/>
+          <w:i/>
+          <w:sz w:val="24"/>
+        </w:rPr>
+        <w:t>core benefit</w:t>
+      </w:r>
+      <w:r>
+        <w:rPr>
+          <w:rFonts w:ascii="Times New Roman" w:hAnsi="Times New Roman" w:cs="Times New Roman"/>
+          <w:sz w:val="24"/>
+        </w:rPr>
+        <w:t>) yang tidak dapat dikompromikan. Zeithaml, Bitner, dan Gremler (2023) serta Tjiptono (2022) menempatkan dimensi keamanan (security) sebagai komponen vital dalam evaluasi mutu jasa, yang mencakup kebebasan dari bahaya, risiko fisik, atau keraguan (freedom from danger, risk, or doubt).</w:t>
       </w:r>
     </w:p>
     <w:p>
@@ -5645,7 +5946,56 @@
           <w:rFonts w:ascii="Times New Roman" w:hAnsi="Times New Roman" w:cs="Times New Roman"/>
           <w:sz w:val="24"/>
         </w:rPr>
-        <w:t xml:space="preserve">Dalam literatur pemasaran relasional mutakhir (Kotler </w:t>
+        <w:t xml:space="preserve">Dalam konteks transportasi darat modern, </w:t>
+      </w:r>
+      <w:r>
+        <w:rPr>
+          <w:rFonts w:ascii="Times New Roman" w:hAnsi="Times New Roman" w:cs="Times New Roman"/>
+          <w:i/>
+          <w:sz w:val="24"/>
+        </w:rPr>
+        <w:t>Perceived Safety</w:t>
+      </w:r>
+      <w:r>
+        <w:rPr>
+          <w:rFonts w:ascii="Times New Roman" w:hAnsi="Times New Roman" w:cs="Times New Roman"/>
+          <w:sz w:val="24"/>
+        </w:rPr>
+        <w:t xml:space="preserve"> didefinisikan sebagai penilaian subjektif penumpang mengenai sejauh mana perjalanan bersama suatu moda transportasi terlindungi dari ancaman fisik, kecelakaan lalu lintas, tindak kriminalitas, serta kegagalan teknis armada (Wijaya &amp; Pahar, 2022; Adha &amp; Suhardi, 2025). Khusus untuk armada taksi listrik murni (</w:t>
+      </w:r>
+      <w:r>
+        <w:rPr>
+          <w:rFonts w:ascii="Times New Roman" w:hAnsi="Times New Roman" w:cs="Times New Roman"/>
+          <w:i/>
+          <w:sz w:val="24"/>
+        </w:rPr>
+        <w:t>pure electric vehicle</w:t>
+      </w:r>
+      <w:r>
+        <w:rPr>
+          <w:rFonts w:ascii="Times New Roman" w:hAnsi="Times New Roman" w:cs="Times New Roman"/>
+          <w:sz w:val="24"/>
+        </w:rPr>
+        <w:t xml:space="preserve"> / EV), persepsi keselamatan penumpang memiliki karakteristik unik yang mencakup evaluasi terhadap keandalan teknologi baterai dan sistem keselamatan elektrik kendaraan.</w:t>
+      </w:r>
+    </w:p>
+    <w:p>
+      <w:pPr>
+        <w:keepNext/>
+        <w:spacing w:after="120" w:line="360" w:lineRule="auto"/>
+        <w:ind w:firstLine="709"/>
+        <w:jc w:val="both"/>
+        <w:rPr>
+          <w:rFonts w:ascii="Times New Roman" w:hAnsi="Times New Roman" w:cs="Times New Roman"/>
+          <w:sz w:val="24"/>
+        </w:rPr>
+      </w:pPr>
+      <w:r>
+        <w:rPr>
+          <w:rFonts w:ascii="Times New Roman" w:hAnsi="Times New Roman" w:cs="Times New Roman"/>
+          <w:sz w:val="24"/>
+        </w:rPr>
+        <w:t xml:space="preserve">Berdasarkan kerangka Zeithaml </w:t>
       </w:r>
       <w:r>
         <w:rPr>
@@ -5660,22 +6010,22 @@
           <w:rFonts w:ascii="Times New Roman" w:hAnsi="Times New Roman" w:cs="Times New Roman"/>
           <w:sz w:val="24"/>
         </w:rPr>
-        <w:t xml:space="preserve">, 2022; Hera &amp; Fourqoniah, 2023; Fadila &amp; Wahyuni, 2025), konstruk </w:t>
-      </w:r>
-      <w:r>
-        <w:rPr>
-          <w:rFonts w:ascii="Times New Roman" w:hAnsi="Times New Roman" w:cs="Times New Roman"/>
-          <w:i/>
-          <w:sz w:val="24"/>
-        </w:rPr>
-        <w:t>brand trust</w:t>
-      </w:r>
-      <w:r>
-        <w:rPr>
-          <w:rFonts w:ascii="Times New Roman" w:hAnsi="Times New Roman" w:cs="Times New Roman"/>
-          <w:sz w:val="24"/>
-        </w:rPr>
-        <w:t xml:space="preserve"> dibangun melalui dua dimensi utama:</w:t>
+        <w:t xml:space="preserve"> (2023), Tjiptono (2022), Wijaya dan Pahar (2022), serta Adha dan Suhardi (2025), dimensi dan indikator </w:t>
+      </w:r>
+      <w:r>
+        <w:rPr>
+          <w:rFonts w:ascii="Times New Roman" w:hAnsi="Times New Roman" w:cs="Times New Roman"/>
+          <w:i/>
+          <w:sz w:val="24"/>
+        </w:rPr>
+        <w:t>Perceived Safety</w:t>
+      </w:r>
+      <w:r>
+        <w:rPr>
+          <w:rFonts w:ascii="Times New Roman" w:hAnsi="Times New Roman" w:cs="Times New Roman"/>
+          <w:sz w:val="24"/>
+        </w:rPr>
+        <w:t xml:space="preserve"> dalam penelitian ini mencakup:</w:t>
       </w:r>
     </w:p>
     <w:p>
@@ -5694,22 +6044,22 @@
           <w:rFonts w:ascii="Times New Roman" w:hAnsi="Times New Roman" w:cs="Times New Roman"/>
           <w:sz w:val="24"/>
         </w:rPr>
-        <w:t>1. Keandalan Merek (</w:t>
-      </w:r>
-      <w:r>
-        <w:rPr>
-          <w:rFonts w:ascii="Times New Roman" w:hAnsi="Times New Roman" w:cs="Times New Roman"/>
-          <w:i/>
-          <w:sz w:val="24"/>
-        </w:rPr>
-        <w:t>Brand Reliability</w:t>
-      </w:r>
-      <w:r>
-        <w:rPr>
-          <w:rFonts w:ascii="Times New Roman" w:hAnsi="Times New Roman" w:cs="Times New Roman"/>
-          <w:sz w:val="24"/>
-        </w:rPr>
-        <w:t xml:space="preserve">): Keyakinan kognitif konsumen bahwa merek mampu dan kompeten dalam memenuhi janji layanannya secara konsisten. Dalam konteks taksi </w:t>
+        <w:t xml:space="preserve">1. Keselamatan Berkendara (Driving &amp; </w:t>
+      </w:r>
+      <w:r>
+        <w:rPr>
+          <w:rFonts w:ascii="Times New Roman" w:hAnsi="Times New Roman" w:cs="Times New Roman"/>
+          <w:i/>
+          <w:sz w:val="24"/>
+        </w:rPr>
+        <w:t>Physical Safety</w:t>
+      </w:r>
+      <w:r>
+        <w:rPr>
+          <w:rFonts w:ascii="Times New Roman" w:hAnsi="Times New Roman" w:cs="Times New Roman"/>
+          <w:sz w:val="24"/>
+        </w:rPr>
+        <w:t xml:space="preserve">): Persepsi penumpang bahwa pengemudi </w:t>
       </w:r>
       <w:r>
         <w:rPr>
@@ -5724,7 +6074,7 @@
           <w:rFonts w:ascii="Times New Roman" w:hAnsi="Times New Roman" w:cs="Times New Roman"/>
           <w:sz w:val="24"/>
         </w:rPr>
-        <w:t>, keandalan ini tecermin dari ketepatan waktu penjemputan armada, ketersediaan unit di sekitar wilayah Jakarta Barat, stabilitas aplikasi pemesanan digital, dan kepastian argo tarif yang adil dan transparan.</w:t>
+        <w:t xml:space="preserve"> mengemudikan kendaraan secara tertib, mematuhi batas kecepatan dan rambu lalu lintas, serta tidak ugal-ugalan di jalanan Jakarta Barat.</w:t>
       </w:r>
     </w:p>
     <w:p>
@@ -5743,22 +6093,22 @@
           <w:rFonts w:ascii="Times New Roman" w:hAnsi="Times New Roman" w:cs="Times New Roman"/>
           <w:sz w:val="24"/>
         </w:rPr>
-        <w:t>2. Itikad Baik / Integritas Merek (</w:t>
-      </w:r>
-      <w:r>
-        <w:rPr>
-          <w:rFonts w:ascii="Times New Roman" w:hAnsi="Times New Roman" w:cs="Times New Roman"/>
-          <w:i/>
-          <w:sz w:val="24"/>
-        </w:rPr>
-        <w:t>Brand Intentions</w:t>
-      </w:r>
-      <w:r>
-        <w:rPr>
-          <w:rFonts w:ascii="Times New Roman" w:hAnsi="Times New Roman" w:cs="Times New Roman"/>
-          <w:sz w:val="24"/>
-        </w:rPr>
-        <w:t xml:space="preserve"> / Benevolence): Keyakinan emosional konsumen bahwa perusahaan memiliki itikad baik untuk mengutamakan kepentingan, kenyamanan, dan keselamatan konsumen di atas sekadar mengejar profitabilitas jangka pendek. Hal ini diwujudkan dalam keramahan dan kejujuran mitra pengemudi </w:t>
+        <w:t>2. Keamanan Pribadi (</w:t>
+      </w:r>
+      <w:r>
+        <w:rPr>
+          <w:rFonts w:ascii="Times New Roman" w:hAnsi="Times New Roman" w:cs="Times New Roman"/>
+          <w:i/>
+          <w:sz w:val="24"/>
+        </w:rPr>
+        <w:t>Personal Security</w:t>
+      </w:r>
+      <w:r>
+        <w:rPr>
+          <w:rFonts w:ascii="Times New Roman" w:hAnsi="Times New Roman" w:cs="Times New Roman"/>
+          <w:sz w:val="24"/>
+        </w:rPr>
+        <w:t xml:space="preserve">): Persepsi penumpang bahwa mereka merasa aman dari risiko pelecehan, pencurian, atau tindak kriminalitas selama berada di dalam kabin taksi </w:t>
       </w:r>
       <w:r>
         <w:rPr>
@@ -5773,71 +6123,7 @@
           <w:rFonts w:ascii="Times New Roman" w:hAnsi="Times New Roman" w:cs="Times New Roman"/>
           <w:sz w:val="24"/>
         </w:rPr>
-        <w:t>, respon cepat layanan pelanggan (</w:t>
-      </w:r>
-      <w:r>
-        <w:rPr>
-          <w:rFonts w:ascii="Times New Roman" w:hAnsi="Times New Roman" w:cs="Times New Roman"/>
-          <w:i/>
-          <w:sz w:val="24"/>
-        </w:rPr>
-        <w:t>customer care</w:t>
-      </w:r>
-      <w:r>
-        <w:rPr>
-          <w:rFonts w:ascii="Times New Roman" w:hAnsi="Times New Roman" w:cs="Times New Roman"/>
-          <w:sz w:val="24"/>
-        </w:rPr>
-        <w:t>), serta jaminan ganti rugi apabila terjadi kendala operasional.</w:t>
-      </w:r>
-    </w:p>
-    <w:p>
-      <w:pPr>
-        <w:keepNext/>
-        <w:spacing w:after="120" w:line="360" w:lineRule="auto"/>
-        <w:ind w:firstLine="709"/>
-        <w:jc w:val="both"/>
-        <w:rPr>
-          <w:rFonts w:ascii="Times New Roman" w:hAnsi="Times New Roman" w:cs="Times New Roman"/>
-          <w:sz w:val="24"/>
-        </w:rPr>
-      </w:pPr>
-      <w:r>
-        <w:rPr>
-          <w:rFonts w:ascii="Times New Roman" w:hAnsi="Times New Roman" w:cs="Times New Roman"/>
-          <w:sz w:val="24"/>
-        </w:rPr>
-        <w:t xml:space="preserve">Dimensi dan indikator baku </w:t>
-      </w:r>
-      <w:r>
-        <w:rPr>
-          <w:rFonts w:ascii="Times New Roman" w:hAnsi="Times New Roman" w:cs="Times New Roman"/>
-          <w:i/>
-          <w:sz w:val="24"/>
-        </w:rPr>
-        <w:t>Brand Trust</w:t>
-      </w:r>
-      <w:r>
-        <w:rPr>
-          <w:rFonts w:ascii="Times New Roman" w:hAnsi="Times New Roman" w:cs="Times New Roman"/>
-          <w:sz w:val="24"/>
-        </w:rPr>
-        <w:t xml:space="preserve"> dalam penelitian ini diadaptasi dari Kotler </w:t>
-      </w:r>
-      <w:r>
-        <w:rPr>
-          <w:rFonts w:ascii="Times New Roman" w:hAnsi="Times New Roman" w:cs="Times New Roman"/>
-          <w:i/>
-          <w:sz w:val="24"/>
-        </w:rPr>
-        <w:t>et al.</w:t>
-      </w:r>
-      <w:r>
-        <w:rPr>
-          <w:rFonts w:ascii="Times New Roman" w:hAnsi="Times New Roman" w:cs="Times New Roman"/>
-          <w:sz w:val="24"/>
-        </w:rPr>
-        <w:t xml:space="preserve"> (2022), Hera dan Fourqoniah (2023), serta Adha dan Suhardi (2025):</w:t>
+        <w:t>, didukung oleh identitas pengemudi yang terverifikasi resmi dan fitur pelacak rute GPS pada aplikasi.</w:t>
       </w:r>
     </w:p>
     <w:p>
@@ -5856,7 +6142,37 @@
           <w:rFonts w:ascii="Times New Roman" w:hAnsi="Times New Roman" w:cs="Times New Roman"/>
           <w:sz w:val="24"/>
         </w:rPr>
-        <w:t xml:space="preserve">1. Keyakinan bahwa taksi </w:t>
+        <w:t>3. Keandalan Teknis Armada Listrik (</w:t>
+      </w:r>
+      <w:r>
+        <w:rPr>
+          <w:rFonts w:ascii="Times New Roman" w:hAnsi="Times New Roman" w:cs="Times New Roman"/>
+          <w:i/>
+          <w:sz w:val="24"/>
+        </w:rPr>
+        <w:t>Vehicle Technical Safety</w:t>
+      </w:r>
+      <w:r>
+        <w:rPr>
+          <w:rFonts w:ascii="Times New Roman" w:hAnsi="Times New Roman" w:cs="Times New Roman"/>
+          <w:sz w:val="24"/>
+        </w:rPr>
+        <w:t xml:space="preserve">): Keyakinan penumpang terhadap kelayakan fisik dan teknis mobil listrik </w:t>
+      </w:r>
+      <w:r>
+        <w:rPr>
+          <w:rFonts w:ascii="Times New Roman" w:hAnsi="Times New Roman" w:cs="Times New Roman"/>
+          <w:i/>
+          <w:sz w:val="24"/>
+        </w:rPr>
+        <w:t>VinFast VF 5</w:t>
+      </w:r>
+      <w:r>
+        <w:rPr>
+          <w:rFonts w:ascii="Times New Roman" w:hAnsi="Times New Roman" w:cs="Times New Roman"/>
+          <w:sz w:val="24"/>
+        </w:rPr>
+        <w:t xml:space="preserve"> yang digunakan </w:t>
       </w:r>
       <w:r>
         <w:rPr>
@@ -5871,169 +6187,22 @@
           <w:rFonts w:ascii="Times New Roman" w:hAnsi="Times New Roman" w:cs="Times New Roman"/>
           <w:sz w:val="24"/>
         </w:rPr>
-        <w:t xml:space="preserve"> selalu memenuhi janji layanannya (</w:t>
-      </w:r>
-      <w:r>
-        <w:rPr>
-          <w:rFonts w:ascii="Times New Roman" w:hAnsi="Times New Roman" w:cs="Times New Roman"/>
-          <w:i/>
-          <w:sz w:val="24"/>
-        </w:rPr>
-        <w:t>brand reliability</w:t>
-      </w:r>
-      <w:r>
-        <w:rPr>
-          <w:rFonts w:ascii="Times New Roman" w:hAnsi="Times New Roman" w:cs="Times New Roman"/>
-          <w:sz w:val="24"/>
-        </w:rPr>
-        <w:t>).</w:t>
-      </w:r>
-    </w:p>
-    <w:p>
-      <w:pPr>
-        <w:keepNext/>
-        <w:spacing w:after="80" w:line="360" w:lineRule="auto"/>
-        <w:ind w:firstLine="425"/>
-        <w:jc w:val="both"/>
-        <w:rPr>
-          <w:rFonts w:ascii="Times New Roman" w:hAnsi="Times New Roman" w:cs="Times New Roman"/>
-          <w:sz w:val="24"/>
-        </w:rPr>
-      </w:pPr>
-      <w:r>
-        <w:rPr>
-          <w:rFonts w:ascii="Times New Roman" w:hAnsi="Times New Roman" w:cs="Times New Roman"/>
-          <w:sz w:val="24"/>
-        </w:rPr>
-        <w:t xml:space="preserve">2. Keyakinan bahwa tarif taksi </w:t>
-      </w:r>
-      <w:r>
-        <w:rPr>
-          <w:rFonts w:ascii="Times New Roman" w:hAnsi="Times New Roman" w:cs="Times New Roman"/>
-          <w:i/>
-          <w:sz w:val="24"/>
-        </w:rPr>
-        <w:t>Green SM</w:t>
-      </w:r>
-      <w:r>
-        <w:rPr>
-          <w:rFonts w:ascii="Times New Roman" w:hAnsi="Times New Roman" w:cs="Times New Roman"/>
-          <w:sz w:val="24"/>
-        </w:rPr>
-        <w:t xml:space="preserve"> transparan, jujur, dan tidak merugikan konsumen (</w:t>
-      </w:r>
-      <w:r>
-        <w:rPr>
-          <w:rFonts w:ascii="Times New Roman" w:hAnsi="Times New Roman" w:cs="Times New Roman"/>
-          <w:i/>
-          <w:sz w:val="24"/>
-        </w:rPr>
-        <w:t>financial integrity</w:t>
-      </w:r>
-      <w:r>
-        <w:rPr>
-          <w:rFonts w:ascii="Times New Roman" w:hAnsi="Times New Roman" w:cs="Times New Roman"/>
-          <w:sz w:val="24"/>
-        </w:rPr>
-        <w:t>).</w:t>
-      </w:r>
-    </w:p>
-    <w:p>
-      <w:pPr>
-        <w:keepNext/>
-        <w:spacing w:after="80" w:line="360" w:lineRule="auto"/>
-        <w:ind w:firstLine="425"/>
-        <w:jc w:val="both"/>
-        <w:rPr>
-          <w:rFonts w:ascii="Times New Roman" w:hAnsi="Times New Roman" w:cs="Times New Roman"/>
-          <w:sz w:val="24"/>
-        </w:rPr>
-      </w:pPr>
-      <w:r>
-        <w:rPr>
-          <w:rFonts w:ascii="Times New Roman" w:hAnsi="Times New Roman" w:cs="Times New Roman"/>
-          <w:sz w:val="24"/>
-        </w:rPr>
-        <w:t xml:space="preserve">3. Keyakinan atas kompetensi dan profesionalisme pengemudi </w:t>
-      </w:r>
-      <w:r>
-        <w:rPr>
-          <w:rFonts w:ascii="Times New Roman" w:hAnsi="Times New Roman" w:cs="Times New Roman"/>
-          <w:i/>
-          <w:sz w:val="24"/>
-        </w:rPr>
-        <w:t>Green SM</w:t>
-      </w:r>
-      <w:r>
-        <w:rPr>
-          <w:rFonts w:ascii="Times New Roman" w:hAnsi="Times New Roman" w:cs="Times New Roman"/>
-          <w:sz w:val="24"/>
-        </w:rPr>
-        <w:t xml:space="preserve"> dalam melayani perjalanan (</w:t>
-      </w:r>
-      <w:r>
-        <w:rPr>
-          <w:rFonts w:ascii="Times New Roman" w:hAnsi="Times New Roman" w:cs="Times New Roman"/>
-          <w:i/>
-          <w:sz w:val="24"/>
-        </w:rPr>
-        <w:t>driver competence</w:t>
-      </w:r>
-      <w:r>
-        <w:rPr>
-          <w:rFonts w:ascii="Times New Roman" w:hAnsi="Times New Roman" w:cs="Times New Roman"/>
-          <w:sz w:val="24"/>
-        </w:rPr>
-        <w:t>).</w:t>
-      </w:r>
-    </w:p>
-    <w:p>
-      <w:pPr>
-        <w:keepNext/>
-        <w:spacing w:after="80" w:line="360" w:lineRule="auto"/>
-        <w:ind w:firstLine="425"/>
-        <w:jc w:val="both"/>
-        <w:rPr>
-          <w:rFonts w:ascii="Times New Roman" w:hAnsi="Times New Roman" w:cs="Times New Roman"/>
-          <w:sz w:val="24"/>
-        </w:rPr>
-      </w:pPr>
-      <w:r>
-        <w:rPr>
-          <w:rFonts w:ascii="Times New Roman" w:hAnsi="Times New Roman" w:cs="Times New Roman"/>
-          <w:sz w:val="24"/>
-        </w:rPr>
-        <w:t xml:space="preserve">4. Rasa percaya bahwa </w:t>
-      </w:r>
-      <w:r>
-        <w:rPr>
-          <w:rFonts w:ascii="Times New Roman" w:hAnsi="Times New Roman" w:cs="Times New Roman"/>
-          <w:i/>
-          <w:sz w:val="24"/>
-        </w:rPr>
-        <w:t>Green SM</w:t>
-      </w:r>
-      <w:r>
-        <w:rPr>
-          <w:rFonts w:ascii="Times New Roman" w:hAnsi="Times New Roman" w:cs="Times New Roman"/>
-          <w:sz w:val="24"/>
-        </w:rPr>
-        <w:t xml:space="preserve"> peduli terhadap kenyamanan dan kesejahteraan penumpangnya (</w:t>
-      </w:r>
-      <w:r>
-        <w:rPr>
-          <w:rFonts w:ascii="Times New Roman" w:hAnsi="Times New Roman" w:cs="Times New Roman"/>
-          <w:i/>
-          <w:sz w:val="24"/>
-        </w:rPr>
-        <w:t>brand benevolence</w:t>
-      </w:r>
-      <w:r>
-        <w:rPr>
-          <w:rFonts w:ascii="Times New Roman" w:hAnsi="Times New Roman" w:cs="Times New Roman"/>
-          <w:sz w:val="24"/>
-        </w:rPr>
-        <w:t>).</w:t>
+        <w:t>, termasuk keandalan pengereman (</w:t>
+      </w:r>
+      <w:r>
+        <w:rPr>
+          <w:rFonts w:ascii="Times New Roman" w:hAnsi="Times New Roman" w:cs="Times New Roman"/>
+          <w:i/>
+          <w:sz w:val="24"/>
+        </w:rPr>
+        <w:t>regenerative braking</w:t>
+      </w:r>
+      <w:r>
+        <w:rPr>
+          <w:rFonts w:ascii="Times New Roman" w:hAnsi="Times New Roman" w:cs="Times New Roman"/>
+          <w:sz w:val="24"/>
+        </w:rPr>
+        <w:t>), sistem suspensi, serta keamanan baterai listrik dari risiko korsleting atau kebakaran, terutama saat melintasi jalanan basah atau cuaca hujan di Jakarta Barat.</w:t>
       </w:r>
     </w:p>
     <w:p>
@@ -6052,352 +6221,7 @@
           <w:b/>
           <w:sz w:val="24"/>
         </w:rPr>
-        <w:t>2.1.5 Persepsi Keamanan dan Keselamatan (</w:t>
-      </w:r>
-      <w:r>
-        <w:rPr>
-          <w:rFonts w:ascii="Times New Roman" w:hAnsi="Times New Roman" w:cs="Times New Roman"/>
-          <w:b/>
-          <w:i/>
-          <w:sz w:val="24"/>
-        </w:rPr>
-        <w:t>Perceived Safety</w:t>
-      </w:r>
-      <w:r>
-        <w:rPr>
-          <w:rFonts w:ascii="Times New Roman" w:hAnsi="Times New Roman" w:cs="Times New Roman"/>
-          <w:b/>
-          <w:sz w:val="24"/>
-        </w:rPr>
-        <w:t>)</w:t>
-      </w:r>
-    </w:p>
-    <w:p>
-      <w:pPr>
-        <w:keepNext/>
-        <w:spacing w:after="120" w:line="360" w:lineRule="auto"/>
-        <w:ind w:firstLine="709"/>
-        <w:jc w:val="both"/>
-        <w:rPr>
-          <w:rFonts w:ascii="Times New Roman" w:hAnsi="Times New Roman" w:cs="Times New Roman"/>
-          <w:sz w:val="24"/>
-        </w:rPr>
-      </w:pPr>
-      <w:r>
-        <w:rPr>
-          <w:rFonts w:ascii="Times New Roman" w:hAnsi="Times New Roman" w:cs="Times New Roman"/>
-          <w:sz w:val="24"/>
-        </w:rPr>
-        <w:t>Dalam industri transportasi penumpang, keselamatan merupakan kebutuhan paling mendasar (</w:t>
-      </w:r>
-      <w:r>
-        <w:rPr>
-          <w:rFonts w:ascii="Times New Roman" w:hAnsi="Times New Roman" w:cs="Times New Roman"/>
-          <w:i/>
-          <w:sz w:val="24"/>
-        </w:rPr>
-        <w:t>core benefit</w:t>
-      </w:r>
-      <w:r>
-        <w:rPr>
-          <w:rFonts w:ascii="Times New Roman" w:hAnsi="Times New Roman" w:cs="Times New Roman"/>
-          <w:sz w:val="24"/>
-        </w:rPr>
-        <w:t>) yang tidak dapat dikompromikan. Zeithaml, Bitner, dan Gremler (2023) serta Tjiptono (2022) menempatkan dimensi keamanan (security) sebagai komponen vital dalam evaluasi mutu jasa, yang mencakup kebebasan dari bahaya, risiko fisik, atau keraguan (freedom from danger, risk, or doubt).</w:t>
-      </w:r>
-    </w:p>
-    <w:p>
-      <w:pPr>
-        <w:keepNext/>
-        <w:spacing w:after="120" w:line="360" w:lineRule="auto"/>
-        <w:ind w:firstLine="709"/>
-        <w:jc w:val="both"/>
-        <w:rPr>
-          <w:rFonts w:ascii="Times New Roman" w:hAnsi="Times New Roman" w:cs="Times New Roman"/>
-          <w:sz w:val="24"/>
-        </w:rPr>
-      </w:pPr>
-      <w:r>
-        <w:rPr>
-          <w:rFonts w:ascii="Times New Roman" w:hAnsi="Times New Roman" w:cs="Times New Roman"/>
-          <w:sz w:val="24"/>
-        </w:rPr>
-        <w:t xml:space="preserve">Dalam konteks transportasi darat modern, </w:t>
-      </w:r>
-      <w:r>
-        <w:rPr>
-          <w:rFonts w:ascii="Times New Roman" w:hAnsi="Times New Roman" w:cs="Times New Roman"/>
-          <w:i/>
-          <w:sz w:val="24"/>
-        </w:rPr>
-        <w:t>Perceived Safety</w:t>
-      </w:r>
-      <w:r>
-        <w:rPr>
-          <w:rFonts w:ascii="Times New Roman" w:hAnsi="Times New Roman" w:cs="Times New Roman"/>
-          <w:sz w:val="24"/>
-        </w:rPr>
-        <w:t xml:space="preserve"> didefinisikan sebagai penilaian subjektif penumpang mengenai sejauh mana perjalanan bersama suatu moda transportasi terlindungi dari ancaman fisik, kecelakaan lalu lintas, tindak kriminalitas, serta kegagalan teknis armada (Wijaya &amp; Pahar, 2022; Adha &amp; Suhardi, 2025). Khusus untuk armada taksi listrik murni (</w:t>
-      </w:r>
-      <w:r>
-        <w:rPr>
-          <w:rFonts w:ascii="Times New Roman" w:hAnsi="Times New Roman" w:cs="Times New Roman"/>
-          <w:i/>
-          <w:sz w:val="24"/>
-        </w:rPr>
-        <w:t>pure electric vehicle</w:t>
-      </w:r>
-      <w:r>
-        <w:rPr>
-          <w:rFonts w:ascii="Times New Roman" w:hAnsi="Times New Roman" w:cs="Times New Roman"/>
-          <w:sz w:val="24"/>
-        </w:rPr>
-        <w:t xml:space="preserve"> / EV), persepsi keselamatan penumpang memiliki karakteristik unik yang mencakup evaluasi terhadap keandalan teknologi baterai dan sistem keselamatan elektrik kendaraan.</w:t>
-      </w:r>
-    </w:p>
-    <w:p>
-      <w:pPr>
-        <w:keepNext/>
-        <w:spacing w:after="120" w:line="360" w:lineRule="auto"/>
-        <w:ind w:firstLine="709"/>
-        <w:jc w:val="both"/>
-        <w:rPr>
-          <w:rFonts w:ascii="Times New Roman" w:hAnsi="Times New Roman" w:cs="Times New Roman"/>
-          <w:sz w:val="24"/>
-        </w:rPr>
-      </w:pPr>
-      <w:r>
-        <w:rPr>
-          <w:rFonts w:ascii="Times New Roman" w:hAnsi="Times New Roman" w:cs="Times New Roman"/>
-          <w:sz w:val="24"/>
-        </w:rPr>
-        <w:t xml:space="preserve">Berdasarkan kerangka Zeithaml </w:t>
-      </w:r>
-      <w:r>
-        <w:rPr>
-          <w:rFonts w:ascii="Times New Roman" w:hAnsi="Times New Roman" w:cs="Times New Roman"/>
-          <w:i/>
-          <w:sz w:val="24"/>
-        </w:rPr>
-        <w:t>et al.</w:t>
-      </w:r>
-      <w:r>
-        <w:rPr>
-          <w:rFonts w:ascii="Times New Roman" w:hAnsi="Times New Roman" w:cs="Times New Roman"/>
-          <w:sz w:val="24"/>
-        </w:rPr>
-        <w:t xml:space="preserve"> (2023), Tjiptono (2022), Wijaya dan Pahar (2022), serta Adha dan Suhardi (2025), dimensi dan indikator </w:t>
-      </w:r>
-      <w:r>
-        <w:rPr>
-          <w:rFonts w:ascii="Times New Roman" w:hAnsi="Times New Roman" w:cs="Times New Roman"/>
-          <w:i/>
-          <w:sz w:val="24"/>
-        </w:rPr>
-        <w:t>Perceived Safety</w:t>
-      </w:r>
-      <w:r>
-        <w:rPr>
-          <w:rFonts w:ascii="Times New Roman" w:hAnsi="Times New Roman" w:cs="Times New Roman"/>
-          <w:sz w:val="24"/>
-        </w:rPr>
-        <w:t xml:space="preserve"> dalam penelitian ini mencakup:</w:t>
-      </w:r>
-    </w:p>
-    <w:p>
-      <w:pPr>
-        <w:keepNext/>
-        <w:spacing w:after="80" w:line="360" w:lineRule="auto"/>
-        <w:ind w:firstLine="425"/>
-        <w:jc w:val="both"/>
-        <w:rPr>
-          <w:rFonts w:ascii="Times New Roman" w:hAnsi="Times New Roman" w:cs="Times New Roman"/>
-          <w:sz w:val="24"/>
-        </w:rPr>
-      </w:pPr>
-      <w:r>
-        <w:rPr>
-          <w:rFonts w:ascii="Times New Roman" w:hAnsi="Times New Roman" w:cs="Times New Roman"/>
-          <w:sz w:val="24"/>
-        </w:rPr>
-        <w:t xml:space="preserve">1. Keselamatan Berkendara (Driving &amp; </w:t>
-      </w:r>
-      <w:r>
-        <w:rPr>
-          <w:rFonts w:ascii="Times New Roman" w:hAnsi="Times New Roman" w:cs="Times New Roman"/>
-          <w:i/>
-          <w:sz w:val="24"/>
-        </w:rPr>
-        <w:t>Physical Safety</w:t>
-      </w:r>
-      <w:r>
-        <w:rPr>
-          <w:rFonts w:ascii="Times New Roman" w:hAnsi="Times New Roman" w:cs="Times New Roman"/>
-          <w:sz w:val="24"/>
-        </w:rPr>
-        <w:t xml:space="preserve">): Persepsi penumpang bahwa pengemudi </w:t>
-      </w:r>
-      <w:r>
-        <w:rPr>
-          <w:rFonts w:ascii="Times New Roman" w:hAnsi="Times New Roman" w:cs="Times New Roman"/>
-          <w:i/>
-          <w:sz w:val="24"/>
-        </w:rPr>
-        <w:t>Green SM</w:t>
-      </w:r>
-      <w:r>
-        <w:rPr>
-          <w:rFonts w:ascii="Times New Roman" w:hAnsi="Times New Roman" w:cs="Times New Roman"/>
-          <w:sz w:val="24"/>
-        </w:rPr>
-        <w:t xml:space="preserve"> mengemudikan kendaraan secara tertib, mematuhi batas kecepatan dan rambu lalu lintas, serta tidak ugal-ugalan di jalanan Jakarta Barat.</w:t>
-      </w:r>
-    </w:p>
-    <w:p>
-      <w:pPr>
-        <w:keepNext/>
-        <w:spacing w:after="80" w:line="360" w:lineRule="auto"/>
-        <w:ind w:firstLine="425"/>
-        <w:jc w:val="both"/>
-        <w:rPr>
-          <w:rFonts w:ascii="Times New Roman" w:hAnsi="Times New Roman" w:cs="Times New Roman"/>
-          <w:sz w:val="24"/>
-        </w:rPr>
-      </w:pPr>
-      <w:r>
-        <w:rPr>
-          <w:rFonts w:ascii="Times New Roman" w:hAnsi="Times New Roman" w:cs="Times New Roman"/>
-          <w:sz w:val="24"/>
-        </w:rPr>
-        <w:t>2. Keamanan Pribadi (</w:t>
-      </w:r>
-      <w:r>
-        <w:rPr>
-          <w:rFonts w:ascii="Times New Roman" w:hAnsi="Times New Roman" w:cs="Times New Roman"/>
-          <w:i/>
-          <w:sz w:val="24"/>
-        </w:rPr>
-        <w:t>Personal Security</w:t>
-      </w:r>
-      <w:r>
-        <w:rPr>
-          <w:rFonts w:ascii="Times New Roman" w:hAnsi="Times New Roman" w:cs="Times New Roman"/>
-          <w:sz w:val="24"/>
-        </w:rPr>
-        <w:t xml:space="preserve">): Persepsi penumpang bahwa mereka merasa aman dari risiko pelecehan, pencurian, atau tindak kriminalitas selama berada di dalam kabin taksi </w:t>
-      </w:r>
-      <w:r>
-        <w:rPr>
-          <w:rFonts w:ascii="Times New Roman" w:hAnsi="Times New Roman" w:cs="Times New Roman"/>
-          <w:i/>
-          <w:sz w:val="24"/>
-        </w:rPr>
-        <w:t>Green SM</w:t>
-      </w:r>
-      <w:r>
-        <w:rPr>
-          <w:rFonts w:ascii="Times New Roman" w:hAnsi="Times New Roman" w:cs="Times New Roman"/>
-          <w:sz w:val="24"/>
-        </w:rPr>
-        <w:t>, didukung oleh identitas pengemudi yang terverifikasi resmi dan fitur pelacak rute GPS pada aplikasi.</w:t>
-      </w:r>
-    </w:p>
-    <w:p>
-      <w:pPr>
-        <w:keepNext/>
-        <w:spacing w:after="80" w:line="360" w:lineRule="auto"/>
-        <w:ind w:firstLine="425"/>
-        <w:jc w:val="both"/>
-        <w:rPr>
-          <w:rFonts w:ascii="Times New Roman" w:hAnsi="Times New Roman" w:cs="Times New Roman"/>
-          <w:sz w:val="24"/>
-        </w:rPr>
-      </w:pPr>
-      <w:r>
-        <w:rPr>
-          <w:rFonts w:ascii="Times New Roman" w:hAnsi="Times New Roman" w:cs="Times New Roman"/>
-          <w:sz w:val="24"/>
-        </w:rPr>
-        <w:t>3. Keandalan Teknis Armada Listrik (</w:t>
-      </w:r>
-      <w:r>
-        <w:rPr>
-          <w:rFonts w:ascii="Times New Roman" w:hAnsi="Times New Roman" w:cs="Times New Roman"/>
-          <w:i/>
-          <w:sz w:val="24"/>
-        </w:rPr>
-        <w:t>Vehicle Technical Safety</w:t>
-      </w:r>
-      <w:r>
-        <w:rPr>
-          <w:rFonts w:ascii="Times New Roman" w:hAnsi="Times New Roman" w:cs="Times New Roman"/>
-          <w:sz w:val="24"/>
-        </w:rPr>
-        <w:t xml:space="preserve">): Keyakinan penumpang terhadap kelayakan fisik dan teknis mobil listrik </w:t>
-      </w:r>
-      <w:r>
-        <w:rPr>
-          <w:rFonts w:ascii="Times New Roman" w:hAnsi="Times New Roman" w:cs="Times New Roman"/>
-          <w:i/>
-          <w:sz w:val="24"/>
-        </w:rPr>
-        <w:t>VinFast VF 5</w:t>
-      </w:r>
-      <w:r>
-        <w:rPr>
-          <w:rFonts w:ascii="Times New Roman" w:hAnsi="Times New Roman" w:cs="Times New Roman"/>
-          <w:sz w:val="24"/>
-        </w:rPr>
-        <w:t xml:space="preserve"> yang digunakan </w:t>
-      </w:r>
-      <w:r>
-        <w:rPr>
-          <w:rFonts w:ascii="Times New Roman" w:hAnsi="Times New Roman" w:cs="Times New Roman"/>
-          <w:i/>
-          <w:sz w:val="24"/>
-        </w:rPr>
-        <w:t>Green SM</w:t>
-      </w:r>
-      <w:r>
-        <w:rPr>
-          <w:rFonts w:ascii="Times New Roman" w:hAnsi="Times New Roman" w:cs="Times New Roman"/>
-          <w:sz w:val="24"/>
-        </w:rPr>
-        <w:t>, termasuk keandalan pengereman (</w:t>
-      </w:r>
-      <w:r>
-        <w:rPr>
-          <w:rFonts w:ascii="Times New Roman" w:hAnsi="Times New Roman" w:cs="Times New Roman"/>
-          <w:i/>
-          <w:sz w:val="24"/>
-        </w:rPr>
-        <w:t>regenerative braking</w:t>
-      </w:r>
-      <w:r>
-        <w:rPr>
-          <w:rFonts w:ascii="Times New Roman" w:hAnsi="Times New Roman" w:cs="Times New Roman"/>
-          <w:sz w:val="24"/>
-        </w:rPr>
-        <w:t>), sistem suspensi, serta keamanan baterai listrik dari risiko korsleting atau kebakaran, terutama saat melintasi jalanan basah atau cuaca hujan di Jakarta Barat.</w:t>
-      </w:r>
-    </w:p>
-    <w:p>
-      <w:pPr>
-        <w:keepNext/>
-        <w:spacing w:after="120" w:line="360" w:lineRule="auto"/>
-        <w:rPr>
-          <w:rFonts w:ascii="Times New Roman" w:hAnsi="Times New Roman" w:cs="Times New Roman"/>
-          <w:b/>
-          <w:sz w:val="24"/>
-        </w:rPr>
-      </w:pPr>
-      <w:r>
-        <w:rPr>
-          <w:rFonts w:ascii="Times New Roman" w:hAnsi="Times New Roman" w:cs="Times New Roman"/>
-          <w:b/>
-          <w:sz w:val="24"/>
-        </w:rPr>
-        <w:t>2.1.6 Perspektif Dosen Program Studi Manajemen FEB UKRIDA mengenai Citra Merek, Kepercayaan, dan Keputusan Konsumen</w:t>
+        <w:t>2.1.5 Perspektif Dosen Program Studi Manajemen FEB UKRIDA mengenai Citra Merek, Kepercayaan, dan Keputusan Konsumen</w:t>
       </w:r>
     </w:p>
     <w:p>
@@ -26016,7 +25840,7 @@
     <w:link w:val="Heading1Char"/>
     <w:uiPriority w:val="9"/>
     <w:qFormat/>
-    <w:rsid w:val="00E91894"/>
+    <w:rsid w:val="0083468D"/>
     <w:pPr>
       <w:keepNext/>
       <w:keepLines/>
@@ -26039,7 +25863,7 @@
     <w:semiHidden/>
     <w:unhideWhenUsed/>
     <w:qFormat/>
-    <w:rsid w:val="00E91894"/>
+    <w:rsid w:val="0083468D"/>
     <w:pPr>
       <w:keepNext/>
       <w:keepLines/>
@@ -26062,7 +25886,7 @@
     <w:semiHidden/>
     <w:unhideWhenUsed/>
     <w:qFormat/>
-    <w:rsid w:val="00E91894"/>
+    <w:rsid w:val="0083468D"/>
     <w:pPr>
       <w:keepNext/>
       <w:keepLines/>
@@ -26085,7 +25909,7 @@
     <w:semiHidden/>
     <w:unhideWhenUsed/>
     <w:qFormat/>
-    <w:rsid w:val="00E91894"/>
+    <w:rsid w:val="0083468D"/>
     <w:pPr>
       <w:keepNext/>
       <w:keepLines/>
@@ -26108,7 +25932,7 @@
     <w:semiHidden/>
     <w:unhideWhenUsed/>
     <w:qFormat/>
-    <w:rsid w:val="00E91894"/>
+    <w:rsid w:val="0083468D"/>
     <w:pPr>
       <w:keepNext/>
       <w:keepLines/>
@@ -26129,7 +25953,7 @@
     <w:semiHidden/>
     <w:unhideWhenUsed/>
     <w:qFormat/>
-    <w:rsid w:val="00E91894"/>
+    <w:rsid w:val="0083468D"/>
     <w:pPr>
       <w:keepNext/>
       <w:keepLines/>
@@ -26152,7 +25976,7 @@
     <w:semiHidden/>
     <w:unhideWhenUsed/>
     <w:qFormat/>
-    <w:rsid w:val="00E91894"/>
+    <w:rsid w:val="0083468D"/>
     <w:pPr>
       <w:keepNext/>
       <w:keepLines/>
@@ -26173,7 +25997,7 @@
     <w:semiHidden/>
     <w:unhideWhenUsed/>
     <w:qFormat/>
-    <w:rsid w:val="00E91894"/>
+    <w:rsid w:val="0083468D"/>
     <w:pPr>
       <w:keepNext/>
       <w:keepLines/>
@@ -26196,7 +26020,7 @@
     <w:semiHidden/>
     <w:unhideWhenUsed/>
     <w:qFormat/>
-    <w:rsid w:val="00E91894"/>
+    <w:rsid w:val="0083468D"/>
     <w:pPr>
       <w:keepNext/>
       <w:keepLines/>
@@ -26240,7 +26064,7 @@
     <w:basedOn w:val="DefaultParagraphFont"/>
     <w:link w:val="Heading1"/>
     <w:uiPriority w:val="9"/>
-    <w:rsid w:val="00E91894"/>
+    <w:rsid w:val="0083468D"/>
     <w:rPr>
       <w:rFonts w:asciiTheme="majorHAnsi" w:eastAsiaTheme="majorEastAsia" w:hAnsiTheme="majorHAnsi" w:cstheme="majorBidi"/>
       <w:color w:val="2F5496" w:themeColor="accent1" w:themeShade="BF"/>
@@ -26254,7 +26078,7 @@
     <w:link w:val="Heading2"/>
     <w:uiPriority w:val="9"/>
     <w:semiHidden/>
-    <w:rsid w:val="00E91894"/>
+    <w:rsid w:val="0083468D"/>
     <w:rPr>
       <w:rFonts w:asciiTheme="majorHAnsi" w:eastAsiaTheme="majorEastAsia" w:hAnsiTheme="majorHAnsi" w:cstheme="majorBidi"/>
       <w:color w:val="2F5496" w:themeColor="accent1" w:themeShade="BF"/>
@@ -26268,7 +26092,7 @@
     <w:link w:val="Heading3"/>
     <w:uiPriority w:val="9"/>
     <w:semiHidden/>
-    <w:rsid w:val="00E91894"/>
+    <w:rsid w:val="0083468D"/>
     <w:rPr>
       <w:rFonts w:eastAsiaTheme="majorEastAsia" w:cstheme="majorBidi"/>
       <w:color w:val="2F5496" w:themeColor="accent1" w:themeShade="BF"/>
@@ -26282,7 +26106,7 @@
     <w:link w:val="Heading4"/>
     <w:uiPriority w:val="9"/>
     <w:semiHidden/>
-    <w:rsid w:val="00E91894"/>
+    <w:rsid w:val="0083468D"/>
     <w:rPr>
       <w:rFonts w:eastAsiaTheme="majorEastAsia" w:cstheme="majorBidi"/>
       <w:i/>
@@ -26296,7 +26120,7 @@
     <w:link w:val="Heading5"/>
     <w:uiPriority w:val="9"/>
     <w:semiHidden/>
-    <w:rsid w:val="00E91894"/>
+    <w:rsid w:val="0083468D"/>
     <w:rPr>
       <w:rFonts w:eastAsiaTheme="majorEastAsia" w:cstheme="majorBidi"/>
       <w:color w:val="2F5496" w:themeColor="accent1" w:themeShade="BF"/>
@@ -26308,7 +26132,7 @@
     <w:link w:val="Heading6"/>
     <w:uiPriority w:val="9"/>
     <w:semiHidden/>
-    <w:rsid w:val="00E91894"/>
+    <w:rsid w:val="0083468D"/>
     <w:rPr>
       <w:rFonts w:eastAsiaTheme="majorEastAsia" w:cstheme="majorBidi"/>
       <w:i/>
@@ -26322,7 +26146,7 @@
     <w:link w:val="Heading7"/>
     <w:uiPriority w:val="9"/>
     <w:semiHidden/>
-    <w:rsid w:val="00E91894"/>
+    <w:rsid w:val="0083468D"/>
     <w:rPr>
       <w:rFonts w:eastAsiaTheme="majorEastAsia" w:cstheme="majorBidi"/>
       <w:color w:val="595959" w:themeColor="text1" w:themeTint="A6"/>
@@ -26334,7 +26158,7 @@
     <w:link w:val="Heading8"/>
     <w:uiPriority w:val="9"/>
     <w:semiHidden/>
-    <w:rsid w:val="00E91894"/>
+    <w:rsid w:val="0083468D"/>
     <w:rPr>
       <w:rFonts w:eastAsiaTheme="majorEastAsia" w:cstheme="majorBidi"/>
       <w:i/>
@@ -26348,7 +26172,7 @@
     <w:link w:val="Heading9"/>
     <w:uiPriority w:val="9"/>
     <w:semiHidden/>
-    <w:rsid w:val="00E91894"/>
+    <w:rsid w:val="0083468D"/>
     <w:rPr>
       <w:rFonts w:eastAsiaTheme="majorEastAsia" w:cstheme="majorBidi"/>
       <w:color w:val="272727" w:themeColor="text1" w:themeTint="D8"/>
@@ -26361,7 +26185,7 @@
     <w:link w:val="TitleChar"/>
     <w:uiPriority w:val="10"/>
     <w:qFormat/>
-    <w:rsid w:val="00E91894"/>
+    <w:rsid w:val="0083468D"/>
     <w:pPr>
       <w:spacing w:after="80" w:line="240" w:lineRule="auto"/>
       <w:contextualSpacing/>
@@ -26379,7 +26203,7 @@
     <w:basedOn w:val="DefaultParagraphFont"/>
     <w:link w:val="Title"/>
     <w:uiPriority w:val="10"/>
-    <w:rsid w:val="00E91894"/>
+    <w:rsid w:val="0083468D"/>
     <w:rPr>
       <w:rFonts w:asciiTheme="majorHAnsi" w:eastAsiaTheme="majorEastAsia" w:hAnsiTheme="majorHAnsi" w:cstheme="majorBidi"/>
       <w:spacing w:val="-10"/>
@@ -26395,7 +26219,7 @@
     <w:link w:val="SubtitleChar"/>
     <w:uiPriority w:val="11"/>
     <w:qFormat/>
-    <w:rsid w:val="00E91894"/>
+    <w:rsid w:val="0083468D"/>
     <w:pPr>
       <w:numPr>
         <w:ilvl w:val="1"/>
@@ -26414,7 +26238,7 @@
     <w:basedOn w:val="DefaultParagraphFont"/>
     <w:link w:val="Subtitle"/>
     <w:uiPriority w:val="11"/>
-    <w:rsid w:val="00E91894"/>
+    <w:rsid w:val="0083468D"/>
     <w:rPr>
       <w:rFonts w:eastAsiaTheme="majorEastAsia" w:cstheme="majorBidi"/>
       <w:color w:val="595959" w:themeColor="text1" w:themeTint="A6"/>
@@ -26430,7 +26254,7 @@
     <w:link w:val="QuoteChar"/>
     <w:uiPriority w:val="29"/>
     <w:qFormat/>
-    <w:rsid w:val="00E91894"/>
+    <w:rsid w:val="0083468D"/>
     <w:pPr>
       <w:spacing w:before="160"/>
       <w:jc w:val="center"/>
@@ -26446,7 +26270,7 @@
     <w:basedOn w:val="DefaultParagraphFont"/>
     <w:link w:val="Quote"/>
     <w:uiPriority w:val="29"/>
-    <w:rsid w:val="00E91894"/>
+    <w:rsid w:val="0083468D"/>
     <w:rPr>
       <w:i/>
       <w:iCs/>
@@ -26458,7 +26282,7 @@
     <w:basedOn w:val="Normal"/>
     <w:uiPriority w:val="34"/>
     <w:qFormat/>
-    <w:rsid w:val="00E91894"/>
+    <w:rsid w:val="0083468D"/>
     <w:pPr>
       <w:ind w:left="720"/>
       <w:contextualSpacing/>
@@ -26469,7 +26293,7 @@
     <w:basedOn w:val="DefaultParagraphFont"/>
     <w:uiPriority w:val="21"/>
     <w:qFormat/>
-    <w:rsid w:val="00E91894"/>
+    <w:rsid w:val="0083468D"/>
     <w:rPr>
       <w:i/>
       <w:iCs/>
@@ -26483,7 +26307,7 @@
     <w:link w:val="IntenseQuoteChar"/>
     <w:uiPriority w:val="30"/>
     <w:qFormat/>
-    <w:rsid w:val="00E91894"/>
+    <w:rsid w:val="0083468D"/>
     <w:pPr>
       <w:pBdr>
         <w:top w:val="single" w:sz="4" w:space="10" w:color="2F5496" w:themeColor="accent1" w:themeShade="BF"/>
@@ -26504,7 +26328,7 @@
     <w:basedOn w:val="DefaultParagraphFont"/>
     <w:link w:val="IntenseQuote"/>
     <w:uiPriority w:val="30"/>
-    <w:rsid w:val="00E91894"/>
+    <w:rsid w:val="0083468D"/>
     <w:rPr>
       <w:i/>
       <w:iCs/>
@@ -26516,7 +26340,7 @@
     <w:basedOn w:val="DefaultParagraphFont"/>
     <w:uiPriority w:val="32"/>
     <w:qFormat/>
-    <w:rsid w:val="00E91894"/>
+    <w:rsid w:val="0083468D"/>
     <w:rPr>
       <w:b/>
       <w:bCs/>

</xml_diff>

<commit_message>
Tambahkan 1 teori definisi variabel terkini (Schiffman 2024, Lovelock 2022, Priansa 2021, Tjiptono 2022) dan sinkronkan dokumen Word, PDF, dan Mendeley
</commit_message>
<xml_diff>
--- a/TOPIK_2_TAKSI_GREEN_SM/01_Naskah_Utama/Proposal_Skripsi_Taksi_Green_SM.docx
+++ b/TOPIK_2_TAKSI_GREEN_SM/01_Naskah_Utama/Proposal_Skripsi_Taksi_Green_SM.docx
@@ -12,16 +12,16 @@
           <w:noProof/>
         </w:rPr>
         <w:drawing>
-          <wp:inline distT="0" distB="0" distL="0" distR="0" wp14:anchorId="7B76848D" wp14:editId="6532028F">
+          <wp:inline distT="0" distB="0" distL="0" distR="0" wp14:anchorId="7A6BCB94" wp14:editId="4419B4D2">
             <wp:extent cx="1152002" cy="1152002"/>
             <wp:effectExtent l="0" t="0" r="0" b="0"/>
-            <wp:docPr id="635760083" name="Picture 1"/>
+            <wp:docPr id="1571650728" name="Picture 1"/>
             <wp:cNvGraphicFramePr/>
             <a:graphic xmlns:a="http://schemas.openxmlformats.org/drawingml/2006/main">
               <a:graphicData uri="http://schemas.openxmlformats.org/drawingml/2006/picture">
                 <pic:pic xmlns:pic="http://schemas.openxmlformats.org/drawingml/2006/picture">
                   <pic:nvPicPr>
-                    <pic:cNvPr id="635760083" name=""/>
+                    <pic:cNvPr id="1571650728" name=""/>
                     <pic:cNvPicPr/>
                   </pic:nvPicPr>
                   <pic:blipFill>
@@ -4474,6 +4474,115 @@
           <w:rFonts w:ascii="Times New Roman" w:hAnsi="Times New Roman" w:cs="Times New Roman"/>
           <w:sz w:val="24"/>
         </w:rPr>
+        <w:t>Lebih lanjut, Schiffman dan Wisenblit (2024) mendefinisikan keputusan pembelian (</w:t>
+      </w:r>
+      <w:r>
+        <w:rPr>
+          <w:rFonts w:ascii="Times New Roman" w:hAnsi="Times New Roman" w:cs="Times New Roman"/>
+          <w:i/>
+          <w:sz w:val="24"/>
+        </w:rPr>
+        <w:t>purchase decision</w:t>
+      </w:r>
+      <w:r>
+        <w:rPr>
+          <w:rFonts w:ascii="Times New Roman" w:hAnsi="Times New Roman" w:cs="Times New Roman"/>
+          <w:sz w:val="24"/>
+        </w:rPr>
+        <w:t xml:space="preserve">) sebagai proses kognitif penyeleksian salah satu tindakan dari dua atau lebih pilihan alternatif yang tersedia di pasar. Dalam pandangan ini, keputusan pembelian hanya terjadi apabila konsumen dihadapkan pada kumpulan pilihan alternatif (choice of alternatives). Apabila konsumen tidak memiliki alternatif lain, maka tindakan tersebut bukanlah sebuah proses pengambilan keputusan yang bebas. Dalam konteks mobilitas perkotaan di Jakarta Barat, kehadiran taksi </w:t>
+      </w:r>
+      <w:r>
+        <w:rPr>
+          <w:rFonts w:ascii="Times New Roman" w:hAnsi="Times New Roman" w:cs="Times New Roman"/>
+          <w:i/>
+          <w:sz w:val="24"/>
+        </w:rPr>
+        <w:t>Green SM</w:t>
+      </w:r>
+      <w:r>
+        <w:rPr>
+          <w:rFonts w:ascii="Times New Roman" w:hAnsi="Times New Roman" w:cs="Times New Roman"/>
+          <w:sz w:val="24"/>
+        </w:rPr>
+        <w:t xml:space="preserve"> menjadi alternatif baru yang bersaing langsung dengan pemain lama (</w:t>
+      </w:r>
+      <w:r>
+        <w:rPr>
+          <w:rFonts w:ascii="Times New Roman" w:hAnsi="Times New Roman" w:cs="Times New Roman"/>
+          <w:i/>
+          <w:sz w:val="24"/>
+        </w:rPr>
+        <w:t>Blue Bird</w:t>
+      </w:r>
+      <w:r>
+        <w:rPr>
+          <w:rFonts w:ascii="Times New Roman" w:hAnsi="Times New Roman" w:cs="Times New Roman"/>
+          <w:sz w:val="24"/>
+        </w:rPr>
+        <w:t xml:space="preserve">, </w:t>
+      </w:r>
+      <w:r>
+        <w:rPr>
+          <w:rFonts w:ascii="Times New Roman" w:hAnsi="Times New Roman" w:cs="Times New Roman"/>
+          <w:i/>
+          <w:sz w:val="24"/>
+        </w:rPr>
+        <w:t>GrabCar</w:t>
+      </w:r>
+      <w:r>
+        <w:rPr>
+          <w:rFonts w:ascii="Times New Roman" w:hAnsi="Times New Roman" w:cs="Times New Roman"/>
+          <w:sz w:val="24"/>
+        </w:rPr>
+        <w:t xml:space="preserve">, </w:t>
+      </w:r>
+      <w:r>
+        <w:rPr>
+          <w:rFonts w:ascii="Times New Roman" w:hAnsi="Times New Roman" w:cs="Times New Roman"/>
+          <w:i/>
+          <w:sz w:val="24"/>
+        </w:rPr>
+        <w:t>GoCar</w:t>
+      </w:r>
+      <w:r>
+        <w:rPr>
+          <w:rFonts w:ascii="Times New Roman" w:hAnsi="Times New Roman" w:cs="Times New Roman"/>
+          <w:sz w:val="24"/>
+        </w:rPr>
+        <w:t xml:space="preserve">), sehingga keputusan konsumen untuk memesan dan membayar layanan </w:t>
+      </w:r>
+      <w:r>
+        <w:rPr>
+          <w:rFonts w:ascii="Times New Roman" w:hAnsi="Times New Roman" w:cs="Times New Roman"/>
+          <w:i/>
+          <w:sz w:val="24"/>
+        </w:rPr>
+        <w:t>Green SM</w:t>
+      </w:r>
+      <w:r>
+        <w:rPr>
+          <w:rFonts w:ascii="Times New Roman" w:hAnsi="Times New Roman" w:cs="Times New Roman"/>
+          <w:sz w:val="24"/>
+        </w:rPr>
+        <w:t xml:space="preserve"> merefleksikan hasil penyeleksian sadar atas moda transportasi yang dinilai paling mampu memuaskan kebutuhan perjalanannya.</w:t>
+      </w:r>
+    </w:p>
+    <w:p>
+      <w:pPr>
+        <w:keepNext/>
+        <w:spacing w:after="120" w:line="360" w:lineRule="auto"/>
+        <w:ind w:firstLine="709"/>
+        <w:jc w:val="both"/>
+        <w:rPr>
+          <w:rFonts w:ascii="Times New Roman" w:hAnsi="Times New Roman" w:cs="Times New Roman"/>
+          <w:sz w:val="24"/>
+        </w:rPr>
+      </w:pPr>
+      <w:r>
+        <w:rPr>
+          <w:rFonts w:ascii="Times New Roman" w:hAnsi="Times New Roman" w:cs="Times New Roman"/>
+          <w:sz w:val="24"/>
+        </w:rPr>
         <w:t xml:space="preserve">Dalam model hirarki pengambilan keputusan konsumen klasik yang dikembangkan oleh Engel, Blackwell, dan Miniard (model EBM) serta dirumuskan kembali oleh Kotler </w:t>
       </w:r>
       <w:r>
@@ -5158,7 +5267,101 @@
           <w:rFonts w:ascii="Times New Roman" w:hAnsi="Times New Roman" w:cs="Times New Roman"/>
           <w:sz w:val="24"/>
         </w:rPr>
-        <w:t xml:space="preserve">Berdasarkan sintesis Kotler, Keller, dan Chernev (2022) serta Aaker (2023), dimensi dan indikator baku </w:t>
+        <w:t>Dalam perspektif manajemen pemasaran jasa modern, Lovelock, Wirtz, dan Chew (2022) mendefinisikan citra merek (</w:t>
+      </w:r>
+      <w:r>
+        <w:rPr>
+          <w:rFonts w:ascii="Times New Roman" w:hAnsi="Times New Roman" w:cs="Times New Roman"/>
+          <w:i/>
+          <w:sz w:val="24"/>
+        </w:rPr>
+        <w:t>brand image</w:t>
+      </w:r>
+      <w:r>
+        <w:rPr>
+          <w:rFonts w:ascii="Times New Roman" w:hAnsi="Times New Roman" w:cs="Times New Roman"/>
+          <w:sz w:val="24"/>
+        </w:rPr>
+        <w:t xml:space="preserve">) sebagai kesan mental menyeluruh dan reputasi perseptual yang tersimpan dalam pikiran pelanggan mengenai kapabilitas organisasi, nilai-nilai inti, serta kepribadian layanan yang membedakannya secara distingtif dari para pesaing di pasar. Dalam bisnis transportasi, citra merek tidak hanya dibentuk oleh identitas visual armada, melainkan juga oleh pengalaman interaksi langsung penumpang dengan kualitas pelayanan pengemudi dan keandalan armada. Bagi </w:t>
+      </w:r>
+      <w:r>
+        <w:rPr>
+          <w:rFonts w:ascii="Times New Roman" w:hAnsi="Times New Roman" w:cs="Times New Roman"/>
+          <w:i/>
+          <w:sz w:val="24"/>
+        </w:rPr>
+        <w:t>Green SM</w:t>
+      </w:r>
+      <w:r>
+        <w:rPr>
+          <w:rFonts w:ascii="Times New Roman" w:hAnsi="Times New Roman" w:cs="Times New Roman"/>
+          <w:sz w:val="24"/>
+        </w:rPr>
+        <w:t xml:space="preserve">, </w:t>
+      </w:r>
+      <w:r>
+        <w:rPr>
+          <w:rFonts w:ascii="Times New Roman" w:hAnsi="Times New Roman" w:cs="Times New Roman"/>
+          <w:i/>
+          <w:sz w:val="24"/>
+        </w:rPr>
+        <w:t>brand image</w:t>
+      </w:r>
+      <w:r>
+        <w:rPr>
+          <w:rFonts w:ascii="Times New Roman" w:hAnsi="Times New Roman" w:cs="Times New Roman"/>
+          <w:sz w:val="24"/>
+        </w:rPr>
+        <w:t xml:space="preserve"> menjadi sarana diferensiasi utama untuk menonjolkan identitasnya sebagai pelopor armada taksi 100% mobil listrik (pure EV) yang ramah lingkungan (</w:t>
+      </w:r>
+      <w:r>
+        <w:rPr>
+          <w:rFonts w:ascii="Times New Roman" w:hAnsi="Times New Roman" w:cs="Times New Roman"/>
+          <w:i/>
+          <w:sz w:val="24"/>
+        </w:rPr>
+        <w:t>zero emission</w:t>
+      </w:r>
+      <w:r>
+        <w:rPr>
+          <w:rFonts w:ascii="Times New Roman" w:hAnsi="Times New Roman" w:cs="Times New Roman"/>
+          <w:sz w:val="24"/>
+        </w:rPr>
+        <w:t>) dan berteknologi tinggi di Jakarta Barat.</w:t>
+      </w:r>
+    </w:p>
+    <w:p>
+      <w:pPr>
+        <w:keepNext/>
+        <w:spacing w:after="120" w:line="360" w:lineRule="auto"/>
+        <w:ind w:firstLine="709"/>
+        <w:jc w:val="both"/>
+        <w:rPr>
+          <w:rFonts w:ascii="Times New Roman" w:hAnsi="Times New Roman" w:cs="Times New Roman"/>
+          <w:sz w:val="24"/>
+        </w:rPr>
+      </w:pPr>
+      <w:r>
+        <w:rPr>
+          <w:rFonts w:ascii="Times New Roman" w:hAnsi="Times New Roman" w:cs="Times New Roman"/>
+          <w:sz w:val="24"/>
+        </w:rPr>
+        <w:t xml:space="preserve">Berdasarkan sintesis Kotler, Keller, dan Chernev (2022), Aaker (2023), serta Lovelock </w:t>
+      </w:r>
+      <w:r>
+        <w:rPr>
+          <w:rFonts w:ascii="Times New Roman" w:hAnsi="Times New Roman" w:cs="Times New Roman"/>
+          <w:i/>
+          <w:sz w:val="24"/>
+        </w:rPr>
+        <w:t>et al.</w:t>
+      </w:r>
+      <w:r>
+        <w:rPr>
+          <w:rFonts w:ascii="Times New Roman" w:hAnsi="Times New Roman" w:cs="Times New Roman"/>
+          <w:sz w:val="24"/>
+        </w:rPr>
+        <w:t xml:space="preserve"> (2022), dimensi dan indikator baku </w:t>
       </w:r>
       <w:r>
         <w:rPr>
@@ -5469,6 +5672,70 @@
           <w:rFonts w:ascii="Times New Roman" w:hAnsi="Times New Roman" w:cs="Times New Roman"/>
           <w:sz w:val="24"/>
         </w:rPr>
+        <w:t>Sejalan dengan hal tersebut, Priansa (2021) serta Lovelock dan Wirtz (2022) menegaskan bahwa kepercayaan merek (</w:t>
+      </w:r>
+      <w:r>
+        <w:rPr>
+          <w:rFonts w:ascii="Times New Roman" w:hAnsi="Times New Roman" w:cs="Times New Roman"/>
+          <w:i/>
+          <w:sz w:val="24"/>
+        </w:rPr>
+        <w:t>brand trust</w:t>
+      </w:r>
+      <w:r>
+        <w:rPr>
+          <w:rFonts w:ascii="Times New Roman" w:hAnsi="Times New Roman" w:cs="Times New Roman"/>
+          <w:sz w:val="24"/>
+        </w:rPr>
+        <w:t xml:space="preserve">) dalam sektor jasa adalah keyakinan dan kemauan konsumen untuk memercayakan risiko kepada penyedia jasa berdasarkan ekspektasi positif bahwa perusahaan memiliki integritas, kompetensi teknis, dan konsistensi dalam memberikan layanan terbaik sesuai dengan janji yang dipublikasikannya (delivering on its promises). Mengingat jasa transportasi merupakan produk yang tidak berwujud (intangible) dan memiliki risiko keselamatan fisik, </w:t>
+      </w:r>
+      <w:r>
+        <w:rPr>
+          <w:rFonts w:ascii="Times New Roman" w:hAnsi="Times New Roman" w:cs="Times New Roman"/>
+          <w:i/>
+          <w:sz w:val="24"/>
+        </w:rPr>
+        <w:t>Brand Trust</w:t>
+      </w:r>
+      <w:r>
+        <w:rPr>
+          <w:rFonts w:ascii="Times New Roman" w:hAnsi="Times New Roman" w:cs="Times New Roman"/>
+          <w:sz w:val="24"/>
+        </w:rPr>
+        <w:t xml:space="preserve"> berfungsi sebagai peredam ketidakpastian (uncertainty reducer) yang memantapkan keyakinan calon penumpang bahwa taksi </w:t>
+      </w:r>
+      <w:r>
+        <w:rPr>
+          <w:rFonts w:ascii="Times New Roman" w:hAnsi="Times New Roman" w:cs="Times New Roman"/>
+          <w:i/>
+          <w:sz w:val="24"/>
+        </w:rPr>
+        <w:t>Green SM</w:t>
+      </w:r>
+      <w:r>
+        <w:rPr>
+          <w:rFonts w:ascii="Times New Roman" w:hAnsi="Times New Roman" w:cs="Times New Roman"/>
+          <w:sz w:val="24"/>
+        </w:rPr>
+        <w:t xml:space="preserve"> akan mengantarkan mereka ke tempat tujuan dengan aman, nyaman, dan dengan tarif yang transparan.</w:t>
+      </w:r>
+    </w:p>
+    <w:p>
+      <w:pPr>
+        <w:keepNext/>
+        <w:spacing w:after="120" w:line="360" w:lineRule="auto"/>
+        <w:ind w:firstLine="709"/>
+        <w:jc w:val="both"/>
+        <w:rPr>
+          <w:rFonts w:ascii="Times New Roman" w:hAnsi="Times New Roman" w:cs="Times New Roman"/>
+          <w:sz w:val="24"/>
+        </w:rPr>
+      </w:pPr>
+      <w:r>
+        <w:rPr>
+          <w:rFonts w:ascii="Times New Roman" w:hAnsi="Times New Roman" w:cs="Times New Roman"/>
+          <w:sz w:val="24"/>
+        </w:rPr>
         <w:t xml:space="preserve">Dalam literatur pemasaran relasional mutakhir (Kotler </w:t>
       </w:r>
       <w:r>
@@ -5946,7 +6213,7 @@
           <w:rFonts w:ascii="Times New Roman" w:hAnsi="Times New Roman" w:cs="Times New Roman"/>
           <w:sz w:val="24"/>
         </w:rPr>
-        <w:t xml:space="preserve">Dalam konteks transportasi darat modern, </w:t>
+        <w:t>Tjiptono (2022) serta Lovelock dan Wirtz (2022) merumuskan bahwa persepsi keamanan dan keselamatan (</w:t>
       </w:r>
       <w:r>
         <w:rPr>
@@ -5961,22 +6228,7 @@
           <w:rFonts w:ascii="Times New Roman" w:hAnsi="Times New Roman" w:cs="Times New Roman"/>
           <w:sz w:val="24"/>
         </w:rPr>
-        <w:t xml:space="preserve"> didefinisikan sebagai penilaian subjektif penumpang mengenai sejauh mana perjalanan bersama suatu moda transportasi terlindungi dari ancaman fisik, kecelakaan lalu lintas, tindak kriminalitas, serta kegagalan teknis armada (Wijaya &amp; Pahar, 2022; Adha &amp; Suhardi, 2025). Khusus untuk armada taksi listrik murni (</w:t>
-      </w:r>
-      <w:r>
-        <w:rPr>
-          <w:rFonts w:ascii="Times New Roman" w:hAnsi="Times New Roman" w:cs="Times New Roman"/>
-          <w:i/>
-          <w:sz w:val="24"/>
-        </w:rPr>
-        <w:t>pure electric vehicle</w:t>
-      </w:r>
-      <w:r>
-        <w:rPr>
-          <w:rFonts w:ascii="Times New Roman" w:hAnsi="Times New Roman" w:cs="Times New Roman"/>
-          <w:sz w:val="24"/>
-        </w:rPr>
-        <w:t xml:space="preserve"> / EV), persepsi keselamatan penumpang memiliki karakteristik unik yang mencakup evaluasi terhadap keandalan teknologi baterai dan sistem keselamatan elektrik kendaraan.</w:t>
+        <w:t>) adalah tingkat keyakinan subjektif pelanggan bahwa seluruh proses penghantaran jasa (service delivery process) terbebas dari bahaya fisik (physical harm), risiko kecelakaan lalu lintas, ancaman kerugian finansial, kegagalan teknis peralatan jasa, maupun keraguan psikologis selama konsumen berinteraksi dengan penyedia jasa.</w:t>
       </w:r>
     </w:p>
     <w:p>
@@ -5995,6 +6247,55 @@
           <w:rFonts w:ascii="Times New Roman" w:hAnsi="Times New Roman" w:cs="Times New Roman"/>
           <w:sz w:val="24"/>
         </w:rPr>
+        <w:t xml:space="preserve">Dalam konteks transportasi darat modern, </w:t>
+      </w:r>
+      <w:r>
+        <w:rPr>
+          <w:rFonts w:ascii="Times New Roman" w:hAnsi="Times New Roman" w:cs="Times New Roman"/>
+          <w:i/>
+          <w:sz w:val="24"/>
+        </w:rPr>
+        <w:t>Perceived Safety</w:t>
+      </w:r>
+      <w:r>
+        <w:rPr>
+          <w:rFonts w:ascii="Times New Roman" w:hAnsi="Times New Roman" w:cs="Times New Roman"/>
+          <w:sz w:val="24"/>
+        </w:rPr>
+        <w:t xml:space="preserve"> didefinisikan sebagai penilaian subjektif penumpang mengenai sejauh mana perjalanan bersama suatu moda transportasi terlindungi dari ancaman fisik, kecelakaan lalu lintas, tindak kriminalitas, serta kegagalan teknis armada (Wijaya &amp; Pahar, 2022; Adha &amp; Suhardi, 2025). Khusus untuk armada taksi listrik murni (</w:t>
+      </w:r>
+      <w:r>
+        <w:rPr>
+          <w:rFonts w:ascii="Times New Roman" w:hAnsi="Times New Roman" w:cs="Times New Roman"/>
+          <w:i/>
+          <w:sz w:val="24"/>
+        </w:rPr>
+        <w:t>pure electric vehicle</w:t>
+      </w:r>
+      <w:r>
+        <w:rPr>
+          <w:rFonts w:ascii="Times New Roman" w:hAnsi="Times New Roman" w:cs="Times New Roman"/>
+          <w:sz w:val="24"/>
+        </w:rPr>
+        <w:t xml:space="preserve"> / EV), persepsi keselamatan penumpang memiliki karakteristik unik yang mencakup evaluasi terhadap keandalan teknologi baterai dan sistem keselamatan elektrik kendaraan.</w:t>
+      </w:r>
+    </w:p>
+    <w:p>
+      <w:pPr>
+        <w:keepNext/>
+        <w:spacing w:after="120" w:line="360" w:lineRule="auto"/>
+        <w:ind w:firstLine="709"/>
+        <w:jc w:val="both"/>
+        <w:rPr>
+          <w:rFonts w:ascii="Times New Roman" w:hAnsi="Times New Roman" w:cs="Times New Roman"/>
+          <w:sz w:val="24"/>
+        </w:rPr>
+      </w:pPr>
+      <w:r>
+        <w:rPr>
+          <w:rFonts w:ascii="Times New Roman" w:hAnsi="Times New Roman" w:cs="Times New Roman"/>
+          <w:sz w:val="24"/>
+        </w:rPr>
         <w:t xml:space="preserve">Berdasarkan kerangka Zeithaml </w:t>
       </w:r>
       <w:r>
@@ -6010,7 +6311,7 @@
           <w:rFonts w:ascii="Times New Roman" w:hAnsi="Times New Roman" w:cs="Times New Roman"/>
           <w:sz w:val="24"/>
         </w:rPr>
-        <w:t xml:space="preserve"> (2023), Tjiptono (2022), Wijaya dan Pahar (2022), serta Adha dan Suhardi (2025), dimensi dan indikator </w:t>
+        <w:t xml:space="preserve"> (2023), Tjiptono (2022), Lovelock dan Wirtz (2022), Wijaya dan Pahar (2022), serta Adha dan Suhardi (2025), dimensi dan indikator </w:t>
       </w:r>
       <w:r>
         <w:rPr>
@@ -17784,22 +18085,7 @@
           <w:rFonts w:ascii="Times New Roman" w:hAnsi="Times New Roman" w:cs="Times New Roman"/>
           <w:sz w:val="24"/>
         </w:rPr>
-        <w:t xml:space="preserve">Mirae Asset Sekuritas Indonesia. (2023). Indonesia mobility sector update: Navigating duopoly competition and profitability in </w:t>
-      </w:r>
-      <w:r>
-        <w:rPr>
-          <w:rFonts w:ascii="Times New Roman" w:hAnsi="Times New Roman" w:cs="Times New Roman"/>
-          <w:i/>
-          <w:sz w:val="24"/>
-        </w:rPr>
-        <w:t>ride-hailing</w:t>
-      </w:r>
-      <w:r>
-        <w:rPr>
-          <w:rFonts w:ascii="Times New Roman" w:hAnsi="Times New Roman" w:cs="Times New Roman"/>
-          <w:sz w:val="24"/>
-        </w:rPr>
-        <w:t xml:space="preserve"> services. Research Report, Mirae Asset Sekuritas.</w:t>
+        <w:t>Lovelock, C., Wirtz, J., &amp; Chew, P. (2022). Services marketing: People, technology, strategy (9th ed.). World Scientific Publishing.</w:t>
       </w:r>
     </w:p>
     <w:p>
@@ -17818,7 +18104,22 @@
           <w:rFonts w:ascii="Times New Roman" w:hAnsi="Times New Roman" w:cs="Times New Roman"/>
           <w:sz w:val="24"/>
         </w:rPr>
-        <w:t>Pemerintah Provinsi Daerah Khusus Ibukota Jakarta. (2021). Peraturan Gubernur Daerah Khusus Ibukota Jakarta Nomor 90 Tahun 2021 tentang Rencana Pembangunan Rendah Karbon Daerah yang Berketahanan Iklim. Berita Daerah Provinsi Daerah Khusus Ibukota Jakarta Tahun 2021 Nomor 62024.</w:t>
+        <w:t xml:space="preserve">Mirae Asset Sekuritas Indonesia. (2023). Indonesia mobility sector update: Navigating duopoly competition and profitability in </w:t>
+      </w:r>
+      <w:r>
+        <w:rPr>
+          <w:rFonts w:ascii="Times New Roman" w:hAnsi="Times New Roman" w:cs="Times New Roman"/>
+          <w:i/>
+          <w:sz w:val="24"/>
+        </w:rPr>
+        <w:t>ride-hailing</w:t>
+      </w:r>
+      <w:r>
+        <w:rPr>
+          <w:rFonts w:ascii="Times New Roman" w:hAnsi="Times New Roman" w:cs="Times New Roman"/>
+          <w:sz w:val="24"/>
+        </w:rPr>
+        <w:t xml:space="preserve"> services. Research Report, Mirae Asset Sekuritas.</w:t>
       </w:r>
     </w:p>
     <w:p>
@@ -17837,22 +18138,7 @@
           <w:rFonts w:ascii="Times New Roman" w:hAnsi="Times New Roman" w:cs="Times New Roman"/>
           <w:sz w:val="24"/>
         </w:rPr>
-        <w:t xml:space="preserve">Populix. (2024). </w:t>
-      </w:r>
-      <w:r>
-        <w:rPr>
-          <w:rFonts w:ascii="Times New Roman" w:hAnsi="Times New Roman" w:cs="Times New Roman"/>
-          <w:i/>
-          <w:sz w:val="24"/>
-        </w:rPr>
-        <w:t>Electric vehicle</w:t>
-      </w:r>
-      <w:r>
-        <w:rPr>
-          <w:rFonts w:ascii="Times New Roman" w:hAnsi="Times New Roman" w:cs="Times New Roman"/>
-          <w:sz w:val="24"/>
-        </w:rPr>
-        <w:t xml:space="preserve"> dynamics: Unveiling consumer perspectives and market insights in Indonesia. Populix Consumer Insights Report. https://populix.co</w:t>
+        <w:t>Pemerintah Provinsi Daerah Khusus Ibukota Jakarta. (2021). Peraturan Gubernur Daerah Khusus Ibukota Jakarta Nomor 90 Tahun 2021 tentang Rencana Pembangunan Rendah Karbon Daerah yang Berketahanan Iklim. Berita Daerah Provinsi Daerah Khusus Ibukota Jakarta Tahun 2021 Nomor 62024.</w:t>
       </w:r>
     </w:p>
     <w:p>
@@ -17871,6 +18157,59 @@
           <w:rFonts w:ascii="Times New Roman" w:hAnsi="Times New Roman" w:cs="Times New Roman"/>
           <w:sz w:val="24"/>
         </w:rPr>
+        <w:t xml:space="preserve">Populix. (2024). </w:t>
+      </w:r>
+      <w:r>
+        <w:rPr>
+          <w:rFonts w:ascii="Times New Roman" w:hAnsi="Times New Roman" w:cs="Times New Roman"/>
+          <w:i/>
+          <w:sz w:val="24"/>
+        </w:rPr>
+        <w:t>Electric vehicle</w:t>
+      </w:r>
+      <w:r>
+        <w:rPr>
+          <w:rFonts w:ascii="Times New Roman" w:hAnsi="Times New Roman" w:cs="Times New Roman"/>
+          <w:sz w:val="24"/>
+        </w:rPr>
+        <w:t xml:space="preserve"> dynamics: Unveiling consumer perspectives and market insights in Indonesia. Populix Consumer Insights Report. https://populix.co</w:t>
+      </w:r>
+    </w:p>
+    <w:p>
+      <w:pPr>
+        <w:keepNext/>
+        <w:spacing w:after="120" w:line="360" w:lineRule="auto"/>
+        <w:ind w:firstLine="709"/>
+        <w:jc w:val="both"/>
+        <w:rPr>
+          <w:rFonts w:ascii="Times New Roman" w:hAnsi="Times New Roman" w:cs="Times New Roman"/>
+          <w:sz w:val="24"/>
+        </w:rPr>
+      </w:pPr>
+      <w:r>
+        <w:rPr>
+          <w:rFonts w:ascii="Times New Roman" w:hAnsi="Times New Roman" w:cs="Times New Roman"/>
+          <w:sz w:val="24"/>
+        </w:rPr>
+        <w:t>Priansa, D. J. (2021). Perencanaan &amp; pengembangan bisnis pariwisata dan jasa. Alfabeta.</w:t>
+      </w:r>
+    </w:p>
+    <w:p>
+      <w:pPr>
+        <w:keepNext/>
+        <w:spacing w:after="120" w:line="360" w:lineRule="auto"/>
+        <w:ind w:firstLine="709"/>
+        <w:jc w:val="both"/>
+        <w:rPr>
+          <w:rFonts w:ascii="Times New Roman" w:hAnsi="Times New Roman" w:cs="Times New Roman"/>
+          <w:sz w:val="24"/>
+        </w:rPr>
+      </w:pPr>
+      <w:r>
+        <w:rPr>
+          <w:rFonts w:ascii="Times New Roman" w:hAnsi="Times New Roman" w:cs="Times New Roman"/>
+          <w:sz w:val="24"/>
+        </w:rPr>
         <w:t>Republik Indonesia. (2023). Peraturan Presiden Republik Indonesia Nomor 79 Tahun 2023 tentang Perubahan atas Peraturan Presiden Nomor 55 Tahun 2019 tentang Percepatan Program Kendaraan Bermotor Listrik Berbasis Baterai (</w:t>
       </w:r>
       <w:r>
@@ -17887,6 +18226,40 @@
           <w:sz w:val="24"/>
         </w:rPr>
         <w:t>) untuk Transportasi Jalan. Lembaran Negara Republik Indonesia Tahun 2023 Nomor 158. Sekretariat Negara.</w:t>
+      </w:r>
+    </w:p>
+    <w:p>
+      <w:pPr>
+        <w:keepNext/>
+        <w:spacing w:after="120" w:line="360" w:lineRule="auto"/>
+        <w:ind w:firstLine="709"/>
+        <w:jc w:val="both"/>
+        <w:rPr>
+          <w:rFonts w:ascii="Times New Roman" w:hAnsi="Times New Roman" w:cs="Times New Roman"/>
+          <w:sz w:val="24"/>
+        </w:rPr>
+      </w:pPr>
+      <w:r>
+        <w:rPr>
+          <w:rFonts w:ascii="Times New Roman" w:hAnsi="Times New Roman" w:cs="Times New Roman"/>
+          <w:sz w:val="24"/>
+        </w:rPr>
+        <w:t xml:space="preserve">Schiffman, L. G., &amp; Wisenblit, J. (2024). </w:t>
+      </w:r>
+      <w:r>
+        <w:rPr>
+          <w:rFonts w:ascii="Times New Roman" w:hAnsi="Times New Roman" w:cs="Times New Roman"/>
+          <w:i/>
+          <w:sz w:val="24"/>
+        </w:rPr>
+        <w:t>Consumer behavior</w:t>
+      </w:r>
+      <w:r>
+        <w:rPr>
+          <w:rFonts w:ascii="Times New Roman" w:hAnsi="Times New Roman" w:cs="Times New Roman"/>
+          <w:sz w:val="24"/>
+        </w:rPr>
+        <w:t xml:space="preserve"> (13th ed., Global ed.). Pearson Education.</w:t>
       </w:r>
     </w:p>
     <w:p>
@@ -25840,7 +26213,7 @@
     <w:link w:val="Heading1Char"/>
     <w:uiPriority w:val="9"/>
     <w:qFormat/>
-    <w:rsid w:val="0083468D"/>
+    <w:rsid w:val="00156B63"/>
     <w:pPr>
       <w:keepNext/>
       <w:keepLines/>
@@ -25863,7 +26236,7 @@
     <w:semiHidden/>
     <w:unhideWhenUsed/>
     <w:qFormat/>
-    <w:rsid w:val="0083468D"/>
+    <w:rsid w:val="00156B63"/>
     <w:pPr>
       <w:keepNext/>
       <w:keepLines/>
@@ -25886,7 +26259,7 @@
     <w:semiHidden/>
     <w:unhideWhenUsed/>
     <w:qFormat/>
-    <w:rsid w:val="0083468D"/>
+    <w:rsid w:val="00156B63"/>
     <w:pPr>
       <w:keepNext/>
       <w:keepLines/>
@@ -25909,7 +26282,7 @@
     <w:semiHidden/>
     <w:unhideWhenUsed/>
     <w:qFormat/>
-    <w:rsid w:val="0083468D"/>
+    <w:rsid w:val="00156B63"/>
     <w:pPr>
       <w:keepNext/>
       <w:keepLines/>
@@ -25932,7 +26305,7 @@
     <w:semiHidden/>
     <w:unhideWhenUsed/>
     <w:qFormat/>
-    <w:rsid w:val="0083468D"/>
+    <w:rsid w:val="00156B63"/>
     <w:pPr>
       <w:keepNext/>
       <w:keepLines/>
@@ -25953,7 +26326,7 @@
     <w:semiHidden/>
     <w:unhideWhenUsed/>
     <w:qFormat/>
-    <w:rsid w:val="0083468D"/>
+    <w:rsid w:val="00156B63"/>
     <w:pPr>
       <w:keepNext/>
       <w:keepLines/>
@@ -25976,7 +26349,7 @@
     <w:semiHidden/>
     <w:unhideWhenUsed/>
     <w:qFormat/>
-    <w:rsid w:val="0083468D"/>
+    <w:rsid w:val="00156B63"/>
     <w:pPr>
       <w:keepNext/>
       <w:keepLines/>
@@ -25997,7 +26370,7 @@
     <w:semiHidden/>
     <w:unhideWhenUsed/>
     <w:qFormat/>
-    <w:rsid w:val="0083468D"/>
+    <w:rsid w:val="00156B63"/>
     <w:pPr>
       <w:keepNext/>
       <w:keepLines/>
@@ -26020,7 +26393,7 @@
     <w:semiHidden/>
     <w:unhideWhenUsed/>
     <w:qFormat/>
-    <w:rsid w:val="0083468D"/>
+    <w:rsid w:val="00156B63"/>
     <w:pPr>
       <w:keepNext/>
       <w:keepLines/>
@@ -26064,7 +26437,7 @@
     <w:basedOn w:val="DefaultParagraphFont"/>
     <w:link w:val="Heading1"/>
     <w:uiPriority w:val="9"/>
-    <w:rsid w:val="0083468D"/>
+    <w:rsid w:val="00156B63"/>
     <w:rPr>
       <w:rFonts w:asciiTheme="majorHAnsi" w:eastAsiaTheme="majorEastAsia" w:hAnsiTheme="majorHAnsi" w:cstheme="majorBidi"/>
       <w:color w:val="2F5496" w:themeColor="accent1" w:themeShade="BF"/>
@@ -26078,7 +26451,7 @@
     <w:link w:val="Heading2"/>
     <w:uiPriority w:val="9"/>
     <w:semiHidden/>
-    <w:rsid w:val="0083468D"/>
+    <w:rsid w:val="00156B63"/>
     <w:rPr>
       <w:rFonts w:asciiTheme="majorHAnsi" w:eastAsiaTheme="majorEastAsia" w:hAnsiTheme="majorHAnsi" w:cstheme="majorBidi"/>
       <w:color w:val="2F5496" w:themeColor="accent1" w:themeShade="BF"/>
@@ -26092,7 +26465,7 @@
     <w:link w:val="Heading3"/>
     <w:uiPriority w:val="9"/>
     <w:semiHidden/>
-    <w:rsid w:val="0083468D"/>
+    <w:rsid w:val="00156B63"/>
     <w:rPr>
       <w:rFonts w:eastAsiaTheme="majorEastAsia" w:cstheme="majorBidi"/>
       <w:color w:val="2F5496" w:themeColor="accent1" w:themeShade="BF"/>
@@ -26106,7 +26479,7 @@
     <w:link w:val="Heading4"/>
     <w:uiPriority w:val="9"/>
     <w:semiHidden/>
-    <w:rsid w:val="0083468D"/>
+    <w:rsid w:val="00156B63"/>
     <w:rPr>
       <w:rFonts w:eastAsiaTheme="majorEastAsia" w:cstheme="majorBidi"/>
       <w:i/>
@@ -26120,7 +26493,7 @@
     <w:link w:val="Heading5"/>
     <w:uiPriority w:val="9"/>
     <w:semiHidden/>
-    <w:rsid w:val="0083468D"/>
+    <w:rsid w:val="00156B63"/>
     <w:rPr>
       <w:rFonts w:eastAsiaTheme="majorEastAsia" w:cstheme="majorBidi"/>
       <w:color w:val="2F5496" w:themeColor="accent1" w:themeShade="BF"/>
@@ -26132,7 +26505,7 @@
     <w:link w:val="Heading6"/>
     <w:uiPriority w:val="9"/>
     <w:semiHidden/>
-    <w:rsid w:val="0083468D"/>
+    <w:rsid w:val="00156B63"/>
     <w:rPr>
       <w:rFonts w:eastAsiaTheme="majorEastAsia" w:cstheme="majorBidi"/>
       <w:i/>
@@ -26146,7 +26519,7 @@
     <w:link w:val="Heading7"/>
     <w:uiPriority w:val="9"/>
     <w:semiHidden/>
-    <w:rsid w:val="0083468D"/>
+    <w:rsid w:val="00156B63"/>
     <w:rPr>
       <w:rFonts w:eastAsiaTheme="majorEastAsia" w:cstheme="majorBidi"/>
       <w:color w:val="595959" w:themeColor="text1" w:themeTint="A6"/>
@@ -26158,7 +26531,7 @@
     <w:link w:val="Heading8"/>
     <w:uiPriority w:val="9"/>
     <w:semiHidden/>
-    <w:rsid w:val="0083468D"/>
+    <w:rsid w:val="00156B63"/>
     <w:rPr>
       <w:rFonts w:eastAsiaTheme="majorEastAsia" w:cstheme="majorBidi"/>
       <w:i/>
@@ -26172,7 +26545,7 @@
     <w:link w:val="Heading9"/>
     <w:uiPriority w:val="9"/>
     <w:semiHidden/>
-    <w:rsid w:val="0083468D"/>
+    <w:rsid w:val="00156B63"/>
     <w:rPr>
       <w:rFonts w:eastAsiaTheme="majorEastAsia" w:cstheme="majorBidi"/>
       <w:color w:val="272727" w:themeColor="text1" w:themeTint="D8"/>
@@ -26185,7 +26558,7 @@
     <w:link w:val="TitleChar"/>
     <w:uiPriority w:val="10"/>
     <w:qFormat/>
-    <w:rsid w:val="0083468D"/>
+    <w:rsid w:val="00156B63"/>
     <w:pPr>
       <w:spacing w:after="80" w:line="240" w:lineRule="auto"/>
       <w:contextualSpacing/>
@@ -26203,7 +26576,7 @@
     <w:basedOn w:val="DefaultParagraphFont"/>
     <w:link w:val="Title"/>
     <w:uiPriority w:val="10"/>
-    <w:rsid w:val="0083468D"/>
+    <w:rsid w:val="00156B63"/>
     <w:rPr>
       <w:rFonts w:asciiTheme="majorHAnsi" w:eastAsiaTheme="majorEastAsia" w:hAnsiTheme="majorHAnsi" w:cstheme="majorBidi"/>
       <w:spacing w:val="-10"/>
@@ -26219,7 +26592,7 @@
     <w:link w:val="SubtitleChar"/>
     <w:uiPriority w:val="11"/>
     <w:qFormat/>
-    <w:rsid w:val="0083468D"/>
+    <w:rsid w:val="00156B63"/>
     <w:pPr>
       <w:numPr>
         <w:ilvl w:val="1"/>
@@ -26238,7 +26611,7 @@
     <w:basedOn w:val="DefaultParagraphFont"/>
     <w:link w:val="Subtitle"/>
     <w:uiPriority w:val="11"/>
-    <w:rsid w:val="0083468D"/>
+    <w:rsid w:val="00156B63"/>
     <w:rPr>
       <w:rFonts w:eastAsiaTheme="majorEastAsia" w:cstheme="majorBidi"/>
       <w:color w:val="595959" w:themeColor="text1" w:themeTint="A6"/>
@@ -26254,7 +26627,7 @@
     <w:link w:val="QuoteChar"/>
     <w:uiPriority w:val="29"/>
     <w:qFormat/>
-    <w:rsid w:val="0083468D"/>
+    <w:rsid w:val="00156B63"/>
     <w:pPr>
       <w:spacing w:before="160"/>
       <w:jc w:val="center"/>
@@ -26270,7 +26643,7 @@
     <w:basedOn w:val="DefaultParagraphFont"/>
     <w:link w:val="Quote"/>
     <w:uiPriority w:val="29"/>
-    <w:rsid w:val="0083468D"/>
+    <w:rsid w:val="00156B63"/>
     <w:rPr>
       <w:i/>
       <w:iCs/>
@@ -26282,7 +26655,7 @@
     <w:basedOn w:val="Normal"/>
     <w:uiPriority w:val="34"/>
     <w:qFormat/>
-    <w:rsid w:val="0083468D"/>
+    <w:rsid w:val="00156B63"/>
     <w:pPr>
       <w:ind w:left="720"/>
       <w:contextualSpacing/>
@@ -26293,7 +26666,7 @@
     <w:basedOn w:val="DefaultParagraphFont"/>
     <w:uiPriority w:val="21"/>
     <w:qFormat/>
-    <w:rsid w:val="0083468D"/>
+    <w:rsid w:val="00156B63"/>
     <w:rPr>
       <w:i/>
       <w:iCs/>
@@ -26307,7 +26680,7 @@
     <w:link w:val="IntenseQuoteChar"/>
     <w:uiPriority w:val="30"/>
     <w:qFormat/>
-    <w:rsid w:val="0083468D"/>
+    <w:rsid w:val="00156B63"/>
     <w:pPr>
       <w:pBdr>
         <w:top w:val="single" w:sz="4" w:space="10" w:color="2F5496" w:themeColor="accent1" w:themeShade="BF"/>
@@ -26328,7 +26701,7 @@
     <w:basedOn w:val="DefaultParagraphFont"/>
     <w:link w:val="IntenseQuote"/>
     <w:uiPriority w:val="30"/>
-    <w:rsid w:val="0083468D"/>
+    <w:rsid w:val="00156B63"/>
     <w:rPr>
       <w:i/>
       <w:iCs/>
@@ -26340,7 +26713,7 @@
     <w:basedOn w:val="DefaultParagraphFont"/>
     <w:uiPriority w:val="32"/>
     <w:qFormat/>
-    <w:rsid w:val="0083468D"/>
+    <w:rsid w:val="00156B63"/>
     <w:rPr>
       <w:b/>
       <w:bCs/>

</xml_diff>

<commit_message>
Tambahkan penomoran halaman resmi dan footer Universitas Kristen Krida Wacana sesuai Pedoman Tugas Akhir FEB UKRIDA
</commit_message>
<xml_diff>
--- a/TOPIK_2_TAKSI_GREEN_SM/01_Naskah_Utama/Proposal_Skripsi_Taksi_Green_SM.docx
+++ b/TOPIK_2_TAKSI_GREEN_SM/01_Naskah_Utama/Proposal_Skripsi_Taksi_Green_SM.docx
@@ -12,20 +12,20 @@
           <w:noProof/>
         </w:rPr>
         <w:drawing>
-          <wp:inline distT="0" distB="0" distL="0" distR="0" wp14:anchorId="7A6BCB94" wp14:editId="4419B4D2">
+          <wp:inline distT="0" distB="0" distL="0" distR="0" wp14:anchorId="3B81755F" wp14:editId="20DBEDC6">
             <wp:extent cx="1152002" cy="1152002"/>
             <wp:effectExtent l="0" t="0" r="0" b="0"/>
-            <wp:docPr id="1571650728" name="Picture 1"/>
+            <wp:docPr id="475188979" name="Picture 1"/>
             <wp:cNvGraphicFramePr/>
             <a:graphic xmlns:a="http://schemas.openxmlformats.org/drawingml/2006/main">
               <a:graphicData uri="http://schemas.openxmlformats.org/drawingml/2006/picture">
                 <pic:pic xmlns:pic="http://schemas.openxmlformats.org/drawingml/2006/picture">
                   <pic:nvPicPr>
-                    <pic:cNvPr id="1571650728" name=""/>
+                    <pic:cNvPr id="475188979" name=""/>
                     <pic:cNvPicPr/>
                   </pic:nvPicPr>
                   <pic:blipFill>
-                    <a:blip r:embed="rId4" cstate="print">
+                    <a:blip r:embed="rId6" cstate="print">
                       <a:extLst>
                         <a:ext uri="{28A0092B-C50C-407E-A947-70E740481C1C}">
                           <a14:useLocalDpi xmlns:a14="http://schemas.microsoft.com/office/drawing/2010/main" val="0"/>
@@ -1792,16 +1792,33 @@
     </w:p>
     <w:p>
       <w:pPr>
-        <w:rPr>
-          <w:rFonts w:ascii="Times New Roman" w:hAnsi="Times New Roman" w:cs="Times New Roman"/>
-        </w:rPr>
-      </w:pPr>
-      <w:r>
-        <w:rPr>
-          <w:rFonts w:ascii="Times New Roman" w:hAnsi="Times New Roman" w:cs="Times New Roman"/>
-        </w:rPr>
-        <w:br w:type="page"/>
-      </w:r>
+        <w:spacing w:after="60" w:line="360" w:lineRule="auto"/>
+        <w:rPr>
+          <w:rFonts w:ascii="Times New Roman" w:hAnsi="Times New Roman" w:cs="Times New Roman"/>
+        </w:rPr>
+        <w:sectPr>
+          <w:headerReference w:type="even" r:id="rId7"/>
+          <w:headerReference w:type="default" r:id="rId8"/>
+          <w:footerReference w:type="even" r:id="rId9"/>
+          <w:footerReference w:type="default" r:id="rId10"/>
+          <w:headerReference w:type="first" r:id="rId11"/>
+          <w:footerReference w:type="first" r:id="rId12"/>
+          <w:pgSz w:w="11907" w:h="16839"/>
+          <w:pgMar w:top="1701" w:right="1701" w:bottom="1701" w:left="2268" w:header="708" w:footer="708" w:gutter="0"/>
+          <w:pgNumType w:fmt="lowerRoman" w:start="1"/>
+          <w:cols w:space="708"/>
+          <w:titlePg/>
+          <w:docGrid w:linePitch="360"/>
+        </w:sectPr>
+      </w:pPr>
+    </w:p>
+    <w:p>
+      <w:pPr>
+        <w:spacing w:after="60" w:line="360" w:lineRule="auto"/>
+        <w:rPr>
+          <w:rFonts w:ascii="Times New Roman" w:hAnsi="Times New Roman" w:cs="Times New Roman"/>
+        </w:rPr>
+      </w:pPr>
     </w:p>
     <w:p>
       <w:pPr>
@@ -25796,13 +25813,226 @@
       </w:pPr>
     </w:p>
     <w:sectPr>
+      <w:footerReference w:type="default" r:id="rId13"/>
       <w:pgSz w:w="11907" w:h="16839"/>
       <w:pgMar w:top="1701" w:right="1701" w:bottom="1701" w:left="2268" w:header="708" w:footer="708" w:gutter="0"/>
+      <w:pgNumType w:start="1"/>
       <w:cols w:space="708"/>
       <w:docGrid w:linePitch="360"/>
     </w:sectPr>
   </w:body>
 </w:document>
+</file>
+
+<file path=word/endnotes.xml><?xml version="1.0" encoding="utf-8"?>
+<w:endnotes xmlns:wpc="http://schemas.microsoft.com/office/word/2010/wordprocessingCanvas" xmlns:cx="http://schemas.microsoft.com/office/drawing/2014/chartex" xmlns:cx1="http://schemas.microsoft.com/office/drawing/2015/9/8/chartex" xmlns:cx2="http://schemas.microsoft.com/office/drawing/2015/10/21/chartex" xmlns:cx3="http://schemas.microsoft.com/office/drawing/2016/5/9/chartex" xmlns:cx4="http://schemas.microsoft.com/office/drawing/2016/5/10/chartex" xmlns:cx5="http://schemas.microsoft.com/office/drawing/2016/5/11/chartex" xmlns:cx6="http://schemas.microsoft.com/office/drawing/2016/5/12/chartex" xmlns:cx7="http://schemas.microsoft.com/office/drawing/2016/5/13/chartex" xmlns:cx8="http://schemas.microsoft.com/office/drawing/2016/5/14/chartex" xmlns:mc="http://schemas.openxmlformats.org/markup-compatibility/2006" xmlns:aink="http://schemas.microsoft.com/office/drawing/2016/ink" xmlns:am3d="http://schemas.microsoft.com/office/drawing/2017/model3d" xmlns:o="urn:schemas-microsoft-com:office:office" xmlns:oel="http://schemas.microsoft.com/office/2019/extlst" xmlns:r="http://schemas.openxmlformats.org/officeDocument/2006/relationships" xmlns:m="http://schemas.openxmlformats.org/officeDocument/2006/math" xmlns:v="urn:schemas-microsoft-com:vml" xmlns:wp14="http://schemas.microsoft.com/office/word/2010/wordprocessingDrawing" xmlns:wp="http://schemas.openxmlformats.org/drawingml/2006/wordprocessingDrawing" xmlns:w10="urn:schemas-microsoft-com:office:word" xmlns:w="http://schemas.openxmlformats.org/wordprocessingml/2006/main" xmlns:w14="http://schemas.microsoft.com/office/word/2010/wordml" xmlns:w15="http://schemas.microsoft.com/office/word/2012/wordml" xmlns:w16cex="http://schemas.microsoft.com/office/word/2018/wordml/cex" xmlns:w16cid="http://schemas.microsoft.com/office/word/2016/wordml/cid" xmlns:w16="http://schemas.microsoft.com/office/word/2018/wordml" xmlns:w16du="http://schemas.microsoft.com/office/word/2023/wordml/word16du" xmlns:w16sdtdh="http://schemas.microsoft.com/office/word/2020/wordml/sdtdatahash" xmlns:w16sdtfl="http://schemas.microsoft.com/office/word/2024/wordml/sdtformatlock" xmlns:w16se="http://schemas.microsoft.com/office/word/2015/wordml/symex" xmlns:wpg="http://schemas.microsoft.com/office/word/2010/wordprocessingGroup" xmlns:wpi="http://schemas.microsoft.com/office/word/2010/wordprocessingInk" xmlns:wne="http://schemas.microsoft.com/office/word/2006/wordml" xmlns:wps="http://schemas.microsoft.com/office/word/2010/wordprocessingShape" mc:Ignorable="w14 w15 w16se w16cid w16 w16cex w16sdtdh w16sdtfl w16du wp14">
+  <w:endnote w:type="separator" w:id="-1">
+    <w:p>
+      <w:pPr>
+        <w:spacing w:after="0" w:line="240" w:lineRule="auto"/>
+      </w:pPr>
+      <w:r>
+        <w:separator/>
+      </w:r>
+    </w:p>
+  </w:endnote>
+  <w:endnote w:type="continuationSeparator" w:id="0">
+    <w:p>
+      <w:pPr>
+        <w:spacing w:after="0" w:line="240" w:lineRule="auto"/>
+      </w:pPr>
+      <w:r>
+        <w:continuationSeparator/>
+      </w:r>
+    </w:p>
+  </w:endnote>
+</w:endnotes>
+</file>
+
+<file path=word/footer1.xml><?xml version="1.0" encoding="utf-8"?>
+<w:ftr xmlns:wpc="http://schemas.microsoft.com/office/word/2010/wordprocessingCanvas" xmlns:cx="http://schemas.microsoft.com/office/drawing/2014/chartex" xmlns:cx1="http://schemas.microsoft.com/office/drawing/2015/9/8/chartex" xmlns:cx2="http://schemas.microsoft.com/office/drawing/2015/10/21/chartex" xmlns:cx3="http://schemas.microsoft.com/office/drawing/2016/5/9/chartex" xmlns:cx4="http://schemas.microsoft.com/office/drawing/2016/5/10/chartex" xmlns:cx5="http://schemas.microsoft.com/office/drawing/2016/5/11/chartex" xmlns:cx6="http://schemas.microsoft.com/office/drawing/2016/5/12/chartex" xmlns:cx7="http://schemas.microsoft.com/office/drawing/2016/5/13/chartex" xmlns:cx8="http://schemas.microsoft.com/office/drawing/2016/5/14/chartex" xmlns:mc="http://schemas.openxmlformats.org/markup-compatibility/2006" xmlns:aink="http://schemas.microsoft.com/office/drawing/2016/ink" xmlns:am3d="http://schemas.microsoft.com/office/drawing/2017/model3d" xmlns:o="urn:schemas-microsoft-com:office:office" xmlns:oel="http://schemas.microsoft.com/office/2019/extlst" xmlns:r="http://schemas.openxmlformats.org/officeDocument/2006/relationships" xmlns:m="http://schemas.openxmlformats.org/officeDocument/2006/math" xmlns:v="urn:schemas-microsoft-com:vml" xmlns:wp14="http://schemas.microsoft.com/office/word/2010/wordprocessingDrawing" xmlns:wp="http://schemas.openxmlformats.org/drawingml/2006/wordprocessingDrawing" xmlns:w10="urn:schemas-microsoft-com:office:word" xmlns:w="http://schemas.openxmlformats.org/wordprocessingml/2006/main" xmlns:w14="http://schemas.microsoft.com/office/word/2010/wordml" xmlns:w15="http://schemas.microsoft.com/office/word/2012/wordml" xmlns:w16cex="http://schemas.microsoft.com/office/word/2018/wordml/cex" xmlns:w16cid="http://schemas.microsoft.com/office/word/2016/wordml/cid" xmlns:w16="http://schemas.microsoft.com/office/word/2018/wordml" xmlns:w16du="http://schemas.microsoft.com/office/word/2023/wordml/word16du" xmlns:w16sdtdh="http://schemas.microsoft.com/office/word/2020/wordml/sdtdatahash" xmlns:w16sdtfl="http://schemas.microsoft.com/office/word/2024/wordml/sdtformatlock" xmlns:w16se="http://schemas.microsoft.com/office/word/2015/wordml/symex" xmlns:wpg="http://schemas.microsoft.com/office/word/2010/wordprocessingGroup" xmlns:wpi="http://schemas.microsoft.com/office/word/2010/wordprocessingInk" xmlns:wne="http://schemas.microsoft.com/office/word/2006/wordml" xmlns:wps="http://schemas.microsoft.com/office/word/2010/wordprocessingShape" mc:Ignorable="w14 w15 w16se w16cid w16 w16cex w16sdtdh w16sdtfl w16du wp14">
+  <w:p>
+    <w:pPr>
+      <w:pStyle w:val="Footer"/>
+    </w:pPr>
+  </w:p>
+</w:ftr>
+</file>
+
+<file path=word/footer2.xml><?xml version="1.0" encoding="utf-8"?>
+<w:ftr xmlns:wpc="http://schemas.microsoft.com/office/word/2010/wordprocessingCanvas" xmlns:cx="http://schemas.microsoft.com/office/drawing/2014/chartex" xmlns:cx1="http://schemas.microsoft.com/office/drawing/2015/9/8/chartex" xmlns:cx2="http://schemas.microsoft.com/office/drawing/2015/10/21/chartex" xmlns:cx3="http://schemas.microsoft.com/office/drawing/2016/5/9/chartex" xmlns:cx4="http://schemas.microsoft.com/office/drawing/2016/5/10/chartex" xmlns:cx5="http://schemas.microsoft.com/office/drawing/2016/5/11/chartex" xmlns:cx6="http://schemas.microsoft.com/office/drawing/2016/5/12/chartex" xmlns:cx7="http://schemas.microsoft.com/office/drawing/2016/5/13/chartex" xmlns:cx8="http://schemas.microsoft.com/office/drawing/2016/5/14/chartex" xmlns:mc="http://schemas.openxmlformats.org/markup-compatibility/2006" xmlns:aink="http://schemas.microsoft.com/office/drawing/2016/ink" xmlns:am3d="http://schemas.microsoft.com/office/drawing/2017/model3d" xmlns:o="urn:schemas-microsoft-com:office:office" xmlns:oel="http://schemas.microsoft.com/office/2019/extlst" xmlns:r="http://schemas.openxmlformats.org/officeDocument/2006/relationships" xmlns:m="http://schemas.openxmlformats.org/officeDocument/2006/math" xmlns:v="urn:schemas-microsoft-com:vml" xmlns:wp14="http://schemas.microsoft.com/office/word/2010/wordprocessingDrawing" xmlns:wp="http://schemas.openxmlformats.org/drawingml/2006/wordprocessingDrawing" xmlns:w10="urn:schemas-microsoft-com:office:word" xmlns:w="http://schemas.openxmlformats.org/wordprocessingml/2006/main" xmlns:w14="http://schemas.microsoft.com/office/word/2010/wordml" xmlns:w15="http://schemas.microsoft.com/office/word/2012/wordml" xmlns:w16cex="http://schemas.microsoft.com/office/word/2018/wordml/cex" xmlns:w16cid="http://schemas.microsoft.com/office/word/2016/wordml/cid" xmlns:w16="http://schemas.microsoft.com/office/word/2018/wordml" xmlns:w16du="http://schemas.microsoft.com/office/word/2023/wordml/word16du" xmlns:w16sdtdh="http://schemas.microsoft.com/office/word/2020/wordml/sdtdatahash" xmlns:w16sdtfl="http://schemas.microsoft.com/office/word/2024/wordml/sdtformatlock" xmlns:w16se="http://schemas.microsoft.com/office/word/2015/wordml/symex" xmlns:wpg="http://schemas.microsoft.com/office/word/2010/wordprocessingGroup" xmlns:wpi="http://schemas.microsoft.com/office/word/2010/wordprocessingInk" xmlns:wne="http://schemas.microsoft.com/office/word/2006/wordml" xmlns:wps="http://schemas.microsoft.com/office/word/2010/wordprocessingShape" mc:Ignorable="w14 w15 w16se w16cid w16 w16cex w16sdtdh w16sdtfl w16du wp14">
+  <w:p>
+    <w:pPr>
+      <w:pStyle w:val="Footer"/>
+    </w:pPr>
+    <w:r>
+      <w:rPr>
+        <w:rFonts w:ascii="Times New Roman" w:hAnsi="Times New Roman" w:cs="Times New Roman"/>
+        <w:sz w:val="20"/>
+      </w:rPr>
+      <w:fldChar w:fldCharType="begin"/>
+    </w:r>
+    <w:r>
+      <w:rPr>
+        <w:rFonts w:ascii="Times New Roman" w:hAnsi="Times New Roman" w:cs="Times New Roman"/>
+        <w:sz w:val="20"/>
+      </w:rPr>
+      <w:instrText xml:space="preserve"> PAGE  \* MERGEFORMAT </w:instrText>
+    </w:r>
+    <w:r>
+      <w:rPr>
+        <w:rFonts w:ascii="Times New Roman" w:hAnsi="Times New Roman" w:cs="Times New Roman"/>
+        <w:sz w:val="20"/>
+      </w:rPr>
+      <w:fldChar w:fldCharType="separate"/>
+    </w:r>
+    <w:r>
+      <w:rPr>
+        <w:rFonts w:ascii="Times New Roman" w:hAnsi="Times New Roman" w:cs="Times New Roman"/>
+        <w:noProof/>
+        <w:sz w:val="20"/>
+      </w:rPr>
+      <w:t>i</w:t>
+    </w:r>
+    <w:r>
+      <w:rPr>
+        <w:rFonts w:ascii="Times New Roman" w:hAnsi="Times New Roman" w:cs="Times New Roman"/>
+        <w:sz w:val="20"/>
+      </w:rPr>
+      <w:fldChar w:fldCharType="end"/>
+    </w:r>
+  </w:p>
+</w:ftr>
+</file>
+
+<file path=word/footer3.xml><?xml version="1.0" encoding="utf-8"?>
+<w:ftr xmlns:wpc="http://schemas.microsoft.com/office/word/2010/wordprocessingCanvas" xmlns:cx="http://schemas.microsoft.com/office/drawing/2014/chartex" xmlns:cx1="http://schemas.microsoft.com/office/drawing/2015/9/8/chartex" xmlns:cx2="http://schemas.microsoft.com/office/drawing/2015/10/21/chartex" xmlns:cx3="http://schemas.microsoft.com/office/drawing/2016/5/9/chartex" xmlns:cx4="http://schemas.microsoft.com/office/drawing/2016/5/10/chartex" xmlns:cx5="http://schemas.microsoft.com/office/drawing/2016/5/11/chartex" xmlns:cx6="http://schemas.microsoft.com/office/drawing/2016/5/12/chartex" xmlns:cx7="http://schemas.microsoft.com/office/drawing/2016/5/13/chartex" xmlns:cx8="http://schemas.microsoft.com/office/drawing/2016/5/14/chartex" xmlns:mc="http://schemas.openxmlformats.org/markup-compatibility/2006" xmlns:aink="http://schemas.microsoft.com/office/drawing/2016/ink" xmlns:am3d="http://schemas.microsoft.com/office/drawing/2017/model3d" xmlns:o="urn:schemas-microsoft-com:office:office" xmlns:oel="http://schemas.microsoft.com/office/2019/extlst" xmlns:r="http://schemas.openxmlformats.org/officeDocument/2006/relationships" xmlns:m="http://schemas.openxmlformats.org/officeDocument/2006/math" xmlns:v="urn:schemas-microsoft-com:vml" xmlns:wp14="http://schemas.microsoft.com/office/word/2010/wordprocessingDrawing" xmlns:wp="http://schemas.openxmlformats.org/drawingml/2006/wordprocessingDrawing" xmlns:w10="urn:schemas-microsoft-com:office:word" xmlns:w="http://schemas.openxmlformats.org/wordprocessingml/2006/main" xmlns:w14="http://schemas.microsoft.com/office/word/2010/wordml" xmlns:w15="http://schemas.microsoft.com/office/word/2012/wordml" xmlns:w16cex="http://schemas.microsoft.com/office/word/2018/wordml/cex" xmlns:w16cid="http://schemas.microsoft.com/office/word/2016/wordml/cid" xmlns:w16="http://schemas.microsoft.com/office/word/2018/wordml" xmlns:w16du="http://schemas.microsoft.com/office/word/2023/wordml/word16du" xmlns:w16sdtdh="http://schemas.microsoft.com/office/word/2020/wordml/sdtdatahash" xmlns:w16sdtfl="http://schemas.microsoft.com/office/word/2024/wordml/sdtformatlock" xmlns:w16se="http://schemas.microsoft.com/office/word/2015/wordml/symex" xmlns:wpg="http://schemas.microsoft.com/office/word/2010/wordprocessingGroup" xmlns:wpi="http://schemas.microsoft.com/office/word/2010/wordprocessingInk" xmlns:wne="http://schemas.microsoft.com/office/word/2006/wordml" xmlns:wps="http://schemas.microsoft.com/office/word/2010/wordprocessingShape" mc:Ignorable="w14 w15 w16se w16cid w16 w16cex w16sdtdh w16sdtfl w16du wp14">
+  <w:p>
+    <w:pPr>
+      <w:pStyle w:val="Footer"/>
+    </w:pPr>
+  </w:p>
+</w:ftr>
+</file>
+
+<file path=word/footer4.xml><?xml version="1.0" encoding="utf-8"?>
+<w:ftr xmlns:wpc="http://schemas.microsoft.com/office/word/2010/wordprocessingCanvas" xmlns:cx="http://schemas.microsoft.com/office/drawing/2014/chartex" xmlns:cx1="http://schemas.microsoft.com/office/drawing/2015/9/8/chartex" xmlns:cx2="http://schemas.microsoft.com/office/drawing/2015/10/21/chartex" xmlns:cx3="http://schemas.microsoft.com/office/drawing/2016/5/9/chartex" xmlns:cx4="http://schemas.microsoft.com/office/drawing/2016/5/10/chartex" xmlns:cx5="http://schemas.microsoft.com/office/drawing/2016/5/11/chartex" xmlns:cx6="http://schemas.microsoft.com/office/drawing/2016/5/12/chartex" xmlns:cx7="http://schemas.microsoft.com/office/drawing/2016/5/13/chartex" xmlns:cx8="http://schemas.microsoft.com/office/drawing/2016/5/14/chartex" xmlns:mc="http://schemas.openxmlformats.org/markup-compatibility/2006" xmlns:aink="http://schemas.microsoft.com/office/drawing/2016/ink" xmlns:am3d="http://schemas.microsoft.com/office/drawing/2017/model3d" xmlns:o="urn:schemas-microsoft-com:office:office" xmlns:oel="http://schemas.microsoft.com/office/2019/extlst" xmlns:r="http://schemas.openxmlformats.org/officeDocument/2006/relationships" xmlns:m="http://schemas.openxmlformats.org/officeDocument/2006/math" xmlns:v="urn:schemas-microsoft-com:vml" xmlns:wp14="http://schemas.microsoft.com/office/word/2010/wordprocessingDrawing" xmlns:wp="http://schemas.openxmlformats.org/drawingml/2006/wordprocessingDrawing" xmlns:w10="urn:schemas-microsoft-com:office:word" xmlns:w="http://schemas.openxmlformats.org/wordprocessingml/2006/main" xmlns:w14="http://schemas.microsoft.com/office/word/2010/wordml" xmlns:w15="http://schemas.microsoft.com/office/word/2012/wordml" xmlns:w16cex="http://schemas.microsoft.com/office/word/2018/wordml/cex" xmlns:w16cid="http://schemas.microsoft.com/office/word/2016/wordml/cid" xmlns:w16="http://schemas.microsoft.com/office/word/2018/wordml" xmlns:w16du="http://schemas.microsoft.com/office/word/2023/wordml/word16du" xmlns:w16sdtdh="http://schemas.microsoft.com/office/word/2020/wordml/sdtdatahash" xmlns:w16sdtfl="http://schemas.microsoft.com/office/word/2024/wordml/sdtformatlock" xmlns:w16se="http://schemas.microsoft.com/office/word/2015/wordml/symex" xmlns:wpg="http://schemas.microsoft.com/office/word/2010/wordprocessingGroup" xmlns:wpi="http://schemas.microsoft.com/office/word/2010/wordprocessingInk" xmlns:wne="http://schemas.microsoft.com/office/word/2006/wordml" xmlns:wps="http://schemas.microsoft.com/office/word/2010/wordprocessingShape" mc:Ignorable="w14 w15 w16se w16cid w16 w16cex w16sdtdh w16sdtfl w16du wp14">
+  <w:p>
+    <w:pPr>
+      <w:pStyle w:val="Footer"/>
+      <w:jc w:val="right"/>
+      <w:rPr>
+        <w:rFonts w:ascii="Times New Roman" w:hAnsi="Times New Roman" w:cs="Times New Roman"/>
+        <w:b/>
+        <w:sz w:val="20"/>
+      </w:rPr>
+    </w:pPr>
+    <w:r>
+      <w:rPr>
+        <w:rFonts w:ascii="Times New Roman" w:hAnsi="Times New Roman" w:cs="Times New Roman"/>
+        <w:b/>
+        <w:sz w:val="20"/>
+      </w:rPr>
+      <w:t xml:space="preserve">Universitas Kristen Krida Wacana | </w:t>
+    </w:r>
+    <w:r>
+      <w:rPr>
+        <w:rFonts w:ascii="Times New Roman" w:hAnsi="Times New Roman" w:cs="Times New Roman"/>
+        <w:b/>
+        <w:sz w:val="20"/>
+      </w:rPr>
+      <w:fldChar w:fldCharType="begin"/>
+    </w:r>
+    <w:r>
+      <w:rPr>
+        <w:rFonts w:ascii="Times New Roman" w:hAnsi="Times New Roman" w:cs="Times New Roman"/>
+        <w:b/>
+        <w:sz w:val="20"/>
+      </w:rPr>
+      <w:instrText xml:space="preserve"> PAGE  \* MERGEFORMAT </w:instrText>
+    </w:r>
+    <w:r>
+      <w:rPr>
+        <w:rFonts w:ascii="Times New Roman" w:hAnsi="Times New Roman" w:cs="Times New Roman"/>
+        <w:b/>
+        <w:sz w:val="20"/>
+      </w:rPr>
+      <w:fldChar w:fldCharType="separate"/>
+    </w:r>
+    <w:r>
+      <w:rPr>
+        <w:rFonts w:ascii="Times New Roman" w:hAnsi="Times New Roman" w:cs="Times New Roman"/>
+        <w:b/>
+        <w:noProof/>
+        <w:sz w:val="20"/>
+      </w:rPr>
+      <w:t>1</w:t>
+    </w:r>
+    <w:r>
+      <w:rPr>
+        <w:rFonts w:ascii="Times New Roman" w:hAnsi="Times New Roman" w:cs="Times New Roman"/>
+        <w:b/>
+        <w:sz w:val="20"/>
+      </w:rPr>
+      <w:fldChar w:fldCharType="end"/>
+    </w:r>
+  </w:p>
+</w:ftr>
+</file>
+
+<file path=word/footnotes.xml><?xml version="1.0" encoding="utf-8"?>
+<w:footnotes xmlns:wpc="http://schemas.microsoft.com/office/word/2010/wordprocessingCanvas" xmlns:cx="http://schemas.microsoft.com/office/drawing/2014/chartex" xmlns:cx1="http://schemas.microsoft.com/office/drawing/2015/9/8/chartex" xmlns:cx2="http://schemas.microsoft.com/office/drawing/2015/10/21/chartex" xmlns:cx3="http://schemas.microsoft.com/office/drawing/2016/5/9/chartex" xmlns:cx4="http://schemas.microsoft.com/office/drawing/2016/5/10/chartex" xmlns:cx5="http://schemas.microsoft.com/office/drawing/2016/5/11/chartex" xmlns:cx6="http://schemas.microsoft.com/office/drawing/2016/5/12/chartex" xmlns:cx7="http://schemas.microsoft.com/office/drawing/2016/5/13/chartex" xmlns:cx8="http://schemas.microsoft.com/office/drawing/2016/5/14/chartex" xmlns:mc="http://schemas.openxmlformats.org/markup-compatibility/2006" xmlns:aink="http://schemas.microsoft.com/office/drawing/2016/ink" xmlns:am3d="http://schemas.microsoft.com/office/drawing/2017/model3d" xmlns:o="urn:schemas-microsoft-com:office:office" xmlns:oel="http://schemas.microsoft.com/office/2019/extlst" xmlns:r="http://schemas.openxmlformats.org/officeDocument/2006/relationships" xmlns:m="http://schemas.openxmlformats.org/officeDocument/2006/math" xmlns:v="urn:schemas-microsoft-com:vml" xmlns:wp14="http://schemas.microsoft.com/office/word/2010/wordprocessingDrawing" xmlns:wp="http://schemas.openxmlformats.org/drawingml/2006/wordprocessingDrawing" xmlns:w10="urn:schemas-microsoft-com:office:word" xmlns:w="http://schemas.openxmlformats.org/wordprocessingml/2006/main" xmlns:w14="http://schemas.microsoft.com/office/word/2010/wordml" xmlns:w15="http://schemas.microsoft.com/office/word/2012/wordml" xmlns:w16cex="http://schemas.microsoft.com/office/word/2018/wordml/cex" xmlns:w16cid="http://schemas.microsoft.com/office/word/2016/wordml/cid" xmlns:w16="http://schemas.microsoft.com/office/word/2018/wordml" xmlns:w16du="http://schemas.microsoft.com/office/word/2023/wordml/word16du" xmlns:w16sdtdh="http://schemas.microsoft.com/office/word/2020/wordml/sdtdatahash" xmlns:w16sdtfl="http://schemas.microsoft.com/office/word/2024/wordml/sdtformatlock" xmlns:w16se="http://schemas.microsoft.com/office/word/2015/wordml/symex" xmlns:wpg="http://schemas.microsoft.com/office/word/2010/wordprocessingGroup" xmlns:wpi="http://schemas.microsoft.com/office/word/2010/wordprocessingInk" xmlns:wne="http://schemas.microsoft.com/office/word/2006/wordml" xmlns:wps="http://schemas.microsoft.com/office/word/2010/wordprocessingShape" mc:Ignorable="w14 w15 w16se w16cid w16 w16cex w16sdtdh w16sdtfl w16du wp14">
+  <w:footnote w:type="separator" w:id="-1">
+    <w:p>
+      <w:pPr>
+        <w:spacing w:after="0" w:line="240" w:lineRule="auto"/>
+      </w:pPr>
+      <w:r>
+        <w:separator/>
+      </w:r>
+    </w:p>
+  </w:footnote>
+  <w:footnote w:type="continuationSeparator" w:id="0">
+    <w:p>
+      <w:pPr>
+        <w:spacing w:after="0" w:line="240" w:lineRule="auto"/>
+      </w:pPr>
+      <w:r>
+        <w:continuationSeparator/>
+      </w:r>
+    </w:p>
+  </w:footnote>
+</w:footnotes>
+</file>
+
+<file path=word/header1.xml><?xml version="1.0" encoding="utf-8"?>
+<w:hdr xmlns:wpc="http://schemas.microsoft.com/office/word/2010/wordprocessingCanvas" xmlns:cx="http://schemas.microsoft.com/office/drawing/2014/chartex" xmlns:cx1="http://schemas.microsoft.com/office/drawing/2015/9/8/chartex" xmlns:cx2="http://schemas.microsoft.com/office/drawing/2015/10/21/chartex" xmlns:cx3="http://schemas.microsoft.com/office/drawing/2016/5/9/chartex" xmlns:cx4="http://schemas.microsoft.com/office/drawing/2016/5/10/chartex" xmlns:cx5="http://schemas.microsoft.com/office/drawing/2016/5/11/chartex" xmlns:cx6="http://schemas.microsoft.com/office/drawing/2016/5/12/chartex" xmlns:cx7="http://schemas.microsoft.com/office/drawing/2016/5/13/chartex" xmlns:cx8="http://schemas.microsoft.com/office/drawing/2016/5/14/chartex" xmlns:mc="http://schemas.openxmlformats.org/markup-compatibility/2006" xmlns:aink="http://schemas.microsoft.com/office/drawing/2016/ink" xmlns:am3d="http://schemas.microsoft.com/office/drawing/2017/model3d" xmlns:o="urn:schemas-microsoft-com:office:office" xmlns:oel="http://schemas.microsoft.com/office/2019/extlst" xmlns:r="http://schemas.openxmlformats.org/officeDocument/2006/relationships" xmlns:m="http://schemas.openxmlformats.org/officeDocument/2006/math" xmlns:v="urn:schemas-microsoft-com:vml" xmlns:wp14="http://schemas.microsoft.com/office/word/2010/wordprocessingDrawing" xmlns:wp="http://schemas.openxmlformats.org/drawingml/2006/wordprocessingDrawing" xmlns:w10="urn:schemas-microsoft-com:office:word" xmlns:w="http://schemas.openxmlformats.org/wordprocessingml/2006/main" xmlns:w14="http://schemas.microsoft.com/office/word/2010/wordml" xmlns:w15="http://schemas.microsoft.com/office/word/2012/wordml" xmlns:w16cex="http://schemas.microsoft.com/office/word/2018/wordml/cex" xmlns:w16cid="http://schemas.microsoft.com/office/word/2016/wordml/cid" xmlns:w16="http://schemas.microsoft.com/office/word/2018/wordml" xmlns:w16du="http://schemas.microsoft.com/office/word/2023/wordml/word16du" xmlns:w16sdtdh="http://schemas.microsoft.com/office/word/2020/wordml/sdtdatahash" xmlns:w16sdtfl="http://schemas.microsoft.com/office/word/2024/wordml/sdtformatlock" xmlns:w16se="http://schemas.microsoft.com/office/word/2015/wordml/symex" xmlns:wpg="http://schemas.microsoft.com/office/word/2010/wordprocessingGroup" xmlns:wpi="http://schemas.microsoft.com/office/word/2010/wordprocessingInk" xmlns:wne="http://schemas.microsoft.com/office/word/2006/wordml" xmlns:wps="http://schemas.microsoft.com/office/word/2010/wordprocessingShape" mc:Ignorable="w14 w15 w16se w16cid w16 w16cex w16sdtdh w16sdtfl w16du wp14">
+  <w:p>
+    <w:pPr>
+      <w:pStyle w:val="Header"/>
+    </w:pPr>
+  </w:p>
+</w:hdr>
+</file>
+
+<file path=word/header2.xml><?xml version="1.0" encoding="utf-8"?>
+<w:hdr xmlns:wpc="http://schemas.microsoft.com/office/word/2010/wordprocessingCanvas" xmlns:cx="http://schemas.microsoft.com/office/drawing/2014/chartex" xmlns:cx1="http://schemas.microsoft.com/office/drawing/2015/9/8/chartex" xmlns:cx2="http://schemas.microsoft.com/office/drawing/2015/10/21/chartex" xmlns:cx3="http://schemas.microsoft.com/office/drawing/2016/5/9/chartex" xmlns:cx4="http://schemas.microsoft.com/office/drawing/2016/5/10/chartex" xmlns:cx5="http://schemas.microsoft.com/office/drawing/2016/5/11/chartex" xmlns:cx6="http://schemas.microsoft.com/office/drawing/2016/5/12/chartex" xmlns:cx7="http://schemas.microsoft.com/office/drawing/2016/5/13/chartex" xmlns:cx8="http://schemas.microsoft.com/office/drawing/2016/5/14/chartex" xmlns:mc="http://schemas.openxmlformats.org/markup-compatibility/2006" xmlns:aink="http://schemas.microsoft.com/office/drawing/2016/ink" xmlns:am3d="http://schemas.microsoft.com/office/drawing/2017/model3d" xmlns:o="urn:schemas-microsoft-com:office:office" xmlns:oel="http://schemas.microsoft.com/office/2019/extlst" xmlns:r="http://schemas.openxmlformats.org/officeDocument/2006/relationships" xmlns:m="http://schemas.openxmlformats.org/officeDocument/2006/math" xmlns:v="urn:schemas-microsoft-com:vml" xmlns:wp14="http://schemas.microsoft.com/office/word/2010/wordprocessingDrawing" xmlns:wp="http://schemas.openxmlformats.org/drawingml/2006/wordprocessingDrawing" xmlns:w10="urn:schemas-microsoft-com:office:word" xmlns:w="http://schemas.openxmlformats.org/wordprocessingml/2006/main" xmlns:w14="http://schemas.microsoft.com/office/word/2010/wordml" xmlns:w15="http://schemas.microsoft.com/office/word/2012/wordml" xmlns:w16cex="http://schemas.microsoft.com/office/word/2018/wordml/cex" xmlns:w16cid="http://schemas.microsoft.com/office/word/2016/wordml/cid" xmlns:w16="http://schemas.microsoft.com/office/word/2018/wordml" xmlns:w16du="http://schemas.microsoft.com/office/word/2023/wordml/word16du" xmlns:w16sdtdh="http://schemas.microsoft.com/office/word/2020/wordml/sdtdatahash" xmlns:w16sdtfl="http://schemas.microsoft.com/office/word/2024/wordml/sdtformatlock" xmlns:w16se="http://schemas.microsoft.com/office/word/2015/wordml/symex" xmlns:wpg="http://schemas.microsoft.com/office/word/2010/wordprocessingGroup" xmlns:wpi="http://schemas.microsoft.com/office/word/2010/wordprocessingInk" xmlns:wne="http://schemas.microsoft.com/office/word/2006/wordml" xmlns:wps="http://schemas.microsoft.com/office/word/2010/wordprocessingShape" mc:Ignorable="w14 w15 w16se w16cid w16 w16cex w16sdtdh w16sdtfl w16du wp14">
+  <w:p>
+    <w:pPr>
+      <w:pStyle w:val="Header"/>
+    </w:pPr>
+  </w:p>
+</w:hdr>
+</file>
+
+<file path=word/header3.xml><?xml version="1.0" encoding="utf-8"?>
+<w:hdr xmlns:wpc="http://schemas.microsoft.com/office/word/2010/wordprocessingCanvas" xmlns:cx="http://schemas.microsoft.com/office/drawing/2014/chartex" xmlns:cx1="http://schemas.microsoft.com/office/drawing/2015/9/8/chartex" xmlns:cx2="http://schemas.microsoft.com/office/drawing/2015/10/21/chartex" xmlns:cx3="http://schemas.microsoft.com/office/drawing/2016/5/9/chartex" xmlns:cx4="http://schemas.microsoft.com/office/drawing/2016/5/10/chartex" xmlns:cx5="http://schemas.microsoft.com/office/drawing/2016/5/11/chartex" xmlns:cx6="http://schemas.microsoft.com/office/drawing/2016/5/12/chartex" xmlns:cx7="http://schemas.microsoft.com/office/drawing/2016/5/13/chartex" xmlns:cx8="http://schemas.microsoft.com/office/drawing/2016/5/14/chartex" xmlns:mc="http://schemas.openxmlformats.org/markup-compatibility/2006" xmlns:aink="http://schemas.microsoft.com/office/drawing/2016/ink" xmlns:am3d="http://schemas.microsoft.com/office/drawing/2017/model3d" xmlns:o="urn:schemas-microsoft-com:office:office" xmlns:oel="http://schemas.microsoft.com/office/2019/extlst" xmlns:r="http://schemas.openxmlformats.org/officeDocument/2006/relationships" xmlns:m="http://schemas.openxmlformats.org/officeDocument/2006/math" xmlns:v="urn:schemas-microsoft-com:vml" xmlns:wp14="http://schemas.microsoft.com/office/word/2010/wordprocessingDrawing" xmlns:wp="http://schemas.openxmlformats.org/drawingml/2006/wordprocessingDrawing" xmlns:w10="urn:schemas-microsoft-com:office:word" xmlns:w="http://schemas.openxmlformats.org/wordprocessingml/2006/main" xmlns:w14="http://schemas.microsoft.com/office/word/2010/wordml" xmlns:w15="http://schemas.microsoft.com/office/word/2012/wordml" xmlns:w16cex="http://schemas.microsoft.com/office/word/2018/wordml/cex" xmlns:w16cid="http://schemas.microsoft.com/office/word/2016/wordml/cid" xmlns:w16="http://schemas.microsoft.com/office/word/2018/wordml" xmlns:w16du="http://schemas.microsoft.com/office/word/2023/wordml/word16du" xmlns:w16sdtdh="http://schemas.microsoft.com/office/word/2020/wordml/sdtdatahash" xmlns:w16sdtfl="http://schemas.microsoft.com/office/word/2024/wordml/sdtformatlock" xmlns:w16se="http://schemas.microsoft.com/office/word/2015/wordml/symex" xmlns:wpg="http://schemas.microsoft.com/office/word/2010/wordprocessingGroup" xmlns:wpi="http://schemas.microsoft.com/office/word/2010/wordprocessingInk" xmlns:wne="http://schemas.microsoft.com/office/word/2006/wordml" xmlns:wps="http://schemas.microsoft.com/office/word/2010/wordprocessingShape" mc:Ignorable="w14 w15 w16se w16cid w16 w16cex w16sdtdh w16sdtfl w16du wp14">
+  <w:p>
+    <w:pPr>
+      <w:pStyle w:val="Header"/>
+    </w:pPr>
+  </w:p>
+</w:hdr>
 </file>
 
 <file path=word/styles.xml><?xml version="1.0" encoding="utf-8"?>
@@ -26213,7 +26443,7 @@
     <w:link w:val="Heading1Char"/>
     <w:uiPriority w:val="9"/>
     <w:qFormat/>
-    <w:rsid w:val="00156B63"/>
+    <w:rsid w:val="00E2545A"/>
     <w:pPr>
       <w:keepNext/>
       <w:keepLines/>
@@ -26236,7 +26466,7 @@
     <w:semiHidden/>
     <w:unhideWhenUsed/>
     <w:qFormat/>
-    <w:rsid w:val="00156B63"/>
+    <w:rsid w:val="00E2545A"/>
     <w:pPr>
       <w:keepNext/>
       <w:keepLines/>
@@ -26259,7 +26489,7 @@
     <w:semiHidden/>
     <w:unhideWhenUsed/>
     <w:qFormat/>
-    <w:rsid w:val="00156B63"/>
+    <w:rsid w:val="00E2545A"/>
     <w:pPr>
       <w:keepNext/>
       <w:keepLines/>
@@ -26282,7 +26512,7 @@
     <w:semiHidden/>
     <w:unhideWhenUsed/>
     <w:qFormat/>
-    <w:rsid w:val="00156B63"/>
+    <w:rsid w:val="00E2545A"/>
     <w:pPr>
       <w:keepNext/>
       <w:keepLines/>
@@ -26305,7 +26535,7 @@
     <w:semiHidden/>
     <w:unhideWhenUsed/>
     <w:qFormat/>
-    <w:rsid w:val="00156B63"/>
+    <w:rsid w:val="00E2545A"/>
     <w:pPr>
       <w:keepNext/>
       <w:keepLines/>
@@ -26326,7 +26556,7 @@
     <w:semiHidden/>
     <w:unhideWhenUsed/>
     <w:qFormat/>
-    <w:rsid w:val="00156B63"/>
+    <w:rsid w:val="00E2545A"/>
     <w:pPr>
       <w:keepNext/>
       <w:keepLines/>
@@ -26349,7 +26579,7 @@
     <w:semiHidden/>
     <w:unhideWhenUsed/>
     <w:qFormat/>
-    <w:rsid w:val="00156B63"/>
+    <w:rsid w:val="00E2545A"/>
     <w:pPr>
       <w:keepNext/>
       <w:keepLines/>
@@ -26370,7 +26600,7 @@
     <w:semiHidden/>
     <w:unhideWhenUsed/>
     <w:qFormat/>
-    <w:rsid w:val="00156B63"/>
+    <w:rsid w:val="00E2545A"/>
     <w:pPr>
       <w:keepNext/>
       <w:keepLines/>
@@ -26393,7 +26623,7 @@
     <w:semiHidden/>
     <w:unhideWhenUsed/>
     <w:qFormat/>
-    <w:rsid w:val="00156B63"/>
+    <w:rsid w:val="00E2545A"/>
     <w:pPr>
       <w:keepNext/>
       <w:keepLines/>
@@ -26437,7 +26667,7 @@
     <w:basedOn w:val="DefaultParagraphFont"/>
     <w:link w:val="Heading1"/>
     <w:uiPriority w:val="9"/>
-    <w:rsid w:val="00156B63"/>
+    <w:rsid w:val="00E2545A"/>
     <w:rPr>
       <w:rFonts w:asciiTheme="majorHAnsi" w:eastAsiaTheme="majorEastAsia" w:hAnsiTheme="majorHAnsi" w:cstheme="majorBidi"/>
       <w:color w:val="2F5496" w:themeColor="accent1" w:themeShade="BF"/>
@@ -26451,7 +26681,7 @@
     <w:link w:val="Heading2"/>
     <w:uiPriority w:val="9"/>
     <w:semiHidden/>
-    <w:rsid w:val="00156B63"/>
+    <w:rsid w:val="00E2545A"/>
     <w:rPr>
       <w:rFonts w:asciiTheme="majorHAnsi" w:eastAsiaTheme="majorEastAsia" w:hAnsiTheme="majorHAnsi" w:cstheme="majorBidi"/>
       <w:color w:val="2F5496" w:themeColor="accent1" w:themeShade="BF"/>
@@ -26465,7 +26695,7 @@
     <w:link w:val="Heading3"/>
     <w:uiPriority w:val="9"/>
     <w:semiHidden/>
-    <w:rsid w:val="00156B63"/>
+    <w:rsid w:val="00E2545A"/>
     <w:rPr>
       <w:rFonts w:eastAsiaTheme="majorEastAsia" w:cstheme="majorBidi"/>
       <w:color w:val="2F5496" w:themeColor="accent1" w:themeShade="BF"/>
@@ -26479,7 +26709,7 @@
     <w:link w:val="Heading4"/>
     <w:uiPriority w:val="9"/>
     <w:semiHidden/>
-    <w:rsid w:val="00156B63"/>
+    <w:rsid w:val="00E2545A"/>
     <w:rPr>
       <w:rFonts w:eastAsiaTheme="majorEastAsia" w:cstheme="majorBidi"/>
       <w:i/>
@@ -26493,7 +26723,7 @@
     <w:link w:val="Heading5"/>
     <w:uiPriority w:val="9"/>
     <w:semiHidden/>
-    <w:rsid w:val="00156B63"/>
+    <w:rsid w:val="00E2545A"/>
     <w:rPr>
       <w:rFonts w:eastAsiaTheme="majorEastAsia" w:cstheme="majorBidi"/>
       <w:color w:val="2F5496" w:themeColor="accent1" w:themeShade="BF"/>
@@ -26505,7 +26735,7 @@
     <w:link w:val="Heading6"/>
     <w:uiPriority w:val="9"/>
     <w:semiHidden/>
-    <w:rsid w:val="00156B63"/>
+    <w:rsid w:val="00E2545A"/>
     <w:rPr>
       <w:rFonts w:eastAsiaTheme="majorEastAsia" w:cstheme="majorBidi"/>
       <w:i/>
@@ -26519,7 +26749,7 @@
     <w:link w:val="Heading7"/>
     <w:uiPriority w:val="9"/>
     <w:semiHidden/>
-    <w:rsid w:val="00156B63"/>
+    <w:rsid w:val="00E2545A"/>
     <w:rPr>
       <w:rFonts w:eastAsiaTheme="majorEastAsia" w:cstheme="majorBidi"/>
       <w:color w:val="595959" w:themeColor="text1" w:themeTint="A6"/>
@@ -26531,7 +26761,7 @@
     <w:link w:val="Heading8"/>
     <w:uiPriority w:val="9"/>
     <w:semiHidden/>
-    <w:rsid w:val="00156B63"/>
+    <w:rsid w:val="00E2545A"/>
     <w:rPr>
       <w:rFonts w:eastAsiaTheme="majorEastAsia" w:cstheme="majorBidi"/>
       <w:i/>
@@ -26545,7 +26775,7 @@
     <w:link w:val="Heading9"/>
     <w:uiPriority w:val="9"/>
     <w:semiHidden/>
-    <w:rsid w:val="00156B63"/>
+    <w:rsid w:val="00E2545A"/>
     <w:rPr>
       <w:rFonts w:eastAsiaTheme="majorEastAsia" w:cstheme="majorBidi"/>
       <w:color w:val="272727" w:themeColor="text1" w:themeTint="D8"/>
@@ -26558,7 +26788,7 @@
     <w:link w:val="TitleChar"/>
     <w:uiPriority w:val="10"/>
     <w:qFormat/>
-    <w:rsid w:val="00156B63"/>
+    <w:rsid w:val="00E2545A"/>
     <w:pPr>
       <w:spacing w:after="80" w:line="240" w:lineRule="auto"/>
       <w:contextualSpacing/>
@@ -26576,7 +26806,7 @@
     <w:basedOn w:val="DefaultParagraphFont"/>
     <w:link w:val="Title"/>
     <w:uiPriority w:val="10"/>
-    <w:rsid w:val="00156B63"/>
+    <w:rsid w:val="00E2545A"/>
     <w:rPr>
       <w:rFonts w:asciiTheme="majorHAnsi" w:eastAsiaTheme="majorEastAsia" w:hAnsiTheme="majorHAnsi" w:cstheme="majorBidi"/>
       <w:spacing w:val="-10"/>
@@ -26592,7 +26822,7 @@
     <w:link w:val="SubtitleChar"/>
     <w:uiPriority w:val="11"/>
     <w:qFormat/>
-    <w:rsid w:val="00156B63"/>
+    <w:rsid w:val="00E2545A"/>
     <w:pPr>
       <w:numPr>
         <w:ilvl w:val="1"/>
@@ -26611,7 +26841,7 @@
     <w:basedOn w:val="DefaultParagraphFont"/>
     <w:link w:val="Subtitle"/>
     <w:uiPriority w:val="11"/>
-    <w:rsid w:val="00156B63"/>
+    <w:rsid w:val="00E2545A"/>
     <w:rPr>
       <w:rFonts w:eastAsiaTheme="majorEastAsia" w:cstheme="majorBidi"/>
       <w:color w:val="595959" w:themeColor="text1" w:themeTint="A6"/>
@@ -26627,7 +26857,7 @@
     <w:link w:val="QuoteChar"/>
     <w:uiPriority w:val="29"/>
     <w:qFormat/>
-    <w:rsid w:val="00156B63"/>
+    <w:rsid w:val="00E2545A"/>
     <w:pPr>
       <w:spacing w:before="160"/>
       <w:jc w:val="center"/>
@@ -26643,7 +26873,7 @@
     <w:basedOn w:val="DefaultParagraphFont"/>
     <w:link w:val="Quote"/>
     <w:uiPriority w:val="29"/>
-    <w:rsid w:val="00156B63"/>
+    <w:rsid w:val="00E2545A"/>
     <w:rPr>
       <w:i/>
       <w:iCs/>
@@ -26655,7 +26885,7 @@
     <w:basedOn w:val="Normal"/>
     <w:uiPriority w:val="34"/>
     <w:qFormat/>
-    <w:rsid w:val="00156B63"/>
+    <w:rsid w:val="00E2545A"/>
     <w:pPr>
       <w:ind w:left="720"/>
       <w:contextualSpacing/>
@@ -26666,7 +26896,7 @@
     <w:basedOn w:val="DefaultParagraphFont"/>
     <w:uiPriority w:val="21"/>
     <w:qFormat/>
-    <w:rsid w:val="00156B63"/>
+    <w:rsid w:val="00E2545A"/>
     <w:rPr>
       <w:i/>
       <w:iCs/>
@@ -26680,7 +26910,7 @@
     <w:link w:val="IntenseQuoteChar"/>
     <w:uiPriority w:val="30"/>
     <w:qFormat/>
-    <w:rsid w:val="00156B63"/>
+    <w:rsid w:val="00E2545A"/>
     <w:pPr>
       <w:pBdr>
         <w:top w:val="single" w:sz="4" w:space="10" w:color="2F5496" w:themeColor="accent1" w:themeShade="BF"/>
@@ -26701,7 +26931,7 @@
     <w:basedOn w:val="DefaultParagraphFont"/>
     <w:link w:val="IntenseQuote"/>
     <w:uiPriority w:val="30"/>
-    <w:rsid w:val="00156B63"/>
+    <w:rsid w:val="00E2545A"/>
     <w:rPr>
       <w:i/>
       <w:iCs/>
@@ -26713,7 +26943,7 @@
     <w:basedOn w:val="DefaultParagraphFont"/>
     <w:uiPriority w:val="32"/>
     <w:qFormat/>
-    <w:rsid w:val="00156B63"/>
+    <w:rsid w:val="00E2545A"/>
     <w:rPr>
       <w:b/>
       <w:bCs/>
@@ -26721,6 +26951,50 @@
       <w:color w:val="2F5496" w:themeColor="accent1" w:themeShade="BF"/>
       <w:spacing w:val="5"/>
     </w:rPr>
+  </w:style>
+  <w:style w:type="paragraph" w:styleId="Header">
+    <w:name w:val="header"/>
+    <w:basedOn w:val="Normal"/>
+    <w:link w:val="HeaderChar"/>
+    <w:uiPriority w:val="99"/>
+    <w:unhideWhenUsed/>
+    <w:rsid w:val="00E2545A"/>
+    <w:pPr>
+      <w:tabs>
+        <w:tab w:val="center" w:pos="4513"/>
+        <w:tab w:val="right" w:pos="9026"/>
+      </w:tabs>
+      <w:spacing w:after="0" w:line="240" w:lineRule="auto"/>
+    </w:pPr>
+  </w:style>
+  <w:style w:type="character" w:customStyle="1" w:styleId="HeaderChar">
+    <w:name w:val="Header Char"/>
+    <w:basedOn w:val="DefaultParagraphFont"/>
+    <w:link w:val="Header"/>
+    <w:uiPriority w:val="99"/>
+    <w:rsid w:val="00E2545A"/>
+  </w:style>
+  <w:style w:type="paragraph" w:styleId="Footer">
+    <w:name w:val="footer"/>
+    <w:basedOn w:val="Normal"/>
+    <w:link w:val="FooterChar"/>
+    <w:uiPriority w:val="99"/>
+    <w:unhideWhenUsed/>
+    <w:rsid w:val="00E2545A"/>
+    <w:pPr>
+      <w:tabs>
+        <w:tab w:val="center" w:pos="4513"/>
+        <w:tab w:val="right" w:pos="9026"/>
+      </w:tabs>
+      <w:spacing w:after="0" w:line="240" w:lineRule="auto"/>
+    </w:pPr>
+  </w:style>
+  <w:style w:type="character" w:customStyle="1" w:styleId="FooterChar">
+    <w:name w:val="Footer Char"/>
+    <w:basedOn w:val="DefaultParagraphFont"/>
+    <w:link w:val="Footer"/>
+    <w:uiPriority w:val="99"/>
+    <w:rsid w:val="00E2545A"/>
   </w:style>
 </w:styles>
 </file>

</xml_diff>

<commit_message>
Hapus sub-bab 2.1.5 perspektif dosen program studi dari Bab II dan sesuaikan Daftar Isi
</commit_message>
<xml_diff>
--- a/TOPIK_2_TAKSI_GREEN_SM/01_Naskah_Utama/Proposal_Skripsi_Taksi_Green_SM.docx
+++ b/TOPIK_2_TAKSI_GREEN_SM/01_Naskah_Utama/Proposal_Skripsi_Taksi_Green_SM.docx
@@ -12,16 +12,16 @@
           <w:noProof/>
         </w:rPr>
         <w:drawing>
-          <wp:inline distT="0" distB="0" distL="0" distR="0" wp14:anchorId="3B81755F" wp14:editId="20DBEDC6">
+          <wp:inline distT="0" distB="0" distL="0" distR="0" wp14:anchorId="6C11E0C5" wp14:editId="46369C2C">
             <wp:extent cx="1152002" cy="1152002"/>
             <wp:effectExtent l="0" t="0" r="0" b="0"/>
-            <wp:docPr id="475188979" name="Picture 1"/>
+            <wp:docPr id="1335938239" name="Picture 1"/>
             <wp:cNvGraphicFramePr/>
             <a:graphic xmlns:a="http://schemas.openxmlformats.org/drawingml/2006/main">
               <a:graphicData uri="http://schemas.openxmlformats.org/drawingml/2006/picture">
                 <pic:pic xmlns:pic="http://schemas.openxmlformats.org/drawingml/2006/picture">
                   <pic:nvPicPr>
-                    <pic:cNvPr id="475188979" name=""/>
+                    <pic:cNvPr id="1335938239" name=""/>
                     <pic:cNvPicPr/>
                   </pic:nvPicPr>
                   <pic:blipFill>
@@ -1436,21 +1436,7 @@
         <w:rPr>
           <w:rFonts w:ascii="Times New Roman" w:hAnsi="Times New Roman" w:cs="Times New Roman"/>
         </w:rPr>
-        <w:t xml:space="preserve">    2.1.5 Perspektif Dosen Program Studi Manajemen FEB UKRIDA .................................................... 18</w:t>
-      </w:r>
-    </w:p>
-    <w:p>
-      <w:pPr>
-        <w:spacing w:after="60" w:line="360" w:lineRule="auto"/>
-        <w:rPr>
-          <w:rFonts w:ascii="Times New Roman" w:hAnsi="Times New Roman" w:cs="Times New Roman"/>
-        </w:rPr>
-      </w:pPr>
-      <w:r>
-        <w:rPr>
-          <w:rFonts w:ascii="Times New Roman" w:hAnsi="Times New Roman" w:cs="Times New Roman"/>
-        </w:rPr>
-        <w:t xml:space="preserve">  2.2 Penelitian Terdahulu ............................................................................................................... 19</w:t>
+        <w:t xml:space="preserve">  2.2 Penelitian Terdahulu ............................................................................................................... 18</w:t>
       </w:r>
     </w:p>
     <w:p>
@@ -6521,202 +6507,6 @@
           <w:sz w:val="24"/>
         </w:rPr>
         <w:t>), sistem suspensi, serta keamanan baterai listrik dari risiko korsleting atau kebakaran, terutama saat melintasi jalanan basah atau cuaca hujan di Jakarta Barat.</w:t>
-      </w:r>
-    </w:p>
-    <w:p>
-      <w:pPr>
-        <w:keepNext/>
-        <w:spacing w:after="120" w:line="360" w:lineRule="auto"/>
-        <w:rPr>
-          <w:rFonts w:ascii="Times New Roman" w:hAnsi="Times New Roman" w:cs="Times New Roman"/>
-          <w:b/>
-          <w:sz w:val="24"/>
-        </w:rPr>
-      </w:pPr>
-      <w:r>
-        <w:rPr>
-          <w:rFonts w:ascii="Times New Roman" w:hAnsi="Times New Roman" w:cs="Times New Roman"/>
-          <w:b/>
-          <w:sz w:val="24"/>
-        </w:rPr>
-        <w:t>2.1.5 Perspektif Dosen Program Studi Manajemen FEB UKRIDA mengenai Citra Merek, Kepercayaan, dan Keputusan Konsumen</w:t>
-      </w:r>
-    </w:p>
-    <w:p>
-      <w:pPr>
-        <w:keepNext/>
-        <w:spacing w:after="120" w:line="360" w:lineRule="auto"/>
-        <w:ind w:firstLine="709"/>
-        <w:jc w:val="both"/>
-        <w:rPr>
-          <w:rFonts w:ascii="Times New Roman" w:hAnsi="Times New Roman" w:cs="Times New Roman"/>
-          <w:sz w:val="24"/>
-        </w:rPr>
-      </w:pPr>
-      <w:r>
-        <w:rPr>
-          <w:rFonts w:ascii="Times New Roman" w:hAnsi="Times New Roman" w:cs="Times New Roman"/>
-          <w:sz w:val="24"/>
-        </w:rPr>
-        <w:t>Riset empiris yang dilakukan oleh para Dosen Program Studi Manajemen FEB UKRIDA memberikan sumbangsih analitis yang sangat mendalam dan kontekstual mengenai dinamika perilaku konsumen di DKI Jakarta. Publikasi ilmiah oleh Melitina Tecoalu (2021) dalam studinya mengenai transportasi penumpang berbasis aplikasi (</w:t>
-      </w:r>
-      <w:r>
-        <w:rPr>
-          <w:rFonts w:ascii="Times New Roman" w:hAnsi="Times New Roman" w:cs="Times New Roman"/>
-          <w:i/>
-          <w:sz w:val="24"/>
-        </w:rPr>
-        <w:t>online</w:t>
-      </w:r>
-      <w:r>
-        <w:rPr>
-          <w:rFonts w:ascii="Times New Roman" w:hAnsi="Times New Roman" w:cs="Times New Roman"/>
-          <w:sz w:val="24"/>
-        </w:rPr>
-        <w:t xml:space="preserve"> transport customer satisfaction in Jakarta region) membuktikan bahwa reputasi citra perusahaan (company/</w:t>
-      </w:r>
-      <w:r>
-        <w:rPr>
-          <w:rFonts w:ascii="Times New Roman" w:hAnsi="Times New Roman" w:cs="Times New Roman"/>
-          <w:i/>
-          <w:sz w:val="24"/>
-        </w:rPr>
-        <w:t>brand image</w:t>
-      </w:r>
-      <w:r>
-        <w:rPr>
-          <w:rFonts w:ascii="Times New Roman" w:hAnsi="Times New Roman" w:cs="Times New Roman"/>
-          <w:sz w:val="24"/>
-        </w:rPr>
-        <w:t>) dan jaminan kualitas layanan secara signifikan memengaruhi evaluasi positif, kepuasan, dan loyalitas konsumen komuter perkotaan di DKI Jakarta.</w:t>
-      </w:r>
-    </w:p>
-    <w:p>
-      <w:pPr>
-        <w:keepNext/>
-        <w:spacing w:after="120" w:line="360" w:lineRule="auto"/>
-        <w:ind w:firstLine="709"/>
-        <w:jc w:val="both"/>
-        <w:rPr>
-          <w:rFonts w:ascii="Times New Roman" w:hAnsi="Times New Roman" w:cs="Times New Roman"/>
-          <w:sz w:val="24"/>
-        </w:rPr>
-      </w:pPr>
-      <w:r>
-        <w:rPr>
-          <w:rFonts w:ascii="Times New Roman" w:hAnsi="Times New Roman" w:cs="Times New Roman"/>
-          <w:sz w:val="24"/>
-        </w:rPr>
-        <w:t xml:space="preserve">Lebih lanjut, Tecoalu, Saparso, dan Fernandes (2021) mengonfirmasi bahwa </w:t>
-      </w:r>
-      <w:r>
-        <w:rPr>
-          <w:rFonts w:ascii="Times New Roman" w:hAnsi="Times New Roman" w:cs="Times New Roman"/>
-          <w:i/>
-          <w:sz w:val="24"/>
-        </w:rPr>
-        <w:t>Brand Image</w:t>
-      </w:r>
-      <w:r>
-        <w:rPr>
-          <w:rFonts w:ascii="Times New Roman" w:hAnsi="Times New Roman" w:cs="Times New Roman"/>
-          <w:sz w:val="24"/>
-        </w:rPr>
-        <w:t xml:space="preserve"> bertindak sebagai variabel fundamental yang secara langsung mendorong pemantapan keputusan pembelian (purchasing decisions) konsumen. Temuan ini diperkuat oleh penelitian Sundah, Tecoalu, dan Wahyoedi (2022) yang membuktikan bahwa faktor Trust (kepercayaan konsumen) memegang peranan vital yang secara positif dan signifikan menentukan keputusan pembelian (</w:t>
-      </w:r>
-      <w:r>
-        <w:rPr>
-          <w:rFonts w:ascii="Times New Roman" w:hAnsi="Times New Roman" w:cs="Times New Roman"/>
-          <w:i/>
-          <w:sz w:val="24"/>
-        </w:rPr>
-        <w:t>purchase decisions</w:t>
-      </w:r>
-      <w:r>
-        <w:rPr>
-          <w:rFonts w:ascii="Times New Roman" w:hAnsi="Times New Roman" w:cs="Times New Roman"/>
-          <w:sz w:val="24"/>
-        </w:rPr>
-        <w:t>).</w:t>
-      </w:r>
-    </w:p>
-    <w:p>
-      <w:pPr>
-        <w:keepNext/>
-        <w:spacing w:after="120" w:line="360" w:lineRule="auto"/>
-        <w:ind w:firstLine="709"/>
-        <w:jc w:val="both"/>
-        <w:rPr>
-          <w:rFonts w:ascii="Times New Roman" w:hAnsi="Times New Roman" w:cs="Times New Roman"/>
-          <w:sz w:val="24"/>
-        </w:rPr>
-      </w:pPr>
-      <w:r>
-        <w:rPr>
-          <w:rFonts w:ascii="Times New Roman" w:hAnsi="Times New Roman" w:cs="Times New Roman"/>
-          <w:sz w:val="24"/>
-        </w:rPr>
-        <w:t xml:space="preserve">Integrasi temuan para akademisi FEB UKRIDA ini memberikan fondasi empiris yang sangat kuat dan relevan bagi penelitian ini: keputusan masyarakat Jakarta Barat untuk beralih dan menggunakan armada taksi listrik </w:t>
-      </w:r>
-      <w:r>
-        <w:rPr>
-          <w:rFonts w:ascii="Times New Roman" w:hAnsi="Times New Roman" w:cs="Times New Roman"/>
-          <w:i/>
-          <w:sz w:val="24"/>
-        </w:rPr>
-        <w:t>Green SM</w:t>
-      </w:r>
-      <w:r>
-        <w:rPr>
-          <w:rFonts w:ascii="Times New Roman" w:hAnsi="Times New Roman" w:cs="Times New Roman"/>
-          <w:sz w:val="24"/>
-        </w:rPr>
-        <w:t xml:space="preserve"> sangat ditentukan oleh pembentukan </w:t>
-      </w:r>
-      <w:r>
-        <w:rPr>
-          <w:rFonts w:ascii="Times New Roman" w:hAnsi="Times New Roman" w:cs="Times New Roman"/>
-          <w:i/>
-          <w:sz w:val="24"/>
-        </w:rPr>
-        <w:t>Brand Image</w:t>
-      </w:r>
-      <w:r>
-        <w:rPr>
-          <w:rFonts w:ascii="Times New Roman" w:hAnsi="Times New Roman" w:cs="Times New Roman"/>
-          <w:sz w:val="24"/>
-        </w:rPr>
-        <w:t xml:space="preserve"> yang ramah lingkungan, penanaman </w:t>
-      </w:r>
-      <w:r>
-        <w:rPr>
-          <w:rFonts w:ascii="Times New Roman" w:hAnsi="Times New Roman" w:cs="Times New Roman"/>
-          <w:i/>
-          <w:sz w:val="24"/>
-        </w:rPr>
-        <w:t>Brand Trust</w:t>
-      </w:r>
-      <w:r>
-        <w:rPr>
-          <w:rFonts w:ascii="Times New Roman" w:hAnsi="Times New Roman" w:cs="Times New Roman"/>
-          <w:sz w:val="24"/>
-        </w:rPr>
-        <w:t xml:space="preserve"> yang kokoh terhadap keandalan operasional armada, serta jaminan perlindungan fisik dan keselamatan berkendara (</w:t>
-      </w:r>
-      <w:r>
-        <w:rPr>
-          <w:rFonts w:ascii="Times New Roman" w:hAnsi="Times New Roman" w:cs="Times New Roman"/>
-          <w:i/>
-          <w:sz w:val="24"/>
-        </w:rPr>
-        <w:t>Perceived Safety</w:t>
-      </w:r>
-      <w:r>
-        <w:rPr>
-          <w:rFonts w:ascii="Times New Roman" w:hAnsi="Times New Roman" w:cs="Times New Roman"/>
-          <w:sz w:val="24"/>
-        </w:rPr>
-        <w:t>) selama di perjalanan.</w:t>
       </w:r>
     </w:p>
     <w:p>
@@ -26443,7 +26233,7 @@
     <w:link w:val="Heading1Char"/>
     <w:uiPriority w:val="9"/>
     <w:qFormat/>
-    <w:rsid w:val="00E2545A"/>
+    <w:rsid w:val="002B7367"/>
     <w:pPr>
       <w:keepNext/>
       <w:keepLines/>
@@ -26466,7 +26256,7 @@
     <w:semiHidden/>
     <w:unhideWhenUsed/>
     <w:qFormat/>
-    <w:rsid w:val="00E2545A"/>
+    <w:rsid w:val="002B7367"/>
     <w:pPr>
       <w:keepNext/>
       <w:keepLines/>
@@ -26489,7 +26279,7 @@
     <w:semiHidden/>
     <w:unhideWhenUsed/>
     <w:qFormat/>
-    <w:rsid w:val="00E2545A"/>
+    <w:rsid w:val="002B7367"/>
     <w:pPr>
       <w:keepNext/>
       <w:keepLines/>
@@ -26512,7 +26302,7 @@
     <w:semiHidden/>
     <w:unhideWhenUsed/>
     <w:qFormat/>
-    <w:rsid w:val="00E2545A"/>
+    <w:rsid w:val="002B7367"/>
     <w:pPr>
       <w:keepNext/>
       <w:keepLines/>
@@ -26535,7 +26325,7 @@
     <w:semiHidden/>
     <w:unhideWhenUsed/>
     <w:qFormat/>
-    <w:rsid w:val="00E2545A"/>
+    <w:rsid w:val="002B7367"/>
     <w:pPr>
       <w:keepNext/>
       <w:keepLines/>
@@ -26556,7 +26346,7 @@
     <w:semiHidden/>
     <w:unhideWhenUsed/>
     <w:qFormat/>
-    <w:rsid w:val="00E2545A"/>
+    <w:rsid w:val="002B7367"/>
     <w:pPr>
       <w:keepNext/>
       <w:keepLines/>
@@ -26579,7 +26369,7 @@
     <w:semiHidden/>
     <w:unhideWhenUsed/>
     <w:qFormat/>
-    <w:rsid w:val="00E2545A"/>
+    <w:rsid w:val="002B7367"/>
     <w:pPr>
       <w:keepNext/>
       <w:keepLines/>
@@ -26600,7 +26390,7 @@
     <w:semiHidden/>
     <w:unhideWhenUsed/>
     <w:qFormat/>
-    <w:rsid w:val="00E2545A"/>
+    <w:rsid w:val="002B7367"/>
     <w:pPr>
       <w:keepNext/>
       <w:keepLines/>
@@ -26623,7 +26413,7 @@
     <w:semiHidden/>
     <w:unhideWhenUsed/>
     <w:qFormat/>
-    <w:rsid w:val="00E2545A"/>
+    <w:rsid w:val="002B7367"/>
     <w:pPr>
       <w:keepNext/>
       <w:keepLines/>
@@ -26667,7 +26457,7 @@
     <w:basedOn w:val="DefaultParagraphFont"/>
     <w:link w:val="Heading1"/>
     <w:uiPriority w:val="9"/>
-    <w:rsid w:val="00E2545A"/>
+    <w:rsid w:val="002B7367"/>
     <w:rPr>
       <w:rFonts w:asciiTheme="majorHAnsi" w:eastAsiaTheme="majorEastAsia" w:hAnsiTheme="majorHAnsi" w:cstheme="majorBidi"/>
       <w:color w:val="2F5496" w:themeColor="accent1" w:themeShade="BF"/>
@@ -26681,7 +26471,7 @@
     <w:link w:val="Heading2"/>
     <w:uiPriority w:val="9"/>
     <w:semiHidden/>
-    <w:rsid w:val="00E2545A"/>
+    <w:rsid w:val="002B7367"/>
     <w:rPr>
       <w:rFonts w:asciiTheme="majorHAnsi" w:eastAsiaTheme="majorEastAsia" w:hAnsiTheme="majorHAnsi" w:cstheme="majorBidi"/>
       <w:color w:val="2F5496" w:themeColor="accent1" w:themeShade="BF"/>
@@ -26695,7 +26485,7 @@
     <w:link w:val="Heading3"/>
     <w:uiPriority w:val="9"/>
     <w:semiHidden/>
-    <w:rsid w:val="00E2545A"/>
+    <w:rsid w:val="002B7367"/>
     <w:rPr>
       <w:rFonts w:eastAsiaTheme="majorEastAsia" w:cstheme="majorBidi"/>
       <w:color w:val="2F5496" w:themeColor="accent1" w:themeShade="BF"/>
@@ -26709,7 +26499,7 @@
     <w:link w:val="Heading4"/>
     <w:uiPriority w:val="9"/>
     <w:semiHidden/>
-    <w:rsid w:val="00E2545A"/>
+    <w:rsid w:val="002B7367"/>
     <w:rPr>
       <w:rFonts w:eastAsiaTheme="majorEastAsia" w:cstheme="majorBidi"/>
       <w:i/>
@@ -26723,7 +26513,7 @@
     <w:link w:val="Heading5"/>
     <w:uiPriority w:val="9"/>
     <w:semiHidden/>
-    <w:rsid w:val="00E2545A"/>
+    <w:rsid w:val="002B7367"/>
     <w:rPr>
       <w:rFonts w:eastAsiaTheme="majorEastAsia" w:cstheme="majorBidi"/>
       <w:color w:val="2F5496" w:themeColor="accent1" w:themeShade="BF"/>
@@ -26735,7 +26525,7 @@
     <w:link w:val="Heading6"/>
     <w:uiPriority w:val="9"/>
     <w:semiHidden/>
-    <w:rsid w:val="00E2545A"/>
+    <w:rsid w:val="002B7367"/>
     <w:rPr>
       <w:rFonts w:eastAsiaTheme="majorEastAsia" w:cstheme="majorBidi"/>
       <w:i/>
@@ -26749,7 +26539,7 @@
     <w:link w:val="Heading7"/>
     <w:uiPriority w:val="9"/>
     <w:semiHidden/>
-    <w:rsid w:val="00E2545A"/>
+    <w:rsid w:val="002B7367"/>
     <w:rPr>
       <w:rFonts w:eastAsiaTheme="majorEastAsia" w:cstheme="majorBidi"/>
       <w:color w:val="595959" w:themeColor="text1" w:themeTint="A6"/>
@@ -26761,7 +26551,7 @@
     <w:link w:val="Heading8"/>
     <w:uiPriority w:val="9"/>
     <w:semiHidden/>
-    <w:rsid w:val="00E2545A"/>
+    <w:rsid w:val="002B7367"/>
     <w:rPr>
       <w:rFonts w:eastAsiaTheme="majorEastAsia" w:cstheme="majorBidi"/>
       <w:i/>
@@ -26775,7 +26565,7 @@
     <w:link w:val="Heading9"/>
     <w:uiPriority w:val="9"/>
     <w:semiHidden/>
-    <w:rsid w:val="00E2545A"/>
+    <w:rsid w:val="002B7367"/>
     <w:rPr>
       <w:rFonts w:eastAsiaTheme="majorEastAsia" w:cstheme="majorBidi"/>
       <w:color w:val="272727" w:themeColor="text1" w:themeTint="D8"/>
@@ -26788,7 +26578,7 @@
     <w:link w:val="TitleChar"/>
     <w:uiPriority w:val="10"/>
     <w:qFormat/>
-    <w:rsid w:val="00E2545A"/>
+    <w:rsid w:val="002B7367"/>
     <w:pPr>
       <w:spacing w:after="80" w:line="240" w:lineRule="auto"/>
       <w:contextualSpacing/>
@@ -26806,7 +26596,7 @@
     <w:basedOn w:val="DefaultParagraphFont"/>
     <w:link w:val="Title"/>
     <w:uiPriority w:val="10"/>
-    <w:rsid w:val="00E2545A"/>
+    <w:rsid w:val="002B7367"/>
     <w:rPr>
       <w:rFonts w:asciiTheme="majorHAnsi" w:eastAsiaTheme="majorEastAsia" w:hAnsiTheme="majorHAnsi" w:cstheme="majorBidi"/>
       <w:spacing w:val="-10"/>
@@ -26822,7 +26612,7 @@
     <w:link w:val="SubtitleChar"/>
     <w:uiPriority w:val="11"/>
     <w:qFormat/>
-    <w:rsid w:val="00E2545A"/>
+    <w:rsid w:val="002B7367"/>
     <w:pPr>
       <w:numPr>
         <w:ilvl w:val="1"/>
@@ -26841,7 +26631,7 @@
     <w:basedOn w:val="DefaultParagraphFont"/>
     <w:link w:val="Subtitle"/>
     <w:uiPriority w:val="11"/>
-    <w:rsid w:val="00E2545A"/>
+    <w:rsid w:val="002B7367"/>
     <w:rPr>
       <w:rFonts w:eastAsiaTheme="majorEastAsia" w:cstheme="majorBidi"/>
       <w:color w:val="595959" w:themeColor="text1" w:themeTint="A6"/>
@@ -26857,7 +26647,7 @@
     <w:link w:val="QuoteChar"/>
     <w:uiPriority w:val="29"/>
     <w:qFormat/>
-    <w:rsid w:val="00E2545A"/>
+    <w:rsid w:val="002B7367"/>
     <w:pPr>
       <w:spacing w:before="160"/>
       <w:jc w:val="center"/>
@@ -26873,7 +26663,7 @@
     <w:basedOn w:val="DefaultParagraphFont"/>
     <w:link w:val="Quote"/>
     <w:uiPriority w:val="29"/>
-    <w:rsid w:val="00E2545A"/>
+    <w:rsid w:val="002B7367"/>
     <w:rPr>
       <w:i/>
       <w:iCs/>
@@ -26885,7 +26675,7 @@
     <w:basedOn w:val="Normal"/>
     <w:uiPriority w:val="34"/>
     <w:qFormat/>
-    <w:rsid w:val="00E2545A"/>
+    <w:rsid w:val="002B7367"/>
     <w:pPr>
       <w:ind w:left="720"/>
       <w:contextualSpacing/>
@@ -26896,7 +26686,7 @@
     <w:basedOn w:val="DefaultParagraphFont"/>
     <w:uiPriority w:val="21"/>
     <w:qFormat/>
-    <w:rsid w:val="00E2545A"/>
+    <w:rsid w:val="002B7367"/>
     <w:rPr>
       <w:i/>
       <w:iCs/>
@@ -26910,7 +26700,7 @@
     <w:link w:val="IntenseQuoteChar"/>
     <w:uiPriority w:val="30"/>
     <w:qFormat/>
-    <w:rsid w:val="00E2545A"/>
+    <w:rsid w:val="002B7367"/>
     <w:pPr>
       <w:pBdr>
         <w:top w:val="single" w:sz="4" w:space="10" w:color="2F5496" w:themeColor="accent1" w:themeShade="BF"/>
@@ -26931,7 +26721,7 @@
     <w:basedOn w:val="DefaultParagraphFont"/>
     <w:link w:val="IntenseQuote"/>
     <w:uiPriority w:val="30"/>
-    <w:rsid w:val="00E2545A"/>
+    <w:rsid w:val="002B7367"/>
     <w:rPr>
       <w:i/>
       <w:iCs/>
@@ -26943,7 +26733,7 @@
     <w:basedOn w:val="DefaultParagraphFont"/>
     <w:uiPriority w:val="32"/>
     <w:qFormat/>
-    <w:rsid w:val="00E2545A"/>
+    <w:rsid w:val="002B7367"/>
     <w:rPr>
       <w:b/>
       <w:bCs/>
@@ -26958,7 +26748,7 @@
     <w:link w:val="HeaderChar"/>
     <w:uiPriority w:val="99"/>
     <w:unhideWhenUsed/>
-    <w:rsid w:val="00E2545A"/>
+    <w:rsid w:val="002B7367"/>
     <w:pPr>
       <w:tabs>
         <w:tab w:val="center" w:pos="4513"/>
@@ -26972,7 +26762,7 @@
     <w:basedOn w:val="DefaultParagraphFont"/>
     <w:link w:val="Header"/>
     <w:uiPriority w:val="99"/>
-    <w:rsid w:val="00E2545A"/>
+    <w:rsid w:val="002B7367"/>
   </w:style>
   <w:style w:type="paragraph" w:styleId="Footer">
     <w:name w:val="footer"/>
@@ -26980,7 +26770,7 @@
     <w:link w:val="FooterChar"/>
     <w:uiPriority w:val="99"/>
     <w:unhideWhenUsed/>
-    <w:rsid w:val="00E2545A"/>
+    <w:rsid w:val="002B7367"/>
     <w:pPr>
       <w:tabs>
         <w:tab w:val="center" w:pos="4513"/>
@@ -26994,7 +26784,7 @@
     <w:basedOn w:val="DefaultParagraphFont"/>
     <w:link w:val="Footer"/>
     <w:uiPriority w:val="99"/>
-    <w:rsid w:val="00E2545A"/>
+    <w:rsid w:val="002B7367"/>
   </w:style>
 </w:styles>
 </file>

</xml_diff>

<commit_message>
fix(proposal): move Gambar 2.1 caption above the image per user request
</commit_message>
<xml_diff>
--- a/TOPIK_2_TAKSI_GREEN_SM/01_Naskah_Utama/Proposal_Skripsi_Taksi_Green_SM.docx
+++ b/TOPIK_2_TAKSI_GREEN_SM/01_Naskah_Utama/Proposal_Skripsi_Taksi_Green_SM.docx
@@ -12,16 +12,16 @@
           <w:noProof/>
         </w:rPr>
         <w:drawing>
-          <wp:inline distT="0" distB="0" distL="0" distR="0" wp14:anchorId="4F354FCF" wp14:editId="6B9272EB">
+          <wp:inline distT="0" distB="0" distL="0" distR="0" wp14:anchorId="14DB718D" wp14:editId="43B8199A">
             <wp:extent cx="1152002" cy="1152002"/>
             <wp:effectExtent l="0" t="0" r="0" b="0"/>
-            <wp:docPr id="1107423154" name="Picture 1"/>
+            <wp:docPr id="1428890418" name="Picture 1"/>
             <wp:cNvGraphicFramePr/>
             <a:graphic xmlns:a="http://schemas.openxmlformats.org/drawingml/2006/main">
               <a:graphicData uri="http://schemas.openxmlformats.org/drawingml/2006/picture">
                 <pic:pic xmlns:pic="http://schemas.openxmlformats.org/drawingml/2006/picture">
                   <pic:nvPicPr>
-                    <pic:cNvPr id="1107423154" name=""/>
+                    <pic:cNvPr id="1428890418" name=""/>
                     <pic:cNvPicPr/>
                   </pic:nvPicPr>
                   <pic:blipFill>
@@ -3375,16 +3375,7 @@
           <w:i/>
           <w:sz w:val="24"/>
         </w:rPr>
-        <w:t xml:space="preserve">Brand </w:t>
-      </w:r>
-      <w:r>
-        <w:rPr>
-          <w:rFonts w:ascii="Times New Roman" w:hAnsi="Times New Roman" w:cs="Times New Roman"/>
-          <w:i/>
-          <w:sz w:val="24"/>
-        </w:rPr>
-        <w:lastRenderedPageBreak/>
-        <w:t>Image</w:t>
+        <w:t>Brand Image</w:t>
       </w:r>
       <w:r>
         <w:rPr>
@@ -3500,15 +3491,7 @@
           <w:rFonts w:ascii="Times New Roman" w:hAnsi="Times New Roman" w:cs="Times New Roman"/>
           <w:sz w:val="24"/>
         </w:rPr>
-        <w:t xml:space="preserve">) yang telah diuraikan, maka </w:t>
-      </w:r>
-      <w:r>
-        <w:rPr>
-          <w:rFonts w:ascii="Times New Roman" w:hAnsi="Times New Roman" w:cs="Times New Roman"/>
-          <w:sz w:val="24"/>
-        </w:rPr>
-        <w:lastRenderedPageBreak/>
-        <w:t>peneliti tertarik untuk melakukan penelitian ilmiah yang mendalam dan sistematis dengan judul:</w:t>
+        <w:t>) yang telah diuraikan, maka peneliti tertarik untuk melakukan penelitian ilmiah yang mendalam dan sistematis dengan judul:</w:t>
       </w:r>
     </w:p>
     <w:p>
@@ -4138,7 +4121,6 @@
           <w:rFonts w:ascii="Times New Roman" w:hAnsi="Times New Roman" w:cs="Times New Roman"/>
           <w:sz w:val="24"/>
         </w:rPr>
-        <w:lastRenderedPageBreak/>
         <w:t>- Memberikan kontribusi nyata bagi pengembangan literatur manajemen pemasaran, khususnya pada cabang perilaku konsumen (</w:t>
       </w:r>
       <w:r>
@@ -10060,31 +10042,48 @@
     <w:p>
       <w:pPr>
         <w:keepNext/>
-        <w:spacing w:before="120" w:after="40" w:line="360" w:lineRule="auto"/>
-        <w:ind w:firstLine="709"/>
+        <w:spacing w:before="200" w:after="80" w:line="360" w:lineRule="auto"/>
         <w:jc w:val="center"/>
         <w:rPr>
           <w:rFonts w:ascii="Times New Roman" w:hAnsi="Times New Roman" w:cs="Times New Roman"/>
-          <w:sz w:val="24"/>
-        </w:rPr>
-      </w:pPr>
-      <w:r>
-        <w:rPr>
-          <w:rFonts w:ascii="Times New Roman" w:hAnsi="Times New Roman" w:cs="Times New Roman"/>
+          <w:b/>
+        </w:rPr>
+      </w:pPr>
+      <w:r>
+        <w:rPr>
+          <w:rFonts w:ascii="Times New Roman" w:hAnsi="Times New Roman" w:cs="Times New Roman"/>
+          <w:b/>
+        </w:rPr>
+        <w:t>Gambar 2.1 Kerangka Pemikiran Konseptual Penelitian</w:t>
+      </w:r>
+    </w:p>
+    <w:p>
+      <w:pPr>
+        <w:keepNext/>
+        <w:spacing w:before="80" w:after="240" w:line="360" w:lineRule="auto"/>
+        <w:jc w:val="center"/>
+        <w:rPr>
+          <w:rFonts w:ascii="Times New Roman" w:hAnsi="Times New Roman" w:cs="Times New Roman"/>
+          <w:b/>
+        </w:rPr>
+      </w:pPr>
+      <w:r>
+        <w:rPr>
+          <w:rFonts w:ascii="Times New Roman" w:hAnsi="Times New Roman" w:cs="Times New Roman"/>
+          <w:b/>
           <w:noProof/>
-          <w:sz w:val="24"/>
         </w:rPr>
         <w:drawing>
-          <wp:inline distT="0" distB="0" distL="0" distR="0" wp14:anchorId="7AB64E55" wp14:editId="34884A2D">
+          <wp:inline distT="0" distB="0" distL="0" distR="0" wp14:anchorId="2524AF91" wp14:editId="2DD0F0F1">
             <wp:extent cx="5400009" cy="2629275"/>
             <wp:effectExtent l="0" t="0" r="0" b="0"/>
-            <wp:docPr id="1477058732" name="Picture 2"/>
+            <wp:docPr id="525943791" name="Picture 2"/>
             <wp:cNvGraphicFramePr/>
             <a:graphic xmlns:a="http://schemas.openxmlformats.org/drawingml/2006/main">
               <a:graphicData uri="http://schemas.openxmlformats.org/drawingml/2006/picture">
                 <pic:pic xmlns:pic="http://schemas.openxmlformats.org/drawingml/2006/picture">
                   <pic:nvPicPr>
-                    <pic:cNvPr id="1477058732" name=""/>
+                    <pic:cNvPr id="525943791" name=""/>
                     <pic:cNvPicPr/>
                   </pic:nvPicPr>
                   <pic:blipFill>
@@ -10118,32 +10117,13 @@
     <w:p>
       <w:pPr>
         <w:keepNext/>
-        <w:spacing w:after="120" w:line="360" w:lineRule="auto"/>
-        <w:ind w:firstLine="709"/>
-        <w:jc w:val="both"/>
-        <w:rPr>
-          <w:rFonts w:ascii="Times New Roman" w:hAnsi="Times New Roman" w:cs="Times New Roman"/>
-          <w:sz w:val="24"/>
-        </w:rPr>
-      </w:pPr>
-    </w:p>
-    <w:p>
-      <w:pPr>
-        <w:keepNext/>
-        <w:spacing w:before="40" w:after="240" w:line="360" w:lineRule="auto"/>
+        <w:spacing w:before="200" w:after="80" w:line="360" w:lineRule="auto"/>
         <w:jc w:val="center"/>
         <w:rPr>
           <w:rFonts w:ascii="Times New Roman" w:hAnsi="Times New Roman" w:cs="Times New Roman"/>
           <w:b/>
         </w:rPr>
       </w:pPr>
-      <w:r>
-        <w:rPr>
-          <w:rFonts w:ascii="Times New Roman" w:hAnsi="Times New Roman" w:cs="Times New Roman"/>
-          <w:b/>
-        </w:rPr>
-        <w:t>Gambar 2.1 Kerangka Pemikiran Konseptual Penelitian</w:t>
-      </w:r>
     </w:p>
     <w:p>
       <w:pPr>
@@ -24654,7 +24634,7 @@
         <w:noProof/>
         <w:sz w:val="20"/>
       </w:rPr>
-      <w:t>xiv</w:t>
+      <w:t>xi</w:t>
     </w:r>
     <w:r>
       <w:rPr>
@@ -24728,7 +24708,7 @@
         <w:noProof/>
         <w:sz w:val="20"/>
       </w:rPr>
-      <w:t>14</w:t>
+      <w:t>11</w:t>
     </w:r>
     <w:r>
       <w:rPr>
@@ -25205,7 +25185,7 @@
     <w:link w:val="Heading1Char"/>
     <w:uiPriority w:val="9"/>
     <w:qFormat/>
-    <w:rsid w:val="008230E0"/>
+    <w:rsid w:val="006B392D"/>
     <w:pPr>
       <w:keepNext/>
       <w:keepLines/>
@@ -25228,7 +25208,7 @@
     <w:semiHidden/>
     <w:unhideWhenUsed/>
     <w:qFormat/>
-    <w:rsid w:val="008230E0"/>
+    <w:rsid w:val="006B392D"/>
     <w:pPr>
       <w:keepNext/>
       <w:keepLines/>
@@ -25251,7 +25231,7 @@
     <w:semiHidden/>
     <w:unhideWhenUsed/>
     <w:qFormat/>
-    <w:rsid w:val="008230E0"/>
+    <w:rsid w:val="006B392D"/>
     <w:pPr>
       <w:keepNext/>
       <w:keepLines/>
@@ -25274,7 +25254,7 @@
     <w:semiHidden/>
     <w:unhideWhenUsed/>
     <w:qFormat/>
-    <w:rsid w:val="008230E0"/>
+    <w:rsid w:val="006B392D"/>
     <w:pPr>
       <w:keepNext/>
       <w:keepLines/>
@@ -25297,7 +25277,7 @@
     <w:semiHidden/>
     <w:unhideWhenUsed/>
     <w:qFormat/>
-    <w:rsid w:val="008230E0"/>
+    <w:rsid w:val="006B392D"/>
     <w:pPr>
       <w:keepNext/>
       <w:keepLines/>
@@ -25318,7 +25298,7 @@
     <w:semiHidden/>
     <w:unhideWhenUsed/>
     <w:qFormat/>
-    <w:rsid w:val="008230E0"/>
+    <w:rsid w:val="006B392D"/>
     <w:pPr>
       <w:keepNext/>
       <w:keepLines/>
@@ -25341,7 +25321,7 @@
     <w:semiHidden/>
     <w:unhideWhenUsed/>
     <w:qFormat/>
-    <w:rsid w:val="008230E0"/>
+    <w:rsid w:val="006B392D"/>
     <w:pPr>
       <w:keepNext/>
       <w:keepLines/>
@@ -25362,7 +25342,7 @@
     <w:semiHidden/>
     <w:unhideWhenUsed/>
     <w:qFormat/>
-    <w:rsid w:val="008230E0"/>
+    <w:rsid w:val="006B392D"/>
     <w:pPr>
       <w:keepNext/>
       <w:keepLines/>
@@ -25385,7 +25365,7 @@
     <w:semiHidden/>
     <w:unhideWhenUsed/>
     <w:qFormat/>
-    <w:rsid w:val="008230E0"/>
+    <w:rsid w:val="006B392D"/>
     <w:pPr>
       <w:keepNext/>
       <w:keepLines/>
@@ -25429,7 +25409,7 @@
     <w:basedOn w:val="DefaultParagraphFont"/>
     <w:link w:val="Heading1"/>
     <w:uiPriority w:val="9"/>
-    <w:rsid w:val="008230E0"/>
+    <w:rsid w:val="006B392D"/>
     <w:rPr>
       <w:rFonts w:asciiTheme="majorHAnsi" w:eastAsiaTheme="majorEastAsia" w:hAnsiTheme="majorHAnsi" w:cstheme="majorBidi"/>
       <w:color w:val="2F5496" w:themeColor="accent1" w:themeShade="BF"/>
@@ -25443,7 +25423,7 @@
     <w:link w:val="Heading2"/>
     <w:uiPriority w:val="9"/>
     <w:semiHidden/>
-    <w:rsid w:val="008230E0"/>
+    <w:rsid w:val="006B392D"/>
     <w:rPr>
       <w:rFonts w:asciiTheme="majorHAnsi" w:eastAsiaTheme="majorEastAsia" w:hAnsiTheme="majorHAnsi" w:cstheme="majorBidi"/>
       <w:color w:val="2F5496" w:themeColor="accent1" w:themeShade="BF"/>
@@ -25457,7 +25437,7 @@
     <w:link w:val="Heading3"/>
     <w:uiPriority w:val="9"/>
     <w:semiHidden/>
-    <w:rsid w:val="008230E0"/>
+    <w:rsid w:val="006B392D"/>
     <w:rPr>
       <w:rFonts w:eastAsiaTheme="majorEastAsia" w:cstheme="majorBidi"/>
       <w:color w:val="2F5496" w:themeColor="accent1" w:themeShade="BF"/>
@@ -25471,7 +25451,7 @@
     <w:link w:val="Heading4"/>
     <w:uiPriority w:val="9"/>
     <w:semiHidden/>
-    <w:rsid w:val="008230E0"/>
+    <w:rsid w:val="006B392D"/>
     <w:rPr>
       <w:rFonts w:eastAsiaTheme="majorEastAsia" w:cstheme="majorBidi"/>
       <w:i/>
@@ -25485,7 +25465,7 @@
     <w:link w:val="Heading5"/>
     <w:uiPriority w:val="9"/>
     <w:semiHidden/>
-    <w:rsid w:val="008230E0"/>
+    <w:rsid w:val="006B392D"/>
     <w:rPr>
       <w:rFonts w:eastAsiaTheme="majorEastAsia" w:cstheme="majorBidi"/>
       <w:color w:val="2F5496" w:themeColor="accent1" w:themeShade="BF"/>
@@ -25497,7 +25477,7 @@
     <w:link w:val="Heading6"/>
     <w:uiPriority w:val="9"/>
     <w:semiHidden/>
-    <w:rsid w:val="008230E0"/>
+    <w:rsid w:val="006B392D"/>
     <w:rPr>
       <w:rFonts w:eastAsiaTheme="majorEastAsia" w:cstheme="majorBidi"/>
       <w:i/>
@@ -25511,7 +25491,7 @@
     <w:link w:val="Heading7"/>
     <w:uiPriority w:val="9"/>
     <w:semiHidden/>
-    <w:rsid w:val="008230E0"/>
+    <w:rsid w:val="006B392D"/>
     <w:rPr>
       <w:rFonts w:eastAsiaTheme="majorEastAsia" w:cstheme="majorBidi"/>
       <w:color w:val="595959" w:themeColor="text1" w:themeTint="A6"/>
@@ -25523,7 +25503,7 @@
     <w:link w:val="Heading8"/>
     <w:uiPriority w:val="9"/>
     <w:semiHidden/>
-    <w:rsid w:val="008230E0"/>
+    <w:rsid w:val="006B392D"/>
     <w:rPr>
       <w:rFonts w:eastAsiaTheme="majorEastAsia" w:cstheme="majorBidi"/>
       <w:i/>
@@ -25537,7 +25517,7 @@
     <w:link w:val="Heading9"/>
     <w:uiPriority w:val="9"/>
     <w:semiHidden/>
-    <w:rsid w:val="008230E0"/>
+    <w:rsid w:val="006B392D"/>
     <w:rPr>
       <w:rFonts w:eastAsiaTheme="majorEastAsia" w:cstheme="majorBidi"/>
       <w:color w:val="272727" w:themeColor="text1" w:themeTint="D8"/>
@@ -25550,7 +25530,7 @@
     <w:link w:val="TitleChar"/>
     <w:uiPriority w:val="10"/>
     <w:qFormat/>
-    <w:rsid w:val="008230E0"/>
+    <w:rsid w:val="006B392D"/>
     <w:pPr>
       <w:spacing w:after="80" w:line="240" w:lineRule="auto"/>
       <w:contextualSpacing/>
@@ -25568,7 +25548,7 @@
     <w:basedOn w:val="DefaultParagraphFont"/>
     <w:link w:val="Title"/>
     <w:uiPriority w:val="10"/>
-    <w:rsid w:val="008230E0"/>
+    <w:rsid w:val="006B392D"/>
     <w:rPr>
       <w:rFonts w:asciiTheme="majorHAnsi" w:eastAsiaTheme="majorEastAsia" w:hAnsiTheme="majorHAnsi" w:cstheme="majorBidi"/>
       <w:spacing w:val="-10"/>
@@ -25584,7 +25564,7 @@
     <w:link w:val="SubtitleChar"/>
     <w:uiPriority w:val="11"/>
     <w:qFormat/>
-    <w:rsid w:val="008230E0"/>
+    <w:rsid w:val="006B392D"/>
     <w:pPr>
       <w:numPr>
         <w:ilvl w:val="1"/>
@@ -25603,7 +25583,7 @@
     <w:basedOn w:val="DefaultParagraphFont"/>
     <w:link w:val="Subtitle"/>
     <w:uiPriority w:val="11"/>
-    <w:rsid w:val="008230E0"/>
+    <w:rsid w:val="006B392D"/>
     <w:rPr>
       <w:rFonts w:eastAsiaTheme="majorEastAsia" w:cstheme="majorBidi"/>
       <w:color w:val="595959" w:themeColor="text1" w:themeTint="A6"/>
@@ -25619,7 +25599,7 @@
     <w:link w:val="QuoteChar"/>
     <w:uiPriority w:val="29"/>
     <w:qFormat/>
-    <w:rsid w:val="008230E0"/>
+    <w:rsid w:val="006B392D"/>
     <w:pPr>
       <w:spacing w:before="160"/>
       <w:jc w:val="center"/>
@@ -25635,7 +25615,7 @@
     <w:basedOn w:val="DefaultParagraphFont"/>
     <w:link w:val="Quote"/>
     <w:uiPriority w:val="29"/>
-    <w:rsid w:val="008230E0"/>
+    <w:rsid w:val="006B392D"/>
     <w:rPr>
       <w:i/>
       <w:iCs/>
@@ -25647,7 +25627,7 @@
     <w:basedOn w:val="Normal"/>
     <w:uiPriority w:val="34"/>
     <w:qFormat/>
-    <w:rsid w:val="008230E0"/>
+    <w:rsid w:val="006B392D"/>
     <w:pPr>
       <w:ind w:left="720"/>
       <w:contextualSpacing/>
@@ -25658,7 +25638,7 @@
     <w:basedOn w:val="DefaultParagraphFont"/>
     <w:uiPriority w:val="21"/>
     <w:qFormat/>
-    <w:rsid w:val="008230E0"/>
+    <w:rsid w:val="006B392D"/>
     <w:rPr>
       <w:i/>
       <w:iCs/>
@@ -25672,7 +25652,7 @@
     <w:link w:val="IntenseQuoteChar"/>
     <w:uiPriority w:val="30"/>
     <w:qFormat/>
-    <w:rsid w:val="008230E0"/>
+    <w:rsid w:val="006B392D"/>
     <w:pPr>
       <w:pBdr>
         <w:top w:val="single" w:sz="4" w:space="10" w:color="2F5496" w:themeColor="accent1" w:themeShade="BF"/>
@@ -25693,7 +25673,7 @@
     <w:basedOn w:val="DefaultParagraphFont"/>
     <w:link w:val="IntenseQuote"/>
     <w:uiPriority w:val="30"/>
-    <w:rsid w:val="008230E0"/>
+    <w:rsid w:val="006B392D"/>
     <w:rPr>
       <w:i/>
       <w:iCs/>
@@ -25705,7 +25685,7 @@
     <w:basedOn w:val="DefaultParagraphFont"/>
     <w:uiPriority w:val="32"/>
     <w:qFormat/>
-    <w:rsid w:val="008230E0"/>
+    <w:rsid w:val="006B392D"/>
     <w:rPr>
       <w:b/>
       <w:bCs/>
@@ -25720,7 +25700,7 @@
     <w:link w:val="HeaderChar"/>
     <w:uiPriority w:val="99"/>
     <w:unhideWhenUsed/>
-    <w:rsid w:val="008230E0"/>
+    <w:rsid w:val="006B392D"/>
     <w:pPr>
       <w:tabs>
         <w:tab w:val="center" w:pos="4513"/>
@@ -25734,7 +25714,7 @@
     <w:basedOn w:val="DefaultParagraphFont"/>
     <w:link w:val="Header"/>
     <w:uiPriority w:val="99"/>
-    <w:rsid w:val="008230E0"/>
+    <w:rsid w:val="006B392D"/>
   </w:style>
   <w:style w:type="paragraph" w:styleId="Footer">
     <w:name w:val="footer"/>
@@ -25742,7 +25722,7 @@
     <w:link w:val="FooterChar"/>
     <w:uiPriority w:val="99"/>
     <w:unhideWhenUsed/>
-    <w:rsid w:val="008230E0"/>
+    <w:rsid w:val="006B392D"/>
     <w:pPr>
       <w:tabs>
         <w:tab w:val="center" w:pos="4513"/>
@@ -25756,7 +25736,7 @@
     <w:basedOn w:val="DefaultParagraphFont"/>
     <w:link w:val="Footer"/>
     <w:uiPriority w:val="99"/>
-    <w:rsid w:val="008230E0"/>
+    <w:rsid w:val="006B392D"/>
   </w:style>
 </w:styles>
 </file>

</xml_diff>

<commit_message>
feat(proposal): update conceptual framework to oval/ellipse shapes with clean indicators and precise arrows
</commit_message>
<xml_diff>
--- a/TOPIK_2_TAKSI_GREEN_SM/01_Naskah_Utama/Proposal_Skripsi_Taksi_Green_SM.docx
+++ b/TOPIK_2_TAKSI_GREEN_SM/01_Naskah_Utama/Proposal_Skripsi_Taksi_Green_SM.docx
@@ -12,16 +12,16 @@
           <w:noProof/>
         </w:rPr>
         <w:drawing>
-          <wp:inline distT="0" distB="0" distL="0" distR="0" wp14:anchorId="14DB718D" wp14:editId="43B8199A">
+          <wp:inline distT="0" distB="0" distL="0" distR="0" wp14:anchorId="658D1584" wp14:editId="67EAB29F">
             <wp:extent cx="1152002" cy="1152002"/>
             <wp:effectExtent l="0" t="0" r="0" b="0"/>
-            <wp:docPr id="1428890418" name="Picture 1"/>
+            <wp:docPr id="1660267036" name="Picture 1"/>
             <wp:cNvGraphicFramePr/>
             <a:graphic xmlns:a="http://schemas.openxmlformats.org/drawingml/2006/main">
               <a:graphicData uri="http://schemas.openxmlformats.org/drawingml/2006/picture">
                 <pic:pic xmlns:pic="http://schemas.openxmlformats.org/drawingml/2006/picture">
                   <pic:nvPicPr>
-                    <pic:cNvPr id="1428890418" name=""/>
+                    <pic:cNvPr id="1660267036" name=""/>
                     <pic:cNvPicPr/>
                   </pic:nvPicPr>
                   <pic:blipFill>
@@ -10074,16 +10074,16 @@
           <w:noProof/>
         </w:rPr>
         <w:drawing>
-          <wp:inline distT="0" distB="0" distL="0" distR="0" wp14:anchorId="2524AF91" wp14:editId="2DD0F0F1">
-            <wp:extent cx="5400009" cy="2629275"/>
-            <wp:effectExtent l="0" t="0" r="0" b="0"/>
-            <wp:docPr id="525943791" name="Picture 2"/>
+          <wp:inline distT="0" distB="0" distL="0" distR="0" wp14:anchorId="6658CB1C" wp14:editId="539A7797">
+            <wp:extent cx="5400009" cy="2300616"/>
+            <wp:effectExtent l="0" t="0" r="0" b="4445"/>
+            <wp:docPr id="489449209" name="Picture 2"/>
             <wp:cNvGraphicFramePr/>
             <a:graphic xmlns:a="http://schemas.openxmlformats.org/drawingml/2006/main">
               <a:graphicData uri="http://schemas.openxmlformats.org/drawingml/2006/picture">
                 <pic:pic xmlns:pic="http://schemas.openxmlformats.org/drawingml/2006/picture">
                   <pic:nvPicPr>
-                    <pic:cNvPr id="525943791" name=""/>
+                    <pic:cNvPr id="489449209" name=""/>
                     <pic:cNvPicPr/>
                   </pic:nvPicPr>
                   <pic:blipFill>
@@ -10101,7 +10101,7 @@
                   <pic:spPr>
                     <a:xfrm>
                       <a:off x="0" y="0"/>
-                      <a:ext cx="5400009" cy="2629275"/>
+                      <a:ext cx="5400009" cy="2300616"/>
                     </a:xfrm>
                     <a:prstGeom prst="rect">
                       <a:avLst/>
@@ -25185,7 +25185,7 @@
     <w:link w:val="Heading1Char"/>
     <w:uiPriority w:val="9"/>
     <w:qFormat/>
-    <w:rsid w:val="006B392D"/>
+    <w:rsid w:val="00D421CC"/>
     <w:pPr>
       <w:keepNext/>
       <w:keepLines/>
@@ -25208,7 +25208,7 @@
     <w:semiHidden/>
     <w:unhideWhenUsed/>
     <w:qFormat/>
-    <w:rsid w:val="006B392D"/>
+    <w:rsid w:val="00D421CC"/>
     <w:pPr>
       <w:keepNext/>
       <w:keepLines/>
@@ -25231,7 +25231,7 @@
     <w:semiHidden/>
     <w:unhideWhenUsed/>
     <w:qFormat/>
-    <w:rsid w:val="006B392D"/>
+    <w:rsid w:val="00D421CC"/>
     <w:pPr>
       <w:keepNext/>
       <w:keepLines/>
@@ -25254,7 +25254,7 @@
     <w:semiHidden/>
     <w:unhideWhenUsed/>
     <w:qFormat/>
-    <w:rsid w:val="006B392D"/>
+    <w:rsid w:val="00D421CC"/>
     <w:pPr>
       <w:keepNext/>
       <w:keepLines/>
@@ -25277,7 +25277,7 @@
     <w:semiHidden/>
     <w:unhideWhenUsed/>
     <w:qFormat/>
-    <w:rsid w:val="006B392D"/>
+    <w:rsid w:val="00D421CC"/>
     <w:pPr>
       <w:keepNext/>
       <w:keepLines/>
@@ -25298,7 +25298,7 @@
     <w:semiHidden/>
     <w:unhideWhenUsed/>
     <w:qFormat/>
-    <w:rsid w:val="006B392D"/>
+    <w:rsid w:val="00D421CC"/>
     <w:pPr>
       <w:keepNext/>
       <w:keepLines/>
@@ -25321,7 +25321,7 @@
     <w:semiHidden/>
     <w:unhideWhenUsed/>
     <w:qFormat/>
-    <w:rsid w:val="006B392D"/>
+    <w:rsid w:val="00D421CC"/>
     <w:pPr>
       <w:keepNext/>
       <w:keepLines/>
@@ -25342,7 +25342,7 @@
     <w:semiHidden/>
     <w:unhideWhenUsed/>
     <w:qFormat/>
-    <w:rsid w:val="006B392D"/>
+    <w:rsid w:val="00D421CC"/>
     <w:pPr>
       <w:keepNext/>
       <w:keepLines/>
@@ -25365,7 +25365,7 @@
     <w:semiHidden/>
     <w:unhideWhenUsed/>
     <w:qFormat/>
-    <w:rsid w:val="006B392D"/>
+    <w:rsid w:val="00D421CC"/>
     <w:pPr>
       <w:keepNext/>
       <w:keepLines/>
@@ -25409,7 +25409,7 @@
     <w:basedOn w:val="DefaultParagraphFont"/>
     <w:link w:val="Heading1"/>
     <w:uiPriority w:val="9"/>
-    <w:rsid w:val="006B392D"/>
+    <w:rsid w:val="00D421CC"/>
     <w:rPr>
       <w:rFonts w:asciiTheme="majorHAnsi" w:eastAsiaTheme="majorEastAsia" w:hAnsiTheme="majorHAnsi" w:cstheme="majorBidi"/>
       <w:color w:val="2F5496" w:themeColor="accent1" w:themeShade="BF"/>
@@ -25423,7 +25423,7 @@
     <w:link w:val="Heading2"/>
     <w:uiPriority w:val="9"/>
     <w:semiHidden/>
-    <w:rsid w:val="006B392D"/>
+    <w:rsid w:val="00D421CC"/>
     <w:rPr>
       <w:rFonts w:asciiTheme="majorHAnsi" w:eastAsiaTheme="majorEastAsia" w:hAnsiTheme="majorHAnsi" w:cstheme="majorBidi"/>
       <w:color w:val="2F5496" w:themeColor="accent1" w:themeShade="BF"/>
@@ -25437,7 +25437,7 @@
     <w:link w:val="Heading3"/>
     <w:uiPriority w:val="9"/>
     <w:semiHidden/>
-    <w:rsid w:val="006B392D"/>
+    <w:rsid w:val="00D421CC"/>
     <w:rPr>
       <w:rFonts w:eastAsiaTheme="majorEastAsia" w:cstheme="majorBidi"/>
       <w:color w:val="2F5496" w:themeColor="accent1" w:themeShade="BF"/>
@@ -25451,7 +25451,7 @@
     <w:link w:val="Heading4"/>
     <w:uiPriority w:val="9"/>
     <w:semiHidden/>
-    <w:rsid w:val="006B392D"/>
+    <w:rsid w:val="00D421CC"/>
     <w:rPr>
       <w:rFonts w:eastAsiaTheme="majorEastAsia" w:cstheme="majorBidi"/>
       <w:i/>
@@ -25465,7 +25465,7 @@
     <w:link w:val="Heading5"/>
     <w:uiPriority w:val="9"/>
     <w:semiHidden/>
-    <w:rsid w:val="006B392D"/>
+    <w:rsid w:val="00D421CC"/>
     <w:rPr>
       <w:rFonts w:eastAsiaTheme="majorEastAsia" w:cstheme="majorBidi"/>
       <w:color w:val="2F5496" w:themeColor="accent1" w:themeShade="BF"/>
@@ -25477,7 +25477,7 @@
     <w:link w:val="Heading6"/>
     <w:uiPriority w:val="9"/>
     <w:semiHidden/>
-    <w:rsid w:val="006B392D"/>
+    <w:rsid w:val="00D421CC"/>
     <w:rPr>
       <w:rFonts w:eastAsiaTheme="majorEastAsia" w:cstheme="majorBidi"/>
       <w:i/>
@@ -25491,7 +25491,7 @@
     <w:link w:val="Heading7"/>
     <w:uiPriority w:val="9"/>
     <w:semiHidden/>
-    <w:rsid w:val="006B392D"/>
+    <w:rsid w:val="00D421CC"/>
     <w:rPr>
       <w:rFonts w:eastAsiaTheme="majorEastAsia" w:cstheme="majorBidi"/>
       <w:color w:val="595959" w:themeColor="text1" w:themeTint="A6"/>
@@ -25503,7 +25503,7 @@
     <w:link w:val="Heading8"/>
     <w:uiPriority w:val="9"/>
     <w:semiHidden/>
-    <w:rsid w:val="006B392D"/>
+    <w:rsid w:val="00D421CC"/>
     <w:rPr>
       <w:rFonts w:eastAsiaTheme="majorEastAsia" w:cstheme="majorBidi"/>
       <w:i/>
@@ -25517,7 +25517,7 @@
     <w:link w:val="Heading9"/>
     <w:uiPriority w:val="9"/>
     <w:semiHidden/>
-    <w:rsid w:val="006B392D"/>
+    <w:rsid w:val="00D421CC"/>
     <w:rPr>
       <w:rFonts w:eastAsiaTheme="majorEastAsia" w:cstheme="majorBidi"/>
       <w:color w:val="272727" w:themeColor="text1" w:themeTint="D8"/>
@@ -25530,7 +25530,7 @@
     <w:link w:val="TitleChar"/>
     <w:uiPriority w:val="10"/>
     <w:qFormat/>
-    <w:rsid w:val="006B392D"/>
+    <w:rsid w:val="00D421CC"/>
     <w:pPr>
       <w:spacing w:after="80" w:line="240" w:lineRule="auto"/>
       <w:contextualSpacing/>
@@ -25548,7 +25548,7 @@
     <w:basedOn w:val="DefaultParagraphFont"/>
     <w:link w:val="Title"/>
     <w:uiPriority w:val="10"/>
-    <w:rsid w:val="006B392D"/>
+    <w:rsid w:val="00D421CC"/>
     <w:rPr>
       <w:rFonts w:asciiTheme="majorHAnsi" w:eastAsiaTheme="majorEastAsia" w:hAnsiTheme="majorHAnsi" w:cstheme="majorBidi"/>
       <w:spacing w:val="-10"/>
@@ -25564,7 +25564,7 @@
     <w:link w:val="SubtitleChar"/>
     <w:uiPriority w:val="11"/>
     <w:qFormat/>
-    <w:rsid w:val="006B392D"/>
+    <w:rsid w:val="00D421CC"/>
     <w:pPr>
       <w:numPr>
         <w:ilvl w:val="1"/>
@@ -25583,7 +25583,7 @@
     <w:basedOn w:val="DefaultParagraphFont"/>
     <w:link w:val="Subtitle"/>
     <w:uiPriority w:val="11"/>
-    <w:rsid w:val="006B392D"/>
+    <w:rsid w:val="00D421CC"/>
     <w:rPr>
       <w:rFonts w:eastAsiaTheme="majorEastAsia" w:cstheme="majorBidi"/>
       <w:color w:val="595959" w:themeColor="text1" w:themeTint="A6"/>
@@ -25599,7 +25599,7 @@
     <w:link w:val="QuoteChar"/>
     <w:uiPriority w:val="29"/>
     <w:qFormat/>
-    <w:rsid w:val="006B392D"/>
+    <w:rsid w:val="00D421CC"/>
     <w:pPr>
       <w:spacing w:before="160"/>
       <w:jc w:val="center"/>
@@ -25615,7 +25615,7 @@
     <w:basedOn w:val="DefaultParagraphFont"/>
     <w:link w:val="Quote"/>
     <w:uiPriority w:val="29"/>
-    <w:rsid w:val="006B392D"/>
+    <w:rsid w:val="00D421CC"/>
     <w:rPr>
       <w:i/>
       <w:iCs/>
@@ -25627,7 +25627,7 @@
     <w:basedOn w:val="Normal"/>
     <w:uiPriority w:val="34"/>
     <w:qFormat/>
-    <w:rsid w:val="006B392D"/>
+    <w:rsid w:val="00D421CC"/>
     <w:pPr>
       <w:ind w:left="720"/>
       <w:contextualSpacing/>
@@ -25638,7 +25638,7 @@
     <w:basedOn w:val="DefaultParagraphFont"/>
     <w:uiPriority w:val="21"/>
     <w:qFormat/>
-    <w:rsid w:val="006B392D"/>
+    <w:rsid w:val="00D421CC"/>
     <w:rPr>
       <w:i/>
       <w:iCs/>
@@ -25652,7 +25652,7 @@
     <w:link w:val="IntenseQuoteChar"/>
     <w:uiPriority w:val="30"/>
     <w:qFormat/>
-    <w:rsid w:val="006B392D"/>
+    <w:rsid w:val="00D421CC"/>
     <w:pPr>
       <w:pBdr>
         <w:top w:val="single" w:sz="4" w:space="10" w:color="2F5496" w:themeColor="accent1" w:themeShade="BF"/>
@@ -25673,7 +25673,7 @@
     <w:basedOn w:val="DefaultParagraphFont"/>
     <w:link w:val="IntenseQuote"/>
     <w:uiPriority w:val="30"/>
-    <w:rsid w:val="006B392D"/>
+    <w:rsid w:val="00D421CC"/>
     <w:rPr>
       <w:i/>
       <w:iCs/>
@@ -25685,7 +25685,7 @@
     <w:basedOn w:val="DefaultParagraphFont"/>
     <w:uiPriority w:val="32"/>
     <w:qFormat/>
-    <w:rsid w:val="006B392D"/>
+    <w:rsid w:val="00D421CC"/>
     <w:rPr>
       <w:b/>
       <w:bCs/>
@@ -25700,7 +25700,7 @@
     <w:link w:val="HeaderChar"/>
     <w:uiPriority w:val="99"/>
     <w:unhideWhenUsed/>
-    <w:rsid w:val="006B392D"/>
+    <w:rsid w:val="00D421CC"/>
     <w:pPr>
       <w:tabs>
         <w:tab w:val="center" w:pos="4513"/>
@@ -25714,7 +25714,7 @@
     <w:basedOn w:val="DefaultParagraphFont"/>
     <w:link w:val="Header"/>
     <w:uiPriority w:val="99"/>
-    <w:rsid w:val="006B392D"/>
+    <w:rsid w:val="00D421CC"/>
   </w:style>
   <w:style w:type="paragraph" w:styleId="Footer">
     <w:name w:val="footer"/>
@@ -25722,7 +25722,7 @@
     <w:link w:val="FooterChar"/>
     <w:uiPriority w:val="99"/>
     <w:unhideWhenUsed/>
-    <w:rsid w:val="006B392D"/>
+    <w:rsid w:val="00D421CC"/>
     <w:pPr>
       <w:tabs>
         <w:tab w:val="center" w:pos="4513"/>
@@ -25736,7 +25736,7 @@
     <w:basedOn w:val="DefaultParagraphFont"/>
     <w:link w:val="Footer"/>
     <w:uiPriority w:val="99"/>
-    <w:rsid w:val="006B392D"/>
+    <w:rsid w:val="00D421CC"/>
   </w:style>
 </w:styles>
 </file>

</xml_diff>

<commit_message>
fix(proposal): upgrade conceptual framework to pure vector SVG and 300-DPI HD rendering with zero blurriness
</commit_message>
<xml_diff>
--- a/TOPIK_2_TAKSI_GREEN_SM/01_Naskah_Utama/Proposal_Skripsi_Taksi_Green_SM.docx
+++ b/TOPIK_2_TAKSI_GREEN_SM/01_Naskah_Utama/Proposal_Skripsi_Taksi_Green_SM.docx
@@ -12,16 +12,16 @@
           <w:noProof/>
         </w:rPr>
         <w:drawing>
-          <wp:inline distT="0" distB="0" distL="0" distR="0" wp14:anchorId="658D1584" wp14:editId="67EAB29F">
+          <wp:inline distT="0" distB="0" distL="0" distR="0" wp14:anchorId="1789DD1D" wp14:editId="168DAC9A">
             <wp:extent cx="1152002" cy="1152002"/>
             <wp:effectExtent l="0" t="0" r="0" b="0"/>
-            <wp:docPr id="1660267036" name="Picture 1"/>
+            <wp:docPr id="261741659" name="Picture 1"/>
             <wp:cNvGraphicFramePr/>
             <a:graphic xmlns:a="http://schemas.openxmlformats.org/drawingml/2006/main">
               <a:graphicData uri="http://schemas.openxmlformats.org/drawingml/2006/picture">
                 <pic:pic xmlns:pic="http://schemas.openxmlformats.org/drawingml/2006/picture">
                   <pic:nvPicPr>
-                    <pic:cNvPr id="1660267036" name=""/>
+                    <pic:cNvPr id="261741659" name=""/>
                     <pic:cNvPicPr/>
                   </pic:nvPicPr>
                   <pic:blipFill>
@@ -1949,15 +1949,7 @@
           <w:rFonts w:ascii="Times New Roman" w:hAnsi="Times New Roman" w:cs="Times New Roman"/>
           <w:sz w:val="24"/>
         </w:rPr>
-        <w:t xml:space="preserve">. Kendati demikian, pasar mobilitas perkotaan di Indonesia memiliki struktur oligopoli ketat yang didominasi secara </w:t>
-      </w:r>
-      <w:r>
-        <w:rPr>
-          <w:rFonts w:ascii="Times New Roman" w:hAnsi="Times New Roman" w:cs="Times New Roman"/>
-          <w:sz w:val="24"/>
-        </w:rPr>
-        <w:lastRenderedPageBreak/>
-        <w:t>mutlak oleh pemain-pemain mapan. Laporan riset pasar industri transportasi dari Mirae Asset Sekuritas (2023) mencatat bahwa pasar angkutan penumpang berbasis aplikasi (</w:t>
+        <w:t>. Kendati demikian, pasar mobilitas perkotaan di Indonesia memiliki struktur oligopoli ketat yang didominasi secara mutlak oleh pemain-pemain mapan. Laporan riset pasar industri transportasi dari Mirae Asset Sekuritas (2023) mencatat bahwa pasar angkutan penumpang berbasis aplikasi (</w:t>
       </w:r>
       <w:r>
         <w:rPr>
@@ -2269,15 +2261,7 @@
           <w:rFonts w:ascii="Times New Roman" w:hAnsi="Times New Roman" w:cs="Times New Roman"/>
           <w:sz w:val="24"/>
         </w:rPr>
-        <w:t xml:space="preserve">). Kehadiran inovasi armada taksi listrik ini secara resmi menempatkan kota metropolitan DKI Jakarta sebagai </w:t>
-      </w:r>
-      <w:r>
-        <w:rPr>
-          <w:rFonts w:ascii="Times New Roman" w:hAnsi="Times New Roman" w:cs="Times New Roman"/>
-          <w:sz w:val="24"/>
-        </w:rPr>
-        <w:lastRenderedPageBreak/>
-        <w:t xml:space="preserve">gerbang pembuka sekaligus episentrum utama operasionalisasi komersial </w:t>
+        <w:t xml:space="preserve">). Kehadiran inovasi armada taksi listrik ini secara resmi menempatkan kota metropolitan DKI Jakarta sebagai gerbang pembuka sekaligus episentrum utama operasionalisasi komersial </w:t>
       </w:r>
       <w:r>
         <w:rPr>
@@ -2529,15 +2513,7 @@
           <w:rFonts w:ascii="Times New Roman" w:hAnsi="Times New Roman" w:cs="Times New Roman"/>
           <w:sz w:val="24"/>
         </w:rPr>
-        <w:t xml:space="preserve"> masih menghadapi hambatan konversi yang cukup berat. Laporan survei mobilitas dari GoodStats (2024) dan Institute for Development of Economics and Finance (INDEF, 2023) mencatat bahwa pasar mobilitas perkotaan di Indonesia memiliki tingkat inersia kebiasaan (habitual inertia) yang sangat tinggi; meskipun mayoritas masyarakat (57,7%) memasang </w:t>
-      </w:r>
-      <w:r>
-        <w:rPr>
-          <w:rFonts w:ascii="Times New Roman" w:hAnsi="Times New Roman" w:cs="Times New Roman"/>
-          <w:sz w:val="24"/>
-        </w:rPr>
-        <w:lastRenderedPageBreak/>
-        <w:t xml:space="preserve">lebih dari satu aplikasi transportasi, preferensi penggunaan harian tetap terkunci pada pemain lama, sementara pemain pendatang baru di segmen mobil penumpang hanya mampu menyerap pangsa adopsi di bawah 3%. Hal ini diperparah oleh laporan liputan media industri dan keselamatan transportasi (Katadata, 2025; Kompas, 2025) yang mencatat bahwa tingkat keterisian penumpang dan ritase harian </w:t>
+        <w:t xml:space="preserve"> masih menghadapi hambatan konversi yang cukup berat. Laporan survei mobilitas dari GoodStats (2024) dan Institute for Development of Economics and Finance (INDEF, 2023) mencatat bahwa pasar mobilitas perkotaan di Indonesia memiliki tingkat inersia kebiasaan (habitual inertia) yang sangat tinggi; meskipun mayoritas masyarakat (57,7%) memasang lebih dari satu aplikasi transportasi, preferensi penggunaan harian tetap terkunci pada pemain lama, sementara pemain pendatang baru di segmen mobil penumpang hanya mampu menyerap pangsa adopsi di bawah 3%. Hal ini diperparah oleh laporan liputan media industri dan keselamatan transportasi (Katadata, 2025; Kompas, 2025) yang mencatat bahwa tingkat keterisian penumpang dan ritase harian </w:t>
       </w:r>
       <w:r>
         <w:rPr>
@@ -2616,15 +2592,7 @@
           <w:rFonts w:ascii="Times New Roman" w:hAnsi="Times New Roman" w:cs="Times New Roman"/>
           <w:sz w:val="24"/>
         </w:rPr>
-        <w:t xml:space="preserve">) masih sangat rendah. Riset Populix (2024) </w:t>
-      </w:r>
-      <w:r>
-        <w:rPr>
-          <w:rFonts w:ascii="Times New Roman" w:hAnsi="Times New Roman" w:cs="Times New Roman"/>
-          <w:sz w:val="24"/>
-        </w:rPr>
-        <w:lastRenderedPageBreak/>
-        <w:t>mengungkapkan bahwa keengganan konsumen untuk memutuskan mengadopsi kendaraan listrik dipicu oleh tiga hambatan utama:</w:t>
+        <w:t>) masih sangat rendah. Riset Populix (2024) mengungkapkan bahwa keengganan konsumen untuk memutuskan mengadopsi kendaraan listrik dipicu oleh tiga hambatan utama:</w:t>
       </w:r>
     </w:p>
     <w:p>
@@ -2944,15 +2912,7 @@
           <w:rFonts w:ascii="Times New Roman" w:hAnsi="Times New Roman" w:cs="Times New Roman"/>
           <w:sz w:val="24"/>
         </w:rPr>
-        <w:t xml:space="preserve">), dan memiliki reputasi internasional. Wijaya dan Pahar (2022) dalam riset empirisnya pada layanan transportasi publik membuktikan bahwa citra merek bersama dengan kepercayaan merek memegang peranan krusial </w:t>
-      </w:r>
-      <w:r>
-        <w:rPr>
-          <w:rFonts w:ascii="Times New Roman" w:hAnsi="Times New Roman" w:cs="Times New Roman"/>
-          <w:sz w:val="24"/>
-        </w:rPr>
-        <w:lastRenderedPageBreak/>
-        <w:t>yang berpengaruh positif dan signifikan terhadap keputusan konsumen. Temuan ini sejalan dengan penelitian Adha dan Suhardi (2025) pada adopsi kendaraan listrik (</w:t>
+        <w:t>), dan memiliki reputasi internasional. Wijaya dan Pahar (2022) dalam riset empirisnya pada layanan transportasi publik membuktikan bahwa citra merek bersama dengan kepercayaan merek memegang peranan krusial yang berpengaruh positif dan signifikan terhadap keputusan konsumen. Temuan ini sejalan dengan penelitian Adha dan Suhardi (2025) pada adopsi kendaraan listrik (</w:t>
       </w:r>
       <w:r>
         <w:rPr>
@@ -3148,16 +3108,7 @@
           <w:i/>
           <w:sz w:val="24"/>
         </w:rPr>
-        <w:t xml:space="preserve">regenerative </w:t>
-      </w:r>
-      <w:r>
-        <w:rPr>
-          <w:rFonts w:ascii="Times New Roman" w:hAnsi="Times New Roman" w:cs="Times New Roman"/>
-          <w:i/>
-          <w:sz w:val="24"/>
-        </w:rPr>
-        <w:lastRenderedPageBreak/>
-        <w:t>braking</w:t>
+        <w:t>regenerative braking</w:t>
       </w:r>
       <w:r>
         <w:rPr>
@@ -10074,23 +10025,23 @@
           <w:noProof/>
         </w:rPr>
         <w:drawing>
-          <wp:inline distT="0" distB="0" distL="0" distR="0" wp14:anchorId="6658CB1C" wp14:editId="539A7797">
-            <wp:extent cx="5400009" cy="2300616"/>
-            <wp:effectExtent l="0" t="0" r="0" b="4445"/>
-            <wp:docPr id="489449209" name="Picture 2"/>
+          <wp:inline distT="0" distB="0" distL="0" distR="0" wp14:anchorId="236FD480" wp14:editId="1554749C">
+            <wp:extent cx="5220008" cy="2800152"/>
+            <wp:effectExtent l="0" t="0" r="0" b="635"/>
+            <wp:docPr id="1061705227" name="Graphic 2"/>
             <wp:cNvGraphicFramePr/>
             <a:graphic xmlns:a="http://schemas.openxmlformats.org/drawingml/2006/main">
               <a:graphicData uri="http://schemas.openxmlformats.org/drawingml/2006/picture">
                 <pic:pic xmlns:pic="http://schemas.openxmlformats.org/drawingml/2006/picture">
                   <pic:nvPicPr>
-                    <pic:cNvPr id="489449209" name=""/>
+                    <pic:cNvPr id="1061705227" name=""/>
                     <pic:cNvPicPr/>
                   </pic:nvPicPr>
                   <pic:blipFill>
-                    <a:blip r:embed="rId13" cstate="print">
+                    <a:blip r:embed="rId13">
                       <a:extLst>
-                        <a:ext uri="{28A0092B-C50C-407E-A947-70E740481C1C}">
-                          <a14:useLocalDpi xmlns:a14="http://schemas.microsoft.com/office/drawing/2010/main" val="0"/>
+                        <a:ext uri="{96DAC541-7B7A-43D3-8B79-37D633B846F1}">
+                          <asvg:svgBlip xmlns:asvg="http://schemas.microsoft.com/office/drawing/2016/SVG/main" r:embed="rId14"/>
                         </a:ext>
                       </a:extLst>
                     </a:blip>
@@ -10101,7 +10052,7 @@
                   <pic:spPr>
                     <a:xfrm>
                       <a:off x="0" y="0"/>
-                      <a:ext cx="5400009" cy="2300616"/>
+                      <a:ext cx="5220008" cy="2800152"/>
                     </a:xfrm>
                     <a:prstGeom prst="rect">
                       <a:avLst/>
@@ -24555,7 +24506,7 @@
       </w:pPr>
     </w:p>
     <w:sectPr>
-      <w:footerReference w:type="default" r:id="rId14"/>
+      <w:footerReference w:type="default" r:id="rId15"/>
       <w:pgSz w:w="11907" w:h="16839"/>
       <w:pgMar w:top="1701" w:right="1701" w:bottom="1701" w:left="2268" w:header="708" w:footer="708" w:gutter="0"/>
       <w:pgNumType w:start="1"/>
@@ -24634,7 +24585,7 @@
         <w:noProof/>
         <w:sz w:val="20"/>
       </w:rPr>
-      <w:t>xi</w:t>
+      <w:t>iv</w:t>
     </w:r>
     <w:r>
       <w:rPr>
@@ -24708,7 +24659,7 @@
         <w:noProof/>
         <w:sz w:val="20"/>
       </w:rPr>
-      <w:t>11</w:t>
+      <w:t>4</w:t>
     </w:r>
     <w:r>
       <w:rPr>
@@ -25185,7 +25136,7 @@
     <w:link w:val="Heading1Char"/>
     <w:uiPriority w:val="9"/>
     <w:qFormat/>
-    <w:rsid w:val="00D421CC"/>
+    <w:rsid w:val="00CC5487"/>
     <w:pPr>
       <w:keepNext/>
       <w:keepLines/>
@@ -25208,7 +25159,7 @@
     <w:semiHidden/>
     <w:unhideWhenUsed/>
     <w:qFormat/>
-    <w:rsid w:val="00D421CC"/>
+    <w:rsid w:val="00CC5487"/>
     <w:pPr>
       <w:keepNext/>
       <w:keepLines/>
@@ -25231,7 +25182,7 @@
     <w:semiHidden/>
     <w:unhideWhenUsed/>
     <w:qFormat/>
-    <w:rsid w:val="00D421CC"/>
+    <w:rsid w:val="00CC5487"/>
     <w:pPr>
       <w:keepNext/>
       <w:keepLines/>
@@ -25254,7 +25205,7 @@
     <w:semiHidden/>
     <w:unhideWhenUsed/>
     <w:qFormat/>
-    <w:rsid w:val="00D421CC"/>
+    <w:rsid w:val="00CC5487"/>
     <w:pPr>
       <w:keepNext/>
       <w:keepLines/>
@@ -25277,7 +25228,7 @@
     <w:semiHidden/>
     <w:unhideWhenUsed/>
     <w:qFormat/>
-    <w:rsid w:val="00D421CC"/>
+    <w:rsid w:val="00CC5487"/>
     <w:pPr>
       <w:keepNext/>
       <w:keepLines/>
@@ -25298,7 +25249,7 @@
     <w:semiHidden/>
     <w:unhideWhenUsed/>
     <w:qFormat/>
-    <w:rsid w:val="00D421CC"/>
+    <w:rsid w:val="00CC5487"/>
     <w:pPr>
       <w:keepNext/>
       <w:keepLines/>
@@ -25321,7 +25272,7 @@
     <w:semiHidden/>
     <w:unhideWhenUsed/>
     <w:qFormat/>
-    <w:rsid w:val="00D421CC"/>
+    <w:rsid w:val="00CC5487"/>
     <w:pPr>
       <w:keepNext/>
       <w:keepLines/>
@@ -25342,7 +25293,7 @@
     <w:semiHidden/>
     <w:unhideWhenUsed/>
     <w:qFormat/>
-    <w:rsid w:val="00D421CC"/>
+    <w:rsid w:val="00CC5487"/>
     <w:pPr>
       <w:keepNext/>
       <w:keepLines/>
@@ -25365,7 +25316,7 @@
     <w:semiHidden/>
     <w:unhideWhenUsed/>
     <w:qFormat/>
-    <w:rsid w:val="00D421CC"/>
+    <w:rsid w:val="00CC5487"/>
     <w:pPr>
       <w:keepNext/>
       <w:keepLines/>
@@ -25409,7 +25360,7 @@
     <w:basedOn w:val="DefaultParagraphFont"/>
     <w:link w:val="Heading1"/>
     <w:uiPriority w:val="9"/>
-    <w:rsid w:val="00D421CC"/>
+    <w:rsid w:val="00CC5487"/>
     <w:rPr>
       <w:rFonts w:asciiTheme="majorHAnsi" w:eastAsiaTheme="majorEastAsia" w:hAnsiTheme="majorHAnsi" w:cstheme="majorBidi"/>
       <w:color w:val="2F5496" w:themeColor="accent1" w:themeShade="BF"/>
@@ -25423,7 +25374,7 @@
     <w:link w:val="Heading2"/>
     <w:uiPriority w:val="9"/>
     <w:semiHidden/>
-    <w:rsid w:val="00D421CC"/>
+    <w:rsid w:val="00CC5487"/>
     <w:rPr>
       <w:rFonts w:asciiTheme="majorHAnsi" w:eastAsiaTheme="majorEastAsia" w:hAnsiTheme="majorHAnsi" w:cstheme="majorBidi"/>
       <w:color w:val="2F5496" w:themeColor="accent1" w:themeShade="BF"/>
@@ -25437,7 +25388,7 @@
     <w:link w:val="Heading3"/>
     <w:uiPriority w:val="9"/>
     <w:semiHidden/>
-    <w:rsid w:val="00D421CC"/>
+    <w:rsid w:val="00CC5487"/>
     <w:rPr>
       <w:rFonts w:eastAsiaTheme="majorEastAsia" w:cstheme="majorBidi"/>
       <w:color w:val="2F5496" w:themeColor="accent1" w:themeShade="BF"/>
@@ -25451,7 +25402,7 @@
     <w:link w:val="Heading4"/>
     <w:uiPriority w:val="9"/>
     <w:semiHidden/>
-    <w:rsid w:val="00D421CC"/>
+    <w:rsid w:val="00CC5487"/>
     <w:rPr>
       <w:rFonts w:eastAsiaTheme="majorEastAsia" w:cstheme="majorBidi"/>
       <w:i/>
@@ -25465,7 +25416,7 @@
     <w:link w:val="Heading5"/>
     <w:uiPriority w:val="9"/>
     <w:semiHidden/>
-    <w:rsid w:val="00D421CC"/>
+    <w:rsid w:val="00CC5487"/>
     <w:rPr>
       <w:rFonts w:eastAsiaTheme="majorEastAsia" w:cstheme="majorBidi"/>
       <w:color w:val="2F5496" w:themeColor="accent1" w:themeShade="BF"/>
@@ -25477,7 +25428,7 @@
     <w:link w:val="Heading6"/>
     <w:uiPriority w:val="9"/>
     <w:semiHidden/>
-    <w:rsid w:val="00D421CC"/>
+    <w:rsid w:val="00CC5487"/>
     <w:rPr>
       <w:rFonts w:eastAsiaTheme="majorEastAsia" w:cstheme="majorBidi"/>
       <w:i/>
@@ -25491,7 +25442,7 @@
     <w:link w:val="Heading7"/>
     <w:uiPriority w:val="9"/>
     <w:semiHidden/>
-    <w:rsid w:val="00D421CC"/>
+    <w:rsid w:val="00CC5487"/>
     <w:rPr>
       <w:rFonts w:eastAsiaTheme="majorEastAsia" w:cstheme="majorBidi"/>
       <w:color w:val="595959" w:themeColor="text1" w:themeTint="A6"/>
@@ -25503,7 +25454,7 @@
     <w:link w:val="Heading8"/>
     <w:uiPriority w:val="9"/>
     <w:semiHidden/>
-    <w:rsid w:val="00D421CC"/>
+    <w:rsid w:val="00CC5487"/>
     <w:rPr>
       <w:rFonts w:eastAsiaTheme="majorEastAsia" w:cstheme="majorBidi"/>
       <w:i/>
@@ -25517,7 +25468,7 @@
     <w:link w:val="Heading9"/>
     <w:uiPriority w:val="9"/>
     <w:semiHidden/>
-    <w:rsid w:val="00D421CC"/>
+    <w:rsid w:val="00CC5487"/>
     <w:rPr>
       <w:rFonts w:eastAsiaTheme="majorEastAsia" w:cstheme="majorBidi"/>
       <w:color w:val="272727" w:themeColor="text1" w:themeTint="D8"/>
@@ -25530,7 +25481,7 @@
     <w:link w:val="TitleChar"/>
     <w:uiPriority w:val="10"/>
     <w:qFormat/>
-    <w:rsid w:val="00D421CC"/>
+    <w:rsid w:val="00CC5487"/>
     <w:pPr>
       <w:spacing w:after="80" w:line="240" w:lineRule="auto"/>
       <w:contextualSpacing/>
@@ -25548,7 +25499,7 @@
     <w:basedOn w:val="DefaultParagraphFont"/>
     <w:link w:val="Title"/>
     <w:uiPriority w:val="10"/>
-    <w:rsid w:val="00D421CC"/>
+    <w:rsid w:val="00CC5487"/>
     <w:rPr>
       <w:rFonts w:asciiTheme="majorHAnsi" w:eastAsiaTheme="majorEastAsia" w:hAnsiTheme="majorHAnsi" w:cstheme="majorBidi"/>
       <w:spacing w:val="-10"/>
@@ -25564,7 +25515,7 @@
     <w:link w:val="SubtitleChar"/>
     <w:uiPriority w:val="11"/>
     <w:qFormat/>
-    <w:rsid w:val="00D421CC"/>
+    <w:rsid w:val="00CC5487"/>
     <w:pPr>
       <w:numPr>
         <w:ilvl w:val="1"/>
@@ -25583,7 +25534,7 @@
     <w:basedOn w:val="DefaultParagraphFont"/>
     <w:link w:val="Subtitle"/>
     <w:uiPriority w:val="11"/>
-    <w:rsid w:val="00D421CC"/>
+    <w:rsid w:val="00CC5487"/>
     <w:rPr>
       <w:rFonts w:eastAsiaTheme="majorEastAsia" w:cstheme="majorBidi"/>
       <w:color w:val="595959" w:themeColor="text1" w:themeTint="A6"/>
@@ -25599,7 +25550,7 @@
     <w:link w:val="QuoteChar"/>
     <w:uiPriority w:val="29"/>
     <w:qFormat/>
-    <w:rsid w:val="00D421CC"/>
+    <w:rsid w:val="00CC5487"/>
     <w:pPr>
       <w:spacing w:before="160"/>
       <w:jc w:val="center"/>
@@ -25615,7 +25566,7 @@
     <w:basedOn w:val="DefaultParagraphFont"/>
     <w:link w:val="Quote"/>
     <w:uiPriority w:val="29"/>
-    <w:rsid w:val="00D421CC"/>
+    <w:rsid w:val="00CC5487"/>
     <w:rPr>
       <w:i/>
       <w:iCs/>
@@ -25627,7 +25578,7 @@
     <w:basedOn w:val="Normal"/>
     <w:uiPriority w:val="34"/>
     <w:qFormat/>
-    <w:rsid w:val="00D421CC"/>
+    <w:rsid w:val="00CC5487"/>
     <w:pPr>
       <w:ind w:left="720"/>
       <w:contextualSpacing/>
@@ -25638,7 +25589,7 @@
     <w:basedOn w:val="DefaultParagraphFont"/>
     <w:uiPriority w:val="21"/>
     <w:qFormat/>
-    <w:rsid w:val="00D421CC"/>
+    <w:rsid w:val="00CC5487"/>
     <w:rPr>
       <w:i/>
       <w:iCs/>
@@ -25652,7 +25603,7 @@
     <w:link w:val="IntenseQuoteChar"/>
     <w:uiPriority w:val="30"/>
     <w:qFormat/>
-    <w:rsid w:val="00D421CC"/>
+    <w:rsid w:val="00CC5487"/>
     <w:pPr>
       <w:pBdr>
         <w:top w:val="single" w:sz="4" w:space="10" w:color="2F5496" w:themeColor="accent1" w:themeShade="BF"/>
@@ -25673,7 +25624,7 @@
     <w:basedOn w:val="DefaultParagraphFont"/>
     <w:link w:val="IntenseQuote"/>
     <w:uiPriority w:val="30"/>
-    <w:rsid w:val="00D421CC"/>
+    <w:rsid w:val="00CC5487"/>
     <w:rPr>
       <w:i/>
       <w:iCs/>
@@ -25685,7 +25636,7 @@
     <w:basedOn w:val="DefaultParagraphFont"/>
     <w:uiPriority w:val="32"/>
     <w:qFormat/>
-    <w:rsid w:val="00D421CC"/>
+    <w:rsid w:val="00CC5487"/>
     <w:rPr>
       <w:b/>
       <w:bCs/>
@@ -25700,7 +25651,7 @@
     <w:link w:val="HeaderChar"/>
     <w:uiPriority w:val="99"/>
     <w:unhideWhenUsed/>
-    <w:rsid w:val="00D421CC"/>
+    <w:rsid w:val="00CC5487"/>
     <w:pPr>
       <w:tabs>
         <w:tab w:val="center" w:pos="4513"/>
@@ -25714,7 +25665,7 @@
     <w:basedOn w:val="DefaultParagraphFont"/>
     <w:link w:val="Header"/>
     <w:uiPriority w:val="99"/>
-    <w:rsid w:val="00D421CC"/>
+    <w:rsid w:val="00CC5487"/>
   </w:style>
   <w:style w:type="paragraph" w:styleId="Footer">
     <w:name w:val="footer"/>
@@ -25722,7 +25673,7 @@
     <w:link w:val="FooterChar"/>
     <w:uiPriority w:val="99"/>
     <w:unhideWhenUsed/>
-    <w:rsid w:val="00D421CC"/>
+    <w:rsid w:val="00CC5487"/>
     <w:pPr>
       <w:tabs>
         <w:tab w:val="center" w:pos="4513"/>
@@ -25736,7 +25687,7 @@
     <w:basedOn w:val="DefaultParagraphFont"/>
     <w:link w:val="Footer"/>
     <w:uiPriority w:val="99"/>
-    <w:rsid w:val="00D421CC"/>
+    <w:rsid w:val="00CC5487"/>
   </w:style>
 </w:styles>
 </file>

</xml_diff>

<commit_message>
fix(diagram): perlebar oval dan rapikan teks kerangka konseptual agar tidak keluar batas oval
</commit_message>
<xml_diff>
--- a/TOPIK_2_TAKSI_GREEN_SM/01_Naskah_Utama/Proposal_Skripsi_Taksi_Green_SM.docx
+++ b/TOPIK_2_TAKSI_GREEN_SM/01_Naskah_Utama/Proposal_Skripsi_Taksi_Green_SM.docx
@@ -12,16 +12,16 @@
           <w:noProof/>
         </w:rPr>
         <w:drawing>
-          <wp:inline distT="0" distB="0" distL="0" distR="0" wp14:anchorId="1789DD1D" wp14:editId="168DAC9A">
+          <wp:inline distT="0" distB="0" distL="0" distR="0" wp14:anchorId="00BD0C3C" wp14:editId="51DC88FB">
             <wp:extent cx="1152002" cy="1152002"/>
             <wp:effectExtent l="0" t="0" r="0" b="0"/>
-            <wp:docPr id="261741659" name="Picture 1"/>
+            <wp:docPr id="380275129" name="Picture 1"/>
             <wp:cNvGraphicFramePr/>
             <a:graphic xmlns:a="http://schemas.openxmlformats.org/drawingml/2006/main">
               <a:graphicData uri="http://schemas.openxmlformats.org/drawingml/2006/picture">
                 <pic:pic xmlns:pic="http://schemas.openxmlformats.org/drawingml/2006/picture">
                   <pic:nvPicPr>
-                    <pic:cNvPr id="261741659" name=""/>
+                    <pic:cNvPr id="380275129" name=""/>
                     <pic:cNvPicPr/>
                   </pic:nvPicPr>
                   <pic:blipFill>
@@ -1089,7 +1089,6 @@
           <w:b/>
           <w:sz w:val="28"/>
         </w:rPr>
-        <w:lastRenderedPageBreak/>
         <w:t>DAFTAR ISI</w:t>
       </w:r>
     </w:p>
@@ -1330,7 +1329,6 @@
         <w:rPr>
           <w:rFonts w:ascii="Times New Roman" w:hAnsi="Times New Roman" w:cs="Times New Roman"/>
         </w:rPr>
-        <w:lastRenderedPageBreak/>
         <w:t xml:space="preserve">    2.1.1 Perilaku Konsumen dan Keputusan Pembelian (</w:t>
       </w:r>
       <w:r>
@@ -1683,7 +1681,6 @@
         <w:rPr>
           <w:rFonts w:ascii="Times New Roman" w:hAnsi="Times New Roman" w:cs="Times New Roman"/>
         </w:rPr>
-        <w:lastRenderedPageBreak/>
         <w:t xml:space="preserve">  3.5 Metode Analisis Data ............................................................................................................... 35</w:t>
       </w:r>
     </w:p>
@@ -10025,16 +10022,16 @@
           <w:noProof/>
         </w:rPr>
         <w:drawing>
-          <wp:inline distT="0" distB="0" distL="0" distR="0" wp14:anchorId="236FD480" wp14:editId="1554749C">
-            <wp:extent cx="5220008" cy="2800152"/>
-            <wp:effectExtent l="0" t="0" r="0" b="635"/>
-            <wp:docPr id="1061705227" name="Graphic 2"/>
+          <wp:inline distT="0" distB="0" distL="0" distR="0" wp14:anchorId="649D19B8" wp14:editId="4538EA4B">
+            <wp:extent cx="5220008" cy="3131820"/>
+            <wp:effectExtent l="0" t="0" r="0" b="0"/>
+            <wp:docPr id="1605507492" name="Graphic 2"/>
             <wp:cNvGraphicFramePr/>
             <a:graphic xmlns:a="http://schemas.openxmlformats.org/drawingml/2006/main">
               <a:graphicData uri="http://schemas.openxmlformats.org/drawingml/2006/picture">
                 <pic:pic xmlns:pic="http://schemas.openxmlformats.org/drawingml/2006/picture">
                   <pic:nvPicPr>
-                    <pic:cNvPr id="1061705227" name=""/>
+                    <pic:cNvPr id="1605507492" name=""/>
                     <pic:cNvPicPr/>
                   </pic:nvPicPr>
                   <pic:blipFill>
@@ -10052,7 +10049,7 @@
                   <pic:spPr>
                     <a:xfrm>
                       <a:off x="0" y="0"/>
-                      <a:ext cx="5220008" cy="2800152"/>
+                      <a:ext cx="5220008" cy="3131820"/>
                     </a:xfrm>
                     <a:prstGeom prst="rect">
                       <a:avLst/>
@@ -24585,7 +24582,7 @@
         <w:noProof/>
         <w:sz w:val="20"/>
       </w:rPr>
-      <w:t>iv</w:t>
+      <w:t>i</w:t>
     </w:r>
     <w:r>
       <w:rPr>
@@ -24659,7 +24656,7 @@
         <w:noProof/>
         <w:sz w:val="20"/>
       </w:rPr>
-      <w:t>4</w:t>
+      <w:t>1</w:t>
     </w:r>
     <w:r>
       <w:rPr>
@@ -25136,7 +25133,7 @@
     <w:link w:val="Heading1Char"/>
     <w:uiPriority w:val="9"/>
     <w:qFormat/>
-    <w:rsid w:val="00CC5487"/>
+    <w:rsid w:val="00072D29"/>
     <w:pPr>
       <w:keepNext/>
       <w:keepLines/>
@@ -25159,7 +25156,7 @@
     <w:semiHidden/>
     <w:unhideWhenUsed/>
     <w:qFormat/>
-    <w:rsid w:val="00CC5487"/>
+    <w:rsid w:val="00072D29"/>
     <w:pPr>
       <w:keepNext/>
       <w:keepLines/>
@@ -25182,7 +25179,7 @@
     <w:semiHidden/>
     <w:unhideWhenUsed/>
     <w:qFormat/>
-    <w:rsid w:val="00CC5487"/>
+    <w:rsid w:val="00072D29"/>
     <w:pPr>
       <w:keepNext/>
       <w:keepLines/>
@@ -25205,7 +25202,7 @@
     <w:semiHidden/>
     <w:unhideWhenUsed/>
     <w:qFormat/>
-    <w:rsid w:val="00CC5487"/>
+    <w:rsid w:val="00072D29"/>
     <w:pPr>
       <w:keepNext/>
       <w:keepLines/>
@@ -25228,7 +25225,7 @@
     <w:semiHidden/>
     <w:unhideWhenUsed/>
     <w:qFormat/>
-    <w:rsid w:val="00CC5487"/>
+    <w:rsid w:val="00072D29"/>
     <w:pPr>
       <w:keepNext/>
       <w:keepLines/>
@@ -25249,7 +25246,7 @@
     <w:semiHidden/>
     <w:unhideWhenUsed/>
     <w:qFormat/>
-    <w:rsid w:val="00CC5487"/>
+    <w:rsid w:val="00072D29"/>
     <w:pPr>
       <w:keepNext/>
       <w:keepLines/>
@@ -25272,7 +25269,7 @@
     <w:semiHidden/>
     <w:unhideWhenUsed/>
     <w:qFormat/>
-    <w:rsid w:val="00CC5487"/>
+    <w:rsid w:val="00072D29"/>
     <w:pPr>
       <w:keepNext/>
       <w:keepLines/>
@@ -25293,7 +25290,7 @@
     <w:semiHidden/>
     <w:unhideWhenUsed/>
     <w:qFormat/>
-    <w:rsid w:val="00CC5487"/>
+    <w:rsid w:val="00072D29"/>
     <w:pPr>
       <w:keepNext/>
       <w:keepLines/>
@@ -25316,7 +25313,7 @@
     <w:semiHidden/>
     <w:unhideWhenUsed/>
     <w:qFormat/>
-    <w:rsid w:val="00CC5487"/>
+    <w:rsid w:val="00072D29"/>
     <w:pPr>
       <w:keepNext/>
       <w:keepLines/>
@@ -25360,7 +25357,7 @@
     <w:basedOn w:val="DefaultParagraphFont"/>
     <w:link w:val="Heading1"/>
     <w:uiPriority w:val="9"/>
-    <w:rsid w:val="00CC5487"/>
+    <w:rsid w:val="00072D29"/>
     <w:rPr>
       <w:rFonts w:asciiTheme="majorHAnsi" w:eastAsiaTheme="majorEastAsia" w:hAnsiTheme="majorHAnsi" w:cstheme="majorBidi"/>
       <w:color w:val="2F5496" w:themeColor="accent1" w:themeShade="BF"/>
@@ -25374,7 +25371,7 @@
     <w:link w:val="Heading2"/>
     <w:uiPriority w:val="9"/>
     <w:semiHidden/>
-    <w:rsid w:val="00CC5487"/>
+    <w:rsid w:val="00072D29"/>
     <w:rPr>
       <w:rFonts w:asciiTheme="majorHAnsi" w:eastAsiaTheme="majorEastAsia" w:hAnsiTheme="majorHAnsi" w:cstheme="majorBidi"/>
       <w:color w:val="2F5496" w:themeColor="accent1" w:themeShade="BF"/>
@@ -25388,7 +25385,7 @@
     <w:link w:val="Heading3"/>
     <w:uiPriority w:val="9"/>
     <w:semiHidden/>
-    <w:rsid w:val="00CC5487"/>
+    <w:rsid w:val="00072D29"/>
     <w:rPr>
       <w:rFonts w:eastAsiaTheme="majorEastAsia" w:cstheme="majorBidi"/>
       <w:color w:val="2F5496" w:themeColor="accent1" w:themeShade="BF"/>
@@ -25402,7 +25399,7 @@
     <w:link w:val="Heading4"/>
     <w:uiPriority w:val="9"/>
     <w:semiHidden/>
-    <w:rsid w:val="00CC5487"/>
+    <w:rsid w:val="00072D29"/>
     <w:rPr>
       <w:rFonts w:eastAsiaTheme="majorEastAsia" w:cstheme="majorBidi"/>
       <w:i/>
@@ -25416,7 +25413,7 @@
     <w:link w:val="Heading5"/>
     <w:uiPriority w:val="9"/>
     <w:semiHidden/>
-    <w:rsid w:val="00CC5487"/>
+    <w:rsid w:val="00072D29"/>
     <w:rPr>
       <w:rFonts w:eastAsiaTheme="majorEastAsia" w:cstheme="majorBidi"/>
       <w:color w:val="2F5496" w:themeColor="accent1" w:themeShade="BF"/>
@@ -25428,7 +25425,7 @@
     <w:link w:val="Heading6"/>
     <w:uiPriority w:val="9"/>
     <w:semiHidden/>
-    <w:rsid w:val="00CC5487"/>
+    <w:rsid w:val="00072D29"/>
     <w:rPr>
       <w:rFonts w:eastAsiaTheme="majorEastAsia" w:cstheme="majorBidi"/>
       <w:i/>
@@ -25442,7 +25439,7 @@
     <w:link w:val="Heading7"/>
     <w:uiPriority w:val="9"/>
     <w:semiHidden/>
-    <w:rsid w:val="00CC5487"/>
+    <w:rsid w:val="00072D29"/>
     <w:rPr>
       <w:rFonts w:eastAsiaTheme="majorEastAsia" w:cstheme="majorBidi"/>
       <w:color w:val="595959" w:themeColor="text1" w:themeTint="A6"/>
@@ -25454,7 +25451,7 @@
     <w:link w:val="Heading8"/>
     <w:uiPriority w:val="9"/>
     <w:semiHidden/>
-    <w:rsid w:val="00CC5487"/>
+    <w:rsid w:val="00072D29"/>
     <w:rPr>
       <w:rFonts w:eastAsiaTheme="majorEastAsia" w:cstheme="majorBidi"/>
       <w:i/>
@@ -25468,7 +25465,7 @@
     <w:link w:val="Heading9"/>
     <w:uiPriority w:val="9"/>
     <w:semiHidden/>
-    <w:rsid w:val="00CC5487"/>
+    <w:rsid w:val="00072D29"/>
     <w:rPr>
       <w:rFonts w:eastAsiaTheme="majorEastAsia" w:cstheme="majorBidi"/>
       <w:color w:val="272727" w:themeColor="text1" w:themeTint="D8"/>
@@ -25481,7 +25478,7 @@
     <w:link w:val="TitleChar"/>
     <w:uiPriority w:val="10"/>
     <w:qFormat/>
-    <w:rsid w:val="00CC5487"/>
+    <w:rsid w:val="00072D29"/>
     <w:pPr>
       <w:spacing w:after="80" w:line="240" w:lineRule="auto"/>
       <w:contextualSpacing/>
@@ -25499,7 +25496,7 @@
     <w:basedOn w:val="DefaultParagraphFont"/>
     <w:link w:val="Title"/>
     <w:uiPriority w:val="10"/>
-    <w:rsid w:val="00CC5487"/>
+    <w:rsid w:val="00072D29"/>
     <w:rPr>
       <w:rFonts w:asciiTheme="majorHAnsi" w:eastAsiaTheme="majorEastAsia" w:hAnsiTheme="majorHAnsi" w:cstheme="majorBidi"/>
       <w:spacing w:val="-10"/>
@@ -25515,7 +25512,7 @@
     <w:link w:val="SubtitleChar"/>
     <w:uiPriority w:val="11"/>
     <w:qFormat/>
-    <w:rsid w:val="00CC5487"/>
+    <w:rsid w:val="00072D29"/>
     <w:pPr>
       <w:numPr>
         <w:ilvl w:val="1"/>
@@ -25534,7 +25531,7 @@
     <w:basedOn w:val="DefaultParagraphFont"/>
     <w:link w:val="Subtitle"/>
     <w:uiPriority w:val="11"/>
-    <w:rsid w:val="00CC5487"/>
+    <w:rsid w:val="00072D29"/>
     <w:rPr>
       <w:rFonts w:eastAsiaTheme="majorEastAsia" w:cstheme="majorBidi"/>
       <w:color w:val="595959" w:themeColor="text1" w:themeTint="A6"/>
@@ -25550,7 +25547,7 @@
     <w:link w:val="QuoteChar"/>
     <w:uiPriority w:val="29"/>
     <w:qFormat/>
-    <w:rsid w:val="00CC5487"/>
+    <w:rsid w:val="00072D29"/>
     <w:pPr>
       <w:spacing w:before="160"/>
       <w:jc w:val="center"/>
@@ -25566,7 +25563,7 @@
     <w:basedOn w:val="DefaultParagraphFont"/>
     <w:link w:val="Quote"/>
     <w:uiPriority w:val="29"/>
-    <w:rsid w:val="00CC5487"/>
+    <w:rsid w:val="00072D29"/>
     <w:rPr>
       <w:i/>
       <w:iCs/>
@@ -25578,7 +25575,7 @@
     <w:basedOn w:val="Normal"/>
     <w:uiPriority w:val="34"/>
     <w:qFormat/>
-    <w:rsid w:val="00CC5487"/>
+    <w:rsid w:val="00072D29"/>
     <w:pPr>
       <w:ind w:left="720"/>
       <w:contextualSpacing/>
@@ -25589,7 +25586,7 @@
     <w:basedOn w:val="DefaultParagraphFont"/>
     <w:uiPriority w:val="21"/>
     <w:qFormat/>
-    <w:rsid w:val="00CC5487"/>
+    <w:rsid w:val="00072D29"/>
     <w:rPr>
       <w:i/>
       <w:iCs/>
@@ -25603,7 +25600,7 @@
     <w:link w:val="IntenseQuoteChar"/>
     <w:uiPriority w:val="30"/>
     <w:qFormat/>
-    <w:rsid w:val="00CC5487"/>
+    <w:rsid w:val="00072D29"/>
     <w:pPr>
       <w:pBdr>
         <w:top w:val="single" w:sz="4" w:space="10" w:color="2F5496" w:themeColor="accent1" w:themeShade="BF"/>
@@ -25624,7 +25621,7 @@
     <w:basedOn w:val="DefaultParagraphFont"/>
     <w:link w:val="IntenseQuote"/>
     <w:uiPriority w:val="30"/>
-    <w:rsid w:val="00CC5487"/>
+    <w:rsid w:val="00072D29"/>
     <w:rPr>
       <w:i/>
       <w:iCs/>
@@ -25636,7 +25633,7 @@
     <w:basedOn w:val="DefaultParagraphFont"/>
     <w:uiPriority w:val="32"/>
     <w:qFormat/>
-    <w:rsid w:val="00CC5487"/>
+    <w:rsid w:val="00072D29"/>
     <w:rPr>
       <w:b/>
       <w:bCs/>
@@ -25651,7 +25648,7 @@
     <w:link w:val="HeaderChar"/>
     <w:uiPriority w:val="99"/>
     <w:unhideWhenUsed/>
-    <w:rsid w:val="00CC5487"/>
+    <w:rsid w:val="00072D29"/>
     <w:pPr>
       <w:tabs>
         <w:tab w:val="center" w:pos="4513"/>
@@ -25665,7 +25662,7 @@
     <w:basedOn w:val="DefaultParagraphFont"/>
     <w:link w:val="Header"/>
     <w:uiPriority w:val="99"/>
-    <w:rsid w:val="00CC5487"/>
+    <w:rsid w:val="00072D29"/>
   </w:style>
   <w:style w:type="paragraph" w:styleId="Footer">
     <w:name w:val="footer"/>
@@ -25673,7 +25670,7 @@
     <w:link w:val="FooterChar"/>
     <w:uiPriority w:val="99"/>
     <w:unhideWhenUsed/>
-    <w:rsid w:val="00CC5487"/>
+    <w:rsid w:val="00072D29"/>
     <w:pPr>
       <w:tabs>
         <w:tab w:val="center" w:pos="4513"/>
@@ -25687,7 +25684,7 @@
     <w:basedOn w:val="DefaultParagraphFont"/>
     <w:link w:val="Footer"/>
     <w:uiPriority w:val="99"/>
-    <w:rsid w:val="00CC5487"/>
+    <w:rsid w:val="00072D29"/>
   </w:style>
 </w:styles>
 </file>

</xml_diff>

<commit_message>
fix(diagram): hapus kata signifikan pada badge hipotesis kerangka pemikiran dan rumusan H1-H3
</commit_message>
<xml_diff>
--- a/TOPIK_2_TAKSI_GREEN_SM/01_Naskah_Utama/Proposal_Skripsi_Taksi_Green_SM.docx
+++ b/TOPIK_2_TAKSI_GREEN_SM/01_Naskah_Utama/Proposal_Skripsi_Taksi_Green_SM.docx
@@ -12,16 +12,16 @@
           <w:noProof/>
         </w:rPr>
         <w:drawing>
-          <wp:inline distT="0" distB="0" distL="0" distR="0" wp14:anchorId="00BD0C3C" wp14:editId="51DC88FB">
+          <wp:inline distT="0" distB="0" distL="0" distR="0" wp14:anchorId="01E93654" wp14:editId="664EA24D">
             <wp:extent cx="1152002" cy="1152002"/>
             <wp:effectExtent l="0" t="0" r="0" b="0"/>
-            <wp:docPr id="380275129" name="Picture 1"/>
+            <wp:docPr id="2083232229" name="Picture 1"/>
             <wp:cNvGraphicFramePr/>
             <a:graphic xmlns:a="http://schemas.openxmlformats.org/drawingml/2006/main">
               <a:graphicData uri="http://schemas.openxmlformats.org/drawingml/2006/picture">
                 <pic:pic xmlns:pic="http://schemas.openxmlformats.org/drawingml/2006/picture">
                   <pic:nvPicPr>
-                    <pic:cNvPr id="380275129" name=""/>
+                    <pic:cNvPr id="2083232229" name=""/>
                     <pic:cNvPicPr/>
                   </pic:nvPicPr>
                   <pic:blipFill>
@@ -9393,7 +9393,7 @@
           <w:rFonts w:ascii="Times New Roman" w:hAnsi="Times New Roman" w:cs="Times New Roman"/>
           <w:i/>
         </w:rPr>
-        <w:t>$H_1$: Brand Image berpengaruh positif dan signifikan terhadap Purchase Decision dalam penggunaan jasa taksi Green SM di wilayah Jakarta Barat.</w:t>
+        <w:t>$H_1$: Brand Image berpengaruh positif terhadap Purchase Decision dalam penggunaan jasa taksi Green SM di wilayah Jakarta Barat.</w:t>
       </w:r>
     </w:p>
     <w:p>
@@ -9555,7 +9555,7 @@
           <w:rFonts w:ascii="Times New Roman" w:hAnsi="Times New Roman" w:cs="Times New Roman"/>
           <w:i/>
         </w:rPr>
-        <w:t>$H_2$: Brand Trust berpengaruh positif dan signifikan terhadap Purchase Decision dalam penggunaan jasa taksi Green SM di wilayah Jakarta Barat.</w:t>
+        <w:t>$H_2$: Brand Trust berpengaruh positif terhadap Purchase Decision dalam penggunaan jasa taksi Green SM di wilayah Jakarta Barat.</w:t>
       </w:r>
     </w:p>
     <w:p>
@@ -9807,7 +9807,7 @@
           <w:rFonts w:ascii="Times New Roman" w:hAnsi="Times New Roman" w:cs="Times New Roman"/>
           <w:i/>
         </w:rPr>
-        <w:t>$H_3$: Perceived Safety berpengaruh positif dan signifikan terhadap Purchase Decision dalam penggunaan jasa taksi Green SM di wilayah Jakarta Barat.</w:t>
+        <w:t>$H_3$: Perceived Safety berpengaruh positif terhadap Purchase Decision dalam penggunaan jasa taksi Green SM di wilayah Jakarta Barat.</w:t>
       </w:r>
     </w:p>
     <w:p>
@@ -10022,16 +10022,16 @@
           <w:noProof/>
         </w:rPr>
         <w:drawing>
-          <wp:inline distT="0" distB="0" distL="0" distR="0" wp14:anchorId="649D19B8" wp14:editId="4538EA4B">
+          <wp:inline distT="0" distB="0" distL="0" distR="0" wp14:anchorId="0ED6DC7F" wp14:editId="102BC202">
             <wp:extent cx="5220008" cy="3131820"/>
             <wp:effectExtent l="0" t="0" r="0" b="0"/>
-            <wp:docPr id="1605507492" name="Graphic 2"/>
+            <wp:docPr id="990285678" name="Graphic 2"/>
             <wp:cNvGraphicFramePr/>
             <a:graphic xmlns:a="http://schemas.openxmlformats.org/drawingml/2006/main">
               <a:graphicData uri="http://schemas.openxmlformats.org/drawingml/2006/picture">
                 <pic:pic xmlns:pic="http://schemas.openxmlformats.org/drawingml/2006/picture">
                   <pic:nvPicPr>
-                    <pic:cNvPr id="1605507492" name=""/>
+                    <pic:cNvPr id="990285678" name=""/>
                     <pic:cNvPicPr/>
                   </pic:nvPicPr>
                   <pic:blipFill>
@@ -25133,7 +25133,7 @@
     <w:link w:val="Heading1Char"/>
     <w:uiPriority w:val="9"/>
     <w:qFormat/>
-    <w:rsid w:val="00072D29"/>
+    <w:rsid w:val="00882559"/>
     <w:pPr>
       <w:keepNext/>
       <w:keepLines/>
@@ -25156,7 +25156,7 @@
     <w:semiHidden/>
     <w:unhideWhenUsed/>
     <w:qFormat/>
-    <w:rsid w:val="00072D29"/>
+    <w:rsid w:val="00882559"/>
     <w:pPr>
       <w:keepNext/>
       <w:keepLines/>
@@ -25179,7 +25179,7 @@
     <w:semiHidden/>
     <w:unhideWhenUsed/>
     <w:qFormat/>
-    <w:rsid w:val="00072D29"/>
+    <w:rsid w:val="00882559"/>
     <w:pPr>
       <w:keepNext/>
       <w:keepLines/>
@@ -25202,7 +25202,7 @@
     <w:semiHidden/>
     <w:unhideWhenUsed/>
     <w:qFormat/>
-    <w:rsid w:val="00072D29"/>
+    <w:rsid w:val="00882559"/>
     <w:pPr>
       <w:keepNext/>
       <w:keepLines/>
@@ -25225,7 +25225,7 @@
     <w:semiHidden/>
     <w:unhideWhenUsed/>
     <w:qFormat/>
-    <w:rsid w:val="00072D29"/>
+    <w:rsid w:val="00882559"/>
     <w:pPr>
       <w:keepNext/>
       <w:keepLines/>
@@ -25246,7 +25246,7 @@
     <w:semiHidden/>
     <w:unhideWhenUsed/>
     <w:qFormat/>
-    <w:rsid w:val="00072D29"/>
+    <w:rsid w:val="00882559"/>
     <w:pPr>
       <w:keepNext/>
       <w:keepLines/>
@@ -25269,7 +25269,7 @@
     <w:semiHidden/>
     <w:unhideWhenUsed/>
     <w:qFormat/>
-    <w:rsid w:val="00072D29"/>
+    <w:rsid w:val="00882559"/>
     <w:pPr>
       <w:keepNext/>
       <w:keepLines/>
@@ -25290,7 +25290,7 @@
     <w:semiHidden/>
     <w:unhideWhenUsed/>
     <w:qFormat/>
-    <w:rsid w:val="00072D29"/>
+    <w:rsid w:val="00882559"/>
     <w:pPr>
       <w:keepNext/>
       <w:keepLines/>
@@ -25313,7 +25313,7 @@
     <w:semiHidden/>
     <w:unhideWhenUsed/>
     <w:qFormat/>
-    <w:rsid w:val="00072D29"/>
+    <w:rsid w:val="00882559"/>
     <w:pPr>
       <w:keepNext/>
       <w:keepLines/>
@@ -25357,7 +25357,7 @@
     <w:basedOn w:val="DefaultParagraphFont"/>
     <w:link w:val="Heading1"/>
     <w:uiPriority w:val="9"/>
-    <w:rsid w:val="00072D29"/>
+    <w:rsid w:val="00882559"/>
     <w:rPr>
       <w:rFonts w:asciiTheme="majorHAnsi" w:eastAsiaTheme="majorEastAsia" w:hAnsiTheme="majorHAnsi" w:cstheme="majorBidi"/>
       <w:color w:val="2F5496" w:themeColor="accent1" w:themeShade="BF"/>
@@ -25371,7 +25371,7 @@
     <w:link w:val="Heading2"/>
     <w:uiPriority w:val="9"/>
     <w:semiHidden/>
-    <w:rsid w:val="00072D29"/>
+    <w:rsid w:val="00882559"/>
     <w:rPr>
       <w:rFonts w:asciiTheme="majorHAnsi" w:eastAsiaTheme="majorEastAsia" w:hAnsiTheme="majorHAnsi" w:cstheme="majorBidi"/>
       <w:color w:val="2F5496" w:themeColor="accent1" w:themeShade="BF"/>
@@ -25385,7 +25385,7 @@
     <w:link w:val="Heading3"/>
     <w:uiPriority w:val="9"/>
     <w:semiHidden/>
-    <w:rsid w:val="00072D29"/>
+    <w:rsid w:val="00882559"/>
     <w:rPr>
       <w:rFonts w:eastAsiaTheme="majorEastAsia" w:cstheme="majorBidi"/>
       <w:color w:val="2F5496" w:themeColor="accent1" w:themeShade="BF"/>
@@ -25399,7 +25399,7 @@
     <w:link w:val="Heading4"/>
     <w:uiPriority w:val="9"/>
     <w:semiHidden/>
-    <w:rsid w:val="00072D29"/>
+    <w:rsid w:val="00882559"/>
     <w:rPr>
       <w:rFonts w:eastAsiaTheme="majorEastAsia" w:cstheme="majorBidi"/>
       <w:i/>
@@ -25413,7 +25413,7 @@
     <w:link w:val="Heading5"/>
     <w:uiPriority w:val="9"/>
     <w:semiHidden/>
-    <w:rsid w:val="00072D29"/>
+    <w:rsid w:val="00882559"/>
     <w:rPr>
       <w:rFonts w:eastAsiaTheme="majorEastAsia" w:cstheme="majorBidi"/>
       <w:color w:val="2F5496" w:themeColor="accent1" w:themeShade="BF"/>
@@ -25425,7 +25425,7 @@
     <w:link w:val="Heading6"/>
     <w:uiPriority w:val="9"/>
     <w:semiHidden/>
-    <w:rsid w:val="00072D29"/>
+    <w:rsid w:val="00882559"/>
     <w:rPr>
       <w:rFonts w:eastAsiaTheme="majorEastAsia" w:cstheme="majorBidi"/>
       <w:i/>
@@ -25439,7 +25439,7 @@
     <w:link w:val="Heading7"/>
     <w:uiPriority w:val="9"/>
     <w:semiHidden/>
-    <w:rsid w:val="00072D29"/>
+    <w:rsid w:val="00882559"/>
     <w:rPr>
       <w:rFonts w:eastAsiaTheme="majorEastAsia" w:cstheme="majorBidi"/>
       <w:color w:val="595959" w:themeColor="text1" w:themeTint="A6"/>
@@ -25451,7 +25451,7 @@
     <w:link w:val="Heading8"/>
     <w:uiPriority w:val="9"/>
     <w:semiHidden/>
-    <w:rsid w:val="00072D29"/>
+    <w:rsid w:val="00882559"/>
     <w:rPr>
       <w:rFonts w:eastAsiaTheme="majorEastAsia" w:cstheme="majorBidi"/>
       <w:i/>
@@ -25465,7 +25465,7 @@
     <w:link w:val="Heading9"/>
     <w:uiPriority w:val="9"/>
     <w:semiHidden/>
-    <w:rsid w:val="00072D29"/>
+    <w:rsid w:val="00882559"/>
     <w:rPr>
       <w:rFonts w:eastAsiaTheme="majorEastAsia" w:cstheme="majorBidi"/>
       <w:color w:val="272727" w:themeColor="text1" w:themeTint="D8"/>
@@ -25478,7 +25478,7 @@
     <w:link w:val="TitleChar"/>
     <w:uiPriority w:val="10"/>
     <w:qFormat/>
-    <w:rsid w:val="00072D29"/>
+    <w:rsid w:val="00882559"/>
     <w:pPr>
       <w:spacing w:after="80" w:line="240" w:lineRule="auto"/>
       <w:contextualSpacing/>
@@ -25496,7 +25496,7 @@
     <w:basedOn w:val="DefaultParagraphFont"/>
     <w:link w:val="Title"/>
     <w:uiPriority w:val="10"/>
-    <w:rsid w:val="00072D29"/>
+    <w:rsid w:val="00882559"/>
     <w:rPr>
       <w:rFonts w:asciiTheme="majorHAnsi" w:eastAsiaTheme="majorEastAsia" w:hAnsiTheme="majorHAnsi" w:cstheme="majorBidi"/>
       <w:spacing w:val="-10"/>
@@ -25512,7 +25512,7 @@
     <w:link w:val="SubtitleChar"/>
     <w:uiPriority w:val="11"/>
     <w:qFormat/>
-    <w:rsid w:val="00072D29"/>
+    <w:rsid w:val="00882559"/>
     <w:pPr>
       <w:numPr>
         <w:ilvl w:val="1"/>
@@ -25531,7 +25531,7 @@
     <w:basedOn w:val="DefaultParagraphFont"/>
     <w:link w:val="Subtitle"/>
     <w:uiPriority w:val="11"/>
-    <w:rsid w:val="00072D29"/>
+    <w:rsid w:val="00882559"/>
     <w:rPr>
       <w:rFonts w:eastAsiaTheme="majorEastAsia" w:cstheme="majorBidi"/>
       <w:color w:val="595959" w:themeColor="text1" w:themeTint="A6"/>
@@ -25547,7 +25547,7 @@
     <w:link w:val="QuoteChar"/>
     <w:uiPriority w:val="29"/>
     <w:qFormat/>
-    <w:rsid w:val="00072D29"/>
+    <w:rsid w:val="00882559"/>
     <w:pPr>
       <w:spacing w:before="160"/>
       <w:jc w:val="center"/>
@@ -25563,7 +25563,7 @@
     <w:basedOn w:val="DefaultParagraphFont"/>
     <w:link w:val="Quote"/>
     <w:uiPriority w:val="29"/>
-    <w:rsid w:val="00072D29"/>
+    <w:rsid w:val="00882559"/>
     <w:rPr>
       <w:i/>
       <w:iCs/>
@@ -25575,7 +25575,7 @@
     <w:basedOn w:val="Normal"/>
     <w:uiPriority w:val="34"/>
     <w:qFormat/>
-    <w:rsid w:val="00072D29"/>
+    <w:rsid w:val="00882559"/>
     <w:pPr>
       <w:ind w:left="720"/>
       <w:contextualSpacing/>
@@ -25586,7 +25586,7 @@
     <w:basedOn w:val="DefaultParagraphFont"/>
     <w:uiPriority w:val="21"/>
     <w:qFormat/>
-    <w:rsid w:val="00072D29"/>
+    <w:rsid w:val="00882559"/>
     <w:rPr>
       <w:i/>
       <w:iCs/>
@@ -25600,7 +25600,7 @@
     <w:link w:val="IntenseQuoteChar"/>
     <w:uiPriority w:val="30"/>
     <w:qFormat/>
-    <w:rsid w:val="00072D29"/>
+    <w:rsid w:val="00882559"/>
     <w:pPr>
       <w:pBdr>
         <w:top w:val="single" w:sz="4" w:space="10" w:color="2F5496" w:themeColor="accent1" w:themeShade="BF"/>
@@ -25621,7 +25621,7 @@
     <w:basedOn w:val="DefaultParagraphFont"/>
     <w:link w:val="IntenseQuote"/>
     <w:uiPriority w:val="30"/>
-    <w:rsid w:val="00072D29"/>
+    <w:rsid w:val="00882559"/>
     <w:rPr>
       <w:i/>
       <w:iCs/>
@@ -25633,7 +25633,7 @@
     <w:basedOn w:val="DefaultParagraphFont"/>
     <w:uiPriority w:val="32"/>
     <w:qFormat/>
-    <w:rsid w:val="00072D29"/>
+    <w:rsid w:val="00882559"/>
     <w:rPr>
       <w:b/>
       <w:bCs/>
@@ -25648,7 +25648,7 @@
     <w:link w:val="HeaderChar"/>
     <w:uiPriority w:val="99"/>
     <w:unhideWhenUsed/>
-    <w:rsid w:val="00072D29"/>
+    <w:rsid w:val="00882559"/>
     <w:pPr>
       <w:tabs>
         <w:tab w:val="center" w:pos="4513"/>
@@ -25662,7 +25662,7 @@
     <w:basedOn w:val="DefaultParagraphFont"/>
     <w:link w:val="Header"/>
     <w:uiPriority w:val="99"/>
-    <w:rsid w:val="00072D29"/>
+    <w:rsid w:val="00882559"/>
   </w:style>
   <w:style w:type="paragraph" w:styleId="Footer">
     <w:name w:val="footer"/>
@@ -25670,7 +25670,7 @@
     <w:link w:val="FooterChar"/>
     <w:uiPriority w:val="99"/>
     <w:unhideWhenUsed/>
-    <w:rsid w:val="00072D29"/>
+    <w:rsid w:val="00882559"/>
     <w:pPr>
       <w:tabs>
         <w:tab w:val="center" w:pos="4513"/>
@@ -25684,7 +25684,7 @@
     <w:basedOn w:val="DefaultParagraphFont"/>
     <w:link w:val="Footer"/>
     <w:uiPriority w:val="99"/>
-    <w:rsid w:val="00072D29"/>
+    <w:rsid w:val="00882559"/>
   </w:style>
 </w:styles>
 </file>

</xml_diff>

<commit_message>
feat(title): perbarui judul penelitian dengan menambahkan segmen Generasi Z pada seluruh naskah dan dokumen Word/PDF
</commit_message>
<xml_diff>
--- a/TOPIK_2_TAKSI_GREEN_SM/01_Naskah_Utama/Proposal_Skripsi_Taksi_Green_SM.docx
+++ b/TOPIK_2_TAKSI_GREEN_SM/01_Naskah_Utama/Proposal_Skripsi_Taksi_Green_SM.docx
@@ -12,16 +12,16 @@
           <w:noProof/>
         </w:rPr>
         <w:drawing>
-          <wp:inline distT="0" distB="0" distL="0" distR="0" wp14:anchorId="01E93654" wp14:editId="664EA24D">
+          <wp:inline distT="0" distB="0" distL="0" distR="0" wp14:anchorId="3F0E42E9" wp14:editId="24A92E45">
             <wp:extent cx="1152002" cy="1152002"/>
             <wp:effectExtent l="0" t="0" r="0" b="0"/>
-            <wp:docPr id="2083232229" name="Picture 1"/>
+            <wp:docPr id="8708232" name="Picture 1"/>
             <wp:cNvGraphicFramePr/>
             <a:graphic xmlns:a="http://schemas.openxmlformats.org/drawingml/2006/main">
               <a:graphicData uri="http://schemas.openxmlformats.org/drawingml/2006/picture">
                 <pic:pic xmlns:pic="http://schemas.openxmlformats.org/drawingml/2006/picture">
                   <pic:nvPicPr>
-                    <pic:cNvPr id="2083232229" name=""/>
+                    <pic:cNvPr id="8708232" name=""/>
                     <pic:cNvPicPr/>
                   </pic:nvPicPr>
                   <pic:blipFill>
@@ -172,7 +172,7 @@
           <w:b/>
           <w:sz w:val="27"/>
         </w:rPr>
-        <w:t xml:space="preserve"> DI WILAYAH JAKARTA BARAT</w:t>
+        <w:t xml:space="preserve"> OLEH GENERASI Z DI WILAYAH JAKARTA BARAT</w:t>
       </w:r>
     </w:p>
     <w:p>
@@ -541,7 +541,7 @@
                 <w:rFonts w:ascii="Times New Roman" w:hAnsi="Times New Roman" w:cs="Times New Roman"/>
                 <w:sz w:val="24"/>
               </w:rPr>
-              <w:t xml:space="preserve"> di Wilayah Jakarta Barat</w:t>
+              <w:t xml:space="preserve"> oleh Generasi Z di Wilayah Jakarta Barat</w:t>
             </w:r>
           </w:p>
         </w:tc>
@@ -3315,7 +3315,22 @@
           <w:rFonts w:ascii="Times New Roman" w:hAnsi="Times New Roman" w:cs="Times New Roman"/>
           <w:sz w:val="24"/>
         </w:rPr>
-        <w:t xml:space="preserve">Meskipun kajian mengenai adopsi transportasi dan kendaraan listrik telah banyak dilakukan, mayoritas penelitian terdahulu mengkaji kendaraan listrik dari sudut pandang kepemilikan pribadi (mobil/motor pribadi) atau berfokus pada transportasi umum konvensional (Wijaya &amp; Pahar, 2022). Belum banyak studi empiris komprehensif yang secara simultan mengintegrasikan variabel </w:t>
+        <w:t xml:space="preserve">Urgensi penelitian ini menjadi semakin krusial ketika dikaitkan dengan segmen demografis konsumen masa kini, khususnya kelompok Generasi Z (Gen Z). Berdasarkan data BPS Provinsi DKI Jakarta (2023), kelompok Generasi Z (kelahiran tahun 1997–2012) merupakan salah satu proporsi populasi usia produktif terbesar dan paling dinamis di kawasan perkotaan, termasuk di Jakarta Barat yang dipadati oleh institusi perguruan tinggi terkemuka (seperti UKRIDA, Untar, Trisakti, Binus) serta sentra gaya hidup dan perkantoran modern. Menurut laporan riset perilaku konsumen digital (Indonesia Gen Z Report, 2024; Populix, 2024), Generasi Z memiliki karakteristik distingtif sebagai digital natives yang mengandalkan aplikasi ponsel pintar dalam mobilitas harian serta memiliki kesadaran ekologis (environmental awareness) dan kepedulian terhadap isu keberlanjutan (green lifestyle) yang tertinggi dibandingkan generasi sebelumnya. Karakteristik ini menjadikan Generasi Z sebagai target pasar potensial (early adopters) yang paling selaras dengan proposisi nilai ramah lingkungan taksi listrik </w:t>
+      </w:r>
+      <w:r>
+        <w:rPr>
+          <w:rFonts w:ascii="Times New Roman" w:hAnsi="Times New Roman" w:cs="Times New Roman"/>
+          <w:i/>
+          <w:sz w:val="24"/>
+        </w:rPr>
+        <w:t>Green SM</w:t>
+      </w:r>
+      <w:r>
+        <w:rPr>
+          <w:rFonts w:ascii="Times New Roman" w:hAnsi="Times New Roman" w:cs="Times New Roman"/>
+          <w:sz w:val="24"/>
+        </w:rPr>
+        <w:t>. Namun, di sisi lain, Generasi Z juga dikenal sangat kritis dan selektif terhadap reputasi merek (</w:t>
       </w:r>
       <w:r>
         <w:rPr>
@@ -3330,7 +3345,7 @@
           <w:rFonts w:ascii="Times New Roman" w:hAnsi="Times New Roman" w:cs="Times New Roman"/>
           <w:sz w:val="24"/>
         </w:rPr>
-        <w:t xml:space="preserve">, </w:t>
+        <w:t>), menuntut transparansi dan integritas layanan (</w:t>
       </w:r>
       <w:r>
         <w:rPr>
@@ -3345,7 +3360,7 @@
           <w:rFonts w:ascii="Times New Roman" w:hAnsi="Times New Roman" w:cs="Times New Roman"/>
           <w:sz w:val="24"/>
         </w:rPr>
-        <w:t xml:space="preserve">, dan </w:t>
+        <w:t>), serta memprioritaskan jaminan keselamatan dan proteksi pribadi (</w:t>
       </w:r>
       <w:r>
         <w:rPr>
@@ -3360,52 +3375,7 @@
           <w:rFonts w:ascii="Times New Roman" w:hAnsi="Times New Roman" w:cs="Times New Roman"/>
           <w:sz w:val="24"/>
         </w:rPr>
-        <w:t xml:space="preserve"> terhadap </w:t>
-      </w:r>
-      <w:r>
-        <w:rPr>
-          <w:rFonts w:ascii="Times New Roman" w:hAnsi="Times New Roman" w:cs="Times New Roman"/>
-          <w:i/>
-          <w:sz w:val="24"/>
-        </w:rPr>
-        <w:t>Purchase Decision</w:t>
-      </w:r>
-      <w:r>
-        <w:rPr>
-          <w:rFonts w:ascii="Times New Roman" w:hAnsi="Times New Roman" w:cs="Times New Roman"/>
-          <w:sz w:val="24"/>
-        </w:rPr>
-        <w:t xml:space="preserve"> pada kategori armada Taksi Listrik Murni (</w:t>
-      </w:r>
-      <w:r>
-        <w:rPr>
-          <w:rFonts w:ascii="Times New Roman" w:hAnsi="Times New Roman" w:cs="Times New Roman"/>
-          <w:i/>
-          <w:sz w:val="24"/>
-        </w:rPr>
-        <w:t>Green SM</w:t>
-      </w:r>
-      <w:r>
-        <w:rPr>
-          <w:rFonts w:ascii="Times New Roman" w:hAnsi="Times New Roman" w:cs="Times New Roman"/>
-          <w:sz w:val="24"/>
-        </w:rPr>
-        <w:t xml:space="preserve"> / </w:t>
-      </w:r>
-      <w:r>
-        <w:rPr>
-          <w:rFonts w:ascii="Times New Roman" w:hAnsi="Times New Roman" w:cs="Times New Roman"/>
-          <w:i/>
-          <w:sz w:val="24"/>
-        </w:rPr>
-        <w:t>VinFast</w:t>
-      </w:r>
-      <w:r>
-        <w:rPr>
-          <w:rFonts w:ascii="Times New Roman" w:hAnsi="Times New Roman" w:cs="Times New Roman"/>
-          <w:sz w:val="24"/>
-        </w:rPr>
-        <w:t>) di area metropolitan dengan karakteristik mobilitas dinamis seperti Jakarta Barat.</w:t>
+        <w:t>) saat bepergian. Oleh karena itu, menyelidiki bagaimana ketiga faktor tersebut membentuk keputusan pembelian Generasi Z di Jakarta Barat memberikan kontribusi ilmiah yang sangat kontekstual dan orisinal bagi strategi pemasaran transportasi hijau.</w:t>
       </w:r>
     </w:p>
     <w:p>
@@ -3424,22 +3394,97 @@
           <w:rFonts w:ascii="Times New Roman" w:hAnsi="Times New Roman" w:cs="Times New Roman"/>
           <w:sz w:val="24"/>
         </w:rPr>
-        <w:t>Berdasarkan latar belakang konseptual, fenomena persaingan riil di lapangan, serta kesenjangan penelitian (</w:t>
-      </w:r>
-      <w:r>
-        <w:rPr>
-          <w:rFonts w:ascii="Times New Roman" w:hAnsi="Times New Roman" w:cs="Times New Roman"/>
-          <w:i/>
-          <w:sz w:val="24"/>
-        </w:rPr>
-        <w:t>research gap</w:t>
-      </w:r>
-      <w:r>
-        <w:rPr>
-          <w:rFonts w:ascii="Times New Roman" w:hAnsi="Times New Roman" w:cs="Times New Roman"/>
-          <w:sz w:val="24"/>
-        </w:rPr>
-        <w:t>) yang telah diuraikan, maka peneliti tertarik untuk melakukan penelitian ilmiah yang mendalam dan sistematis dengan judul:</w:t>
+        <w:t xml:space="preserve">Meskipun kajian mengenai adopsi transportasi dan kendaraan listrik telah banyak dilakukan, mayoritas penelitian terdahulu mengkaji kendaraan listrik dari sudut pandang kepemilikan pribadi (mobil/motor pribadi) atau berfokus pada transportasi umum konvensional tanpa segmentasi generasi yang spesifik (Wijaya &amp; Pahar, 2022). Belum banyak studi empiris komprehensif yang secara simultan mengintegrasikan variabel </w:t>
+      </w:r>
+      <w:r>
+        <w:rPr>
+          <w:rFonts w:ascii="Times New Roman" w:hAnsi="Times New Roman" w:cs="Times New Roman"/>
+          <w:i/>
+          <w:sz w:val="24"/>
+        </w:rPr>
+        <w:t>Brand Image</w:t>
+      </w:r>
+      <w:r>
+        <w:rPr>
+          <w:rFonts w:ascii="Times New Roman" w:hAnsi="Times New Roman" w:cs="Times New Roman"/>
+          <w:sz w:val="24"/>
+        </w:rPr>
+        <w:t xml:space="preserve">, </w:t>
+      </w:r>
+      <w:r>
+        <w:rPr>
+          <w:rFonts w:ascii="Times New Roman" w:hAnsi="Times New Roman" w:cs="Times New Roman"/>
+          <w:i/>
+          <w:sz w:val="24"/>
+        </w:rPr>
+        <w:t>Brand Trust</w:t>
+      </w:r>
+      <w:r>
+        <w:rPr>
+          <w:rFonts w:ascii="Times New Roman" w:hAnsi="Times New Roman" w:cs="Times New Roman"/>
+          <w:sz w:val="24"/>
+        </w:rPr>
+        <w:t xml:space="preserve">, dan </w:t>
+      </w:r>
+      <w:r>
+        <w:rPr>
+          <w:rFonts w:ascii="Times New Roman" w:hAnsi="Times New Roman" w:cs="Times New Roman"/>
+          <w:i/>
+          <w:sz w:val="24"/>
+        </w:rPr>
+        <w:t>Perceived Safety</w:t>
+      </w:r>
+      <w:r>
+        <w:rPr>
+          <w:rFonts w:ascii="Times New Roman" w:hAnsi="Times New Roman" w:cs="Times New Roman"/>
+          <w:sz w:val="24"/>
+        </w:rPr>
+        <w:t xml:space="preserve"> terhadap </w:t>
+      </w:r>
+      <w:r>
+        <w:rPr>
+          <w:rFonts w:ascii="Times New Roman" w:hAnsi="Times New Roman" w:cs="Times New Roman"/>
+          <w:i/>
+          <w:sz w:val="24"/>
+        </w:rPr>
+        <w:t>Purchase Decision</w:t>
+      </w:r>
+      <w:r>
+        <w:rPr>
+          <w:rFonts w:ascii="Times New Roman" w:hAnsi="Times New Roman" w:cs="Times New Roman"/>
+          <w:sz w:val="24"/>
+        </w:rPr>
+        <w:t xml:space="preserve"> pada kategori armada Taksi Listrik Murni (</w:t>
+      </w:r>
+      <w:r>
+        <w:rPr>
+          <w:rFonts w:ascii="Times New Roman" w:hAnsi="Times New Roman" w:cs="Times New Roman"/>
+          <w:i/>
+          <w:sz w:val="24"/>
+        </w:rPr>
+        <w:t>Green SM</w:t>
+      </w:r>
+      <w:r>
+        <w:rPr>
+          <w:rFonts w:ascii="Times New Roman" w:hAnsi="Times New Roman" w:cs="Times New Roman"/>
+          <w:sz w:val="24"/>
+        </w:rPr>
+        <w:t xml:space="preserve"> / </w:t>
+      </w:r>
+      <w:r>
+        <w:rPr>
+          <w:rFonts w:ascii="Times New Roman" w:hAnsi="Times New Roman" w:cs="Times New Roman"/>
+          <w:i/>
+          <w:sz w:val="24"/>
+        </w:rPr>
+        <w:t>VinFast</w:t>
+      </w:r>
+      <w:r>
+        <w:rPr>
+          <w:rFonts w:ascii="Times New Roman" w:hAnsi="Times New Roman" w:cs="Times New Roman"/>
+          <w:sz w:val="24"/>
+        </w:rPr>
+        <w:t>) yang difokuskan secara spesifik pada Generasi Z di area metropolitan dengan karakteristik mobilitas dinamis seperti Jakarta Barat.</w:t>
       </w:r>
     </w:p>
     <w:p>
@@ -3458,101 +3503,22 @@
           <w:rFonts w:ascii="Times New Roman" w:hAnsi="Times New Roman" w:cs="Times New Roman"/>
           <w:sz w:val="24"/>
         </w:rPr>
-        <w:t xml:space="preserve">"Pengaruh </w:t>
-      </w:r>
-      <w:r>
-        <w:rPr>
-          <w:rFonts w:ascii="Times New Roman" w:hAnsi="Times New Roman" w:cs="Times New Roman"/>
-          <w:i/>
-          <w:sz w:val="24"/>
-        </w:rPr>
-        <w:t>Brand Image</w:t>
-      </w:r>
-      <w:r>
-        <w:rPr>
-          <w:rFonts w:ascii="Times New Roman" w:hAnsi="Times New Roman" w:cs="Times New Roman"/>
-          <w:sz w:val="24"/>
-        </w:rPr>
-        <w:t xml:space="preserve">, </w:t>
-      </w:r>
-      <w:r>
-        <w:rPr>
-          <w:rFonts w:ascii="Times New Roman" w:hAnsi="Times New Roman" w:cs="Times New Roman"/>
-          <w:i/>
-          <w:sz w:val="24"/>
-        </w:rPr>
-        <w:t>Brand Trust</w:t>
-      </w:r>
-      <w:r>
-        <w:rPr>
-          <w:rFonts w:ascii="Times New Roman" w:hAnsi="Times New Roman" w:cs="Times New Roman"/>
-          <w:sz w:val="24"/>
-        </w:rPr>
-        <w:t xml:space="preserve"> dan </w:t>
-      </w:r>
-      <w:r>
-        <w:rPr>
-          <w:rFonts w:ascii="Times New Roman" w:hAnsi="Times New Roman" w:cs="Times New Roman"/>
-          <w:i/>
-          <w:sz w:val="24"/>
-        </w:rPr>
-        <w:t>Perceived Safety</w:t>
-      </w:r>
-      <w:r>
-        <w:rPr>
-          <w:rFonts w:ascii="Times New Roman" w:hAnsi="Times New Roman" w:cs="Times New Roman"/>
-          <w:sz w:val="24"/>
-        </w:rPr>
-        <w:t xml:space="preserve"> terhadap </w:t>
-      </w:r>
-      <w:r>
-        <w:rPr>
-          <w:rFonts w:ascii="Times New Roman" w:hAnsi="Times New Roman" w:cs="Times New Roman"/>
-          <w:i/>
-          <w:sz w:val="24"/>
-        </w:rPr>
-        <w:t>Purchase Decision</w:t>
-      </w:r>
-      <w:r>
-        <w:rPr>
-          <w:rFonts w:ascii="Times New Roman" w:hAnsi="Times New Roman" w:cs="Times New Roman"/>
-          <w:sz w:val="24"/>
-        </w:rPr>
-        <w:t xml:space="preserve"> dalam Penggunaan Jasa Taksi </w:t>
-      </w:r>
-      <w:r>
-        <w:rPr>
-          <w:rFonts w:ascii="Times New Roman" w:hAnsi="Times New Roman" w:cs="Times New Roman"/>
-          <w:i/>
-          <w:sz w:val="24"/>
-        </w:rPr>
-        <w:t>Green SM</w:t>
-      </w:r>
-      <w:r>
-        <w:rPr>
-          <w:rFonts w:ascii="Times New Roman" w:hAnsi="Times New Roman" w:cs="Times New Roman"/>
-          <w:sz w:val="24"/>
-        </w:rPr>
-        <w:t xml:space="preserve"> di Wilayah Jakarta Barat".</w:t>
-      </w:r>
-    </w:p>
-    <w:p>
-      <w:pPr>
-        <w:keepNext/>
-        <w:spacing w:line="360" w:lineRule="auto"/>
-        <w:rPr>
-          <w:rFonts w:ascii="Times New Roman" w:hAnsi="Times New Roman" w:cs="Times New Roman"/>
-          <w:b/>
-          <w:sz w:val="24"/>
-        </w:rPr>
-      </w:pPr>
-      <w:r>
-        <w:rPr>
-          <w:rFonts w:ascii="Times New Roman" w:hAnsi="Times New Roman" w:cs="Times New Roman"/>
-          <w:b/>
-          <w:sz w:val="24"/>
-        </w:rPr>
-        <w:t>1.2 Rumusan Masalah</w:t>
+        <w:t>Berdasarkan latar belakang konseptual, fenomena persaingan riil di lapangan, serta kesenjangan penelitian (</w:t>
+      </w:r>
+      <w:r>
+        <w:rPr>
+          <w:rFonts w:ascii="Times New Roman" w:hAnsi="Times New Roman" w:cs="Times New Roman"/>
+          <w:i/>
+          <w:sz w:val="24"/>
+        </w:rPr>
+        <w:t>research gap</w:t>
+      </w:r>
+      <w:r>
+        <w:rPr>
+          <w:rFonts w:ascii="Times New Roman" w:hAnsi="Times New Roman" w:cs="Times New Roman"/>
+          <w:sz w:val="24"/>
+        </w:rPr>
+        <w:t>) yang telah diuraikan, maka peneliti tertarik untuk melakukan penelitian ilmiah yang mendalam dan sistematis dengan judul:</w:t>
       </w:r>
     </w:p>
     <w:p>
@@ -3571,6 +3537,119 @@
           <w:rFonts w:ascii="Times New Roman" w:hAnsi="Times New Roman" w:cs="Times New Roman"/>
           <w:sz w:val="24"/>
         </w:rPr>
+        <w:t xml:space="preserve">"Pengaruh </w:t>
+      </w:r>
+      <w:r>
+        <w:rPr>
+          <w:rFonts w:ascii="Times New Roman" w:hAnsi="Times New Roman" w:cs="Times New Roman"/>
+          <w:i/>
+          <w:sz w:val="24"/>
+        </w:rPr>
+        <w:t>Brand Image</w:t>
+      </w:r>
+      <w:r>
+        <w:rPr>
+          <w:rFonts w:ascii="Times New Roman" w:hAnsi="Times New Roman" w:cs="Times New Roman"/>
+          <w:sz w:val="24"/>
+        </w:rPr>
+        <w:t xml:space="preserve">, </w:t>
+      </w:r>
+      <w:r>
+        <w:rPr>
+          <w:rFonts w:ascii="Times New Roman" w:hAnsi="Times New Roman" w:cs="Times New Roman"/>
+          <w:i/>
+          <w:sz w:val="24"/>
+        </w:rPr>
+        <w:t>Brand Trust</w:t>
+      </w:r>
+      <w:r>
+        <w:rPr>
+          <w:rFonts w:ascii="Times New Roman" w:hAnsi="Times New Roman" w:cs="Times New Roman"/>
+          <w:sz w:val="24"/>
+        </w:rPr>
+        <w:t xml:space="preserve"> dan </w:t>
+      </w:r>
+      <w:r>
+        <w:rPr>
+          <w:rFonts w:ascii="Times New Roman" w:hAnsi="Times New Roman" w:cs="Times New Roman"/>
+          <w:i/>
+          <w:sz w:val="24"/>
+        </w:rPr>
+        <w:t>Perceived Safety</w:t>
+      </w:r>
+      <w:r>
+        <w:rPr>
+          <w:rFonts w:ascii="Times New Roman" w:hAnsi="Times New Roman" w:cs="Times New Roman"/>
+          <w:sz w:val="24"/>
+        </w:rPr>
+        <w:t xml:space="preserve"> terhadap </w:t>
+      </w:r>
+      <w:r>
+        <w:rPr>
+          <w:rFonts w:ascii="Times New Roman" w:hAnsi="Times New Roman" w:cs="Times New Roman"/>
+          <w:i/>
+          <w:sz w:val="24"/>
+        </w:rPr>
+        <w:t>Purchase Decision</w:t>
+      </w:r>
+      <w:r>
+        <w:rPr>
+          <w:rFonts w:ascii="Times New Roman" w:hAnsi="Times New Roman" w:cs="Times New Roman"/>
+          <w:sz w:val="24"/>
+        </w:rPr>
+        <w:t xml:space="preserve"> dalam Penggunaan Jasa Taksi </w:t>
+      </w:r>
+      <w:r>
+        <w:rPr>
+          <w:rFonts w:ascii="Times New Roman" w:hAnsi="Times New Roman" w:cs="Times New Roman"/>
+          <w:i/>
+          <w:sz w:val="24"/>
+        </w:rPr>
+        <w:t>Green SM</w:t>
+      </w:r>
+      <w:r>
+        <w:rPr>
+          <w:rFonts w:ascii="Times New Roman" w:hAnsi="Times New Roman" w:cs="Times New Roman"/>
+          <w:sz w:val="24"/>
+        </w:rPr>
+        <w:t xml:space="preserve"> oleh Generasi Z di Wilayah Jakarta Barat".</w:t>
+      </w:r>
+    </w:p>
+    <w:p>
+      <w:pPr>
+        <w:keepNext/>
+        <w:spacing w:line="360" w:lineRule="auto"/>
+        <w:rPr>
+          <w:rFonts w:ascii="Times New Roman" w:hAnsi="Times New Roman" w:cs="Times New Roman"/>
+          <w:b/>
+          <w:sz w:val="24"/>
+        </w:rPr>
+      </w:pPr>
+      <w:r>
+        <w:rPr>
+          <w:rFonts w:ascii="Times New Roman" w:hAnsi="Times New Roman" w:cs="Times New Roman"/>
+          <w:b/>
+          <w:sz w:val="24"/>
+        </w:rPr>
+        <w:t>1.2 Rumusan Masalah</w:t>
+      </w:r>
+    </w:p>
+    <w:p>
+      <w:pPr>
+        <w:keepNext/>
+        <w:spacing w:after="120" w:line="360" w:lineRule="auto"/>
+        <w:ind w:firstLine="709"/>
+        <w:jc w:val="both"/>
+        <w:rPr>
+          <w:rFonts w:ascii="Times New Roman" w:hAnsi="Times New Roman" w:cs="Times New Roman"/>
+          <w:sz w:val="24"/>
+        </w:rPr>
+      </w:pPr>
+      <w:r>
+        <w:rPr>
+          <w:rFonts w:ascii="Times New Roman" w:hAnsi="Times New Roman" w:cs="Times New Roman"/>
+          <w:sz w:val="24"/>
+        </w:rPr>
         <w:t>Berdasarkan latar belakang penelitian yang telah diuraikan, maka rumusan masalah dalam penelitian ini adalah sebagai berikut:</w:t>
       </w:r>
     </w:p>
@@ -3635,7 +3714,7 @@
           <w:rFonts w:ascii="Times New Roman" w:hAnsi="Times New Roman" w:cs="Times New Roman"/>
           <w:sz w:val="24"/>
         </w:rPr>
-        <w:t xml:space="preserve"> di wilayah Jakarta Barat?</w:t>
+        <w:t xml:space="preserve"> oleh Generasi Z di wilayah Jakarta Barat?</w:t>
       </w:r>
     </w:p>
     <w:p>
@@ -3699,7 +3778,7 @@
           <w:rFonts w:ascii="Times New Roman" w:hAnsi="Times New Roman" w:cs="Times New Roman"/>
           <w:sz w:val="24"/>
         </w:rPr>
-        <w:t xml:space="preserve"> di wilayah Jakarta Barat?</w:t>
+        <w:t xml:space="preserve"> oleh Generasi Z di wilayah Jakarta Barat?</w:t>
       </w:r>
     </w:p>
     <w:p>
@@ -3763,7 +3842,7 @@
           <w:rFonts w:ascii="Times New Roman" w:hAnsi="Times New Roman" w:cs="Times New Roman"/>
           <w:sz w:val="24"/>
         </w:rPr>
-        <w:t xml:space="preserve"> di wilayah Jakarta Barat?</w:t>
+        <w:t xml:space="preserve"> oleh Generasi Z di wilayah Jakarta Barat?</w:t>
       </w:r>
     </w:p>
     <w:p>
@@ -3865,7 +3944,7 @@
           <w:rFonts w:ascii="Times New Roman" w:hAnsi="Times New Roman" w:cs="Times New Roman"/>
           <w:sz w:val="24"/>
         </w:rPr>
-        <w:t xml:space="preserve"> di wilayah Jakarta Barat.</w:t>
+        <w:t xml:space="preserve"> oleh Generasi Z di wilayah Jakarta Barat.</w:t>
       </w:r>
     </w:p>
     <w:p>
@@ -3929,7 +4008,7 @@
           <w:rFonts w:ascii="Times New Roman" w:hAnsi="Times New Roman" w:cs="Times New Roman"/>
           <w:sz w:val="24"/>
         </w:rPr>
-        <w:t xml:space="preserve"> di wilayah Jakarta Barat.</w:t>
+        <w:t xml:space="preserve"> oleh Generasi Z di wilayah Jakarta Barat.</w:t>
       </w:r>
     </w:p>
     <w:p>
@@ -3993,7 +4072,7 @@
           <w:rFonts w:ascii="Times New Roman" w:hAnsi="Times New Roman" w:cs="Times New Roman"/>
           <w:sz w:val="24"/>
         </w:rPr>
-        <w:t xml:space="preserve"> di wilayah Jakarta Barat.</w:t>
+        <w:t xml:space="preserve"> oleh Generasi Z di wilayah Jakarta Barat.</w:t>
       </w:r>
     </w:p>
     <w:p>
@@ -4133,7 +4212,7 @@
           <w:rFonts w:ascii="Times New Roman" w:hAnsi="Times New Roman" w:cs="Times New Roman"/>
           <w:sz w:val="24"/>
         </w:rPr>
-        <w:t>- Memperkaya khazanah keilmuan mengenai integrasi teori ekuitas merek (Keller/Aaker), teori kepercayaan merek (Chaudhuri &amp; Holbrook), dan teori persepsi risiko keselamatan (Bauer/Parasuraman) dalam menjelaskan adopsi armada kendaraan listrik di Indonesia.</w:t>
+        <w:t>- Memperkaya khazanah keilmuan mengenai integrasi teori ekuitas merek (Keller/Aaker), teori kepercayaan merek (Chaudhuri &amp; Holbrook), dan teori persepsi risiko keselamatan (Bauer/Parasuraman) dalam menjelaskan adopsi armada kendaraan listrik di kalangan generasi muda Indonesia.</w:t>
       </w:r>
     </w:p>
     <w:p>
@@ -4152,7 +4231,7 @@
           <w:rFonts w:ascii="Times New Roman" w:hAnsi="Times New Roman" w:cs="Times New Roman"/>
           <w:sz w:val="24"/>
         </w:rPr>
-        <w:t>- Menjadi sumber referensi empiris bagi civitas akademika Universitas Kristen Krida Wacana (UKRIDA) dan peneliti lain yang hendak melakukan kajian lanjutan terkait inovasi transportasi ramah lingkungan.</w:t>
+        <w:t>- Menjadi sumber referensi empiris bagi civitas akademika Universitas Kristen Krida Wacana (UKRIDA) dan peneliti lain yang hendak melakukan kajian lanjutan terkait inovasi transportasi ramah lingkungan dan preferensi Generasi Z.</w:t>
       </w:r>
     </w:p>
     <w:p>
@@ -4224,7 +4303,7 @@
           <w:rFonts w:ascii="Times New Roman" w:hAnsi="Times New Roman" w:cs="Times New Roman"/>
           <w:sz w:val="24"/>
         </w:rPr>
-        <w:t>Memberikan masukan strategis berbasis data empiris mengenai faktor-faktor yang paling dominan dipertimbangkan konsumen di wilayah Jakarta Barat. Hal ini berguna dalam merumuskan strategi penjenamaan (branding), kampanye edukasi keselamatan armada listrik, peningkatan pelatihan standar layanan pengemudi, dan perancangan promosi penetrasi pasar yang efektif.</w:t>
+        <w:t>Memberikan masukan strategis berbasis data empiris mengenai faktor-faktor yang paling dominan dipertimbangkan oleh segmen konsumen Generasi Z di wilayah Jakarta Barat. Hal ini berguna dalam merumuskan strategi penjenamaan (branding), kampanye edukasi keselamatan armada listrik yang komunikatif bagi generasi muda, peningkatan pelatihan standar layanan pengemudi, dan perancangan promosi penetrasi pasar yang efektif.</w:t>
       </w:r>
     </w:p>
     <w:p>
@@ -9393,7 +9472,7 @@
           <w:rFonts w:ascii="Times New Roman" w:hAnsi="Times New Roman" w:cs="Times New Roman"/>
           <w:i/>
         </w:rPr>
-        <w:t>$H_1$: Brand Image berpengaruh positif terhadap Purchase Decision dalam penggunaan jasa taksi Green SM di wilayah Jakarta Barat.</w:t>
+        <w:t>$H_1$: Brand Image berpengaruh positif terhadap Purchase Decision dalam penggunaan jasa taksi Green SM oleh Generasi Z di wilayah Jakarta Barat.</w:t>
       </w:r>
     </w:p>
     <w:p>
@@ -9555,7 +9634,7 @@
           <w:rFonts w:ascii="Times New Roman" w:hAnsi="Times New Roman" w:cs="Times New Roman"/>
           <w:i/>
         </w:rPr>
-        <w:t>$H_2$: Brand Trust berpengaruh positif terhadap Purchase Decision dalam penggunaan jasa taksi Green SM di wilayah Jakarta Barat.</w:t>
+        <w:t>$H_2$: Brand Trust berpengaruh positif terhadap Purchase Decision dalam penggunaan jasa taksi Green SM oleh Generasi Z di wilayah Jakarta Barat.</w:t>
       </w:r>
     </w:p>
     <w:p>
@@ -9807,7 +9886,7 @@
           <w:rFonts w:ascii="Times New Roman" w:hAnsi="Times New Roman" w:cs="Times New Roman"/>
           <w:i/>
         </w:rPr>
-        <w:t>$H_3$: Perceived Safety berpengaruh positif terhadap Purchase Decision dalam penggunaan jasa taksi Green SM di wilayah Jakarta Barat.</w:t>
+        <w:t>$H_3$: Perceived Safety berpengaruh positif terhadap Purchase Decision dalam penggunaan jasa taksi Green SM oleh Generasi Z di wilayah Jakarta Barat.</w:t>
       </w:r>
     </w:p>
     <w:p>
@@ -10022,16 +10101,16 @@
           <w:noProof/>
         </w:rPr>
         <w:drawing>
-          <wp:inline distT="0" distB="0" distL="0" distR="0" wp14:anchorId="0ED6DC7F" wp14:editId="102BC202">
+          <wp:inline distT="0" distB="0" distL="0" distR="0" wp14:anchorId="43574F71" wp14:editId="58A2B531">
             <wp:extent cx="5220008" cy="3131820"/>
             <wp:effectExtent l="0" t="0" r="0" b="0"/>
-            <wp:docPr id="990285678" name="Graphic 2"/>
+            <wp:docPr id="1869747472" name="Graphic 2"/>
             <wp:cNvGraphicFramePr/>
             <a:graphic xmlns:a="http://schemas.openxmlformats.org/drawingml/2006/main">
               <a:graphicData uri="http://schemas.openxmlformats.org/drawingml/2006/picture">
                 <pic:pic xmlns:pic="http://schemas.openxmlformats.org/drawingml/2006/picture">
                   <pic:nvPicPr>
-                    <pic:cNvPr id="990285678" name=""/>
+                    <pic:cNvPr id="1869747472" name=""/>
                     <pic:cNvPicPr/>
                   </pic:nvPicPr>
                   <pic:blipFill>
@@ -10257,7 +10336,7 @@
           <w:rFonts w:ascii="Times New Roman" w:hAnsi="Times New Roman" w:cs="Times New Roman"/>
           <w:sz w:val="24"/>
         </w:rPr>
-        <w:t xml:space="preserve"> yang dioperasikan oleh PT Xanh SM Green and Smart Mobility Indonesia. Unit analisis dalam penelitian ini adalah individu konsumen yang berdomisili, bekerja, atau beraktivitas rutin di wilayah administratif Jakarta Barat.</w:t>
+        <w:t xml:space="preserve"> yang dioperasikan oleh PT Xanh SM Green and Smart Mobility Indonesia. Unit analisis dalam penelitian ini adalah individu konsumen kelompok Generasi Z yang berdomisili, menempuh pendidikan tinggi, bekerja, atau beraktivitas rutin di wilayah administratif Jakarta Barat.</w:t>
       </w:r>
     </w:p>
     <w:p>
@@ -14041,7 +14120,7 @@
           <w:rFonts w:ascii="Times New Roman" w:hAnsi="Times New Roman" w:cs="Times New Roman"/>
           <w:sz w:val="24"/>
         </w:rPr>
-        <w:t xml:space="preserve">Populasi adalah wilayah generalisasi yang terdiri atas objek/subjek yang mempunyai kuantitas dan karakteristik tertentu yang ditetapkan oleh peneliti untuk dipelajari dan kemudian ditarik kesimpulannya (Sugiyono, 2022). Populasi dalam penelitian ini adalah seluruh masyarakat yang berdomisili, bekerja, berkuliah, atau beraktivitas rutin di wilayah administratif Kota Administrasi Jakarta Barat dan telah mengetahui keberadaan layanan taksi listrik </w:t>
+        <w:t xml:space="preserve">Populasi adalah wilayah generalisasi yang terdiri atas objek/subjek yang mempunyai kuantitas dan karakteristik tertentu yang ditetapkan oleh peneliti untuk dipelajari dan kemudian ditarik kesimpulannya (Sugiyono, 2022). Populasi dalam penelitian ini adalah seluruh masyarakat kelompok Generasi Z yang berdomisili, menempuh pendidikan tinggi, bekerja, atau beraktivitas rutin di wilayah administratif Kota Administrasi Jakarta Barat dan telah mengetahui keberadaan layanan taksi listrik </w:t>
       </w:r>
       <w:r>
         <w:rPr>
@@ -14222,7 +14301,7 @@
           <w:rFonts w:ascii="Times New Roman" w:hAnsi="Times New Roman" w:cs="Times New Roman"/>
           <w:sz w:val="24"/>
         </w:rPr>
-        <w:t>1. Responden berusia minimal 17 tahun (telah memiliki identitas KTP, dewasa, dan mandiri dalam mengambil keputusan mobilitas serta bertransaksi keuangan).</w:t>
+        <w:t>1. Responden tergolong dalam kelompok Generasi Z, yaitu berusia antara 17 hingga 29 tahun pada saat penelitian dilakukan (kelahiran tahun 1997–2009), telah memiliki identitas KTP, serta mandiri secara finansial dan hukum dalam mengambil keputusan mobilitas.</w:t>
       </w:r>
     </w:p>
     <w:p>
@@ -14241,7 +14320,7 @@
           <w:rFonts w:ascii="Times New Roman" w:hAnsi="Times New Roman" w:cs="Times New Roman"/>
           <w:sz w:val="24"/>
         </w:rPr>
-        <w:t>2. Berdomisili, bekerja, menempuh pendidikan tinggi, atau sering beraktivitas di wilayah administratif Jakarta Barat (seperti kawasan perkantoran/mall di Grogol Petamburan, Palmerah, Kebon Jeruk, Kembangan, Cengkareng, Kalideres, Tambora, atau Taman Sari).</w:t>
+        <w:t>2. Berdomisili, menempuh pendidikan tinggi (kuliah), bekerja, atau sering beraktivitas rutin di wilayah administratif Jakarta Barat (seperti kawasan kampus perguruan tinggi, perkantoran, atau pusat perbelanjaan di Grogol Petamburan, Palmerah, Kebon Jeruk, Kembangan, Cengkareng, Kalideres, Tambora, atau Taman Sari).</w:t>
       </w:r>
     </w:p>
     <w:p>
@@ -25133,7 +25212,7 @@
     <w:link w:val="Heading1Char"/>
     <w:uiPriority w:val="9"/>
     <w:qFormat/>
-    <w:rsid w:val="00882559"/>
+    <w:rsid w:val="00E013AD"/>
     <w:pPr>
       <w:keepNext/>
       <w:keepLines/>
@@ -25156,7 +25235,7 @@
     <w:semiHidden/>
     <w:unhideWhenUsed/>
     <w:qFormat/>
-    <w:rsid w:val="00882559"/>
+    <w:rsid w:val="00E013AD"/>
     <w:pPr>
       <w:keepNext/>
       <w:keepLines/>
@@ -25179,7 +25258,7 @@
     <w:semiHidden/>
     <w:unhideWhenUsed/>
     <w:qFormat/>
-    <w:rsid w:val="00882559"/>
+    <w:rsid w:val="00E013AD"/>
     <w:pPr>
       <w:keepNext/>
       <w:keepLines/>
@@ -25202,7 +25281,7 @@
     <w:semiHidden/>
     <w:unhideWhenUsed/>
     <w:qFormat/>
-    <w:rsid w:val="00882559"/>
+    <w:rsid w:val="00E013AD"/>
     <w:pPr>
       <w:keepNext/>
       <w:keepLines/>
@@ -25225,7 +25304,7 @@
     <w:semiHidden/>
     <w:unhideWhenUsed/>
     <w:qFormat/>
-    <w:rsid w:val="00882559"/>
+    <w:rsid w:val="00E013AD"/>
     <w:pPr>
       <w:keepNext/>
       <w:keepLines/>
@@ -25246,7 +25325,7 @@
     <w:semiHidden/>
     <w:unhideWhenUsed/>
     <w:qFormat/>
-    <w:rsid w:val="00882559"/>
+    <w:rsid w:val="00E013AD"/>
     <w:pPr>
       <w:keepNext/>
       <w:keepLines/>
@@ -25269,7 +25348,7 @@
     <w:semiHidden/>
     <w:unhideWhenUsed/>
     <w:qFormat/>
-    <w:rsid w:val="00882559"/>
+    <w:rsid w:val="00E013AD"/>
     <w:pPr>
       <w:keepNext/>
       <w:keepLines/>
@@ -25290,7 +25369,7 @@
     <w:semiHidden/>
     <w:unhideWhenUsed/>
     <w:qFormat/>
-    <w:rsid w:val="00882559"/>
+    <w:rsid w:val="00E013AD"/>
     <w:pPr>
       <w:keepNext/>
       <w:keepLines/>
@@ -25313,7 +25392,7 @@
     <w:semiHidden/>
     <w:unhideWhenUsed/>
     <w:qFormat/>
-    <w:rsid w:val="00882559"/>
+    <w:rsid w:val="00E013AD"/>
     <w:pPr>
       <w:keepNext/>
       <w:keepLines/>
@@ -25357,7 +25436,7 @@
     <w:basedOn w:val="DefaultParagraphFont"/>
     <w:link w:val="Heading1"/>
     <w:uiPriority w:val="9"/>
-    <w:rsid w:val="00882559"/>
+    <w:rsid w:val="00E013AD"/>
     <w:rPr>
       <w:rFonts w:asciiTheme="majorHAnsi" w:eastAsiaTheme="majorEastAsia" w:hAnsiTheme="majorHAnsi" w:cstheme="majorBidi"/>
       <w:color w:val="2F5496" w:themeColor="accent1" w:themeShade="BF"/>
@@ -25371,7 +25450,7 @@
     <w:link w:val="Heading2"/>
     <w:uiPriority w:val="9"/>
     <w:semiHidden/>
-    <w:rsid w:val="00882559"/>
+    <w:rsid w:val="00E013AD"/>
     <w:rPr>
       <w:rFonts w:asciiTheme="majorHAnsi" w:eastAsiaTheme="majorEastAsia" w:hAnsiTheme="majorHAnsi" w:cstheme="majorBidi"/>
       <w:color w:val="2F5496" w:themeColor="accent1" w:themeShade="BF"/>
@@ -25385,7 +25464,7 @@
     <w:link w:val="Heading3"/>
     <w:uiPriority w:val="9"/>
     <w:semiHidden/>
-    <w:rsid w:val="00882559"/>
+    <w:rsid w:val="00E013AD"/>
     <w:rPr>
       <w:rFonts w:eastAsiaTheme="majorEastAsia" w:cstheme="majorBidi"/>
       <w:color w:val="2F5496" w:themeColor="accent1" w:themeShade="BF"/>
@@ -25399,7 +25478,7 @@
     <w:link w:val="Heading4"/>
     <w:uiPriority w:val="9"/>
     <w:semiHidden/>
-    <w:rsid w:val="00882559"/>
+    <w:rsid w:val="00E013AD"/>
     <w:rPr>
       <w:rFonts w:eastAsiaTheme="majorEastAsia" w:cstheme="majorBidi"/>
       <w:i/>
@@ -25413,7 +25492,7 @@
     <w:link w:val="Heading5"/>
     <w:uiPriority w:val="9"/>
     <w:semiHidden/>
-    <w:rsid w:val="00882559"/>
+    <w:rsid w:val="00E013AD"/>
     <w:rPr>
       <w:rFonts w:eastAsiaTheme="majorEastAsia" w:cstheme="majorBidi"/>
       <w:color w:val="2F5496" w:themeColor="accent1" w:themeShade="BF"/>
@@ -25425,7 +25504,7 @@
     <w:link w:val="Heading6"/>
     <w:uiPriority w:val="9"/>
     <w:semiHidden/>
-    <w:rsid w:val="00882559"/>
+    <w:rsid w:val="00E013AD"/>
     <w:rPr>
       <w:rFonts w:eastAsiaTheme="majorEastAsia" w:cstheme="majorBidi"/>
       <w:i/>
@@ -25439,7 +25518,7 @@
     <w:link w:val="Heading7"/>
     <w:uiPriority w:val="9"/>
     <w:semiHidden/>
-    <w:rsid w:val="00882559"/>
+    <w:rsid w:val="00E013AD"/>
     <w:rPr>
       <w:rFonts w:eastAsiaTheme="majorEastAsia" w:cstheme="majorBidi"/>
       <w:color w:val="595959" w:themeColor="text1" w:themeTint="A6"/>
@@ -25451,7 +25530,7 @@
     <w:link w:val="Heading8"/>
     <w:uiPriority w:val="9"/>
     <w:semiHidden/>
-    <w:rsid w:val="00882559"/>
+    <w:rsid w:val="00E013AD"/>
     <w:rPr>
       <w:rFonts w:eastAsiaTheme="majorEastAsia" w:cstheme="majorBidi"/>
       <w:i/>
@@ -25465,7 +25544,7 @@
     <w:link w:val="Heading9"/>
     <w:uiPriority w:val="9"/>
     <w:semiHidden/>
-    <w:rsid w:val="00882559"/>
+    <w:rsid w:val="00E013AD"/>
     <w:rPr>
       <w:rFonts w:eastAsiaTheme="majorEastAsia" w:cstheme="majorBidi"/>
       <w:color w:val="272727" w:themeColor="text1" w:themeTint="D8"/>
@@ -25478,7 +25557,7 @@
     <w:link w:val="TitleChar"/>
     <w:uiPriority w:val="10"/>
     <w:qFormat/>
-    <w:rsid w:val="00882559"/>
+    <w:rsid w:val="00E013AD"/>
     <w:pPr>
       <w:spacing w:after="80" w:line="240" w:lineRule="auto"/>
       <w:contextualSpacing/>
@@ -25496,7 +25575,7 @@
     <w:basedOn w:val="DefaultParagraphFont"/>
     <w:link w:val="Title"/>
     <w:uiPriority w:val="10"/>
-    <w:rsid w:val="00882559"/>
+    <w:rsid w:val="00E013AD"/>
     <w:rPr>
       <w:rFonts w:asciiTheme="majorHAnsi" w:eastAsiaTheme="majorEastAsia" w:hAnsiTheme="majorHAnsi" w:cstheme="majorBidi"/>
       <w:spacing w:val="-10"/>
@@ -25512,7 +25591,7 @@
     <w:link w:val="SubtitleChar"/>
     <w:uiPriority w:val="11"/>
     <w:qFormat/>
-    <w:rsid w:val="00882559"/>
+    <w:rsid w:val="00E013AD"/>
     <w:pPr>
       <w:numPr>
         <w:ilvl w:val="1"/>
@@ -25531,7 +25610,7 @@
     <w:basedOn w:val="DefaultParagraphFont"/>
     <w:link w:val="Subtitle"/>
     <w:uiPriority w:val="11"/>
-    <w:rsid w:val="00882559"/>
+    <w:rsid w:val="00E013AD"/>
     <w:rPr>
       <w:rFonts w:eastAsiaTheme="majorEastAsia" w:cstheme="majorBidi"/>
       <w:color w:val="595959" w:themeColor="text1" w:themeTint="A6"/>
@@ -25547,7 +25626,7 @@
     <w:link w:val="QuoteChar"/>
     <w:uiPriority w:val="29"/>
     <w:qFormat/>
-    <w:rsid w:val="00882559"/>
+    <w:rsid w:val="00E013AD"/>
     <w:pPr>
       <w:spacing w:before="160"/>
       <w:jc w:val="center"/>
@@ -25563,7 +25642,7 @@
     <w:basedOn w:val="DefaultParagraphFont"/>
     <w:link w:val="Quote"/>
     <w:uiPriority w:val="29"/>
-    <w:rsid w:val="00882559"/>
+    <w:rsid w:val="00E013AD"/>
     <w:rPr>
       <w:i/>
       <w:iCs/>
@@ -25575,7 +25654,7 @@
     <w:basedOn w:val="Normal"/>
     <w:uiPriority w:val="34"/>
     <w:qFormat/>
-    <w:rsid w:val="00882559"/>
+    <w:rsid w:val="00E013AD"/>
     <w:pPr>
       <w:ind w:left="720"/>
       <w:contextualSpacing/>
@@ -25586,7 +25665,7 @@
     <w:basedOn w:val="DefaultParagraphFont"/>
     <w:uiPriority w:val="21"/>
     <w:qFormat/>
-    <w:rsid w:val="00882559"/>
+    <w:rsid w:val="00E013AD"/>
     <w:rPr>
       <w:i/>
       <w:iCs/>
@@ -25600,7 +25679,7 @@
     <w:link w:val="IntenseQuoteChar"/>
     <w:uiPriority w:val="30"/>
     <w:qFormat/>
-    <w:rsid w:val="00882559"/>
+    <w:rsid w:val="00E013AD"/>
     <w:pPr>
       <w:pBdr>
         <w:top w:val="single" w:sz="4" w:space="10" w:color="2F5496" w:themeColor="accent1" w:themeShade="BF"/>
@@ -25621,7 +25700,7 @@
     <w:basedOn w:val="DefaultParagraphFont"/>
     <w:link w:val="IntenseQuote"/>
     <w:uiPriority w:val="30"/>
-    <w:rsid w:val="00882559"/>
+    <w:rsid w:val="00E013AD"/>
     <w:rPr>
       <w:i/>
       <w:iCs/>
@@ -25633,7 +25712,7 @@
     <w:basedOn w:val="DefaultParagraphFont"/>
     <w:uiPriority w:val="32"/>
     <w:qFormat/>
-    <w:rsid w:val="00882559"/>
+    <w:rsid w:val="00E013AD"/>
     <w:rPr>
       <w:b/>
       <w:bCs/>
@@ -25648,7 +25727,7 @@
     <w:link w:val="HeaderChar"/>
     <w:uiPriority w:val="99"/>
     <w:unhideWhenUsed/>
-    <w:rsid w:val="00882559"/>
+    <w:rsid w:val="00E013AD"/>
     <w:pPr>
       <w:tabs>
         <w:tab w:val="center" w:pos="4513"/>
@@ -25662,7 +25741,7 @@
     <w:basedOn w:val="DefaultParagraphFont"/>
     <w:link w:val="Header"/>
     <w:uiPriority w:val="99"/>
-    <w:rsid w:val="00882559"/>
+    <w:rsid w:val="00E013AD"/>
   </w:style>
   <w:style w:type="paragraph" w:styleId="Footer">
     <w:name w:val="footer"/>
@@ -25670,7 +25749,7 @@
     <w:link w:val="FooterChar"/>
     <w:uiPriority w:val="99"/>
     <w:unhideWhenUsed/>
-    <w:rsid w:val="00882559"/>
+    <w:rsid w:val="00E013AD"/>
     <w:pPr>
       <w:tabs>
         <w:tab w:val="center" w:pos="4513"/>
@@ -25684,7 +25763,7 @@
     <w:basedOn w:val="DefaultParagraphFont"/>
     <w:link w:val="Footer"/>
     <w:uiPriority w:val="99"/>
-    <w:rsid w:val="00882559"/>
+    <w:rsid w:val="00E013AD"/>
   </w:style>
 </w:styles>
 </file>

</xml_diff>